<commit_message>
Updated Section 1 - Introduction
</commit_message>
<xml_diff>
--- a/7COM1079_Final report_template.docx
+++ b/7COM1079_Final report_template.docx
@@ -11,59 +11,16 @@
           <w:rFonts w:ascii="Times New Roman" w:eastAsia="Times New Roman" w:hAnsi="Times New Roman" w:cs="Times New Roman"/>
           <w:color w:val="2D3B45"/>
           <w:kern w:val="0"/>
-          <w:highlight w:val="yellow"/>
           <w:lang w:eastAsia="en-GB"/>
           <w14:ligatures w14:val="none"/>
         </w:rPr>
       </w:pPr>
-      <w:r>
-        <w:rPr>
-          <w:rFonts w:ascii="Times New Roman" w:eastAsia="Times New Roman" w:hAnsi="Times New Roman" w:cs="Times New Roman"/>
-          <w:i/>
-          <w:color w:val="2D3B45"/>
-          <w:kern w:val="0"/>
-          <w:highlight w:val="yellow"/>
-          <w:lang w:eastAsia="en-GB"/>
-          <w14:ligatures w14:val="none"/>
-        </w:rPr>
-        <w:t xml:space="preserve">Please delete all the </w:t>
-      </w:r>
-      <w:r>
-        <w:rPr>
-          <w:rFonts w:ascii="Times New Roman" w:eastAsia="Times New Roman" w:hAnsi="Times New Roman" w:cs="Times New Roman"/>
-          <w:i/>
-          <w:color w:val="2D3B45"/>
-          <w:kern w:val="0"/>
-          <w:highlight w:val="yellow"/>
-          <w:lang w:eastAsia="en-GB"/>
-          <w14:ligatures w14:val="none"/>
-        </w:rPr>
-        <w:t>italic</w:t>
-      </w:r>
-      <w:r>
-        <w:rPr>
-          <w:rFonts w:ascii="Times New Roman" w:eastAsia="Times New Roman" w:hAnsi="Times New Roman" w:cs="Times New Roman"/>
-          <w:i/>
-          <w:color w:val="2D3B45"/>
-          <w:kern w:val="0"/>
-          <w:highlight w:val="yellow"/>
-          <w:lang w:eastAsia="en-GB"/>
-          <w14:ligatures w14:val="none"/>
-        </w:rPr>
-        <w:t xml:space="preserve"> text before submission. It is here just for your reference</w:t>
-      </w:r>
-      <w:r>
-        <w:rPr>
-          <w:rFonts w:ascii="Times New Roman" w:eastAsia="Times New Roman" w:hAnsi="Times New Roman" w:cs="Times New Roman"/>
-          <w:color w:val="2D3B45"/>
-          <w:kern w:val="0"/>
-          <w:highlight w:val="yellow"/>
-          <w:lang w:eastAsia="en-GB"/>
-          <w14:ligatures w14:val="none"/>
-        </w:rPr>
-        <w:t>.</w:t>
-      </w:r>
-      <w:r>
+    </w:p>
+    <w:p>
+      <w:pPr>
+        <w:shd w:val="clear" w:color="auto" w:fill="FFFFFF" w:themeFill="background1"/>
+        <w:jc w:val="center"/>
+        <w:outlineLvl w:val="1"/>
         <w:rPr>
           <w:rFonts w:ascii="Times New Roman" w:eastAsia="Times New Roman" w:hAnsi="Times New Roman" w:cs="Times New Roman"/>
           <w:color w:val="2D3B45"/>
@@ -71,8 +28,7 @@
           <w:lang w:eastAsia="en-GB"/>
           <w14:ligatures w14:val="none"/>
         </w:rPr>
-        <w:t xml:space="preserve"> </w:t>
-      </w:r>
+      </w:pPr>
     </w:p>
     <w:p>
       <w:pPr>
@@ -81,122 +37,12 @@
         <w:outlineLvl w:val="1"/>
         <w:rPr>
           <w:rFonts w:ascii="Times New Roman" w:eastAsia="Times New Roman" w:hAnsi="Times New Roman" w:cs="Times New Roman"/>
-          <w:i/>
-          <w:color w:val="2D3B45"/>
-          <w:kern w:val="0"/>
-          <w:highlight w:val="yellow"/>
-          <w:lang w:eastAsia="en-GB"/>
-          <w14:ligatures w14:val="none"/>
-        </w:rPr>
-      </w:pPr>
-      <w:r>
-        <w:rPr>
-          <w:rFonts w:ascii="Times New Roman" w:eastAsia="Times New Roman" w:hAnsi="Times New Roman" w:cs="Times New Roman"/>
-          <w:i/>
-          <w:color w:val="2D3B45"/>
-          <w:kern w:val="0"/>
-          <w:highlight w:val="yellow"/>
-          <w:lang w:eastAsia="en-GB"/>
-          <w14:ligatures w14:val="none"/>
-        </w:rPr>
-        <w:t>Further: data set – DS, research question – RQ</w:t>
-      </w:r>
-    </w:p>
-    <w:p>
-      <w:pPr>
-        <w:shd w:val="clear" w:color="auto" w:fill="FFFFFF" w:themeFill="background1"/>
-        <w:jc w:val="center"/>
-        <w:outlineLvl w:val="1"/>
-        <w:rPr>
-          <w:rFonts w:ascii="Times New Roman" w:eastAsia="Times New Roman" w:hAnsi="Times New Roman" w:cs="Times New Roman"/>
-          <w:i/>
-          <w:iCs/>
-          <w:color w:val="2D3B45"/>
-          <w:kern w:val="0"/>
-          <w:highlight w:val="yellow"/>
-          <w:lang w:eastAsia="en-GB"/>
-          <w14:ligatures w14:val="none"/>
-        </w:rPr>
-      </w:pPr>
-      <w:r>
-        <w:rPr>
-          <w:rFonts w:ascii="Times New Roman" w:eastAsia="Times New Roman" w:hAnsi="Times New Roman" w:cs="Times New Roman"/>
-          <w:i/>
-          <w:iCs/>
-          <w:color w:val="2D3B45"/>
-          <w:kern w:val="0"/>
-          <w:highlight w:val="yellow"/>
-          <w:lang w:eastAsia="en-GB"/>
-          <w14:ligatures w14:val="none"/>
-        </w:rPr>
-        <w:t>The mark (</w:t>
-      </w:r>
-      <w:r>
-        <w:rPr>
-          <w:rFonts w:ascii="Times New Roman" w:eastAsia="Times New Roman" w:hAnsi="Times New Roman" w:cs="Times New Roman"/>
-          <w:b/>
-          <w:bCs/>
-          <w:i/>
-          <w:iCs/>
-          <w:color w:val="2D3B45"/>
-          <w:kern w:val="0"/>
-          <w:highlight w:val="yellow"/>
-          <w:lang w:eastAsia="en-GB"/>
-          <w14:ligatures w14:val="none"/>
-        </w:rPr>
-        <w:t>x words</w:t>
-      </w:r>
-      <w:r>
-        <w:rPr>
-          <w:rFonts w:ascii="Times New Roman" w:eastAsia="Times New Roman" w:hAnsi="Times New Roman" w:cs="Times New Roman"/>
-          <w:i/>
-          <w:iCs/>
-          <w:color w:val="2D3B45"/>
-          <w:kern w:val="0"/>
-          <w:highlight w:val="yellow"/>
-          <w:lang w:eastAsia="en-GB"/>
-          <w14:ligatures w14:val="none"/>
-        </w:rPr>
-        <w:t xml:space="preserve">) after each subchapter states the word count limit. This indicates the expected amount of information which you can exceed </w:t>
-      </w:r>
-      <w:r>
-        <w:rPr>
-          <w:rFonts w:ascii="Times New Roman" w:eastAsia="Times New Roman" w:hAnsi="Times New Roman" w:cs="Times New Roman"/>
-          <w:i/>
-          <w:iCs/>
-          <w:color w:val="2D3B45"/>
-          <w:kern w:val="0"/>
-          <w:highlight w:val="yellow"/>
-          <w:lang w:eastAsia="en-GB"/>
-          <w14:ligatures w14:val="none"/>
-        </w:rPr>
-        <w:t>by</w:t>
-      </w:r>
-      <w:r>
-        <w:rPr>
-          <w:rFonts w:ascii="Times New Roman" w:eastAsia="Times New Roman" w:hAnsi="Times New Roman" w:cs="Times New Roman"/>
-          <w:i/>
-          <w:iCs/>
-          <w:color w:val="2D3B45"/>
-          <w:kern w:val="0"/>
-          <w:highlight w:val="yellow"/>
-          <w:lang w:eastAsia="en-GB"/>
-          <w14:ligatures w14:val="none"/>
-        </w:rPr>
-        <w:t xml:space="preserve"> 10% without losing the mark.</w:t>
-      </w:r>
-      <w:r>
-        <w:rPr>
-          <w:rFonts w:ascii="Times New Roman" w:eastAsia="Times New Roman" w:hAnsi="Times New Roman" w:cs="Times New Roman"/>
-          <w:i/>
-          <w:iCs/>
           <w:color w:val="2D3B45"/>
           <w:kern w:val="0"/>
           <w:lang w:eastAsia="en-GB"/>
           <w14:ligatures w14:val="none"/>
         </w:rPr>
-        <w:t xml:space="preserve"> </w:t>
-      </w:r>
+      </w:pPr>
     </w:p>
     <w:p>
       <w:pPr>
@@ -211,12 +57,7 @@
           <w14:ligatures w14:val="none"/>
         </w:rPr>
       </w:pPr>
-    </w:p>
-    <w:p>
-      <w:pPr>
-        <w:shd w:val="clear" w:color="auto" w:fill="FFFFFF" w:themeFill="background1"/>
-        <w:jc w:val="center"/>
-        <w:outlineLvl w:val="1"/>
+      <w:r>
         <w:rPr>
           <w:rFonts w:ascii="Times New Roman" w:eastAsia="Times New Roman" w:hAnsi="Times New Roman" w:cs="Times New Roman"/>
           <w:color w:val="2D3B45"/>
@@ -224,13 +65,9 @@
           <w:lang w:eastAsia="en-GB"/>
           <w14:ligatures w14:val="none"/>
         </w:rPr>
-      </w:pPr>
-    </w:p>
-    <w:p>
-      <w:pPr>
-        <w:shd w:val="clear" w:color="auto" w:fill="FFFFFF" w:themeFill="background1"/>
-        <w:jc w:val="center"/>
-        <w:outlineLvl w:val="1"/>
+        <w:t>7COM1079-0901-202</w:t>
+      </w:r>
+      <w:r>
         <w:rPr>
           <w:rFonts w:ascii="Times New Roman" w:eastAsia="Times New Roman" w:hAnsi="Times New Roman" w:cs="Times New Roman"/>
           <w:color w:val="2D3B45"/>
@@ -238,13 +75,9 @@
           <w:lang w:eastAsia="en-GB"/>
           <w14:ligatures w14:val="none"/>
         </w:rPr>
-      </w:pPr>
-    </w:p>
-    <w:p>
-      <w:pPr>
-        <w:shd w:val="clear" w:color="auto" w:fill="FFFFFF" w:themeFill="background1"/>
-        <w:jc w:val="center"/>
-        <w:outlineLvl w:val="1"/>
+        <w:t>5</w:t>
+      </w:r>
+      <w:r>
         <w:rPr>
           <w:rFonts w:ascii="Times New Roman" w:eastAsia="Times New Roman" w:hAnsi="Times New Roman" w:cs="Times New Roman"/>
           <w:color w:val="2D3B45"/>
@@ -252,537 +85,421 @@
           <w:lang w:eastAsia="en-GB"/>
           <w14:ligatures w14:val="none"/>
         </w:rPr>
-      </w:pPr>
-      <w:r>
-        <w:rPr>
-          <w:rFonts w:ascii="Times New Roman" w:eastAsia="Times New Roman" w:hAnsi="Times New Roman" w:cs="Times New Roman"/>
-          <w:color w:val="2D3B45"/>
-          <w:kern w:val="0"/>
-          <w:lang w:eastAsia="en-GB"/>
-          <w14:ligatures w14:val="none"/>
-        </w:rPr>
-        <w:t>7COM1079-0901-202</w:t>
-      </w:r>
-      <w:r>
-        <w:rPr>
-          <w:rFonts w:ascii="Times New Roman" w:eastAsia="Times New Roman" w:hAnsi="Times New Roman" w:cs="Times New Roman"/>
-          <w:color w:val="2D3B45"/>
-          <w:kern w:val="0"/>
-          <w:lang w:eastAsia="en-GB"/>
-          <w14:ligatures w14:val="none"/>
+        <w:t xml:space="preserve"> - Team Research and Development Project</w:t>
+      </w:r>
+    </w:p>
+    <w:p>
+      <w:pPr>
+        <w:rPr>
+          <w:rFonts w:ascii="Times New Roman" w:eastAsia="Times New Roman" w:hAnsi="Times New Roman" w:cs="Times New Roman"/>
+        </w:rPr>
+      </w:pPr>
+    </w:p>
+    <w:p>
+      <w:pPr>
+        <w:rPr>
+          <w:rFonts w:ascii="Times New Roman" w:eastAsia="Times New Roman" w:hAnsi="Times New Roman" w:cs="Times New Roman"/>
+        </w:rPr>
+      </w:pPr>
+    </w:p>
+    <w:p>
+      <w:pPr>
+        <w:rPr>
+          <w:rFonts w:ascii="Times New Roman" w:eastAsia="Times New Roman" w:hAnsi="Times New Roman" w:cs="Times New Roman"/>
+        </w:rPr>
+      </w:pPr>
+      <w:r>
+        <w:rPr>
+          <w:rFonts w:ascii="Times New Roman" w:eastAsia="Times New Roman" w:hAnsi="Times New Roman" w:cs="Times New Roman"/>
+        </w:rPr>
+        <w:t xml:space="preserve">Final report title: </w:t>
+      </w:r>
+      <w:r>
+        <w:rPr>
+          <w:rFonts w:ascii="Times New Roman" w:hAnsi="Times New Roman" w:cs="Times New Roman"/>
+          <w:b/>
+          <w:bCs/>
+        </w:rPr>
+        <w:t>The Relationship Between Alcohol Consumption and Life Expectancy: A Cross-National Analysis</w:t>
+      </w:r>
+    </w:p>
+    <w:p>
+      <w:pPr>
+        <w:rPr>
+          <w:rFonts w:ascii="Times New Roman" w:eastAsia="Times New Roman" w:hAnsi="Times New Roman" w:cs="Times New Roman"/>
+        </w:rPr>
+      </w:pPr>
+    </w:p>
+    <w:p>
+      <w:pPr>
+        <w:rPr>
+          <w:rFonts w:ascii="Times New Roman" w:eastAsia="Times New Roman" w:hAnsi="Times New Roman" w:cs="Times New Roman"/>
+        </w:rPr>
+      </w:pPr>
+      <w:r>
+        <w:rPr>
+          <w:rFonts w:ascii="Times New Roman" w:eastAsia="Times New Roman" w:hAnsi="Times New Roman" w:cs="Times New Roman"/>
+        </w:rPr>
+        <w:t xml:space="preserve">Group </w:t>
+      </w:r>
+      <w:r>
+        <w:rPr>
+          <w:rFonts w:ascii="Times New Roman" w:eastAsia="Times New Roman" w:hAnsi="Times New Roman" w:cs="Times New Roman"/>
+        </w:rPr>
+        <w:t>ID</w:t>
+      </w:r>
+      <w:r>
+        <w:rPr>
+          <w:rFonts w:ascii="Times New Roman" w:eastAsia="Times New Roman" w:hAnsi="Times New Roman" w:cs="Times New Roman"/>
+        </w:rPr>
+        <w:t>:</w:t>
+      </w:r>
+      <w:r>
+        <w:rPr>
+          <w:rFonts w:ascii="Times New Roman" w:eastAsia="Times New Roman" w:hAnsi="Times New Roman" w:cs="Times New Roman"/>
+        </w:rPr>
+        <w:t xml:space="preserve"> A168</w:t>
+      </w:r>
+    </w:p>
+    <w:p>
+      <w:pPr>
+        <w:rPr>
+          <w:rFonts w:ascii="Times New Roman" w:eastAsia="Times New Roman" w:hAnsi="Times New Roman" w:cs="Times New Roman"/>
+        </w:rPr>
+      </w:pPr>
+    </w:p>
+    <w:p>
+      <w:pPr>
+        <w:rPr>
+          <w:rFonts w:ascii="Times New Roman" w:eastAsia="Times New Roman" w:hAnsi="Times New Roman" w:cs="Times New Roman"/>
+        </w:rPr>
+      </w:pPr>
+      <w:r>
+        <w:rPr>
+          <w:rFonts w:ascii="Times New Roman" w:eastAsia="Times New Roman" w:hAnsi="Times New Roman" w:cs="Times New Roman"/>
+        </w:rPr>
+        <w:t xml:space="preserve">Dataset number: </w:t>
+      </w:r>
+      <w:r>
+        <w:rPr>
+          <w:rFonts w:ascii="Times New Roman" w:eastAsia="Times New Roman" w:hAnsi="Times New Roman" w:cs="Times New Roman"/>
+        </w:rPr>
+        <w:t>ds033</w:t>
+      </w:r>
+    </w:p>
+    <w:p>
+      <w:pPr>
+        <w:rPr>
+          <w:rFonts w:ascii="Times New Roman" w:eastAsia="Times New Roman" w:hAnsi="Times New Roman" w:cs="Times New Roman"/>
+        </w:rPr>
+      </w:pPr>
+    </w:p>
+    <w:p>
+      <w:pPr>
+        <w:rPr>
+          <w:rFonts w:ascii="Times New Roman" w:eastAsia="Times New Roman" w:hAnsi="Times New Roman" w:cs="Times New Roman"/>
+          <w:iCs/>
+        </w:rPr>
+      </w:pPr>
+      <w:r>
+        <w:rPr>
+          <w:rFonts w:ascii="Times New Roman" w:eastAsia="Times New Roman" w:hAnsi="Times New Roman" w:cs="Times New Roman"/>
+        </w:rPr>
+        <w:t xml:space="preserve">Prepared </w:t>
+      </w:r>
+      <w:r>
+        <w:rPr>
+          <w:rFonts w:ascii="Times New Roman" w:eastAsia="Times New Roman" w:hAnsi="Times New Roman" w:cs="Times New Roman"/>
+        </w:rPr>
+        <w:t xml:space="preserve">by: </w:t>
+      </w:r>
+      <w:r>
+        <w:rPr>
+          <w:rFonts w:ascii="Times New Roman" w:eastAsia="Times New Roman" w:hAnsi="Times New Roman" w:cs="Times New Roman"/>
+          <w:iCs/>
+        </w:rPr>
+        <w:t>Hyndavi Yasarapu 24090531</w:t>
+      </w:r>
+    </w:p>
+    <w:p>
+      <w:pPr>
+        <w:rPr>
+          <w:rFonts w:ascii="Times New Roman" w:eastAsia="Times New Roman" w:hAnsi="Times New Roman" w:cs="Times New Roman"/>
+          <w:iCs/>
+        </w:rPr>
+      </w:pPr>
+      <w:r>
+        <w:rPr>
+          <w:rFonts w:ascii="Times New Roman" w:eastAsia="Times New Roman" w:hAnsi="Times New Roman" w:cs="Times New Roman"/>
+          <w:iCs/>
+        </w:rPr>
+        <w:tab/>
+        <w:t xml:space="preserve">         Tarun </w:t>
+      </w:r>
+      <w:proofErr w:type="spellStart"/>
+      <w:r>
+        <w:rPr>
+          <w:rFonts w:ascii="Times New Roman" w:eastAsia="Times New Roman" w:hAnsi="Times New Roman" w:cs="Times New Roman"/>
+          <w:iCs/>
+        </w:rPr>
+        <w:t>Cherupally</w:t>
+      </w:r>
+      <w:proofErr w:type="spellEnd"/>
+      <w:r>
+        <w:rPr>
+          <w:rFonts w:ascii="Times New Roman" w:eastAsia="Times New Roman" w:hAnsi="Times New Roman" w:cs="Times New Roman"/>
+          <w:iCs/>
+        </w:rPr>
+        <w:t xml:space="preserve"> </w:t>
+      </w:r>
+    </w:p>
+    <w:p>
+      <w:pPr>
+        <w:rPr>
+          <w:rFonts w:ascii="Times New Roman" w:eastAsia="Times New Roman" w:hAnsi="Times New Roman" w:cs="Times New Roman"/>
+          <w:iCs/>
+        </w:rPr>
+      </w:pPr>
+      <w:r>
+        <w:rPr>
+          <w:rFonts w:ascii="Times New Roman" w:eastAsia="Times New Roman" w:hAnsi="Times New Roman" w:cs="Times New Roman"/>
+          <w:iCs/>
+        </w:rPr>
+        <w:tab/>
+        <w:t xml:space="preserve">          </w:t>
+      </w:r>
+      <w:r>
+        <w:rPr>
+          <w:rFonts w:ascii="Times New Roman" w:eastAsia="Times New Roman" w:hAnsi="Times New Roman" w:cs="Times New Roman"/>
+          <w:iCs/>
+        </w:rPr>
+        <w:t xml:space="preserve">Venumadhav </w:t>
+      </w:r>
+      <w:proofErr w:type="spellStart"/>
+      <w:r>
+        <w:rPr>
+          <w:rFonts w:ascii="Times New Roman" w:eastAsia="Times New Roman" w:hAnsi="Times New Roman" w:cs="Times New Roman"/>
+          <w:iCs/>
+        </w:rPr>
+        <w:t>reddy</w:t>
+      </w:r>
+      <w:proofErr w:type="spellEnd"/>
+      <w:r>
+        <w:rPr>
+          <w:rFonts w:ascii="Times New Roman" w:eastAsia="Times New Roman" w:hAnsi="Times New Roman" w:cs="Times New Roman"/>
+          <w:iCs/>
+        </w:rPr>
+        <w:t xml:space="preserve"> </w:t>
+      </w:r>
+      <w:proofErr w:type="spellStart"/>
+      <w:r>
+        <w:rPr>
+          <w:rFonts w:ascii="Times New Roman" w:eastAsia="Times New Roman" w:hAnsi="Times New Roman" w:cs="Times New Roman"/>
+          <w:iCs/>
+        </w:rPr>
+        <w:t>Marapally</w:t>
+      </w:r>
+      <w:proofErr w:type="spellEnd"/>
+    </w:p>
+    <w:p>
+      <w:pPr>
+        <w:ind w:firstLine="720"/>
+        <w:rPr>
+          <w:rFonts w:ascii="Times New Roman" w:eastAsia="Times New Roman" w:hAnsi="Times New Roman" w:cs="Times New Roman"/>
+          <w:iCs/>
+        </w:rPr>
+      </w:pPr>
+      <w:r>
+        <w:rPr>
+          <w:rFonts w:ascii="Times New Roman" w:eastAsia="Times New Roman" w:hAnsi="Times New Roman" w:cs="Times New Roman"/>
+          <w:iCs/>
+        </w:rPr>
+        <w:t xml:space="preserve">          </w:t>
+      </w:r>
+      <w:r>
+        <w:rPr>
+          <w:rFonts w:ascii="Times New Roman" w:eastAsia="Times New Roman" w:hAnsi="Times New Roman" w:cs="Times New Roman"/>
+          <w:iCs/>
+        </w:rPr>
+        <w:t>Vinay Kumar Andoju</w:t>
+      </w:r>
+    </w:p>
+    <w:p>
+      <w:pPr>
+        <w:rPr>
+          <w:rFonts w:ascii="Times New Roman" w:eastAsia="Times New Roman" w:hAnsi="Times New Roman" w:cs="Times New Roman"/>
+          <w:iCs/>
+        </w:rPr>
+      </w:pPr>
+      <w:r>
+        <w:rPr>
+          <w:rFonts w:ascii="Times New Roman" w:eastAsia="Times New Roman" w:hAnsi="Times New Roman" w:cs="Times New Roman"/>
+          <w:iCs/>
+        </w:rPr>
+        <w:tab/>
+        <w:t xml:space="preserve">         </w:t>
+      </w:r>
+    </w:p>
+    <w:p>
+      <w:pPr>
+        <w:ind w:left="720"/>
+        <w:rPr>
+          <w:rFonts w:ascii="Times New Roman" w:eastAsia="Times New Roman" w:hAnsi="Times New Roman" w:cs="Times New Roman"/>
+          <w:i/>
+        </w:rPr>
+      </w:pPr>
+    </w:p>
+    <w:p>
+      <w:pPr>
+        <w:ind w:left="720"/>
+        <w:rPr>
+          <w:rFonts w:ascii="Times New Roman" w:eastAsia="Times New Roman" w:hAnsi="Times New Roman" w:cs="Times New Roman"/>
+          <w:i/>
+        </w:rPr>
+      </w:pPr>
+    </w:p>
+    <w:p>
+      <w:pPr>
+        <w:ind w:left="720"/>
+        <w:rPr>
+          <w:rFonts w:ascii="Times New Roman" w:eastAsia="Times New Roman" w:hAnsi="Times New Roman" w:cs="Times New Roman"/>
+          <w:i/>
+        </w:rPr>
+      </w:pPr>
+    </w:p>
+    <w:p>
+      <w:pPr>
+        <w:rPr>
+          <w:rFonts w:ascii="Times New Roman" w:eastAsia="Times New Roman" w:hAnsi="Times New Roman" w:cs="Times New Roman"/>
+        </w:rPr>
+      </w:pPr>
+    </w:p>
+    <w:p>
+      <w:pPr>
+        <w:rPr>
+          <w:rFonts w:ascii="Times New Roman" w:eastAsia="Times New Roman" w:hAnsi="Times New Roman" w:cs="Times New Roman"/>
+        </w:rPr>
+      </w:pPr>
+    </w:p>
+    <w:p>
+      <w:pPr>
+        <w:rPr>
+          <w:rFonts w:ascii="Times New Roman" w:eastAsia="Times New Roman" w:hAnsi="Times New Roman" w:cs="Times New Roman"/>
+        </w:rPr>
+      </w:pPr>
+    </w:p>
+    <w:p>
+      <w:pPr>
+        <w:rPr>
+          <w:rFonts w:ascii="Times New Roman" w:eastAsia="Times New Roman" w:hAnsi="Times New Roman" w:cs="Times New Roman"/>
+        </w:rPr>
+      </w:pPr>
+    </w:p>
+    <w:p>
+      <w:pPr>
+        <w:rPr>
+          <w:rFonts w:ascii="Times New Roman" w:eastAsia="Times New Roman" w:hAnsi="Times New Roman" w:cs="Times New Roman"/>
+        </w:rPr>
+      </w:pPr>
+    </w:p>
+    <w:p>
+      <w:pPr>
+        <w:rPr>
+          <w:rFonts w:ascii="Times New Roman" w:eastAsia="Times New Roman" w:hAnsi="Times New Roman" w:cs="Times New Roman"/>
+        </w:rPr>
+      </w:pPr>
+    </w:p>
+    <w:p>
+      <w:pPr>
+        <w:rPr>
+          <w:rFonts w:ascii="Times New Roman" w:eastAsia="Times New Roman" w:hAnsi="Times New Roman" w:cs="Times New Roman"/>
+        </w:rPr>
+      </w:pPr>
+    </w:p>
+    <w:p>
+      <w:pPr>
+        <w:rPr>
+          <w:rFonts w:ascii="Times New Roman" w:eastAsia="Times New Roman" w:hAnsi="Times New Roman" w:cs="Times New Roman"/>
+        </w:rPr>
+      </w:pPr>
+    </w:p>
+    <w:p>
+      <w:pPr>
+        <w:rPr>
+          <w:rFonts w:ascii="Times New Roman" w:eastAsia="Times New Roman" w:hAnsi="Times New Roman" w:cs="Times New Roman"/>
+        </w:rPr>
+      </w:pPr>
+    </w:p>
+    <w:p>
+      <w:pPr>
+        <w:rPr>
+          <w:rFonts w:ascii="Times New Roman" w:eastAsia="Times New Roman" w:hAnsi="Times New Roman" w:cs="Times New Roman"/>
+        </w:rPr>
+      </w:pPr>
+    </w:p>
+    <w:p>
+      <w:pPr>
+        <w:jc w:val="center"/>
+        <w:rPr>
+          <w:rFonts w:ascii="Times New Roman" w:eastAsia="Times New Roman" w:hAnsi="Times New Roman" w:cs="Times New Roman"/>
+        </w:rPr>
+      </w:pPr>
+      <w:r>
+        <w:rPr>
+          <w:rFonts w:ascii="Times New Roman" w:eastAsia="Times New Roman" w:hAnsi="Times New Roman" w:cs="Times New Roman"/>
+        </w:rPr>
+        <w:t>University of Hertfordshire</w:t>
+      </w:r>
+    </w:p>
+    <w:p>
+      <w:pPr>
+        <w:jc w:val="center"/>
+        <w:rPr>
+          <w:rFonts w:ascii="Times New Roman" w:eastAsia="Times New Roman" w:hAnsi="Times New Roman" w:cs="Times New Roman"/>
+        </w:rPr>
+      </w:pPr>
+      <w:r>
+        <w:rPr>
+          <w:rFonts w:ascii="Times New Roman" w:eastAsia="Times New Roman" w:hAnsi="Times New Roman" w:cs="Times New Roman"/>
+        </w:rPr>
+        <w:t>Hatfield, 202</w:t>
+      </w:r>
+      <w:r>
+        <w:rPr>
+          <w:rFonts w:ascii="Times New Roman" w:eastAsia="Times New Roman" w:hAnsi="Times New Roman" w:cs="Times New Roman"/>
         </w:rPr>
         <w:t>5</w:t>
       </w:r>
-      <w:r>
-        <w:rPr>
-          <w:rFonts w:ascii="Times New Roman" w:eastAsia="Times New Roman" w:hAnsi="Times New Roman" w:cs="Times New Roman"/>
-          <w:color w:val="2D3B45"/>
-          <w:kern w:val="0"/>
-          <w:lang w:eastAsia="en-GB"/>
-          <w14:ligatures w14:val="none"/>
-        </w:rPr>
-        <w:t xml:space="preserve"> - Team Research and Development Project</w:t>
-      </w:r>
-    </w:p>
-    <w:p>
-      <w:pPr>
-        <w:rPr>
-          <w:rFonts w:ascii="Times New Roman" w:eastAsia="Times New Roman" w:hAnsi="Times New Roman" w:cs="Times New Roman"/>
-        </w:rPr>
-      </w:pPr>
-    </w:p>
-    <w:p>
-      <w:pPr>
-        <w:rPr>
-          <w:rFonts w:ascii="Times New Roman" w:eastAsia="Times New Roman" w:hAnsi="Times New Roman" w:cs="Times New Roman"/>
-        </w:rPr>
-      </w:pPr>
-    </w:p>
-    <w:p>
-      <w:pPr>
-        <w:rPr>
-          <w:rFonts w:ascii="Times New Roman" w:eastAsia="Times New Roman" w:hAnsi="Times New Roman" w:cs="Times New Roman"/>
-        </w:rPr>
-      </w:pPr>
-      <w:r>
-        <w:rPr>
-          <w:rFonts w:ascii="Times New Roman" w:eastAsia="Times New Roman" w:hAnsi="Times New Roman" w:cs="Times New Roman"/>
-        </w:rPr>
-        <w:t xml:space="preserve">Final report title: </w:t>
-      </w:r>
-      <w:r>
-        <w:rPr>
-          <w:rFonts w:ascii="Times New Roman" w:eastAsia="Times New Roman" w:hAnsi="Times New Roman" w:cs="Times New Roman"/>
-        </w:rPr>
-        <w:t>(</w:t>
-      </w:r>
-      <w:r>
-        <w:rPr>
-          <w:rFonts w:ascii="Times New Roman" w:eastAsia="Times New Roman" w:hAnsi="Times New Roman" w:cs="Times New Roman"/>
-          <w:i/>
-        </w:rPr>
-        <w:t>t</w:t>
-      </w:r>
-      <w:r>
-        <w:rPr>
-          <w:rFonts w:ascii="Times New Roman" w:eastAsia="Times New Roman" w:hAnsi="Times New Roman" w:cs="Times New Roman"/>
-          <w:i/>
-        </w:rPr>
-        <w:t xml:space="preserve">he </w:t>
-      </w:r>
-      <w:r>
-        <w:rPr>
-          <w:rFonts w:ascii="Times New Roman" w:eastAsia="Times New Roman" w:hAnsi="Times New Roman" w:cs="Times New Roman"/>
-          <w:i/>
-        </w:rPr>
-        <w:t>t</w:t>
-      </w:r>
-      <w:r>
-        <w:rPr>
-          <w:rFonts w:ascii="Times New Roman" w:eastAsia="Times New Roman" w:hAnsi="Times New Roman" w:cs="Times New Roman"/>
-          <w:i/>
-        </w:rPr>
-        <w:t>opic of your research.</w:t>
-      </w:r>
-      <w:r>
-        <w:rPr>
-          <w:rFonts w:ascii="Times New Roman" w:eastAsia="Times New Roman" w:hAnsi="Times New Roman" w:cs="Times New Roman"/>
-          <w:i/>
-        </w:rPr>
-        <w:t>)</w:t>
-      </w:r>
-    </w:p>
-    <w:p>
-      <w:pPr>
-        <w:rPr>
-          <w:rFonts w:ascii="Times New Roman" w:eastAsia="Times New Roman" w:hAnsi="Times New Roman" w:cs="Times New Roman"/>
-        </w:rPr>
-      </w:pPr>
-    </w:p>
-    <w:p>
-      <w:pPr>
-        <w:rPr>
-          <w:rFonts w:ascii="Times New Roman" w:eastAsia="Times New Roman" w:hAnsi="Times New Roman" w:cs="Times New Roman"/>
-        </w:rPr>
-      </w:pPr>
-      <w:r>
-        <w:rPr>
-          <w:rFonts w:ascii="Times New Roman" w:eastAsia="Times New Roman" w:hAnsi="Times New Roman" w:cs="Times New Roman"/>
-        </w:rPr>
-        <w:t xml:space="preserve">Group </w:t>
-      </w:r>
-      <w:r>
-        <w:rPr>
-          <w:rFonts w:ascii="Times New Roman" w:eastAsia="Times New Roman" w:hAnsi="Times New Roman" w:cs="Times New Roman"/>
-        </w:rPr>
-        <w:t>ID</w:t>
-      </w:r>
-      <w:r>
-        <w:rPr>
-          <w:rFonts w:ascii="Times New Roman" w:eastAsia="Times New Roman" w:hAnsi="Times New Roman" w:cs="Times New Roman"/>
-        </w:rPr>
-        <w:t>:</w:t>
-      </w:r>
-    </w:p>
-    <w:p>
-      <w:pPr>
-        <w:rPr>
-          <w:rFonts w:ascii="Times New Roman" w:eastAsia="Times New Roman" w:hAnsi="Times New Roman" w:cs="Times New Roman"/>
-        </w:rPr>
-      </w:pPr>
-    </w:p>
-    <w:p>
-      <w:pPr>
-        <w:rPr>
-          <w:rFonts w:ascii="Times New Roman" w:eastAsia="Times New Roman" w:hAnsi="Times New Roman" w:cs="Times New Roman"/>
-        </w:rPr>
-      </w:pPr>
-      <w:r>
-        <w:rPr>
-          <w:rFonts w:ascii="Times New Roman" w:eastAsia="Times New Roman" w:hAnsi="Times New Roman" w:cs="Times New Roman"/>
-        </w:rPr>
-        <w:t xml:space="preserve">Dataset number: </w:t>
-      </w:r>
-    </w:p>
-    <w:p>
-      <w:pPr>
-        <w:rPr>
-          <w:rFonts w:ascii="Times New Roman" w:eastAsia="Times New Roman" w:hAnsi="Times New Roman" w:cs="Times New Roman"/>
-        </w:rPr>
-      </w:pPr>
-    </w:p>
-    <w:p>
-      <w:pPr>
-        <w:rPr>
-          <w:rFonts w:ascii="Times New Roman" w:eastAsia="Times New Roman" w:hAnsi="Times New Roman" w:cs="Times New Roman"/>
-          <w:i/>
-          <w:highlight w:val="yellow"/>
-        </w:rPr>
-      </w:pPr>
-      <w:r>
-        <w:rPr>
-          <w:rFonts w:ascii="Times New Roman" w:eastAsia="Times New Roman" w:hAnsi="Times New Roman" w:cs="Times New Roman"/>
-        </w:rPr>
-        <w:t xml:space="preserve">Prepared </w:t>
-      </w:r>
-      <w:r>
-        <w:rPr>
-          <w:rFonts w:ascii="Times New Roman" w:eastAsia="Times New Roman" w:hAnsi="Times New Roman" w:cs="Times New Roman"/>
-        </w:rPr>
-        <w:t xml:space="preserve">by: </w:t>
-      </w:r>
-      <w:r>
-        <w:rPr>
-          <w:rFonts w:ascii="Times New Roman" w:eastAsia="Times New Roman" w:hAnsi="Times New Roman" w:cs="Times New Roman"/>
-          <w:i/>
-          <w:highlight w:val="yellow"/>
-        </w:rPr>
-        <w:t>[Name and ID of submitting student</w:t>
-      </w:r>
-      <w:r>
-        <w:rPr>
-          <w:rFonts w:ascii="Times New Roman" w:eastAsia="Times New Roman" w:hAnsi="Times New Roman" w:cs="Times New Roman"/>
-          <w:i/>
-          <w:highlight w:val="yellow"/>
-        </w:rPr>
-        <w:t xml:space="preserve"> first</w:t>
-      </w:r>
-      <w:r>
-        <w:rPr>
-          <w:rFonts w:ascii="Times New Roman" w:eastAsia="Times New Roman" w:hAnsi="Times New Roman" w:cs="Times New Roman"/>
-          <w:i/>
-          <w:highlight w:val="yellow"/>
-        </w:rPr>
-        <w:t>],</w:t>
-      </w:r>
-      <w:r>
-        <w:rPr>
-          <w:rFonts w:ascii="Times New Roman" w:eastAsia="Times New Roman" w:hAnsi="Times New Roman" w:cs="Times New Roman"/>
-          <w:i/>
+    </w:p>
+    <w:p>
+      <w:pPr>
+        <w:sectPr>
+          <w:footerReference w:type="even" r:id="rId8"/>
+          <w:footerReference w:type="default" r:id="rId9"/>
+          <w:pgSz w:w="11906" w:h="16838"/>
+          <w:pgMar w:top="1440" w:right="1440" w:bottom="1440" w:left="1440" w:header="708" w:footer="708" w:gutter="0"/>
+          <w:cols w:space="708"/>
+          <w:titlePg/>
+          <w:docGrid w:linePitch="360"/>
+        </w:sectPr>
+      </w:pPr>
+    </w:p>
+    <w:p>
+      <w:pPr>
+        <w:jc w:val="center"/>
+      </w:pPr>
+      <w:r>
+        <w:rPr>
+          <w:rFonts w:ascii="Times New Roman" w:eastAsia="Times New Roman" w:hAnsi="Times New Roman" w:cs="Times New Roman"/>
+        </w:rPr>
+        <w:lastRenderedPageBreak/>
+        <w:t>Table of Contents</w:t>
+      </w:r>
+      <w:r>
+        <w:rPr>
+          <w:rFonts w:ascii="Times New Roman" w:eastAsia="Times New Roman" w:hAnsi="Times New Roman" w:cs="Times New Roman"/>
         </w:rPr>
         <w:t xml:space="preserve"> </w:t>
-      </w:r>
-    </w:p>
-    <w:p>
-      <w:pPr>
-        <w:ind w:left="720"/>
-        <w:rPr>
-          <w:rFonts w:ascii="Times New Roman" w:eastAsia="Times New Roman" w:hAnsi="Times New Roman" w:cs="Times New Roman"/>
-          <w:i/>
-          <w:highlight w:val="yellow"/>
-        </w:rPr>
-      </w:pPr>
-      <w:r>
-        <w:rPr>
-          <w:rFonts w:ascii="Times New Roman" w:eastAsia="Times New Roman" w:hAnsi="Times New Roman" w:cs="Times New Roman"/>
-          <w:i/>
-        </w:rPr>
-        <w:t xml:space="preserve">      </w:t>
-      </w:r>
-      <w:r>
-        <w:rPr>
-          <w:rFonts w:ascii="Times New Roman" w:eastAsia="Times New Roman" w:hAnsi="Times New Roman" w:cs="Times New Roman"/>
-          <w:i/>
-        </w:rPr>
-        <w:t xml:space="preserve"> </w:t>
-      </w:r>
-      <w:r>
-        <w:rPr>
-          <w:rFonts w:ascii="Times New Roman" w:eastAsia="Times New Roman" w:hAnsi="Times New Roman" w:cs="Times New Roman"/>
-          <w:i/>
-        </w:rPr>
-        <w:t xml:space="preserve">  </w:t>
-      </w:r>
-      <w:r>
-        <w:rPr>
-          <w:rFonts w:ascii="Times New Roman" w:eastAsia="Times New Roman" w:hAnsi="Times New Roman" w:cs="Times New Roman"/>
-          <w:i/>
-          <w:highlight w:val="yellow"/>
-        </w:rPr>
-        <w:t>[Name and ID of other group members]</w:t>
-      </w:r>
-    </w:p>
-    <w:p>
-      <w:pPr>
-        <w:ind w:left="720"/>
-        <w:rPr>
-          <w:rFonts w:ascii="Times New Roman" w:eastAsia="Times New Roman" w:hAnsi="Times New Roman" w:cs="Times New Roman"/>
-          <w:i/>
-        </w:rPr>
-      </w:pPr>
-    </w:p>
-    <w:p>
-      <w:pPr>
-        <w:ind w:left="720"/>
-        <w:rPr>
-          <w:rFonts w:ascii="Times New Roman" w:eastAsia="Times New Roman" w:hAnsi="Times New Roman" w:cs="Times New Roman"/>
-          <w:i/>
-        </w:rPr>
-      </w:pPr>
-    </w:p>
-    <w:p>
-      <w:pPr>
-        <w:ind w:left="720"/>
-        <w:rPr>
-          <w:rFonts w:ascii="Times New Roman" w:eastAsia="Times New Roman" w:hAnsi="Times New Roman" w:cs="Times New Roman"/>
-          <w:i/>
-        </w:rPr>
-      </w:pPr>
-    </w:p>
-    <w:p>
-      <w:pPr>
-        <w:ind w:left="720"/>
-        <w:rPr>
-          <w:rFonts w:ascii="Times New Roman" w:eastAsia="Times New Roman" w:hAnsi="Times New Roman" w:cs="Times New Roman"/>
-          <w:i/>
-        </w:rPr>
-      </w:pPr>
-    </w:p>
-    <w:p>
-      <w:pPr>
-        <w:rPr>
-          <w:rFonts w:ascii="Times New Roman" w:eastAsia="Times New Roman" w:hAnsi="Times New Roman" w:cs="Times New Roman"/>
-        </w:rPr>
-      </w:pPr>
-    </w:p>
-    <w:p>
-      <w:pPr>
-        <w:rPr>
-          <w:rFonts w:ascii="Times New Roman" w:eastAsia="Times New Roman" w:hAnsi="Times New Roman" w:cs="Times New Roman"/>
-        </w:rPr>
-      </w:pPr>
-    </w:p>
-    <w:p>
-      <w:pPr>
-        <w:rPr>
-          <w:rFonts w:ascii="Times New Roman" w:eastAsia="Times New Roman" w:hAnsi="Times New Roman" w:cs="Times New Roman"/>
-        </w:rPr>
-      </w:pPr>
-    </w:p>
-    <w:p>
-      <w:pPr>
-        <w:rPr>
-          <w:rFonts w:ascii="Times New Roman" w:eastAsia="Times New Roman" w:hAnsi="Times New Roman" w:cs="Times New Roman"/>
-        </w:rPr>
-      </w:pPr>
-    </w:p>
-    <w:p>
-      <w:pPr>
-        <w:rPr>
-          <w:rFonts w:ascii="Times New Roman" w:eastAsia="Times New Roman" w:hAnsi="Times New Roman" w:cs="Times New Roman"/>
-        </w:rPr>
-      </w:pPr>
-    </w:p>
-    <w:p>
-      <w:pPr>
-        <w:rPr>
-          <w:rFonts w:ascii="Times New Roman" w:eastAsia="Times New Roman" w:hAnsi="Times New Roman" w:cs="Times New Roman"/>
-        </w:rPr>
-      </w:pPr>
-    </w:p>
-    <w:p>
-      <w:pPr>
-        <w:pStyle w:val="ListParagraph"/>
-        <w:rPr>
-          <w:rFonts w:ascii="Times New Roman" w:eastAsia="Times New Roman" w:hAnsi="Times New Roman" w:cs="Times New Roman"/>
-          <w:i/>
-          <w:highlight w:val="yellow"/>
-        </w:rPr>
-      </w:pPr>
-      <w:r>
-        <w:rPr>
-          <w:rStyle w:val="Strong"/>
-          <w:rFonts w:ascii="Times New Roman" w:eastAsia="Times New Roman" w:hAnsi="Times New Roman" w:cs="Times New Roman"/>
-          <w:i/>
-          <w:highlight w:val="yellow"/>
-        </w:rPr>
-        <w:t>Please make sure</w:t>
-      </w:r>
-      <w:r>
-        <w:rPr>
-          <w:rFonts w:ascii="Times New Roman" w:eastAsia="Times New Roman" w:hAnsi="Times New Roman" w:cs="Times New Roman"/>
-          <w:i/>
-          <w:highlight w:val="yellow"/>
-        </w:rPr>
-        <w:t xml:space="preserve"> the document spelled correctly (including image labels, section headings, and table of contents</w:t>
-      </w:r>
-      <w:r>
-        <w:rPr>
-          <w:rFonts w:ascii="Times New Roman" w:eastAsia="Times New Roman" w:hAnsi="Times New Roman" w:cs="Times New Roman"/>
-          <w:i/>
-          <w:highlight w:val="yellow"/>
-        </w:rPr>
-        <w:t>)</w:t>
-      </w:r>
-      <w:r>
-        <w:rPr>
-          <w:rFonts w:ascii="Times New Roman" w:eastAsia="Times New Roman" w:hAnsi="Times New Roman" w:cs="Times New Roman"/>
-          <w:i/>
-          <w:highlight w:val="yellow"/>
-        </w:rPr>
-        <w:t>.</w:t>
-      </w:r>
-      <w:r>
-        <w:rPr>
-          <w:rFonts w:ascii="Times New Roman" w:eastAsia="Times New Roman" w:hAnsi="Times New Roman" w:cs="Times New Roman"/>
-          <w:i/>
-          <w:highlight w:val="yellow"/>
-        </w:rPr>
-        <w:t xml:space="preserve"> Please use correct punctuation.</w:t>
-      </w:r>
-    </w:p>
-    <w:p>
-      <w:pPr>
-        <w:pStyle w:val="ListParagraph"/>
-        <w:rPr>
-          <w:rFonts w:ascii="Times New Roman" w:eastAsia="Times New Roman" w:hAnsi="Times New Roman" w:cs="Times New Roman"/>
-        </w:rPr>
-      </w:pPr>
-      <w:r>
-        <w:rPr>
-          <w:rFonts w:ascii="Times New Roman" w:eastAsia="Times New Roman" w:hAnsi="Times New Roman" w:cs="Times New Roman"/>
-          <w:i/>
-          <w:highlight w:val="yellow"/>
-        </w:rPr>
-        <w:t>Make sure your report is grammatically correct</w:t>
-      </w:r>
-      <w:r>
-        <w:rPr>
-          <w:rFonts w:ascii="Times New Roman" w:eastAsia="Times New Roman" w:hAnsi="Times New Roman" w:cs="Times New Roman"/>
-          <w:i/>
-          <w:highlight w:val="yellow"/>
-        </w:rPr>
-        <w:t>.</w:t>
-      </w:r>
-      <w:r>
-        <w:rPr>
-          <w:rFonts w:ascii="Times New Roman" w:eastAsia="Times New Roman" w:hAnsi="Times New Roman" w:cs="Times New Roman"/>
-        </w:rPr>
-        <w:t xml:space="preserve"> </w:t>
-      </w:r>
-    </w:p>
-    <w:p>
-      <w:pPr>
-        <w:rPr>
-          <w:rFonts w:ascii="Times New Roman" w:eastAsia="Times New Roman" w:hAnsi="Times New Roman" w:cs="Times New Roman"/>
-        </w:rPr>
-      </w:pPr>
-    </w:p>
-    <w:p>
-      <w:pPr>
-        <w:rPr>
-          <w:rFonts w:ascii="Times New Roman" w:eastAsia="Times New Roman" w:hAnsi="Times New Roman" w:cs="Times New Roman"/>
-        </w:rPr>
-      </w:pPr>
-    </w:p>
-    <w:p>
-      <w:pPr>
-        <w:rPr>
-          <w:rFonts w:ascii="Times New Roman" w:eastAsia="Times New Roman" w:hAnsi="Times New Roman" w:cs="Times New Roman"/>
-        </w:rPr>
-      </w:pPr>
-    </w:p>
-    <w:p>
-      <w:pPr>
-        <w:jc w:val="center"/>
-        <w:rPr>
-          <w:rFonts w:ascii="Times New Roman" w:eastAsia="Times New Roman" w:hAnsi="Times New Roman" w:cs="Times New Roman"/>
-        </w:rPr>
-      </w:pPr>
-      <w:r>
-        <w:rPr>
-          <w:rFonts w:ascii="Times New Roman" w:eastAsia="Times New Roman" w:hAnsi="Times New Roman" w:cs="Times New Roman"/>
-        </w:rPr>
-        <w:t>University of Hertfordshire</w:t>
-      </w:r>
-    </w:p>
-    <w:p>
-      <w:pPr>
-        <w:jc w:val="center"/>
-        <w:rPr>
-          <w:rFonts w:ascii="Times New Roman" w:eastAsia="Times New Roman" w:hAnsi="Times New Roman" w:cs="Times New Roman"/>
-        </w:rPr>
-      </w:pPr>
-      <w:r>
-        <w:rPr>
-          <w:rFonts w:ascii="Times New Roman" w:eastAsia="Times New Roman" w:hAnsi="Times New Roman" w:cs="Times New Roman"/>
-        </w:rPr>
-        <w:t>Hatfield, 202</w:t>
-      </w:r>
-      <w:r>
-        <w:rPr>
-          <w:rFonts w:ascii="Times New Roman" w:eastAsia="Times New Roman" w:hAnsi="Times New Roman" w:cs="Times New Roman"/>
-        </w:rPr>
-        <w:t>5</w:t>
-      </w:r>
-    </w:p>
-    <w:p>
-      <w:r>
-        <w:br w:type="page"/>
-      </w:r>
-    </w:p>
-    <w:p>
-      <w:pPr>
-        <w:jc w:val="center"/>
-        <w:rPr>
-          <w:rFonts w:ascii="Times New Roman" w:eastAsia="Times New Roman" w:hAnsi="Times New Roman" w:cs="Times New Roman"/>
-        </w:rPr>
-      </w:pPr>
-    </w:p>
-    <w:p>
-      <w:pPr>
-        <w:rPr>
-          <w:rFonts w:ascii="Times New Roman" w:eastAsia="Times New Roman" w:hAnsi="Times New Roman" w:cs="Times New Roman"/>
-        </w:rPr>
-      </w:pPr>
-    </w:p>
-    <w:p>
-      <w:pPr>
-        <w:jc w:val="center"/>
-        <w:rPr>
-          <w:rFonts w:ascii="Times New Roman" w:eastAsia="Times New Roman" w:hAnsi="Times New Roman" w:cs="Times New Roman"/>
-          <w:i/>
-          <w:highlight w:val="yellow"/>
-        </w:rPr>
-      </w:pPr>
-      <w:r>
-        <w:rPr>
-          <w:rFonts w:ascii="Times New Roman" w:eastAsia="Times New Roman" w:hAnsi="Times New Roman" w:cs="Times New Roman"/>
-        </w:rPr>
-        <w:t>Table of Contents</w:t>
-      </w:r>
-      <w:r>
-        <w:rPr>
-          <w:rFonts w:ascii="Times New Roman" w:eastAsia="Times New Roman" w:hAnsi="Times New Roman" w:cs="Times New Roman"/>
-        </w:rPr>
-        <w:t xml:space="preserve"> </w:t>
-      </w:r>
-      <w:r>
-        <w:rPr>
-          <w:rFonts w:ascii="Times New Roman" w:eastAsia="Times New Roman" w:hAnsi="Times New Roman" w:cs="Times New Roman"/>
-          <w:i/>
-          <w:iCs/>
-          <w:highlight w:val="yellow"/>
-        </w:rPr>
-        <w:t xml:space="preserve">add page numbers </w:t>
-      </w:r>
-      <w:r>
-        <w:rPr>
-          <w:rFonts w:ascii="Times New Roman" w:eastAsia="Times New Roman" w:hAnsi="Times New Roman" w:cs="Times New Roman"/>
-          <w:i/>
-          <w:iCs/>
-          <w:highlight w:val="yellow"/>
-        </w:rPr>
-        <w:t xml:space="preserve">from </w:t>
-      </w:r>
-      <w:r>
-        <w:rPr>
-          <w:rFonts w:ascii="Times New Roman" w:eastAsia="Times New Roman" w:hAnsi="Times New Roman" w:cs="Times New Roman"/>
-          <w:i/>
-          <w:iCs/>
-          <w:highlight w:val="yellow"/>
-        </w:rPr>
-        <w:t>here</w:t>
       </w:r>
     </w:p>
     <w:p>
@@ -1042,119 +759,14 @@
           <w:rFonts w:ascii="Times New Roman" w:eastAsia="Times New Roman" w:hAnsi="Times New Roman" w:cs="Times New Roman"/>
           <w:iCs/>
         </w:rPr>
-        <w:t xml:space="preserve"> and r</w:t>
-      </w:r>
-      <w:r>
-        <w:rPr>
-          <w:rFonts w:ascii="Times New Roman" w:eastAsia="Times New Roman" w:hAnsi="Times New Roman" w:cs="Times New Roman"/>
-          <w:iCs/>
-        </w:rPr>
-        <w:t xml:space="preserve">equired </w:t>
-      </w:r>
-      <w:r>
-        <w:rPr>
-          <w:rFonts w:ascii="Times New Roman" w:eastAsia="Times New Roman" w:hAnsi="Times New Roman" w:cs="Times New Roman"/>
-          <w:iCs/>
-        </w:rPr>
-        <w:t>s</w:t>
-      </w:r>
-      <w:r>
-        <w:rPr>
-          <w:rFonts w:ascii="Times New Roman" w:eastAsia="Times New Roman" w:hAnsi="Times New Roman" w:cs="Times New Roman"/>
-          <w:iCs/>
-        </w:rPr>
-        <w:t xml:space="preserve">upplementary </w:t>
-      </w:r>
-      <w:r>
-        <w:rPr>
-          <w:rFonts w:ascii="Times New Roman" w:eastAsia="Times New Roman" w:hAnsi="Times New Roman" w:cs="Times New Roman"/>
-          <w:iCs/>
-        </w:rPr>
-        <w:t>g</w:t>
-      </w:r>
-      <w:r>
-        <w:rPr>
-          <w:rFonts w:ascii="Times New Roman" w:eastAsia="Times New Roman" w:hAnsi="Times New Roman" w:cs="Times New Roman"/>
-          <w:iCs/>
-        </w:rPr>
-        <w:t>raph/</w:t>
-      </w:r>
-      <w:r>
-        <w:rPr>
-          <w:rFonts w:ascii="Times New Roman" w:eastAsia="Times New Roman" w:hAnsi="Times New Roman" w:cs="Times New Roman"/>
-          <w:iCs/>
-        </w:rPr>
-        <w:t>t</w:t>
-      </w:r>
-      <w:r>
-        <w:rPr>
-          <w:rFonts w:ascii="Times New Roman" w:eastAsia="Times New Roman" w:hAnsi="Times New Roman" w:cs="Times New Roman"/>
-          <w:iCs/>
-        </w:rPr>
-        <w:t>able</w:t>
-      </w:r>
-      <w:r>
-        <w:rPr>
-          <w:rFonts w:ascii="Times New Roman" w:eastAsia="Times New Roman" w:hAnsi="Times New Roman" w:cs="Times New Roman"/>
-          <w:iCs/>
-        </w:rPr>
-        <w:t xml:space="preserve"> </w:t>
-      </w:r>
-      <w:r>
-        <w:rPr>
-          <w:rFonts w:ascii="Times New Roman" w:eastAsia="Times New Roman" w:hAnsi="Times New Roman" w:cs="Times New Roman"/>
-          <w:i/>
-        </w:rPr>
-        <w:t>(</w:t>
-      </w:r>
-      <w:r>
-        <w:rPr>
-          <w:rFonts w:ascii="Times New Roman" w:eastAsia="Times New Roman" w:hAnsi="Times New Roman" w:cs="Times New Roman"/>
-          <w:i/>
-        </w:rPr>
-        <w:t>include histogram</w:t>
-      </w:r>
-      <w:r>
-        <w:rPr>
-          <w:rFonts w:ascii="Times New Roman" w:eastAsia="Times New Roman" w:hAnsi="Times New Roman" w:cs="Times New Roman"/>
-          <w:i/>
-        </w:rPr>
-        <w:t xml:space="preserve"> f</w:t>
-      </w:r>
-      <w:r>
-        <w:rPr>
-          <w:rFonts w:ascii="Times New Roman" w:eastAsia="Times New Roman" w:hAnsi="Times New Roman" w:cs="Times New Roman"/>
-          <w:i/>
-        </w:rPr>
-        <w:t>or correlation/comparison of means RQs</w:t>
-      </w:r>
-      <w:r>
-        <w:rPr>
-          <w:rFonts w:ascii="Times New Roman" w:eastAsia="Times New Roman" w:hAnsi="Times New Roman" w:cs="Times New Roman"/>
-          <w:i/>
-        </w:rPr>
-        <w:t xml:space="preserve">, </w:t>
-      </w:r>
-      <w:r>
-        <w:rPr>
-          <w:rFonts w:ascii="Times New Roman" w:eastAsia="Times New Roman" w:hAnsi="Times New Roman" w:cs="Times New Roman"/>
-          <w:i/>
-        </w:rPr>
-        <w:t>include contingency table</w:t>
-      </w:r>
-      <w:r>
-        <w:rPr>
-          <w:rFonts w:ascii="Times New Roman" w:eastAsia="Times New Roman" w:hAnsi="Times New Roman" w:cs="Times New Roman"/>
-          <w:i/>
-        </w:rPr>
-        <w:t xml:space="preserve"> f</w:t>
-      </w:r>
-      <w:r>
-        <w:rPr>
-          <w:rFonts w:ascii="Times New Roman" w:eastAsia="Times New Roman" w:hAnsi="Times New Roman" w:cs="Times New Roman"/>
-          <w:i/>
-        </w:rPr>
-        <w:t xml:space="preserve">or comparison of proportions </w:t>
+        <w:t xml:space="preserve"> and required supplementary graph/table </w:t>
+      </w:r>
+      <w:r>
+        <w:rPr>
+          <w:rFonts w:ascii="Times New Roman" w:eastAsia="Times New Roman" w:hAnsi="Times New Roman" w:cs="Times New Roman"/>
+          <w:i/>
+        </w:rPr>
+        <w:t xml:space="preserve">(include histogram for correlation/comparison of means RQs, include contingency table for comparison of proportions </w:t>
       </w:r>
       <w:r>
         <w:rPr>
@@ -1769,109 +1381,358 @@
       <w:pPr>
         <w:rPr>
           <w:rFonts w:ascii="Times New Roman" w:eastAsia="Times New Roman" w:hAnsi="Times New Roman" w:cs="Times New Roman"/>
-        </w:rPr>
-      </w:pPr>
-    </w:p>
-    <w:p>
-      <w:pPr>
-        <w:pStyle w:val="ListParagraph"/>
-        <w:ind w:left="1440" w:hanging="720"/>
-        <w:rPr>
-          <w:rFonts w:ascii="Times New Roman" w:eastAsia="Times New Roman" w:hAnsi="Times New Roman" w:cs="Times New Roman"/>
-          <w:i/>
-          <w:iCs/>
-          <w:highlight w:val="yellow"/>
-        </w:rPr>
-      </w:pPr>
-      <w:r>
-        <w:rPr>
-          <w:rFonts w:ascii="Times New Roman" w:eastAsia="Times New Roman" w:hAnsi="Times New Roman" w:cs="Times New Roman"/>
-          <w:i/>
-          <w:iCs/>
-          <w:highlight w:val="yellow"/>
-        </w:rPr>
-        <w:t>The list below outlines the chapter/subchapter numbers, names, word count limits, and explanations of what to write in each section.</w:t>
-      </w:r>
-    </w:p>
-    <w:p>
-      <w:pPr>
-        <w:pStyle w:val="ListParagraph"/>
-        <w:ind w:left="1440" w:hanging="720"/>
-        <w:rPr>
-          <w:rFonts w:ascii="Times New Roman" w:eastAsia="Times New Roman" w:hAnsi="Times New Roman" w:cs="Times New Roman"/>
-          <w:i/>
-          <w:iCs/>
-          <w:highlight w:val="yellow"/>
-        </w:rPr>
-      </w:pPr>
-    </w:p>
-    <w:p>
-      <w:pPr>
-        <w:ind w:left="450"/>
-        <w:rPr>
-          <w:rFonts w:ascii="Times New Roman" w:eastAsia="Times New Roman" w:hAnsi="Times New Roman" w:cs="Times New Roman"/>
-        </w:rPr>
-      </w:pPr>
-      <w:r>
-        <w:rPr>
-          <w:rFonts w:ascii="Times New Roman" w:eastAsia="Times New Roman" w:hAnsi="Times New Roman" w:cs="Times New Roman"/>
-        </w:rPr>
-        <w:t xml:space="preserve">1. </w:t>
-      </w:r>
-      <w:r>
-        <w:rPr>
-          <w:rFonts w:ascii="Times New Roman" w:eastAsia="Times New Roman" w:hAnsi="Times New Roman" w:cs="Times New Roman"/>
-        </w:rPr>
-        <w:t>Introduction</w:t>
-      </w:r>
-    </w:p>
-    <w:p>
-      <w:pPr>
-        <w:pStyle w:val="ListParagraph"/>
-        <w:ind w:left="1440" w:hanging="720"/>
-        <w:rPr>
-          <w:rFonts w:ascii="Times New Roman" w:eastAsia="Times New Roman" w:hAnsi="Times New Roman" w:cs="Times New Roman"/>
-          <w:i/>
-          <w:iCs/>
-          <w:highlight w:val="yellow"/>
-        </w:rPr>
-      </w:pPr>
-    </w:p>
-    <w:p>
-      <w:pPr>
-        <w:ind w:left="1440" w:hanging="720"/>
-        <w:rPr>
-          <w:rFonts w:ascii="Times New Roman" w:eastAsia="Times New Roman" w:hAnsi="Times New Roman" w:cs="Times New Roman"/>
-          <w:i/>
-          <w:iCs/>
-        </w:rPr>
-      </w:pPr>
+          <w:i/>
+          <w:iCs/>
+          <w:highlight w:val="yellow"/>
+        </w:rPr>
+      </w:pPr>
+    </w:p>
+    <w:p>
+      <w:pPr>
+        <w:spacing w:after="160" w:line="278" w:lineRule="auto"/>
+        <w:rPr>
+          <w:rFonts w:ascii="Times New Roman" w:hAnsi="Times New Roman" w:cs="Times New Roman"/>
+          <w:b/>
+          <w:bCs/>
+          <w:sz w:val="32"/>
+          <w:szCs w:val="32"/>
+        </w:rPr>
+      </w:pPr>
+      <w:r>
+        <w:rPr>
+          <w:rFonts w:ascii="Times New Roman" w:hAnsi="Times New Roman" w:cs="Times New Roman"/>
+          <w:b/>
+          <w:bCs/>
+          <w:sz w:val="32"/>
+          <w:szCs w:val="32"/>
+        </w:rPr>
+        <w:t>1. Introduction</w:t>
+      </w:r>
     </w:p>
     <w:p>
       <w:pPr>
         <w:pStyle w:val="ListParagraph"/>
         <w:numPr>
           <w:ilvl w:val="1"/>
-          <w:numId w:val="32"/>
+          <w:numId w:val="35"/>
         </w:numPr>
-        <w:ind w:hanging="720"/>
-        <w:rPr>
-          <w:rFonts w:ascii="Times New Roman" w:eastAsia="Times New Roman" w:hAnsi="Times New Roman" w:cs="Times New Roman"/>
-        </w:rPr>
-      </w:pPr>
-      <w:r>
-        <w:rPr>
-          <w:rFonts w:ascii="Times New Roman" w:eastAsia="Times New Roman" w:hAnsi="Times New Roman" w:cs="Times New Roman"/>
-        </w:rPr>
-        <w:t xml:space="preserve">Problem statement and research motivation </w:t>
-      </w:r>
-      <w:r>
-        <w:rPr>
-          <w:rFonts w:ascii="Times New Roman" w:eastAsia="Times New Roman" w:hAnsi="Times New Roman" w:cs="Times New Roman"/>
+        <w:spacing w:after="160" w:line="278" w:lineRule="auto"/>
+        <w:rPr>
+          <w:rFonts w:ascii="Times New Roman" w:hAnsi="Times New Roman" w:cs="Times New Roman"/>
           <w:b/>
           <w:bCs/>
-        </w:rPr>
-        <w:t>(100 words)</w:t>
+          <w:sz w:val="28"/>
+          <w:szCs w:val="28"/>
+        </w:rPr>
+      </w:pPr>
+      <w:r>
+        <w:rPr>
+          <w:rFonts w:ascii="Times New Roman" w:hAnsi="Times New Roman" w:cs="Times New Roman"/>
+          <w:b/>
+          <w:bCs/>
+          <w:sz w:val="28"/>
+          <w:szCs w:val="28"/>
+        </w:rPr>
+        <w:t xml:space="preserve">Problem statement and research motivation </w:t>
+      </w:r>
+    </w:p>
+    <w:p>
+      <w:pPr>
+        <w:jc w:val="both"/>
+        <w:rPr>
+          <w:rFonts w:ascii="Times New Roman" w:eastAsia="Times New Roman" w:hAnsi="Times New Roman" w:cs="Times New Roman"/>
+          <w:kern w:val="0"/>
+          <w:lang w:val="en-IN" w:eastAsia="ko-KR"/>
+          <w14:ligatures w14:val="none"/>
+        </w:rPr>
+      </w:pPr>
+      <w:r>
+        <w:rPr>
+          <w:rFonts w:ascii="Times New Roman" w:eastAsia="Times New Roman" w:hAnsi="Times New Roman" w:cs="Times New Roman"/>
+          <w:kern w:val="0"/>
+          <w:lang w:val="en-IN" w:eastAsia="ko-KR"/>
+          <w14:ligatures w14:val="none"/>
+        </w:rPr>
+        <w:t>According to estimates from the World Health Organisation, alcohol causes 2.6 million deaths annually, making it a significant public health issue (Manthey et al., 2024). Excessive alcohol consumption is associated with liver disease, heart issues, and some types of cancer, while moderate drinking may have few advantages. It's critical to comprehend the relationship between population life expectancy and national alcohol use. In order to fill a gap in cross-national health research and inform alcohol-harm reduction strategies, this study investigates whether nations with higher per-capita alcohol consumption have noticeably different life expectancy results.</w:t>
+      </w:r>
+    </w:p>
+    <w:p>
+      <w:pPr>
+        <w:rPr>
+          <w:rFonts w:ascii="Times New Roman" w:eastAsia="Times New Roman" w:hAnsi="Times New Roman" w:cs="Times New Roman"/>
+          <w:kern w:val="0"/>
+          <w:lang w:val="en-IN" w:eastAsia="ko-KR"/>
+          <w14:ligatures w14:val="none"/>
+        </w:rPr>
+      </w:pPr>
+    </w:p>
+    <w:p>
+      <w:pPr>
+        <w:pStyle w:val="ListParagraph"/>
+        <w:numPr>
+          <w:ilvl w:val="1"/>
+          <w:numId w:val="35"/>
+        </w:numPr>
+        <w:spacing w:after="160" w:line="278" w:lineRule="auto"/>
+        <w:rPr>
+          <w:rFonts w:ascii="Times New Roman" w:hAnsi="Times New Roman" w:cs="Times New Roman"/>
+          <w:b/>
+          <w:bCs/>
+          <w:sz w:val="28"/>
+          <w:szCs w:val="28"/>
+        </w:rPr>
+      </w:pPr>
+      <w:r>
+        <w:rPr>
+          <w:rFonts w:ascii="Times New Roman" w:hAnsi="Times New Roman" w:cs="Times New Roman"/>
+          <w:b/>
+          <w:bCs/>
+          <w:sz w:val="28"/>
+          <w:szCs w:val="28"/>
+        </w:rPr>
+        <w:t xml:space="preserve">The data set </w:t>
+      </w:r>
+    </w:p>
+    <w:p>
+      <w:pPr>
+        <w:jc w:val="both"/>
+        <w:rPr>
+          <w:rFonts w:ascii="Times New Roman" w:eastAsia="Times New Roman" w:hAnsi="Times New Roman" w:cs="Times New Roman"/>
+          <w:kern w:val="0"/>
+          <w:lang w:val="en-IN" w:eastAsia="ko-KR"/>
+          <w14:ligatures w14:val="none"/>
+        </w:rPr>
+      </w:pPr>
+      <w:r>
+        <w:rPr>
+          <w:rFonts w:ascii="Times New Roman" w:eastAsia="Times New Roman" w:hAnsi="Times New Roman" w:cs="Times New Roman"/>
+          <w:kern w:val="0"/>
+          <w:lang w:val="en-IN" w:eastAsia="ko-KR"/>
+          <w14:ligatures w14:val="none"/>
+        </w:rPr>
+        <w:t>The dataset includes cross-sectional information on life expectancy and alcohol consumption in several different nations. The name of the nation, the amount of pure alcohol consumed per person in litres for those over 15, and the years of life expectancy at birth are important factors. It makes it possible to compare the association between longevity and alcohol intake across various geographical areas with disparate healthcare systems and cultural perspectives.</w:t>
+      </w:r>
+    </w:p>
+    <w:p>
+      <w:pPr>
+        <w:jc w:val="both"/>
+        <w:rPr>
+          <w:rFonts w:ascii="Times New Roman" w:eastAsia="Times New Roman" w:hAnsi="Times New Roman" w:cs="Times New Roman"/>
+          <w:kern w:val="0"/>
+          <w:lang w:val="en-IN" w:eastAsia="ko-KR"/>
+          <w14:ligatures w14:val="none"/>
+        </w:rPr>
+      </w:pPr>
+    </w:p>
+    <w:p>
+      <w:pPr>
+        <w:pStyle w:val="ListParagraph"/>
+        <w:numPr>
+          <w:ilvl w:val="1"/>
+          <w:numId w:val="35"/>
+        </w:numPr>
+        <w:rPr>
+          <w:rFonts w:ascii="Times New Roman" w:eastAsia="Times New Roman" w:hAnsi="Times New Roman" w:cs="Times New Roman"/>
+          <w:b/>
+          <w:bCs/>
+          <w:kern w:val="0"/>
+          <w:sz w:val="28"/>
+          <w:szCs w:val="28"/>
+          <w:lang w:val="en-IN" w:eastAsia="ko-KR"/>
+          <w14:ligatures w14:val="none"/>
+        </w:rPr>
+      </w:pPr>
+      <w:r>
+        <w:rPr>
+          <w:rFonts w:ascii="Times New Roman" w:eastAsia="Times New Roman" w:hAnsi="Times New Roman" w:cs="Times New Roman"/>
+          <w:b/>
+          <w:bCs/>
+          <w:kern w:val="0"/>
+          <w:sz w:val="28"/>
+          <w:szCs w:val="28"/>
+          <w:lang w:val="en-IN" w:eastAsia="ko-KR"/>
+          <w14:ligatures w14:val="none"/>
+        </w:rPr>
+        <w:t>Research Question</w:t>
+      </w:r>
+    </w:p>
+    <w:p>
+      <w:pPr>
+        <w:rPr>
+          <w:rFonts w:ascii="Times New Roman" w:eastAsia="Times New Roman" w:hAnsi="Times New Roman" w:cs="Times New Roman"/>
+          <w:lang w:val="en-IN"/>
+        </w:rPr>
+      </w:pPr>
+    </w:p>
+    <w:p>
+      <w:pPr>
+        <w:spacing w:after="160" w:line="278" w:lineRule="auto"/>
+        <w:jc w:val="both"/>
+        <w:rPr>
+          <w:rFonts w:ascii="Times New Roman" w:hAnsi="Times New Roman" w:cs="Times New Roman"/>
+          <w:lang w:val="en-IN"/>
+        </w:rPr>
+      </w:pPr>
+      <w:r>
+        <w:rPr>
+          <w:rFonts w:ascii="Times New Roman" w:hAnsi="Times New Roman" w:cs="Times New Roman"/>
+          <w:b/>
+          <w:bCs/>
+        </w:rPr>
+        <w:t>Is there a statistically significant correlation between alcohol consumption per capita (litres of pure alcohol, ages 15+) and life expectancy at birth (years) across countries?</w:t>
+      </w:r>
+      <w:r>
+        <w:rPr>
+          <w:rFonts w:ascii="Times New Roman" w:eastAsia="Times New Roman" w:hAnsi="Times New Roman" w:cs="Times New Roman"/>
+          <w:lang w:val="en-IN"/>
+        </w:rPr>
+        <w:br/>
+      </w:r>
+      <w:r>
+        <w:rPr>
+          <w:rFonts w:ascii="Times New Roman" w:hAnsi="Times New Roman" w:cs="Times New Roman"/>
+          <w:lang w:val="en-IN"/>
+        </w:rPr>
+        <w:t>This study evaluates the direction and strength of any association between national alcohol consumption patterns and population longevity.</w:t>
+      </w:r>
+    </w:p>
+    <w:p>
+      <w:pPr>
+        <w:pStyle w:val="ListParagraph"/>
+        <w:numPr>
+          <w:ilvl w:val="1"/>
+          <w:numId w:val="35"/>
+        </w:numPr>
+        <w:rPr>
+          <w:rFonts w:ascii="Times New Roman" w:eastAsia="Times New Roman" w:hAnsi="Times New Roman" w:cs="Times New Roman"/>
+          <w:b/>
+          <w:bCs/>
+          <w:sz w:val="28"/>
+          <w:szCs w:val="28"/>
+        </w:rPr>
+      </w:pPr>
+      <w:r>
+        <w:rPr>
+          <w:rFonts w:ascii="Times New Roman" w:eastAsia="Times New Roman" w:hAnsi="Times New Roman" w:cs="Times New Roman"/>
+          <w:b/>
+          <w:bCs/>
+          <w:sz w:val="28"/>
+          <w:szCs w:val="28"/>
+        </w:rPr>
+        <w:t>Null hypothesis and alternative hypothesis (H0/H1) (100 words)</w:t>
+      </w:r>
+    </w:p>
+    <w:p>
+      <w:pPr>
+        <w:pStyle w:val="ListParagraph"/>
+        <w:ind w:left="420"/>
+        <w:rPr>
+          <w:rFonts w:ascii="Times New Roman" w:eastAsia="Times New Roman" w:hAnsi="Times New Roman" w:cs="Times New Roman"/>
+          <w:b/>
+          <w:bCs/>
+          <w:sz w:val="28"/>
+          <w:szCs w:val="28"/>
+        </w:rPr>
+      </w:pPr>
+    </w:p>
+    <w:p>
+      <w:pPr>
+        <w:spacing w:after="160" w:line="278" w:lineRule="auto"/>
+        <w:jc w:val="both"/>
+        <w:rPr>
+          <w:rFonts w:ascii="Times New Roman" w:hAnsi="Times New Roman" w:cs="Times New Roman"/>
+          <w:lang w:val="en-IN"/>
+        </w:rPr>
+      </w:pPr>
+      <w:r>
+        <w:rPr>
+          <w:rFonts w:ascii="Times New Roman" w:hAnsi="Times New Roman" w:cs="Times New Roman"/>
+          <w:b/>
+          <w:bCs/>
+          <w:lang w:val="en-IN"/>
+        </w:rPr>
+        <w:t xml:space="preserve">Null Hypothesis (H0): </w:t>
+      </w:r>
+      <w:r>
+        <w:rPr>
+          <w:rFonts w:ascii="Times New Roman" w:hAnsi="Times New Roman" w:cs="Times New Roman"/>
+          <w:lang w:val="en-IN"/>
+        </w:rPr>
+        <w:t xml:space="preserve">Life expectancy at birth does not significantly correlate with alcohol use per capita across nations. The population correlation coefficient, represented by ρ = 0, indicates that any observable association is the result of random chance. </w:t>
+      </w:r>
+      <w:r>
+        <w:rPr>
+          <w:rFonts w:ascii="Times New Roman" w:hAnsi="Times New Roman" w:cs="Times New Roman"/>
+          <w:lang w:val="en-IN"/>
+        </w:rPr>
+        <w:br/>
+      </w:r>
+      <w:r>
+        <w:rPr>
+          <w:rFonts w:ascii="Times New Roman" w:hAnsi="Times New Roman" w:cs="Times New Roman"/>
+          <w:b/>
+          <w:bCs/>
+          <w:lang w:val="en-IN"/>
+        </w:rPr>
+        <w:t xml:space="preserve">Alternative Hypothesis (H1): </w:t>
+      </w:r>
+      <w:r>
+        <w:rPr>
+          <w:rFonts w:ascii="Times New Roman" w:hAnsi="Times New Roman" w:cs="Times New Roman"/>
+          <w:lang w:val="en-IN"/>
+        </w:rPr>
+        <w:t>Life expectancy at birth is significantly correlated with per capita alcohol use across nations. The correlation coefficient (ρ ≠ 0) differs significantly from zero. This two-tailed hypothesis acknowledges that, depending on confounding variables like economic development, healthcare access, and cultural customs, the link may theoretically work in either direction and enables for the detection of positive and negative correlations.</w:t>
+      </w:r>
+    </w:p>
+    <w:p>
+      <w:pPr>
+        <w:spacing w:after="160" w:line="278" w:lineRule="auto"/>
+        <w:rPr>
+          <w:lang w:val="en-IN"/>
+        </w:rPr>
+      </w:pPr>
+    </w:p>
+    <w:p>
+      <w:pPr>
+        <w:spacing w:after="160" w:line="278" w:lineRule="auto"/>
+        <w:rPr>
+          <w:lang w:val="en-IN"/>
+        </w:rPr>
+      </w:pPr>
+    </w:p>
+    <w:p>
+      <w:pPr>
+        <w:spacing w:after="160" w:line="278" w:lineRule="auto"/>
+      </w:pPr>
+    </w:p>
+    <w:p>
+      <w:pPr>
+        <w:rPr>
+          <w:rFonts w:ascii="Times New Roman" w:eastAsia="Times New Roman" w:hAnsi="Times New Roman" w:cs="Times New Roman"/>
+          <w:lang w:val="en-IN"/>
+        </w:rPr>
+      </w:pPr>
+    </w:p>
+    <w:p>
+      <w:pPr>
+        <w:pStyle w:val="ListParagraph"/>
+        <w:rPr>
+          <w:rFonts w:ascii="Times New Roman" w:eastAsia="Times New Roman" w:hAnsi="Times New Roman" w:cs="Times New Roman"/>
+        </w:rPr>
+      </w:pPr>
+    </w:p>
+    <w:p>
+      <w:pPr>
+        <w:ind w:left="1440"/>
+        <w:rPr>
+          <w:rFonts w:ascii="Times New Roman" w:eastAsia="Times New Roman" w:hAnsi="Times New Roman" w:cs="Times New Roman"/>
+        </w:rPr>
+      </w:pPr>
+      <w:r>
+        <w:rPr>
+          <w:rFonts w:ascii="Times New Roman" w:eastAsia="Times New Roman" w:hAnsi="Times New Roman" w:cs="Times New Roman"/>
+        </w:rPr>
+        <w:t xml:space="preserve"> </w:t>
       </w:r>
     </w:p>
     <w:p>
@@ -1879,98 +1740,18 @@
         <w:pStyle w:val="ListParagraph"/>
         <w:numPr>
           <w:ilvl w:val="0"/>
-          <w:numId w:val="31"/>
+          <w:numId w:val="35"/>
         </w:numPr>
-        <w:ind w:left="2160"/>
-        <w:rPr>
-          <w:rFonts w:ascii="Times New Roman" w:eastAsia="Times New Roman" w:hAnsi="Times New Roman" w:cs="Times New Roman"/>
-          <w:i/>
-          <w:iCs/>
-          <w:color w:val="000000" w:themeColor="text1"/>
-          <w:highlight w:val="yellow"/>
-        </w:rPr>
-      </w:pPr>
-      <w:r>
-        <w:rPr>
-          <w:rFonts w:ascii="Times New Roman" w:eastAsia="Times New Roman" w:hAnsi="Times New Roman" w:cs="Times New Roman"/>
-          <w:i/>
-          <w:iCs/>
-          <w:color w:val="000000" w:themeColor="text1"/>
-          <w:highlight w:val="yellow"/>
-        </w:rPr>
-        <w:t xml:space="preserve">What is </w:t>
-      </w:r>
-      <w:r>
-        <w:rPr>
-          <w:rFonts w:ascii="Times New Roman" w:eastAsia="Times New Roman" w:hAnsi="Times New Roman" w:cs="Times New Roman"/>
-          <w:i/>
-          <w:iCs/>
-          <w:color w:val="000000" w:themeColor="text1"/>
-          <w:highlight w:val="yellow"/>
-        </w:rPr>
-        <w:t xml:space="preserve">the </w:t>
-      </w:r>
-      <w:r>
-        <w:rPr>
-          <w:rFonts w:ascii="Times New Roman" w:eastAsia="Times New Roman" w:hAnsi="Times New Roman" w:cs="Times New Roman"/>
-          <w:i/>
-          <w:iCs/>
-          <w:color w:val="000000" w:themeColor="text1"/>
-          <w:highlight w:val="yellow"/>
-        </w:rPr>
-        <w:t xml:space="preserve">problem in </w:t>
-      </w:r>
-      <w:r>
-        <w:rPr>
-          <w:rFonts w:ascii="Times New Roman" w:eastAsia="Times New Roman" w:hAnsi="Times New Roman" w:cs="Times New Roman"/>
-          <w:i/>
-          <w:iCs/>
-          <w:color w:val="000000" w:themeColor="text1"/>
-          <w:highlight w:val="yellow"/>
-        </w:rPr>
-        <w:t xml:space="preserve">the </w:t>
-      </w:r>
-      <w:r>
-        <w:rPr>
-          <w:rFonts w:ascii="Times New Roman" w:eastAsia="Times New Roman" w:hAnsi="Times New Roman" w:cs="Times New Roman"/>
-          <w:i/>
-          <w:iCs/>
-          <w:color w:val="000000" w:themeColor="text1"/>
-          <w:highlight w:val="yellow"/>
-        </w:rPr>
-        <w:t>area we want to learn more about (motivation for study).</w:t>
-      </w:r>
-    </w:p>
-    <w:p>
-      <w:pPr>
-        <w:pStyle w:val="ListParagraph"/>
-        <w:numPr>
-          <w:ilvl w:val="0"/>
-          <w:numId w:val="31"/>
-        </w:numPr>
-        <w:ind w:left="2160"/>
-        <w:rPr>
-          <w:rFonts w:ascii="Times New Roman" w:eastAsia="Times New Roman" w:hAnsi="Times New Roman" w:cs="Times New Roman"/>
-          <w:color w:val="000000" w:themeColor="text1"/>
-          <w:highlight w:val="yellow"/>
-        </w:rPr>
-      </w:pPr>
-      <w:r>
-        <w:rPr>
-          <w:rFonts w:ascii="Times New Roman" w:eastAsia="Times New Roman" w:hAnsi="Times New Roman" w:cs="Times New Roman"/>
-          <w:i/>
-          <w:iCs/>
-          <w:color w:val="000000" w:themeColor="text1"/>
-          <w:highlight w:val="yellow"/>
-        </w:rPr>
-        <w:t>Use at least one citation from related literature for top marks.</w:t>
-      </w:r>
-      <w:r>
-        <w:rPr>
-          <w:rFonts w:ascii="Times New Roman" w:eastAsia="Times New Roman" w:hAnsi="Times New Roman" w:cs="Times New Roman"/>
-          <w:color w:val="000000" w:themeColor="text1"/>
-        </w:rPr>
-        <w:t xml:space="preserve"> </w:t>
+        <w:rPr>
+          <w:rFonts w:ascii="Times New Roman" w:eastAsia="Times New Roman" w:hAnsi="Times New Roman" w:cs="Times New Roman"/>
+        </w:rPr>
+      </w:pPr>
+      <w:r>
+        <w:rPr>
+          <w:rFonts w:ascii="Times New Roman" w:eastAsia="Times New Roman" w:hAnsi="Times New Roman" w:cs="Times New Roman"/>
+        </w:rPr>
+        <w:lastRenderedPageBreak/>
+        <w:t>Background research</w:t>
       </w:r>
     </w:p>
     <w:p>
@@ -1978,174 +1759,7 @@
         <w:pStyle w:val="ListParagraph"/>
         <w:numPr>
           <w:ilvl w:val="1"/>
-          <w:numId w:val="32"/>
-        </w:numPr>
-        <w:ind w:hanging="720"/>
-        <w:rPr>
-          <w:rFonts w:ascii="Times New Roman" w:eastAsia="Times New Roman" w:hAnsi="Times New Roman" w:cs="Times New Roman"/>
-        </w:rPr>
-      </w:pPr>
-      <w:r>
-        <w:rPr>
-          <w:rFonts w:ascii="Times New Roman" w:eastAsia="Times New Roman" w:hAnsi="Times New Roman" w:cs="Times New Roman"/>
-        </w:rPr>
-        <w:t xml:space="preserve">The data set </w:t>
-      </w:r>
-      <w:r>
-        <w:rPr>
-          <w:rFonts w:ascii="Times New Roman" w:eastAsia="Times New Roman" w:hAnsi="Times New Roman" w:cs="Times New Roman"/>
-          <w:b/>
-        </w:rPr>
-        <w:t>(75 words)</w:t>
-      </w:r>
-    </w:p>
-    <w:p>
-      <w:pPr>
-        <w:pStyle w:val="ListParagraph"/>
-        <w:numPr>
-          <w:ilvl w:val="1"/>
-          <w:numId w:val="32"/>
-        </w:numPr>
-        <w:ind w:hanging="720"/>
-        <w:rPr>
-          <w:rFonts w:ascii="Times New Roman" w:eastAsia="Times New Roman" w:hAnsi="Times New Roman" w:cs="Times New Roman"/>
-          <w:b/>
-          <w:bCs/>
-        </w:rPr>
-      </w:pPr>
-      <w:r>
-        <w:rPr>
-          <w:rFonts w:ascii="Times New Roman" w:eastAsia="Times New Roman" w:hAnsi="Times New Roman" w:cs="Times New Roman"/>
-        </w:rPr>
-        <w:t>R</w:t>
-      </w:r>
-      <w:r>
-        <w:rPr>
-          <w:rFonts w:ascii="Times New Roman" w:eastAsia="Times New Roman" w:hAnsi="Times New Roman" w:cs="Times New Roman"/>
-        </w:rPr>
-        <w:t>esearch question</w:t>
-      </w:r>
-      <w:r>
-        <w:rPr>
-          <w:rFonts w:ascii="Times New Roman" w:eastAsia="Times New Roman" w:hAnsi="Times New Roman" w:cs="Times New Roman"/>
-        </w:rPr>
-        <w:t xml:space="preserve"> </w:t>
-      </w:r>
-      <w:r>
-        <w:rPr>
-          <w:rFonts w:ascii="Times New Roman" w:eastAsia="Times New Roman" w:hAnsi="Times New Roman" w:cs="Times New Roman"/>
-          <w:b/>
-          <w:bCs/>
-        </w:rPr>
-        <w:t>(50 words)</w:t>
-      </w:r>
-      <w:r>
-        <w:rPr>
-          <w:rFonts w:ascii="Times New Roman" w:eastAsia="Times New Roman" w:hAnsi="Times New Roman" w:cs="Times New Roman"/>
-          <w:b/>
-          <w:bCs/>
-        </w:rPr>
-        <w:t xml:space="preserve">. </w:t>
-      </w:r>
-      <w:r>
-        <w:rPr>
-          <w:rFonts w:ascii="Times New Roman" w:eastAsia="Times New Roman" w:hAnsi="Times New Roman" w:cs="Times New Roman"/>
-          <w:i/>
-          <w:iCs/>
-          <w:highlight w:val="yellow"/>
-        </w:rPr>
-        <w:t>State your RQ</w:t>
-      </w:r>
-      <w:r>
-        <w:rPr>
-          <w:rFonts w:ascii="Times New Roman" w:eastAsia="Times New Roman" w:hAnsi="Times New Roman" w:cs="Times New Roman"/>
-          <w:i/>
-          <w:iCs/>
-        </w:rPr>
-        <w:t xml:space="preserve"> </w:t>
-      </w:r>
-      <w:r>
-        <w:rPr>
-          <w:rFonts w:ascii="Times New Roman" w:eastAsia="Times New Roman" w:hAnsi="Times New Roman" w:cs="Times New Roman"/>
-          <w:b/>
-          <w:bCs/>
-        </w:rPr>
-        <w:t>(50 words)</w:t>
-      </w:r>
-    </w:p>
-    <w:p>
-      <w:pPr>
-        <w:pStyle w:val="ListParagraph"/>
-        <w:numPr>
-          <w:ilvl w:val="1"/>
-          <w:numId w:val="32"/>
-        </w:numPr>
-        <w:ind w:hanging="720"/>
-        <w:rPr>
-          <w:rFonts w:ascii="Times New Roman" w:eastAsia="Times New Roman" w:hAnsi="Times New Roman" w:cs="Times New Roman"/>
-        </w:rPr>
-      </w:pPr>
-      <w:r>
-        <w:rPr>
-          <w:rFonts w:ascii="Times New Roman" w:eastAsia="Times New Roman" w:hAnsi="Times New Roman" w:cs="Times New Roman"/>
-        </w:rPr>
-        <w:t xml:space="preserve">Null hypothesis and alternative hypothesis (H0/H1) </w:t>
-      </w:r>
-      <w:r>
-        <w:rPr>
-          <w:rFonts w:ascii="Times New Roman" w:eastAsia="Times New Roman" w:hAnsi="Times New Roman" w:cs="Times New Roman"/>
-          <w:b/>
-          <w:bCs/>
-        </w:rPr>
-        <w:t>(100 words)</w:t>
-      </w:r>
-    </w:p>
-    <w:p>
-      <w:pPr>
-        <w:pStyle w:val="ListParagraph"/>
-        <w:rPr>
-          <w:rFonts w:ascii="Times New Roman" w:eastAsia="Times New Roman" w:hAnsi="Times New Roman" w:cs="Times New Roman"/>
-        </w:rPr>
-      </w:pPr>
-    </w:p>
-    <w:p>
-      <w:pPr>
-        <w:ind w:left="1440"/>
-        <w:rPr>
-          <w:rFonts w:ascii="Times New Roman" w:eastAsia="Times New Roman" w:hAnsi="Times New Roman" w:cs="Times New Roman"/>
-        </w:rPr>
-      </w:pPr>
-      <w:r>
-        <w:rPr>
-          <w:rFonts w:ascii="Times New Roman" w:eastAsia="Times New Roman" w:hAnsi="Times New Roman" w:cs="Times New Roman"/>
-        </w:rPr>
-        <w:t xml:space="preserve"> </w:t>
-      </w:r>
-    </w:p>
-    <w:p>
-      <w:pPr>
-        <w:pStyle w:val="ListParagraph"/>
-        <w:numPr>
-          <w:ilvl w:val="0"/>
-          <w:numId w:val="32"/>
-        </w:numPr>
-        <w:rPr>
-          <w:rFonts w:ascii="Times New Roman" w:eastAsia="Times New Roman" w:hAnsi="Times New Roman" w:cs="Times New Roman"/>
-        </w:rPr>
-      </w:pPr>
-      <w:r>
-        <w:rPr>
-          <w:rFonts w:ascii="Times New Roman" w:eastAsia="Times New Roman" w:hAnsi="Times New Roman" w:cs="Times New Roman"/>
-        </w:rPr>
-        <w:t>Background research</w:t>
-      </w:r>
-    </w:p>
-    <w:p>
-      <w:pPr>
-        <w:pStyle w:val="ListParagraph"/>
-        <w:numPr>
-          <w:ilvl w:val="1"/>
-          <w:numId w:val="32"/>
+          <w:numId w:val="35"/>
         </w:numPr>
         <w:ind w:hanging="720"/>
         <w:rPr>
@@ -2249,7 +1863,7 @@
         </w:rPr>
         <w:t xml:space="preserve"> See </w:t>
       </w:r>
-      <w:hyperlink r:id="rId7" w:history="1">
+      <w:hyperlink r:id="rId10" w:history="1">
         <w:r>
           <w:rPr>
             <w:rStyle w:val="Hyperlink"/>
@@ -2290,7 +1904,7 @@
         <w:pStyle w:val="ListParagraph"/>
         <w:numPr>
           <w:ilvl w:val="1"/>
-          <w:numId w:val="32"/>
+          <w:numId w:val="35"/>
         </w:numPr>
         <w:ind w:hanging="720"/>
         <w:rPr>
@@ -2343,7 +1957,7 @@
         <w:pStyle w:val="ListParagraph"/>
         <w:numPr>
           <w:ilvl w:val="0"/>
-          <w:numId w:val="32"/>
+          <w:numId w:val="35"/>
         </w:numPr>
         <w:rPr>
           <w:rFonts w:ascii="Times New Roman" w:eastAsia="Times New Roman" w:hAnsi="Times New Roman" w:cs="Times New Roman"/>
@@ -2361,7 +1975,7 @@
         <w:pStyle w:val="ListParagraph"/>
         <w:numPr>
           <w:ilvl w:val="1"/>
-          <w:numId w:val="32"/>
+          <w:numId w:val="35"/>
         </w:numPr>
         <w:ind w:hanging="720"/>
         <w:rPr>
@@ -2864,7 +2478,7 @@
         <w:pStyle w:val="ListParagraph"/>
         <w:numPr>
           <w:ilvl w:val="1"/>
-          <w:numId w:val="32"/>
+          <w:numId w:val="35"/>
         </w:numPr>
         <w:ind w:hanging="720"/>
         <w:rPr>
@@ -2950,7 +2564,7 @@
         <w:pStyle w:val="ListParagraph"/>
         <w:numPr>
           <w:ilvl w:val="1"/>
-          <w:numId w:val="32"/>
+          <w:numId w:val="35"/>
         </w:numPr>
         <w:ind w:hanging="720"/>
         <w:rPr>
@@ -3047,7 +2661,7 @@
         <w:pStyle w:val="ListParagraph"/>
         <w:numPr>
           <w:ilvl w:val="0"/>
-          <w:numId w:val="32"/>
+          <w:numId w:val="35"/>
         </w:numPr>
         <w:rPr>
           <w:rFonts w:ascii="Times New Roman" w:eastAsia="Times New Roman" w:hAnsi="Times New Roman" w:cs="Times New Roman"/>
@@ -3065,7 +2679,7 @@
         <w:pStyle w:val="ListParagraph"/>
         <w:numPr>
           <w:ilvl w:val="1"/>
-          <w:numId w:val="32"/>
+          <w:numId w:val="35"/>
         </w:numPr>
         <w:ind w:hanging="720"/>
         <w:rPr>
@@ -3078,7 +2692,6 @@
         <w:rPr>
           <w:rFonts w:ascii="Times New Roman" w:eastAsia="Times New Roman" w:hAnsi="Times New Roman" w:cs="Times New Roman"/>
         </w:rPr>
-        <w:lastRenderedPageBreak/>
         <w:t>Statistical test used to test the hypotheses and output</w:t>
       </w:r>
       <w:r>
@@ -3208,7 +2821,7 @@
         <w:pStyle w:val="ListParagraph"/>
         <w:numPr>
           <w:ilvl w:val="1"/>
-          <w:numId w:val="32"/>
+          <w:numId w:val="35"/>
         </w:numPr>
         <w:ind w:hanging="720"/>
         <w:rPr>
@@ -3281,7 +2894,7 @@
         <w:pStyle w:val="ListParagraph"/>
         <w:numPr>
           <w:ilvl w:val="0"/>
-          <w:numId w:val="32"/>
+          <w:numId w:val="35"/>
         </w:numPr>
         <w:rPr>
           <w:rFonts w:ascii="Times New Roman" w:eastAsia="Times New Roman" w:hAnsi="Times New Roman" w:cs="Times New Roman"/>
@@ -3299,7 +2912,7 @@
         <w:pStyle w:val="ListParagraph"/>
         <w:numPr>
           <w:ilvl w:val="1"/>
-          <w:numId w:val="32"/>
+          <w:numId w:val="35"/>
         </w:numPr>
         <w:ind w:hanging="720"/>
         <w:rPr>
@@ -3332,7 +2945,7 @@
         <w:pStyle w:val="ListParagraph"/>
         <w:numPr>
           <w:ilvl w:val="1"/>
-          <w:numId w:val="32"/>
+          <w:numId w:val="35"/>
         </w:numPr>
         <w:ind w:hanging="720"/>
         <w:rPr>
@@ -3365,7 +2978,7 @@
         <w:pStyle w:val="ListParagraph"/>
         <w:numPr>
           <w:ilvl w:val="1"/>
-          <w:numId w:val="32"/>
+          <w:numId w:val="35"/>
         </w:numPr>
         <w:ind w:hanging="720"/>
         <w:rPr>
@@ -3391,7 +3004,7 @@
         <w:pStyle w:val="ListParagraph"/>
         <w:numPr>
           <w:ilvl w:val="1"/>
-          <w:numId w:val="32"/>
+          <w:numId w:val="35"/>
         </w:numPr>
         <w:ind w:hanging="720"/>
         <w:rPr>
@@ -3417,7 +3030,7 @@
         <w:pStyle w:val="ListParagraph"/>
         <w:numPr>
           <w:ilvl w:val="1"/>
-          <w:numId w:val="32"/>
+          <w:numId w:val="35"/>
         </w:numPr>
         <w:ind w:hanging="720"/>
         <w:rPr>
@@ -3526,7 +3139,7 @@
         <w:pStyle w:val="ListParagraph"/>
         <w:numPr>
           <w:ilvl w:val="1"/>
-          <w:numId w:val="32"/>
+          <w:numId w:val="35"/>
         </w:numPr>
         <w:ind w:hanging="720"/>
         <w:rPr>
@@ -3643,6 +3256,7 @@
           <w:iCs/>
           <w:highlight w:val="yellow"/>
         </w:rPr>
+        <w:lastRenderedPageBreak/>
         <w:t>From your Git log, select three most significant commits during this project and include the following for each:</w:t>
       </w:r>
     </w:p>
@@ -3832,7 +3446,7 @@
         <w:pStyle w:val="ListParagraph"/>
         <w:numPr>
           <w:ilvl w:val="0"/>
-          <w:numId w:val="32"/>
+          <w:numId w:val="35"/>
         </w:numPr>
         <w:rPr>
           <w:rFonts w:ascii="Times New Roman" w:eastAsia="Times New Roman" w:hAnsi="Times New Roman" w:cs="Times New Roman"/>
@@ -3850,7 +3464,7 @@
         <w:pStyle w:val="ListParagraph"/>
         <w:numPr>
           <w:ilvl w:val="1"/>
-          <w:numId w:val="32"/>
+          <w:numId w:val="35"/>
         </w:numPr>
         <w:ind w:hanging="720"/>
         <w:rPr>
@@ -3883,7 +3497,7 @@
         <w:pStyle w:val="ListParagraph"/>
         <w:numPr>
           <w:ilvl w:val="1"/>
-          <w:numId w:val="32"/>
+          <w:numId w:val="35"/>
         </w:numPr>
         <w:ind w:hanging="720"/>
         <w:rPr>
@@ -3983,7 +3597,7 @@
         <w:pStyle w:val="ListParagraph"/>
         <w:numPr>
           <w:ilvl w:val="1"/>
-          <w:numId w:val="32"/>
+          <w:numId w:val="35"/>
         </w:numPr>
         <w:ind w:hanging="720"/>
         <w:rPr>
@@ -4030,7 +3644,7 @@
         <w:pStyle w:val="ListParagraph"/>
         <w:numPr>
           <w:ilvl w:val="0"/>
-          <w:numId w:val="32"/>
+          <w:numId w:val="35"/>
         </w:numPr>
         <w:rPr>
           <w:rFonts w:ascii="Times New Roman" w:eastAsia="Times New Roman" w:hAnsi="Times New Roman" w:cs="Times New Roman"/>
@@ -4130,7 +3744,7 @@
         <w:pStyle w:val="ListParagraph"/>
         <w:numPr>
           <w:ilvl w:val="0"/>
-          <w:numId w:val="32"/>
+          <w:numId w:val="35"/>
         </w:numPr>
         <w:rPr>
           <w:rFonts w:ascii="Times New Roman" w:eastAsia="Times New Roman" w:hAnsi="Times New Roman" w:cs="Times New Roman"/>
@@ -4377,10 +3991,10 @@
       </w:pPr>
     </w:p>
     <w:sectPr>
-      <w:footerReference w:type="even" r:id="rId8"/>
-      <w:footerReference w:type="default" r:id="rId9"/>
+      <w:footerReference w:type="first" r:id="rId11"/>
       <w:pgSz w:w="11906" w:h="16838"/>
       <w:pgMar w:top="1440" w:right="1440" w:bottom="1440" w:left="1440" w:header="708" w:footer="708" w:gutter="0"/>
+      <w:pgNumType w:start="1"/>
       <w:cols w:space="708"/>
       <w:titlePg/>
       <w:docGrid w:linePitch="360"/>
@@ -4480,7 +4094,7 @@
       <w:p>
         <w:pPr>
           <w:pStyle w:val="Footer"/>
-          <w:framePr w:wrap="none" w:vAnchor="text" w:hAnchor="margin" w:xAlign="right" w:y="1"/>
+          <w:framePr w:w="373" w:wrap="none" w:vAnchor="text" w:hAnchor="margin" w:xAlign="right" w:y="4"/>
           <w:rPr>
             <w:rStyle w:val="PageNumber"/>
           </w:rPr>
@@ -4523,6 +4137,45 @@
     <w:pPr>
       <w:pStyle w:val="Footer"/>
       <w:ind w:right="360"/>
+      <w:rPr>
+        <w:lang w:val="en-IN"/>
+      </w:rPr>
+    </w:pPr>
+  </w:p>
+</w:ftr>
+</file>
+
+<file path=word/footer3.xml><?xml version="1.0" encoding="utf-8"?>
+<w:ftr xmlns:wpc="http://schemas.microsoft.com/office/word/2010/wordprocessingCanvas" xmlns:cx="http://schemas.microsoft.com/office/drawing/2014/chartex" xmlns:cx1="http://schemas.microsoft.com/office/drawing/2015/9/8/chartex" xmlns:cx2="http://schemas.microsoft.com/office/drawing/2015/10/21/chartex" xmlns:cx3="http://schemas.microsoft.com/office/drawing/2016/5/9/chartex" xmlns:cx4="http://schemas.microsoft.com/office/drawing/2016/5/10/chartex" xmlns:cx5="http://schemas.microsoft.com/office/drawing/2016/5/11/chartex" xmlns:cx6="http://schemas.microsoft.com/office/drawing/2016/5/12/chartex" xmlns:cx7="http://schemas.microsoft.com/office/drawing/2016/5/13/chartex" xmlns:cx8="http://schemas.microsoft.com/office/drawing/2016/5/14/chartex" xmlns:mc="http://schemas.openxmlformats.org/markup-compatibility/2006" xmlns:aink="http://schemas.microsoft.com/office/drawing/2016/ink" xmlns:am3d="http://schemas.microsoft.com/office/drawing/2017/model3d" xmlns:o="urn:schemas-microsoft-com:office:office" xmlns:oel="http://schemas.microsoft.com/office/2019/extlst" xmlns:r="http://schemas.openxmlformats.org/officeDocument/2006/relationships" xmlns:m="http://schemas.openxmlformats.org/officeDocument/2006/math" xmlns:v="urn:schemas-microsoft-com:vml" xmlns:wp14="http://schemas.microsoft.com/office/word/2010/wordprocessingDrawing" xmlns:wp="http://schemas.openxmlformats.org/drawingml/2006/wordprocessingDrawing" xmlns:w10="urn:schemas-microsoft-com:office:word" xmlns:w="http://schemas.openxmlformats.org/wordprocessingml/2006/main" xmlns:w14="http://schemas.microsoft.com/office/word/2010/wordml" xmlns:w15="http://schemas.microsoft.com/office/word/2012/wordml" xmlns:w16cex="http://schemas.microsoft.com/office/word/2018/wordml/cex" xmlns:w16cid="http://schemas.microsoft.com/office/word/2016/wordml/cid" xmlns:w16="http://schemas.microsoft.com/office/word/2018/wordml" xmlns:w16du="http://schemas.microsoft.com/office/word/2023/wordml/word16du" xmlns:w16sdtdh="http://schemas.microsoft.com/office/word/2020/wordml/sdtdatahash" xmlns:w16sdtfl="http://schemas.microsoft.com/office/word/2024/wordml/sdtformatlock" xmlns:w16se="http://schemas.microsoft.com/office/word/2015/wordml/symex" xmlns:wpg="http://schemas.microsoft.com/office/word/2010/wordprocessingGroup" xmlns:wpi="http://schemas.microsoft.com/office/word/2010/wordprocessingInk" xmlns:wne="http://schemas.microsoft.com/office/word/2006/wordml" xmlns:wps="http://schemas.microsoft.com/office/word/2010/wordprocessingShape" mc:Ignorable="w14 w15 w16se w16cid w16 w16cex w16sdtdh w16sdtfl w16du wp14">
+  <w:sdt>
+    <w:sdtPr>
+      <w:id w:val="-436516227"/>
+      <w:docPartObj>
+        <w:docPartGallery w:val="Page Numbers (Bottom of Page)"/>
+        <w:docPartUnique/>
+      </w:docPartObj>
+    </w:sdtPr>
+    <w:sdtContent>
+      <w:p>
+        <w:pPr>
+          <w:pStyle w:val="Footer"/>
+          <w:jc w:val="right"/>
+        </w:pPr>
+      </w:p>
+      <w:p>
+        <w:pPr>
+          <w:pStyle w:val="Footer"/>
+          <w:jc w:val="right"/>
+        </w:pPr>
+        <w:r>
+          <w:t>1</w:t>
+        </w:r>
+      </w:p>
+    </w:sdtContent>
+  </w:sdt>
+  <w:p>
+    <w:pPr>
+      <w:pStyle w:val="Footer"/>
     </w:pPr>
   </w:p>
 </w:ftr>
@@ -4932,6 +4585,119 @@
     </w:lvl>
   </w:abstractNum>
   <w:abstractNum w:abstractNumId="4" w15:restartNumberingAfterBreak="0">
+    <w:nsid w:val="064B1E91"/>
+    <w:multiLevelType w:val="multilevel"/>
+    <w:tmpl w:val="97C62892"/>
+    <w:lvl w:ilvl="0">
+      <w:start w:val="1"/>
+      <w:numFmt w:val="decimal"/>
+      <w:lvlText w:val="%1"/>
+      <w:lvlJc w:val="left"/>
+      <w:pPr>
+        <w:ind w:left="420" w:hanging="420"/>
+      </w:pPr>
+      <w:rPr>
+        <w:rFonts w:hint="default"/>
+      </w:rPr>
+    </w:lvl>
+    <w:lvl w:ilvl="1">
+      <w:start w:val="1"/>
+      <w:numFmt w:val="decimal"/>
+      <w:lvlText w:val="%1.%2"/>
+      <w:lvlJc w:val="left"/>
+      <w:pPr>
+        <w:ind w:left="420" w:hanging="420"/>
+      </w:pPr>
+      <w:rPr>
+        <w:rFonts w:hint="default"/>
+      </w:rPr>
+    </w:lvl>
+    <w:lvl w:ilvl="2">
+      <w:start w:val="1"/>
+      <w:numFmt w:val="decimal"/>
+      <w:lvlText w:val="%1.%2.%3"/>
+      <w:lvlJc w:val="left"/>
+      <w:pPr>
+        <w:ind w:left="720" w:hanging="720"/>
+      </w:pPr>
+      <w:rPr>
+        <w:rFonts w:hint="default"/>
+      </w:rPr>
+    </w:lvl>
+    <w:lvl w:ilvl="3">
+      <w:start w:val="1"/>
+      <w:numFmt w:val="decimal"/>
+      <w:lvlText w:val="%1.%2.%3.%4"/>
+      <w:lvlJc w:val="left"/>
+      <w:pPr>
+        <w:ind w:left="1080" w:hanging="1080"/>
+      </w:pPr>
+      <w:rPr>
+        <w:rFonts w:hint="default"/>
+      </w:rPr>
+    </w:lvl>
+    <w:lvl w:ilvl="4">
+      <w:start w:val="1"/>
+      <w:numFmt w:val="decimal"/>
+      <w:lvlText w:val="%1.%2.%3.%4.%5"/>
+      <w:lvlJc w:val="left"/>
+      <w:pPr>
+        <w:ind w:left="1080" w:hanging="1080"/>
+      </w:pPr>
+      <w:rPr>
+        <w:rFonts w:hint="default"/>
+      </w:rPr>
+    </w:lvl>
+    <w:lvl w:ilvl="5">
+      <w:start w:val="1"/>
+      <w:numFmt w:val="decimal"/>
+      <w:lvlText w:val="%1.%2.%3.%4.%5.%6"/>
+      <w:lvlJc w:val="left"/>
+      <w:pPr>
+        <w:ind w:left="1440" w:hanging="1440"/>
+      </w:pPr>
+      <w:rPr>
+        <w:rFonts w:hint="default"/>
+      </w:rPr>
+    </w:lvl>
+    <w:lvl w:ilvl="6">
+      <w:start w:val="1"/>
+      <w:numFmt w:val="decimal"/>
+      <w:lvlText w:val="%1.%2.%3.%4.%5.%6.%7"/>
+      <w:lvlJc w:val="left"/>
+      <w:pPr>
+        <w:ind w:left="1440" w:hanging="1440"/>
+      </w:pPr>
+      <w:rPr>
+        <w:rFonts w:hint="default"/>
+      </w:rPr>
+    </w:lvl>
+    <w:lvl w:ilvl="7">
+      <w:start w:val="1"/>
+      <w:numFmt w:val="decimal"/>
+      <w:lvlText w:val="%1.%2.%3.%4.%5.%6.%7.%8"/>
+      <w:lvlJc w:val="left"/>
+      <w:pPr>
+        <w:ind w:left="1800" w:hanging="1800"/>
+      </w:pPr>
+      <w:rPr>
+        <w:rFonts w:hint="default"/>
+      </w:rPr>
+    </w:lvl>
+    <w:lvl w:ilvl="8">
+      <w:start w:val="1"/>
+      <w:numFmt w:val="decimal"/>
+      <w:lvlText w:val="%1.%2.%3.%4.%5.%6.%7.%8.%9"/>
+      <w:lvlJc w:val="left"/>
+      <w:pPr>
+        <w:ind w:left="2160" w:hanging="2160"/>
+      </w:pPr>
+      <w:rPr>
+        <w:rFonts w:hint="default"/>
+      </w:rPr>
+    </w:lvl>
+  </w:abstractNum>
+  <w:abstractNum w:abstractNumId="5" w15:restartNumberingAfterBreak="0">
     <w:nsid w:val="08BB5A03"/>
     <w:multiLevelType w:val="hybridMultilevel"/>
     <w:tmpl w:val="FFFFFFFF"/>
@@ -5044,7 +4810,7 @@
       </w:rPr>
     </w:lvl>
   </w:abstractNum>
-  <w:abstractNum w:abstractNumId="5" w15:restartNumberingAfterBreak="0">
+  <w:abstractNum w:abstractNumId="6" w15:restartNumberingAfterBreak="0">
     <w:nsid w:val="09ED0321"/>
     <w:multiLevelType w:val="multilevel"/>
     <w:tmpl w:val="4DA4E65A"/>
@@ -5165,7 +4931,7 @@
       </w:rPr>
     </w:lvl>
   </w:abstractNum>
-  <w:abstractNum w:abstractNumId="6" w15:restartNumberingAfterBreak="0">
+  <w:abstractNum w:abstractNumId="7" w15:restartNumberingAfterBreak="0">
     <w:nsid w:val="0E890F98"/>
     <w:multiLevelType w:val="hybridMultilevel"/>
     <w:tmpl w:val="FFFFFFFF"/>
@@ -5278,7 +5044,7 @@
       </w:rPr>
     </w:lvl>
   </w:abstractNum>
-  <w:abstractNum w:abstractNumId="7" w15:restartNumberingAfterBreak="0">
+  <w:abstractNum w:abstractNumId="8" w15:restartNumberingAfterBreak="0">
     <w:nsid w:val="126901FE"/>
     <w:multiLevelType w:val="multilevel"/>
     <w:tmpl w:val="0B3671C4"/>
@@ -5399,7 +5165,7 @@
       </w:rPr>
     </w:lvl>
   </w:abstractNum>
-  <w:abstractNum w:abstractNumId="8" w15:restartNumberingAfterBreak="0">
+  <w:abstractNum w:abstractNumId="9" w15:restartNumberingAfterBreak="0">
     <w:nsid w:val="1B21B0F4"/>
     <w:multiLevelType w:val="hybridMultilevel"/>
     <w:tmpl w:val="72720076"/>
@@ -5512,7 +5278,7 @@
       </w:rPr>
     </w:lvl>
   </w:abstractNum>
-  <w:abstractNum w:abstractNumId="9" w15:restartNumberingAfterBreak="0">
+  <w:abstractNum w:abstractNumId="10" w15:restartNumberingAfterBreak="0">
     <w:nsid w:val="1C5D3AF2"/>
     <w:multiLevelType w:val="hybridMultilevel"/>
     <w:tmpl w:val="FFFFFFFF"/>
@@ -5625,7 +5391,7 @@
       </w:rPr>
     </w:lvl>
   </w:abstractNum>
-  <w:abstractNum w:abstractNumId="10" w15:restartNumberingAfterBreak="0">
+  <w:abstractNum w:abstractNumId="11" w15:restartNumberingAfterBreak="0">
     <w:nsid w:val="1CFC5493"/>
     <w:multiLevelType w:val="hybridMultilevel"/>
     <w:tmpl w:val="FFFFFFFF"/>
@@ -5711,7 +5477,7 @@
       </w:pPr>
     </w:lvl>
   </w:abstractNum>
-  <w:abstractNum w:abstractNumId="11" w15:restartNumberingAfterBreak="0">
+  <w:abstractNum w:abstractNumId="12" w15:restartNumberingAfterBreak="0">
     <w:nsid w:val="1E875941"/>
     <w:multiLevelType w:val="hybridMultilevel"/>
     <w:tmpl w:val="CD722D48"/>
@@ -5824,7 +5590,7 @@
       </w:rPr>
     </w:lvl>
   </w:abstractNum>
-  <w:abstractNum w:abstractNumId="12" w15:restartNumberingAfterBreak="0">
+  <w:abstractNum w:abstractNumId="13" w15:restartNumberingAfterBreak="0">
     <w:nsid w:val="215ED53B"/>
     <w:multiLevelType w:val="hybridMultilevel"/>
     <w:tmpl w:val="FFFFFFFF"/>
@@ -5937,7 +5703,7 @@
       </w:rPr>
     </w:lvl>
   </w:abstractNum>
-  <w:abstractNum w:abstractNumId="13" w15:restartNumberingAfterBreak="0">
+  <w:abstractNum w:abstractNumId="14" w15:restartNumberingAfterBreak="0">
     <w:nsid w:val="25481131"/>
     <w:multiLevelType w:val="hybridMultilevel"/>
     <w:tmpl w:val="FFFFFFFF"/>
@@ -6050,7 +5816,7 @@
       </w:rPr>
     </w:lvl>
   </w:abstractNum>
-  <w:abstractNum w:abstractNumId="14" w15:restartNumberingAfterBreak="0">
+  <w:abstractNum w:abstractNumId="15" w15:restartNumberingAfterBreak="0">
     <w:nsid w:val="2BEF301D"/>
     <w:multiLevelType w:val="hybridMultilevel"/>
     <w:tmpl w:val="2B3AA896"/>
@@ -6163,7 +5929,93 @@
       </w:rPr>
     </w:lvl>
   </w:abstractNum>
-  <w:abstractNum w:abstractNumId="15" w15:restartNumberingAfterBreak="0">
+  <w:abstractNum w:abstractNumId="16" w15:restartNumberingAfterBreak="0">
+    <w:nsid w:val="3588683D"/>
+    <w:multiLevelType w:val="hybridMultilevel"/>
+    <w:tmpl w:val="53264F6E"/>
+    <w:lvl w:ilvl="0" w:tplc="4009000F">
+      <w:start w:val="1"/>
+      <w:numFmt w:val="decimal"/>
+      <w:lvlText w:val="%1."/>
+      <w:lvlJc w:val="left"/>
+      <w:pPr>
+        <w:ind w:left="720" w:hanging="360"/>
+      </w:pPr>
+    </w:lvl>
+    <w:lvl w:ilvl="1" w:tplc="40090019">
+      <w:start w:val="1"/>
+      <w:numFmt w:val="lowerLetter"/>
+      <w:lvlText w:val="%2."/>
+      <w:lvlJc w:val="left"/>
+      <w:pPr>
+        <w:ind w:left="1440" w:hanging="360"/>
+      </w:pPr>
+    </w:lvl>
+    <w:lvl w:ilvl="2" w:tplc="4009001B" w:tentative="1">
+      <w:start w:val="1"/>
+      <w:numFmt w:val="lowerRoman"/>
+      <w:lvlText w:val="%3."/>
+      <w:lvlJc w:val="right"/>
+      <w:pPr>
+        <w:ind w:left="2160" w:hanging="180"/>
+      </w:pPr>
+    </w:lvl>
+    <w:lvl w:ilvl="3" w:tplc="4009000F" w:tentative="1">
+      <w:start w:val="1"/>
+      <w:numFmt w:val="decimal"/>
+      <w:lvlText w:val="%4."/>
+      <w:lvlJc w:val="left"/>
+      <w:pPr>
+        <w:ind w:left="2880" w:hanging="360"/>
+      </w:pPr>
+    </w:lvl>
+    <w:lvl w:ilvl="4" w:tplc="40090019" w:tentative="1">
+      <w:start w:val="1"/>
+      <w:numFmt w:val="lowerLetter"/>
+      <w:lvlText w:val="%5."/>
+      <w:lvlJc w:val="left"/>
+      <w:pPr>
+        <w:ind w:left="3600" w:hanging="360"/>
+      </w:pPr>
+    </w:lvl>
+    <w:lvl w:ilvl="5" w:tplc="4009001B" w:tentative="1">
+      <w:start w:val="1"/>
+      <w:numFmt w:val="lowerRoman"/>
+      <w:lvlText w:val="%6."/>
+      <w:lvlJc w:val="right"/>
+      <w:pPr>
+        <w:ind w:left="4320" w:hanging="180"/>
+      </w:pPr>
+    </w:lvl>
+    <w:lvl w:ilvl="6" w:tplc="4009000F" w:tentative="1">
+      <w:start w:val="1"/>
+      <w:numFmt w:val="decimal"/>
+      <w:lvlText w:val="%7."/>
+      <w:lvlJc w:val="left"/>
+      <w:pPr>
+        <w:ind w:left="5040" w:hanging="360"/>
+      </w:pPr>
+    </w:lvl>
+    <w:lvl w:ilvl="7" w:tplc="40090019" w:tentative="1">
+      <w:start w:val="1"/>
+      <w:numFmt w:val="lowerLetter"/>
+      <w:lvlText w:val="%8."/>
+      <w:lvlJc w:val="left"/>
+      <w:pPr>
+        <w:ind w:left="5760" w:hanging="360"/>
+      </w:pPr>
+    </w:lvl>
+    <w:lvl w:ilvl="8" w:tplc="4009001B" w:tentative="1">
+      <w:start w:val="1"/>
+      <w:numFmt w:val="lowerRoman"/>
+      <w:lvlText w:val="%9."/>
+      <w:lvlJc w:val="right"/>
+      <w:pPr>
+        <w:ind w:left="6480" w:hanging="180"/>
+      </w:pPr>
+    </w:lvl>
+  </w:abstractNum>
+  <w:abstractNum w:abstractNumId="17" w15:restartNumberingAfterBreak="0">
     <w:nsid w:val="360E79A9"/>
     <w:multiLevelType w:val="multilevel"/>
     <w:tmpl w:val="FFFFFFFF"/>
@@ -6276,7 +6128,7 @@
       </w:rPr>
     </w:lvl>
   </w:abstractNum>
-  <w:abstractNum w:abstractNumId="16" w15:restartNumberingAfterBreak="0">
+  <w:abstractNum w:abstractNumId="18" w15:restartNumberingAfterBreak="0">
     <w:nsid w:val="3AE77EFC"/>
     <w:multiLevelType w:val="hybridMultilevel"/>
     <w:tmpl w:val="BF34E8AA"/>
@@ -6389,7 +6241,7 @@
       </w:rPr>
     </w:lvl>
   </w:abstractNum>
-  <w:abstractNum w:abstractNumId="17" w15:restartNumberingAfterBreak="0">
+  <w:abstractNum w:abstractNumId="19" w15:restartNumberingAfterBreak="0">
     <w:nsid w:val="3BD0A676"/>
     <w:multiLevelType w:val="hybridMultilevel"/>
     <w:tmpl w:val="FFFFFFFF"/>
@@ -6502,7 +6354,7 @@
       </w:rPr>
     </w:lvl>
   </w:abstractNum>
-  <w:abstractNum w:abstractNumId="18" w15:restartNumberingAfterBreak="0">
+  <w:abstractNum w:abstractNumId="20" w15:restartNumberingAfterBreak="0">
     <w:nsid w:val="3CEA41A4"/>
     <w:multiLevelType w:val="hybridMultilevel"/>
     <w:tmpl w:val="FFFFFFFF"/>
@@ -6588,7 +6440,7 @@
       </w:pPr>
     </w:lvl>
   </w:abstractNum>
-  <w:abstractNum w:abstractNumId="19" w15:restartNumberingAfterBreak="0">
+  <w:abstractNum w:abstractNumId="21" w15:restartNumberingAfterBreak="0">
     <w:nsid w:val="3F9AADF4"/>
     <w:multiLevelType w:val="hybridMultilevel"/>
     <w:tmpl w:val="FFFFFFFF"/>
@@ -6674,7 +6526,7 @@
       </w:pPr>
     </w:lvl>
   </w:abstractNum>
-  <w:abstractNum w:abstractNumId="20" w15:restartNumberingAfterBreak="0">
+  <w:abstractNum w:abstractNumId="22" w15:restartNumberingAfterBreak="0">
     <w:nsid w:val="41A2DE95"/>
     <w:multiLevelType w:val="hybridMultilevel"/>
     <w:tmpl w:val="FFFFFFFF"/>
@@ -6787,7 +6639,7 @@
       </w:rPr>
     </w:lvl>
   </w:abstractNum>
-  <w:abstractNum w:abstractNumId="21" w15:restartNumberingAfterBreak="0">
+  <w:abstractNum w:abstractNumId="23" w15:restartNumberingAfterBreak="0">
     <w:nsid w:val="42202A9B"/>
     <w:multiLevelType w:val="hybridMultilevel"/>
     <w:tmpl w:val="FFFFFFFF"/>
@@ -6900,7 +6752,7 @@
       </w:rPr>
     </w:lvl>
   </w:abstractNum>
-  <w:abstractNum w:abstractNumId="22" w15:restartNumberingAfterBreak="0">
+  <w:abstractNum w:abstractNumId="24" w15:restartNumberingAfterBreak="0">
     <w:nsid w:val="43DCB8F2"/>
     <w:multiLevelType w:val="hybridMultilevel"/>
     <w:tmpl w:val="FFFFFFFF"/>
@@ -7013,7 +6865,7 @@
       </w:rPr>
     </w:lvl>
   </w:abstractNum>
-  <w:abstractNum w:abstractNumId="23" w15:restartNumberingAfterBreak="0">
+  <w:abstractNum w:abstractNumId="25" w15:restartNumberingAfterBreak="0">
     <w:nsid w:val="453E2DC6"/>
     <w:multiLevelType w:val="multilevel"/>
     <w:tmpl w:val="4DA4E65A"/>
@@ -7134,7 +6986,7 @@
       </w:rPr>
     </w:lvl>
   </w:abstractNum>
-  <w:abstractNum w:abstractNumId="24" w15:restartNumberingAfterBreak="0">
+  <w:abstractNum w:abstractNumId="26" w15:restartNumberingAfterBreak="0">
     <w:nsid w:val="4D557C4F"/>
     <w:multiLevelType w:val="hybridMultilevel"/>
     <w:tmpl w:val="E482CF54"/>
@@ -7223,7 +7075,7 @@
       </w:pPr>
     </w:lvl>
   </w:abstractNum>
-  <w:abstractNum w:abstractNumId="25" w15:restartNumberingAfterBreak="0">
+  <w:abstractNum w:abstractNumId="27" w15:restartNumberingAfterBreak="0">
     <w:nsid w:val="52DF187A"/>
     <w:multiLevelType w:val="hybridMultilevel"/>
     <w:tmpl w:val="FFFFFFFF"/>
@@ -7336,7 +7188,7 @@
       </w:rPr>
     </w:lvl>
   </w:abstractNum>
-  <w:abstractNum w:abstractNumId="26" w15:restartNumberingAfterBreak="0">
+  <w:abstractNum w:abstractNumId="28" w15:restartNumberingAfterBreak="0">
     <w:nsid w:val="573E3B79"/>
     <w:multiLevelType w:val="hybridMultilevel"/>
     <w:tmpl w:val="FFFFFFFF"/>
@@ -7422,7 +7274,7 @@
       </w:pPr>
     </w:lvl>
   </w:abstractNum>
-  <w:abstractNum w:abstractNumId="27" w15:restartNumberingAfterBreak="0">
+  <w:abstractNum w:abstractNumId="29" w15:restartNumberingAfterBreak="0">
     <w:nsid w:val="5A72411A"/>
     <w:multiLevelType w:val="hybridMultilevel"/>
     <w:tmpl w:val="C31A5862"/>
@@ -7508,7 +7360,7 @@
       </w:pPr>
     </w:lvl>
   </w:abstractNum>
-  <w:abstractNum w:abstractNumId="28" w15:restartNumberingAfterBreak="0">
+  <w:abstractNum w:abstractNumId="30" w15:restartNumberingAfterBreak="0">
     <w:nsid w:val="64424843"/>
     <w:multiLevelType w:val="hybridMultilevel"/>
     <w:tmpl w:val="FFFFFFFF"/>
@@ -7594,7 +7446,7 @@
       </w:pPr>
     </w:lvl>
   </w:abstractNum>
-  <w:abstractNum w:abstractNumId="29" w15:restartNumberingAfterBreak="0">
+  <w:abstractNum w:abstractNumId="31" w15:restartNumberingAfterBreak="0">
     <w:nsid w:val="64803963"/>
     <w:multiLevelType w:val="multilevel"/>
     <w:tmpl w:val="FFFFFFFF"/>
@@ -7680,7 +7532,7 @@
       </w:pPr>
     </w:lvl>
   </w:abstractNum>
-  <w:abstractNum w:abstractNumId="30" w15:restartNumberingAfterBreak="0">
+  <w:abstractNum w:abstractNumId="32" w15:restartNumberingAfterBreak="0">
     <w:nsid w:val="662D2694"/>
     <w:multiLevelType w:val="hybridMultilevel"/>
     <w:tmpl w:val="FFFFFFFF"/>
@@ -7766,7 +7618,7 @@
       </w:pPr>
     </w:lvl>
   </w:abstractNum>
-  <w:abstractNum w:abstractNumId="31" w15:restartNumberingAfterBreak="0">
+  <w:abstractNum w:abstractNumId="33" w15:restartNumberingAfterBreak="0">
     <w:nsid w:val="6989EEEE"/>
     <w:multiLevelType w:val="multilevel"/>
     <w:tmpl w:val="FFFFFFFF"/>
@@ -7852,7 +7704,93 @@
       </w:pPr>
     </w:lvl>
   </w:abstractNum>
-  <w:abstractNum w:abstractNumId="32" w15:restartNumberingAfterBreak="0">
+  <w:abstractNum w:abstractNumId="34" w15:restartNumberingAfterBreak="0">
+    <w:nsid w:val="69FD6100"/>
+    <w:multiLevelType w:val="hybridMultilevel"/>
+    <w:tmpl w:val="19FAEE92"/>
+    <w:lvl w:ilvl="0" w:tplc="4009000F">
+      <w:start w:val="1"/>
+      <w:numFmt w:val="decimal"/>
+      <w:lvlText w:val="%1."/>
+      <w:lvlJc w:val="left"/>
+      <w:pPr>
+        <w:ind w:left="720" w:hanging="360"/>
+      </w:pPr>
+    </w:lvl>
+    <w:lvl w:ilvl="1" w:tplc="40090019" w:tentative="1">
+      <w:start w:val="1"/>
+      <w:numFmt w:val="lowerLetter"/>
+      <w:lvlText w:val="%2."/>
+      <w:lvlJc w:val="left"/>
+      <w:pPr>
+        <w:ind w:left="1440" w:hanging="360"/>
+      </w:pPr>
+    </w:lvl>
+    <w:lvl w:ilvl="2" w:tplc="4009001B" w:tentative="1">
+      <w:start w:val="1"/>
+      <w:numFmt w:val="lowerRoman"/>
+      <w:lvlText w:val="%3."/>
+      <w:lvlJc w:val="right"/>
+      <w:pPr>
+        <w:ind w:left="2160" w:hanging="180"/>
+      </w:pPr>
+    </w:lvl>
+    <w:lvl w:ilvl="3" w:tplc="4009000F" w:tentative="1">
+      <w:start w:val="1"/>
+      <w:numFmt w:val="decimal"/>
+      <w:lvlText w:val="%4."/>
+      <w:lvlJc w:val="left"/>
+      <w:pPr>
+        <w:ind w:left="2880" w:hanging="360"/>
+      </w:pPr>
+    </w:lvl>
+    <w:lvl w:ilvl="4" w:tplc="40090019" w:tentative="1">
+      <w:start w:val="1"/>
+      <w:numFmt w:val="lowerLetter"/>
+      <w:lvlText w:val="%5."/>
+      <w:lvlJc w:val="left"/>
+      <w:pPr>
+        <w:ind w:left="3600" w:hanging="360"/>
+      </w:pPr>
+    </w:lvl>
+    <w:lvl w:ilvl="5" w:tplc="4009001B" w:tentative="1">
+      <w:start w:val="1"/>
+      <w:numFmt w:val="lowerRoman"/>
+      <w:lvlText w:val="%6."/>
+      <w:lvlJc w:val="right"/>
+      <w:pPr>
+        <w:ind w:left="4320" w:hanging="180"/>
+      </w:pPr>
+    </w:lvl>
+    <w:lvl w:ilvl="6" w:tplc="4009000F" w:tentative="1">
+      <w:start w:val="1"/>
+      <w:numFmt w:val="decimal"/>
+      <w:lvlText w:val="%7."/>
+      <w:lvlJc w:val="left"/>
+      <w:pPr>
+        <w:ind w:left="5040" w:hanging="360"/>
+      </w:pPr>
+    </w:lvl>
+    <w:lvl w:ilvl="7" w:tplc="40090019" w:tentative="1">
+      <w:start w:val="1"/>
+      <w:numFmt w:val="lowerLetter"/>
+      <w:lvlText w:val="%8."/>
+      <w:lvlJc w:val="left"/>
+      <w:pPr>
+        <w:ind w:left="5760" w:hanging="360"/>
+      </w:pPr>
+    </w:lvl>
+    <w:lvl w:ilvl="8" w:tplc="4009001B" w:tentative="1">
+      <w:start w:val="1"/>
+      <w:numFmt w:val="lowerRoman"/>
+      <w:lvlText w:val="%9."/>
+      <w:lvlJc w:val="right"/>
+      <w:pPr>
+        <w:ind w:left="6480" w:hanging="180"/>
+      </w:pPr>
+    </w:lvl>
+  </w:abstractNum>
+  <w:abstractNum w:abstractNumId="35" w15:restartNumberingAfterBreak="0">
     <w:nsid w:val="717456F8"/>
     <w:multiLevelType w:val="hybridMultilevel"/>
     <w:tmpl w:val="FFFFFFFF"/>
@@ -7966,103 +7904,112 @@
     </w:lvl>
   </w:abstractNum>
   <w:num w:numId="1" w16cid:durableId="193809708">
-    <w:abstractNumId w:val="27"/>
+    <w:abstractNumId w:val="29"/>
   </w:num>
   <w:num w:numId="2" w16cid:durableId="439304008">
     <w:abstractNumId w:val="0"/>
   </w:num>
   <w:num w:numId="3" w16cid:durableId="1814369601">
+    <w:abstractNumId w:val="9"/>
+  </w:num>
+  <w:num w:numId="4" w16cid:durableId="2006858979">
+    <w:abstractNumId w:val="30"/>
+  </w:num>
+  <w:num w:numId="5" w16cid:durableId="1839346339">
+    <w:abstractNumId w:val="20"/>
+  </w:num>
+  <w:num w:numId="6" w16cid:durableId="1380855808">
+    <w:abstractNumId w:val="11"/>
+  </w:num>
+  <w:num w:numId="7" w16cid:durableId="565338146">
+    <w:abstractNumId w:val="32"/>
+  </w:num>
+  <w:num w:numId="8" w16cid:durableId="522136554">
+    <w:abstractNumId w:val="21"/>
+  </w:num>
+  <w:num w:numId="9" w16cid:durableId="729496021">
+    <w:abstractNumId w:val="26"/>
+  </w:num>
+  <w:num w:numId="10" w16cid:durableId="417485858">
     <w:abstractNumId w:val="8"/>
   </w:num>
-  <w:num w:numId="4" w16cid:durableId="2006858979">
-    <w:abstractNumId w:val="28"/>
+  <w:num w:numId="11" w16cid:durableId="1035351234">
+    <w:abstractNumId w:val="25"/>
   </w:num>
-  <w:num w:numId="5" w16cid:durableId="1839346339">
+  <w:num w:numId="12" w16cid:durableId="837691969">
+    <w:abstractNumId w:val="6"/>
+  </w:num>
+  <w:num w:numId="13" w16cid:durableId="979849249">
     <w:abstractNumId w:val="18"/>
   </w:num>
-  <w:num w:numId="6" w16cid:durableId="1380855808">
-    <w:abstractNumId w:val="10"/>
-  </w:num>
-  <w:num w:numId="7" w16cid:durableId="565338146">
-    <w:abstractNumId w:val="30"/>
-  </w:num>
-  <w:num w:numId="8" w16cid:durableId="522136554">
-    <w:abstractNumId w:val="19"/>
-  </w:num>
-  <w:num w:numId="9" w16cid:durableId="729496021">
-    <w:abstractNumId w:val="24"/>
-  </w:num>
-  <w:num w:numId="10" w16cid:durableId="417485858">
-    <w:abstractNumId w:val="7"/>
-  </w:num>
-  <w:num w:numId="11" w16cid:durableId="1035351234">
-    <w:abstractNumId w:val="23"/>
-  </w:num>
-  <w:num w:numId="12" w16cid:durableId="837691969">
-    <w:abstractNumId w:val="5"/>
-  </w:num>
-  <w:num w:numId="13" w16cid:durableId="979849249">
-    <w:abstractNumId w:val="16"/>
-  </w:num>
   <w:num w:numId="14" w16cid:durableId="387188096">
-    <w:abstractNumId w:val="11"/>
+    <w:abstractNumId w:val="12"/>
   </w:num>
   <w:num w:numId="15" w16cid:durableId="1770663035">
-    <w:abstractNumId w:val="14"/>
+    <w:abstractNumId w:val="15"/>
   </w:num>
   <w:num w:numId="16" w16cid:durableId="642200228">
-    <w:abstractNumId w:val="15"/>
+    <w:abstractNumId w:val="17"/>
   </w:num>
   <w:num w:numId="17" w16cid:durableId="595553950">
-    <w:abstractNumId w:val="6"/>
+    <w:abstractNumId w:val="7"/>
   </w:num>
   <w:num w:numId="18" w16cid:durableId="1839729133">
     <w:abstractNumId w:val="1"/>
   </w:num>
   <w:num w:numId="19" w16cid:durableId="1430350645">
-    <w:abstractNumId w:val="17"/>
+    <w:abstractNumId w:val="19"/>
   </w:num>
   <w:num w:numId="20" w16cid:durableId="609823634">
-    <w:abstractNumId w:val="9"/>
+    <w:abstractNumId w:val="10"/>
   </w:num>
   <w:num w:numId="21" w16cid:durableId="1595891774">
-    <w:abstractNumId w:val="13"/>
+    <w:abstractNumId w:val="14"/>
   </w:num>
   <w:num w:numId="22" w16cid:durableId="1857501887">
-    <w:abstractNumId w:val="4"/>
+    <w:abstractNumId w:val="5"/>
   </w:num>
   <w:num w:numId="23" w16cid:durableId="1424566782">
-    <w:abstractNumId w:val="20"/>
+    <w:abstractNumId w:val="22"/>
   </w:num>
   <w:num w:numId="24" w16cid:durableId="983385615">
-    <w:abstractNumId w:val="22"/>
+    <w:abstractNumId w:val="24"/>
   </w:num>
   <w:num w:numId="25" w16cid:durableId="1303582182">
-    <w:abstractNumId w:val="25"/>
+    <w:abstractNumId w:val="27"/>
   </w:num>
   <w:num w:numId="26" w16cid:durableId="2138447778">
     <w:abstractNumId w:val="2"/>
   </w:num>
   <w:num w:numId="27" w16cid:durableId="715280916">
-    <w:abstractNumId w:val="12"/>
+    <w:abstractNumId w:val="13"/>
   </w:num>
   <w:num w:numId="28" w16cid:durableId="296570619">
-    <w:abstractNumId w:val="26"/>
+    <w:abstractNumId w:val="28"/>
   </w:num>
   <w:num w:numId="29" w16cid:durableId="266351746">
-    <w:abstractNumId w:val="32"/>
+    <w:abstractNumId w:val="35"/>
   </w:num>
   <w:num w:numId="30" w16cid:durableId="1027947511">
-    <w:abstractNumId w:val="29"/>
+    <w:abstractNumId w:val="31"/>
   </w:num>
   <w:num w:numId="31" w16cid:durableId="1358778646">
-    <w:abstractNumId w:val="21"/>
+    <w:abstractNumId w:val="23"/>
   </w:num>
   <w:num w:numId="32" w16cid:durableId="186406669">
-    <w:abstractNumId w:val="31"/>
+    <w:abstractNumId w:val="33"/>
   </w:num>
   <w:num w:numId="33" w16cid:durableId="364215154">
     <w:abstractNumId w:val="3"/>
+  </w:num>
+  <w:num w:numId="34" w16cid:durableId="1603416196">
+    <w:abstractNumId w:val="34"/>
+  </w:num>
+  <w:num w:numId="35" w16cid:durableId="1979143889">
+    <w:abstractNumId w:val="4"/>
+  </w:num>
+  <w:num w:numId="36" w16cid:durableId="1377850721">
+    <w:abstractNumId w:val="16"/>
   </w:num>
 </w:numbering>
 </file>
@@ -8663,7 +8610,6 @@
   <w:style w:type="character" w:default="1" w:styleId="DefaultParagraphFont">
     <w:name w:val="Default Paragraph Font"/>
     <w:uiPriority w:val="1"/>
-    <w:semiHidden/>
     <w:unhideWhenUsed/>
   </w:style>
   <w:style w:type="table" w:default="1" w:styleId="TableNormal">
@@ -9022,7 +8968,6 @@
     <w:basedOn w:val="Normal"/>
     <w:link w:val="HeaderChar"/>
     <w:uiPriority w:val="99"/>
-    <w:semiHidden/>
     <w:unhideWhenUsed/>
     <w:rsid w:val="00BC4CBB"/>
     <w:pPr>
@@ -9037,7 +8982,6 @@
     <w:basedOn w:val="DefaultParagraphFont"/>
     <w:link w:val="Header"/>
     <w:uiPriority w:val="99"/>
-    <w:semiHidden/>
     <w:rsid w:val="00BC4CBB"/>
   </w:style>
   <w:style w:type="character" w:styleId="CommentReference">
@@ -9422,4 +9366,16 @@
     </a:ext>
   </a:extLst>
 </a:theme>
+</file>
+
+<file path=customXml/item1.xml><?xml version="1.0" encoding="utf-8"?>
+<b:Sources xmlns:b="http://schemas.openxmlformats.org/officeDocument/2006/bibliography" xmlns="http://schemas.openxmlformats.org/officeDocument/2006/bibliography" SelectedStyle="\APASixthEditionOfficeOnline.xsl" StyleName="APA" Version="6"/>
+</file>
+
+<file path=customXml/itemProps1.xml><?xml version="1.0" encoding="utf-8"?>
+<ds:datastoreItem xmlns:ds="http://schemas.openxmlformats.org/officeDocument/2006/customXml" ds:itemID="{3AB5A224-2A8F-4425-B95F-7AA308F42803}">
+  <ds:schemaRefs>
+    <ds:schemaRef ds:uri="http://schemas.openxmlformats.org/officeDocument/2006/bibliography"/>
+  </ds:schemaRefs>
+</ds:datastoreItem>
 </file>
</xml_diff>

<commit_message>
Updated Documentation - Background research, Reference List
</commit_message>
<xml_diff>
--- a/7COM1079_Final report_template.docx
+++ b/7COM1079_Final report_template.docx
@@ -266,14 +266,7 @@
           <w:iCs/>
         </w:rPr>
         <w:tab/>
-        <w:t xml:space="preserve">          </w:t>
-      </w:r>
-      <w:r>
-        <w:rPr>
-          <w:rFonts w:ascii="Times New Roman" w:eastAsia="Times New Roman" w:hAnsi="Times New Roman" w:cs="Times New Roman"/>
-          <w:iCs/>
-        </w:rPr>
-        <w:t xml:space="preserve">Venumadhav </w:t>
+        <w:t xml:space="preserve">          Venumadhav </w:t>
       </w:r>
       <w:proofErr w:type="spellStart"/>
       <w:r>
@@ -314,14 +307,7 @@
           <w:rFonts w:ascii="Times New Roman" w:eastAsia="Times New Roman" w:hAnsi="Times New Roman" w:cs="Times New Roman"/>
           <w:iCs/>
         </w:rPr>
-        <w:t xml:space="preserve">          </w:t>
-      </w:r>
-      <w:r>
-        <w:rPr>
-          <w:rFonts w:ascii="Times New Roman" w:eastAsia="Times New Roman" w:hAnsi="Times New Roman" w:cs="Times New Roman"/>
-          <w:iCs/>
-        </w:rPr>
-        <w:t>Vinay Kumar Andoju</w:t>
+        <w:t xml:space="preserve">          Vinay Kumar Andoju</w:t>
       </w:r>
     </w:p>
     <w:p>
@@ -1389,6 +1375,11 @@
     </w:p>
     <w:p>
       <w:pPr>
+        <w:pStyle w:val="ListParagraph"/>
+        <w:numPr>
+          <w:ilvl w:val="0"/>
+          <w:numId w:val="35"/>
+        </w:numPr>
         <w:spacing w:after="160" w:line="278" w:lineRule="auto"/>
         <w:rPr>
           <w:rFonts w:ascii="Times New Roman" w:hAnsi="Times New Roman" w:cs="Times New Roman"/>
@@ -1406,7 +1397,7 @@
           <w:sz w:val="32"/>
           <w:szCs w:val="32"/>
         </w:rPr>
-        <w:t>1. Introduction</w:t>
+        <w:t xml:space="preserve"> Introduction</w:t>
       </w:r>
     </w:p>
     <w:p>
@@ -1737,22 +1728,158 @@
     </w:p>
     <w:p>
       <w:pPr>
+        <w:rPr>
+          <w:rFonts w:ascii="Times New Roman" w:eastAsia="Times New Roman" w:hAnsi="Times New Roman" w:cs="Times New Roman"/>
+          <w:b/>
+          <w:bCs/>
+          <w:sz w:val="32"/>
+          <w:szCs w:val="32"/>
+        </w:rPr>
+      </w:pPr>
+    </w:p>
+    <w:p>
+      <w:pPr>
         <w:pStyle w:val="ListParagraph"/>
         <w:numPr>
           <w:ilvl w:val="0"/>
           <w:numId w:val="35"/>
         </w:numPr>
-        <w:rPr>
-          <w:rFonts w:ascii="Times New Roman" w:eastAsia="Times New Roman" w:hAnsi="Times New Roman" w:cs="Times New Roman"/>
-        </w:rPr>
-      </w:pPr>
-      <w:r>
-        <w:rPr>
-          <w:rFonts w:ascii="Times New Roman" w:eastAsia="Times New Roman" w:hAnsi="Times New Roman" w:cs="Times New Roman"/>
-        </w:rPr>
-        <w:lastRenderedPageBreak/>
+        <w:ind w:left="142"/>
+        <w:rPr>
+          <w:rFonts w:ascii="Times New Roman" w:eastAsia="Times New Roman" w:hAnsi="Times New Roman" w:cs="Times New Roman"/>
+          <w:b/>
+          <w:bCs/>
+          <w:sz w:val="32"/>
+          <w:szCs w:val="32"/>
+        </w:rPr>
+      </w:pPr>
+      <w:r>
+        <w:rPr>
+          <w:rFonts w:ascii="Times New Roman" w:eastAsia="Times New Roman" w:hAnsi="Times New Roman" w:cs="Times New Roman"/>
+          <w:b/>
+          <w:bCs/>
+          <w:sz w:val="32"/>
+          <w:szCs w:val="32"/>
+        </w:rPr>
         <w:t>Background research</w:t>
       </w:r>
+    </w:p>
+    <w:p>
+      <w:pPr>
+        <w:rPr>
+          <w:rFonts w:ascii="Times New Roman" w:eastAsia="Times New Roman" w:hAnsi="Times New Roman" w:cs="Times New Roman"/>
+          <w:b/>
+          <w:bCs/>
+          <w:sz w:val="28"/>
+          <w:szCs w:val="28"/>
+        </w:rPr>
+      </w:pPr>
+    </w:p>
+    <w:p>
+      <w:pPr>
+        <w:pStyle w:val="ListParagraph"/>
+        <w:numPr>
+          <w:ilvl w:val="1"/>
+          <w:numId w:val="35"/>
+        </w:numPr>
+        <w:ind w:left="142"/>
+        <w:rPr>
+          <w:rFonts w:ascii="Times New Roman" w:eastAsia="Times New Roman" w:hAnsi="Times New Roman" w:cs="Times New Roman"/>
+          <w:b/>
+          <w:bCs/>
+          <w:sz w:val="28"/>
+          <w:szCs w:val="28"/>
+        </w:rPr>
+      </w:pPr>
+      <w:r>
+        <w:rPr>
+          <w:rFonts w:ascii="Times New Roman" w:eastAsia="Times New Roman" w:hAnsi="Times New Roman" w:cs="Times New Roman"/>
+          <w:b/>
+          <w:bCs/>
+          <w:sz w:val="28"/>
+          <w:szCs w:val="28"/>
+        </w:rPr>
+        <w:t>Research papers (at least 3 relevant to your topic / DS)</w:t>
+      </w:r>
+      <w:r>
+        <w:rPr>
+          <w:rFonts w:ascii="Times New Roman" w:eastAsia="Times New Roman" w:hAnsi="Times New Roman" w:cs="Times New Roman"/>
+          <w:b/>
+          <w:bCs/>
+          <w:sz w:val="28"/>
+          <w:szCs w:val="28"/>
+        </w:rPr>
+        <w:t xml:space="preserve"> </w:t>
+      </w:r>
+    </w:p>
+    <w:p>
+      <w:pPr>
+        <w:ind w:left="-300"/>
+        <w:rPr>
+          <w:rFonts w:ascii="Times New Roman" w:eastAsia="Times New Roman" w:hAnsi="Times New Roman" w:cs="Times New Roman"/>
+          <w:kern w:val="0"/>
+          <w:lang w:val="en-IN" w:eastAsia="ko-KR"/>
+          <w14:ligatures w14:val="none"/>
+        </w:rPr>
+      </w:pPr>
+    </w:p>
+    <w:p>
+      <w:pPr>
+        <w:ind w:left="-300"/>
+        <w:jc w:val="both"/>
+        <w:rPr>
+          <w:rFonts w:ascii="Times New Roman" w:eastAsia="Times New Roman" w:hAnsi="Times New Roman" w:cs="Times New Roman"/>
+          <w:kern w:val="0"/>
+          <w:lang w:val="en-IN" w:eastAsia="ko-KR"/>
+          <w14:ligatures w14:val="none"/>
+        </w:rPr>
+      </w:pPr>
+      <w:r>
+        <w:rPr>
+          <w:rFonts w:ascii="Times New Roman" w:eastAsia="Times New Roman" w:hAnsi="Times New Roman" w:cs="Times New Roman"/>
+          <w:kern w:val="0"/>
+          <w:lang w:val="en-IN" w:eastAsia="ko-KR"/>
+          <w14:ligatures w14:val="none"/>
+        </w:rPr>
+        <w:t>A thorough worldwide analysis of alcohol consumption trends and the associated illness burden from 2000 to 2020 was carried out by Manthey et al. (2024). According to their estimate, alcohol use was responsible for 2.6 million deaths and 116 million disability-adjusted life years lost in 2019, with an average global adult per capita intake of 5.5 litres. Their research highlighted the intricate relationships between alcohol consumption and population health, emphasising significant geographical differences in consumption and health effects. According to Rehm et al. (2009), alcohol is responsible for roughly 3.8% of all deaths globally. Their research developed methodological frameworks that included both direct impacts and alcohol-related injuries when attributing health outcomes to alcohol.</w:t>
+      </w:r>
+      <w:r>
+        <w:rPr>
+          <w:rFonts w:ascii="Times New Roman" w:eastAsia="Times New Roman" w:hAnsi="Times New Roman" w:cs="Times New Roman"/>
+          <w:kern w:val="0"/>
+          <w:lang w:val="en-IN" w:eastAsia="ko-KR"/>
+          <w14:ligatures w14:val="none"/>
+        </w:rPr>
+        <w:t xml:space="preserve"> </w:t>
+      </w:r>
+      <w:r>
+        <w:rPr>
+          <w:rFonts w:ascii="Times New Roman" w:eastAsia="Times New Roman" w:hAnsi="Times New Roman" w:cs="Times New Roman"/>
+          <w:kern w:val="0"/>
+          <w:lang w:val="en-IN" w:eastAsia="ko-KR"/>
+          <w14:ligatures w14:val="none"/>
+        </w:rPr>
+        <w:t>While high episodic drinking consistently demonstrated detrimental effects, they observed contradictory results for moderate usage in certain populations. When taking into account all disease categories, the GBD 2016 Alcohol Collaborators (2018) evaluated alcohol use and its effects in 195 countries and came to the conclusion that no level of consumption improves health. Based on 23 causally related health outcomes, they discovered that the ideal amount for reducing health risks is zero grammes per day, defying previous recommendations of benefits from moderate drinking.</w:t>
+      </w:r>
+    </w:p>
+    <w:p>
+      <w:pPr>
+        <w:ind w:left="-300"/>
+        <w:rPr>
+          <w:rFonts w:ascii="Times New Roman" w:eastAsia="Times New Roman" w:hAnsi="Times New Roman" w:cs="Times New Roman"/>
+          <w:kern w:val="0"/>
+          <w:lang w:val="en-IN" w:eastAsia="ko-KR"/>
+          <w14:ligatures w14:val="none"/>
+        </w:rPr>
+      </w:pPr>
+    </w:p>
+    <w:p>
+      <w:pPr>
+        <w:rPr>
+          <w:rFonts w:ascii="Times New Roman" w:eastAsia="Times New Roman" w:hAnsi="Times New Roman" w:cs="Times New Roman"/>
+          <w:lang w:val="en-IN"/>
+        </w:rPr>
+      </w:pPr>
     </w:p>
     <w:p>
       <w:pPr>
@@ -1766,27 +1893,77 @@
           <w:rFonts w:ascii="Times New Roman" w:eastAsia="Times New Roman" w:hAnsi="Times New Roman" w:cs="Times New Roman"/>
           <w:b/>
           <w:bCs/>
-        </w:rPr>
-      </w:pPr>
-      <w:r>
-        <w:rPr>
-          <w:rFonts w:ascii="Times New Roman" w:eastAsia="Times New Roman" w:hAnsi="Times New Roman" w:cs="Times New Roman"/>
-        </w:rPr>
-        <w:t>Research papers (at least 3 relevant to your topic / DS)</w:t>
-      </w:r>
-      <w:r>
-        <w:rPr>
-          <w:rFonts w:ascii="Times New Roman" w:eastAsia="Times New Roman" w:hAnsi="Times New Roman" w:cs="Times New Roman"/>
-        </w:rPr>
-        <w:t xml:space="preserve"> </w:t>
-      </w:r>
+          <w:sz w:val="28"/>
+          <w:szCs w:val="28"/>
+        </w:rPr>
+      </w:pPr>
       <w:r>
         <w:rPr>
           <w:rFonts w:ascii="Times New Roman" w:eastAsia="Times New Roman" w:hAnsi="Times New Roman" w:cs="Times New Roman"/>
           <w:b/>
           <w:bCs/>
-        </w:rPr>
-        <w:t>(200 words)</w:t>
+          <w:sz w:val="28"/>
+          <w:szCs w:val="28"/>
+        </w:rPr>
+        <w:t>Why RQ is of interest (research gap and future directions according to the literature)</w:t>
+      </w:r>
+      <w:r>
+        <w:rPr>
+          <w:rFonts w:ascii="Times New Roman" w:eastAsia="Times New Roman" w:hAnsi="Times New Roman" w:cs="Times New Roman"/>
+          <w:b/>
+          <w:bCs/>
+          <w:sz w:val="28"/>
+          <w:szCs w:val="28"/>
+        </w:rPr>
+        <w:t xml:space="preserve"> </w:t>
+      </w:r>
+    </w:p>
+    <w:p>
+      <w:pPr>
+        <w:ind w:left="-300"/>
+        <w:rPr>
+          <w:rFonts w:ascii="Times New Roman" w:eastAsia="Times New Roman" w:hAnsi="Times New Roman" w:cs="Times New Roman"/>
+        </w:rPr>
+      </w:pPr>
+    </w:p>
+    <w:p>
+      <w:pPr>
+        <w:ind w:left="-300"/>
+        <w:jc w:val="both"/>
+        <w:rPr>
+          <w:rFonts w:ascii="Times New Roman" w:eastAsia="Times New Roman" w:hAnsi="Times New Roman" w:cs="Times New Roman"/>
+          <w:lang w:val="en-IN"/>
+        </w:rPr>
+      </w:pPr>
+      <w:r>
+        <w:rPr>
+          <w:rFonts w:ascii="Times New Roman" w:eastAsia="Times New Roman" w:hAnsi="Times New Roman" w:cs="Times New Roman"/>
+          <w:lang w:val="en-IN"/>
+        </w:rPr>
+        <w:t>There is still a lack of knowledge regarding the overall relationship between national consumption levels and population lifespan, despite substantial study on alcohol-related health effects. Instead of using life expectancy as a more general measure of health, the majority of research concentrate on effects at the individual level or results related to a particular condition. Further research is also necessary due to contradictory results among communities and consumption levels. In order to provide more complex and situation-specific policy recommendations, future research should look at temporal patterns, investigate any non-linear relationships, and take socioeconomic confounders into consideration.</w:t>
+      </w:r>
+    </w:p>
+    <w:p>
+      <w:pPr>
+        <w:ind w:left="-300"/>
+        <w:rPr>
+          <w:rFonts w:ascii="Times New Roman" w:eastAsia="Times New Roman" w:hAnsi="Times New Roman" w:cs="Times New Roman"/>
+          <w:lang w:val="en-IN"/>
+        </w:rPr>
+      </w:pPr>
+    </w:p>
+    <w:p>
+      <w:pPr>
+        <w:ind w:left="1440"/>
+        <w:rPr>
+          <w:rFonts w:ascii="Times New Roman" w:eastAsia="Times New Roman" w:hAnsi="Times New Roman" w:cs="Times New Roman"/>
+        </w:rPr>
+      </w:pPr>
+      <w:r>
+        <w:rPr>
+          <w:rFonts w:ascii="Times New Roman" w:eastAsia="Times New Roman" w:hAnsi="Times New Roman" w:cs="Times New Roman"/>
+        </w:rPr>
+        <w:t xml:space="preserve"> </w:t>
       </w:r>
     </w:p>
     <w:p>
@@ -1794,7 +1971,7 @@
         <w:pStyle w:val="ListParagraph"/>
         <w:numPr>
           <w:ilvl w:val="0"/>
-          <w:numId w:val="25"/>
+          <w:numId w:val="35"/>
         </w:numPr>
         <w:rPr>
           <w:rFonts w:ascii="Times New Roman" w:eastAsia="Times New Roman" w:hAnsi="Times New Roman" w:cs="Times New Roman"/>
@@ -1803,101 +1980,9 @@
       <w:r>
         <w:rPr>
           <w:rFonts w:ascii="Times New Roman" w:eastAsia="Times New Roman" w:hAnsi="Times New Roman" w:cs="Times New Roman"/>
-          <w:i/>
-          <w:highlight w:val="yellow"/>
-        </w:rPr>
-        <w:t>Was the data set used for some research papers?</w:t>
-      </w:r>
-      <w:r>
-        <w:rPr>
-          <w:rFonts w:ascii="Times New Roman" w:eastAsia="Times New Roman" w:hAnsi="Times New Roman" w:cs="Times New Roman"/>
-          <w:highlight w:val="yellow"/>
-        </w:rPr>
-        <w:t xml:space="preserve"> </w:t>
-      </w:r>
-      <w:r>
-        <w:rPr>
-          <w:rFonts w:ascii="Times New Roman" w:eastAsia="Times New Roman" w:hAnsi="Times New Roman" w:cs="Times New Roman"/>
-          <w:i/>
-          <w:iCs/>
-          <w:highlight w:val="yellow"/>
-        </w:rPr>
-        <w:t>Summarise and</w:t>
-      </w:r>
-      <w:r>
-        <w:rPr>
-          <w:rFonts w:ascii="Times New Roman" w:eastAsia="Times New Roman" w:hAnsi="Times New Roman" w:cs="Times New Roman"/>
-          <w:highlight w:val="yellow"/>
-        </w:rPr>
-        <w:t xml:space="preserve"> </w:t>
-      </w:r>
-      <w:r>
-        <w:rPr>
-          <w:rFonts w:ascii="Times New Roman" w:eastAsia="Times New Roman" w:hAnsi="Times New Roman" w:cs="Times New Roman"/>
-          <w:i/>
-          <w:highlight w:val="yellow"/>
-        </w:rPr>
-        <w:t>r</w:t>
-      </w:r>
-      <w:r>
-        <w:rPr>
-          <w:rFonts w:ascii="Times New Roman" w:eastAsia="Times New Roman" w:hAnsi="Times New Roman" w:cs="Times New Roman"/>
-          <w:i/>
-          <w:highlight w:val="yellow"/>
-        </w:rPr>
-        <w:t>eference at least 3 relevant research papers to your topic / DS</w:t>
-      </w:r>
-      <w:r>
-        <w:rPr>
-          <w:rFonts w:ascii="Times New Roman" w:eastAsia="Times New Roman" w:hAnsi="Times New Roman" w:cs="Times New Roman"/>
-          <w:i/>
-          <w:highlight w:val="yellow"/>
-        </w:rPr>
-        <w:t>.</w:t>
-      </w:r>
-      <w:r>
-        <w:rPr>
-          <w:rFonts w:ascii="Times New Roman" w:eastAsia="Times New Roman" w:hAnsi="Times New Roman" w:cs="Times New Roman"/>
-          <w:i/>
-          <w:highlight w:val="yellow"/>
-        </w:rPr>
-        <w:t xml:space="preserve"> See </w:t>
-      </w:r>
-      <w:hyperlink r:id="rId10" w:history="1">
-        <w:r>
-          <w:rPr>
-            <w:rStyle w:val="Hyperlink"/>
-            <w:rFonts w:ascii="Times New Roman" w:eastAsia="Times New Roman" w:hAnsi="Times New Roman" w:cs="Times New Roman"/>
-            <w:i/>
-            <w:highlight w:val="yellow"/>
-          </w:rPr>
-          <w:t>https://herts.instructure.com/courses/61421/modules</w:t>
-        </w:r>
-      </w:hyperlink>
-      <w:r>
-        <w:rPr>
-          <w:rFonts w:ascii="Times New Roman" w:eastAsia="Times New Roman" w:hAnsi="Times New Roman" w:cs="Times New Roman"/>
-          <w:i/>
-          <w:highlight w:val="yellow"/>
-        </w:rPr>
-        <w:t xml:space="preserve"> for writing.</w:t>
-      </w:r>
-      <w:r>
-        <w:rPr>
-          <w:rFonts w:ascii="Times New Roman" w:eastAsia="Times New Roman" w:hAnsi="Times New Roman" w:cs="Times New Roman"/>
-          <w:i/>
-        </w:rPr>
-        <w:t xml:space="preserve"> </w:t>
-      </w:r>
-    </w:p>
-    <w:p>
-      <w:pPr>
-        <w:pStyle w:val="ListParagraph"/>
-        <w:ind w:left="1440" w:hanging="720"/>
-        <w:rPr>
-          <w:rFonts w:ascii="Times New Roman" w:eastAsia="Times New Roman" w:hAnsi="Times New Roman" w:cs="Times New Roman"/>
-        </w:rPr>
-      </w:pPr>
+        </w:rPr>
+        <w:t>Visualisation</w:t>
+      </w:r>
     </w:p>
     <w:p>
       <w:pPr>
@@ -1915,13 +2000,42 @@
         <w:rPr>
           <w:rFonts w:ascii="Times New Roman" w:eastAsia="Times New Roman" w:hAnsi="Times New Roman" w:cs="Times New Roman"/>
         </w:rPr>
-        <w:t>Why RQ is of interest (research gap and future directions according to the literature)</w:t>
-      </w:r>
-      <w:r>
-        <w:rPr>
-          <w:rFonts w:ascii="Times New Roman" w:eastAsia="Times New Roman" w:hAnsi="Times New Roman" w:cs="Times New Roman"/>
+        <w:t xml:space="preserve">Appropriate </w:t>
+      </w:r>
+      <w:r>
+        <w:rPr>
+          <w:rFonts w:ascii="Times New Roman" w:eastAsia="Times New Roman" w:hAnsi="Times New Roman" w:cs="Times New Roman"/>
+        </w:rPr>
+        <w:t>graphs</w:t>
+      </w:r>
+      <w:r>
+        <w:rPr>
+          <w:rFonts w:ascii="Times New Roman" w:eastAsia="Times New Roman" w:hAnsi="Times New Roman" w:cs="Times New Roman"/>
+        </w:rPr>
+        <w:t xml:space="preserve"> for the RQ </w:t>
+      </w:r>
+      <w:r>
+        <w:rPr>
+          <w:rFonts w:ascii="Times New Roman" w:eastAsia="Times New Roman" w:hAnsi="Times New Roman" w:cs="Times New Roman"/>
+          <w:i/>
+          <w:iCs/>
+          <w:highlight w:val="yellow"/>
+        </w:rPr>
+        <w:t>output of an R script (NOT a screenshot)</w:t>
+      </w:r>
+      <w:r>
+        <w:rPr>
+          <w:rFonts w:ascii="Times New Roman" w:eastAsia="Times New Roman" w:hAnsi="Times New Roman" w:cs="Times New Roman"/>
+          <w:i/>
+          <w:iCs/>
         </w:rPr>
         <w:t xml:space="preserve"> </w:t>
+      </w:r>
+      <w:r>
+        <w:rPr>
+          <w:rFonts w:ascii="Times New Roman" w:eastAsia="Times New Roman" w:hAnsi="Times New Roman" w:cs="Times New Roman"/>
+        </w:rPr>
+        <w:t>(</w:t>
       </w:r>
       <w:r>
         <w:rPr>
@@ -1929,22 +2043,8 @@
           <w:b/>
           <w:bCs/>
         </w:rPr>
-        <w:t>(100 word</w:t>
-      </w:r>
-      <w:r>
-        <w:rPr>
-          <w:rFonts w:ascii="Times New Roman" w:eastAsia="Times New Roman" w:hAnsi="Times New Roman" w:cs="Times New Roman"/>
-        </w:rPr>
-        <w:t>s)</w:t>
-      </w:r>
-    </w:p>
-    <w:p>
-      <w:pPr>
-        <w:ind w:left="1440"/>
-        <w:rPr>
-          <w:rFonts w:ascii="Times New Roman" w:eastAsia="Times New Roman" w:hAnsi="Times New Roman" w:cs="Times New Roman"/>
-        </w:rPr>
-      </w:pPr>
+        <w:t>50 words)</w:t>
+      </w:r>
       <w:r>
         <w:rPr>
           <w:rFonts w:ascii="Times New Roman" w:eastAsia="Times New Roman" w:hAnsi="Times New Roman" w:cs="Times New Roman"/>
@@ -1957,18 +2057,435 @@
         <w:pStyle w:val="ListParagraph"/>
         <w:numPr>
           <w:ilvl w:val="0"/>
-          <w:numId w:val="35"/>
+          <w:numId w:val="23"/>
         </w:numPr>
-        <w:rPr>
-          <w:rFonts w:ascii="Times New Roman" w:eastAsia="Times New Roman" w:hAnsi="Times New Roman" w:cs="Times New Roman"/>
-        </w:rPr>
-      </w:pPr>
-      <w:r>
-        <w:rPr>
-          <w:rFonts w:ascii="Times New Roman" w:eastAsia="Times New Roman" w:hAnsi="Times New Roman" w:cs="Times New Roman"/>
-        </w:rPr>
-        <w:t>Visualisation</w:t>
-      </w:r>
+        <w:ind w:left="1800"/>
+        <w:rPr>
+          <w:rFonts w:ascii="Times New Roman" w:eastAsia="Times New Roman" w:hAnsi="Times New Roman" w:cs="Times New Roman"/>
+          <w:i/>
+          <w:iCs/>
+          <w:highlight w:val="yellow"/>
+        </w:rPr>
+      </w:pPr>
+      <w:r>
+        <w:rPr>
+          <w:rFonts w:ascii="Times New Roman" w:eastAsia="Times New Roman" w:hAnsi="Times New Roman" w:cs="Times New Roman"/>
+          <w:i/>
+          <w:iCs/>
+          <w:highlight w:val="yellow"/>
+        </w:rPr>
+        <w:t>E</w:t>
+      </w:r>
+      <w:r>
+        <w:rPr>
+          <w:rFonts w:ascii="Times New Roman" w:eastAsia="Times New Roman" w:hAnsi="Times New Roman" w:cs="Times New Roman"/>
+          <w:i/>
+          <w:iCs/>
+          <w:highlight w:val="yellow"/>
+        </w:rPr>
+        <w:t>xplain the choice of</w:t>
+      </w:r>
+      <w:r>
+        <w:rPr>
+          <w:rFonts w:ascii="Times New Roman" w:eastAsia="Times New Roman" w:hAnsi="Times New Roman" w:cs="Times New Roman"/>
+          <w:i/>
+          <w:iCs/>
+          <w:highlight w:val="yellow"/>
+        </w:rPr>
+        <w:t xml:space="preserve"> the</w:t>
+      </w:r>
+      <w:r>
+        <w:rPr>
+          <w:rFonts w:ascii="Times New Roman" w:eastAsia="Times New Roman" w:hAnsi="Times New Roman" w:cs="Times New Roman"/>
+          <w:i/>
+          <w:iCs/>
+          <w:highlight w:val="yellow"/>
+        </w:rPr>
+        <w:t xml:space="preserve"> plot</w:t>
+      </w:r>
+      <w:r>
+        <w:rPr>
+          <w:rFonts w:ascii="Times New Roman" w:eastAsia="Times New Roman" w:hAnsi="Times New Roman" w:cs="Times New Roman"/>
+          <w:i/>
+          <w:iCs/>
+          <w:highlight w:val="yellow"/>
+        </w:rPr>
+        <w:t>.</w:t>
+      </w:r>
+    </w:p>
+    <w:p>
+      <w:pPr>
+        <w:pStyle w:val="ListParagraph"/>
+        <w:numPr>
+          <w:ilvl w:val="0"/>
+          <w:numId w:val="23"/>
+        </w:numPr>
+        <w:ind w:left="1800"/>
+        <w:rPr>
+          <w:rFonts w:ascii="Times New Roman" w:eastAsia="Times New Roman" w:hAnsi="Times New Roman" w:cs="Times New Roman"/>
+          <w:i/>
+          <w:iCs/>
+          <w:highlight w:val="yellow"/>
+        </w:rPr>
+      </w:pPr>
+      <w:r>
+        <w:rPr>
+          <w:rFonts w:ascii="Times New Roman" w:eastAsia="Times New Roman" w:hAnsi="Times New Roman" w:cs="Times New Roman"/>
+          <w:i/>
+          <w:iCs/>
+          <w:highlight w:val="yellow"/>
+        </w:rPr>
+        <w:t xml:space="preserve">Include your main plot relevant to the RQ type. </w:t>
+      </w:r>
+    </w:p>
+    <w:p>
+      <w:pPr>
+        <w:pStyle w:val="ListParagraph"/>
+        <w:numPr>
+          <w:ilvl w:val="0"/>
+          <w:numId w:val="23"/>
+        </w:numPr>
+        <w:ind w:left="1800"/>
+        <w:rPr>
+          <w:rFonts w:ascii="Times New Roman" w:eastAsia="Times New Roman" w:hAnsi="Times New Roman" w:cs="Times New Roman"/>
+          <w:i/>
+          <w:iCs/>
+          <w:highlight w:val="yellow"/>
+        </w:rPr>
+      </w:pPr>
+      <w:r>
+        <w:rPr>
+          <w:rFonts w:ascii="Times New Roman" w:hAnsi="Times New Roman" w:cs="Times New Roman"/>
+          <w:i/>
+          <w:iCs/>
+          <w:color w:val="273540"/>
+          <w:highlight w:val="yellow"/>
+          <w:shd w:val="clear" w:color="auto" w:fill="FFFFFF"/>
+        </w:rPr>
+        <w:t xml:space="preserve">Include </w:t>
+      </w:r>
+      <w:r>
+        <w:rPr>
+          <w:rFonts w:ascii="Times New Roman" w:hAnsi="Times New Roman" w:cs="Times New Roman"/>
+          <w:i/>
+          <w:iCs/>
+          <w:color w:val="273540"/>
+          <w:highlight w:val="yellow"/>
+          <w:shd w:val="clear" w:color="auto" w:fill="FFFFFF"/>
+        </w:rPr>
+        <w:t>histogram</w:t>
+      </w:r>
+      <w:r>
+        <w:rPr>
+          <w:rFonts w:ascii="Times New Roman" w:hAnsi="Times New Roman" w:cs="Times New Roman"/>
+          <w:i/>
+          <w:iCs/>
+          <w:color w:val="273540"/>
+          <w:highlight w:val="yellow"/>
+          <w:shd w:val="clear" w:color="auto" w:fill="FFFFFF"/>
+        </w:rPr>
+        <w:t xml:space="preserve"> or </w:t>
+      </w:r>
+      <w:r>
+        <w:rPr>
+          <w:rFonts w:ascii="Times New Roman" w:hAnsi="Times New Roman" w:cs="Times New Roman"/>
+          <w:i/>
+          <w:iCs/>
+          <w:color w:val="273540"/>
+          <w:highlight w:val="yellow"/>
+          <w:shd w:val="clear" w:color="auto" w:fill="FFFFFF"/>
+        </w:rPr>
+        <w:t>contingency table</w:t>
+      </w:r>
+      <w:r>
+        <w:rPr>
+          <w:rFonts w:ascii="Times New Roman" w:hAnsi="Times New Roman" w:cs="Times New Roman"/>
+          <w:i/>
+          <w:iCs/>
+          <w:color w:val="273540"/>
+          <w:highlight w:val="yellow"/>
+          <w:shd w:val="clear" w:color="auto" w:fill="FFFFFF"/>
+        </w:rPr>
+        <w:t xml:space="preserve"> (think what is suitable)</w:t>
+      </w:r>
+      <w:r>
+        <w:rPr>
+          <w:rFonts w:ascii="Times New Roman" w:hAnsi="Times New Roman" w:cs="Times New Roman"/>
+          <w:i/>
+          <w:iCs/>
+          <w:color w:val="273540"/>
+          <w:highlight w:val="yellow"/>
+          <w:shd w:val="clear" w:color="auto" w:fill="FFFFFF"/>
+        </w:rPr>
+        <w:t xml:space="preserve"> </w:t>
+      </w:r>
+      <w:r>
+        <w:rPr>
+          <w:rFonts w:ascii="Times New Roman" w:hAnsi="Times New Roman" w:cs="Times New Roman"/>
+          <w:i/>
+          <w:iCs/>
+          <w:color w:val="273540"/>
+          <w:highlight w:val="yellow"/>
+          <w:shd w:val="clear" w:color="auto" w:fill="FFFFFF"/>
+        </w:rPr>
+        <w:t>in addition to the main plot</w:t>
+      </w:r>
+      <w:r>
+        <w:rPr>
+          <w:rFonts w:ascii="Times New Roman" w:hAnsi="Times New Roman" w:cs="Times New Roman"/>
+          <w:i/>
+          <w:iCs/>
+          <w:color w:val="273540"/>
+          <w:highlight w:val="yellow"/>
+        </w:rPr>
+        <w:t>.</w:t>
+      </w:r>
+    </w:p>
+    <w:p>
+      <w:pPr>
+        <w:pStyle w:val="ListParagraph"/>
+        <w:numPr>
+          <w:ilvl w:val="0"/>
+          <w:numId w:val="23"/>
+        </w:numPr>
+        <w:ind w:left="1800"/>
+        <w:rPr>
+          <w:rFonts w:ascii="Times New Roman" w:eastAsia="Times New Roman" w:hAnsi="Times New Roman" w:cs="Times New Roman"/>
+          <w:i/>
+          <w:highlight w:val="yellow"/>
+        </w:rPr>
+      </w:pPr>
+      <w:r>
+        <w:rPr>
+          <w:rFonts w:ascii="Times New Roman" w:eastAsia="Times New Roman" w:hAnsi="Times New Roman" w:cs="Times New Roman"/>
+          <w:i/>
+          <w:highlight w:val="yellow"/>
+        </w:rPr>
+        <w:t>A</w:t>
+      </w:r>
+      <w:r>
+        <w:rPr>
+          <w:rFonts w:ascii="Times New Roman" w:eastAsia="Times New Roman" w:hAnsi="Times New Roman" w:cs="Times New Roman"/>
+          <w:i/>
+          <w:highlight w:val="yellow"/>
+        </w:rPr>
+        <w:t>nything on the plot from R is not counted towards word count limit</w:t>
+      </w:r>
+      <w:r>
+        <w:rPr>
+          <w:rFonts w:ascii="Times New Roman" w:eastAsia="Times New Roman" w:hAnsi="Times New Roman" w:cs="Times New Roman"/>
+          <w:i/>
+          <w:highlight w:val="yellow"/>
+        </w:rPr>
+        <w:t xml:space="preserve"> (e.g. legend, axes titles, name). </w:t>
+      </w:r>
+    </w:p>
+    <w:p>
+      <w:pPr>
+        <w:pStyle w:val="ListParagraph"/>
+        <w:numPr>
+          <w:ilvl w:val="0"/>
+          <w:numId w:val="23"/>
+        </w:numPr>
+        <w:ind w:left="1800"/>
+        <w:rPr>
+          <w:rFonts w:ascii="Times New Roman" w:eastAsia="Times New Roman" w:hAnsi="Times New Roman" w:cs="Times New Roman"/>
+          <w:i/>
+          <w:highlight w:val="yellow"/>
+        </w:rPr>
+      </w:pPr>
+      <w:r>
+        <w:rPr>
+          <w:rFonts w:ascii="Times New Roman" w:eastAsia="Times New Roman" w:hAnsi="Times New Roman" w:cs="Times New Roman"/>
+          <w:i/>
+          <w:highlight w:val="yellow"/>
+        </w:rPr>
+        <w:t xml:space="preserve">Make sure that the plot </w:t>
+      </w:r>
+      <w:r>
+        <w:rPr>
+          <w:rFonts w:ascii="Times New Roman" w:eastAsia="Times New Roman" w:hAnsi="Times New Roman" w:cs="Times New Roman"/>
+          <w:i/>
+          <w:highlight w:val="yellow"/>
+        </w:rPr>
+        <w:t xml:space="preserve">is </w:t>
+      </w:r>
+      <w:r>
+        <w:rPr>
+          <w:rFonts w:ascii="Times New Roman" w:eastAsia="Times New Roman" w:hAnsi="Times New Roman" w:cs="Times New Roman"/>
+          <w:i/>
+          <w:highlight w:val="yellow"/>
+        </w:rPr>
+        <w:t>from output of an R script (NOT a screenshot</w:t>
+      </w:r>
+      <w:r>
+        <w:rPr>
+          <w:rFonts w:ascii="Times New Roman" w:eastAsia="Times New Roman" w:hAnsi="Times New Roman" w:cs="Times New Roman"/>
+          <w:i/>
+          <w:highlight w:val="yellow"/>
+        </w:rPr>
+        <w:t>)</w:t>
+      </w:r>
+      <w:r>
+        <w:rPr>
+          <w:rFonts w:ascii="Times New Roman" w:eastAsia="Times New Roman" w:hAnsi="Times New Roman" w:cs="Times New Roman"/>
+          <w:i/>
+          <w:highlight w:val="yellow"/>
+        </w:rPr>
+        <w:t>.</w:t>
+      </w:r>
+    </w:p>
+    <w:p>
+      <w:pPr>
+        <w:pStyle w:val="ListParagraph"/>
+        <w:numPr>
+          <w:ilvl w:val="0"/>
+          <w:numId w:val="23"/>
+        </w:numPr>
+        <w:ind w:left="1800"/>
+        <w:rPr>
+          <w:rFonts w:ascii="Times New Roman" w:eastAsia="Times New Roman" w:hAnsi="Times New Roman" w:cs="Times New Roman"/>
+          <w:i/>
+          <w:highlight w:val="yellow"/>
+        </w:rPr>
+      </w:pPr>
+      <w:r>
+        <w:rPr>
+          <w:rFonts w:ascii="Times New Roman" w:eastAsia="Times New Roman" w:hAnsi="Times New Roman" w:cs="Times New Roman"/>
+          <w:i/>
+          <w:highlight w:val="yellow"/>
+        </w:rPr>
+        <w:t xml:space="preserve">Make sure that the </w:t>
+      </w:r>
+      <w:r>
+        <w:rPr>
+          <w:rFonts w:ascii="Times New Roman" w:eastAsia="Times New Roman" w:hAnsi="Times New Roman" w:cs="Times New Roman"/>
+          <w:i/>
+          <w:highlight w:val="yellow"/>
+        </w:rPr>
+        <w:t>plot</w:t>
+      </w:r>
+      <w:r>
+        <w:rPr>
+          <w:rFonts w:ascii="Times New Roman" w:eastAsia="Times New Roman" w:hAnsi="Times New Roman" w:cs="Times New Roman"/>
+          <w:i/>
+          <w:highlight w:val="yellow"/>
+        </w:rPr>
+        <w:t xml:space="preserve"> </w:t>
+      </w:r>
+      <w:r>
+        <w:rPr>
+          <w:rFonts w:ascii="Times New Roman" w:eastAsia="Times New Roman" w:hAnsi="Times New Roman" w:cs="Times New Roman"/>
+          <w:i/>
+          <w:highlight w:val="yellow"/>
+        </w:rPr>
+        <w:t>has</w:t>
+      </w:r>
+      <w:r>
+        <w:rPr>
+          <w:rFonts w:ascii="Times New Roman" w:eastAsia="Times New Roman" w:hAnsi="Times New Roman" w:cs="Times New Roman"/>
+          <w:i/>
+          <w:highlight w:val="yellow"/>
+        </w:rPr>
+        <w:t xml:space="preserve"> a caption or title, X and Y-axis labels</w:t>
+      </w:r>
+      <w:r>
+        <w:rPr>
+          <w:rFonts w:ascii="Times New Roman" w:eastAsia="Times New Roman" w:hAnsi="Times New Roman" w:cs="Times New Roman"/>
+          <w:i/>
+          <w:highlight w:val="yellow"/>
+        </w:rPr>
+        <w:t xml:space="preserve"> with units where appropriate</w:t>
+      </w:r>
+      <w:r>
+        <w:rPr>
+          <w:rFonts w:ascii="Times New Roman" w:eastAsia="Times New Roman" w:hAnsi="Times New Roman" w:cs="Times New Roman"/>
+          <w:i/>
+          <w:highlight w:val="yellow"/>
+        </w:rPr>
+        <w:t>,</w:t>
+      </w:r>
+      <w:r>
+        <w:rPr>
+          <w:rFonts w:ascii="Times New Roman" w:eastAsia="Times New Roman" w:hAnsi="Times New Roman" w:cs="Times New Roman"/>
+          <w:i/>
+          <w:highlight w:val="yellow"/>
+        </w:rPr>
+        <w:t xml:space="preserve"> and legend</w:t>
+      </w:r>
+      <w:r>
+        <w:rPr>
+          <w:rFonts w:ascii="Times New Roman" w:eastAsia="Times New Roman" w:hAnsi="Times New Roman" w:cs="Times New Roman"/>
+          <w:i/>
+          <w:highlight w:val="yellow"/>
+        </w:rPr>
+        <w:t>.</w:t>
+      </w:r>
+    </w:p>
+    <w:p>
+      <w:pPr>
+        <w:pStyle w:val="ListParagraph"/>
+        <w:numPr>
+          <w:ilvl w:val="0"/>
+          <w:numId w:val="23"/>
+        </w:numPr>
+        <w:ind w:left="1800"/>
+        <w:rPr>
+          <w:rFonts w:ascii="Times New Roman" w:eastAsia="Times New Roman" w:hAnsi="Times New Roman" w:cs="Times New Roman"/>
+          <w:i/>
+          <w:highlight w:val="yellow"/>
+        </w:rPr>
+      </w:pPr>
+      <w:r>
+        <w:rPr>
+          <w:rFonts w:ascii="Times New Roman" w:eastAsia="Times New Roman" w:hAnsi="Times New Roman" w:cs="Times New Roman"/>
+          <w:i/>
+          <w:highlight w:val="yellow"/>
+        </w:rPr>
+        <w:t>Make sure the title or caption and axis labels</w:t>
+      </w:r>
+      <w:r>
+        <w:rPr>
+          <w:rFonts w:ascii="Times New Roman" w:eastAsia="Times New Roman" w:hAnsi="Times New Roman" w:cs="Times New Roman"/>
+          <w:i/>
+          <w:highlight w:val="yellow"/>
+        </w:rPr>
+        <w:t xml:space="preserve"> are</w:t>
+      </w:r>
+      <w:r>
+        <w:rPr>
+          <w:rFonts w:ascii="Times New Roman" w:eastAsia="Times New Roman" w:hAnsi="Times New Roman" w:cs="Times New Roman"/>
+          <w:i/>
+          <w:highlight w:val="yellow"/>
+        </w:rPr>
+        <w:t xml:space="preserve"> informative</w:t>
+      </w:r>
+      <w:r>
+        <w:rPr>
+          <w:rFonts w:ascii="Times New Roman" w:eastAsia="Times New Roman" w:hAnsi="Times New Roman" w:cs="Times New Roman"/>
+          <w:i/>
+          <w:highlight w:val="yellow"/>
+        </w:rPr>
+        <w:t xml:space="preserve"> and written in English</w:t>
+      </w:r>
+      <w:r>
+        <w:rPr>
+          <w:rFonts w:ascii="Times New Roman" w:eastAsia="Times New Roman" w:hAnsi="Times New Roman" w:cs="Times New Roman"/>
+          <w:i/>
+          <w:highlight w:val="yellow"/>
+        </w:rPr>
+        <w:t>.</w:t>
+      </w:r>
+    </w:p>
+    <w:p>
+      <w:pPr>
+        <w:pStyle w:val="ListParagraph"/>
+        <w:rPr>
+          <w:rFonts w:ascii="Times New Roman" w:eastAsia="Times New Roman" w:hAnsi="Times New Roman" w:cs="Times New Roman"/>
+          <w:i/>
+          <w:iCs/>
+        </w:rPr>
+      </w:pPr>
     </w:p>
     <w:p>
       <w:pPr>
@@ -1980,48 +2497,21 @@
         <w:ind w:hanging="720"/>
         <w:rPr>
           <w:rFonts w:ascii="Times New Roman" w:eastAsia="Times New Roman" w:hAnsi="Times New Roman" w:cs="Times New Roman"/>
-        </w:rPr>
-      </w:pPr>
-      <w:r>
-        <w:rPr>
-          <w:rFonts w:ascii="Times New Roman" w:eastAsia="Times New Roman" w:hAnsi="Times New Roman" w:cs="Times New Roman"/>
-        </w:rPr>
-        <w:t xml:space="preserve">Appropriate </w:t>
-      </w:r>
-      <w:r>
-        <w:rPr>
-          <w:rFonts w:ascii="Times New Roman" w:eastAsia="Times New Roman" w:hAnsi="Times New Roman" w:cs="Times New Roman"/>
-        </w:rPr>
-        <w:t>graphs</w:t>
-      </w:r>
-      <w:r>
-        <w:rPr>
-          <w:rFonts w:ascii="Times New Roman" w:eastAsia="Times New Roman" w:hAnsi="Times New Roman" w:cs="Times New Roman"/>
-        </w:rPr>
-        <w:t xml:space="preserve"> for the RQ </w:t>
-      </w:r>
-      <w:r>
-        <w:rPr>
-          <w:rFonts w:ascii="Times New Roman" w:eastAsia="Times New Roman" w:hAnsi="Times New Roman" w:cs="Times New Roman"/>
-          <w:i/>
-          <w:iCs/>
-          <w:highlight w:val="yellow"/>
-        </w:rPr>
-        <w:t>output of an R script (NOT a screenshot)</w:t>
-      </w:r>
-      <w:r>
-        <w:rPr>
-          <w:rFonts w:ascii="Times New Roman" w:eastAsia="Times New Roman" w:hAnsi="Times New Roman" w:cs="Times New Roman"/>
-          <w:i/>
-          <w:iCs/>
-        </w:rPr>
-        <w:t xml:space="preserve"> </w:t>
-      </w:r>
-      <w:r>
-        <w:rPr>
-          <w:rFonts w:ascii="Times New Roman" w:eastAsia="Times New Roman" w:hAnsi="Times New Roman" w:cs="Times New Roman"/>
-        </w:rPr>
-        <w:t>(</w:t>
+          <w:i/>
+          <w:iCs/>
+        </w:rPr>
+      </w:pPr>
+      <w:r>
+        <w:rPr>
+          <w:rFonts w:ascii="Times New Roman" w:eastAsia="Times New Roman" w:hAnsi="Times New Roman" w:cs="Times New Roman"/>
+        </w:rPr>
+        <w:t>Additional information relating to understanding the data (optional)</w:t>
+      </w:r>
+      <w:r>
+        <w:rPr>
+          <w:rFonts w:ascii="Times New Roman" w:eastAsia="Times New Roman" w:hAnsi="Times New Roman" w:cs="Times New Roman"/>
+        </w:rPr>
+        <w:t xml:space="preserve"> (</w:t>
       </w:r>
       <w:r>
         <w:rPr>
@@ -2034,6 +2524,8 @@
       <w:r>
         <w:rPr>
           <w:rFonts w:ascii="Times New Roman" w:eastAsia="Times New Roman" w:hAnsi="Times New Roman" w:cs="Times New Roman"/>
+          <w:i/>
+          <w:iCs/>
         </w:rPr>
         <w:t xml:space="preserve"> </w:t>
       </w:r>
@@ -2043,7 +2535,7 @@
         <w:pStyle w:val="ListParagraph"/>
         <w:numPr>
           <w:ilvl w:val="0"/>
-          <w:numId w:val="23"/>
+          <w:numId w:val="22"/>
         </w:numPr>
         <w:ind w:left="1800"/>
         <w:rPr>
@@ -2060,7 +2552,7 @@
           <w:iCs/>
           <w:highlight w:val="yellow"/>
         </w:rPr>
-        <w:t>E</w:t>
+        <w:t>P</w:t>
       </w:r>
       <w:r>
         <w:rPr>
@@ -2069,407 +2561,15 @@
           <w:iCs/>
           <w:highlight w:val="yellow"/>
         </w:rPr>
-        <w:t>xplain the choice of</w:t>
-      </w:r>
-      <w:r>
-        <w:rPr>
-          <w:rFonts w:ascii="Times New Roman" w:eastAsia="Times New Roman" w:hAnsi="Times New Roman" w:cs="Times New Roman"/>
-          <w:i/>
-          <w:iCs/>
-          <w:highlight w:val="yellow"/>
-        </w:rPr>
-        <w:t xml:space="preserve"> the</w:t>
-      </w:r>
-      <w:r>
-        <w:rPr>
-          <w:rFonts w:ascii="Times New Roman" w:eastAsia="Times New Roman" w:hAnsi="Times New Roman" w:cs="Times New Roman"/>
-          <w:i/>
-          <w:iCs/>
-          <w:highlight w:val="yellow"/>
-        </w:rPr>
-        <w:t xml:space="preserve"> plot</w:t>
-      </w:r>
-      <w:r>
-        <w:rPr>
-          <w:rFonts w:ascii="Times New Roman" w:eastAsia="Times New Roman" w:hAnsi="Times New Roman" w:cs="Times New Roman"/>
-          <w:i/>
-          <w:iCs/>
-          <w:highlight w:val="yellow"/>
-        </w:rPr>
-        <w:t>.</w:t>
+        <w:t>er plot: explain the purpose and insights.</w:t>
       </w:r>
     </w:p>
     <w:p>
       <w:pPr>
         <w:pStyle w:val="ListParagraph"/>
-        <w:numPr>
-          <w:ilvl w:val="0"/>
-          <w:numId w:val="23"/>
-        </w:numPr>
-        <w:ind w:left="1800"/>
-        <w:rPr>
-          <w:rFonts w:ascii="Times New Roman" w:eastAsia="Times New Roman" w:hAnsi="Times New Roman" w:cs="Times New Roman"/>
-          <w:i/>
-          <w:iCs/>
-          <w:highlight w:val="yellow"/>
-        </w:rPr>
-      </w:pPr>
-      <w:r>
-        <w:rPr>
-          <w:rFonts w:ascii="Times New Roman" w:eastAsia="Times New Roman" w:hAnsi="Times New Roman" w:cs="Times New Roman"/>
-          <w:i/>
-          <w:iCs/>
-          <w:highlight w:val="yellow"/>
-        </w:rPr>
-        <w:t xml:space="preserve">Include your main plot relevant to the RQ type. </w:t>
-      </w:r>
-    </w:p>
-    <w:p>
-      <w:pPr>
-        <w:pStyle w:val="ListParagraph"/>
-        <w:numPr>
-          <w:ilvl w:val="0"/>
-          <w:numId w:val="23"/>
-        </w:numPr>
-        <w:ind w:left="1800"/>
-        <w:rPr>
-          <w:rFonts w:ascii="Times New Roman" w:eastAsia="Times New Roman" w:hAnsi="Times New Roman" w:cs="Times New Roman"/>
-          <w:i/>
-          <w:iCs/>
-          <w:highlight w:val="yellow"/>
-        </w:rPr>
-      </w:pPr>
-      <w:r>
-        <w:rPr>
-          <w:rFonts w:ascii="Times New Roman" w:hAnsi="Times New Roman" w:cs="Times New Roman"/>
-          <w:i/>
-          <w:iCs/>
-          <w:color w:val="273540"/>
-          <w:highlight w:val="yellow"/>
-          <w:shd w:val="clear" w:color="auto" w:fill="FFFFFF"/>
-        </w:rPr>
-        <w:t xml:space="preserve">Include </w:t>
-      </w:r>
-      <w:r>
-        <w:rPr>
-          <w:rFonts w:ascii="Times New Roman" w:hAnsi="Times New Roman" w:cs="Times New Roman"/>
-          <w:i/>
-          <w:iCs/>
-          <w:color w:val="273540"/>
-          <w:highlight w:val="yellow"/>
-          <w:shd w:val="clear" w:color="auto" w:fill="FFFFFF"/>
-        </w:rPr>
-        <w:t>histogram</w:t>
-      </w:r>
-      <w:r>
-        <w:rPr>
-          <w:rFonts w:ascii="Times New Roman" w:hAnsi="Times New Roman" w:cs="Times New Roman"/>
-          <w:i/>
-          <w:iCs/>
-          <w:color w:val="273540"/>
-          <w:highlight w:val="yellow"/>
-          <w:shd w:val="clear" w:color="auto" w:fill="FFFFFF"/>
-        </w:rPr>
-        <w:t xml:space="preserve"> or </w:t>
-      </w:r>
-      <w:r>
-        <w:rPr>
-          <w:rFonts w:ascii="Times New Roman" w:hAnsi="Times New Roman" w:cs="Times New Roman"/>
-          <w:i/>
-          <w:iCs/>
-          <w:color w:val="273540"/>
-          <w:highlight w:val="yellow"/>
-          <w:shd w:val="clear" w:color="auto" w:fill="FFFFFF"/>
-        </w:rPr>
-        <w:t>contingency table</w:t>
-      </w:r>
-      <w:r>
-        <w:rPr>
-          <w:rFonts w:ascii="Times New Roman" w:hAnsi="Times New Roman" w:cs="Times New Roman"/>
-          <w:i/>
-          <w:iCs/>
-          <w:color w:val="273540"/>
-          <w:highlight w:val="yellow"/>
-          <w:shd w:val="clear" w:color="auto" w:fill="FFFFFF"/>
-        </w:rPr>
-        <w:t xml:space="preserve"> (think what is suitable)</w:t>
-      </w:r>
-      <w:r>
-        <w:rPr>
-          <w:rFonts w:ascii="Times New Roman" w:hAnsi="Times New Roman" w:cs="Times New Roman"/>
-          <w:i/>
-          <w:iCs/>
-          <w:color w:val="273540"/>
-          <w:highlight w:val="yellow"/>
-          <w:shd w:val="clear" w:color="auto" w:fill="FFFFFF"/>
-        </w:rPr>
-        <w:t xml:space="preserve"> </w:t>
-      </w:r>
-      <w:r>
-        <w:rPr>
-          <w:rFonts w:ascii="Times New Roman" w:hAnsi="Times New Roman" w:cs="Times New Roman"/>
-          <w:i/>
-          <w:iCs/>
-          <w:color w:val="273540"/>
-          <w:highlight w:val="yellow"/>
-          <w:shd w:val="clear" w:color="auto" w:fill="FFFFFF"/>
-        </w:rPr>
-        <w:t>in addition to the main plot</w:t>
-      </w:r>
-      <w:r>
-        <w:rPr>
-          <w:rFonts w:ascii="Times New Roman" w:hAnsi="Times New Roman" w:cs="Times New Roman"/>
-          <w:i/>
-          <w:iCs/>
-          <w:color w:val="273540"/>
-          <w:highlight w:val="yellow"/>
-        </w:rPr>
-        <w:t>.</w:t>
-      </w:r>
-    </w:p>
-    <w:p>
-      <w:pPr>
-        <w:pStyle w:val="ListParagraph"/>
-        <w:numPr>
-          <w:ilvl w:val="0"/>
-          <w:numId w:val="23"/>
-        </w:numPr>
-        <w:ind w:left="1800"/>
-        <w:rPr>
-          <w:rFonts w:ascii="Times New Roman" w:eastAsia="Times New Roman" w:hAnsi="Times New Roman" w:cs="Times New Roman"/>
-          <w:i/>
-          <w:highlight w:val="yellow"/>
-        </w:rPr>
-      </w:pPr>
-      <w:r>
-        <w:rPr>
-          <w:rFonts w:ascii="Times New Roman" w:eastAsia="Times New Roman" w:hAnsi="Times New Roman" w:cs="Times New Roman"/>
-          <w:i/>
-          <w:highlight w:val="yellow"/>
-        </w:rPr>
-        <w:t>A</w:t>
-      </w:r>
-      <w:r>
-        <w:rPr>
-          <w:rFonts w:ascii="Times New Roman" w:eastAsia="Times New Roman" w:hAnsi="Times New Roman" w:cs="Times New Roman"/>
-          <w:i/>
-          <w:highlight w:val="yellow"/>
-        </w:rPr>
-        <w:t>nything on the plot from R is not counted towards word count limit</w:t>
-      </w:r>
-      <w:r>
-        <w:rPr>
-          <w:rFonts w:ascii="Times New Roman" w:eastAsia="Times New Roman" w:hAnsi="Times New Roman" w:cs="Times New Roman"/>
-          <w:i/>
-          <w:highlight w:val="yellow"/>
-        </w:rPr>
-        <w:t xml:space="preserve"> (e.g. legend, axes titles, name). </w:t>
-      </w:r>
-    </w:p>
-    <w:p>
-      <w:pPr>
-        <w:pStyle w:val="ListParagraph"/>
-        <w:numPr>
-          <w:ilvl w:val="0"/>
-          <w:numId w:val="23"/>
-        </w:numPr>
-        <w:ind w:left="1800"/>
-        <w:rPr>
-          <w:rFonts w:ascii="Times New Roman" w:eastAsia="Times New Roman" w:hAnsi="Times New Roman" w:cs="Times New Roman"/>
-          <w:i/>
-          <w:highlight w:val="yellow"/>
-        </w:rPr>
-      </w:pPr>
-      <w:r>
-        <w:rPr>
-          <w:rFonts w:ascii="Times New Roman" w:eastAsia="Times New Roman" w:hAnsi="Times New Roman" w:cs="Times New Roman"/>
-          <w:i/>
-          <w:highlight w:val="yellow"/>
-        </w:rPr>
-        <w:t xml:space="preserve">Make sure that the plot </w:t>
-      </w:r>
-      <w:r>
-        <w:rPr>
-          <w:rFonts w:ascii="Times New Roman" w:eastAsia="Times New Roman" w:hAnsi="Times New Roman" w:cs="Times New Roman"/>
-          <w:i/>
-          <w:highlight w:val="yellow"/>
-        </w:rPr>
-        <w:t xml:space="preserve">is </w:t>
-      </w:r>
-      <w:r>
-        <w:rPr>
-          <w:rFonts w:ascii="Times New Roman" w:eastAsia="Times New Roman" w:hAnsi="Times New Roman" w:cs="Times New Roman"/>
-          <w:i/>
-          <w:highlight w:val="yellow"/>
-        </w:rPr>
-        <w:t>from output of an R script (NOT a screenshot</w:t>
-      </w:r>
-      <w:r>
-        <w:rPr>
-          <w:rFonts w:ascii="Times New Roman" w:eastAsia="Times New Roman" w:hAnsi="Times New Roman" w:cs="Times New Roman"/>
-          <w:i/>
-          <w:highlight w:val="yellow"/>
-        </w:rPr>
-        <w:t>)</w:t>
-      </w:r>
-      <w:r>
-        <w:rPr>
-          <w:rFonts w:ascii="Times New Roman" w:eastAsia="Times New Roman" w:hAnsi="Times New Roman" w:cs="Times New Roman"/>
-          <w:i/>
-          <w:highlight w:val="yellow"/>
-        </w:rPr>
-        <w:t>.</w:t>
-      </w:r>
-    </w:p>
-    <w:p>
-      <w:pPr>
-        <w:pStyle w:val="ListParagraph"/>
-        <w:numPr>
-          <w:ilvl w:val="0"/>
-          <w:numId w:val="23"/>
-        </w:numPr>
-        <w:ind w:left="1800"/>
-        <w:rPr>
-          <w:rFonts w:ascii="Times New Roman" w:eastAsia="Times New Roman" w:hAnsi="Times New Roman" w:cs="Times New Roman"/>
-          <w:i/>
-          <w:highlight w:val="yellow"/>
-        </w:rPr>
-      </w:pPr>
-      <w:r>
-        <w:rPr>
-          <w:rFonts w:ascii="Times New Roman" w:eastAsia="Times New Roman" w:hAnsi="Times New Roman" w:cs="Times New Roman"/>
-          <w:i/>
-          <w:highlight w:val="yellow"/>
-        </w:rPr>
-        <w:t xml:space="preserve">Make sure that the </w:t>
-      </w:r>
-      <w:r>
-        <w:rPr>
-          <w:rFonts w:ascii="Times New Roman" w:eastAsia="Times New Roman" w:hAnsi="Times New Roman" w:cs="Times New Roman"/>
-          <w:i/>
-          <w:highlight w:val="yellow"/>
-        </w:rPr>
-        <w:t>plot</w:t>
-      </w:r>
-      <w:r>
-        <w:rPr>
-          <w:rFonts w:ascii="Times New Roman" w:eastAsia="Times New Roman" w:hAnsi="Times New Roman" w:cs="Times New Roman"/>
-          <w:i/>
-          <w:highlight w:val="yellow"/>
-        </w:rPr>
-        <w:t xml:space="preserve"> </w:t>
-      </w:r>
-      <w:r>
-        <w:rPr>
-          <w:rFonts w:ascii="Times New Roman" w:eastAsia="Times New Roman" w:hAnsi="Times New Roman" w:cs="Times New Roman"/>
-          <w:i/>
-          <w:highlight w:val="yellow"/>
-        </w:rPr>
-        <w:t>has</w:t>
-      </w:r>
-      <w:r>
-        <w:rPr>
-          <w:rFonts w:ascii="Times New Roman" w:eastAsia="Times New Roman" w:hAnsi="Times New Roman" w:cs="Times New Roman"/>
-          <w:i/>
-          <w:highlight w:val="yellow"/>
-        </w:rPr>
-        <w:t xml:space="preserve"> a caption or title, X and Y-axis labels</w:t>
-      </w:r>
-      <w:r>
-        <w:rPr>
-          <w:rFonts w:ascii="Times New Roman" w:eastAsia="Times New Roman" w:hAnsi="Times New Roman" w:cs="Times New Roman"/>
-          <w:i/>
-          <w:highlight w:val="yellow"/>
-        </w:rPr>
-        <w:t xml:space="preserve"> with units where appropriate</w:t>
-      </w:r>
-      <w:r>
-        <w:rPr>
-          <w:rFonts w:ascii="Times New Roman" w:eastAsia="Times New Roman" w:hAnsi="Times New Roman" w:cs="Times New Roman"/>
-          <w:i/>
-          <w:highlight w:val="yellow"/>
-        </w:rPr>
-        <w:t>,</w:t>
-      </w:r>
-      <w:r>
-        <w:rPr>
-          <w:rFonts w:ascii="Times New Roman" w:eastAsia="Times New Roman" w:hAnsi="Times New Roman" w:cs="Times New Roman"/>
-          <w:i/>
-          <w:highlight w:val="yellow"/>
-        </w:rPr>
-        <w:t xml:space="preserve"> and legend</w:t>
-      </w:r>
-      <w:r>
-        <w:rPr>
-          <w:rFonts w:ascii="Times New Roman" w:eastAsia="Times New Roman" w:hAnsi="Times New Roman" w:cs="Times New Roman"/>
-          <w:i/>
-          <w:highlight w:val="yellow"/>
-        </w:rPr>
-        <w:t>.</w:t>
-      </w:r>
-    </w:p>
-    <w:p>
-      <w:pPr>
-        <w:pStyle w:val="ListParagraph"/>
-        <w:numPr>
-          <w:ilvl w:val="0"/>
-          <w:numId w:val="23"/>
-        </w:numPr>
-        <w:ind w:left="1800"/>
-        <w:rPr>
-          <w:rFonts w:ascii="Times New Roman" w:eastAsia="Times New Roman" w:hAnsi="Times New Roman" w:cs="Times New Roman"/>
-          <w:i/>
-          <w:highlight w:val="yellow"/>
-        </w:rPr>
-      </w:pPr>
-      <w:r>
-        <w:rPr>
-          <w:rFonts w:ascii="Times New Roman" w:eastAsia="Times New Roman" w:hAnsi="Times New Roman" w:cs="Times New Roman"/>
-          <w:i/>
-          <w:highlight w:val="yellow"/>
-        </w:rPr>
-        <w:t>Make sure the title or caption and axis labels</w:t>
-      </w:r>
-      <w:r>
-        <w:rPr>
-          <w:rFonts w:ascii="Times New Roman" w:eastAsia="Times New Roman" w:hAnsi="Times New Roman" w:cs="Times New Roman"/>
-          <w:i/>
-          <w:highlight w:val="yellow"/>
-        </w:rPr>
-        <w:t xml:space="preserve"> are</w:t>
-      </w:r>
-      <w:r>
-        <w:rPr>
-          <w:rFonts w:ascii="Times New Roman" w:eastAsia="Times New Roman" w:hAnsi="Times New Roman" w:cs="Times New Roman"/>
-          <w:i/>
-          <w:highlight w:val="yellow"/>
-        </w:rPr>
-        <w:t xml:space="preserve"> informative</w:t>
-      </w:r>
-      <w:r>
-        <w:rPr>
-          <w:rFonts w:ascii="Times New Roman" w:eastAsia="Times New Roman" w:hAnsi="Times New Roman" w:cs="Times New Roman"/>
-          <w:i/>
-          <w:highlight w:val="yellow"/>
-        </w:rPr>
-        <w:t xml:space="preserve"> and written in English</w:t>
-      </w:r>
-      <w:r>
-        <w:rPr>
-          <w:rFonts w:ascii="Times New Roman" w:eastAsia="Times New Roman" w:hAnsi="Times New Roman" w:cs="Times New Roman"/>
-          <w:i/>
-          <w:highlight w:val="yellow"/>
-        </w:rPr>
-        <w:t>.</w:t>
-      </w:r>
-    </w:p>
-    <w:p>
-      <w:pPr>
-        <w:pStyle w:val="ListParagraph"/>
-        <w:rPr>
-          <w:rFonts w:ascii="Times New Roman" w:eastAsia="Times New Roman" w:hAnsi="Times New Roman" w:cs="Times New Roman"/>
-          <w:i/>
-          <w:iCs/>
+        <w:ind w:left="1440" w:hanging="720"/>
+        <w:rPr>
+          <w:rFonts w:ascii="Times New Roman" w:eastAsia="Times New Roman" w:hAnsi="Times New Roman" w:cs="Times New Roman"/>
         </w:rPr>
       </w:pPr>
     </w:p>
@@ -2491,7 +2591,7 @@
         <w:rPr>
           <w:rFonts w:ascii="Times New Roman" w:eastAsia="Times New Roman" w:hAnsi="Times New Roman" w:cs="Times New Roman"/>
         </w:rPr>
-        <w:t>Additional information relating to understanding the data (optional)</w:t>
+        <w:t>Useful information for the data understanding</w:t>
       </w:r>
       <w:r>
         <w:rPr>
@@ -2510,8 +2610,6 @@
       <w:r>
         <w:rPr>
           <w:rFonts w:ascii="Times New Roman" w:eastAsia="Times New Roman" w:hAnsi="Times New Roman" w:cs="Times New Roman"/>
-          <w:i/>
-          <w:iCs/>
         </w:rPr>
         <w:t xml:space="preserve"> </w:t>
       </w:r>
@@ -2521,7 +2619,7 @@
         <w:pStyle w:val="ListParagraph"/>
         <w:numPr>
           <w:ilvl w:val="0"/>
-          <w:numId w:val="22"/>
+          <w:numId w:val="21"/>
         </w:numPr>
         <w:ind w:left="1800"/>
         <w:rPr>
@@ -2538,7 +2636,7 @@
           <w:iCs/>
           <w:highlight w:val="yellow"/>
         </w:rPr>
-        <w:t>P</w:t>
+        <w:t>S</w:t>
       </w:r>
       <w:r>
         <w:rPr>
@@ -2547,17 +2645,48 @@
           <w:iCs/>
           <w:highlight w:val="yellow"/>
         </w:rPr>
-        <w:t>er plot: explain the purpose and insights.</w:t>
+        <w:t>ummarise key observations from the plot.</w:t>
       </w:r>
     </w:p>
     <w:p>
       <w:pPr>
         <w:pStyle w:val="ListParagraph"/>
-        <w:ind w:left="1440" w:hanging="720"/>
-        <w:rPr>
-          <w:rFonts w:ascii="Times New Roman" w:eastAsia="Times New Roman" w:hAnsi="Times New Roman" w:cs="Times New Roman"/>
-        </w:rPr>
-      </w:pPr>
+        <w:rPr>
+          <w:rFonts w:ascii="Times New Roman" w:eastAsia="Times New Roman" w:hAnsi="Times New Roman" w:cs="Times New Roman"/>
+        </w:rPr>
+      </w:pPr>
+    </w:p>
+    <w:p>
+      <w:pPr>
+        <w:ind w:left="1440"/>
+        <w:rPr>
+          <w:rFonts w:ascii="Times New Roman" w:eastAsia="Times New Roman" w:hAnsi="Times New Roman" w:cs="Times New Roman"/>
+        </w:rPr>
+      </w:pPr>
+      <w:r>
+        <w:rPr>
+          <w:rFonts w:ascii="Times New Roman" w:eastAsia="Times New Roman" w:hAnsi="Times New Roman" w:cs="Times New Roman"/>
+        </w:rPr>
+        <w:t xml:space="preserve"> </w:t>
+      </w:r>
+    </w:p>
+    <w:p>
+      <w:pPr>
+        <w:pStyle w:val="ListParagraph"/>
+        <w:numPr>
+          <w:ilvl w:val="0"/>
+          <w:numId w:val="35"/>
+        </w:numPr>
+        <w:rPr>
+          <w:rFonts w:ascii="Times New Roman" w:eastAsia="Times New Roman" w:hAnsi="Times New Roman" w:cs="Times New Roman"/>
+        </w:rPr>
+      </w:pPr>
+      <w:r>
+        <w:rPr>
+          <w:rFonts w:ascii="Times New Roman" w:eastAsia="Times New Roman" w:hAnsi="Times New Roman" w:cs="Times New Roman"/>
+        </w:rPr>
+        <w:t>Analysis</w:t>
+      </w:r>
     </w:p>
     <w:p>
       <w:pPr>
@@ -2577,7 +2706,7 @@
         <w:rPr>
           <w:rFonts w:ascii="Times New Roman" w:eastAsia="Times New Roman" w:hAnsi="Times New Roman" w:cs="Times New Roman"/>
         </w:rPr>
-        <w:t>Useful information for the data understanding</w:t>
+        <w:t>Statistical test used to test the hypotheses and output</w:t>
       </w:r>
       <w:r>
         <w:rPr>
@@ -2591,7 +2720,7 @@
           <w:b/>
           <w:bCs/>
         </w:rPr>
-        <w:t>50 words)</w:t>
+        <w:t>75 words)</w:t>
       </w:r>
       <w:r>
         <w:rPr>
@@ -2605,9 +2734,8 @@
         <w:pStyle w:val="ListParagraph"/>
         <w:numPr>
           <w:ilvl w:val="0"/>
-          <w:numId w:val="21"/>
+          <w:numId w:val="20"/>
         </w:numPr>
-        <w:ind w:left="1800"/>
         <w:rPr>
           <w:rFonts w:ascii="Times New Roman" w:eastAsia="Times New Roman" w:hAnsi="Times New Roman" w:cs="Times New Roman"/>
           <w:i/>
@@ -2622,7 +2750,7 @@
           <w:iCs/>
           <w:highlight w:val="yellow"/>
         </w:rPr>
-        <w:t>S</w:t>
+        <w:t>E</w:t>
       </w:r>
       <w:r>
         <w:rPr>
@@ -2631,27 +2759,40 @@
           <w:iCs/>
           <w:highlight w:val="yellow"/>
         </w:rPr>
-        <w:t>ummarise key observations from the plot.</w:t>
-      </w:r>
-    </w:p>
-    <w:p>
-      <w:pPr>
-        <w:pStyle w:val="ListParagraph"/>
-        <w:rPr>
-          <w:rFonts w:ascii="Times New Roman" w:eastAsia="Times New Roman" w:hAnsi="Times New Roman" w:cs="Times New Roman"/>
-        </w:rPr>
-      </w:pPr>
-    </w:p>
-    <w:p>
-      <w:pPr>
-        <w:ind w:left="1440"/>
-        <w:rPr>
-          <w:rFonts w:ascii="Times New Roman" w:eastAsia="Times New Roman" w:hAnsi="Times New Roman" w:cs="Times New Roman"/>
-        </w:rPr>
-      </w:pPr>
-      <w:r>
-        <w:rPr>
-          <w:rFonts w:ascii="Times New Roman" w:eastAsia="Times New Roman" w:hAnsi="Times New Roman" w:cs="Times New Roman"/>
+        <w:t xml:space="preserve">xplain the choice of </w:t>
+      </w:r>
+      <w:r>
+        <w:rPr>
+          <w:rFonts w:ascii="Times New Roman" w:eastAsia="Times New Roman" w:hAnsi="Times New Roman" w:cs="Times New Roman"/>
+          <w:i/>
+          <w:iCs/>
+          <w:highlight w:val="yellow"/>
+        </w:rPr>
+        <w:t xml:space="preserve">the </w:t>
+      </w:r>
+      <w:r>
+        <w:rPr>
+          <w:rFonts w:ascii="Times New Roman" w:eastAsia="Times New Roman" w:hAnsi="Times New Roman" w:cs="Times New Roman"/>
+          <w:i/>
+          <w:iCs/>
+          <w:highlight w:val="yellow"/>
+        </w:rPr>
+        <w:t xml:space="preserve">statistical </w:t>
+      </w:r>
+      <w:r>
+        <w:rPr>
+          <w:rFonts w:ascii="Times New Roman" w:eastAsia="Times New Roman" w:hAnsi="Times New Roman" w:cs="Times New Roman"/>
+          <w:i/>
+          <w:iCs/>
+          <w:highlight w:val="yellow"/>
+        </w:rPr>
+        <w:t>test.</w:t>
+      </w:r>
+      <w:r>
+        <w:rPr>
+          <w:rFonts w:ascii="Times New Roman" w:eastAsia="Times New Roman" w:hAnsi="Times New Roman" w:cs="Times New Roman"/>
+          <w:i/>
+          <w:iCs/>
         </w:rPr>
         <w:t xml:space="preserve"> </w:t>
       </w:r>
@@ -2661,18 +2802,33 @@
         <w:pStyle w:val="ListParagraph"/>
         <w:numPr>
           <w:ilvl w:val="0"/>
-          <w:numId w:val="35"/>
+          <w:numId w:val="20"/>
         </w:numPr>
         <w:rPr>
           <w:rFonts w:ascii="Times New Roman" w:eastAsia="Times New Roman" w:hAnsi="Times New Roman" w:cs="Times New Roman"/>
-        </w:rPr>
-      </w:pPr>
-      <w:r>
-        <w:rPr>
-          <w:rFonts w:ascii="Times New Roman" w:eastAsia="Times New Roman" w:hAnsi="Times New Roman" w:cs="Times New Roman"/>
-        </w:rPr>
-        <w:t>Analysis</w:t>
-      </w:r>
+          <w:i/>
+          <w:iCs/>
+          <w:highlight w:val="yellow"/>
+        </w:rPr>
+      </w:pPr>
+      <w:r>
+        <w:rPr>
+          <w:rFonts w:ascii="Times New Roman" w:eastAsia="Times New Roman" w:hAnsi="Times New Roman" w:cs="Times New Roman"/>
+          <w:i/>
+          <w:iCs/>
+          <w:highlight w:val="yellow"/>
+        </w:rPr>
+        <w:t>Make sure the test is appropriate for the RQ and data.</w:t>
+      </w:r>
+    </w:p>
+    <w:p>
+      <w:pPr>
+        <w:pStyle w:val="ListParagraph"/>
+        <w:ind w:left="1440" w:hanging="720"/>
+        <w:rPr>
+          <w:rFonts w:ascii="Times New Roman" w:eastAsia="Times New Roman" w:hAnsi="Times New Roman" w:cs="Times New Roman"/>
+        </w:rPr>
+      </w:pPr>
     </w:p>
     <w:p>
       <w:pPr>
@@ -2686,13 +2842,14 @@
           <w:rFonts w:ascii="Times New Roman" w:eastAsia="Times New Roman" w:hAnsi="Times New Roman" w:cs="Times New Roman"/>
           <w:i/>
           <w:iCs/>
-        </w:rPr>
-      </w:pPr>
-      <w:r>
-        <w:rPr>
-          <w:rFonts w:ascii="Times New Roman" w:eastAsia="Times New Roman" w:hAnsi="Times New Roman" w:cs="Times New Roman"/>
-        </w:rPr>
-        <w:t>Statistical test used to test the hypotheses and output</w:t>
+          <w:highlight w:val="yellow"/>
+        </w:rPr>
+      </w:pPr>
+      <w:r>
+        <w:rPr>
+          <w:rFonts w:ascii="Times New Roman" w:eastAsia="Times New Roman" w:hAnsi="Times New Roman" w:cs="Times New Roman"/>
+        </w:rPr>
+        <w:t>The null hypothesis is rejected /not rejected based on the p-value</w:t>
       </w:r>
       <w:r>
         <w:rPr>
@@ -2706,8 +2863,39 @@
           <w:b/>
           <w:bCs/>
         </w:rPr>
-        <w:t>75 words)</w:t>
-      </w:r>
+        <w:t>10</w:t>
+      </w:r>
+      <w:r>
+        <w:rPr>
+          <w:rFonts w:ascii="Times New Roman" w:eastAsia="Times New Roman" w:hAnsi="Times New Roman" w:cs="Times New Roman"/>
+          <w:b/>
+          <w:bCs/>
+        </w:rPr>
+        <w:t>0 words)</w:t>
+      </w:r>
+      <w:r>
+        <w:rPr>
+          <w:rFonts w:ascii="Times New Roman" w:eastAsia="Times New Roman" w:hAnsi="Times New Roman" w:cs="Times New Roman"/>
+        </w:rPr>
+        <w:t xml:space="preserve"> </w:t>
+      </w:r>
+      <w:r>
+        <w:rPr>
+          <w:rFonts w:ascii="Times New Roman" w:eastAsia="Times New Roman" w:hAnsi="Times New Roman" w:cs="Times New Roman"/>
+          <w:i/>
+          <w:iCs/>
+          <w:highlight w:val="yellow"/>
+        </w:rPr>
+        <w:t>(interpret the results)</w:t>
+      </w:r>
+    </w:p>
+    <w:p>
+      <w:pPr>
+        <w:ind w:left="1440"/>
+        <w:rPr>
+          <w:rFonts w:ascii="Times New Roman" w:eastAsia="Times New Roman" w:hAnsi="Times New Roman" w:cs="Times New Roman"/>
+        </w:rPr>
+      </w:pPr>
       <w:r>
         <w:rPr>
           <w:rFonts w:ascii="Times New Roman" w:eastAsia="Times New Roman" w:hAnsi="Times New Roman" w:cs="Times New Roman"/>
@@ -2720,101 +2908,18 @@
         <w:pStyle w:val="ListParagraph"/>
         <w:numPr>
           <w:ilvl w:val="0"/>
-          <w:numId w:val="20"/>
+          <w:numId w:val="35"/>
         </w:numPr>
         <w:rPr>
           <w:rFonts w:ascii="Times New Roman" w:eastAsia="Times New Roman" w:hAnsi="Times New Roman" w:cs="Times New Roman"/>
-          <w:i/>
-          <w:iCs/>
-          <w:highlight w:val="yellow"/>
-        </w:rPr>
-      </w:pPr>
-      <w:r>
-        <w:rPr>
-          <w:rFonts w:ascii="Times New Roman" w:eastAsia="Times New Roman" w:hAnsi="Times New Roman" w:cs="Times New Roman"/>
-          <w:i/>
-          <w:iCs/>
-          <w:highlight w:val="yellow"/>
-        </w:rPr>
-        <w:t>E</w:t>
-      </w:r>
-      <w:r>
-        <w:rPr>
-          <w:rFonts w:ascii="Times New Roman" w:eastAsia="Times New Roman" w:hAnsi="Times New Roman" w:cs="Times New Roman"/>
-          <w:i/>
-          <w:iCs/>
-          <w:highlight w:val="yellow"/>
-        </w:rPr>
-        <w:t xml:space="preserve">xplain the choice of </w:t>
-      </w:r>
-      <w:r>
-        <w:rPr>
-          <w:rFonts w:ascii="Times New Roman" w:eastAsia="Times New Roman" w:hAnsi="Times New Roman" w:cs="Times New Roman"/>
-          <w:i/>
-          <w:iCs/>
-          <w:highlight w:val="yellow"/>
-        </w:rPr>
-        <w:t xml:space="preserve">the </w:t>
-      </w:r>
-      <w:r>
-        <w:rPr>
-          <w:rFonts w:ascii="Times New Roman" w:eastAsia="Times New Roman" w:hAnsi="Times New Roman" w:cs="Times New Roman"/>
-          <w:i/>
-          <w:iCs/>
-          <w:highlight w:val="yellow"/>
-        </w:rPr>
-        <w:t xml:space="preserve">statistical </w:t>
-      </w:r>
-      <w:r>
-        <w:rPr>
-          <w:rFonts w:ascii="Times New Roman" w:eastAsia="Times New Roman" w:hAnsi="Times New Roman" w:cs="Times New Roman"/>
-          <w:i/>
-          <w:iCs/>
-          <w:highlight w:val="yellow"/>
-        </w:rPr>
-        <w:t>test.</w:t>
-      </w:r>
-      <w:r>
-        <w:rPr>
-          <w:rFonts w:ascii="Times New Roman" w:eastAsia="Times New Roman" w:hAnsi="Times New Roman" w:cs="Times New Roman"/>
-          <w:i/>
-          <w:iCs/>
-        </w:rPr>
-        <w:t xml:space="preserve"> </w:t>
-      </w:r>
-    </w:p>
-    <w:p>
-      <w:pPr>
-        <w:pStyle w:val="ListParagraph"/>
-        <w:numPr>
-          <w:ilvl w:val="0"/>
-          <w:numId w:val="20"/>
-        </w:numPr>
-        <w:rPr>
-          <w:rFonts w:ascii="Times New Roman" w:eastAsia="Times New Roman" w:hAnsi="Times New Roman" w:cs="Times New Roman"/>
-          <w:i/>
-          <w:iCs/>
-          <w:highlight w:val="yellow"/>
-        </w:rPr>
-      </w:pPr>
-      <w:r>
-        <w:rPr>
-          <w:rFonts w:ascii="Times New Roman" w:eastAsia="Times New Roman" w:hAnsi="Times New Roman" w:cs="Times New Roman"/>
-          <w:i/>
-          <w:iCs/>
-          <w:highlight w:val="yellow"/>
-        </w:rPr>
-        <w:t>Make sure the test is appropriate for the RQ and data.</w:t>
-      </w:r>
-    </w:p>
-    <w:p>
-      <w:pPr>
-        <w:pStyle w:val="ListParagraph"/>
-        <w:ind w:left="1440" w:hanging="720"/>
-        <w:rPr>
-          <w:rFonts w:ascii="Times New Roman" w:eastAsia="Times New Roman" w:hAnsi="Times New Roman" w:cs="Times New Roman"/>
-        </w:rPr>
-      </w:pPr>
+        </w:rPr>
+      </w:pPr>
+      <w:r>
+        <w:rPr>
+          <w:rFonts w:ascii="Times New Roman" w:eastAsia="Times New Roman" w:hAnsi="Times New Roman" w:cs="Times New Roman"/>
+        </w:rPr>
+        <w:t>Evaluation – group’s experience at 7COM1079</w:t>
+      </w:r>
     </w:p>
     <w:p>
       <w:pPr>
@@ -2826,22 +2931,19 @@
         <w:ind w:hanging="720"/>
         <w:rPr>
           <w:rFonts w:ascii="Times New Roman" w:eastAsia="Times New Roman" w:hAnsi="Times New Roman" w:cs="Times New Roman"/>
-          <w:i/>
-          <w:iCs/>
-          <w:highlight w:val="yellow"/>
-        </w:rPr>
-      </w:pPr>
-      <w:r>
-        <w:rPr>
-          <w:rFonts w:ascii="Times New Roman" w:eastAsia="Times New Roman" w:hAnsi="Times New Roman" w:cs="Times New Roman"/>
-        </w:rPr>
-        <w:t>The null hypothesis is rejected /not rejected based on the p-value</w:t>
-      </w:r>
-      <w:r>
-        <w:rPr>
-          <w:rFonts w:ascii="Times New Roman" w:eastAsia="Times New Roman" w:hAnsi="Times New Roman" w:cs="Times New Roman"/>
-        </w:rPr>
-        <w:t xml:space="preserve"> (</w:t>
+        </w:rPr>
+      </w:pPr>
+      <w:r>
+        <w:rPr>
+          <w:rFonts w:ascii="Times New Roman" w:eastAsia="Times New Roman" w:hAnsi="Times New Roman" w:cs="Times New Roman"/>
+        </w:rPr>
+        <w:t>What went well</w:t>
+      </w:r>
+      <w:r>
+        <w:rPr>
+          <w:rFonts w:ascii="Times New Roman" w:eastAsia="Times New Roman" w:hAnsi="Times New Roman" w:cs="Times New Roman"/>
+        </w:rPr>
+        <w:t xml:space="preserve"> </w:t>
       </w:r>
       <w:r>
         <w:rPr>
@@ -2849,62 +2951,7 @@
           <w:b/>
           <w:bCs/>
         </w:rPr>
-        <w:t>10</w:t>
-      </w:r>
-      <w:r>
-        <w:rPr>
-          <w:rFonts w:ascii="Times New Roman" w:eastAsia="Times New Roman" w:hAnsi="Times New Roman" w:cs="Times New Roman"/>
-          <w:b/>
-          <w:bCs/>
-        </w:rPr>
-        <w:t>0 words)</w:t>
-      </w:r>
-      <w:r>
-        <w:rPr>
-          <w:rFonts w:ascii="Times New Roman" w:eastAsia="Times New Roman" w:hAnsi="Times New Roman" w:cs="Times New Roman"/>
-        </w:rPr>
-        <w:t xml:space="preserve"> </w:t>
-      </w:r>
-      <w:r>
-        <w:rPr>
-          <w:rFonts w:ascii="Times New Roman" w:eastAsia="Times New Roman" w:hAnsi="Times New Roman" w:cs="Times New Roman"/>
-          <w:i/>
-          <w:iCs/>
-          <w:highlight w:val="yellow"/>
-        </w:rPr>
-        <w:t>(interpret the results)</w:t>
-      </w:r>
-    </w:p>
-    <w:p>
-      <w:pPr>
-        <w:ind w:left="1440"/>
-        <w:rPr>
-          <w:rFonts w:ascii="Times New Roman" w:eastAsia="Times New Roman" w:hAnsi="Times New Roman" w:cs="Times New Roman"/>
-        </w:rPr>
-      </w:pPr>
-      <w:r>
-        <w:rPr>
-          <w:rFonts w:ascii="Times New Roman" w:eastAsia="Times New Roman" w:hAnsi="Times New Roman" w:cs="Times New Roman"/>
-        </w:rPr>
-        <w:t xml:space="preserve"> </w:t>
-      </w:r>
-    </w:p>
-    <w:p>
-      <w:pPr>
-        <w:pStyle w:val="ListParagraph"/>
-        <w:numPr>
-          <w:ilvl w:val="0"/>
-          <w:numId w:val="35"/>
-        </w:numPr>
-        <w:rPr>
-          <w:rFonts w:ascii="Times New Roman" w:eastAsia="Times New Roman" w:hAnsi="Times New Roman" w:cs="Times New Roman"/>
-        </w:rPr>
-      </w:pPr>
-      <w:r>
-        <w:rPr>
-          <w:rFonts w:ascii="Times New Roman" w:eastAsia="Times New Roman" w:hAnsi="Times New Roman" w:cs="Times New Roman"/>
-        </w:rPr>
-        <w:t>Evaluation – group’s experience at 7COM1079</w:t>
+        <w:t>(75 words)</w:t>
       </w:r>
     </w:p>
     <w:p>
@@ -2923,7 +2970,7 @@
         <w:rPr>
           <w:rFonts w:ascii="Times New Roman" w:eastAsia="Times New Roman" w:hAnsi="Times New Roman" w:cs="Times New Roman"/>
         </w:rPr>
-        <w:t>What went well</w:t>
+        <w:t>Points for improvement</w:t>
       </w:r>
       <w:r>
         <w:rPr>
@@ -2956,21 +3003,14 @@
         <w:rPr>
           <w:rFonts w:ascii="Times New Roman" w:eastAsia="Times New Roman" w:hAnsi="Times New Roman" w:cs="Times New Roman"/>
         </w:rPr>
-        <w:t>Points for improvement</w:t>
-      </w:r>
-      <w:r>
-        <w:rPr>
-          <w:rFonts w:ascii="Times New Roman" w:eastAsia="Times New Roman" w:hAnsi="Times New Roman" w:cs="Times New Roman"/>
-        </w:rPr>
-        <w:t xml:space="preserve"> </w:t>
+        <w:t>Group’s time management (</w:t>
       </w:r>
       <w:r>
         <w:rPr>
           <w:rFonts w:ascii="Times New Roman" w:eastAsia="Times New Roman" w:hAnsi="Times New Roman" w:cs="Times New Roman"/>
           <w:b/>
-          <w:bCs/>
-        </w:rPr>
-        <w:t>(75 words)</w:t>
+        </w:rPr>
+        <w:t>50 words)</w:t>
       </w:r>
     </w:p>
     <w:p>
@@ -2989,7 +3029,7 @@
         <w:rPr>
           <w:rFonts w:ascii="Times New Roman" w:eastAsia="Times New Roman" w:hAnsi="Times New Roman" w:cs="Times New Roman"/>
         </w:rPr>
-        <w:t>Group’s time management (</w:t>
+        <w:t>Project’s overall judgement (</w:t>
       </w:r>
       <w:r>
         <w:rPr>
@@ -3009,20 +3049,103 @@
         <w:ind w:hanging="720"/>
         <w:rPr>
           <w:rFonts w:ascii="Times New Roman" w:eastAsia="Times New Roman" w:hAnsi="Times New Roman" w:cs="Times New Roman"/>
-        </w:rPr>
-      </w:pPr>
-      <w:r>
-        <w:rPr>
-          <w:rFonts w:ascii="Times New Roman" w:eastAsia="Times New Roman" w:hAnsi="Times New Roman" w:cs="Times New Roman"/>
-        </w:rPr>
-        <w:t>Project’s overall judgement (</w:t>
-      </w:r>
-      <w:r>
-        <w:rPr>
-          <w:rFonts w:ascii="Times New Roman" w:eastAsia="Times New Roman" w:hAnsi="Times New Roman" w:cs="Times New Roman"/>
           <w:b/>
-        </w:rPr>
-        <w:t>50 words)</w:t>
+          <w:bCs/>
+        </w:rPr>
+      </w:pPr>
+      <w:r>
+        <w:rPr>
+          <w:rFonts w:ascii="Times New Roman" w:eastAsia="Times New Roman" w:hAnsi="Times New Roman" w:cs="Times New Roman"/>
+          <w:i/>
+          <w:iCs/>
+        </w:rPr>
+        <w:t xml:space="preserve">Note any </w:t>
+      </w:r>
+      <w:r>
+        <w:rPr>
+          <w:rFonts w:ascii="Times New Roman" w:eastAsia="Times New Roman" w:hAnsi="Times New Roman" w:cs="Times New Roman"/>
+          <w:i/>
+          <w:iCs/>
+        </w:rPr>
+        <w:t>changes</w:t>
+      </w:r>
+      <w:r>
+        <w:rPr>
+          <w:rFonts w:ascii="Times New Roman" w:eastAsia="Times New Roman" w:hAnsi="Times New Roman" w:cs="Times New Roman"/>
+          <w:i/>
+          <w:iCs/>
+        </w:rPr>
+        <w:t xml:space="preserve"> </w:t>
+      </w:r>
+      <w:r>
+        <w:rPr>
+          <w:rFonts w:ascii="Times New Roman" w:eastAsia="Times New Roman" w:hAnsi="Times New Roman" w:cs="Times New Roman"/>
+          <w:i/>
+          <w:iCs/>
+        </w:rPr>
+        <w:t>t</w:t>
+      </w:r>
+      <w:r>
+        <w:rPr>
+          <w:rFonts w:ascii="Times New Roman" w:eastAsia="Times New Roman" w:hAnsi="Times New Roman" w:cs="Times New Roman"/>
+          <w:i/>
+          <w:iCs/>
+        </w:rPr>
+        <w:t xml:space="preserve">o group since </w:t>
+      </w:r>
+      <w:r>
+        <w:rPr>
+          <w:rFonts w:ascii="Times New Roman" w:eastAsia="Times New Roman" w:hAnsi="Times New Roman" w:cs="Times New Roman"/>
+          <w:i/>
+          <w:iCs/>
+        </w:rPr>
+        <w:t>original allocation if applicable</w:t>
+      </w:r>
+      <w:r>
+        <w:rPr>
+          <w:rFonts w:ascii="Times New Roman" w:eastAsia="Times New Roman" w:hAnsi="Times New Roman" w:cs="Times New Roman"/>
+          <w:i/>
+          <w:iCs/>
+        </w:rPr>
+        <w:t xml:space="preserve">. </w:t>
+      </w:r>
+      <w:r>
+        <w:rPr>
+          <w:rFonts w:ascii="Times New Roman" w:eastAsia="Times New Roman" w:hAnsi="Times New Roman" w:cs="Times New Roman"/>
+          <w:i/>
+          <w:iCs/>
+        </w:rPr>
+        <w:t xml:space="preserve">Add new </w:t>
+      </w:r>
+      <w:r>
+        <w:rPr>
+          <w:rFonts w:ascii="Times New Roman" w:eastAsia="Times New Roman" w:hAnsi="Times New Roman" w:cs="Times New Roman"/>
+          <w:i/>
+          <w:iCs/>
+        </w:rPr>
+        <w:t xml:space="preserve">or amended </w:t>
+      </w:r>
+      <w:r>
+        <w:rPr>
+          <w:rFonts w:ascii="Times New Roman" w:eastAsia="Times New Roman" w:hAnsi="Times New Roman" w:cs="Times New Roman"/>
+          <w:i/>
+          <w:iCs/>
+        </w:rPr>
+        <w:t>GitHub Ids for new members</w:t>
+      </w:r>
+      <w:r>
+        <w:rPr>
+          <w:rFonts w:ascii="Times New Roman" w:eastAsia="Times New Roman" w:hAnsi="Times New Roman" w:cs="Times New Roman"/>
+        </w:rPr>
+        <w:t xml:space="preserve"> </w:t>
+      </w:r>
+      <w:r>
+        <w:rPr>
+          <w:rFonts w:ascii="Times New Roman" w:eastAsia="Times New Roman" w:hAnsi="Times New Roman" w:cs="Times New Roman"/>
+          <w:b/>
+          <w:bCs/>
+        </w:rPr>
+        <w:t>(75 words, write only if applies to your group arrangements)</w:t>
       </w:r>
     </w:p>
     <w:p>
@@ -3042,88 +3165,20 @@
       <w:r>
         <w:rPr>
           <w:rFonts w:ascii="Times New Roman" w:eastAsia="Times New Roman" w:hAnsi="Times New Roman" w:cs="Times New Roman"/>
-          <w:i/>
-          <w:iCs/>
-        </w:rPr>
-        <w:t xml:space="preserve">Note any </w:t>
-      </w:r>
-      <w:r>
-        <w:rPr>
-          <w:rFonts w:ascii="Times New Roman" w:eastAsia="Times New Roman" w:hAnsi="Times New Roman" w:cs="Times New Roman"/>
-          <w:i/>
-          <w:iCs/>
-        </w:rPr>
-        <w:t>changes</w:t>
-      </w:r>
-      <w:r>
-        <w:rPr>
-          <w:rFonts w:ascii="Times New Roman" w:eastAsia="Times New Roman" w:hAnsi="Times New Roman" w:cs="Times New Roman"/>
-          <w:i/>
-          <w:iCs/>
-        </w:rPr>
-        <w:t xml:space="preserve"> </w:t>
-      </w:r>
-      <w:r>
-        <w:rPr>
-          <w:rFonts w:ascii="Times New Roman" w:eastAsia="Times New Roman" w:hAnsi="Times New Roman" w:cs="Times New Roman"/>
-          <w:i/>
-          <w:iCs/>
-        </w:rPr>
-        <w:t>t</w:t>
-      </w:r>
-      <w:r>
-        <w:rPr>
-          <w:rFonts w:ascii="Times New Roman" w:eastAsia="Times New Roman" w:hAnsi="Times New Roman" w:cs="Times New Roman"/>
-          <w:i/>
-          <w:iCs/>
-        </w:rPr>
-        <w:t xml:space="preserve">o group since </w:t>
-      </w:r>
-      <w:r>
-        <w:rPr>
-          <w:rFonts w:ascii="Times New Roman" w:eastAsia="Times New Roman" w:hAnsi="Times New Roman" w:cs="Times New Roman"/>
-          <w:i/>
-          <w:iCs/>
-        </w:rPr>
-        <w:t>original allocation if applicable</w:t>
-      </w:r>
-      <w:r>
-        <w:rPr>
-          <w:rFonts w:ascii="Times New Roman" w:eastAsia="Times New Roman" w:hAnsi="Times New Roman" w:cs="Times New Roman"/>
-          <w:i/>
-          <w:iCs/>
-        </w:rPr>
-        <w:t xml:space="preserve">. </w:t>
-      </w:r>
-      <w:r>
-        <w:rPr>
-          <w:rFonts w:ascii="Times New Roman" w:eastAsia="Times New Roman" w:hAnsi="Times New Roman" w:cs="Times New Roman"/>
-          <w:i/>
-          <w:iCs/>
-        </w:rPr>
-        <w:t xml:space="preserve">Add new </w:t>
-      </w:r>
-      <w:r>
-        <w:rPr>
-          <w:rFonts w:ascii="Times New Roman" w:eastAsia="Times New Roman" w:hAnsi="Times New Roman" w:cs="Times New Roman"/>
-          <w:i/>
-          <w:iCs/>
-        </w:rPr>
-        <w:t xml:space="preserve">or amended </w:t>
-      </w:r>
-      <w:r>
-        <w:rPr>
-          <w:rFonts w:ascii="Times New Roman" w:eastAsia="Times New Roman" w:hAnsi="Times New Roman" w:cs="Times New Roman"/>
-          <w:i/>
-          <w:iCs/>
-        </w:rPr>
-        <w:t>GitHub Ids for new members</w:t>
-      </w:r>
-      <w:r>
-        <w:rPr>
-          <w:rFonts w:ascii="Times New Roman" w:eastAsia="Times New Roman" w:hAnsi="Times New Roman" w:cs="Times New Roman"/>
-        </w:rPr>
-        <w:t xml:space="preserve"> </w:t>
+        </w:rPr>
+        <w:t>Comment on the Git</w:t>
+      </w:r>
+      <w:r>
+        <w:rPr>
+          <w:rFonts w:ascii="Times New Roman" w:eastAsia="Times New Roman" w:hAnsi="Times New Roman" w:cs="Times New Roman"/>
+        </w:rPr>
+        <w:t>Hub</w:t>
+      </w:r>
+      <w:r>
+        <w:rPr>
+          <w:rFonts w:ascii="Times New Roman" w:eastAsia="Times New Roman" w:hAnsi="Times New Roman" w:cs="Times New Roman"/>
+        </w:rPr>
+        <w:t xml:space="preserve"> log output </w:t>
       </w:r>
       <w:r>
         <w:rPr>
@@ -3131,17 +3186,13 @@
           <w:b/>
           <w:bCs/>
         </w:rPr>
-        <w:t>(75 words, write only if applies to your group arrangements)</w:t>
+        <w:t xml:space="preserve">(50 words) </w:t>
       </w:r>
     </w:p>
     <w:p>
       <w:pPr>
         <w:pStyle w:val="ListParagraph"/>
-        <w:numPr>
-          <w:ilvl w:val="1"/>
-          <w:numId w:val="35"/>
-        </w:numPr>
-        <w:ind w:hanging="720"/>
+        <w:ind w:left="1440"/>
         <w:rPr>
           <w:rFonts w:ascii="Times New Roman" w:eastAsia="Times New Roman" w:hAnsi="Times New Roman" w:cs="Times New Roman"/>
           <w:b/>
@@ -3151,20 +3202,29 @@
       <w:r>
         <w:rPr>
           <w:rFonts w:ascii="Times New Roman" w:eastAsia="Times New Roman" w:hAnsi="Times New Roman" w:cs="Times New Roman"/>
-        </w:rPr>
-        <w:t>Comment on the Git</w:t>
-      </w:r>
-      <w:r>
-        <w:rPr>
-          <w:rFonts w:ascii="Times New Roman" w:eastAsia="Times New Roman" w:hAnsi="Times New Roman" w:cs="Times New Roman"/>
-        </w:rPr>
-        <w:t>Hub</w:t>
-      </w:r>
-      <w:r>
-        <w:rPr>
-          <w:rFonts w:ascii="Times New Roman" w:eastAsia="Times New Roman" w:hAnsi="Times New Roman" w:cs="Times New Roman"/>
-        </w:rPr>
-        <w:t xml:space="preserve"> log output </w:t>
+          <w:i/>
+          <w:iCs/>
+          <w:highlight w:val="yellow"/>
+        </w:rPr>
+        <w:t>Please comment on the GitHub log output, and refer to it as being</w:t>
+      </w:r>
+      <w:r>
+        <w:rPr>
+          <w:rFonts w:ascii="Times New Roman" w:eastAsia="Times New Roman" w:hAnsi="Times New Roman" w:cs="Times New Roman"/>
+          <w:i/>
+          <w:iCs/>
+          <w:highlight w:val="yellow"/>
+        </w:rPr>
+        <w:t xml:space="preserve"> </w:t>
+      </w:r>
+      <w:r>
+        <w:rPr>
+          <w:rFonts w:ascii="Times New Roman" w:eastAsia="Times New Roman" w:hAnsi="Times New Roman" w:cs="Times New Roman"/>
+          <w:i/>
+          <w:iCs/>
+          <w:highlight w:val="yellow"/>
+        </w:rPr>
+        <w:t>placed into</w:t>
       </w:r>
       <w:r>
         <w:rPr>
@@ -3172,69 +3232,23 @@
           <w:b/>
           <w:bCs/>
         </w:rPr>
-        <w:t xml:space="preserve">(50 words) </w:t>
-      </w:r>
-    </w:p>
-    <w:p>
-      <w:pPr>
-        <w:pStyle w:val="ListParagraph"/>
-        <w:ind w:left="1440"/>
+        <w:t xml:space="preserve"> </w:t>
+      </w:r>
+      <w:r>
+        <w:rPr>
+          <w:rFonts w:ascii="Times New Roman" w:eastAsiaTheme="minorEastAsia" w:hAnsi="Times New Roman" w:cs="Times New Roman"/>
+          <w:i/>
+          <w:iCs/>
+          <w:highlight w:val="yellow"/>
+        </w:rPr>
+        <w:t>Appendix B.</w:t>
+      </w:r>
+      <w:r>
         <w:rPr>
           <w:rFonts w:ascii="Times New Roman" w:eastAsia="Times New Roman" w:hAnsi="Times New Roman" w:cs="Times New Roman"/>
           <w:b/>
           <w:bCs/>
         </w:rPr>
-      </w:pPr>
-      <w:r>
-        <w:rPr>
-          <w:rFonts w:ascii="Times New Roman" w:eastAsia="Times New Roman" w:hAnsi="Times New Roman" w:cs="Times New Roman"/>
-          <w:i/>
-          <w:iCs/>
-          <w:highlight w:val="yellow"/>
-        </w:rPr>
-        <w:t>Please comment on the GitHub log output, and refer to it as being</w:t>
-      </w:r>
-      <w:r>
-        <w:rPr>
-          <w:rFonts w:ascii="Times New Roman" w:eastAsia="Times New Roman" w:hAnsi="Times New Roman" w:cs="Times New Roman"/>
-          <w:i/>
-          <w:iCs/>
-          <w:highlight w:val="yellow"/>
-        </w:rPr>
-        <w:t xml:space="preserve"> </w:t>
-      </w:r>
-      <w:r>
-        <w:rPr>
-          <w:rFonts w:ascii="Times New Roman" w:eastAsia="Times New Roman" w:hAnsi="Times New Roman" w:cs="Times New Roman"/>
-          <w:i/>
-          <w:iCs/>
-          <w:highlight w:val="yellow"/>
-        </w:rPr>
-        <w:t>placed into</w:t>
-      </w:r>
-      <w:r>
-        <w:rPr>
-          <w:rFonts w:ascii="Times New Roman" w:eastAsia="Times New Roman" w:hAnsi="Times New Roman" w:cs="Times New Roman"/>
-          <w:b/>
-          <w:bCs/>
-        </w:rPr>
-        <w:t xml:space="preserve"> </w:t>
-      </w:r>
-      <w:r>
-        <w:rPr>
-          <w:rFonts w:ascii="Times New Roman" w:eastAsiaTheme="minorEastAsia" w:hAnsi="Times New Roman" w:cs="Times New Roman"/>
-          <w:i/>
-          <w:iCs/>
-          <w:highlight w:val="yellow"/>
-        </w:rPr>
-        <w:t>Appendix B.</w:t>
-      </w:r>
-      <w:r>
-        <w:rPr>
-          <w:rFonts w:ascii="Times New Roman" w:eastAsia="Times New Roman" w:hAnsi="Times New Roman" w:cs="Times New Roman"/>
-          <w:b/>
-          <w:bCs/>
-        </w:rPr>
         <w:t xml:space="preserve"> </w:t>
       </w:r>
     </w:p>
@@ -3256,7 +3270,6 @@
           <w:iCs/>
           <w:highlight w:val="yellow"/>
         </w:rPr>
-        <w:lastRenderedPageBreak/>
         <w:t>From your Git log, select three most significant commits during this project and include the following for each:</w:t>
       </w:r>
     </w:p>
@@ -3642,6 +3655,60 @@
     <w:p>
       <w:pPr>
         <w:pStyle w:val="ListParagraph"/>
+        <w:ind w:left="420"/>
+        <w:rPr>
+          <w:rFonts w:ascii="Times New Roman" w:eastAsia="Times New Roman" w:hAnsi="Times New Roman" w:cs="Times New Roman"/>
+        </w:rPr>
+      </w:pPr>
+    </w:p>
+    <w:p>
+      <w:pPr>
+        <w:pStyle w:val="ListParagraph"/>
+        <w:ind w:left="420"/>
+        <w:rPr>
+          <w:rFonts w:ascii="Times New Roman" w:eastAsia="Times New Roman" w:hAnsi="Times New Roman" w:cs="Times New Roman"/>
+        </w:rPr>
+      </w:pPr>
+    </w:p>
+    <w:p>
+      <w:pPr>
+        <w:pStyle w:val="ListParagraph"/>
+        <w:ind w:left="420"/>
+        <w:rPr>
+          <w:rFonts w:ascii="Times New Roman" w:eastAsia="Times New Roman" w:hAnsi="Times New Roman" w:cs="Times New Roman"/>
+        </w:rPr>
+      </w:pPr>
+    </w:p>
+    <w:p>
+      <w:pPr>
+        <w:pStyle w:val="ListParagraph"/>
+        <w:ind w:left="420"/>
+        <w:rPr>
+          <w:rFonts w:ascii="Times New Roman" w:eastAsia="Times New Roman" w:hAnsi="Times New Roman" w:cs="Times New Roman"/>
+        </w:rPr>
+      </w:pPr>
+    </w:p>
+    <w:p>
+      <w:pPr>
+        <w:pStyle w:val="ListParagraph"/>
+        <w:ind w:left="420"/>
+        <w:rPr>
+          <w:rFonts w:ascii="Times New Roman" w:eastAsia="Times New Roman" w:hAnsi="Times New Roman" w:cs="Times New Roman"/>
+        </w:rPr>
+      </w:pPr>
+    </w:p>
+    <w:p>
+      <w:pPr>
+        <w:pStyle w:val="ListParagraph"/>
+        <w:ind w:left="420"/>
+        <w:rPr>
+          <w:rFonts w:ascii="Times New Roman" w:eastAsia="Times New Roman" w:hAnsi="Times New Roman" w:cs="Times New Roman"/>
+        </w:rPr>
+      </w:pPr>
+    </w:p>
+    <w:p>
+      <w:pPr>
+        <w:pStyle w:val="ListParagraph"/>
         <w:numPr>
           <w:ilvl w:val="0"/>
           <w:numId w:val="35"/>
@@ -3652,69 +3719,19 @@
           <w:bCs/>
           <w:i/>
           <w:iCs/>
-        </w:rPr>
-      </w:pPr>
-      <w:r>
-        <w:rPr>
-          <w:rFonts w:ascii="Times New Roman" w:eastAsia="Times New Roman" w:hAnsi="Times New Roman" w:cs="Times New Roman"/>
-        </w:rPr>
-        <w:t>Reference list</w:t>
-      </w:r>
-      <w:r>
-        <w:rPr>
-          <w:rFonts w:ascii="Times New Roman" w:eastAsia="Times New Roman" w:hAnsi="Times New Roman" w:cs="Times New Roman"/>
-        </w:rPr>
-        <w:t xml:space="preserve"> </w:t>
-      </w:r>
+          <w:sz w:val="32"/>
+          <w:szCs w:val="32"/>
+        </w:rPr>
+      </w:pPr>
       <w:r>
         <w:rPr>
           <w:rFonts w:ascii="Times New Roman" w:eastAsia="Times New Roman" w:hAnsi="Times New Roman" w:cs="Times New Roman"/>
           <w:b/>
           <w:bCs/>
-          <w:i/>
-          <w:iCs/>
-        </w:rPr>
-        <w:t>(not included in</w:t>
-      </w:r>
-      <w:r>
-        <w:rPr>
-          <w:rFonts w:ascii="Times New Roman" w:eastAsia="Times New Roman" w:hAnsi="Times New Roman" w:cs="Times New Roman"/>
-          <w:b/>
-          <w:bCs/>
-          <w:i/>
-          <w:iCs/>
-        </w:rPr>
-        <w:t xml:space="preserve"> the</w:t>
-      </w:r>
-      <w:r>
-        <w:rPr>
-          <w:rFonts w:ascii="Times New Roman" w:eastAsia="Times New Roman" w:hAnsi="Times New Roman" w:cs="Times New Roman"/>
-          <w:b/>
-          <w:bCs/>
-          <w:i/>
-          <w:iCs/>
-        </w:rPr>
-        <w:t xml:space="preserve"> wor</w:t>
-      </w:r>
-      <w:r>
-        <w:rPr>
-          <w:rFonts w:ascii="Times New Roman" w:eastAsia="Times New Roman" w:hAnsi="Times New Roman" w:cs="Times New Roman"/>
-          <w:b/>
-          <w:bCs/>
-          <w:i/>
-          <w:iCs/>
-        </w:rPr>
-        <w:t>d</w:t>
-      </w:r>
-      <w:r>
-        <w:rPr>
-          <w:rFonts w:ascii="Times New Roman" w:eastAsia="Times New Roman" w:hAnsi="Times New Roman" w:cs="Times New Roman"/>
-          <w:b/>
-          <w:bCs/>
-          <w:i/>
-          <w:iCs/>
-        </w:rPr>
-        <w:t xml:space="preserve"> count)</w:t>
+          <w:sz w:val="32"/>
+          <w:szCs w:val="32"/>
+        </w:rPr>
+        <w:t>Reference list</w:t>
       </w:r>
     </w:p>
     <w:p>
@@ -3724,11 +3741,179 @@
           <w:rFonts w:ascii="Times New Roman" w:eastAsia="Times New Roman" w:hAnsi="Times New Roman" w:cs="Times New Roman"/>
         </w:rPr>
       </w:pPr>
-      <w:r>
-        <w:rPr>
-          <w:rFonts w:ascii="Times New Roman" w:eastAsia="Times New Roman" w:hAnsi="Times New Roman" w:cs="Times New Roman"/>
-        </w:rPr>
-        <w:t>Harvard (author, date) format.</w:t>
+    </w:p>
+    <w:p>
+      <w:pPr>
+        <w:pStyle w:val="ListParagraph"/>
+        <w:numPr>
+          <w:ilvl w:val="0"/>
+          <w:numId w:val="38"/>
+        </w:numPr>
+        <w:jc w:val="both"/>
+        <w:rPr>
+          <w:rFonts w:ascii="Times New Roman" w:hAnsi="Times New Roman" w:cs="Times New Roman"/>
+        </w:rPr>
+      </w:pPr>
+      <w:r>
+        <w:rPr>
+          <w:rFonts w:ascii="Times New Roman" w:hAnsi="Times New Roman" w:cs="Times New Roman"/>
+        </w:rPr>
+        <w:t xml:space="preserve">GBD 2016 Alcohol Collaborators (2018) 'Alcohol use and burden for 195 countries and territories, 1990–2016: a systematic analysis for the Global Burden of Disease Study 2016', </w:t>
+      </w:r>
+      <w:r>
+        <w:rPr>
+          <w:rFonts w:ascii="Times New Roman" w:hAnsi="Times New Roman" w:cs="Times New Roman"/>
+          <w:i/>
+          <w:iCs/>
+        </w:rPr>
+        <w:t>The Lancet</w:t>
+      </w:r>
+      <w:r>
+        <w:rPr>
+          <w:rFonts w:ascii="Times New Roman" w:hAnsi="Times New Roman" w:cs="Times New Roman"/>
+        </w:rPr>
+        <w:t xml:space="preserve">, 392(10152), pp. 1015-1035. </w:t>
+      </w:r>
+      <w:proofErr w:type="spellStart"/>
+      <w:r>
+        <w:rPr>
+          <w:rFonts w:ascii="Times New Roman" w:hAnsi="Times New Roman" w:cs="Times New Roman"/>
+        </w:rPr>
+        <w:t>doi</w:t>
+      </w:r>
+      <w:proofErr w:type="spellEnd"/>
+      <w:r>
+        <w:rPr>
+          <w:rFonts w:ascii="Times New Roman" w:hAnsi="Times New Roman" w:cs="Times New Roman"/>
+        </w:rPr>
+        <w:t>: 10.1016/S0140-6736(18)31310-2.</w:t>
+      </w:r>
+    </w:p>
+    <w:p>
+      <w:pPr>
+        <w:pStyle w:val="ListParagraph"/>
+        <w:numPr>
+          <w:ilvl w:val="0"/>
+          <w:numId w:val="38"/>
+        </w:numPr>
+        <w:jc w:val="both"/>
+        <w:rPr>
+          <w:rFonts w:ascii="Times New Roman" w:hAnsi="Times New Roman" w:cs="Times New Roman"/>
+        </w:rPr>
+      </w:pPr>
+      <w:r>
+        <w:rPr>
+          <w:rFonts w:ascii="Times New Roman" w:hAnsi="Times New Roman" w:cs="Times New Roman"/>
+        </w:rPr>
+        <w:t xml:space="preserve">Manthey, J. et al. (2024) 'National, regional, and global statistics on alcohol consumption and associated burden of disease 2000–20: a modelling study and comparative risk assessment', </w:t>
+      </w:r>
+      <w:r>
+        <w:rPr>
+          <w:rFonts w:ascii="Times New Roman" w:hAnsi="Times New Roman" w:cs="Times New Roman"/>
+          <w:i/>
+          <w:iCs/>
+        </w:rPr>
+        <w:t>The Lancet Public Health</w:t>
+      </w:r>
+      <w:r>
+        <w:rPr>
+          <w:rFonts w:ascii="Times New Roman" w:hAnsi="Times New Roman" w:cs="Times New Roman"/>
+        </w:rPr>
+        <w:t xml:space="preserve">, 9(11), e825-e843. </w:t>
+      </w:r>
+      <w:proofErr w:type="spellStart"/>
+      <w:r>
+        <w:rPr>
+          <w:rFonts w:ascii="Times New Roman" w:hAnsi="Times New Roman" w:cs="Times New Roman"/>
+        </w:rPr>
+        <w:t>doi</w:t>
+      </w:r>
+      <w:proofErr w:type="spellEnd"/>
+      <w:r>
+        <w:rPr>
+          <w:rFonts w:ascii="Times New Roman" w:hAnsi="Times New Roman" w:cs="Times New Roman"/>
+        </w:rPr>
+        <w:t>: 10.1016/S2468-2667(24)00199-9.</w:t>
+      </w:r>
+    </w:p>
+    <w:p>
+      <w:pPr>
+        <w:pStyle w:val="ListParagraph"/>
+        <w:numPr>
+          <w:ilvl w:val="0"/>
+          <w:numId w:val="38"/>
+        </w:numPr>
+        <w:jc w:val="both"/>
+        <w:rPr>
+          <w:rFonts w:ascii="Times New Roman" w:hAnsi="Times New Roman" w:cs="Times New Roman"/>
+        </w:rPr>
+      </w:pPr>
+      <w:r>
+        <w:rPr>
+          <w:rFonts w:ascii="Times New Roman" w:hAnsi="Times New Roman" w:cs="Times New Roman"/>
+        </w:rPr>
+        <w:t xml:space="preserve">Rehm, J. et al. (2009) 'Global burden of disease and injury and economic cost attributable to alcohol use and alcohol-use disorders', </w:t>
+      </w:r>
+      <w:r>
+        <w:rPr>
+          <w:rFonts w:ascii="Times New Roman" w:hAnsi="Times New Roman" w:cs="Times New Roman"/>
+          <w:i/>
+          <w:iCs/>
+        </w:rPr>
+        <w:t>The Lancet</w:t>
+      </w:r>
+      <w:r>
+        <w:rPr>
+          <w:rFonts w:ascii="Times New Roman" w:hAnsi="Times New Roman" w:cs="Times New Roman"/>
+        </w:rPr>
+        <w:t xml:space="preserve">, 373(9682), pp. 2223-2233. </w:t>
+      </w:r>
+      <w:proofErr w:type="spellStart"/>
+      <w:r>
+        <w:rPr>
+          <w:rFonts w:ascii="Times New Roman" w:hAnsi="Times New Roman" w:cs="Times New Roman"/>
+        </w:rPr>
+        <w:t>doi</w:t>
+      </w:r>
+      <w:proofErr w:type="spellEnd"/>
+      <w:r>
+        <w:rPr>
+          <w:rFonts w:ascii="Times New Roman" w:hAnsi="Times New Roman" w:cs="Times New Roman"/>
+        </w:rPr>
+        <w:t>: 10.1016/S0140-6736(09)60746-7.</w:t>
+      </w:r>
+    </w:p>
+    <w:p>
+      <w:pPr>
+        <w:pStyle w:val="ListParagraph"/>
+        <w:numPr>
+          <w:ilvl w:val="0"/>
+          <w:numId w:val="38"/>
+        </w:numPr>
+        <w:jc w:val="both"/>
+        <w:rPr>
+          <w:rFonts w:ascii="Times New Roman" w:hAnsi="Times New Roman" w:cs="Times New Roman"/>
+        </w:rPr>
+      </w:pPr>
+      <w:r>
+        <w:rPr>
+          <w:rFonts w:ascii="Times New Roman" w:hAnsi="Times New Roman" w:cs="Times New Roman"/>
+        </w:rPr>
+        <w:t xml:space="preserve">World Health Organization (2024) </w:t>
+      </w:r>
+      <w:r>
+        <w:rPr>
+          <w:rFonts w:ascii="Times New Roman" w:hAnsi="Times New Roman" w:cs="Times New Roman"/>
+          <w:i/>
+          <w:iCs/>
+        </w:rPr>
+        <w:t>Global Health Estimates 2021: Deaths by Cause, Age, Sex, by Country and by Region, 2000-2021</w:t>
+      </w:r>
+      <w:r>
+        <w:rPr>
+          <w:rFonts w:ascii="Times New Roman" w:hAnsi="Times New Roman" w:cs="Times New Roman"/>
+        </w:rPr>
+        <w:t>. Geneva: World Health Organization. Available at: https://www.who.int/data/gho/data/themes/mortality-and-global-health-estimates (Accessed: 6 December 2025).</w:t>
       </w:r>
     </w:p>
     <w:p>
@@ -3991,7 +4176,7 @@
       </w:pPr>
     </w:p>
     <w:sectPr>
-      <w:footerReference w:type="first" r:id="rId11"/>
+      <w:footerReference w:type="first" r:id="rId10"/>
       <w:pgSz w:w="11906" w:h="16838"/>
       <w:pgMar w:top="1440" w:right="1440" w:bottom="1440" w:left="1440" w:header="708" w:footer="708" w:gutter="0"/>
       <w:pgNumType w:start="1"/>
@@ -4587,17 +4772,17 @@
   <w:abstractNum w:abstractNumId="4" w15:restartNumberingAfterBreak="0">
     <w:nsid w:val="064B1E91"/>
     <w:multiLevelType w:val="multilevel"/>
-    <w:tmpl w:val="97C62892"/>
+    <w:tmpl w:val="340C31BA"/>
     <w:lvl w:ilvl="0">
       <w:start w:val="1"/>
       <w:numFmt w:val="decimal"/>
-      <w:lvlText w:val="%1"/>
+      <w:lvlText w:val="%1."/>
       <w:lvlJc w:val="left"/>
       <w:pPr>
         <w:ind w:left="420" w:hanging="420"/>
       </w:pPr>
       <w:rPr>
-        <w:rFonts w:hint="default"/>
+        <w:rFonts w:ascii="Times New Roman" w:eastAsiaTheme="minorHAnsi" w:hAnsi="Times New Roman" w:cs="Times New Roman"/>
       </w:rPr>
     </w:lvl>
     <w:lvl w:ilvl="1">
@@ -7361,6 +7546,95 @@
     </w:lvl>
   </w:abstractNum>
   <w:abstractNum w:abstractNumId="30" w15:restartNumberingAfterBreak="0">
+    <w:nsid w:val="6092794D"/>
+    <w:multiLevelType w:val="hybridMultilevel"/>
+    <w:tmpl w:val="736C64F0"/>
+    <w:lvl w:ilvl="0" w:tplc="4009000F">
+      <w:start w:val="2"/>
+      <w:numFmt w:val="decimal"/>
+      <w:lvlText w:val="%1."/>
+      <w:lvlJc w:val="left"/>
+      <w:pPr>
+        <w:ind w:left="720" w:hanging="360"/>
+      </w:pPr>
+      <w:rPr>
+        <w:rFonts w:hint="default"/>
+      </w:rPr>
+    </w:lvl>
+    <w:lvl w:ilvl="1" w:tplc="40090019" w:tentative="1">
+      <w:start w:val="1"/>
+      <w:numFmt w:val="lowerLetter"/>
+      <w:lvlText w:val="%2."/>
+      <w:lvlJc w:val="left"/>
+      <w:pPr>
+        <w:ind w:left="1440" w:hanging="360"/>
+      </w:pPr>
+    </w:lvl>
+    <w:lvl w:ilvl="2" w:tplc="4009001B" w:tentative="1">
+      <w:start w:val="1"/>
+      <w:numFmt w:val="lowerRoman"/>
+      <w:lvlText w:val="%3."/>
+      <w:lvlJc w:val="right"/>
+      <w:pPr>
+        <w:ind w:left="2160" w:hanging="180"/>
+      </w:pPr>
+    </w:lvl>
+    <w:lvl w:ilvl="3" w:tplc="4009000F" w:tentative="1">
+      <w:start w:val="1"/>
+      <w:numFmt w:val="decimal"/>
+      <w:lvlText w:val="%4."/>
+      <w:lvlJc w:val="left"/>
+      <w:pPr>
+        <w:ind w:left="2880" w:hanging="360"/>
+      </w:pPr>
+    </w:lvl>
+    <w:lvl w:ilvl="4" w:tplc="40090019" w:tentative="1">
+      <w:start w:val="1"/>
+      <w:numFmt w:val="lowerLetter"/>
+      <w:lvlText w:val="%5."/>
+      <w:lvlJc w:val="left"/>
+      <w:pPr>
+        <w:ind w:left="3600" w:hanging="360"/>
+      </w:pPr>
+    </w:lvl>
+    <w:lvl w:ilvl="5" w:tplc="4009001B" w:tentative="1">
+      <w:start w:val="1"/>
+      <w:numFmt w:val="lowerRoman"/>
+      <w:lvlText w:val="%6."/>
+      <w:lvlJc w:val="right"/>
+      <w:pPr>
+        <w:ind w:left="4320" w:hanging="180"/>
+      </w:pPr>
+    </w:lvl>
+    <w:lvl w:ilvl="6" w:tplc="4009000F" w:tentative="1">
+      <w:start w:val="1"/>
+      <w:numFmt w:val="decimal"/>
+      <w:lvlText w:val="%7."/>
+      <w:lvlJc w:val="left"/>
+      <w:pPr>
+        <w:ind w:left="5040" w:hanging="360"/>
+      </w:pPr>
+    </w:lvl>
+    <w:lvl w:ilvl="7" w:tplc="40090019" w:tentative="1">
+      <w:start w:val="1"/>
+      <w:numFmt w:val="lowerLetter"/>
+      <w:lvlText w:val="%8."/>
+      <w:lvlJc w:val="left"/>
+      <w:pPr>
+        <w:ind w:left="5760" w:hanging="360"/>
+      </w:pPr>
+    </w:lvl>
+    <w:lvl w:ilvl="8" w:tplc="4009001B" w:tentative="1">
+      <w:start w:val="1"/>
+      <w:numFmt w:val="lowerRoman"/>
+      <w:lvlText w:val="%9."/>
+      <w:lvlJc w:val="right"/>
+      <w:pPr>
+        <w:ind w:left="6480" w:hanging="180"/>
+      </w:pPr>
+    </w:lvl>
+  </w:abstractNum>
+  <w:abstractNum w:abstractNumId="31" w15:restartNumberingAfterBreak="0">
     <w:nsid w:val="64424843"/>
     <w:multiLevelType w:val="hybridMultilevel"/>
     <w:tmpl w:val="FFFFFFFF"/>
@@ -7446,7 +7720,7 @@
       </w:pPr>
     </w:lvl>
   </w:abstractNum>
-  <w:abstractNum w:abstractNumId="31" w15:restartNumberingAfterBreak="0">
+  <w:abstractNum w:abstractNumId="32" w15:restartNumberingAfterBreak="0">
     <w:nsid w:val="64803963"/>
     <w:multiLevelType w:val="multilevel"/>
     <w:tmpl w:val="FFFFFFFF"/>
@@ -7532,7 +7806,7 @@
       </w:pPr>
     </w:lvl>
   </w:abstractNum>
-  <w:abstractNum w:abstractNumId="32" w15:restartNumberingAfterBreak="0">
+  <w:abstractNum w:abstractNumId="33" w15:restartNumberingAfterBreak="0">
     <w:nsid w:val="662D2694"/>
     <w:multiLevelType w:val="hybridMultilevel"/>
     <w:tmpl w:val="FFFFFFFF"/>
@@ -7618,7 +7892,7 @@
       </w:pPr>
     </w:lvl>
   </w:abstractNum>
-  <w:abstractNum w:abstractNumId="33" w15:restartNumberingAfterBreak="0">
+  <w:abstractNum w:abstractNumId="34" w15:restartNumberingAfterBreak="0">
     <w:nsid w:val="6989EEEE"/>
     <w:multiLevelType w:val="multilevel"/>
     <w:tmpl w:val="FFFFFFFF"/>
@@ -7704,7 +7978,7 @@
       </w:pPr>
     </w:lvl>
   </w:abstractNum>
-  <w:abstractNum w:abstractNumId="34" w15:restartNumberingAfterBreak="0">
+  <w:abstractNum w:abstractNumId="35" w15:restartNumberingAfterBreak="0">
     <w:nsid w:val="69FD6100"/>
     <w:multiLevelType w:val="hybridMultilevel"/>
     <w:tmpl w:val="19FAEE92"/>
@@ -7790,7 +8064,120 @@
       </w:pPr>
     </w:lvl>
   </w:abstractNum>
-  <w:abstractNum w:abstractNumId="35" w15:restartNumberingAfterBreak="0">
+  <w:abstractNum w:abstractNumId="36" w15:restartNumberingAfterBreak="0">
+    <w:nsid w:val="6F3356D3"/>
+    <w:multiLevelType w:val="hybridMultilevel"/>
+    <w:tmpl w:val="6E20625E"/>
+    <w:lvl w:ilvl="0" w:tplc="40090001">
+      <w:start w:val="1"/>
+      <w:numFmt w:val="bullet"/>
+      <w:lvlText w:val=""/>
+      <w:lvlJc w:val="left"/>
+      <w:pPr>
+        <w:ind w:left="720" w:hanging="360"/>
+      </w:pPr>
+      <w:rPr>
+        <w:rFonts w:ascii="Symbol" w:hAnsi="Symbol" w:hint="default"/>
+      </w:rPr>
+    </w:lvl>
+    <w:lvl w:ilvl="1" w:tplc="40090003" w:tentative="1">
+      <w:start w:val="1"/>
+      <w:numFmt w:val="bullet"/>
+      <w:lvlText w:val="o"/>
+      <w:lvlJc w:val="left"/>
+      <w:pPr>
+        <w:ind w:left="1440" w:hanging="360"/>
+      </w:pPr>
+      <w:rPr>
+        <w:rFonts w:ascii="Courier New" w:hAnsi="Courier New" w:cs="Courier New" w:hint="default"/>
+      </w:rPr>
+    </w:lvl>
+    <w:lvl w:ilvl="2" w:tplc="40090005" w:tentative="1">
+      <w:start w:val="1"/>
+      <w:numFmt w:val="bullet"/>
+      <w:lvlText w:val=""/>
+      <w:lvlJc w:val="left"/>
+      <w:pPr>
+        <w:ind w:left="2160" w:hanging="360"/>
+      </w:pPr>
+      <w:rPr>
+        <w:rFonts w:ascii="Wingdings" w:hAnsi="Wingdings" w:hint="default"/>
+      </w:rPr>
+    </w:lvl>
+    <w:lvl w:ilvl="3" w:tplc="40090001" w:tentative="1">
+      <w:start w:val="1"/>
+      <w:numFmt w:val="bullet"/>
+      <w:lvlText w:val=""/>
+      <w:lvlJc w:val="left"/>
+      <w:pPr>
+        <w:ind w:left="2880" w:hanging="360"/>
+      </w:pPr>
+      <w:rPr>
+        <w:rFonts w:ascii="Symbol" w:hAnsi="Symbol" w:hint="default"/>
+      </w:rPr>
+    </w:lvl>
+    <w:lvl w:ilvl="4" w:tplc="40090003" w:tentative="1">
+      <w:start w:val="1"/>
+      <w:numFmt w:val="bullet"/>
+      <w:lvlText w:val="o"/>
+      <w:lvlJc w:val="left"/>
+      <w:pPr>
+        <w:ind w:left="3600" w:hanging="360"/>
+      </w:pPr>
+      <w:rPr>
+        <w:rFonts w:ascii="Courier New" w:hAnsi="Courier New" w:cs="Courier New" w:hint="default"/>
+      </w:rPr>
+    </w:lvl>
+    <w:lvl w:ilvl="5" w:tplc="40090005" w:tentative="1">
+      <w:start w:val="1"/>
+      <w:numFmt w:val="bullet"/>
+      <w:lvlText w:val=""/>
+      <w:lvlJc w:val="left"/>
+      <w:pPr>
+        <w:ind w:left="4320" w:hanging="360"/>
+      </w:pPr>
+      <w:rPr>
+        <w:rFonts w:ascii="Wingdings" w:hAnsi="Wingdings" w:hint="default"/>
+      </w:rPr>
+    </w:lvl>
+    <w:lvl w:ilvl="6" w:tplc="40090001" w:tentative="1">
+      <w:start w:val="1"/>
+      <w:numFmt w:val="bullet"/>
+      <w:lvlText w:val=""/>
+      <w:lvlJc w:val="left"/>
+      <w:pPr>
+        <w:ind w:left="5040" w:hanging="360"/>
+      </w:pPr>
+      <w:rPr>
+        <w:rFonts w:ascii="Symbol" w:hAnsi="Symbol" w:hint="default"/>
+      </w:rPr>
+    </w:lvl>
+    <w:lvl w:ilvl="7" w:tplc="40090003" w:tentative="1">
+      <w:start w:val="1"/>
+      <w:numFmt w:val="bullet"/>
+      <w:lvlText w:val="o"/>
+      <w:lvlJc w:val="left"/>
+      <w:pPr>
+        <w:ind w:left="5760" w:hanging="360"/>
+      </w:pPr>
+      <w:rPr>
+        <w:rFonts w:ascii="Courier New" w:hAnsi="Courier New" w:cs="Courier New" w:hint="default"/>
+      </w:rPr>
+    </w:lvl>
+    <w:lvl w:ilvl="8" w:tplc="40090005" w:tentative="1">
+      <w:start w:val="1"/>
+      <w:numFmt w:val="bullet"/>
+      <w:lvlText w:val=""/>
+      <w:lvlJc w:val="left"/>
+      <w:pPr>
+        <w:ind w:left="6480" w:hanging="360"/>
+      </w:pPr>
+      <w:rPr>
+        <w:rFonts w:ascii="Wingdings" w:hAnsi="Wingdings" w:hint="default"/>
+      </w:rPr>
+    </w:lvl>
+  </w:abstractNum>
+  <w:abstractNum w:abstractNumId="37" w15:restartNumberingAfterBreak="0">
     <w:nsid w:val="717456F8"/>
     <w:multiLevelType w:val="hybridMultilevel"/>
     <w:tmpl w:val="FFFFFFFF"/>
@@ -7913,7 +8300,7 @@
     <w:abstractNumId w:val="9"/>
   </w:num>
   <w:num w:numId="4" w16cid:durableId="2006858979">
-    <w:abstractNumId w:val="30"/>
+    <w:abstractNumId w:val="31"/>
   </w:num>
   <w:num w:numId="5" w16cid:durableId="1839346339">
     <w:abstractNumId w:val="20"/>
@@ -7922,7 +8309,7 @@
     <w:abstractNumId w:val="11"/>
   </w:num>
   <w:num w:numId="7" w16cid:durableId="565338146">
-    <w:abstractNumId w:val="32"/>
+    <w:abstractNumId w:val="33"/>
   </w:num>
   <w:num w:numId="8" w16cid:durableId="522136554">
     <w:abstractNumId w:val="21"/>
@@ -7988,28 +8375,34 @@
     <w:abstractNumId w:val="28"/>
   </w:num>
   <w:num w:numId="29" w16cid:durableId="266351746">
-    <w:abstractNumId w:val="35"/>
+    <w:abstractNumId w:val="37"/>
   </w:num>
   <w:num w:numId="30" w16cid:durableId="1027947511">
-    <w:abstractNumId w:val="31"/>
+    <w:abstractNumId w:val="32"/>
   </w:num>
   <w:num w:numId="31" w16cid:durableId="1358778646">
     <w:abstractNumId w:val="23"/>
   </w:num>
   <w:num w:numId="32" w16cid:durableId="186406669">
-    <w:abstractNumId w:val="33"/>
+    <w:abstractNumId w:val="34"/>
   </w:num>
   <w:num w:numId="33" w16cid:durableId="364215154">
     <w:abstractNumId w:val="3"/>
   </w:num>
   <w:num w:numId="34" w16cid:durableId="1603416196">
-    <w:abstractNumId w:val="34"/>
+    <w:abstractNumId w:val="35"/>
   </w:num>
   <w:num w:numId="35" w16cid:durableId="1979143889">
     <w:abstractNumId w:val="4"/>
   </w:num>
   <w:num w:numId="36" w16cid:durableId="1377850721">
     <w:abstractNumId w:val="16"/>
+  </w:num>
+  <w:num w:numId="37" w16cid:durableId="1166286677">
+    <w:abstractNumId w:val="30"/>
+  </w:num>
+  <w:num w:numId="38" w16cid:durableId="1158306841">
+    <w:abstractNumId w:val="36"/>
   </w:num>
 </w:numbering>
 </file>

</xml_diff>

<commit_message>
Updated Visualization Charts and Documentation - Added Appendices with R code
</commit_message>
<xml_diff>
--- a/7COM1079_Final report_template.docx
+++ b/7COM1079_Final report_template.docx
@@ -1841,25 +1841,7 @@
           <w:lang w:val="en-IN" w:eastAsia="ko-KR"/>
           <w14:ligatures w14:val="none"/>
         </w:rPr>
-        <w:t>A thorough worldwide analysis of alcohol consumption trends and the associated illness burden from 2000 to 2020 was carried out by Manthey et al. (2024). According to their estimate, alcohol use was responsible for 2.6 million deaths and 116 million disability-adjusted life years lost in 2019, with an average global adult per capita intake of 5.5 litres. Their research highlighted the intricate relationships between alcohol consumption and population health, emphasising significant geographical differences in consumption and health effects. According to Rehm et al. (2009), alcohol is responsible for roughly 3.8% of all deaths globally. Their research developed methodological frameworks that included both direct impacts and alcohol-related injuries when attributing health outcomes to alcohol.</w:t>
-      </w:r>
-      <w:r>
-        <w:rPr>
-          <w:rFonts w:ascii="Times New Roman" w:eastAsia="Times New Roman" w:hAnsi="Times New Roman" w:cs="Times New Roman"/>
-          <w:kern w:val="0"/>
-          <w:lang w:val="en-IN" w:eastAsia="ko-KR"/>
-          <w14:ligatures w14:val="none"/>
-        </w:rPr>
-        <w:t xml:space="preserve"> </w:t>
-      </w:r>
-      <w:r>
-        <w:rPr>
-          <w:rFonts w:ascii="Times New Roman" w:eastAsia="Times New Roman" w:hAnsi="Times New Roman" w:cs="Times New Roman"/>
-          <w:kern w:val="0"/>
-          <w:lang w:val="en-IN" w:eastAsia="ko-KR"/>
-          <w14:ligatures w14:val="none"/>
-        </w:rPr>
-        <w:t>While high episodic drinking consistently demonstrated detrimental effects, they observed contradictory results for moderate usage in certain populations. When taking into account all disease categories, the GBD 2016 Alcohol Collaborators (2018) evaluated alcohol use and its effects in 195 countries and came to the conclusion that no level of consumption improves health. Based on 23 causally related health outcomes, they discovered that the ideal amount for reducing health risks is zero grammes per day, defying previous recommendations of benefits from moderate drinking.</w:t>
+        <w:t>A thorough worldwide analysis of alcohol consumption trends and the associated illness burden from 2000 to 2020 was carried out by Manthey et al. (2024). According to their estimate, alcohol use was responsible for 2.6 million deaths and 116 million disability-adjusted life years lost in 2019, with an average global adult per capita intake of 5.5 litres. Their research highlighted the intricate relationships between alcohol consumption and population health, emphasising significant geographical differences in consumption and health effects. According to Rehm et al. (2009), alcohol is responsible for roughly 3.8% of all deaths globally. Their research developed methodological frameworks that included both direct impacts and alcohol-related injuries when attributing health outcomes to alcohol. While high episodic drinking consistently demonstrated detrimental effects, they observed contradictory results for moderate usage in certain populations. When taking into account all disease categories, the GBD 2016 Alcohol Collaborators (2018) evaluated alcohol use and its effects in 195 countries and came to the conclusion that no level of consumption improves health. Based on 23 causally related health outcomes, they discovered that the ideal amount for reducing health risks is zero grammes per day, defying previous recommendations of benefits from moderate drinking.</w:t>
       </w:r>
     </w:p>
     <w:p>
@@ -3907,7 +3889,25 @@
           <w:i/>
           <w:iCs/>
         </w:rPr>
-        <w:t>Global Health Estimates 2021: Deaths by Cause, Age, Sex, by Country and by Region, 2000-2021</w:t>
+        <w:t xml:space="preserve">Global Health Estimates 2021: Deaths by Cause, Age, Sex, by Country and by </w:t>
+      </w:r>
+      <w:proofErr w:type="gramStart"/>
+      <w:r>
+        <w:rPr>
+          <w:rFonts w:ascii="Times New Roman" w:hAnsi="Times New Roman" w:cs="Times New Roman"/>
+          <w:i/>
+          <w:iCs/>
+        </w:rPr>
+        <w:t>Region</w:t>
+      </w:r>
+      <w:proofErr w:type="gramEnd"/>
+      <w:r>
+        <w:rPr>
+          <w:rFonts w:ascii="Times New Roman" w:hAnsi="Times New Roman" w:cs="Times New Roman"/>
+          <w:i/>
+          <w:iCs/>
+        </w:rPr>
+        <w:t>, 2000-2021</w:t>
       </w:r>
       <w:r>
         <w:rPr>
@@ -3933,14 +3933,28 @@
         </w:numPr>
         <w:rPr>
           <w:rFonts w:ascii="Times New Roman" w:eastAsia="Times New Roman" w:hAnsi="Times New Roman" w:cs="Times New Roman"/>
+          <w:b/>
+          <w:bCs/>
           <w:color w:val="333333"/>
         </w:rPr>
       </w:pPr>
       <w:r>
         <w:rPr>
           <w:rFonts w:ascii="Times New Roman" w:eastAsia="Times New Roman" w:hAnsi="Times New Roman" w:cs="Times New Roman"/>
-        </w:rPr>
-        <w:t xml:space="preserve">Appendices </w:t>
+          <w:b/>
+          <w:bCs/>
+          <w:sz w:val="32"/>
+          <w:szCs w:val="32"/>
+        </w:rPr>
+        <w:t>Appendices</w:t>
+      </w:r>
+      <w:r>
+        <w:rPr>
+          <w:rFonts w:ascii="Times New Roman" w:eastAsia="Times New Roman" w:hAnsi="Times New Roman" w:cs="Times New Roman"/>
+          <w:b/>
+          <w:bCs/>
+        </w:rPr>
+        <w:t xml:space="preserve"> </w:t>
       </w:r>
     </w:p>
     <w:p>
@@ -3950,6 +3964,7 @@
           <w:ilvl w:val="0"/>
           <w:numId w:val="4"/>
         </w:numPr>
+        <w:ind w:left="426"/>
         <w:rPr>
           <w:rFonts w:ascii="Times New Roman" w:eastAsia="Times New Roman" w:hAnsi="Times New Roman" w:cs="Times New Roman"/>
           <w:b/>
@@ -3961,182 +3976,4600 @@
       <w:r>
         <w:rPr>
           <w:rFonts w:ascii="Times New Roman" w:eastAsia="Times New Roman" w:hAnsi="Times New Roman" w:cs="Times New Roman"/>
-          <w:color w:val="333333"/>
-        </w:rPr>
-        <w:t>R code used for analysis and visualisation</w:t>
-      </w:r>
-      <w:r>
-        <w:rPr>
-          <w:rFonts w:ascii="Times New Roman" w:eastAsia="Times New Roman" w:hAnsi="Times New Roman" w:cs="Times New Roman"/>
-          <w:color w:val="333333"/>
-        </w:rPr>
-        <w:t xml:space="preserve"> </w:t>
-      </w:r>
-      <w:r>
-        <w:rPr>
-          <w:rFonts w:ascii="Times New Roman" w:eastAsia="Times New Roman" w:hAnsi="Times New Roman" w:cs="Times New Roman"/>
           <w:b/>
           <w:bCs/>
-          <w:i/>
-          <w:iCs/>
-        </w:rPr>
-        <w:t>(not included in</w:t>
+          <w:color w:val="333333"/>
+        </w:rPr>
+        <w:t xml:space="preserve">R code used </w:t>
       </w:r>
       <w:r>
         <w:rPr>
           <w:rFonts w:ascii="Times New Roman" w:eastAsia="Times New Roman" w:hAnsi="Times New Roman" w:cs="Times New Roman"/>
           <w:b/>
           <w:bCs/>
-          <w:i/>
-          <w:iCs/>
-        </w:rPr>
-        <w:t xml:space="preserve"> the</w:t>
+          <w:color w:val="333333"/>
+          <w:sz w:val="28"/>
+          <w:szCs w:val="28"/>
+        </w:rPr>
+        <w:t>for</w:t>
       </w:r>
       <w:r>
         <w:rPr>
           <w:rFonts w:ascii="Times New Roman" w:eastAsia="Times New Roman" w:hAnsi="Times New Roman" w:cs="Times New Roman"/>
           <w:b/>
           <w:bCs/>
-          <w:i/>
-          <w:iCs/>
-        </w:rPr>
-        <w:t xml:space="preserve"> wor</w:t>
+          <w:color w:val="333333"/>
+        </w:rPr>
+        <w:t xml:space="preserve"> analysis and</w:t>
+      </w:r>
+      <w:r>
+        <w:rPr>
+          <w:rFonts w:ascii="Times New Roman" w:eastAsia="Times New Roman" w:hAnsi="Times New Roman" w:cs="Times New Roman"/>
+          <w:color w:val="333333"/>
+        </w:rPr>
+        <w:t xml:space="preserve"> </w:t>
       </w:r>
       <w:r>
         <w:rPr>
           <w:rFonts w:ascii="Times New Roman" w:eastAsia="Times New Roman" w:hAnsi="Times New Roman" w:cs="Times New Roman"/>
           <w:b/>
           <w:bCs/>
-          <w:i/>
-          <w:iCs/>
-        </w:rPr>
-        <w:t>d</w:t>
-      </w:r>
-      <w:r>
+          <w:color w:val="333333"/>
+        </w:rPr>
+        <w:t>visualisation</w:t>
+      </w:r>
+      <w:r>
+        <w:rPr>
+          <w:rFonts w:ascii="Times New Roman" w:eastAsia="Times New Roman" w:hAnsi="Times New Roman" w:cs="Times New Roman"/>
+          <w:color w:val="333333"/>
+        </w:rPr>
+        <w:t xml:space="preserve"> </w:t>
+      </w:r>
+    </w:p>
+    <w:tbl>
+      <w:tblPr>
+        <w:tblStyle w:val="TableGrid"/>
+        <w:tblW w:w="0" w:type="auto"/>
+        <w:tblLook w:val="04A0" w:firstRow="1" w:lastRow="0" w:firstColumn="1" w:lastColumn="0" w:noHBand="0" w:noVBand="1"/>
+      </w:tblPr>
+      <w:tblGrid>
+        <w:gridCol w:w="9016"/>
+      </w:tblGrid>
+      <w:tr>
+        <w:tc>
+          <w:tcPr>
+            <w:tcW w:w="9016" w:type="dxa"/>
+          </w:tcPr>
+          <w:p>
+            <w:pPr>
+              <w:ind w:left="34"/>
+              <w:rPr>
+                <w:rFonts w:ascii="Times New Roman" w:eastAsia="Times New Roman" w:hAnsi="Times New Roman" w:cs="Times New Roman"/>
+              </w:rPr>
+            </w:pPr>
+            <w:r>
+              <w:rPr>
+                <w:rFonts w:ascii="Times New Roman" w:eastAsia="Times New Roman" w:hAnsi="Times New Roman" w:cs="Times New Roman"/>
+              </w:rPr>
+              <w:t># ============================================================================</w:t>
+            </w:r>
+          </w:p>
+          <w:p>
+            <w:pPr>
+              <w:ind w:left="34"/>
+              <w:rPr>
+                <w:rFonts w:ascii="Times New Roman" w:eastAsia="Times New Roman" w:hAnsi="Times New Roman" w:cs="Times New Roman"/>
+                <w:b/>
+                <w:bCs/>
+              </w:rPr>
+            </w:pPr>
+            <w:r>
+              <w:rPr>
+                <w:rFonts w:ascii="Times New Roman" w:eastAsia="Times New Roman" w:hAnsi="Times New Roman" w:cs="Times New Roman"/>
+                <w:b/>
+                <w:bCs/>
+              </w:rPr>
+              <w:t># ALCOHOL CONSUMPTION VS LIFE EXPECTANCY ANALYSIS</w:t>
+            </w:r>
+          </w:p>
+          <w:p>
+            <w:pPr>
+              <w:ind w:left="34"/>
+              <w:rPr>
+                <w:rFonts w:ascii="Times New Roman" w:eastAsia="Times New Roman" w:hAnsi="Times New Roman" w:cs="Times New Roman"/>
+                <w:b/>
+                <w:bCs/>
+              </w:rPr>
+            </w:pPr>
+            <w:r>
+              <w:rPr>
+                <w:rFonts w:ascii="Times New Roman" w:eastAsia="Times New Roman" w:hAnsi="Times New Roman" w:cs="Times New Roman"/>
+                <w:b/>
+                <w:bCs/>
+              </w:rPr>
+              <w:t># 7COM1079 - Team Research and Development Project</w:t>
+            </w:r>
+          </w:p>
+          <w:p>
+            <w:pPr>
+              <w:ind w:left="34"/>
+              <w:rPr>
+                <w:rFonts w:ascii="Times New Roman" w:eastAsia="Times New Roman" w:hAnsi="Times New Roman" w:cs="Times New Roman"/>
+              </w:rPr>
+            </w:pPr>
+            <w:r>
+              <w:rPr>
+                <w:rFonts w:ascii="Times New Roman" w:eastAsia="Times New Roman" w:hAnsi="Times New Roman" w:cs="Times New Roman"/>
+              </w:rPr>
+              <w:t># ============================================================================</w:t>
+            </w:r>
+          </w:p>
+          <w:p>
+            <w:pPr>
+              <w:ind w:left="34"/>
+              <w:rPr>
+                <w:rFonts w:ascii="Times New Roman" w:eastAsia="Times New Roman" w:hAnsi="Times New Roman" w:cs="Times New Roman"/>
+              </w:rPr>
+            </w:pPr>
+          </w:p>
+          <w:p>
+            <w:pPr>
+              <w:ind w:left="34"/>
+              <w:rPr>
+                <w:rFonts w:ascii="Times New Roman" w:eastAsia="Times New Roman" w:hAnsi="Times New Roman" w:cs="Times New Roman"/>
+              </w:rPr>
+            </w:pPr>
+            <w:r>
+              <w:rPr>
+                <w:rFonts w:ascii="Times New Roman" w:eastAsia="Times New Roman" w:hAnsi="Times New Roman" w:cs="Times New Roman"/>
+              </w:rPr>
+              <w:t># Load required libraries</w:t>
+            </w:r>
+          </w:p>
+          <w:p>
+            <w:pPr>
+              <w:ind w:left="34"/>
+              <w:rPr>
+                <w:rFonts w:ascii="Times New Roman" w:eastAsia="Times New Roman" w:hAnsi="Times New Roman" w:cs="Times New Roman"/>
+              </w:rPr>
+            </w:pPr>
+            <w:r>
+              <w:rPr>
+                <w:rFonts w:ascii="Times New Roman" w:eastAsia="Times New Roman" w:hAnsi="Times New Roman" w:cs="Times New Roman"/>
+              </w:rPr>
+              <w:t>library(ggplot2)</w:t>
+            </w:r>
+          </w:p>
+          <w:p>
+            <w:pPr>
+              <w:ind w:left="34"/>
+              <w:rPr>
+                <w:rFonts w:ascii="Times New Roman" w:eastAsia="Times New Roman" w:hAnsi="Times New Roman" w:cs="Times New Roman"/>
+              </w:rPr>
+            </w:pPr>
+            <w:r>
+              <w:rPr>
+                <w:rFonts w:ascii="Times New Roman" w:eastAsia="Times New Roman" w:hAnsi="Times New Roman" w:cs="Times New Roman"/>
+              </w:rPr>
+              <w:t>library(</w:t>
+            </w:r>
+            <w:proofErr w:type="spellStart"/>
+            <w:r>
+              <w:rPr>
+                <w:rFonts w:ascii="Times New Roman" w:eastAsia="Times New Roman" w:hAnsi="Times New Roman" w:cs="Times New Roman"/>
+              </w:rPr>
+              <w:t>dplyr</w:t>
+            </w:r>
+            <w:proofErr w:type="spellEnd"/>
+            <w:r>
+              <w:rPr>
+                <w:rFonts w:ascii="Times New Roman" w:eastAsia="Times New Roman" w:hAnsi="Times New Roman" w:cs="Times New Roman"/>
+              </w:rPr>
+              <w:t>)</w:t>
+            </w:r>
+          </w:p>
+          <w:p>
+            <w:pPr>
+              <w:ind w:left="34"/>
+              <w:rPr>
+                <w:rFonts w:ascii="Times New Roman" w:eastAsia="Times New Roman" w:hAnsi="Times New Roman" w:cs="Times New Roman"/>
+              </w:rPr>
+            </w:pPr>
+          </w:p>
+          <w:p>
+            <w:pPr>
+              <w:ind w:left="34"/>
+              <w:rPr>
+                <w:rFonts w:ascii="Times New Roman" w:eastAsia="Times New Roman" w:hAnsi="Times New Roman" w:cs="Times New Roman"/>
+              </w:rPr>
+            </w:pPr>
+            <w:r>
+              <w:rPr>
+                <w:rFonts w:ascii="Times New Roman" w:eastAsia="Times New Roman" w:hAnsi="Times New Roman" w:cs="Times New Roman"/>
+              </w:rPr>
+              <w:t># ============================================================================</w:t>
+            </w:r>
+          </w:p>
+          <w:p>
+            <w:pPr>
+              <w:ind w:left="34"/>
+              <w:rPr>
+                <w:rFonts w:ascii="Times New Roman" w:eastAsia="Times New Roman" w:hAnsi="Times New Roman" w:cs="Times New Roman"/>
+                <w:b/>
+                <w:bCs/>
+              </w:rPr>
+            </w:pPr>
+            <w:r>
+              <w:rPr>
+                <w:rFonts w:ascii="Times New Roman" w:eastAsia="Times New Roman" w:hAnsi="Times New Roman" w:cs="Times New Roman"/>
+                <w:b/>
+                <w:bCs/>
+              </w:rPr>
+              <w:t># 1. DATA LOADING AND PREPARATION</w:t>
+            </w:r>
+          </w:p>
+          <w:p>
+            <w:pPr>
+              <w:ind w:left="34"/>
+              <w:rPr>
+                <w:rFonts w:ascii="Times New Roman" w:eastAsia="Times New Roman" w:hAnsi="Times New Roman" w:cs="Times New Roman"/>
+              </w:rPr>
+            </w:pPr>
+            <w:r>
+              <w:rPr>
+                <w:rFonts w:ascii="Times New Roman" w:eastAsia="Times New Roman" w:hAnsi="Times New Roman" w:cs="Times New Roman"/>
+              </w:rPr>
+              <w:t># ============================================================================</w:t>
+            </w:r>
+          </w:p>
+          <w:p>
+            <w:pPr>
+              <w:ind w:left="34"/>
+              <w:rPr>
+                <w:rFonts w:ascii="Times New Roman" w:eastAsia="Times New Roman" w:hAnsi="Times New Roman" w:cs="Times New Roman"/>
+              </w:rPr>
+            </w:pPr>
+          </w:p>
+          <w:p>
+            <w:pPr>
+              <w:ind w:left="34"/>
+              <w:rPr>
+                <w:rFonts w:ascii="Times New Roman" w:eastAsia="Times New Roman" w:hAnsi="Times New Roman" w:cs="Times New Roman"/>
+              </w:rPr>
+            </w:pPr>
+            <w:proofErr w:type="gramStart"/>
+            <w:r>
+              <w:rPr>
+                <w:rFonts w:ascii="Times New Roman" w:eastAsia="Times New Roman" w:hAnsi="Times New Roman" w:cs="Times New Roman"/>
+              </w:rPr>
+              <w:t>cat(</w:t>
+            </w:r>
+            <w:proofErr w:type="gramEnd"/>
+            <w:r>
+              <w:rPr>
+                <w:rFonts w:ascii="Times New Roman" w:eastAsia="Times New Roman" w:hAnsi="Times New Roman" w:cs="Times New Roman"/>
+              </w:rPr>
+              <w:t>"=== LOADING DATASETS ===\n\n")</w:t>
+            </w:r>
+          </w:p>
+          <w:p>
+            <w:pPr>
+              <w:ind w:left="1080"/>
+              <w:rPr>
+                <w:rFonts w:ascii="Times New Roman" w:eastAsia="Times New Roman" w:hAnsi="Times New Roman" w:cs="Times New Roman"/>
+              </w:rPr>
+            </w:pPr>
+          </w:p>
+          <w:p>
+            <w:pPr>
+              <w:rPr>
+                <w:rFonts w:ascii="Times New Roman" w:eastAsia="Times New Roman" w:hAnsi="Times New Roman" w:cs="Times New Roman"/>
+              </w:rPr>
+            </w:pPr>
+            <w:r>
+              <w:rPr>
+                <w:rFonts w:ascii="Times New Roman" w:eastAsia="Times New Roman" w:hAnsi="Times New Roman" w:cs="Times New Roman"/>
+              </w:rPr>
+              <w:t># Read the TWO dataset files</w:t>
+            </w:r>
+          </w:p>
+          <w:p>
+            <w:pPr>
+              <w:rPr>
+                <w:rFonts w:ascii="Times New Roman" w:eastAsia="Times New Roman" w:hAnsi="Times New Roman" w:cs="Times New Roman"/>
+              </w:rPr>
+            </w:pPr>
+            <w:r>
+              <w:rPr>
+                <w:rFonts w:ascii="Times New Roman" w:eastAsia="Times New Roman" w:hAnsi="Times New Roman" w:cs="Times New Roman"/>
+              </w:rPr>
+              <w:t>drinks &lt;- read.csv("C:\\Users\\hynda\\Downloads\\drinks.csv")</w:t>
+            </w:r>
+          </w:p>
+          <w:p>
+            <w:pPr>
+              <w:rPr>
+                <w:rFonts w:ascii="Times New Roman" w:eastAsia="Times New Roman" w:hAnsi="Times New Roman" w:cs="Times New Roman"/>
+              </w:rPr>
+            </w:pPr>
+            <w:proofErr w:type="spellStart"/>
+            <w:r>
+              <w:rPr>
+                <w:rFonts w:ascii="Times New Roman" w:eastAsia="Times New Roman" w:hAnsi="Times New Roman" w:cs="Times New Roman"/>
+              </w:rPr>
+              <w:t>life_exp</w:t>
+            </w:r>
+            <w:proofErr w:type="spellEnd"/>
+            <w:r>
+              <w:rPr>
+                <w:rFonts w:ascii="Times New Roman" w:eastAsia="Times New Roman" w:hAnsi="Times New Roman" w:cs="Times New Roman"/>
+              </w:rPr>
+              <w:t xml:space="preserve"> &lt;- read.csv("C:\\Users\\hynda\\Downloads\\lifeexpectancy.csv")</w:t>
+            </w:r>
+          </w:p>
+          <w:p>
+            <w:pPr>
+              <w:rPr>
+                <w:rFonts w:ascii="Times New Roman" w:eastAsia="Times New Roman" w:hAnsi="Times New Roman" w:cs="Times New Roman"/>
+              </w:rPr>
+            </w:pPr>
+          </w:p>
+          <w:p>
+            <w:pPr>
+              <w:rPr>
+                <w:rFonts w:ascii="Times New Roman" w:eastAsia="Times New Roman" w:hAnsi="Times New Roman" w:cs="Times New Roman"/>
+              </w:rPr>
+            </w:pPr>
+            <w:r>
+              <w:rPr>
+                <w:rFonts w:ascii="Times New Roman" w:eastAsia="Times New Roman" w:hAnsi="Times New Roman" w:cs="Times New Roman"/>
+              </w:rPr>
+              <w:t># Display drinks dataset structure</w:t>
+            </w:r>
+          </w:p>
+          <w:p>
+            <w:pPr>
+              <w:rPr>
+                <w:rFonts w:ascii="Times New Roman" w:eastAsia="Times New Roman" w:hAnsi="Times New Roman" w:cs="Times New Roman"/>
+              </w:rPr>
+            </w:pPr>
+            <w:proofErr w:type="gramStart"/>
+            <w:r>
+              <w:rPr>
+                <w:rFonts w:ascii="Times New Roman" w:eastAsia="Times New Roman" w:hAnsi="Times New Roman" w:cs="Times New Roman"/>
+              </w:rPr>
+              <w:lastRenderedPageBreak/>
+              <w:t>cat(</w:t>
+            </w:r>
+            <w:proofErr w:type="gramEnd"/>
+            <w:r>
+              <w:rPr>
+                <w:rFonts w:ascii="Times New Roman" w:eastAsia="Times New Roman" w:hAnsi="Times New Roman" w:cs="Times New Roman"/>
+              </w:rPr>
+              <w:t>"--- DRINKS DATASET ---\n")</w:t>
+            </w:r>
+          </w:p>
+          <w:p>
+            <w:pPr>
+              <w:rPr>
+                <w:rFonts w:ascii="Times New Roman" w:eastAsia="Times New Roman" w:hAnsi="Times New Roman" w:cs="Times New Roman"/>
+              </w:rPr>
+            </w:pPr>
+            <w:proofErr w:type="gramStart"/>
+            <w:r>
+              <w:rPr>
+                <w:rFonts w:ascii="Times New Roman" w:eastAsia="Times New Roman" w:hAnsi="Times New Roman" w:cs="Times New Roman"/>
+              </w:rPr>
+              <w:t>cat(</w:t>
+            </w:r>
+            <w:proofErr w:type="gramEnd"/>
+            <w:r>
+              <w:rPr>
+                <w:rFonts w:ascii="Times New Roman" w:eastAsia="Times New Roman" w:hAnsi="Times New Roman" w:cs="Times New Roman"/>
+              </w:rPr>
+              <w:t>"Columns:", paste(</w:t>
+            </w:r>
+            <w:proofErr w:type="spellStart"/>
+            <w:r>
+              <w:rPr>
+                <w:rFonts w:ascii="Times New Roman" w:eastAsia="Times New Roman" w:hAnsi="Times New Roman" w:cs="Times New Roman"/>
+              </w:rPr>
+              <w:t>colnames</w:t>
+            </w:r>
+            <w:proofErr w:type="spellEnd"/>
+            <w:r>
+              <w:rPr>
+                <w:rFonts w:ascii="Times New Roman" w:eastAsia="Times New Roman" w:hAnsi="Times New Roman" w:cs="Times New Roman"/>
+              </w:rPr>
+              <w:t>(drinks), collapse=", "), "\n")</w:t>
+            </w:r>
+          </w:p>
+          <w:p>
+            <w:pPr>
+              <w:rPr>
+                <w:rFonts w:ascii="Times New Roman" w:eastAsia="Times New Roman" w:hAnsi="Times New Roman" w:cs="Times New Roman"/>
+              </w:rPr>
+            </w:pPr>
+            <w:proofErr w:type="gramStart"/>
+            <w:r>
+              <w:rPr>
+                <w:rFonts w:ascii="Times New Roman" w:eastAsia="Times New Roman" w:hAnsi="Times New Roman" w:cs="Times New Roman"/>
+              </w:rPr>
+              <w:t>cat(</w:t>
+            </w:r>
+            <w:proofErr w:type="gramEnd"/>
+            <w:r>
+              <w:rPr>
+                <w:rFonts w:ascii="Times New Roman" w:eastAsia="Times New Roman" w:hAnsi="Times New Roman" w:cs="Times New Roman"/>
+              </w:rPr>
+              <w:t xml:space="preserve">"Dimensions:", </w:t>
+            </w:r>
+            <w:proofErr w:type="spellStart"/>
+            <w:r>
+              <w:rPr>
+                <w:rFonts w:ascii="Times New Roman" w:eastAsia="Times New Roman" w:hAnsi="Times New Roman" w:cs="Times New Roman"/>
+              </w:rPr>
+              <w:t>nrow</w:t>
+            </w:r>
+            <w:proofErr w:type="spellEnd"/>
+            <w:r>
+              <w:rPr>
+                <w:rFonts w:ascii="Times New Roman" w:eastAsia="Times New Roman" w:hAnsi="Times New Roman" w:cs="Times New Roman"/>
+              </w:rPr>
+              <w:t xml:space="preserve">(drinks), "rows x", </w:t>
+            </w:r>
+            <w:proofErr w:type="spellStart"/>
+            <w:r>
+              <w:rPr>
+                <w:rFonts w:ascii="Times New Roman" w:eastAsia="Times New Roman" w:hAnsi="Times New Roman" w:cs="Times New Roman"/>
+              </w:rPr>
+              <w:t>ncol</w:t>
+            </w:r>
+            <w:proofErr w:type="spellEnd"/>
+            <w:r>
+              <w:rPr>
+                <w:rFonts w:ascii="Times New Roman" w:eastAsia="Times New Roman" w:hAnsi="Times New Roman" w:cs="Times New Roman"/>
+              </w:rPr>
+              <w:t>(drinks), "columns\n\n")</w:t>
+            </w:r>
+          </w:p>
+          <w:p>
+            <w:pPr>
+              <w:rPr>
+                <w:rFonts w:ascii="Times New Roman" w:eastAsia="Times New Roman" w:hAnsi="Times New Roman" w:cs="Times New Roman"/>
+              </w:rPr>
+            </w:pPr>
+            <w:r>
+              <w:rPr>
+                <w:rFonts w:ascii="Times New Roman" w:eastAsia="Times New Roman" w:hAnsi="Times New Roman" w:cs="Times New Roman"/>
+              </w:rPr>
+              <w:t>str(drinks)</w:t>
+            </w:r>
+          </w:p>
+          <w:p>
+            <w:pPr>
+              <w:rPr>
+                <w:rFonts w:ascii="Times New Roman" w:eastAsia="Times New Roman" w:hAnsi="Times New Roman" w:cs="Times New Roman"/>
+              </w:rPr>
+            </w:pPr>
+            <w:r>
+              <w:rPr>
+                <w:rFonts w:ascii="Times New Roman" w:eastAsia="Times New Roman" w:hAnsi="Times New Roman" w:cs="Times New Roman"/>
+              </w:rPr>
+              <w:t>summary(drinks)</w:t>
+            </w:r>
+          </w:p>
+          <w:p>
+            <w:pPr>
+              <w:rPr>
+                <w:rFonts w:ascii="Times New Roman" w:eastAsia="Times New Roman" w:hAnsi="Times New Roman" w:cs="Times New Roman"/>
+              </w:rPr>
+            </w:pPr>
+          </w:p>
+          <w:p>
+            <w:pPr>
+              <w:rPr>
+                <w:rFonts w:ascii="Times New Roman" w:eastAsia="Times New Roman" w:hAnsi="Times New Roman" w:cs="Times New Roman"/>
+              </w:rPr>
+            </w:pPr>
+            <w:r>
+              <w:rPr>
+                <w:rFonts w:ascii="Times New Roman" w:eastAsia="Times New Roman" w:hAnsi="Times New Roman" w:cs="Times New Roman"/>
+              </w:rPr>
+              <w:t># Display life expectancy dataset structure</w:t>
+            </w:r>
+          </w:p>
+          <w:p>
+            <w:pPr>
+              <w:rPr>
+                <w:rFonts w:ascii="Times New Roman" w:eastAsia="Times New Roman" w:hAnsi="Times New Roman" w:cs="Times New Roman"/>
+              </w:rPr>
+            </w:pPr>
+            <w:proofErr w:type="gramStart"/>
+            <w:r>
+              <w:rPr>
+                <w:rFonts w:ascii="Times New Roman" w:eastAsia="Times New Roman" w:hAnsi="Times New Roman" w:cs="Times New Roman"/>
+              </w:rPr>
+              <w:t>cat(</w:t>
+            </w:r>
+            <w:proofErr w:type="gramEnd"/>
+            <w:r>
+              <w:rPr>
+                <w:rFonts w:ascii="Times New Roman" w:eastAsia="Times New Roman" w:hAnsi="Times New Roman" w:cs="Times New Roman"/>
+              </w:rPr>
+              <w:t>"\n--- LIFE EXPECTANCY DATASET ---\n")</w:t>
+            </w:r>
+          </w:p>
+          <w:p>
+            <w:pPr>
+              <w:rPr>
+                <w:rFonts w:ascii="Times New Roman" w:eastAsia="Times New Roman" w:hAnsi="Times New Roman" w:cs="Times New Roman"/>
+              </w:rPr>
+            </w:pPr>
+            <w:proofErr w:type="gramStart"/>
+            <w:r>
+              <w:rPr>
+                <w:rFonts w:ascii="Times New Roman" w:eastAsia="Times New Roman" w:hAnsi="Times New Roman" w:cs="Times New Roman"/>
+              </w:rPr>
+              <w:t>cat(</w:t>
+            </w:r>
+            <w:proofErr w:type="gramEnd"/>
+            <w:r>
+              <w:rPr>
+                <w:rFonts w:ascii="Times New Roman" w:eastAsia="Times New Roman" w:hAnsi="Times New Roman" w:cs="Times New Roman"/>
+              </w:rPr>
+              <w:t>"Columns:", paste(</w:t>
+            </w:r>
+            <w:proofErr w:type="spellStart"/>
+            <w:r>
+              <w:rPr>
+                <w:rFonts w:ascii="Times New Roman" w:eastAsia="Times New Roman" w:hAnsi="Times New Roman" w:cs="Times New Roman"/>
+              </w:rPr>
+              <w:t>colnames</w:t>
+            </w:r>
+            <w:proofErr w:type="spellEnd"/>
+            <w:r>
+              <w:rPr>
+                <w:rFonts w:ascii="Times New Roman" w:eastAsia="Times New Roman" w:hAnsi="Times New Roman" w:cs="Times New Roman"/>
+              </w:rPr>
+              <w:t>(</w:t>
+            </w:r>
+            <w:proofErr w:type="spellStart"/>
+            <w:r>
+              <w:rPr>
+                <w:rFonts w:ascii="Times New Roman" w:eastAsia="Times New Roman" w:hAnsi="Times New Roman" w:cs="Times New Roman"/>
+              </w:rPr>
+              <w:t>life_exp</w:t>
+            </w:r>
+            <w:proofErr w:type="spellEnd"/>
+            <w:r>
+              <w:rPr>
+                <w:rFonts w:ascii="Times New Roman" w:eastAsia="Times New Roman" w:hAnsi="Times New Roman" w:cs="Times New Roman"/>
+              </w:rPr>
+              <w:t>), collapse=", "), "\n")</w:t>
+            </w:r>
+          </w:p>
+          <w:p>
+            <w:pPr>
+              <w:rPr>
+                <w:rFonts w:ascii="Times New Roman" w:eastAsia="Times New Roman" w:hAnsi="Times New Roman" w:cs="Times New Roman"/>
+              </w:rPr>
+            </w:pPr>
+            <w:proofErr w:type="gramStart"/>
+            <w:r>
+              <w:rPr>
+                <w:rFonts w:ascii="Times New Roman" w:eastAsia="Times New Roman" w:hAnsi="Times New Roman" w:cs="Times New Roman"/>
+              </w:rPr>
+              <w:t>cat(</w:t>
+            </w:r>
+            <w:proofErr w:type="gramEnd"/>
+            <w:r>
+              <w:rPr>
+                <w:rFonts w:ascii="Times New Roman" w:eastAsia="Times New Roman" w:hAnsi="Times New Roman" w:cs="Times New Roman"/>
+              </w:rPr>
+              <w:t xml:space="preserve">"Dimensions:", </w:t>
+            </w:r>
+            <w:proofErr w:type="spellStart"/>
+            <w:r>
+              <w:rPr>
+                <w:rFonts w:ascii="Times New Roman" w:eastAsia="Times New Roman" w:hAnsi="Times New Roman" w:cs="Times New Roman"/>
+              </w:rPr>
+              <w:t>nrow</w:t>
+            </w:r>
+            <w:proofErr w:type="spellEnd"/>
+            <w:r>
+              <w:rPr>
+                <w:rFonts w:ascii="Times New Roman" w:eastAsia="Times New Roman" w:hAnsi="Times New Roman" w:cs="Times New Roman"/>
+              </w:rPr>
+              <w:t>(</w:t>
+            </w:r>
+            <w:proofErr w:type="spellStart"/>
+            <w:r>
+              <w:rPr>
+                <w:rFonts w:ascii="Times New Roman" w:eastAsia="Times New Roman" w:hAnsi="Times New Roman" w:cs="Times New Roman"/>
+              </w:rPr>
+              <w:t>life_exp</w:t>
+            </w:r>
+            <w:proofErr w:type="spellEnd"/>
+            <w:r>
+              <w:rPr>
+                <w:rFonts w:ascii="Times New Roman" w:eastAsia="Times New Roman" w:hAnsi="Times New Roman" w:cs="Times New Roman"/>
+              </w:rPr>
+              <w:t xml:space="preserve">), "rows x", </w:t>
+            </w:r>
+            <w:proofErr w:type="spellStart"/>
+            <w:r>
+              <w:rPr>
+                <w:rFonts w:ascii="Times New Roman" w:eastAsia="Times New Roman" w:hAnsi="Times New Roman" w:cs="Times New Roman"/>
+              </w:rPr>
+              <w:t>ncol</w:t>
+            </w:r>
+            <w:proofErr w:type="spellEnd"/>
+            <w:r>
+              <w:rPr>
+                <w:rFonts w:ascii="Times New Roman" w:eastAsia="Times New Roman" w:hAnsi="Times New Roman" w:cs="Times New Roman"/>
+              </w:rPr>
+              <w:t>(</w:t>
+            </w:r>
+            <w:proofErr w:type="spellStart"/>
+            <w:r>
+              <w:rPr>
+                <w:rFonts w:ascii="Times New Roman" w:eastAsia="Times New Roman" w:hAnsi="Times New Roman" w:cs="Times New Roman"/>
+              </w:rPr>
+              <w:t>life_exp</w:t>
+            </w:r>
+            <w:proofErr w:type="spellEnd"/>
+            <w:r>
+              <w:rPr>
+                <w:rFonts w:ascii="Times New Roman" w:eastAsia="Times New Roman" w:hAnsi="Times New Roman" w:cs="Times New Roman"/>
+              </w:rPr>
+              <w:t>), "columns\n\n")</w:t>
+            </w:r>
+          </w:p>
+          <w:p>
+            <w:pPr>
+              <w:rPr>
+                <w:rFonts w:ascii="Times New Roman" w:eastAsia="Times New Roman" w:hAnsi="Times New Roman" w:cs="Times New Roman"/>
+              </w:rPr>
+            </w:pPr>
+            <w:r>
+              <w:rPr>
+                <w:rFonts w:ascii="Times New Roman" w:eastAsia="Times New Roman" w:hAnsi="Times New Roman" w:cs="Times New Roman"/>
+              </w:rPr>
+              <w:t>str(</w:t>
+            </w:r>
+            <w:proofErr w:type="spellStart"/>
+            <w:r>
+              <w:rPr>
+                <w:rFonts w:ascii="Times New Roman" w:eastAsia="Times New Roman" w:hAnsi="Times New Roman" w:cs="Times New Roman"/>
+              </w:rPr>
+              <w:t>life_exp</w:t>
+            </w:r>
+            <w:proofErr w:type="spellEnd"/>
+            <w:r>
+              <w:rPr>
+                <w:rFonts w:ascii="Times New Roman" w:eastAsia="Times New Roman" w:hAnsi="Times New Roman" w:cs="Times New Roman"/>
+              </w:rPr>
+              <w:t>)</w:t>
+            </w:r>
+          </w:p>
+          <w:p>
+            <w:pPr>
+              <w:rPr>
+                <w:rFonts w:ascii="Times New Roman" w:eastAsia="Times New Roman" w:hAnsi="Times New Roman" w:cs="Times New Roman"/>
+              </w:rPr>
+            </w:pPr>
+            <w:r>
+              <w:rPr>
+                <w:rFonts w:ascii="Times New Roman" w:eastAsia="Times New Roman" w:hAnsi="Times New Roman" w:cs="Times New Roman"/>
+              </w:rPr>
+              <w:t>summary(</w:t>
+            </w:r>
+            <w:proofErr w:type="spellStart"/>
+            <w:r>
+              <w:rPr>
+                <w:rFonts w:ascii="Times New Roman" w:eastAsia="Times New Roman" w:hAnsi="Times New Roman" w:cs="Times New Roman"/>
+              </w:rPr>
+              <w:t>life_exp</w:t>
+            </w:r>
+            <w:proofErr w:type="spellEnd"/>
+            <w:r>
+              <w:rPr>
+                <w:rFonts w:ascii="Times New Roman" w:eastAsia="Times New Roman" w:hAnsi="Times New Roman" w:cs="Times New Roman"/>
+              </w:rPr>
+              <w:t>)</w:t>
+            </w:r>
+          </w:p>
+          <w:p>
+            <w:pPr>
+              <w:rPr>
+                <w:rFonts w:ascii="Times New Roman" w:eastAsia="Times New Roman" w:hAnsi="Times New Roman" w:cs="Times New Roman"/>
+              </w:rPr>
+            </w:pPr>
+          </w:p>
+          <w:p>
+            <w:pPr>
+              <w:rPr>
+                <w:rFonts w:ascii="Times New Roman" w:eastAsia="Times New Roman" w:hAnsi="Times New Roman" w:cs="Times New Roman"/>
+              </w:rPr>
+            </w:pPr>
+            <w:r>
+              <w:rPr>
+                <w:rFonts w:ascii="Times New Roman" w:eastAsia="Times New Roman" w:hAnsi="Times New Roman" w:cs="Times New Roman"/>
+              </w:rPr>
+              <w:t># Check for missing values in both datasets</w:t>
+            </w:r>
+          </w:p>
+          <w:p>
+            <w:pPr>
+              <w:rPr>
+                <w:rFonts w:ascii="Times New Roman" w:eastAsia="Times New Roman" w:hAnsi="Times New Roman" w:cs="Times New Roman"/>
+              </w:rPr>
+            </w:pPr>
+            <w:proofErr w:type="gramStart"/>
+            <w:r>
+              <w:rPr>
+                <w:rFonts w:ascii="Times New Roman" w:eastAsia="Times New Roman" w:hAnsi="Times New Roman" w:cs="Times New Roman"/>
+              </w:rPr>
+              <w:t>cat(</w:t>
+            </w:r>
+            <w:proofErr w:type="gramEnd"/>
+            <w:r>
+              <w:rPr>
+                <w:rFonts w:ascii="Times New Roman" w:eastAsia="Times New Roman" w:hAnsi="Times New Roman" w:cs="Times New Roman"/>
+              </w:rPr>
+              <w:t>"\n--- MISSING VALUES CHECK ---\n")</w:t>
+            </w:r>
+          </w:p>
+          <w:p>
+            <w:pPr>
+              <w:rPr>
+                <w:rFonts w:ascii="Times New Roman" w:eastAsia="Times New Roman" w:hAnsi="Times New Roman" w:cs="Times New Roman"/>
+              </w:rPr>
+            </w:pPr>
+            <w:proofErr w:type="gramStart"/>
+            <w:r>
+              <w:rPr>
+                <w:rFonts w:ascii="Times New Roman" w:eastAsia="Times New Roman" w:hAnsi="Times New Roman" w:cs="Times New Roman"/>
+              </w:rPr>
+              <w:t>cat(</w:t>
+            </w:r>
+            <w:proofErr w:type="gramEnd"/>
+            <w:r>
+              <w:rPr>
+                <w:rFonts w:ascii="Times New Roman" w:eastAsia="Times New Roman" w:hAnsi="Times New Roman" w:cs="Times New Roman"/>
+              </w:rPr>
+              <w:t>"Missing values in drinks:", sum(is.na(drinks)), "\n")</w:t>
+            </w:r>
+          </w:p>
+          <w:p>
+            <w:pPr>
+              <w:rPr>
+                <w:rFonts w:ascii="Times New Roman" w:eastAsia="Times New Roman" w:hAnsi="Times New Roman" w:cs="Times New Roman"/>
+              </w:rPr>
+            </w:pPr>
+            <w:proofErr w:type="gramStart"/>
+            <w:r>
+              <w:rPr>
+                <w:rFonts w:ascii="Times New Roman" w:eastAsia="Times New Roman" w:hAnsi="Times New Roman" w:cs="Times New Roman"/>
+              </w:rPr>
+              <w:t>cat(</w:t>
+            </w:r>
+            <w:proofErr w:type="gramEnd"/>
+            <w:r>
+              <w:rPr>
+                <w:rFonts w:ascii="Times New Roman" w:eastAsia="Times New Roman" w:hAnsi="Times New Roman" w:cs="Times New Roman"/>
+              </w:rPr>
+              <w:t>"Missing values in life expectancy:", sum(is.na(</w:t>
+            </w:r>
+            <w:proofErr w:type="spellStart"/>
+            <w:r>
+              <w:rPr>
+                <w:rFonts w:ascii="Times New Roman" w:eastAsia="Times New Roman" w:hAnsi="Times New Roman" w:cs="Times New Roman"/>
+              </w:rPr>
+              <w:t>life_exp</w:t>
+            </w:r>
+            <w:proofErr w:type="spellEnd"/>
+            <w:r>
+              <w:rPr>
+                <w:rFonts w:ascii="Times New Roman" w:eastAsia="Times New Roman" w:hAnsi="Times New Roman" w:cs="Times New Roman"/>
+              </w:rPr>
+              <w:t>)), "\n\n")</w:t>
+            </w:r>
+          </w:p>
+          <w:p>
+            <w:pPr>
+              <w:rPr>
+                <w:rFonts w:ascii="Times New Roman" w:eastAsia="Times New Roman" w:hAnsi="Times New Roman" w:cs="Times New Roman"/>
+              </w:rPr>
+            </w:pPr>
+          </w:p>
+          <w:p>
+            <w:pPr>
+              <w:rPr>
+                <w:rFonts w:ascii="Times New Roman" w:eastAsia="Times New Roman" w:hAnsi="Times New Roman" w:cs="Times New Roman"/>
+              </w:rPr>
+            </w:pPr>
+            <w:r>
+              <w:rPr>
+                <w:rFonts w:ascii="Times New Roman" w:eastAsia="Times New Roman" w:hAnsi="Times New Roman" w:cs="Times New Roman"/>
+              </w:rPr>
+              <w:t># ============================================================================</w:t>
+            </w:r>
+          </w:p>
+          <w:p>
+            <w:pPr>
+              <w:rPr>
+                <w:rFonts w:ascii="Times New Roman" w:eastAsia="Times New Roman" w:hAnsi="Times New Roman" w:cs="Times New Roman"/>
+                <w:b/>
+                <w:bCs/>
+              </w:rPr>
+            </w:pPr>
+            <w:r>
+              <w:rPr>
+                <w:rFonts w:ascii="Times New Roman" w:eastAsia="Times New Roman" w:hAnsi="Times New Roman" w:cs="Times New Roman"/>
+                <w:b/>
+                <w:bCs/>
+              </w:rPr>
+              <w:t># 2. DATA MERGING</w:t>
+            </w:r>
+          </w:p>
+          <w:p>
+            <w:pPr>
+              <w:rPr>
+                <w:rFonts w:ascii="Times New Roman" w:eastAsia="Times New Roman" w:hAnsi="Times New Roman" w:cs="Times New Roman"/>
+              </w:rPr>
+            </w:pPr>
+            <w:r>
+              <w:rPr>
+                <w:rFonts w:ascii="Times New Roman" w:eastAsia="Times New Roman" w:hAnsi="Times New Roman" w:cs="Times New Roman"/>
+              </w:rPr>
+              <w:t># ============================================================================</w:t>
+            </w:r>
+          </w:p>
+          <w:p>
+            <w:pPr>
+              <w:rPr>
+                <w:rFonts w:ascii="Times New Roman" w:eastAsia="Times New Roman" w:hAnsi="Times New Roman" w:cs="Times New Roman"/>
+              </w:rPr>
+            </w:pPr>
+          </w:p>
+          <w:p>
+            <w:pPr>
+              <w:rPr>
+                <w:rFonts w:ascii="Times New Roman" w:eastAsia="Times New Roman" w:hAnsi="Times New Roman" w:cs="Times New Roman"/>
+              </w:rPr>
+            </w:pPr>
+            <w:proofErr w:type="gramStart"/>
+            <w:r>
+              <w:rPr>
+                <w:rFonts w:ascii="Times New Roman" w:eastAsia="Times New Roman" w:hAnsi="Times New Roman" w:cs="Times New Roman"/>
+              </w:rPr>
+              <w:t>cat(</w:t>
+            </w:r>
+            <w:proofErr w:type="gramEnd"/>
+            <w:r>
+              <w:rPr>
+                <w:rFonts w:ascii="Times New Roman" w:eastAsia="Times New Roman" w:hAnsi="Times New Roman" w:cs="Times New Roman"/>
+              </w:rPr>
+              <w:t>"=== MERGING DATASETS ===\n\n")</w:t>
+            </w:r>
+          </w:p>
+          <w:p>
+            <w:pPr>
+              <w:rPr>
+                <w:rFonts w:ascii="Times New Roman" w:eastAsia="Times New Roman" w:hAnsi="Times New Roman" w:cs="Times New Roman"/>
+              </w:rPr>
+            </w:pPr>
+          </w:p>
+          <w:p>
+            <w:pPr>
+              <w:rPr>
+                <w:rFonts w:ascii="Times New Roman" w:eastAsia="Times New Roman" w:hAnsi="Times New Roman" w:cs="Times New Roman"/>
+              </w:rPr>
+            </w:pPr>
+            <w:r>
+              <w:rPr>
+                <w:rFonts w:ascii="Times New Roman" w:eastAsia="Times New Roman" w:hAnsi="Times New Roman" w:cs="Times New Roman"/>
+              </w:rPr>
+              <w:t># Merge the two datasets by country</w:t>
+            </w:r>
+          </w:p>
+          <w:p>
+            <w:pPr>
+              <w:rPr>
+                <w:rFonts w:ascii="Times New Roman" w:eastAsia="Times New Roman" w:hAnsi="Times New Roman" w:cs="Times New Roman"/>
+              </w:rPr>
+            </w:pPr>
+            <w:r>
+              <w:rPr>
+                <w:rFonts w:ascii="Times New Roman" w:eastAsia="Times New Roman" w:hAnsi="Times New Roman" w:cs="Times New Roman"/>
+              </w:rPr>
+              <w:t># IMPORTANT: Adjust column names based on your actual data</w:t>
+            </w:r>
+          </w:p>
+          <w:p>
+            <w:pPr>
+              <w:rPr>
+                <w:rFonts w:ascii="Times New Roman" w:eastAsia="Times New Roman" w:hAnsi="Times New Roman" w:cs="Times New Roman"/>
+              </w:rPr>
+            </w:pPr>
+            <w:r>
+              <w:rPr>
+                <w:rFonts w:ascii="Times New Roman" w:eastAsia="Times New Roman" w:hAnsi="Times New Roman" w:cs="Times New Roman"/>
+              </w:rPr>
+              <w:t># Common variations in drinks.csv: "country" or "Country"</w:t>
+            </w:r>
+          </w:p>
+          <w:p>
+            <w:pPr>
+              <w:rPr>
+                <w:rFonts w:ascii="Times New Roman" w:eastAsia="Times New Roman" w:hAnsi="Times New Roman" w:cs="Times New Roman"/>
+              </w:rPr>
+            </w:pPr>
+            <w:r>
+              <w:rPr>
+                <w:rFonts w:ascii="Times New Roman" w:eastAsia="Times New Roman" w:hAnsi="Times New Roman" w:cs="Times New Roman"/>
+              </w:rPr>
+              <w:t># Common variations in life expectancy: "Country", "country", "</w:t>
+            </w:r>
+            <w:proofErr w:type="spellStart"/>
+            <w:r>
+              <w:rPr>
+                <w:rFonts w:ascii="Times New Roman" w:eastAsia="Times New Roman" w:hAnsi="Times New Roman" w:cs="Times New Roman"/>
+              </w:rPr>
+              <w:t>country_name</w:t>
+            </w:r>
+            <w:proofErr w:type="spellEnd"/>
+            <w:r>
+              <w:rPr>
+                <w:rFonts w:ascii="Times New Roman" w:eastAsia="Times New Roman" w:hAnsi="Times New Roman" w:cs="Times New Roman"/>
+              </w:rPr>
+              <w:t>"</w:t>
+            </w:r>
+          </w:p>
+          <w:p>
+            <w:pPr>
+              <w:rPr>
+                <w:rFonts w:ascii="Times New Roman" w:eastAsia="Times New Roman" w:hAnsi="Times New Roman" w:cs="Times New Roman"/>
+              </w:rPr>
+            </w:pPr>
+          </w:p>
+          <w:p>
+            <w:pPr>
+              <w:rPr>
+                <w:rFonts w:ascii="Times New Roman" w:eastAsia="Times New Roman" w:hAnsi="Times New Roman" w:cs="Times New Roman"/>
+              </w:rPr>
+            </w:pPr>
+            <w:r>
+              <w:rPr>
+                <w:rFonts w:ascii="Times New Roman" w:eastAsia="Times New Roman" w:hAnsi="Times New Roman" w:cs="Times New Roman"/>
+              </w:rPr>
+              <w:t># Check column names to determine merge keys</w:t>
+            </w:r>
+          </w:p>
+          <w:p>
+            <w:pPr>
+              <w:rPr>
+                <w:rFonts w:ascii="Times New Roman" w:eastAsia="Times New Roman" w:hAnsi="Times New Roman" w:cs="Times New Roman"/>
+              </w:rPr>
+            </w:pPr>
+            <w:proofErr w:type="gramStart"/>
+            <w:r>
+              <w:rPr>
+                <w:rFonts w:ascii="Times New Roman" w:eastAsia="Times New Roman" w:hAnsi="Times New Roman" w:cs="Times New Roman"/>
+              </w:rPr>
+              <w:t>cat(</w:t>
+            </w:r>
+            <w:proofErr w:type="gramEnd"/>
+            <w:r>
+              <w:rPr>
+                <w:rFonts w:ascii="Times New Roman" w:eastAsia="Times New Roman" w:hAnsi="Times New Roman" w:cs="Times New Roman"/>
+              </w:rPr>
+              <w:t xml:space="preserve">"Drinks column names:", </w:t>
+            </w:r>
+            <w:proofErr w:type="spellStart"/>
+            <w:r>
+              <w:rPr>
+                <w:rFonts w:ascii="Times New Roman" w:eastAsia="Times New Roman" w:hAnsi="Times New Roman" w:cs="Times New Roman"/>
+              </w:rPr>
+              <w:t>colnames</w:t>
+            </w:r>
+            <w:proofErr w:type="spellEnd"/>
+            <w:r>
+              <w:rPr>
+                <w:rFonts w:ascii="Times New Roman" w:eastAsia="Times New Roman" w:hAnsi="Times New Roman" w:cs="Times New Roman"/>
+              </w:rPr>
+              <w:t>(drinks), "\n")</w:t>
+            </w:r>
+          </w:p>
+          <w:p>
+            <w:pPr>
+              <w:rPr>
+                <w:rFonts w:ascii="Times New Roman" w:eastAsia="Times New Roman" w:hAnsi="Times New Roman" w:cs="Times New Roman"/>
+              </w:rPr>
+            </w:pPr>
+            <w:proofErr w:type="gramStart"/>
+            <w:r>
+              <w:rPr>
+                <w:rFonts w:ascii="Times New Roman" w:eastAsia="Times New Roman" w:hAnsi="Times New Roman" w:cs="Times New Roman"/>
+              </w:rPr>
+              <w:t>cat(</w:t>
+            </w:r>
+            <w:proofErr w:type="gramEnd"/>
+            <w:r>
+              <w:rPr>
+                <w:rFonts w:ascii="Times New Roman" w:eastAsia="Times New Roman" w:hAnsi="Times New Roman" w:cs="Times New Roman"/>
+              </w:rPr>
+              <w:t xml:space="preserve">"Life expectancy column names:", </w:t>
+            </w:r>
+            <w:proofErr w:type="spellStart"/>
+            <w:r>
+              <w:rPr>
+                <w:rFonts w:ascii="Times New Roman" w:eastAsia="Times New Roman" w:hAnsi="Times New Roman" w:cs="Times New Roman"/>
+              </w:rPr>
+              <w:t>colnames</w:t>
+            </w:r>
+            <w:proofErr w:type="spellEnd"/>
+            <w:r>
+              <w:rPr>
+                <w:rFonts w:ascii="Times New Roman" w:eastAsia="Times New Roman" w:hAnsi="Times New Roman" w:cs="Times New Roman"/>
+              </w:rPr>
+              <w:t>(</w:t>
+            </w:r>
+            <w:proofErr w:type="spellStart"/>
+            <w:r>
+              <w:rPr>
+                <w:rFonts w:ascii="Times New Roman" w:eastAsia="Times New Roman" w:hAnsi="Times New Roman" w:cs="Times New Roman"/>
+              </w:rPr>
+              <w:t>life_exp</w:t>
+            </w:r>
+            <w:proofErr w:type="spellEnd"/>
+            <w:r>
+              <w:rPr>
+                <w:rFonts w:ascii="Times New Roman" w:eastAsia="Times New Roman" w:hAnsi="Times New Roman" w:cs="Times New Roman"/>
+              </w:rPr>
+              <w:t>), "\n\n")</w:t>
+            </w:r>
+          </w:p>
+          <w:p>
+            <w:pPr>
+              <w:rPr>
+                <w:rFonts w:ascii="Times New Roman" w:eastAsia="Times New Roman" w:hAnsi="Times New Roman" w:cs="Times New Roman"/>
+              </w:rPr>
+            </w:pPr>
+          </w:p>
+          <w:p>
+            <w:pPr>
+              <w:rPr>
+                <w:rFonts w:ascii="Times New Roman" w:eastAsia="Times New Roman" w:hAnsi="Times New Roman" w:cs="Times New Roman"/>
+              </w:rPr>
+            </w:pPr>
+            <w:r>
+              <w:rPr>
+                <w:rFonts w:ascii="Times New Roman" w:eastAsia="Times New Roman" w:hAnsi="Times New Roman" w:cs="Times New Roman"/>
+              </w:rPr>
+              <w:t xml:space="preserve"># Merge - adjust the </w:t>
+            </w:r>
+            <w:proofErr w:type="spellStart"/>
+            <w:r>
+              <w:rPr>
+                <w:rFonts w:ascii="Times New Roman" w:eastAsia="Times New Roman" w:hAnsi="Times New Roman" w:cs="Times New Roman"/>
+              </w:rPr>
+              <w:t>by.x</w:t>
+            </w:r>
+            <w:proofErr w:type="spellEnd"/>
+            <w:r>
+              <w:rPr>
+                <w:rFonts w:ascii="Times New Roman" w:eastAsia="Times New Roman" w:hAnsi="Times New Roman" w:cs="Times New Roman"/>
+              </w:rPr>
+              <w:t xml:space="preserve"> and </w:t>
+            </w:r>
+            <w:proofErr w:type="spellStart"/>
+            <w:proofErr w:type="gramStart"/>
+            <w:r>
+              <w:rPr>
+                <w:rFonts w:ascii="Times New Roman" w:eastAsia="Times New Roman" w:hAnsi="Times New Roman" w:cs="Times New Roman"/>
+              </w:rPr>
+              <w:t>by.y</w:t>
+            </w:r>
+            <w:proofErr w:type="spellEnd"/>
+            <w:proofErr w:type="gramEnd"/>
+            <w:r>
+              <w:rPr>
+                <w:rFonts w:ascii="Times New Roman" w:eastAsia="Times New Roman" w:hAnsi="Times New Roman" w:cs="Times New Roman"/>
+              </w:rPr>
+              <w:t xml:space="preserve"> parameters to match your actual column names</w:t>
+            </w:r>
+          </w:p>
+          <w:p>
+            <w:pPr>
+              <w:rPr>
+                <w:rFonts w:ascii="Times New Roman" w:eastAsia="Times New Roman" w:hAnsi="Times New Roman" w:cs="Times New Roman"/>
+              </w:rPr>
+            </w:pPr>
+            <w:r>
+              <w:rPr>
+                <w:rFonts w:ascii="Times New Roman" w:eastAsia="Times New Roman" w:hAnsi="Times New Roman" w:cs="Times New Roman"/>
+              </w:rPr>
+              <w:t xml:space="preserve"># Example assuming drinks has "country" and </w:t>
+            </w:r>
+            <w:proofErr w:type="spellStart"/>
+            <w:r>
+              <w:rPr>
+                <w:rFonts w:ascii="Times New Roman" w:eastAsia="Times New Roman" w:hAnsi="Times New Roman" w:cs="Times New Roman"/>
+              </w:rPr>
+              <w:t>life_exp</w:t>
+            </w:r>
+            <w:proofErr w:type="spellEnd"/>
+            <w:r>
+              <w:rPr>
+                <w:rFonts w:ascii="Times New Roman" w:eastAsia="Times New Roman" w:hAnsi="Times New Roman" w:cs="Times New Roman"/>
+              </w:rPr>
+              <w:t xml:space="preserve"> has "</w:t>
+            </w:r>
+            <w:proofErr w:type="spellStart"/>
+            <w:r>
+              <w:rPr>
+                <w:rFonts w:ascii="Times New Roman" w:eastAsia="Times New Roman" w:hAnsi="Times New Roman" w:cs="Times New Roman"/>
+              </w:rPr>
+              <w:t>CountryDisplay</w:t>
+            </w:r>
+            <w:proofErr w:type="spellEnd"/>
+            <w:r>
+              <w:rPr>
+                <w:rFonts w:ascii="Times New Roman" w:eastAsia="Times New Roman" w:hAnsi="Times New Roman" w:cs="Times New Roman"/>
+              </w:rPr>
+              <w:t>"</w:t>
+            </w:r>
+          </w:p>
+          <w:p>
+            <w:pPr>
+              <w:rPr>
+                <w:rFonts w:ascii="Times New Roman" w:eastAsia="Times New Roman" w:hAnsi="Times New Roman" w:cs="Times New Roman"/>
+              </w:rPr>
+            </w:pPr>
+            <w:proofErr w:type="spellStart"/>
+            <w:r>
+              <w:rPr>
+                <w:rFonts w:ascii="Times New Roman" w:eastAsia="Times New Roman" w:hAnsi="Times New Roman" w:cs="Times New Roman"/>
+              </w:rPr>
+              <w:t>data_merged</w:t>
+            </w:r>
+            <w:proofErr w:type="spellEnd"/>
+            <w:r>
+              <w:rPr>
+                <w:rFonts w:ascii="Times New Roman" w:eastAsia="Times New Roman" w:hAnsi="Times New Roman" w:cs="Times New Roman"/>
+              </w:rPr>
+              <w:t xml:space="preserve"> &lt;- </w:t>
+            </w:r>
+            <w:proofErr w:type="gramStart"/>
+            <w:r>
+              <w:rPr>
+                <w:rFonts w:ascii="Times New Roman" w:eastAsia="Times New Roman" w:hAnsi="Times New Roman" w:cs="Times New Roman"/>
+              </w:rPr>
+              <w:t>merge(</w:t>
+            </w:r>
+            <w:proofErr w:type="gramEnd"/>
+            <w:r>
+              <w:rPr>
+                <w:rFonts w:ascii="Times New Roman" w:eastAsia="Times New Roman" w:hAnsi="Times New Roman" w:cs="Times New Roman"/>
+              </w:rPr>
+              <w:t xml:space="preserve">drinks, </w:t>
+            </w:r>
+            <w:proofErr w:type="spellStart"/>
+            <w:r>
+              <w:rPr>
+                <w:rFonts w:ascii="Times New Roman" w:eastAsia="Times New Roman" w:hAnsi="Times New Roman" w:cs="Times New Roman"/>
+              </w:rPr>
+              <w:t>life_exp</w:t>
+            </w:r>
+            <w:proofErr w:type="spellEnd"/>
+            <w:r>
+              <w:rPr>
+                <w:rFonts w:ascii="Times New Roman" w:eastAsia="Times New Roman" w:hAnsi="Times New Roman" w:cs="Times New Roman"/>
+              </w:rPr>
+              <w:t xml:space="preserve">, </w:t>
+            </w:r>
+            <w:proofErr w:type="spellStart"/>
+            <w:r>
+              <w:rPr>
+                <w:rFonts w:ascii="Times New Roman" w:eastAsia="Times New Roman" w:hAnsi="Times New Roman" w:cs="Times New Roman"/>
+              </w:rPr>
+              <w:t>by.x</w:t>
+            </w:r>
+            <w:proofErr w:type="spellEnd"/>
+            <w:r>
+              <w:rPr>
+                <w:rFonts w:ascii="Times New Roman" w:eastAsia="Times New Roman" w:hAnsi="Times New Roman" w:cs="Times New Roman"/>
+              </w:rPr>
+              <w:t xml:space="preserve"> = "country", </w:t>
+            </w:r>
+            <w:proofErr w:type="spellStart"/>
+            <w:proofErr w:type="gramStart"/>
+            <w:r>
+              <w:rPr>
+                <w:rFonts w:ascii="Times New Roman" w:eastAsia="Times New Roman" w:hAnsi="Times New Roman" w:cs="Times New Roman"/>
+              </w:rPr>
+              <w:t>by.y</w:t>
+            </w:r>
+            <w:proofErr w:type="spellEnd"/>
+            <w:proofErr w:type="gramEnd"/>
+            <w:r>
+              <w:rPr>
+                <w:rFonts w:ascii="Times New Roman" w:eastAsia="Times New Roman" w:hAnsi="Times New Roman" w:cs="Times New Roman"/>
+              </w:rPr>
+              <w:t xml:space="preserve"> = "</w:t>
+            </w:r>
+            <w:proofErr w:type="spellStart"/>
+            <w:r>
+              <w:rPr>
+                <w:rFonts w:ascii="Times New Roman" w:eastAsia="Times New Roman" w:hAnsi="Times New Roman" w:cs="Times New Roman"/>
+              </w:rPr>
+              <w:t>CountryDisplay</w:t>
+            </w:r>
+            <w:proofErr w:type="spellEnd"/>
+            <w:r>
+              <w:rPr>
+                <w:rFonts w:ascii="Times New Roman" w:eastAsia="Times New Roman" w:hAnsi="Times New Roman" w:cs="Times New Roman"/>
+              </w:rPr>
+              <w:t>", all = FALSE)</w:t>
+            </w:r>
+          </w:p>
+          <w:p>
+            <w:pPr>
+              <w:rPr>
+                <w:rFonts w:ascii="Times New Roman" w:eastAsia="Times New Roman" w:hAnsi="Times New Roman" w:cs="Times New Roman"/>
+              </w:rPr>
+            </w:pPr>
+          </w:p>
+          <w:p>
+            <w:pPr>
+              <w:rPr>
+                <w:rFonts w:ascii="Times New Roman" w:eastAsia="Times New Roman" w:hAnsi="Times New Roman" w:cs="Times New Roman"/>
+              </w:rPr>
+            </w:pPr>
+            <w:proofErr w:type="gramStart"/>
+            <w:r>
+              <w:rPr>
+                <w:rFonts w:ascii="Times New Roman" w:eastAsia="Times New Roman" w:hAnsi="Times New Roman" w:cs="Times New Roman"/>
+              </w:rPr>
+              <w:t>cat(</w:t>
+            </w:r>
+            <w:proofErr w:type="gramEnd"/>
+            <w:r>
+              <w:rPr>
+                <w:rFonts w:ascii="Times New Roman" w:eastAsia="Times New Roman" w:hAnsi="Times New Roman" w:cs="Times New Roman"/>
+              </w:rPr>
+              <w:t xml:space="preserve">"Number of countries after merge:", </w:t>
+            </w:r>
+            <w:proofErr w:type="spellStart"/>
+            <w:r>
+              <w:rPr>
+                <w:rFonts w:ascii="Times New Roman" w:eastAsia="Times New Roman" w:hAnsi="Times New Roman" w:cs="Times New Roman"/>
+              </w:rPr>
+              <w:t>nrow</w:t>
+            </w:r>
+            <w:proofErr w:type="spellEnd"/>
+            <w:r>
+              <w:rPr>
+                <w:rFonts w:ascii="Times New Roman" w:eastAsia="Times New Roman" w:hAnsi="Times New Roman" w:cs="Times New Roman"/>
+              </w:rPr>
+              <w:t>(</w:t>
+            </w:r>
+            <w:proofErr w:type="spellStart"/>
+            <w:r>
+              <w:rPr>
+                <w:rFonts w:ascii="Times New Roman" w:eastAsia="Times New Roman" w:hAnsi="Times New Roman" w:cs="Times New Roman"/>
+              </w:rPr>
+              <w:t>data_merged</w:t>
+            </w:r>
+            <w:proofErr w:type="spellEnd"/>
+            <w:r>
+              <w:rPr>
+                <w:rFonts w:ascii="Times New Roman" w:eastAsia="Times New Roman" w:hAnsi="Times New Roman" w:cs="Times New Roman"/>
+              </w:rPr>
+              <w:t>), "\n\n")</w:t>
+            </w:r>
+          </w:p>
+          <w:p>
+            <w:pPr>
+              <w:rPr>
+                <w:rFonts w:ascii="Times New Roman" w:eastAsia="Times New Roman" w:hAnsi="Times New Roman" w:cs="Times New Roman"/>
+              </w:rPr>
+            </w:pPr>
+          </w:p>
+          <w:p>
+            <w:pPr>
+              <w:rPr>
+                <w:rFonts w:ascii="Times New Roman" w:eastAsia="Times New Roman" w:hAnsi="Times New Roman" w:cs="Times New Roman"/>
+              </w:rPr>
+            </w:pPr>
+          </w:p>
+          <w:p>
+            <w:pPr>
+              <w:rPr>
+                <w:rFonts w:ascii="Times New Roman" w:eastAsia="Times New Roman" w:hAnsi="Times New Roman" w:cs="Times New Roman"/>
+              </w:rPr>
+            </w:pPr>
+          </w:p>
+          <w:p>
+            <w:pPr>
+              <w:rPr>
+                <w:rFonts w:ascii="Times New Roman" w:eastAsia="Times New Roman" w:hAnsi="Times New Roman" w:cs="Times New Roman"/>
+              </w:rPr>
+            </w:pPr>
+          </w:p>
+          <w:p>
+            <w:pPr>
+              <w:rPr>
+                <w:rFonts w:ascii="Times New Roman" w:eastAsia="Times New Roman" w:hAnsi="Times New Roman" w:cs="Times New Roman"/>
+              </w:rPr>
+            </w:pPr>
+          </w:p>
+          <w:p>
+            <w:pPr>
+              <w:rPr>
+                <w:rFonts w:ascii="Times New Roman" w:eastAsia="Times New Roman" w:hAnsi="Times New Roman" w:cs="Times New Roman"/>
+              </w:rPr>
+            </w:pPr>
+          </w:p>
+          <w:p>
+            <w:pPr>
+              <w:rPr>
+                <w:rFonts w:ascii="Times New Roman" w:eastAsia="Times New Roman" w:hAnsi="Times New Roman" w:cs="Times New Roman"/>
+              </w:rPr>
+            </w:pPr>
+          </w:p>
+          <w:p>
+            <w:pPr>
+              <w:rPr>
+                <w:rFonts w:ascii="Times New Roman" w:eastAsia="Times New Roman" w:hAnsi="Times New Roman" w:cs="Times New Roman"/>
+              </w:rPr>
+            </w:pPr>
+          </w:p>
+          <w:p>
+            <w:pPr>
+              <w:rPr>
+                <w:rFonts w:ascii="Times New Roman" w:eastAsia="Times New Roman" w:hAnsi="Times New Roman" w:cs="Times New Roman"/>
+              </w:rPr>
+            </w:pPr>
+            <w:r>
+              <w:rPr>
+                <w:rFonts w:ascii="Times New Roman" w:eastAsia="Times New Roman" w:hAnsi="Times New Roman" w:cs="Times New Roman"/>
+              </w:rPr>
+              <w:t># ============================================================================</w:t>
+            </w:r>
+          </w:p>
+          <w:p>
+            <w:pPr>
+              <w:rPr>
+                <w:rFonts w:ascii="Times New Roman" w:eastAsia="Times New Roman" w:hAnsi="Times New Roman" w:cs="Times New Roman"/>
+                <w:b/>
+                <w:bCs/>
+              </w:rPr>
+            </w:pPr>
+            <w:r>
+              <w:rPr>
+                <w:rFonts w:ascii="Times New Roman" w:eastAsia="Times New Roman" w:hAnsi="Times New Roman" w:cs="Times New Roman"/>
+                <w:b/>
+                <w:bCs/>
+              </w:rPr>
+              <w:t># 3. DATA CLEANING AND SELECTION</w:t>
+            </w:r>
+          </w:p>
+          <w:p>
+            <w:pPr>
+              <w:rPr>
+                <w:rFonts w:ascii="Times New Roman" w:eastAsia="Times New Roman" w:hAnsi="Times New Roman" w:cs="Times New Roman"/>
+              </w:rPr>
+            </w:pPr>
+            <w:r>
+              <w:rPr>
+                <w:rFonts w:ascii="Times New Roman" w:eastAsia="Times New Roman" w:hAnsi="Times New Roman" w:cs="Times New Roman"/>
+              </w:rPr>
+              <w:t># ============================================================================</w:t>
+            </w:r>
+          </w:p>
+          <w:p>
+            <w:pPr>
+              <w:rPr>
+                <w:rFonts w:ascii="Times New Roman" w:eastAsia="Times New Roman" w:hAnsi="Times New Roman" w:cs="Times New Roman"/>
+              </w:rPr>
+            </w:pPr>
+            <w:proofErr w:type="spellStart"/>
+            <w:r>
+              <w:rPr>
+                <w:rFonts w:ascii="Times New Roman" w:eastAsia="Times New Roman" w:hAnsi="Times New Roman" w:cs="Times New Roman"/>
+              </w:rPr>
+              <w:t>colnames</w:t>
+            </w:r>
+            <w:proofErr w:type="spellEnd"/>
+            <w:r>
+              <w:rPr>
+                <w:rFonts w:ascii="Times New Roman" w:eastAsia="Times New Roman" w:hAnsi="Times New Roman" w:cs="Times New Roman"/>
+              </w:rPr>
+              <w:t>(</w:t>
+            </w:r>
+            <w:proofErr w:type="spellStart"/>
+            <w:r>
+              <w:rPr>
+                <w:rFonts w:ascii="Times New Roman" w:eastAsia="Times New Roman" w:hAnsi="Times New Roman" w:cs="Times New Roman"/>
+              </w:rPr>
+              <w:t>data_merged</w:t>
+            </w:r>
+            <w:proofErr w:type="spellEnd"/>
+            <w:r>
+              <w:rPr>
+                <w:rFonts w:ascii="Times New Roman" w:eastAsia="Times New Roman" w:hAnsi="Times New Roman" w:cs="Times New Roman"/>
+              </w:rPr>
+              <w:t>)</w:t>
+            </w:r>
+          </w:p>
+          <w:p>
+            <w:pPr>
+              <w:rPr>
+                <w:rFonts w:ascii="Times New Roman" w:eastAsia="Times New Roman" w:hAnsi="Times New Roman" w:cs="Times New Roman"/>
+              </w:rPr>
+            </w:pPr>
+            <w:proofErr w:type="gramStart"/>
+            <w:r>
+              <w:rPr>
+                <w:rFonts w:ascii="Times New Roman" w:eastAsia="Times New Roman" w:hAnsi="Times New Roman" w:cs="Times New Roman"/>
+              </w:rPr>
+              <w:t>cat(</w:t>
+            </w:r>
+            <w:proofErr w:type="gramEnd"/>
+            <w:r>
+              <w:rPr>
+                <w:rFonts w:ascii="Times New Roman" w:eastAsia="Times New Roman" w:hAnsi="Times New Roman" w:cs="Times New Roman"/>
+              </w:rPr>
+              <w:t>"=== DATA CLEANING ===\n\n")</w:t>
+            </w:r>
+          </w:p>
+          <w:p>
+            <w:pPr>
+              <w:rPr>
+                <w:rFonts w:ascii="Times New Roman" w:eastAsia="Times New Roman" w:hAnsi="Times New Roman" w:cs="Times New Roman"/>
+              </w:rPr>
+            </w:pPr>
+          </w:p>
+          <w:p>
+            <w:pPr>
+              <w:rPr>
+                <w:rFonts w:ascii="Times New Roman" w:eastAsia="Times New Roman" w:hAnsi="Times New Roman" w:cs="Times New Roman"/>
+              </w:rPr>
+            </w:pPr>
+            <w:r>
+              <w:rPr>
+                <w:rFonts w:ascii="Times New Roman" w:eastAsia="Times New Roman" w:hAnsi="Times New Roman" w:cs="Times New Roman"/>
+              </w:rPr>
+              <w:t># Remove rows with missing values</w:t>
+            </w:r>
+          </w:p>
+          <w:p>
+            <w:pPr>
+              <w:rPr>
+                <w:rFonts w:ascii="Times New Roman" w:eastAsia="Times New Roman" w:hAnsi="Times New Roman" w:cs="Times New Roman"/>
+              </w:rPr>
+            </w:pPr>
+            <w:proofErr w:type="spellStart"/>
+            <w:r>
+              <w:rPr>
+                <w:rFonts w:ascii="Times New Roman" w:eastAsia="Times New Roman" w:hAnsi="Times New Roman" w:cs="Times New Roman"/>
+              </w:rPr>
+              <w:t>data_clean</w:t>
+            </w:r>
+            <w:proofErr w:type="spellEnd"/>
+            <w:r>
+              <w:rPr>
+                <w:rFonts w:ascii="Times New Roman" w:eastAsia="Times New Roman" w:hAnsi="Times New Roman" w:cs="Times New Roman"/>
+              </w:rPr>
+              <w:t xml:space="preserve"> &lt;- </w:t>
+            </w:r>
+            <w:proofErr w:type="spellStart"/>
+            <w:proofErr w:type="gramStart"/>
+            <w:r>
+              <w:rPr>
+                <w:rFonts w:ascii="Times New Roman" w:eastAsia="Times New Roman" w:hAnsi="Times New Roman" w:cs="Times New Roman"/>
+              </w:rPr>
+              <w:t>na.omit</w:t>
+            </w:r>
+            <w:proofErr w:type="spellEnd"/>
+            <w:proofErr w:type="gramEnd"/>
+            <w:r>
+              <w:rPr>
+                <w:rFonts w:ascii="Times New Roman" w:eastAsia="Times New Roman" w:hAnsi="Times New Roman" w:cs="Times New Roman"/>
+              </w:rPr>
+              <w:t>(</w:t>
+            </w:r>
+            <w:proofErr w:type="spellStart"/>
+            <w:r>
+              <w:rPr>
+                <w:rFonts w:ascii="Times New Roman" w:eastAsia="Times New Roman" w:hAnsi="Times New Roman" w:cs="Times New Roman"/>
+              </w:rPr>
+              <w:t>data_merged</w:t>
+            </w:r>
+            <w:proofErr w:type="spellEnd"/>
+            <w:r>
+              <w:rPr>
+                <w:rFonts w:ascii="Times New Roman" w:eastAsia="Times New Roman" w:hAnsi="Times New Roman" w:cs="Times New Roman"/>
+              </w:rPr>
+              <w:t>)</w:t>
+            </w:r>
+          </w:p>
+          <w:p>
+            <w:pPr>
+              <w:rPr>
+                <w:rFonts w:ascii="Times New Roman" w:eastAsia="Times New Roman" w:hAnsi="Times New Roman" w:cs="Times New Roman"/>
+              </w:rPr>
+            </w:pPr>
+            <w:proofErr w:type="gramStart"/>
+            <w:r>
+              <w:rPr>
+                <w:rFonts w:ascii="Times New Roman" w:eastAsia="Times New Roman" w:hAnsi="Times New Roman" w:cs="Times New Roman"/>
+              </w:rPr>
+              <w:t>cat(</w:t>
+            </w:r>
+            <w:proofErr w:type="gramEnd"/>
+            <w:r>
+              <w:rPr>
+                <w:rFonts w:ascii="Times New Roman" w:eastAsia="Times New Roman" w:hAnsi="Times New Roman" w:cs="Times New Roman"/>
+              </w:rPr>
+              <w:t xml:space="preserve">"Number of countries after removing NA:", </w:t>
+            </w:r>
+            <w:proofErr w:type="spellStart"/>
+            <w:r>
+              <w:rPr>
+                <w:rFonts w:ascii="Times New Roman" w:eastAsia="Times New Roman" w:hAnsi="Times New Roman" w:cs="Times New Roman"/>
+              </w:rPr>
+              <w:t>nrow</w:t>
+            </w:r>
+            <w:proofErr w:type="spellEnd"/>
+            <w:r>
+              <w:rPr>
+                <w:rFonts w:ascii="Times New Roman" w:eastAsia="Times New Roman" w:hAnsi="Times New Roman" w:cs="Times New Roman"/>
+              </w:rPr>
+              <w:t>(</w:t>
+            </w:r>
+            <w:proofErr w:type="spellStart"/>
+            <w:r>
+              <w:rPr>
+                <w:rFonts w:ascii="Times New Roman" w:eastAsia="Times New Roman" w:hAnsi="Times New Roman" w:cs="Times New Roman"/>
+              </w:rPr>
+              <w:t>data_clean</w:t>
+            </w:r>
+            <w:proofErr w:type="spellEnd"/>
+            <w:r>
+              <w:rPr>
+                <w:rFonts w:ascii="Times New Roman" w:eastAsia="Times New Roman" w:hAnsi="Times New Roman" w:cs="Times New Roman"/>
+              </w:rPr>
+              <w:t>), "\n\n")</w:t>
+            </w:r>
+          </w:p>
+          <w:p>
+            <w:pPr>
+              <w:rPr>
+                <w:rFonts w:ascii="Times New Roman" w:eastAsia="Times New Roman" w:hAnsi="Times New Roman" w:cs="Times New Roman"/>
+              </w:rPr>
+            </w:pPr>
+          </w:p>
+          <w:p>
+            <w:pPr>
+              <w:rPr>
+                <w:rFonts w:ascii="Times New Roman" w:eastAsia="Times New Roman" w:hAnsi="Times New Roman" w:cs="Times New Roman"/>
+              </w:rPr>
+            </w:pPr>
+            <w:r>
+              <w:rPr>
+                <w:rFonts w:ascii="Times New Roman" w:eastAsia="Times New Roman" w:hAnsi="Times New Roman" w:cs="Times New Roman"/>
+              </w:rPr>
+              <w:t># Select and rename relevant columns for analysis</w:t>
+            </w:r>
+          </w:p>
+          <w:p>
+            <w:pPr>
+              <w:rPr>
+                <w:rFonts w:ascii="Times New Roman" w:eastAsia="Times New Roman" w:hAnsi="Times New Roman" w:cs="Times New Roman"/>
+              </w:rPr>
+            </w:pPr>
+            <w:r>
+              <w:rPr>
+                <w:rFonts w:ascii="Times New Roman" w:eastAsia="Times New Roman" w:hAnsi="Times New Roman" w:cs="Times New Roman"/>
+              </w:rPr>
+              <w:t xml:space="preserve"># drinks.csv columns: country, </w:t>
+            </w:r>
+            <w:proofErr w:type="spellStart"/>
+            <w:r>
+              <w:rPr>
+                <w:rFonts w:ascii="Times New Roman" w:eastAsia="Times New Roman" w:hAnsi="Times New Roman" w:cs="Times New Roman"/>
+              </w:rPr>
+              <w:t>beer_servings</w:t>
+            </w:r>
+            <w:proofErr w:type="spellEnd"/>
+            <w:r>
+              <w:rPr>
+                <w:rFonts w:ascii="Times New Roman" w:eastAsia="Times New Roman" w:hAnsi="Times New Roman" w:cs="Times New Roman"/>
+              </w:rPr>
+              <w:t xml:space="preserve">, </w:t>
+            </w:r>
+            <w:proofErr w:type="spellStart"/>
+            <w:r>
+              <w:rPr>
+                <w:rFonts w:ascii="Times New Roman" w:eastAsia="Times New Roman" w:hAnsi="Times New Roman" w:cs="Times New Roman"/>
+              </w:rPr>
+              <w:t>spirit_servings</w:t>
+            </w:r>
+            <w:proofErr w:type="spellEnd"/>
+            <w:r>
+              <w:rPr>
+                <w:rFonts w:ascii="Times New Roman" w:eastAsia="Times New Roman" w:hAnsi="Times New Roman" w:cs="Times New Roman"/>
+              </w:rPr>
+              <w:t xml:space="preserve">, </w:t>
+            </w:r>
+            <w:proofErr w:type="spellStart"/>
+            <w:r>
+              <w:rPr>
+                <w:rFonts w:ascii="Times New Roman" w:eastAsia="Times New Roman" w:hAnsi="Times New Roman" w:cs="Times New Roman"/>
+              </w:rPr>
+              <w:t>wine_servings</w:t>
+            </w:r>
+            <w:proofErr w:type="spellEnd"/>
+            <w:r>
+              <w:rPr>
+                <w:rFonts w:ascii="Times New Roman" w:eastAsia="Times New Roman" w:hAnsi="Times New Roman" w:cs="Times New Roman"/>
+              </w:rPr>
+              <w:t xml:space="preserve">, </w:t>
+            </w:r>
+            <w:proofErr w:type="spellStart"/>
+            <w:r>
+              <w:rPr>
+                <w:rFonts w:ascii="Times New Roman" w:eastAsia="Times New Roman" w:hAnsi="Times New Roman" w:cs="Times New Roman"/>
+              </w:rPr>
+              <w:t>total_litres_of_pure_alcohol</w:t>
+            </w:r>
+            <w:proofErr w:type="spellEnd"/>
+          </w:p>
+          <w:p>
+            <w:pPr>
+              <w:rPr>
+                <w:rFonts w:ascii="Times New Roman" w:eastAsia="Times New Roman" w:hAnsi="Times New Roman" w:cs="Times New Roman"/>
+              </w:rPr>
+            </w:pPr>
+            <w:r>
+              <w:rPr>
+                <w:rFonts w:ascii="Times New Roman" w:eastAsia="Times New Roman" w:hAnsi="Times New Roman" w:cs="Times New Roman"/>
+              </w:rPr>
+              <w:t># lifeexpectency.csv has the life expectancy value in the column called "Numeric"</w:t>
+            </w:r>
+          </w:p>
+          <w:p>
+            <w:pPr>
+              <w:rPr>
+                <w:rFonts w:ascii="Times New Roman" w:eastAsia="Times New Roman" w:hAnsi="Times New Roman" w:cs="Times New Roman"/>
+              </w:rPr>
+            </w:pPr>
+          </w:p>
+          <w:p>
+            <w:pPr>
+              <w:rPr>
+                <w:rFonts w:ascii="Times New Roman" w:eastAsia="Times New Roman" w:hAnsi="Times New Roman" w:cs="Times New Roman"/>
+              </w:rPr>
+            </w:pPr>
+            <w:r>
+              <w:rPr>
+                <w:rFonts w:ascii="Times New Roman" w:eastAsia="Times New Roman" w:hAnsi="Times New Roman" w:cs="Times New Roman"/>
+              </w:rPr>
+              <w:t># Select only the columns we need for analysis</w:t>
+            </w:r>
+          </w:p>
+          <w:p>
+            <w:pPr>
+              <w:rPr>
+                <w:rFonts w:ascii="Times New Roman" w:eastAsia="Times New Roman" w:hAnsi="Times New Roman" w:cs="Times New Roman"/>
+              </w:rPr>
+            </w:pPr>
+            <w:proofErr w:type="spellStart"/>
+            <w:r>
+              <w:rPr>
+                <w:rFonts w:ascii="Times New Roman" w:eastAsia="Times New Roman" w:hAnsi="Times New Roman" w:cs="Times New Roman"/>
+              </w:rPr>
+              <w:t>data_clean</w:t>
+            </w:r>
+            <w:proofErr w:type="spellEnd"/>
+            <w:r>
+              <w:rPr>
+                <w:rFonts w:ascii="Times New Roman" w:eastAsia="Times New Roman" w:hAnsi="Times New Roman" w:cs="Times New Roman"/>
+              </w:rPr>
+              <w:t xml:space="preserve"> &lt;- </w:t>
+            </w:r>
+            <w:proofErr w:type="spellStart"/>
+            <w:r>
+              <w:rPr>
+                <w:rFonts w:ascii="Times New Roman" w:eastAsia="Times New Roman" w:hAnsi="Times New Roman" w:cs="Times New Roman"/>
+              </w:rPr>
+              <w:t>data_merged</w:t>
+            </w:r>
+            <w:proofErr w:type="spellEnd"/>
+            <w:r>
+              <w:rPr>
+                <w:rFonts w:ascii="Times New Roman" w:eastAsia="Times New Roman" w:hAnsi="Times New Roman" w:cs="Times New Roman"/>
+              </w:rPr>
+              <w:t xml:space="preserve"> %&gt;%</w:t>
+            </w:r>
+          </w:p>
+          <w:p>
+            <w:pPr>
+              <w:rPr>
+                <w:rFonts w:ascii="Times New Roman" w:eastAsia="Times New Roman" w:hAnsi="Times New Roman" w:cs="Times New Roman"/>
+              </w:rPr>
+            </w:pPr>
+            <w:r>
+              <w:rPr>
+                <w:rFonts w:ascii="Times New Roman" w:eastAsia="Times New Roman" w:hAnsi="Times New Roman" w:cs="Times New Roman"/>
+              </w:rPr>
+              <w:t xml:space="preserve">  </w:t>
+            </w:r>
+            <w:proofErr w:type="gramStart"/>
+            <w:r>
+              <w:rPr>
+                <w:rFonts w:ascii="Times New Roman" w:eastAsia="Times New Roman" w:hAnsi="Times New Roman" w:cs="Times New Roman"/>
+              </w:rPr>
+              <w:t>select(</w:t>
+            </w:r>
+            <w:proofErr w:type="gramEnd"/>
+            <w:r>
+              <w:rPr>
+                <w:rFonts w:ascii="Times New Roman" w:eastAsia="Times New Roman" w:hAnsi="Times New Roman" w:cs="Times New Roman"/>
+              </w:rPr>
+              <w:t xml:space="preserve">country, </w:t>
+            </w:r>
+            <w:proofErr w:type="spellStart"/>
+            <w:r>
+              <w:rPr>
+                <w:rFonts w:ascii="Times New Roman" w:eastAsia="Times New Roman" w:hAnsi="Times New Roman" w:cs="Times New Roman"/>
+              </w:rPr>
+              <w:t>total_litres_of_pure_alcohol</w:t>
+            </w:r>
+            <w:proofErr w:type="spellEnd"/>
+            <w:r>
+              <w:rPr>
+                <w:rFonts w:ascii="Times New Roman" w:eastAsia="Times New Roman" w:hAnsi="Times New Roman" w:cs="Times New Roman"/>
+              </w:rPr>
+              <w:t>, Numeric) %&gt;%</w:t>
+            </w:r>
+          </w:p>
+          <w:p>
+            <w:pPr>
+              <w:rPr>
+                <w:rFonts w:ascii="Times New Roman" w:eastAsia="Times New Roman" w:hAnsi="Times New Roman" w:cs="Times New Roman"/>
+              </w:rPr>
+            </w:pPr>
+            <w:r>
+              <w:rPr>
+                <w:rFonts w:ascii="Times New Roman" w:eastAsia="Times New Roman" w:hAnsi="Times New Roman" w:cs="Times New Roman"/>
+              </w:rPr>
+              <w:t xml:space="preserve">  </w:t>
+            </w:r>
+            <w:proofErr w:type="gramStart"/>
+            <w:r>
+              <w:rPr>
+                <w:rFonts w:ascii="Times New Roman" w:eastAsia="Times New Roman" w:hAnsi="Times New Roman" w:cs="Times New Roman"/>
+              </w:rPr>
+              <w:t>rename(</w:t>
+            </w:r>
+            <w:proofErr w:type="gramEnd"/>
+            <w:r>
+              <w:rPr>
+                <w:rFonts w:ascii="Times New Roman" w:eastAsia="Times New Roman" w:hAnsi="Times New Roman" w:cs="Times New Roman"/>
+              </w:rPr>
+              <w:t>Country = country,</w:t>
+            </w:r>
+          </w:p>
+          <w:p>
+            <w:pPr>
+              <w:rPr>
+                <w:rFonts w:ascii="Times New Roman" w:eastAsia="Times New Roman" w:hAnsi="Times New Roman" w:cs="Times New Roman"/>
+              </w:rPr>
+            </w:pPr>
+            <w:r>
+              <w:rPr>
+                <w:rFonts w:ascii="Times New Roman" w:eastAsia="Times New Roman" w:hAnsi="Times New Roman" w:cs="Times New Roman"/>
+              </w:rPr>
+              <w:t xml:space="preserve">         </w:t>
+            </w:r>
+            <w:proofErr w:type="spellStart"/>
+            <w:r>
+              <w:rPr>
+                <w:rFonts w:ascii="Times New Roman" w:eastAsia="Times New Roman" w:hAnsi="Times New Roman" w:cs="Times New Roman"/>
+              </w:rPr>
+              <w:t>Alcohol_Consumption</w:t>
+            </w:r>
+            <w:proofErr w:type="spellEnd"/>
+            <w:r>
+              <w:rPr>
+                <w:rFonts w:ascii="Times New Roman" w:eastAsia="Times New Roman" w:hAnsi="Times New Roman" w:cs="Times New Roman"/>
+              </w:rPr>
+              <w:t xml:space="preserve"> = </w:t>
+            </w:r>
+            <w:proofErr w:type="spellStart"/>
+            <w:r>
+              <w:rPr>
+                <w:rFonts w:ascii="Times New Roman" w:eastAsia="Times New Roman" w:hAnsi="Times New Roman" w:cs="Times New Roman"/>
+              </w:rPr>
+              <w:t>total_litres_of_pure_alcohol</w:t>
+            </w:r>
+            <w:proofErr w:type="spellEnd"/>
+            <w:r>
+              <w:rPr>
+                <w:rFonts w:ascii="Times New Roman" w:eastAsia="Times New Roman" w:hAnsi="Times New Roman" w:cs="Times New Roman"/>
+              </w:rPr>
+              <w:t>,</w:t>
+            </w:r>
+          </w:p>
+          <w:p>
+            <w:pPr>
+              <w:rPr>
+                <w:rFonts w:ascii="Times New Roman" w:eastAsia="Times New Roman" w:hAnsi="Times New Roman" w:cs="Times New Roman"/>
+              </w:rPr>
+            </w:pPr>
+            <w:r>
+              <w:rPr>
+                <w:rFonts w:ascii="Times New Roman" w:eastAsia="Times New Roman" w:hAnsi="Times New Roman" w:cs="Times New Roman"/>
+              </w:rPr>
+              <w:t xml:space="preserve">         </w:t>
+            </w:r>
+            <w:proofErr w:type="spellStart"/>
+            <w:r>
+              <w:rPr>
+                <w:rFonts w:ascii="Times New Roman" w:eastAsia="Times New Roman" w:hAnsi="Times New Roman" w:cs="Times New Roman"/>
+              </w:rPr>
+              <w:t>Life_Expectancy</w:t>
+            </w:r>
+            <w:proofErr w:type="spellEnd"/>
+            <w:r>
+              <w:rPr>
+                <w:rFonts w:ascii="Times New Roman" w:eastAsia="Times New Roman" w:hAnsi="Times New Roman" w:cs="Times New Roman"/>
+              </w:rPr>
+              <w:t xml:space="preserve"> = Numeric)</w:t>
+            </w:r>
+          </w:p>
+          <w:p>
+            <w:pPr>
+              <w:rPr>
+                <w:rFonts w:ascii="Times New Roman" w:eastAsia="Times New Roman" w:hAnsi="Times New Roman" w:cs="Times New Roman"/>
+              </w:rPr>
+            </w:pPr>
+          </w:p>
+          <w:p>
+            <w:pPr>
+              <w:rPr>
+                <w:rFonts w:ascii="Times New Roman" w:eastAsia="Times New Roman" w:hAnsi="Times New Roman" w:cs="Times New Roman"/>
+              </w:rPr>
+            </w:pPr>
+            <w:r>
+              <w:rPr>
+                <w:rFonts w:ascii="Times New Roman" w:eastAsia="Times New Roman" w:hAnsi="Times New Roman" w:cs="Times New Roman"/>
+              </w:rPr>
+              <w:t># Display final cleaned dataset</w:t>
+            </w:r>
+          </w:p>
+          <w:p>
+            <w:pPr>
+              <w:rPr>
+                <w:rFonts w:ascii="Times New Roman" w:eastAsia="Times New Roman" w:hAnsi="Times New Roman" w:cs="Times New Roman"/>
+              </w:rPr>
+            </w:pPr>
+            <w:proofErr w:type="gramStart"/>
+            <w:r>
+              <w:rPr>
+                <w:rFonts w:ascii="Times New Roman" w:eastAsia="Times New Roman" w:hAnsi="Times New Roman" w:cs="Times New Roman"/>
+              </w:rPr>
+              <w:t>cat(</w:t>
+            </w:r>
+            <w:proofErr w:type="gramEnd"/>
+            <w:r>
+              <w:rPr>
+                <w:rFonts w:ascii="Times New Roman" w:eastAsia="Times New Roman" w:hAnsi="Times New Roman" w:cs="Times New Roman"/>
+              </w:rPr>
+              <w:t>"--- FINAL CLEANED DATASET ---\n")</w:t>
+            </w:r>
+          </w:p>
+          <w:p>
+            <w:pPr>
+              <w:rPr>
+                <w:rFonts w:ascii="Times New Roman" w:eastAsia="Times New Roman" w:hAnsi="Times New Roman" w:cs="Times New Roman"/>
+              </w:rPr>
+            </w:pPr>
+            <w:r>
+              <w:rPr>
+                <w:rFonts w:ascii="Times New Roman" w:eastAsia="Times New Roman" w:hAnsi="Times New Roman" w:cs="Times New Roman"/>
+              </w:rPr>
+              <w:t>str(</w:t>
+            </w:r>
+            <w:proofErr w:type="spellStart"/>
+            <w:r>
+              <w:rPr>
+                <w:rFonts w:ascii="Times New Roman" w:eastAsia="Times New Roman" w:hAnsi="Times New Roman" w:cs="Times New Roman"/>
+              </w:rPr>
+              <w:t>data_clean</w:t>
+            </w:r>
+            <w:proofErr w:type="spellEnd"/>
+            <w:r>
+              <w:rPr>
+                <w:rFonts w:ascii="Times New Roman" w:eastAsia="Times New Roman" w:hAnsi="Times New Roman" w:cs="Times New Roman"/>
+              </w:rPr>
+              <w:t>)</w:t>
+            </w:r>
+          </w:p>
+          <w:p>
+            <w:pPr>
+              <w:rPr>
+                <w:rFonts w:ascii="Times New Roman" w:eastAsia="Times New Roman" w:hAnsi="Times New Roman" w:cs="Times New Roman"/>
+              </w:rPr>
+            </w:pPr>
+            <w:proofErr w:type="gramStart"/>
+            <w:r>
+              <w:rPr>
+                <w:rFonts w:ascii="Times New Roman" w:eastAsia="Times New Roman" w:hAnsi="Times New Roman" w:cs="Times New Roman"/>
+              </w:rPr>
+              <w:t>head(</w:t>
+            </w:r>
+            <w:proofErr w:type="spellStart"/>
+            <w:proofErr w:type="gramEnd"/>
+            <w:r>
+              <w:rPr>
+                <w:rFonts w:ascii="Times New Roman" w:eastAsia="Times New Roman" w:hAnsi="Times New Roman" w:cs="Times New Roman"/>
+              </w:rPr>
+              <w:t>data_clean</w:t>
+            </w:r>
+            <w:proofErr w:type="spellEnd"/>
+            <w:r>
+              <w:rPr>
+                <w:rFonts w:ascii="Times New Roman" w:eastAsia="Times New Roman" w:hAnsi="Times New Roman" w:cs="Times New Roman"/>
+              </w:rPr>
+              <w:t>, 50)</w:t>
+            </w:r>
+          </w:p>
+          <w:p>
+            <w:pPr>
+              <w:rPr>
+                <w:rFonts w:ascii="Times New Roman" w:eastAsia="Times New Roman" w:hAnsi="Times New Roman" w:cs="Times New Roman"/>
+              </w:rPr>
+            </w:pPr>
+          </w:p>
+          <w:p>
+            <w:pPr>
+              <w:rPr>
+                <w:rFonts w:ascii="Times New Roman" w:eastAsia="Times New Roman" w:hAnsi="Times New Roman" w:cs="Times New Roman"/>
+              </w:rPr>
+            </w:pPr>
+            <w:r>
+              <w:rPr>
+                <w:rFonts w:ascii="Times New Roman" w:eastAsia="Times New Roman" w:hAnsi="Times New Roman" w:cs="Times New Roman"/>
+              </w:rPr>
+              <w:t># ============================================================================</w:t>
+            </w:r>
+          </w:p>
+          <w:p>
+            <w:pPr>
+              <w:rPr>
+                <w:rFonts w:ascii="Times New Roman" w:eastAsia="Times New Roman" w:hAnsi="Times New Roman" w:cs="Times New Roman"/>
+                <w:b/>
+                <w:bCs/>
+              </w:rPr>
+            </w:pPr>
+            <w:r>
+              <w:rPr>
+                <w:rFonts w:ascii="Times New Roman" w:eastAsia="Times New Roman" w:hAnsi="Times New Roman" w:cs="Times New Roman"/>
+                <w:b/>
+                <w:bCs/>
+              </w:rPr>
+              <w:t># 4. DESCRIPTIVE STATISTICS</w:t>
+            </w:r>
+          </w:p>
+          <w:p>
+            <w:pPr>
+              <w:rPr>
+                <w:rFonts w:ascii="Times New Roman" w:eastAsia="Times New Roman" w:hAnsi="Times New Roman" w:cs="Times New Roman"/>
+              </w:rPr>
+            </w:pPr>
+            <w:r>
+              <w:rPr>
+                <w:rFonts w:ascii="Times New Roman" w:eastAsia="Times New Roman" w:hAnsi="Times New Roman" w:cs="Times New Roman"/>
+              </w:rPr>
+              <w:t># ============================================================================</w:t>
+            </w:r>
+          </w:p>
+          <w:p>
+            <w:pPr>
+              <w:rPr>
+                <w:rFonts w:ascii="Times New Roman" w:eastAsia="Times New Roman" w:hAnsi="Times New Roman" w:cs="Times New Roman"/>
+              </w:rPr>
+            </w:pPr>
+          </w:p>
+          <w:p>
+            <w:pPr>
+              <w:rPr>
+                <w:rFonts w:ascii="Times New Roman" w:eastAsia="Times New Roman" w:hAnsi="Times New Roman" w:cs="Times New Roman"/>
+              </w:rPr>
+            </w:pPr>
+            <w:proofErr w:type="gramStart"/>
+            <w:r>
+              <w:rPr>
+                <w:rFonts w:ascii="Times New Roman" w:eastAsia="Times New Roman" w:hAnsi="Times New Roman" w:cs="Times New Roman"/>
+              </w:rPr>
+              <w:t>cat(</w:t>
+            </w:r>
+            <w:proofErr w:type="gramEnd"/>
+            <w:r>
+              <w:rPr>
+                <w:rFonts w:ascii="Times New Roman" w:eastAsia="Times New Roman" w:hAnsi="Times New Roman" w:cs="Times New Roman"/>
+              </w:rPr>
+              <w:t>"\n\n=== DESCRIPTIVE STATISTICS ===\n\n")</w:t>
+            </w:r>
+          </w:p>
+          <w:p>
+            <w:pPr>
+              <w:rPr>
+                <w:rFonts w:ascii="Times New Roman" w:eastAsia="Times New Roman" w:hAnsi="Times New Roman" w:cs="Times New Roman"/>
+              </w:rPr>
+            </w:pPr>
+          </w:p>
+          <w:p>
+            <w:pPr>
+              <w:rPr>
+                <w:rFonts w:ascii="Times New Roman" w:eastAsia="Times New Roman" w:hAnsi="Times New Roman" w:cs="Times New Roman"/>
+              </w:rPr>
+            </w:pPr>
+            <w:r>
+              <w:rPr>
+                <w:rFonts w:ascii="Times New Roman" w:eastAsia="Times New Roman" w:hAnsi="Times New Roman" w:cs="Times New Roman"/>
+              </w:rPr>
+              <w:t># Alcohol consumption statistics</w:t>
+            </w:r>
+          </w:p>
+          <w:p>
+            <w:pPr>
+              <w:rPr>
+                <w:rFonts w:ascii="Times New Roman" w:eastAsia="Times New Roman" w:hAnsi="Times New Roman" w:cs="Times New Roman"/>
+              </w:rPr>
+            </w:pPr>
+            <w:proofErr w:type="spellStart"/>
+            <w:r>
+              <w:rPr>
+                <w:rFonts w:ascii="Times New Roman" w:eastAsia="Times New Roman" w:hAnsi="Times New Roman" w:cs="Times New Roman"/>
+              </w:rPr>
+              <w:t>mean_alcohol</w:t>
+            </w:r>
+            <w:proofErr w:type="spellEnd"/>
+            <w:r>
+              <w:rPr>
+                <w:rFonts w:ascii="Times New Roman" w:eastAsia="Times New Roman" w:hAnsi="Times New Roman" w:cs="Times New Roman"/>
+              </w:rPr>
+              <w:t xml:space="preserve"> &lt;- mean(</w:t>
+            </w:r>
+            <w:proofErr w:type="spellStart"/>
+            <w:r>
+              <w:rPr>
+                <w:rFonts w:ascii="Times New Roman" w:eastAsia="Times New Roman" w:hAnsi="Times New Roman" w:cs="Times New Roman"/>
+              </w:rPr>
+              <w:t>data_clean$Alcohol_Consumption</w:t>
+            </w:r>
+            <w:proofErr w:type="spellEnd"/>
+            <w:r>
+              <w:rPr>
+                <w:rFonts w:ascii="Times New Roman" w:eastAsia="Times New Roman" w:hAnsi="Times New Roman" w:cs="Times New Roman"/>
+              </w:rPr>
+              <w:t>)</w:t>
+            </w:r>
+          </w:p>
+          <w:p>
+            <w:pPr>
+              <w:rPr>
+                <w:rFonts w:ascii="Times New Roman" w:eastAsia="Times New Roman" w:hAnsi="Times New Roman" w:cs="Times New Roman"/>
+              </w:rPr>
+            </w:pPr>
+            <w:proofErr w:type="spellStart"/>
+            <w:r>
+              <w:rPr>
+                <w:rFonts w:ascii="Times New Roman" w:eastAsia="Times New Roman" w:hAnsi="Times New Roman" w:cs="Times New Roman"/>
+              </w:rPr>
+              <w:t>sd_alcohol</w:t>
+            </w:r>
+            <w:proofErr w:type="spellEnd"/>
+            <w:r>
+              <w:rPr>
+                <w:rFonts w:ascii="Times New Roman" w:eastAsia="Times New Roman" w:hAnsi="Times New Roman" w:cs="Times New Roman"/>
+              </w:rPr>
+              <w:t xml:space="preserve"> &lt;- </w:t>
+            </w:r>
+            <w:proofErr w:type="spellStart"/>
+            <w:r>
+              <w:rPr>
+                <w:rFonts w:ascii="Times New Roman" w:eastAsia="Times New Roman" w:hAnsi="Times New Roman" w:cs="Times New Roman"/>
+              </w:rPr>
+              <w:t>sd</w:t>
+            </w:r>
+            <w:proofErr w:type="spellEnd"/>
+            <w:r>
+              <w:rPr>
+                <w:rFonts w:ascii="Times New Roman" w:eastAsia="Times New Roman" w:hAnsi="Times New Roman" w:cs="Times New Roman"/>
+              </w:rPr>
+              <w:t>(</w:t>
+            </w:r>
+            <w:proofErr w:type="spellStart"/>
+            <w:r>
+              <w:rPr>
+                <w:rFonts w:ascii="Times New Roman" w:eastAsia="Times New Roman" w:hAnsi="Times New Roman" w:cs="Times New Roman"/>
+              </w:rPr>
+              <w:t>data_clean$Alcohol_Consumption</w:t>
+            </w:r>
+            <w:proofErr w:type="spellEnd"/>
+            <w:r>
+              <w:rPr>
+                <w:rFonts w:ascii="Times New Roman" w:eastAsia="Times New Roman" w:hAnsi="Times New Roman" w:cs="Times New Roman"/>
+              </w:rPr>
+              <w:t>)</w:t>
+            </w:r>
+          </w:p>
+          <w:p>
+            <w:pPr>
+              <w:rPr>
+                <w:rFonts w:ascii="Times New Roman" w:eastAsia="Times New Roman" w:hAnsi="Times New Roman" w:cs="Times New Roman"/>
+              </w:rPr>
+            </w:pPr>
+            <w:proofErr w:type="spellStart"/>
+            <w:r>
+              <w:rPr>
+                <w:rFonts w:ascii="Times New Roman" w:eastAsia="Times New Roman" w:hAnsi="Times New Roman" w:cs="Times New Roman"/>
+              </w:rPr>
+              <w:t>median_alcohol</w:t>
+            </w:r>
+            <w:proofErr w:type="spellEnd"/>
+            <w:r>
+              <w:rPr>
+                <w:rFonts w:ascii="Times New Roman" w:eastAsia="Times New Roman" w:hAnsi="Times New Roman" w:cs="Times New Roman"/>
+              </w:rPr>
+              <w:t xml:space="preserve"> &lt;- median(</w:t>
+            </w:r>
+            <w:proofErr w:type="spellStart"/>
+            <w:r>
+              <w:rPr>
+                <w:rFonts w:ascii="Times New Roman" w:eastAsia="Times New Roman" w:hAnsi="Times New Roman" w:cs="Times New Roman"/>
+              </w:rPr>
+              <w:t>data_clean$Alcohol_Consumption</w:t>
+            </w:r>
+            <w:proofErr w:type="spellEnd"/>
+            <w:r>
+              <w:rPr>
+                <w:rFonts w:ascii="Times New Roman" w:eastAsia="Times New Roman" w:hAnsi="Times New Roman" w:cs="Times New Roman"/>
+              </w:rPr>
+              <w:t>)</w:t>
+            </w:r>
+          </w:p>
+          <w:p>
+            <w:pPr>
+              <w:rPr>
+                <w:rFonts w:ascii="Times New Roman" w:eastAsia="Times New Roman" w:hAnsi="Times New Roman" w:cs="Times New Roman"/>
+              </w:rPr>
+            </w:pPr>
+            <w:proofErr w:type="spellStart"/>
+            <w:r>
+              <w:rPr>
+                <w:rFonts w:ascii="Times New Roman" w:eastAsia="Times New Roman" w:hAnsi="Times New Roman" w:cs="Times New Roman"/>
+              </w:rPr>
+              <w:t>min_alcohol</w:t>
+            </w:r>
+            <w:proofErr w:type="spellEnd"/>
+            <w:r>
+              <w:rPr>
+                <w:rFonts w:ascii="Times New Roman" w:eastAsia="Times New Roman" w:hAnsi="Times New Roman" w:cs="Times New Roman"/>
+              </w:rPr>
+              <w:t xml:space="preserve"> &lt;- min(</w:t>
+            </w:r>
+            <w:proofErr w:type="spellStart"/>
+            <w:r>
+              <w:rPr>
+                <w:rFonts w:ascii="Times New Roman" w:eastAsia="Times New Roman" w:hAnsi="Times New Roman" w:cs="Times New Roman"/>
+              </w:rPr>
+              <w:t>data_clean$Alcohol_Consumption</w:t>
+            </w:r>
+            <w:proofErr w:type="spellEnd"/>
+            <w:r>
+              <w:rPr>
+                <w:rFonts w:ascii="Times New Roman" w:eastAsia="Times New Roman" w:hAnsi="Times New Roman" w:cs="Times New Roman"/>
+              </w:rPr>
+              <w:t>)</w:t>
+            </w:r>
+          </w:p>
+          <w:p>
+            <w:pPr>
+              <w:rPr>
+                <w:rFonts w:ascii="Times New Roman" w:eastAsia="Times New Roman" w:hAnsi="Times New Roman" w:cs="Times New Roman"/>
+              </w:rPr>
+            </w:pPr>
+            <w:proofErr w:type="spellStart"/>
+            <w:r>
+              <w:rPr>
+                <w:rFonts w:ascii="Times New Roman" w:eastAsia="Times New Roman" w:hAnsi="Times New Roman" w:cs="Times New Roman"/>
+              </w:rPr>
+              <w:t>max_alcohol</w:t>
+            </w:r>
+            <w:proofErr w:type="spellEnd"/>
+            <w:r>
+              <w:rPr>
+                <w:rFonts w:ascii="Times New Roman" w:eastAsia="Times New Roman" w:hAnsi="Times New Roman" w:cs="Times New Roman"/>
+              </w:rPr>
+              <w:t xml:space="preserve"> &lt;- max(</w:t>
+            </w:r>
+            <w:proofErr w:type="spellStart"/>
+            <w:r>
+              <w:rPr>
+                <w:rFonts w:ascii="Times New Roman" w:eastAsia="Times New Roman" w:hAnsi="Times New Roman" w:cs="Times New Roman"/>
+              </w:rPr>
+              <w:t>data_clean$Alcohol_Consumption</w:t>
+            </w:r>
+            <w:proofErr w:type="spellEnd"/>
+            <w:r>
+              <w:rPr>
+                <w:rFonts w:ascii="Times New Roman" w:eastAsia="Times New Roman" w:hAnsi="Times New Roman" w:cs="Times New Roman"/>
+              </w:rPr>
+              <w:t>)</w:t>
+            </w:r>
+          </w:p>
+          <w:p>
+            <w:pPr>
+              <w:rPr>
+                <w:rFonts w:ascii="Times New Roman" w:eastAsia="Times New Roman" w:hAnsi="Times New Roman" w:cs="Times New Roman"/>
+              </w:rPr>
+            </w:pPr>
+          </w:p>
+          <w:p>
+            <w:pPr>
+              <w:rPr>
+                <w:rFonts w:ascii="Times New Roman" w:eastAsia="Times New Roman" w:hAnsi="Times New Roman" w:cs="Times New Roman"/>
+              </w:rPr>
+            </w:pPr>
+            <w:proofErr w:type="gramStart"/>
+            <w:r>
+              <w:rPr>
+                <w:rFonts w:ascii="Times New Roman" w:eastAsia="Times New Roman" w:hAnsi="Times New Roman" w:cs="Times New Roman"/>
+              </w:rPr>
+              <w:t>cat(</w:t>
+            </w:r>
+            <w:proofErr w:type="gramEnd"/>
+            <w:r>
+              <w:rPr>
+                <w:rFonts w:ascii="Times New Roman" w:eastAsia="Times New Roman" w:hAnsi="Times New Roman" w:cs="Times New Roman"/>
+              </w:rPr>
+              <w:t>"--- ALCOHOL CONSUMPTION (litres per capita) ---\n")</w:t>
+            </w:r>
+          </w:p>
+          <w:p>
+            <w:pPr>
+              <w:rPr>
+                <w:rFonts w:ascii="Times New Roman" w:eastAsia="Times New Roman" w:hAnsi="Times New Roman" w:cs="Times New Roman"/>
+              </w:rPr>
+            </w:pPr>
+            <w:proofErr w:type="gramStart"/>
+            <w:r>
+              <w:rPr>
+                <w:rFonts w:ascii="Times New Roman" w:eastAsia="Times New Roman" w:hAnsi="Times New Roman" w:cs="Times New Roman"/>
+              </w:rPr>
+              <w:lastRenderedPageBreak/>
+              <w:t>cat(</w:t>
+            </w:r>
+            <w:proofErr w:type="gramEnd"/>
+            <w:r>
+              <w:rPr>
+                <w:rFonts w:ascii="Times New Roman" w:eastAsia="Times New Roman" w:hAnsi="Times New Roman" w:cs="Times New Roman"/>
+              </w:rPr>
+              <w:t xml:space="preserve">"Mean:   ", </w:t>
+            </w:r>
+            <w:proofErr w:type="gramStart"/>
+            <w:r>
+              <w:rPr>
+                <w:rFonts w:ascii="Times New Roman" w:eastAsia="Times New Roman" w:hAnsi="Times New Roman" w:cs="Times New Roman"/>
+              </w:rPr>
+              <w:t>round(</w:t>
+            </w:r>
+            <w:proofErr w:type="spellStart"/>
+            <w:proofErr w:type="gramEnd"/>
+            <w:r>
+              <w:rPr>
+                <w:rFonts w:ascii="Times New Roman" w:eastAsia="Times New Roman" w:hAnsi="Times New Roman" w:cs="Times New Roman"/>
+              </w:rPr>
+              <w:t>mean_alcohol</w:t>
+            </w:r>
+            <w:proofErr w:type="spellEnd"/>
+            <w:r>
+              <w:rPr>
+                <w:rFonts w:ascii="Times New Roman" w:eastAsia="Times New Roman" w:hAnsi="Times New Roman" w:cs="Times New Roman"/>
+              </w:rPr>
+              <w:t>, 2), "\n")</w:t>
+            </w:r>
+          </w:p>
+          <w:p>
+            <w:pPr>
+              <w:rPr>
+                <w:rFonts w:ascii="Times New Roman" w:eastAsia="Times New Roman" w:hAnsi="Times New Roman" w:cs="Times New Roman"/>
+              </w:rPr>
+            </w:pPr>
+            <w:proofErr w:type="gramStart"/>
+            <w:r>
+              <w:rPr>
+                <w:rFonts w:ascii="Times New Roman" w:eastAsia="Times New Roman" w:hAnsi="Times New Roman" w:cs="Times New Roman"/>
+              </w:rPr>
+              <w:t>cat(</w:t>
+            </w:r>
+            <w:proofErr w:type="gramEnd"/>
+            <w:r>
+              <w:rPr>
+                <w:rFonts w:ascii="Times New Roman" w:eastAsia="Times New Roman" w:hAnsi="Times New Roman" w:cs="Times New Roman"/>
+              </w:rPr>
+              <w:t xml:space="preserve">"SD:     ", </w:t>
+            </w:r>
+            <w:proofErr w:type="gramStart"/>
+            <w:r>
+              <w:rPr>
+                <w:rFonts w:ascii="Times New Roman" w:eastAsia="Times New Roman" w:hAnsi="Times New Roman" w:cs="Times New Roman"/>
+              </w:rPr>
+              <w:t>round(</w:t>
+            </w:r>
+            <w:proofErr w:type="spellStart"/>
+            <w:proofErr w:type="gramEnd"/>
+            <w:r>
+              <w:rPr>
+                <w:rFonts w:ascii="Times New Roman" w:eastAsia="Times New Roman" w:hAnsi="Times New Roman" w:cs="Times New Roman"/>
+              </w:rPr>
+              <w:t>sd_alcohol</w:t>
+            </w:r>
+            <w:proofErr w:type="spellEnd"/>
+            <w:r>
+              <w:rPr>
+                <w:rFonts w:ascii="Times New Roman" w:eastAsia="Times New Roman" w:hAnsi="Times New Roman" w:cs="Times New Roman"/>
+              </w:rPr>
+              <w:t>, 2), "\n")</w:t>
+            </w:r>
+          </w:p>
+          <w:p>
+            <w:pPr>
+              <w:rPr>
+                <w:rFonts w:ascii="Times New Roman" w:eastAsia="Times New Roman" w:hAnsi="Times New Roman" w:cs="Times New Roman"/>
+              </w:rPr>
+            </w:pPr>
+            <w:proofErr w:type="gramStart"/>
+            <w:r>
+              <w:rPr>
+                <w:rFonts w:ascii="Times New Roman" w:eastAsia="Times New Roman" w:hAnsi="Times New Roman" w:cs="Times New Roman"/>
+              </w:rPr>
+              <w:t>cat(</w:t>
+            </w:r>
+            <w:proofErr w:type="gramEnd"/>
+            <w:r>
+              <w:rPr>
+                <w:rFonts w:ascii="Times New Roman" w:eastAsia="Times New Roman" w:hAnsi="Times New Roman" w:cs="Times New Roman"/>
+              </w:rPr>
+              <w:t xml:space="preserve">"Median: ", </w:t>
+            </w:r>
+            <w:proofErr w:type="gramStart"/>
+            <w:r>
+              <w:rPr>
+                <w:rFonts w:ascii="Times New Roman" w:eastAsia="Times New Roman" w:hAnsi="Times New Roman" w:cs="Times New Roman"/>
+              </w:rPr>
+              <w:t>round(</w:t>
+            </w:r>
+            <w:proofErr w:type="spellStart"/>
+            <w:proofErr w:type="gramEnd"/>
+            <w:r>
+              <w:rPr>
+                <w:rFonts w:ascii="Times New Roman" w:eastAsia="Times New Roman" w:hAnsi="Times New Roman" w:cs="Times New Roman"/>
+              </w:rPr>
+              <w:t>median_alcohol</w:t>
+            </w:r>
+            <w:proofErr w:type="spellEnd"/>
+            <w:r>
+              <w:rPr>
+                <w:rFonts w:ascii="Times New Roman" w:eastAsia="Times New Roman" w:hAnsi="Times New Roman" w:cs="Times New Roman"/>
+              </w:rPr>
+              <w:t>, 2), "\n")</w:t>
+            </w:r>
+          </w:p>
+          <w:p>
+            <w:pPr>
+              <w:rPr>
+                <w:rFonts w:ascii="Times New Roman" w:eastAsia="Times New Roman" w:hAnsi="Times New Roman" w:cs="Times New Roman"/>
+              </w:rPr>
+            </w:pPr>
+            <w:proofErr w:type="gramStart"/>
+            <w:r>
+              <w:rPr>
+                <w:rFonts w:ascii="Times New Roman" w:eastAsia="Times New Roman" w:hAnsi="Times New Roman" w:cs="Times New Roman"/>
+              </w:rPr>
+              <w:t>cat(</w:t>
+            </w:r>
+            <w:proofErr w:type="gramEnd"/>
+            <w:r>
+              <w:rPr>
+                <w:rFonts w:ascii="Times New Roman" w:eastAsia="Times New Roman" w:hAnsi="Times New Roman" w:cs="Times New Roman"/>
+              </w:rPr>
+              <w:t xml:space="preserve">"Min:    ", </w:t>
+            </w:r>
+            <w:proofErr w:type="gramStart"/>
+            <w:r>
+              <w:rPr>
+                <w:rFonts w:ascii="Times New Roman" w:eastAsia="Times New Roman" w:hAnsi="Times New Roman" w:cs="Times New Roman"/>
+              </w:rPr>
+              <w:t>round(</w:t>
+            </w:r>
+            <w:proofErr w:type="spellStart"/>
+            <w:proofErr w:type="gramEnd"/>
+            <w:r>
+              <w:rPr>
+                <w:rFonts w:ascii="Times New Roman" w:eastAsia="Times New Roman" w:hAnsi="Times New Roman" w:cs="Times New Roman"/>
+              </w:rPr>
+              <w:t>min_alcohol</w:t>
+            </w:r>
+            <w:proofErr w:type="spellEnd"/>
+            <w:r>
+              <w:rPr>
+                <w:rFonts w:ascii="Times New Roman" w:eastAsia="Times New Roman" w:hAnsi="Times New Roman" w:cs="Times New Roman"/>
+              </w:rPr>
+              <w:t>, 2), "\n")</w:t>
+            </w:r>
+          </w:p>
+          <w:p>
+            <w:pPr>
+              <w:rPr>
+                <w:rFonts w:ascii="Times New Roman" w:eastAsia="Times New Roman" w:hAnsi="Times New Roman" w:cs="Times New Roman"/>
+              </w:rPr>
+            </w:pPr>
+            <w:proofErr w:type="gramStart"/>
+            <w:r>
+              <w:rPr>
+                <w:rFonts w:ascii="Times New Roman" w:eastAsia="Times New Roman" w:hAnsi="Times New Roman" w:cs="Times New Roman"/>
+              </w:rPr>
+              <w:t>cat(</w:t>
+            </w:r>
+            <w:proofErr w:type="gramEnd"/>
+            <w:r>
+              <w:rPr>
+                <w:rFonts w:ascii="Times New Roman" w:eastAsia="Times New Roman" w:hAnsi="Times New Roman" w:cs="Times New Roman"/>
+              </w:rPr>
+              <w:t xml:space="preserve">"Max:    ", </w:t>
+            </w:r>
+            <w:proofErr w:type="gramStart"/>
+            <w:r>
+              <w:rPr>
+                <w:rFonts w:ascii="Times New Roman" w:eastAsia="Times New Roman" w:hAnsi="Times New Roman" w:cs="Times New Roman"/>
+              </w:rPr>
+              <w:t>round(</w:t>
+            </w:r>
+            <w:proofErr w:type="spellStart"/>
+            <w:proofErr w:type="gramEnd"/>
+            <w:r>
+              <w:rPr>
+                <w:rFonts w:ascii="Times New Roman" w:eastAsia="Times New Roman" w:hAnsi="Times New Roman" w:cs="Times New Roman"/>
+              </w:rPr>
+              <w:t>max_alcohol</w:t>
+            </w:r>
+            <w:proofErr w:type="spellEnd"/>
+            <w:r>
+              <w:rPr>
+                <w:rFonts w:ascii="Times New Roman" w:eastAsia="Times New Roman" w:hAnsi="Times New Roman" w:cs="Times New Roman"/>
+              </w:rPr>
+              <w:t>, 2), "\n\n")</w:t>
+            </w:r>
+          </w:p>
+          <w:p>
+            <w:pPr>
+              <w:rPr>
+                <w:rFonts w:ascii="Times New Roman" w:eastAsia="Times New Roman" w:hAnsi="Times New Roman" w:cs="Times New Roman"/>
+              </w:rPr>
+            </w:pPr>
+          </w:p>
+          <w:p>
+            <w:pPr>
+              <w:rPr>
+                <w:rFonts w:ascii="Times New Roman" w:eastAsia="Times New Roman" w:hAnsi="Times New Roman" w:cs="Times New Roman"/>
+              </w:rPr>
+            </w:pPr>
+            <w:r>
+              <w:rPr>
+                <w:rFonts w:ascii="Times New Roman" w:eastAsia="Times New Roman" w:hAnsi="Times New Roman" w:cs="Times New Roman"/>
+              </w:rPr>
+              <w:t># Life expectancy statistics</w:t>
+            </w:r>
+          </w:p>
+          <w:p>
+            <w:pPr>
+              <w:rPr>
+                <w:rFonts w:ascii="Times New Roman" w:eastAsia="Times New Roman" w:hAnsi="Times New Roman" w:cs="Times New Roman"/>
+              </w:rPr>
+            </w:pPr>
+            <w:proofErr w:type="spellStart"/>
+            <w:r>
+              <w:rPr>
+                <w:rFonts w:ascii="Times New Roman" w:eastAsia="Times New Roman" w:hAnsi="Times New Roman" w:cs="Times New Roman"/>
+              </w:rPr>
+              <w:t>mean_life_exp</w:t>
+            </w:r>
+            <w:proofErr w:type="spellEnd"/>
+            <w:r>
+              <w:rPr>
+                <w:rFonts w:ascii="Times New Roman" w:eastAsia="Times New Roman" w:hAnsi="Times New Roman" w:cs="Times New Roman"/>
+              </w:rPr>
+              <w:t xml:space="preserve"> &lt;- mean(</w:t>
+            </w:r>
+            <w:proofErr w:type="spellStart"/>
+            <w:r>
+              <w:rPr>
+                <w:rFonts w:ascii="Times New Roman" w:eastAsia="Times New Roman" w:hAnsi="Times New Roman" w:cs="Times New Roman"/>
+              </w:rPr>
+              <w:t>data_clean$Life_Expectancy</w:t>
+            </w:r>
+            <w:proofErr w:type="spellEnd"/>
+            <w:r>
+              <w:rPr>
+                <w:rFonts w:ascii="Times New Roman" w:eastAsia="Times New Roman" w:hAnsi="Times New Roman" w:cs="Times New Roman"/>
+              </w:rPr>
+              <w:t>)</w:t>
+            </w:r>
+          </w:p>
+          <w:p>
+            <w:pPr>
+              <w:rPr>
+                <w:rFonts w:ascii="Times New Roman" w:eastAsia="Times New Roman" w:hAnsi="Times New Roman" w:cs="Times New Roman"/>
+              </w:rPr>
+            </w:pPr>
+            <w:proofErr w:type="spellStart"/>
+            <w:r>
+              <w:rPr>
+                <w:rFonts w:ascii="Times New Roman" w:eastAsia="Times New Roman" w:hAnsi="Times New Roman" w:cs="Times New Roman"/>
+              </w:rPr>
+              <w:t>sd_life_exp</w:t>
+            </w:r>
+            <w:proofErr w:type="spellEnd"/>
+            <w:r>
+              <w:rPr>
+                <w:rFonts w:ascii="Times New Roman" w:eastAsia="Times New Roman" w:hAnsi="Times New Roman" w:cs="Times New Roman"/>
+              </w:rPr>
+              <w:t xml:space="preserve"> &lt;- </w:t>
+            </w:r>
+            <w:proofErr w:type="spellStart"/>
+            <w:r>
+              <w:rPr>
+                <w:rFonts w:ascii="Times New Roman" w:eastAsia="Times New Roman" w:hAnsi="Times New Roman" w:cs="Times New Roman"/>
+              </w:rPr>
+              <w:t>sd</w:t>
+            </w:r>
+            <w:proofErr w:type="spellEnd"/>
+            <w:r>
+              <w:rPr>
+                <w:rFonts w:ascii="Times New Roman" w:eastAsia="Times New Roman" w:hAnsi="Times New Roman" w:cs="Times New Roman"/>
+              </w:rPr>
+              <w:t>(</w:t>
+            </w:r>
+            <w:proofErr w:type="spellStart"/>
+            <w:r>
+              <w:rPr>
+                <w:rFonts w:ascii="Times New Roman" w:eastAsia="Times New Roman" w:hAnsi="Times New Roman" w:cs="Times New Roman"/>
+              </w:rPr>
+              <w:t>data_clean$Life_Expectancy</w:t>
+            </w:r>
+            <w:proofErr w:type="spellEnd"/>
+            <w:r>
+              <w:rPr>
+                <w:rFonts w:ascii="Times New Roman" w:eastAsia="Times New Roman" w:hAnsi="Times New Roman" w:cs="Times New Roman"/>
+              </w:rPr>
+              <w:t>)</w:t>
+            </w:r>
+          </w:p>
+          <w:p>
+            <w:pPr>
+              <w:rPr>
+                <w:rFonts w:ascii="Times New Roman" w:eastAsia="Times New Roman" w:hAnsi="Times New Roman" w:cs="Times New Roman"/>
+              </w:rPr>
+            </w:pPr>
+            <w:proofErr w:type="spellStart"/>
+            <w:r>
+              <w:rPr>
+                <w:rFonts w:ascii="Times New Roman" w:eastAsia="Times New Roman" w:hAnsi="Times New Roman" w:cs="Times New Roman"/>
+              </w:rPr>
+              <w:t>median_life_exp</w:t>
+            </w:r>
+            <w:proofErr w:type="spellEnd"/>
+            <w:r>
+              <w:rPr>
+                <w:rFonts w:ascii="Times New Roman" w:eastAsia="Times New Roman" w:hAnsi="Times New Roman" w:cs="Times New Roman"/>
+              </w:rPr>
+              <w:t xml:space="preserve"> &lt;- median(</w:t>
+            </w:r>
+            <w:proofErr w:type="spellStart"/>
+            <w:r>
+              <w:rPr>
+                <w:rFonts w:ascii="Times New Roman" w:eastAsia="Times New Roman" w:hAnsi="Times New Roman" w:cs="Times New Roman"/>
+              </w:rPr>
+              <w:t>data_clean$Life_Expectancy</w:t>
+            </w:r>
+            <w:proofErr w:type="spellEnd"/>
+            <w:r>
+              <w:rPr>
+                <w:rFonts w:ascii="Times New Roman" w:eastAsia="Times New Roman" w:hAnsi="Times New Roman" w:cs="Times New Roman"/>
+              </w:rPr>
+              <w:t>)</w:t>
+            </w:r>
+          </w:p>
+          <w:p>
+            <w:pPr>
+              <w:rPr>
+                <w:rFonts w:ascii="Times New Roman" w:eastAsia="Times New Roman" w:hAnsi="Times New Roman" w:cs="Times New Roman"/>
+              </w:rPr>
+            </w:pPr>
+            <w:proofErr w:type="spellStart"/>
+            <w:r>
+              <w:rPr>
+                <w:rFonts w:ascii="Times New Roman" w:eastAsia="Times New Roman" w:hAnsi="Times New Roman" w:cs="Times New Roman"/>
+              </w:rPr>
+              <w:t>min_life_exp</w:t>
+            </w:r>
+            <w:proofErr w:type="spellEnd"/>
+            <w:r>
+              <w:rPr>
+                <w:rFonts w:ascii="Times New Roman" w:eastAsia="Times New Roman" w:hAnsi="Times New Roman" w:cs="Times New Roman"/>
+              </w:rPr>
+              <w:t xml:space="preserve"> &lt;- min(</w:t>
+            </w:r>
+            <w:proofErr w:type="spellStart"/>
+            <w:r>
+              <w:rPr>
+                <w:rFonts w:ascii="Times New Roman" w:eastAsia="Times New Roman" w:hAnsi="Times New Roman" w:cs="Times New Roman"/>
+              </w:rPr>
+              <w:t>data_clean$Life_Expectancy</w:t>
+            </w:r>
+            <w:proofErr w:type="spellEnd"/>
+            <w:r>
+              <w:rPr>
+                <w:rFonts w:ascii="Times New Roman" w:eastAsia="Times New Roman" w:hAnsi="Times New Roman" w:cs="Times New Roman"/>
+              </w:rPr>
+              <w:t>)</w:t>
+            </w:r>
+          </w:p>
+          <w:p>
+            <w:pPr>
+              <w:rPr>
+                <w:rFonts w:ascii="Times New Roman" w:eastAsia="Times New Roman" w:hAnsi="Times New Roman" w:cs="Times New Roman"/>
+              </w:rPr>
+            </w:pPr>
+            <w:proofErr w:type="spellStart"/>
+            <w:r>
+              <w:rPr>
+                <w:rFonts w:ascii="Times New Roman" w:eastAsia="Times New Roman" w:hAnsi="Times New Roman" w:cs="Times New Roman"/>
+              </w:rPr>
+              <w:t>max_life_exp</w:t>
+            </w:r>
+            <w:proofErr w:type="spellEnd"/>
+            <w:r>
+              <w:rPr>
+                <w:rFonts w:ascii="Times New Roman" w:eastAsia="Times New Roman" w:hAnsi="Times New Roman" w:cs="Times New Roman"/>
+              </w:rPr>
+              <w:t xml:space="preserve"> &lt;- max(</w:t>
+            </w:r>
+            <w:proofErr w:type="spellStart"/>
+            <w:r>
+              <w:rPr>
+                <w:rFonts w:ascii="Times New Roman" w:eastAsia="Times New Roman" w:hAnsi="Times New Roman" w:cs="Times New Roman"/>
+              </w:rPr>
+              <w:t>data_clean$Life_Expectancy</w:t>
+            </w:r>
+            <w:proofErr w:type="spellEnd"/>
+            <w:r>
+              <w:rPr>
+                <w:rFonts w:ascii="Times New Roman" w:eastAsia="Times New Roman" w:hAnsi="Times New Roman" w:cs="Times New Roman"/>
+              </w:rPr>
+              <w:t>)</w:t>
+            </w:r>
+          </w:p>
+          <w:p>
+            <w:pPr>
+              <w:rPr>
+                <w:rFonts w:ascii="Times New Roman" w:eastAsia="Times New Roman" w:hAnsi="Times New Roman" w:cs="Times New Roman"/>
+              </w:rPr>
+            </w:pPr>
+          </w:p>
+          <w:p>
+            <w:pPr>
+              <w:rPr>
+                <w:rFonts w:ascii="Times New Roman" w:eastAsia="Times New Roman" w:hAnsi="Times New Roman" w:cs="Times New Roman"/>
+              </w:rPr>
+            </w:pPr>
+            <w:proofErr w:type="gramStart"/>
+            <w:r>
+              <w:rPr>
+                <w:rFonts w:ascii="Times New Roman" w:eastAsia="Times New Roman" w:hAnsi="Times New Roman" w:cs="Times New Roman"/>
+              </w:rPr>
+              <w:t>cat(</w:t>
+            </w:r>
+            <w:proofErr w:type="gramEnd"/>
+            <w:r>
+              <w:rPr>
+                <w:rFonts w:ascii="Times New Roman" w:eastAsia="Times New Roman" w:hAnsi="Times New Roman" w:cs="Times New Roman"/>
+              </w:rPr>
+              <w:t>"--- LIFE EXPECTANCY (years) ---\n")</w:t>
+            </w:r>
+          </w:p>
+          <w:p>
+            <w:pPr>
+              <w:rPr>
+                <w:rFonts w:ascii="Times New Roman" w:eastAsia="Times New Roman" w:hAnsi="Times New Roman" w:cs="Times New Roman"/>
+              </w:rPr>
+            </w:pPr>
+            <w:proofErr w:type="gramStart"/>
+            <w:r>
+              <w:rPr>
+                <w:rFonts w:ascii="Times New Roman" w:eastAsia="Times New Roman" w:hAnsi="Times New Roman" w:cs="Times New Roman"/>
+              </w:rPr>
+              <w:t>cat(</w:t>
+            </w:r>
+            <w:proofErr w:type="gramEnd"/>
+            <w:r>
+              <w:rPr>
+                <w:rFonts w:ascii="Times New Roman" w:eastAsia="Times New Roman" w:hAnsi="Times New Roman" w:cs="Times New Roman"/>
+              </w:rPr>
+              <w:t xml:space="preserve">"Mean:   ", </w:t>
+            </w:r>
+            <w:proofErr w:type="gramStart"/>
+            <w:r>
+              <w:rPr>
+                <w:rFonts w:ascii="Times New Roman" w:eastAsia="Times New Roman" w:hAnsi="Times New Roman" w:cs="Times New Roman"/>
+              </w:rPr>
+              <w:t>round(</w:t>
+            </w:r>
+            <w:proofErr w:type="spellStart"/>
+            <w:proofErr w:type="gramEnd"/>
+            <w:r>
+              <w:rPr>
+                <w:rFonts w:ascii="Times New Roman" w:eastAsia="Times New Roman" w:hAnsi="Times New Roman" w:cs="Times New Roman"/>
+              </w:rPr>
+              <w:t>mean_life_exp</w:t>
+            </w:r>
+            <w:proofErr w:type="spellEnd"/>
+            <w:r>
+              <w:rPr>
+                <w:rFonts w:ascii="Times New Roman" w:eastAsia="Times New Roman" w:hAnsi="Times New Roman" w:cs="Times New Roman"/>
+              </w:rPr>
+              <w:t>, 2), "\n")</w:t>
+            </w:r>
+          </w:p>
+          <w:p>
+            <w:pPr>
+              <w:rPr>
+                <w:rFonts w:ascii="Times New Roman" w:eastAsia="Times New Roman" w:hAnsi="Times New Roman" w:cs="Times New Roman"/>
+              </w:rPr>
+            </w:pPr>
+            <w:proofErr w:type="gramStart"/>
+            <w:r>
+              <w:rPr>
+                <w:rFonts w:ascii="Times New Roman" w:eastAsia="Times New Roman" w:hAnsi="Times New Roman" w:cs="Times New Roman"/>
+              </w:rPr>
+              <w:t>cat(</w:t>
+            </w:r>
+            <w:proofErr w:type="gramEnd"/>
+            <w:r>
+              <w:rPr>
+                <w:rFonts w:ascii="Times New Roman" w:eastAsia="Times New Roman" w:hAnsi="Times New Roman" w:cs="Times New Roman"/>
+              </w:rPr>
+              <w:t xml:space="preserve">"SD:     ", </w:t>
+            </w:r>
+            <w:proofErr w:type="gramStart"/>
+            <w:r>
+              <w:rPr>
+                <w:rFonts w:ascii="Times New Roman" w:eastAsia="Times New Roman" w:hAnsi="Times New Roman" w:cs="Times New Roman"/>
+              </w:rPr>
+              <w:t>round(</w:t>
+            </w:r>
+            <w:proofErr w:type="spellStart"/>
+            <w:proofErr w:type="gramEnd"/>
+            <w:r>
+              <w:rPr>
+                <w:rFonts w:ascii="Times New Roman" w:eastAsia="Times New Roman" w:hAnsi="Times New Roman" w:cs="Times New Roman"/>
+              </w:rPr>
+              <w:t>sd_life_exp</w:t>
+            </w:r>
+            <w:proofErr w:type="spellEnd"/>
+            <w:r>
+              <w:rPr>
+                <w:rFonts w:ascii="Times New Roman" w:eastAsia="Times New Roman" w:hAnsi="Times New Roman" w:cs="Times New Roman"/>
+              </w:rPr>
+              <w:t>, 2), "\n")</w:t>
+            </w:r>
+          </w:p>
+          <w:p>
+            <w:pPr>
+              <w:rPr>
+                <w:rFonts w:ascii="Times New Roman" w:eastAsia="Times New Roman" w:hAnsi="Times New Roman" w:cs="Times New Roman"/>
+              </w:rPr>
+            </w:pPr>
+            <w:proofErr w:type="gramStart"/>
+            <w:r>
+              <w:rPr>
+                <w:rFonts w:ascii="Times New Roman" w:eastAsia="Times New Roman" w:hAnsi="Times New Roman" w:cs="Times New Roman"/>
+              </w:rPr>
+              <w:t>cat(</w:t>
+            </w:r>
+            <w:proofErr w:type="gramEnd"/>
+            <w:r>
+              <w:rPr>
+                <w:rFonts w:ascii="Times New Roman" w:eastAsia="Times New Roman" w:hAnsi="Times New Roman" w:cs="Times New Roman"/>
+              </w:rPr>
+              <w:t xml:space="preserve">"Median: ", </w:t>
+            </w:r>
+            <w:proofErr w:type="gramStart"/>
+            <w:r>
+              <w:rPr>
+                <w:rFonts w:ascii="Times New Roman" w:eastAsia="Times New Roman" w:hAnsi="Times New Roman" w:cs="Times New Roman"/>
+              </w:rPr>
+              <w:t>round(</w:t>
+            </w:r>
+            <w:proofErr w:type="spellStart"/>
+            <w:proofErr w:type="gramEnd"/>
+            <w:r>
+              <w:rPr>
+                <w:rFonts w:ascii="Times New Roman" w:eastAsia="Times New Roman" w:hAnsi="Times New Roman" w:cs="Times New Roman"/>
+              </w:rPr>
+              <w:t>median_life_exp</w:t>
+            </w:r>
+            <w:proofErr w:type="spellEnd"/>
+            <w:r>
+              <w:rPr>
+                <w:rFonts w:ascii="Times New Roman" w:eastAsia="Times New Roman" w:hAnsi="Times New Roman" w:cs="Times New Roman"/>
+              </w:rPr>
+              <w:t>, 2), "\n")</w:t>
+            </w:r>
+          </w:p>
+          <w:p>
+            <w:pPr>
+              <w:rPr>
+                <w:rFonts w:ascii="Times New Roman" w:eastAsia="Times New Roman" w:hAnsi="Times New Roman" w:cs="Times New Roman"/>
+              </w:rPr>
+            </w:pPr>
+            <w:proofErr w:type="gramStart"/>
+            <w:r>
+              <w:rPr>
+                <w:rFonts w:ascii="Times New Roman" w:eastAsia="Times New Roman" w:hAnsi="Times New Roman" w:cs="Times New Roman"/>
+              </w:rPr>
+              <w:t>cat(</w:t>
+            </w:r>
+            <w:proofErr w:type="gramEnd"/>
+            <w:r>
+              <w:rPr>
+                <w:rFonts w:ascii="Times New Roman" w:eastAsia="Times New Roman" w:hAnsi="Times New Roman" w:cs="Times New Roman"/>
+              </w:rPr>
+              <w:t xml:space="preserve">"Min:    ", </w:t>
+            </w:r>
+            <w:proofErr w:type="gramStart"/>
+            <w:r>
+              <w:rPr>
+                <w:rFonts w:ascii="Times New Roman" w:eastAsia="Times New Roman" w:hAnsi="Times New Roman" w:cs="Times New Roman"/>
+              </w:rPr>
+              <w:t>round(</w:t>
+            </w:r>
+            <w:proofErr w:type="spellStart"/>
+            <w:proofErr w:type="gramEnd"/>
+            <w:r>
+              <w:rPr>
+                <w:rFonts w:ascii="Times New Roman" w:eastAsia="Times New Roman" w:hAnsi="Times New Roman" w:cs="Times New Roman"/>
+              </w:rPr>
+              <w:t>min_life_exp</w:t>
+            </w:r>
+            <w:proofErr w:type="spellEnd"/>
+            <w:r>
+              <w:rPr>
+                <w:rFonts w:ascii="Times New Roman" w:eastAsia="Times New Roman" w:hAnsi="Times New Roman" w:cs="Times New Roman"/>
+              </w:rPr>
+              <w:t>, 2), "\n")</w:t>
+            </w:r>
+          </w:p>
+          <w:p>
+            <w:pPr>
+              <w:rPr>
+                <w:rFonts w:ascii="Times New Roman" w:eastAsia="Times New Roman" w:hAnsi="Times New Roman" w:cs="Times New Roman"/>
+              </w:rPr>
+            </w:pPr>
+            <w:proofErr w:type="gramStart"/>
+            <w:r>
+              <w:rPr>
+                <w:rFonts w:ascii="Times New Roman" w:eastAsia="Times New Roman" w:hAnsi="Times New Roman" w:cs="Times New Roman"/>
+              </w:rPr>
+              <w:t>cat(</w:t>
+            </w:r>
+            <w:proofErr w:type="gramEnd"/>
+            <w:r>
+              <w:rPr>
+                <w:rFonts w:ascii="Times New Roman" w:eastAsia="Times New Roman" w:hAnsi="Times New Roman" w:cs="Times New Roman"/>
+              </w:rPr>
+              <w:t xml:space="preserve">"Max:    ", </w:t>
+            </w:r>
+            <w:proofErr w:type="gramStart"/>
+            <w:r>
+              <w:rPr>
+                <w:rFonts w:ascii="Times New Roman" w:eastAsia="Times New Roman" w:hAnsi="Times New Roman" w:cs="Times New Roman"/>
+              </w:rPr>
+              <w:t>round(</w:t>
+            </w:r>
+            <w:proofErr w:type="spellStart"/>
+            <w:proofErr w:type="gramEnd"/>
+            <w:r>
+              <w:rPr>
+                <w:rFonts w:ascii="Times New Roman" w:eastAsia="Times New Roman" w:hAnsi="Times New Roman" w:cs="Times New Roman"/>
+              </w:rPr>
+              <w:t>max_life_exp</w:t>
+            </w:r>
+            <w:proofErr w:type="spellEnd"/>
+            <w:r>
+              <w:rPr>
+                <w:rFonts w:ascii="Times New Roman" w:eastAsia="Times New Roman" w:hAnsi="Times New Roman" w:cs="Times New Roman"/>
+              </w:rPr>
+              <w:t>, 2), "\n\n")</w:t>
+            </w:r>
+          </w:p>
+          <w:p>
+            <w:pPr>
+              <w:rPr>
+                <w:rFonts w:ascii="Times New Roman" w:eastAsia="Times New Roman" w:hAnsi="Times New Roman" w:cs="Times New Roman"/>
+              </w:rPr>
+            </w:pPr>
+          </w:p>
+          <w:p>
+            <w:pPr>
+              <w:rPr>
+                <w:rFonts w:ascii="Times New Roman" w:eastAsia="Times New Roman" w:hAnsi="Times New Roman" w:cs="Times New Roman"/>
+              </w:rPr>
+            </w:pPr>
+            <w:r>
+              <w:rPr>
+                <w:rFonts w:ascii="Times New Roman" w:eastAsia="Times New Roman" w:hAnsi="Times New Roman" w:cs="Times New Roman"/>
+              </w:rPr>
+              <w:t># ============================================================================</w:t>
+            </w:r>
+          </w:p>
+          <w:p>
+            <w:pPr>
+              <w:rPr>
+                <w:rFonts w:ascii="Times New Roman" w:eastAsia="Times New Roman" w:hAnsi="Times New Roman" w:cs="Times New Roman"/>
+                <w:b/>
+                <w:bCs/>
+              </w:rPr>
+            </w:pPr>
+            <w:r>
+              <w:rPr>
+                <w:rFonts w:ascii="Times New Roman" w:eastAsia="Times New Roman" w:hAnsi="Times New Roman" w:cs="Times New Roman"/>
+                <w:b/>
+                <w:bCs/>
+              </w:rPr>
+              <w:t xml:space="preserve"># 5. VISUALIZATIONS </w:t>
+            </w:r>
+          </w:p>
+          <w:p>
+            <w:pPr>
+              <w:rPr>
+                <w:rFonts w:ascii="Times New Roman" w:eastAsia="Times New Roman" w:hAnsi="Times New Roman" w:cs="Times New Roman"/>
+              </w:rPr>
+            </w:pPr>
+            <w:r>
+              <w:rPr>
+                <w:rFonts w:ascii="Times New Roman" w:eastAsia="Times New Roman" w:hAnsi="Times New Roman" w:cs="Times New Roman"/>
+              </w:rPr>
+              <w:t># ============================================================================</w:t>
+            </w:r>
+          </w:p>
+          <w:p>
+            <w:pPr>
+              <w:rPr>
+                <w:rFonts w:ascii="Times New Roman" w:eastAsia="Times New Roman" w:hAnsi="Times New Roman" w:cs="Times New Roman"/>
+              </w:rPr>
+            </w:pPr>
+          </w:p>
+          <w:p>
+            <w:pPr>
+              <w:rPr>
+                <w:rFonts w:ascii="Times New Roman" w:eastAsia="Times New Roman" w:hAnsi="Times New Roman" w:cs="Times New Roman"/>
+              </w:rPr>
+            </w:pPr>
+            <w:proofErr w:type="gramStart"/>
+            <w:r>
+              <w:rPr>
+                <w:rFonts w:ascii="Times New Roman" w:eastAsia="Times New Roman" w:hAnsi="Times New Roman" w:cs="Times New Roman"/>
+              </w:rPr>
+              <w:t>cat(</w:t>
+            </w:r>
+            <w:proofErr w:type="gramEnd"/>
+            <w:r>
+              <w:rPr>
+                <w:rFonts w:ascii="Times New Roman" w:eastAsia="Times New Roman" w:hAnsi="Times New Roman" w:cs="Times New Roman"/>
+              </w:rPr>
+              <w:t>"=== CREATING UPDATED VISUALIZATIONS ===\n\n")</w:t>
+            </w:r>
+          </w:p>
+          <w:p>
+            <w:pPr>
+              <w:rPr>
+                <w:rFonts w:ascii="Times New Roman" w:eastAsia="Times New Roman" w:hAnsi="Times New Roman" w:cs="Times New Roman"/>
+              </w:rPr>
+            </w:pPr>
+          </w:p>
+          <w:p>
+            <w:pPr>
+              <w:rPr>
+                <w:rFonts w:ascii="Times New Roman" w:eastAsia="Times New Roman" w:hAnsi="Times New Roman" w:cs="Times New Roman"/>
+              </w:rPr>
+            </w:pPr>
+            <w:r>
+              <w:rPr>
+                <w:rFonts w:ascii="Times New Roman" w:eastAsia="Times New Roman" w:hAnsi="Times New Roman" w:cs="Times New Roman"/>
+              </w:rPr>
+              <w:t># --------------------------------------------------</w:t>
+            </w:r>
+          </w:p>
+          <w:p>
+            <w:pPr>
+              <w:rPr>
+                <w:rFonts w:ascii="Times New Roman" w:eastAsia="Times New Roman" w:hAnsi="Times New Roman" w:cs="Times New Roman"/>
+              </w:rPr>
+            </w:pPr>
+            <w:r>
+              <w:rPr>
+                <w:rFonts w:ascii="Times New Roman" w:eastAsia="Times New Roman" w:hAnsi="Times New Roman" w:cs="Times New Roman"/>
+              </w:rPr>
+              <w:t># Visualization 1: Histogram of Alcohol Consumption</w:t>
+            </w:r>
+          </w:p>
+          <w:p>
+            <w:pPr>
+              <w:rPr>
+                <w:rFonts w:ascii="Times New Roman" w:eastAsia="Times New Roman" w:hAnsi="Times New Roman" w:cs="Times New Roman"/>
+              </w:rPr>
+            </w:pPr>
+            <w:r>
+              <w:rPr>
+                <w:rFonts w:ascii="Times New Roman" w:eastAsia="Times New Roman" w:hAnsi="Times New Roman" w:cs="Times New Roman"/>
+              </w:rPr>
+              <w:t># --------------------------------------------------</w:t>
+            </w:r>
+          </w:p>
+          <w:p>
+            <w:pPr>
+              <w:rPr>
+                <w:rFonts w:ascii="Times New Roman" w:eastAsia="Times New Roman" w:hAnsi="Times New Roman" w:cs="Times New Roman"/>
+              </w:rPr>
+            </w:pPr>
+          </w:p>
+          <w:p>
+            <w:pPr>
+              <w:rPr>
+                <w:rFonts w:ascii="Times New Roman" w:eastAsia="Times New Roman" w:hAnsi="Times New Roman" w:cs="Times New Roman"/>
+              </w:rPr>
+            </w:pPr>
+            <w:proofErr w:type="gramStart"/>
+            <w:r>
+              <w:rPr>
+                <w:rFonts w:ascii="Times New Roman" w:eastAsia="Times New Roman" w:hAnsi="Times New Roman" w:cs="Times New Roman"/>
+              </w:rPr>
+              <w:t>hist(</w:t>
+            </w:r>
+            <w:proofErr w:type="spellStart"/>
+            <w:proofErr w:type="gramEnd"/>
+            <w:r>
+              <w:rPr>
+                <w:rFonts w:ascii="Times New Roman" w:eastAsia="Times New Roman" w:hAnsi="Times New Roman" w:cs="Times New Roman"/>
+              </w:rPr>
+              <w:t>data_clean$Alcohol_Consumption</w:t>
+            </w:r>
+            <w:proofErr w:type="spellEnd"/>
+            <w:r>
+              <w:rPr>
+                <w:rFonts w:ascii="Times New Roman" w:eastAsia="Times New Roman" w:hAnsi="Times New Roman" w:cs="Times New Roman"/>
+              </w:rPr>
+              <w:t>,</w:t>
+            </w:r>
+          </w:p>
+          <w:p>
+            <w:pPr>
+              <w:rPr>
+                <w:rFonts w:ascii="Times New Roman" w:eastAsia="Times New Roman" w:hAnsi="Times New Roman" w:cs="Times New Roman"/>
+              </w:rPr>
+            </w:pPr>
+            <w:r>
+              <w:rPr>
+                <w:rFonts w:ascii="Times New Roman" w:eastAsia="Times New Roman" w:hAnsi="Times New Roman" w:cs="Times New Roman"/>
+              </w:rPr>
+              <w:t xml:space="preserve">     main = "Distribution of Alcohol Consumption per Capita",</w:t>
+            </w:r>
+          </w:p>
+          <w:p>
+            <w:pPr>
+              <w:rPr>
+                <w:rFonts w:ascii="Times New Roman" w:eastAsia="Times New Roman" w:hAnsi="Times New Roman" w:cs="Times New Roman"/>
+              </w:rPr>
+            </w:pPr>
+            <w:r>
+              <w:rPr>
+                <w:rFonts w:ascii="Times New Roman" w:eastAsia="Times New Roman" w:hAnsi="Times New Roman" w:cs="Times New Roman"/>
+              </w:rPr>
+              <w:t xml:space="preserve">     </w:t>
+            </w:r>
+            <w:proofErr w:type="spellStart"/>
+            <w:r>
+              <w:rPr>
+                <w:rFonts w:ascii="Times New Roman" w:eastAsia="Times New Roman" w:hAnsi="Times New Roman" w:cs="Times New Roman"/>
+              </w:rPr>
+              <w:t>xlab</w:t>
+            </w:r>
+            <w:proofErr w:type="spellEnd"/>
+            <w:r>
+              <w:rPr>
+                <w:rFonts w:ascii="Times New Roman" w:eastAsia="Times New Roman" w:hAnsi="Times New Roman" w:cs="Times New Roman"/>
+              </w:rPr>
+              <w:t xml:space="preserve"> = "Alcohol Consumption (litres per capita)",</w:t>
+            </w:r>
+          </w:p>
+          <w:p>
+            <w:pPr>
+              <w:rPr>
+                <w:rFonts w:ascii="Times New Roman" w:eastAsia="Times New Roman" w:hAnsi="Times New Roman" w:cs="Times New Roman"/>
+              </w:rPr>
+            </w:pPr>
+            <w:r>
+              <w:rPr>
+                <w:rFonts w:ascii="Times New Roman" w:eastAsia="Times New Roman" w:hAnsi="Times New Roman" w:cs="Times New Roman"/>
+              </w:rPr>
+              <w:t xml:space="preserve">     </w:t>
+            </w:r>
+            <w:proofErr w:type="spellStart"/>
+            <w:r>
+              <w:rPr>
+                <w:rFonts w:ascii="Times New Roman" w:eastAsia="Times New Roman" w:hAnsi="Times New Roman" w:cs="Times New Roman"/>
+              </w:rPr>
+              <w:t>ylab</w:t>
+            </w:r>
+            <w:proofErr w:type="spellEnd"/>
+            <w:r>
+              <w:rPr>
+                <w:rFonts w:ascii="Times New Roman" w:eastAsia="Times New Roman" w:hAnsi="Times New Roman" w:cs="Times New Roman"/>
+              </w:rPr>
+              <w:t xml:space="preserve"> = "Frequency",</w:t>
+            </w:r>
+          </w:p>
+          <w:p>
+            <w:pPr>
+              <w:rPr>
+                <w:rFonts w:ascii="Times New Roman" w:eastAsia="Times New Roman" w:hAnsi="Times New Roman" w:cs="Times New Roman"/>
+              </w:rPr>
+            </w:pPr>
+            <w:r>
+              <w:rPr>
+                <w:rFonts w:ascii="Times New Roman" w:eastAsia="Times New Roman" w:hAnsi="Times New Roman" w:cs="Times New Roman"/>
+              </w:rPr>
+              <w:t xml:space="preserve">     col = "</w:t>
+            </w:r>
+            <w:proofErr w:type="spellStart"/>
+            <w:r>
+              <w:rPr>
+                <w:rFonts w:ascii="Times New Roman" w:eastAsia="Times New Roman" w:hAnsi="Times New Roman" w:cs="Times New Roman"/>
+              </w:rPr>
+              <w:t>steelblue</w:t>
+            </w:r>
+            <w:proofErr w:type="spellEnd"/>
+            <w:r>
+              <w:rPr>
+                <w:rFonts w:ascii="Times New Roman" w:eastAsia="Times New Roman" w:hAnsi="Times New Roman" w:cs="Times New Roman"/>
+              </w:rPr>
+              <w:t>",</w:t>
+            </w:r>
+          </w:p>
+          <w:p>
+            <w:pPr>
+              <w:rPr>
+                <w:rFonts w:ascii="Times New Roman" w:eastAsia="Times New Roman" w:hAnsi="Times New Roman" w:cs="Times New Roman"/>
+              </w:rPr>
+            </w:pPr>
+            <w:r>
+              <w:rPr>
+                <w:rFonts w:ascii="Times New Roman" w:eastAsia="Times New Roman" w:hAnsi="Times New Roman" w:cs="Times New Roman"/>
+              </w:rPr>
+              <w:t xml:space="preserve">     border = "white",</w:t>
+            </w:r>
+          </w:p>
+          <w:p>
+            <w:pPr>
+              <w:rPr>
+                <w:rFonts w:ascii="Times New Roman" w:eastAsia="Times New Roman" w:hAnsi="Times New Roman" w:cs="Times New Roman"/>
+              </w:rPr>
+            </w:pPr>
+            <w:r>
+              <w:rPr>
+                <w:rFonts w:ascii="Times New Roman" w:eastAsia="Times New Roman" w:hAnsi="Times New Roman" w:cs="Times New Roman"/>
+              </w:rPr>
+              <w:t xml:space="preserve">     breaks = 15)</w:t>
+            </w:r>
+          </w:p>
+          <w:p>
+            <w:pPr>
+              <w:rPr>
+                <w:rFonts w:ascii="Times New Roman" w:eastAsia="Times New Roman" w:hAnsi="Times New Roman" w:cs="Times New Roman"/>
+              </w:rPr>
+            </w:pPr>
+          </w:p>
+          <w:p>
+            <w:pPr>
+              <w:rPr>
+                <w:rFonts w:ascii="Times New Roman" w:eastAsia="Times New Roman" w:hAnsi="Times New Roman" w:cs="Times New Roman"/>
+              </w:rPr>
+            </w:pPr>
+            <w:proofErr w:type="gramStart"/>
+            <w:r>
+              <w:rPr>
+                <w:rFonts w:ascii="Times New Roman" w:eastAsia="Times New Roman" w:hAnsi="Times New Roman" w:cs="Times New Roman"/>
+              </w:rPr>
+              <w:t>cat(</w:t>
+            </w:r>
+            <w:proofErr w:type="gramEnd"/>
+            <w:r>
+              <w:rPr>
+                <w:rFonts w:ascii="Times New Roman" w:eastAsia="Times New Roman" w:hAnsi="Times New Roman" w:cs="Times New Roman"/>
+              </w:rPr>
+              <w:t>"Displayed: Histogram of Alcohol Consumption\n")</w:t>
+            </w:r>
+          </w:p>
+          <w:p>
+            <w:pPr>
+              <w:rPr>
+                <w:rFonts w:ascii="Times New Roman" w:eastAsia="Times New Roman" w:hAnsi="Times New Roman" w:cs="Times New Roman"/>
+              </w:rPr>
+            </w:pPr>
+          </w:p>
+          <w:p>
+            <w:pPr>
+              <w:rPr>
+                <w:rFonts w:ascii="Times New Roman" w:eastAsia="Times New Roman" w:hAnsi="Times New Roman" w:cs="Times New Roman"/>
+              </w:rPr>
+            </w:pPr>
+            <w:r>
+              <w:rPr>
+                <w:rFonts w:ascii="Times New Roman" w:eastAsia="Times New Roman" w:hAnsi="Times New Roman" w:cs="Times New Roman"/>
+              </w:rPr>
+              <w:t># --------------------------------------------------</w:t>
+            </w:r>
+          </w:p>
+          <w:p>
+            <w:pPr>
+              <w:rPr>
+                <w:rFonts w:ascii="Times New Roman" w:eastAsia="Times New Roman" w:hAnsi="Times New Roman" w:cs="Times New Roman"/>
+              </w:rPr>
+            </w:pPr>
+            <w:r>
+              <w:rPr>
+                <w:rFonts w:ascii="Times New Roman" w:eastAsia="Times New Roman" w:hAnsi="Times New Roman" w:cs="Times New Roman"/>
+              </w:rPr>
+              <w:t># Visualization 2: Histogram of Life Expectancy</w:t>
+            </w:r>
+          </w:p>
+          <w:p>
+            <w:pPr>
+              <w:rPr>
+                <w:rFonts w:ascii="Times New Roman" w:eastAsia="Times New Roman" w:hAnsi="Times New Roman" w:cs="Times New Roman"/>
+              </w:rPr>
+            </w:pPr>
+            <w:r>
+              <w:rPr>
+                <w:rFonts w:ascii="Times New Roman" w:eastAsia="Times New Roman" w:hAnsi="Times New Roman" w:cs="Times New Roman"/>
+              </w:rPr>
+              <w:t># --------------------------------------------------</w:t>
+            </w:r>
+          </w:p>
+          <w:p>
+            <w:pPr>
+              <w:rPr>
+                <w:rFonts w:ascii="Times New Roman" w:eastAsia="Times New Roman" w:hAnsi="Times New Roman" w:cs="Times New Roman"/>
+              </w:rPr>
+            </w:pPr>
+          </w:p>
+          <w:p>
+            <w:pPr>
+              <w:rPr>
+                <w:rFonts w:ascii="Times New Roman" w:eastAsia="Times New Roman" w:hAnsi="Times New Roman" w:cs="Times New Roman"/>
+              </w:rPr>
+            </w:pPr>
+            <w:proofErr w:type="gramStart"/>
+            <w:r>
+              <w:rPr>
+                <w:rFonts w:ascii="Times New Roman" w:eastAsia="Times New Roman" w:hAnsi="Times New Roman" w:cs="Times New Roman"/>
+              </w:rPr>
+              <w:t>hist(</w:t>
+            </w:r>
+            <w:proofErr w:type="spellStart"/>
+            <w:proofErr w:type="gramEnd"/>
+            <w:r>
+              <w:rPr>
+                <w:rFonts w:ascii="Times New Roman" w:eastAsia="Times New Roman" w:hAnsi="Times New Roman" w:cs="Times New Roman"/>
+              </w:rPr>
+              <w:t>data_clean$Life_Expectancy</w:t>
+            </w:r>
+            <w:proofErr w:type="spellEnd"/>
+            <w:r>
+              <w:rPr>
+                <w:rFonts w:ascii="Times New Roman" w:eastAsia="Times New Roman" w:hAnsi="Times New Roman" w:cs="Times New Roman"/>
+              </w:rPr>
+              <w:t>,</w:t>
+            </w:r>
+          </w:p>
+          <w:p>
+            <w:pPr>
+              <w:rPr>
+                <w:rFonts w:ascii="Times New Roman" w:eastAsia="Times New Roman" w:hAnsi="Times New Roman" w:cs="Times New Roman"/>
+              </w:rPr>
+            </w:pPr>
+            <w:r>
+              <w:rPr>
+                <w:rFonts w:ascii="Times New Roman" w:eastAsia="Times New Roman" w:hAnsi="Times New Roman" w:cs="Times New Roman"/>
+              </w:rPr>
+              <w:t xml:space="preserve">     main = "Distribution of Life Expectancy",</w:t>
+            </w:r>
+          </w:p>
+          <w:p>
+            <w:pPr>
+              <w:rPr>
+                <w:rFonts w:ascii="Times New Roman" w:eastAsia="Times New Roman" w:hAnsi="Times New Roman" w:cs="Times New Roman"/>
+              </w:rPr>
+            </w:pPr>
+            <w:r>
+              <w:rPr>
+                <w:rFonts w:ascii="Times New Roman" w:eastAsia="Times New Roman" w:hAnsi="Times New Roman" w:cs="Times New Roman"/>
+              </w:rPr>
+              <w:lastRenderedPageBreak/>
+              <w:t xml:space="preserve">     </w:t>
+            </w:r>
+            <w:proofErr w:type="spellStart"/>
+            <w:r>
+              <w:rPr>
+                <w:rFonts w:ascii="Times New Roman" w:eastAsia="Times New Roman" w:hAnsi="Times New Roman" w:cs="Times New Roman"/>
+              </w:rPr>
+              <w:t>xlab</w:t>
+            </w:r>
+            <w:proofErr w:type="spellEnd"/>
+            <w:r>
+              <w:rPr>
+                <w:rFonts w:ascii="Times New Roman" w:eastAsia="Times New Roman" w:hAnsi="Times New Roman" w:cs="Times New Roman"/>
+              </w:rPr>
+              <w:t xml:space="preserve"> = "Life Expectancy (years)",</w:t>
+            </w:r>
+          </w:p>
+          <w:p>
+            <w:pPr>
+              <w:rPr>
+                <w:rFonts w:ascii="Times New Roman" w:eastAsia="Times New Roman" w:hAnsi="Times New Roman" w:cs="Times New Roman"/>
+              </w:rPr>
+            </w:pPr>
+            <w:r>
+              <w:rPr>
+                <w:rFonts w:ascii="Times New Roman" w:eastAsia="Times New Roman" w:hAnsi="Times New Roman" w:cs="Times New Roman"/>
+              </w:rPr>
+              <w:t xml:space="preserve">     </w:t>
+            </w:r>
+            <w:proofErr w:type="spellStart"/>
+            <w:r>
+              <w:rPr>
+                <w:rFonts w:ascii="Times New Roman" w:eastAsia="Times New Roman" w:hAnsi="Times New Roman" w:cs="Times New Roman"/>
+              </w:rPr>
+              <w:t>ylab</w:t>
+            </w:r>
+            <w:proofErr w:type="spellEnd"/>
+            <w:r>
+              <w:rPr>
+                <w:rFonts w:ascii="Times New Roman" w:eastAsia="Times New Roman" w:hAnsi="Times New Roman" w:cs="Times New Roman"/>
+              </w:rPr>
+              <w:t xml:space="preserve"> = "Frequency",</w:t>
+            </w:r>
+          </w:p>
+          <w:p>
+            <w:pPr>
+              <w:rPr>
+                <w:rFonts w:ascii="Times New Roman" w:eastAsia="Times New Roman" w:hAnsi="Times New Roman" w:cs="Times New Roman"/>
+              </w:rPr>
+            </w:pPr>
+            <w:r>
+              <w:rPr>
+                <w:rFonts w:ascii="Times New Roman" w:eastAsia="Times New Roman" w:hAnsi="Times New Roman" w:cs="Times New Roman"/>
+              </w:rPr>
+              <w:t xml:space="preserve">     col = "coral",</w:t>
+            </w:r>
+          </w:p>
+          <w:p>
+            <w:pPr>
+              <w:rPr>
+                <w:rFonts w:ascii="Times New Roman" w:eastAsia="Times New Roman" w:hAnsi="Times New Roman" w:cs="Times New Roman"/>
+              </w:rPr>
+            </w:pPr>
+            <w:r>
+              <w:rPr>
+                <w:rFonts w:ascii="Times New Roman" w:eastAsia="Times New Roman" w:hAnsi="Times New Roman" w:cs="Times New Roman"/>
+              </w:rPr>
+              <w:t xml:space="preserve">     border = "white",</w:t>
+            </w:r>
+          </w:p>
+          <w:p>
+            <w:pPr>
+              <w:rPr>
+                <w:rFonts w:ascii="Times New Roman" w:eastAsia="Times New Roman" w:hAnsi="Times New Roman" w:cs="Times New Roman"/>
+              </w:rPr>
+            </w:pPr>
+            <w:r>
+              <w:rPr>
+                <w:rFonts w:ascii="Times New Roman" w:eastAsia="Times New Roman" w:hAnsi="Times New Roman" w:cs="Times New Roman"/>
+              </w:rPr>
+              <w:t xml:space="preserve">     breaks = 15)</w:t>
+            </w:r>
+          </w:p>
+          <w:p>
+            <w:pPr>
+              <w:rPr>
+                <w:rFonts w:ascii="Times New Roman" w:eastAsia="Times New Roman" w:hAnsi="Times New Roman" w:cs="Times New Roman"/>
+              </w:rPr>
+            </w:pPr>
+          </w:p>
+          <w:p>
+            <w:pPr>
+              <w:rPr>
+                <w:rFonts w:ascii="Times New Roman" w:eastAsia="Times New Roman" w:hAnsi="Times New Roman" w:cs="Times New Roman"/>
+              </w:rPr>
+            </w:pPr>
+            <w:proofErr w:type="gramStart"/>
+            <w:r>
+              <w:rPr>
+                <w:rFonts w:ascii="Times New Roman" w:eastAsia="Times New Roman" w:hAnsi="Times New Roman" w:cs="Times New Roman"/>
+              </w:rPr>
+              <w:t>cat(</w:t>
+            </w:r>
+            <w:proofErr w:type="gramEnd"/>
+            <w:r>
+              <w:rPr>
+                <w:rFonts w:ascii="Times New Roman" w:eastAsia="Times New Roman" w:hAnsi="Times New Roman" w:cs="Times New Roman"/>
+              </w:rPr>
+              <w:t>"Displayed: Histogram of Life Expectancy\n")</w:t>
+            </w:r>
+          </w:p>
+          <w:p>
+            <w:pPr>
+              <w:rPr>
+                <w:rFonts w:ascii="Times New Roman" w:eastAsia="Times New Roman" w:hAnsi="Times New Roman" w:cs="Times New Roman"/>
+              </w:rPr>
+            </w:pPr>
+          </w:p>
+          <w:p>
+            <w:pPr>
+              <w:rPr>
+                <w:rFonts w:ascii="Times New Roman" w:eastAsia="Times New Roman" w:hAnsi="Times New Roman" w:cs="Times New Roman"/>
+              </w:rPr>
+            </w:pPr>
+            <w:r>
+              <w:rPr>
+                <w:rFonts w:ascii="Times New Roman" w:eastAsia="Times New Roman" w:hAnsi="Times New Roman" w:cs="Times New Roman"/>
+              </w:rPr>
+              <w:t># --------------------------------------------------</w:t>
+            </w:r>
+          </w:p>
+          <w:p>
+            <w:pPr>
+              <w:rPr>
+                <w:rFonts w:ascii="Times New Roman" w:eastAsia="Times New Roman" w:hAnsi="Times New Roman" w:cs="Times New Roman"/>
+              </w:rPr>
+            </w:pPr>
+            <w:r>
+              <w:rPr>
+                <w:rFonts w:ascii="Times New Roman" w:eastAsia="Times New Roman" w:hAnsi="Times New Roman" w:cs="Times New Roman"/>
+              </w:rPr>
+              <w:t># Visualization 3: Scatter Plot WITHOUT Regression Line</w:t>
+            </w:r>
+          </w:p>
+          <w:p>
+            <w:pPr>
+              <w:rPr>
+                <w:rFonts w:ascii="Times New Roman" w:eastAsia="Times New Roman" w:hAnsi="Times New Roman" w:cs="Times New Roman"/>
+              </w:rPr>
+            </w:pPr>
+            <w:r>
+              <w:rPr>
+                <w:rFonts w:ascii="Times New Roman" w:eastAsia="Times New Roman" w:hAnsi="Times New Roman" w:cs="Times New Roman"/>
+              </w:rPr>
+              <w:t># --------------------------------------------------</w:t>
+            </w:r>
+          </w:p>
+          <w:p>
+            <w:pPr>
+              <w:rPr>
+                <w:rFonts w:ascii="Times New Roman" w:eastAsia="Times New Roman" w:hAnsi="Times New Roman" w:cs="Times New Roman"/>
+              </w:rPr>
+            </w:pPr>
+          </w:p>
+          <w:p>
+            <w:pPr>
+              <w:rPr>
+                <w:rFonts w:ascii="Times New Roman" w:eastAsia="Times New Roman" w:hAnsi="Times New Roman" w:cs="Times New Roman"/>
+              </w:rPr>
+            </w:pPr>
+            <w:proofErr w:type="gramStart"/>
+            <w:r>
+              <w:rPr>
+                <w:rFonts w:ascii="Times New Roman" w:eastAsia="Times New Roman" w:hAnsi="Times New Roman" w:cs="Times New Roman"/>
+              </w:rPr>
+              <w:t>plot(</w:t>
+            </w:r>
+            <w:proofErr w:type="spellStart"/>
+            <w:proofErr w:type="gramEnd"/>
+            <w:r>
+              <w:rPr>
+                <w:rFonts w:ascii="Times New Roman" w:eastAsia="Times New Roman" w:hAnsi="Times New Roman" w:cs="Times New Roman"/>
+              </w:rPr>
+              <w:t>data_clean$Alcohol_Consumption</w:t>
+            </w:r>
+            <w:proofErr w:type="spellEnd"/>
+            <w:r>
+              <w:rPr>
+                <w:rFonts w:ascii="Times New Roman" w:eastAsia="Times New Roman" w:hAnsi="Times New Roman" w:cs="Times New Roman"/>
+              </w:rPr>
+              <w:t xml:space="preserve">, </w:t>
+            </w:r>
+          </w:p>
+          <w:p>
+            <w:pPr>
+              <w:rPr>
+                <w:rFonts w:ascii="Times New Roman" w:eastAsia="Times New Roman" w:hAnsi="Times New Roman" w:cs="Times New Roman"/>
+              </w:rPr>
+            </w:pPr>
+            <w:r>
+              <w:rPr>
+                <w:rFonts w:ascii="Times New Roman" w:eastAsia="Times New Roman" w:hAnsi="Times New Roman" w:cs="Times New Roman"/>
+              </w:rPr>
+              <w:t xml:space="preserve">     </w:t>
+            </w:r>
+            <w:proofErr w:type="spellStart"/>
+            <w:r>
+              <w:rPr>
+                <w:rFonts w:ascii="Times New Roman" w:eastAsia="Times New Roman" w:hAnsi="Times New Roman" w:cs="Times New Roman"/>
+              </w:rPr>
+              <w:t>data_clean$Life_Expectancy</w:t>
+            </w:r>
+            <w:proofErr w:type="spellEnd"/>
+            <w:r>
+              <w:rPr>
+                <w:rFonts w:ascii="Times New Roman" w:eastAsia="Times New Roman" w:hAnsi="Times New Roman" w:cs="Times New Roman"/>
+              </w:rPr>
+              <w:t>,</w:t>
+            </w:r>
+          </w:p>
+          <w:p>
+            <w:pPr>
+              <w:rPr>
+                <w:rFonts w:ascii="Times New Roman" w:eastAsia="Times New Roman" w:hAnsi="Times New Roman" w:cs="Times New Roman"/>
+              </w:rPr>
+            </w:pPr>
+            <w:r>
+              <w:rPr>
+                <w:rFonts w:ascii="Times New Roman" w:eastAsia="Times New Roman" w:hAnsi="Times New Roman" w:cs="Times New Roman"/>
+              </w:rPr>
+              <w:t xml:space="preserve">     main = "Alcohol Consumption vs Life Expectancy",</w:t>
+            </w:r>
+          </w:p>
+          <w:p>
+            <w:pPr>
+              <w:rPr>
+                <w:rFonts w:ascii="Times New Roman" w:eastAsia="Times New Roman" w:hAnsi="Times New Roman" w:cs="Times New Roman"/>
+              </w:rPr>
+            </w:pPr>
+            <w:r>
+              <w:rPr>
+                <w:rFonts w:ascii="Times New Roman" w:eastAsia="Times New Roman" w:hAnsi="Times New Roman" w:cs="Times New Roman"/>
+              </w:rPr>
+              <w:t xml:space="preserve">     </w:t>
+            </w:r>
+            <w:proofErr w:type="spellStart"/>
+            <w:r>
+              <w:rPr>
+                <w:rFonts w:ascii="Times New Roman" w:eastAsia="Times New Roman" w:hAnsi="Times New Roman" w:cs="Times New Roman"/>
+              </w:rPr>
+              <w:t>xlab</w:t>
+            </w:r>
+            <w:proofErr w:type="spellEnd"/>
+            <w:r>
+              <w:rPr>
+                <w:rFonts w:ascii="Times New Roman" w:eastAsia="Times New Roman" w:hAnsi="Times New Roman" w:cs="Times New Roman"/>
+              </w:rPr>
+              <w:t xml:space="preserve"> = "Alcohol Consumption (litres per capita)",</w:t>
+            </w:r>
+          </w:p>
+          <w:p>
+            <w:pPr>
+              <w:rPr>
+                <w:rFonts w:ascii="Times New Roman" w:eastAsia="Times New Roman" w:hAnsi="Times New Roman" w:cs="Times New Roman"/>
+              </w:rPr>
+            </w:pPr>
+            <w:r>
+              <w:rPr>
+                <w:rFonts w:ascii="Times New Roman" w:eastAsia="Times New Roman" w:hAnsi="Times New Roman" w:cs="Times New Roman"/>
+              </w:rPr>
+              <w:t xml:space="preserve">     </w:t>
+            </w:r>
+            <w:proofErr w:type="spellStart"/>
+            <w:r>
+              <w:rPr>
+                <w:rFonts w:ascii="Times New Roman" w:eastAsia="Times New Roman" w:hAnsi="Times New Roman" w:cs="Times New Roman"/>
+              </w:rPr>
+              <w:t>ylab</w:t>
+            </w:r>
+            <w:proofErr w:type="spellEnd"/>
+            <w:r>
+              <w:rPr>
+                <w:rFonts w:ascii="Times New Roman" w:eastAsia="Times New Roman" w:hAnsi="Times New Roman" w:cs="Times New Roman"/>
+              </w:rPr>
+              <w:t xml:space="preserve"> = "Life Expectancy (years)",</w:t>
+            </w:r>
+          </w:p>
+          <w:p>
+            <w:pPr>
+              <w:rPr>
+                <w:rFonts w:ascii="Times New Roman" w:eastAsia="Times New Roman" w:hAnsi="Times New Roman" w:cs="Times New Roman"/>
+              </w:rPr>
+            </w:pPr>
+            <w:r>
+              <w:rPr>
+                <w:rFonts w:ascii="Times New Roman" w:eastAsia="Times New Roman" w:hAnsi="Times New Roman" w:cs="Times New Roman"/>
+              </w:rPr>
+              <w:t xml:space="preserve">     </w:t>
+            </w:r>
+            <w:proofErr w:type="spellStart"/>
+            <w:r>
+              <w:rPr>
+                <w:rFonts w:ascii="Times New Roman" w:eastAsia="Times New Roman" w:hAnsi="Times New Roman" w:cs="Times New Roman"/>
+              </w:rPr>
+              <w:t>pch</w:t>
+            </w:r>
+            <w:proofErr w:type="spellEnd"/>
+            <w:r>
+              <w:rPr>
+                <w:rFonts w:ascii="Times New Roman" w:eastAsia="Times New Roman" w:hAnsi="Times New Roman" w:cs="Times New Roman"/>
+              </w:rPr>
+              <w:t xml:space="preserve"> = 19,</w:t>
+            </w:r>
+          </w:p>
+          <w:p>
+            <w:pPr>
+              <w:rPr>
+                <w:rFonts w:ascii="Times New Roman" w:eastAsia="Times New Roman" w:hAnsi="Times New Roman" w:cs="Times New Roman"/>
+              </w:rPr>
+            </w:pPr>
+            <w:r>
+              <w:rPr>
+                <w:rFonts w:ascii="Times New Roman" w:eastAsia="Times New Roman" w:hAnsi="Times New Roman" w:cs="Times New Roman"/>
+              </w:rPr>
+              <w:t xml:space="preserve">     col = </w:t>
+            </w:r>
+            <w:proofErr w:type="spellStart"/>
+            <w:proofErr w:type="gramStart"/>
+            <w:r>
+              <w:rPr>
+                <w:rFonts w:ascii="Times New Roman" w:eastAsia="Times New Roman" w:hAnsi="Times New Roman" w:cs="Times New Roman"/>
+              </w:rPr>
+              <w:t>rgb</w:t>
+            </w:r>
+            <w:proofErr w:type="spellEnd"/>
+            <w:r>
+              <w:rPr>
+                <w:rFonts w:ascii="Times New Roman" w:eastAsia="Times New Roman" w:hAnsi="Times New Roman" w:cs="Times New Roman"/>
+              </w:rPr>
+              <w:t>(</w:t>
+            </w:r>
+            <w:proofErr w:type="gramEnd"/>
+            <w:r>
+              <w:rPr>
+                <w:rFonts w:ascii="Times New Roman" w:eastAsia="Times New Roman" w:hAnsi="Times New Roman" w:cs="Times New Roman"/>
+              </w:rPr>
+              <w:t>0, 0, 0.5, 0.6),</w:t>
+            </w:r>
+          </w:p>
+          <w:p>
+            <w:pPr>
+              <w:rPr>
+                <w:rFonts w:ascii="Times New Roman" w:eastAsia="Times New Roman" w:hAnsi="Times New Roman" w:cs="Times New Roman"/>
+              </w:rPr>
+            </w:pPr>
+            <w:r>
+              <w:rPr>
+                <w:rFonts w:ascii="Times New Roman" w:eastAsia="Times New Roman" w:hAnsi="Times New Roman" w:cs="Times New Roman"/>
+              </w:rPr>
+              <w:t xml:space="preserve">     </w:t>
+            </w:r>
+            <w:proofErr w:type="spellStart"/>
+            <w:r>
+              <w:rPr>
+                <w:rFonts w:ascii="Times New Roman" w:eastAsia="Times New Roman" w:hAnsi="Times New Roman" w:cs="Times New Roman"/>
+              </w:rPr>
+              <w:t>cex</w:t>
+            </w:r>
+            <w:proofErr w:type="spellEnd"/>
+            <w:r>
+              <w:rPr>
+                <w:rFonts w:ascii="Times New Roman" w:eastAsia="Times New Roman" w:hAnsi="Times New Roman" w:cs="Times New Roman"/>
+              </w:rPr>
+              <w:t xml:space="preserve"> = 1.1)</w:t>
+            </w:r>
+          </w:p>
+          <w:p>
+            <w:pPr>
+              <w:rPr>
+                <w:rFonts w:ascii="Times New Roman" w:eastAsia="Times New Roman" w:hAnsi="Times New Roman" w:cs="Times New Roman"/>
+              </w:rPr>
+            </w:pPr>
+          </w:p>
+          <w:p>
+            <w:pPr>
+              <w:rPr>
+                <w:rFonts w:ascii="Times New Roman" w:eastAsia="Times New Roman" w:hAnsi="Times New Roman" w:cs="Times New Roman"/>
+              </w:rPr>
+            </w:pPr>
+            <w:proofErr w:type="gramStart"/>
+            <w:r>
+              <w:rPr>
+                <w:rFonts w:ascii="Times New Roman" w:eastAsia="Times New Roman" w:hAnsi="Times New Roman" w:cs="Times New Roman"/>
+              </w:rPr>
+              <w:t>grid(</w:t>
+            </w:r>
+            <w:proofErr w:type="gramEnd"/>
+            <w:r>
+              <w:rPr>
+                <w:rFonts w:ascii="Times New Roman" w:eastAsia="Times New Roman" w:hAnsi="Times New Roman" w:cs="Times New Roman"/>
+              </w:rPr>
+              <w:t>col = "</w:t>
+            </w:r>
+            <w:proofErr w:type="spellStart"/>
+            <w:r>
+              <w:rPr>
+                <w:rFonts w:ascii="Times New Roman" w:eastAsia="Times New Roman" w:hAnsi="Times New Roman" w:cs="Times New Roman"/>
+              </w:rPr>
+              <w:t>gray</w:t>
+            </w:r>
+            <w:proofErr w:type="spellEnd"/>
+            <w:r>
+              <w:rPr>
+                <w:rFonts w:ascii="Times New Roman" w:eastAsia="Times New Roman" w:hAnsi="Times New Roman" w:cs="Times New Roman"/>
+              </w:rPr>
+              <w:t xml:space="preserve">", </w:t>
+            </w:r>
+            <w:proofErr w:type="spellStart"/>
+            <w:r>
+              <w:rPr>
+                <w:rFonts w:ascii="Times New Roman" w:eastAsia="Times New Roman" w:hAnsi="Times New Roman" w:cs="Times New Roman"/>
+              </w:rPr>
+              <w:t>lty</w:t>
+            </w:r>
+            <w:proofErr w:type="spellEnd"/>
+            <w:r>
+              <w:rPr>
+                <w:rFonts w:ascii="Times New Roman" w:eastAsia="Times New Roman" w:hAnsi="Times New Roman" w:cs="Times New Roman"/>
+              </w:rPr>
+              <w:t xml:space="preserve"> = "dotted")</w:t>
+            </w:r>
+          </w:p>
+          <w:p>
+            <w:pPr>
+              <w:rPr>
+                <w:rFonts w:ascii="Times New Roman" w:eastAsia="Times New Roman" w:hAnsi="Times New Roman" w:cs="Times New Roman"/>
+              </w:rPr>
+            </w:pPr>
+          </w:p>
+          <w:p>
+            <w:pPr>
+              <w:rPr>
+                <w:rFonts w:ascii="Times New Roman" w:eastAsia="Times New Roman" w:hAnsi="Times New Roman" w:cs="Times New Roman"/>
+              </w:rPr>
+            </w:pPr>
+            <w:proofErr w:type="spellStart"/>
+            <w:proofErr w:type="gramStart"/>
+            <w:r>
+              <w:rPr>
+                <w:rFonts w:ascii="Times New Roman" w:eastAsia="Times New Roman" w:hAnsi="Times New Roman" w:cs="Times New Roman"/>
+              </w:rPr>
+              <w:t>mtext</w:t>
+            </w:r>
+            <w:proofErr w:type="spellEnd"/>
+            <w:r>
+              <w:rPr>
+                <w:rFonts w:ascii="Times New Roman" w:eastAsia="Times New Roman" w:hAnsi="Times New Roman" w:cs="Times New Roman"/>
+              </w:rPr>
+              <w:t>(paste(</w:t>
+            </w:r>
+            <w:proofErr w:type="gramEnd"/>
+            <w:r>
+              <w:rPr>
+                <w:rFonts w:ascii="Times New Roman" w:eastAsia="Times New Roman" w:hAnsi="Times New Roman" w:cs="Times New Roman"/>
+              </w:rPr>
+              <w:t xml:space="preserve">"n =", </w:t>
+            </w:r>
+            <w:proofErr w:type="spellStart"/>
+            <w:r>
+              <w:rPr>
+                <w:rFonts w:ascii="Times New Roman" w:eastAsia="Times New Roman" w:hAnsi="Times New Roman" w:cs="Times New Roman"/>
+              </w:rPr>
+              <w:t>nrow</w:t>
+            </w:r>
+            <w:proofErr w:type="spellEnd"/>
+            <w:r>
+              <w:rPr>
+                <w:rFonts w:ascii="Times New Roman" w:eastAsia="Times New Roman" w:hAnsi="Times New Roman" w:cs="Times New Roman"/>
+              </w:rPr>
+              <w:t>(</w:t>
+            </w:r>
+            <w:proofErr w:type="spellStart"/>
+            <w:r>
+              <w:rPr>
+                <w:rFonts w:ascii="Times New Roman" w:eastAsia="Times New Roman" w:hAnsi="Times New Roman" w:cs="Times New Roman"/>
+              </w:rPr>
+              <w:t>data_clean</w:t>
+            </w:r>
+            <w:proofErr w:type="spellEnd"/>
+            <w:r>
+              <w:rPr>
+                <w:rFonts w:ascii="Times New Roman" w:eastAsia="Times New Roman" w:hAnsi="Times New Roman" w:cs="Times New Roman"/>
+              </w:rPr>
+              <w:t xml:space="preserve">), "countries"), </w:t>
+            </w:r>
+          </w:p>
+          <w:p>
+            <w:pPr>
+              <w:rPr>
+                <w:rFonts w:ascii="Times New Roman" w:eastAsia="Times New Roman" w:hAnsi="Times New Roman" w:cs="Times New Roman"/>
+              </w:rPr>
+            </w:pPr>
+            <w:r>
+              <w:rPr>
+                <w:rFonts w:ascii="Times New Roman" w:eastAsia="Times New Roman" w:hAnsi="Times New Roman" w:cs="Times New Roman"/>
+              </w:rPr>
+              <w:t xml:space="preserve">      side = 3, </w:t>
+            </w:r>
+          </w:p>
+          <w:p>
+            <w:pPr>
+              <w:rPr>
+                <w:rFonts w:ascii="Times New Roman" w:eastAsia="Times New Roman" w:hAnsi="Times New Roman" w:cs="Times New Roman"/>
+              </w:rPr>
+            </w:pPr>
+            <w:r>
+              <w:rPr>
+                <w:rFonts w:ascii="Times New Roman" w:eastAsia="Times New Roman" w:hAnsi="Times New Roman" w:cs="Times New Roman"/>
+              </w:rPr>
+              <w:t xml:space="preserve">      line = 0.3,</w:t>
+            </w:r>
+          </w:p>
+          <w:p>
+            <w:pPr>
+              <w:rPr>
+                <w:rFonts w:ascii="Times New Roman" w:eastAsia="Times New Roman" w:hAnsi="Times New Roman" w:cs="Times New Roman"/>
+              </w:rPr>
+            </w:pPr>
+            <w:r>
+              <w:rPr>
+                <w:rFonts w:ascii="Times New Roman" w:eastAsia="Times New Roman" w:hAnsi="Times New Roman" w:cs="Times New Roman"/>
+              </w:rPr>
+              <w:t xml:space="preserve">      </w:t>
+            </w:r>
+            <w:proofErr w:type="spellStart"/>
+            <w:r>
+              <w:rPr>
+                <w:rFonts w:ascii="Times New Roman" w:eastAsia="Times New Roman" w:hAnsi="Times New Roman" w:cs="Times New Roman"/>
+              </w:rPr>
+              <w:t>cex</w:t>
+            </w:r>
+            <w:proofErr w:type="spellEnd"/>
+            <w:r>
+              <w:rPr>
+                <w:rFonts w:ascii="Times New Roman" w:eastAsia="Times New Roman" w:hAnsi="Times New Roman" w:cs="Times New Roman"/>
+              </w:rPr>
+              <w:t xml:space="preserve"> = 0.9)</w:t>
+            </w:r>
+          </w:p>
+          <w:p>
+            <w:pPr>
+              <w:rPr>
+                <w:rFonts w:ascii="Times New Roman" w:eastAsia="Times New Roman" w:hAnsi="Times New Roman" w:cs="Times New Roman"/>
+              </w:rPr>
+            </w:pPr>
+          </w:p>
+          <w:p>
+            <w:pPr>
+              <w:rPr>
+                <w:rFonts w:ascii="Times New Roman" w:eastAsia="Times New Roman" w:hAnsi="Times New Roman" w:cs="Times New Roman"/>
+              </w:rPr>
+            </w:pPr>
+            <w:proofErr w:type="gramStart"/>
+            <w:r>
+              <w:rPr>
+                <w:rFonts w:ascii="Times New Roman" w:eastAsia="Times New Roman" w:hAnsi="Times New Roman" w:cs="Times New Roman"/>
+              </w:rPr>
+              <w:t>cat(</w:t>
+            </w:r>
+            <w:proofErr w:type="gramEnd"/>
+            <w:r>
+              <w:rPr>
+                <w:rFonts w:ascii="Times New Roman" w:eastAsia="Times New Roman" w:hAnsi="Times New Roman" w:cs="Times New Roman"/>
+              </w:rPr>
+              <w:t>"Displayed: Scatter Plot\n")</w:t>
+            </w:r>
+          </w:p>
+          <w:p>
+            <w:pPr>
+              <w:rPr>
+                <w:rFonts w:ascii="Times New Roman" w:eastAsia="Times New Roman" w:hAnsi="Times New Roman" w:cs="Times New Roman"/>
+              </w:rPr>
+            </w:pPr>
+          </w:p>
+          <w:p>
+            <w:pPr>
+              <w:rPr>
+                <w:rFonts w:ascii="Times New Roman" w:eastAsia="Times New Roman" w:hAnsi="Times New Roman" w:cs="Times New Roman"/>
+              </w:rPr>
+            </w:pPr>
+            <w:r>
+              <w:rPr>
+                <w:rFonts w:ascii="Times New Roman" w:eastAsia="Times New Roman" w:hAnsi="Times New Roman" w:cs="Times New Roman"/>
+              </w:rPr>
+              <w:t># --------------------------------------------------</w:t>
+            </w:r>
+          </w:p>
+          <w:p>
+            <w:pPr>
+              <w:rPr>
+                <w:rFonts w:ascii="Times New Roman" w:eastAsia="Times New Roman" w:hAnsi="Times New Roman" w:cs="Times New Roman"/>
+              </w:rPr>
+            </w:pPr>
+            <w:r>
+              <w:rPr>
+                <w:rFonts w:ascii="Times New Roman" w:eastAsia="Times New Roman" w:hAnsi="Times New Roman" w:cs="Times New Roman"/>
+              </w:rPr>
+              <w:t xml:space="preserve"># Visualization 4: </w:t>
+            </w:r>
+            <w:proofErr w:type="spellStart"/>
+            <w:r>
+              <w:rPr>
+                <w:rFonts w:ascii="Times New Roman" w:eastAsia="Times New Roman" w:hAnsi="Times New Roman" w:cs="Times New Roman"/>
+              </w:rPr>
+              <w:t>StripChart</w:t>
+            </w:r>
+            <w:proofErr w:type="spellEnd"/>
+            <w:r>
+              <w:rPr>
+                <w:rFonts w:ascii="Times New Roman" w:eastAsia="Times New Roman" w:hAnsi="Times New Roman" w:cs="Times New Roman"/>
+              </w:rPr>
+              <w:t xml:space="preserve"> (Alcohol)</w:t>
+            </w:r>
+          </w:p>
+          <w:p>
+            <w:pPr>
+              <w:rPr>
+                <w:rFonts w:ascii="Times New Roman" w:eastAsia="Times New Roman" w:hAnsi="Times New Roman" w:cs="Times New Roman"/>
+              </w:rPr>
+            </w:pPr>
+            <w:r>
+              <w:rPr>
+                <w:rFonts w:ascii="Times New Roman" w:eastAsia="Times New Roman" w:hAnsi="Times New Roman" w:cs="Times New Roman"/>
+              </w:rPr>
+              <w:t># --------------------------------------------------</w:t>
+            </w:r>
+          </w:p>
+          <w:p>
+            <w:pPr>
+              <w:rPr>
+                <w:rFonts w:ascii="Times New Roman" w:eastAsia="Times New Roman" w:hAnsi="Times New Roman" w:cs="Times New Roman"/>
+              </w:rPr>
+            </w:pPr>
+          </w:p>
+          <w:p>
+            <w:pPr>
+              <w:rPr>
+                <w:rFonts w:ascii="Times New Roman" w:eastAsia="Times New Roman" w:hAnsi="Times New Roman" w:cs="Times New Roman"/>
+              </w:rPr>
+            </w:pPr>
+            <w:proofErr w:type="spellStart"/>
+            <w:proofErr w:type="gramStart"/>
+            <w:r>
+              <w:rPr>
+                <w:rFonts w:ascii="Times New Roman" w:eastAsia="Times New Roman" w:hAnsi="Times New Roman" w:cs="Times New Roman"/>
+              </w:rPr>
+              <w:t>stripchart</w:t>
+            </w:r>
+            <w:proofErr w:type="spellEnd"/>
+            <w:r>
+              <w:rPr>
+                <w:rFonts w:ascii="Times New Roman" w:eastAsia="Times New Roman" w:hAnsi="Times New Roman" w:cs="Times New Roman"/>
+              </w:rPr>
+              <w:t>(</w:t>
+            </w:r>
+            <w:proofErr w:type="spellStart"/>
+            <w:proofErr w:type="gramEnd"/>
+            <w:r>
+              <w:rPr>
+                <w:rFonts w:ascii="Times New Roman" w:eastAsia="Times New Roman" w:hAnsi="Times New Roman" w:cs="Times New Roman"/>
+              </w:rPr>
+              <w:t>data_clean$Alcohol_Consumption</w:t>
+            </w:r>
+            <w:proofErr w:type="spellEnd"/>
+            <w:r>
+              <w:rPr>
+                <w:rFonts w:ascii="Times New Roman" w:eastAsia="Times New Roman" w:hAnsi="Times New Roman" w:cs="Times New Roman"/>
+              </w:rPr>
+              <w:t>,</w:t>
+            </w:r>
+          </w:p>
+          <w:p>
+            <w:pPr>
+              <w:rPr>
+                <w:rFonts w:ascii="Times New Roman" w:eastAsia="Times New Roman" w:hAnsi="Times New Roman" w:cs="Times New Roman"/>
+              </w:rPr>
+            </w:pPr>
+            <w:r>
+              <w:rPr>
+                <w:rFonts w:ascii="Times New Roman" w:eastAsia="Times New Roman" w:hAnsi="Times New Roman" w:cs="Times New Roman"/>
+              </w:rPr>
+              <w:t xml:space="preserve">           method = "jitter",</w:t>
+            </w:r>
+          </w:p>
+          <w:p>
+            <w:pPr>
+              <w:rPr>
+                <w:rFonts w:ascii="Times New Roman" w:eastAsia="Times New Roman" w:hAnsi="Times New Roman" w:cs="Times New Roman"/>
+              </w:rPr>
+            </w:pPr>
+            <w:r>
+              <w:rPr>
+                <w:rFonts w:ascii="Times New Roman" w:eastAsia="Times New Roman" w:hAnsi="Times New Roman" w:cs="Times New Roman"/>
+              </w:rPr>
+              <w:t xml:space="preserve">           main = "</w:t>
+            </w:r>
+            <w:proofErr w:type="spellStart"/>
+            <w:r>
+              <w:rPr>
+                <w:rFonts w:ascii="Times New Roman" w:eastAsia="Times New Roman" w:hAnsi="Times New Roman" w:cs="Times New Roman"/>
+              </w:rPr>
+              <w:t>Stripchart</w:t>
+            </w:r>
+            <w:proofErr w:type="spellEnd"/>
+            <w:r>
+              <w:rPr>
+                <w:rFonts w:ascii="Times New Roman" w:eastAsia="Times New Roman" w:hAnsi="Times New Roman" w:cs="Times New Roman"/>
+              </w:rPr>
+              <w:t>: Alcohol Consumption",</w:t>
+            </w:r>
+          </w:p>
+          <w:p>
+            <w:pPr>
+              <w:rPr>
+                <w:rFonts w:ascii="Times New Roman" w:eastAsia="Times New Roman" w:hAnsi="Times New Roman" w:cs="Times New Roman"/>
+              </w:rPr>
+            </w:pPr>
+            <w:r>
+              <w:rPr>
+                <w:rFonts w:ascii="Times New Roman" w:eastAsia="Times New Roman" w:hAnsi="Times New Roman" w:cs="Times New Roman"/>
+              </w:rPr>
+              <w:t xml:space="preserve">           </w:t>
+            </w:r>
+            <w:proofErr w:type="spellStart"/>
+            <w:r>
+              <w:rPr>
+                <w:rFonts w:ascii="Times New Roman" w:eastAsia="Times New Roman" w:hAnsi="Times New Roman" w:cs="Times New Roman"/>
+              </w:rPr>
+              <w:t>xlab</w:t>
+            </w:r>
+            <w:proofErr w:type="spellEnd"/>
+            <w:r>
+              <w:rPr>
+                <w:rFonts w:ascii="Times New Roman" w:eastAsia="Times New Roman" w:hAnsi="Times New Roman" w:cs="Times New Roman"/>
+              </w:rPr>
+              <w:t xml:space="preserve"> = "Alcohol Consumption (litres per capita)",</w:t>
+            </w:r>
+          </w:p>
+          <w:p>
+            <w:pPr>
+              <w:rPr>
+                <w:rFonts w:ascii="Times New Roman" w:eastAsia="Times New Roman" w:hAnsi="Times New Roman" w:cs="Times New Roman"/>
+              </w:rPr>
+            </w:pPr>
+            <w:r>
+              <w:rPr>
+                <w:rFonts w:ascii="Times New Roman" w:eastAsia="Times New Roman" w:hAnsi="Times New Roman" w:cs="Times New Roman"/>
+              </w:rPr>
+              <w:t xml:space="preserve">           </w:t>
+            </w:r>
+            <w:proofErr w:type="spellStart"/>
+            <w:r>
+              <w:rPr>
+                <w:rFonts w:ascii="Times New Roman" w:eastAsia="Times New Roman" w:hAnsi="Times New Roman" w:cs="Times New Roman"/>
+              </w:rPr>
+              <w:t>pch</w:t>
+            </w:r>
+            <w:proofErr w:type="spellEnd"/>
+            <w:r>
+              <w:rPr>
+                <w:rFonts w:ascii="Times New Roman" w:eastAsia="Times New Roman" w:hAnsi="Times New Roman" w:cs="Times New Roman"/>
+              </w:rPr>
+              <w:t xml:space="preserve"> = 19,</w:t>
+            </w:r>
+          </w:p>
+          <w:p>
+            <w:pPr>
+              <w:rPr>
+                <w:rFonts w:ascii="Times New Roman" w:eastAsia="Times New Roman" w:hAnsi="Times New Roman" w:cs="Times New Roman"/>
+              </w:rPr>
+            </w:pPr>
+            <w:r>
+              <w:rPr>
+                <w:rFonts w:ascii="Times New Roman" w:eastAsia="Times New Roman" w:hAnsi="Times New Roman" w:cs="Times New Roman"/>
+              </w:rPr>
+              <w:t xml:space="preserve">           col = "</w:t>
+            </w:r>
+            <w:proofErr w:type="spellStart"/>
+            <w:r>
+              <w:rPr>
+                <w:rFonts w:ascii="Times New Roman" w:eastAsia="Times New Roman" w:hAnsi="Times New Roman" w:cs="Times New Roman"/>
+              </w:rPr>
+              <w:t>steelblue</w:t>
+            </w:r>
+            <w:proofErr w:type="spellEnd"/>
+            <w:r>
+              <w:rPr>
+                <w:rFonts w:ascii="Times New Roman" w:eastAsia="Times New Roman" w:hAnsi="Times New Roman" w:cs="Times New Roman"/>
+              </w:rPr>
+              <w:t>")</w:t>
+            </w:r>
+          </w:p>
+          <w:p>
+            <w:pPr>
+              <w:rPr>
+                <w:rFonts w:ascii="Times New Roman" w:eastAsia="Times New Roman" w:hAnsi="Times New Roman" w:cs="Times New Roman"/>
+              </w:rPr>
+            </w:pPr>
+          </w:p>
+          <w:p>
+            <w:pPr>
+              <w:rPr>
+                <w:rFonts w:ascii="Times New Roman" w:eastAsia="Times New Roman" w:hAnsi="Times New Roman" w:cs="Times New Roman"/>
+              </w:rPr>
+            </w:pPr>
+            <w:proofErr w:type="gramStart"/>
+            <w:r>
+              <w:rPr>
+                <w:rFonts w:ascii="Times New Roman" w:eastAsia="Times New Roman" w:hAnsi="Times New Roman" w:cs="Times New Roman"/>
+              </w:rPr>
+              <w:t>cat(</w:t>
+            </w:r>
+            <w:proofErr w:type="gramEnd"/>
+            <w:r>
+              <w:rPr>
+                <w:rFonts w:ascii="Times New Roman" w:eastAsia="Times New Roman" w:hAnsi="Times New Roman" w:cs="Times New Roman"/>
+              </w:rPr>
+              <w:t xml:space="preserve">"Displayed: </w:t>
+            </w:r>
+            <w:proofErr w:type="spellStart"/>
+            <w:r>
+              <w:rPr>
+                <w:rFonts w:ascii="Times New Roman" w:eastAsia="Times New Roman" w:hAnsi="Times New Roman" w:cs="Times New Roman"/>
+              </w:rPr>
+              <w:t>Stripchart</w:t>
+            </w:r>
+            <w:proofErr w:type="spellEnd"/>
+            <w:r>
+              <w:rPr>
+                <w:rFonts w:ascii="Times New Roman" w:eastAsia="Times New Roman" w:hAnsi="Times New Roman" w:cs="Times New Roman"/>
+              </w:rPr>
+              <w:t xml:space="preserve"> for Alcohol Consumption\n")</w:t>
+            </w:r>
+          </w:p>
+          <w:p>
+            <w:pPr>
+              <w:rPr>
+                <w:rFonts w:ascii="Times New Roman" w:eastAsia="Times New Roman" w:hAnsi="Times New Roman" w:cs="Times New Roman"/>
+              </w:rPr>
+            </w:pPr>
+          </w:p>
+          <w:p>
+            <w:pPr>
+              <w:rPr>
+                <w:rFonts w:ascii="Times New Roman" w:eastAsia="Times New Roman" w:hAnsi="Times New Roman" w:cs="Times New Roman"/>
+              </w:rPr>
+            </w:pPr>
+            <w:r>
+              <w:rPr>
+                <w:rFonts w:ascii="Times New Roman" w:eastAsia="Times New Roman" w:hAnsi="Times New Roman" w:cs="Times New Roman"/>
+              </w:rPr>
+              <w:t># --------------------------------------------------</w:t>
+            </w:r>
+          </w:p>
+          <w:p>
+            <w:pPr>
+              <w:rPr>
+                <w:rFonts w:ascii="Times New Roman" w:eastAsia="Times New Roman" w:hAnsi="Times New Roman" w:cs="Times New Roman"/>
+              </w:rPr>
+            </w:pPr>
+            <w:r>
+              <w:rPr>
+                <w:rFonts w:ascii="Times New Roman" w:eastAsia="Times New Roman" w:hAnsi="Times New Roman" w:cs="Times New Roman"/>
+              </w:rPr>
+              <w:t xml:space="preserve"># Visualization 5: </w:t>
+            </w:r>
+            <w:proofErr w:type="spellStart"/>
+            <w:r>
+              <w:rPr>
+                <w:rFonts w:ascii="Times New Roman" w:eastAsia="Times New Roman" w:hAnsi="Times New Roman" w:cs="Times New Roman"/>
+              </w:rPr>
+              <w:t>Barplot</w:t>
+            </w:r>
+            <w:proofErr w:type="spellEnd"/>
+            <w:r>
+              <w:rPr>
+                <w:rFonts w:ascii="Times New Roman" w:eastAsia="Times New Roman" w:hAnsi="Times New Roman" w:cs="Times New Roman"/>
+              </w:rPr>
+              <w:t xml:space="preserve"> (Life Expectancy)</w:t>
+            </w:r>
+          </w:p>
+          <w:p>
+            <w:pPr>
+              <w:rPr>
+                <w:rFonts w:ascii="Times New Roman" w:eastAsia="Times New Roman" w:hAnsi="Times New Roman" w:cs="Times New Roman"/>
+              </w:rPr>
+            </w:pPr>
+            <w:r>
+              <w:rPr>
+                <w:rFonts w:ascii="Times New Roman" w:eastAsia="Times New Roman" w:hAnsi="Times New Roman" w:cs="Times New Roman"/>
+              </w:rPr>
+              <w:t># --------------------------------------------------</w:t>
+            </w:r>
+          </w:p>
+          <w:p>
+            <w:pPr>
+              <w:rPr>
+                <w:rFonts w:ascii="Times New Roman" w:eastAsia="Times New Roman" w:hAnsi="Times New Roman" w:cs="Times New Roman"/>
+              </w:rPr>
+            </w:pPr>
+          </w:p>
+          <w:p>
+            <w:pPr>
+              <w:rPr>
+                <w:rFonts w:ascii="Times New Roman" w:eastAsia="Times New Roman" w:hAnsi="Times New Roman" w:cs="Times New Roman"/>
+              </w:rPr>
+            </w:pPr>
+            <w:proofErr w:type="spellStart"/>
+            <w:r>
+              <w:rPr>
+                <w:rFonts w:ascii="Times New Roman" w:eastAsia="Times New Roman" w:hAnsi="Times New Roman" w:cs="Times New Roman"/>
+              </w:rPr>
+              <w:t>life_bins</w:t>
+            </w:r>
+            <w:proofErr w:type="spellEnd"/>
+            <w:r>
+              <w:rPr>
+                <w:rFonts w:ascii="Times New Roman" w:eastAsia="Times New Roman" w:hAnsi="Times New Roman" w:cs="Times New Roman"/>
+              </w:rPr>
+              <w:t xml:space="preserve"> &lt;- </w:t>
+            </w:r>
+            <w:proofErr w:type="gramStart"/>
+            <w:r>
+              <w:rPr>
+                <w:rFonts w:ascii="Times New Roman" w:eastAsia="Times New Roman" w:hAnsi="Times New Roman" w:cs="Times New Roman"/>
+              </w:rPr>
+              <w:t>cut(</w:t>
+            </w:r>
+            <w:proofErr w:type="spellStart"/>
+            <w:proofErr w:type="gramEnd"/>
+            <w:r>
+              <w:rPr>
+                <w:rFonts w:ascii="Times New Roman" w:eastAsia="Times New Roman" w:hAnsi="Times New Roman" w:cs="Times New Roman"/>
+              </w:rPr>
+              <w:t>data_clean$Life_Expectancy</w:t>
+            </w:r>
+            <w:proofErr w:type="spellEnd"/>
+            <w:r>
+              <w:rPr>
+                <w:rFonts w:ascii="Times New Roman" w:eastAsia="Times New Roman" w:hAnsi="Times New Roman" w:cs="Times New Roman"/>
+              </w:rPr>
+              <w:t>,</w:t>
+            </w:r>
+          </w:p>
+          <w:p>
+            <w:pPr>
+              <w:rPr>
+                <w:rFonts w:ascii="Times New Roman" w:eastAsia="Times New Roman" w:hAnsi="Times New Roman" w:cs="Times New Roman"/>
+              </w:rPr>
+            </w:pPr>
+            <w:r>
+              <w:rPr>
+                <w:rFonts w:ascii="Times New Roman" w:eastAsia="Times New Roman" w:hAnsi="Times New Roman" w:cs="Times New Roman"/>
+              </w:rPr>
+              <w:t xml:space="preserve">                 breaks = 10,</w:t>
+            </w:r>
+          </w:p>
+          <w:p>
+            <w:pPr>
+              <w:rPr>
+                <w:rFonts w:ascii="Times New Roman" w:eastAsia="Times New Roman" w:hAnsi="Times New Roman" w:cs="Times New Roman"/>
+              </w:rPr>
+            </w:pPr>
+            <w:r>
+              <w:rPr>
+                <w:rFonts w:ascii="Times New Roman" w:eastAsia="Times New Roman" w:hAnsi="Times New Roman" w:cs="Times New Roman"/>
+              </w:rPr>
+              <w:t xml:space="preserve">                 </w:t>
+            </w:r>
+            <w:proofErr w:type="spellStart"/>
+            <w:proofErr w:type="gramStart"/>
+            <w:r>
+              <w:rPr>
+                <w:rFonts w:ascii="Times New Roman" w:eastAsia="Times New Roman" w:hAnsi="Times New Roman" w:cs="Times New Roman"/>
+              </w:rPr>
+              <w:t>include.lowest</w:t>
+            </w:r>
+            <w:proofErr w:type="spellEnd"/>
+            <w:proofErr w:type="gramEnd"/>
+            <w:r>
+              <w:rPr>
+                <w:rFonts w:ascii="Times New Roman" w:eastAsia="Times New Roman" w:hAnsi="Times New Roman" w:cs="Times New Roman"/>
+              </w:rPr>
+              <w:t xml:space="preserve"> = TRUE)</w:t>
+            </w:r>
+          </w:p>
+          <w:p>
+            <w:pPr>
+              <w:rPr>
+                <w:rFonts w:ascii="Times New Roman" w:eastAsia="Times New Roman" w:hAnsi="Times New Roman" w:cs="Times New Roman"/>
+              </w:rPr>
+            </w:pPr>
+          </w:p>
+          <w:p>
+            <w:pPr>
+              <w:rPr>
+                <w:rFonts w:ascii="Times New Roman" w:eastAsia="Times New Roman" w:hAnsi="Times New Roman" w:cs="Times New Roman"/>
+              </w:rPr>
+            </w:pPr>
+            <w:proofErr w:type="spellStart"/>
+            <w:r>
+              <w:rPr>
+                <w:rFonts w:ascii="Times New Roman" w:eastAsia="Times New Roman" w:hAnsi="Times New Roman" w:cs="Times New Roman"/>
+              </w:rPr>
+              <w:t>life_counts</w:t>
+            </w:r>
+            <w:proofErr w:type="spellEnd"/>
+            <w:r>
+              <w:rPr>
+                <w:rFonts w:ascii="Times New Roman" w:eastAsia="Times New Roman" w:hAnsi="Times New Roman" w:cs="Times New Roman"/>
+              </w:rPr>
+              <w:t xml:space="preserve"> &lt;- table(</w:t>
+            </w:r>
+            <w:proofErr w:type="spellStart"/>
+            <w:r>
+              <w:rPr>
+                <w:rFonts w:ascii="Times New Roman" w:eastAsia="Times New Roman" w:hAnsi="Times New Roman" w:cs="Times New Roman"/>
+              </w:rPr>
+              <w:t>life_bins</w:t>
+            </w:r>
+            <w:proofErr w:type="spellEnd"/>
+            <w:r>
+              <w:rPr>
+                <w:rFonts w:ascii="Times New Roman" w:eastAsia="Times New Roman" w:hAnsi="Times New Roman" w:cs="Times New Roman"/>
+              </w:rPr>
+              <w:t>)</w:t>
+            </w:r>
+          </w:p>
+          <w:p>
+            <w:pPr>
+              <w:rPr>
+                <w:rFonts w:ascii="Times New Roman" w:eastAsia="Times New Roman" w:hAnsi="Times New Roman" w:cs="Times New Roman"/>
+              </w:rPr>
+            </w:pPr>
+          </w:p>
+          <w:p>
+            <w:pPr>
+              <w:rPr>
+                <w:rFonts w:ascii="Times New Roman" w:eastAsia="Times New Roman" w:hAnsi="Times New Roman" w:cs="Times New Roman"/>
+              </w:rPr>
+            </w:pPr>
+            <w:proofErr w:type="spellStart"/>
+            <w:proofErr w:type="gramStart"/>
+            <w:r>
+              <w:rPr>
+                <w:rFonts w:ascii="Times New Roman" w:eastAsia="Times New Roman" w:hAnsi="Times New Roman" w:cs="Times New Roman"/>
+              </w:rPr>
+              <w:t>barplot</w:t>
+            </w:r>
+            <w:proofErr w:type="spellEnd"/>
+            <w:r>
+              <w:rPr>
+                <w:rFonts w:ascii="Times New Roman" w:eastAsia="Times New Roman" w:hAnsi="Times New Roman" w:cs="Times New Roman"/>
+              </w:rPr>
+              <w:t>(</w:t>
+            </w:r>
+            <w:proofErr w:type="spellStart"/>
+            <w:proofErr w:type="gramEnd"/>
+            <w:r>
+              <w:rPr>
+                <w:rFonts w:ascii="Times New Roman" w:eastAsia="Times New Roman" w:hAnsi="Times New Roman" w:cs="Times New Roman"/>
+              </w:rPr>
+              <w:t>life_counts</w:t>
+            </w:r>
+            <w:proofErr w:type="spellEnd"/>
+            <w:r>
+              <w:rPr>
+                <w:rFonts w:ascii="Times New Roman" w:eastAsia="Times New Roman" w:hAnsi="Times New Roman" w:cs="Times New Roman"/>
+              </w:rPr>
+              <w:t>,</w:t>
+            </w:r>
+          </w:p>
+          <w:p>
+            <w:pPr>
+              <w:rPr>
+                <w:rFonts w:ascii="Times New Roman" w:eastAsia="Times New Roman" w:hAnsi="Times New Roman" w:cs="Times New Roman"/>
+              </w:rPr>
+            </w:pPr>
+            <w:r>
+              <w:rPr>
+                <w:rFonts w:ascii="Times New Roman" w:eastAsia="Times New Roman" w:hAnsi="Times New Roman" w:cs="Times New Roman"/>
+              </w:rPr>
+              <w:t xml:space="preserve">        main = "</w:t>
+            </w:r>
+            <w:proofErr w:type="spellStart"/>
+            <w:r>
+              <w:rPr>
+                <w:rFonts w:ascii="Times New Roman" w:eastAsia="Times New Roman" w:hAnsi="Times New Roman" w:cs="Times New Roman"/>
+              </w:rPr>
+              <w:t>Barplot</w:t>
+            </w:r>
+            <w:proofErr w:type="spellEnd"/>
+            <w:r>
+              <w:rPr>
+                <w:rFonts w:ascii="Times New Roman" w:eastAsia="Times New Roman" w:hAnsi="Times New Roman" w:cs="Times New Roman"/>
+              </w:rPr>
+              <w:t xml:space="preserve"> of Life Expectancy Bins",</w:t>
+            </w:r>
+          </w:p>
+          <w:p>
+            <w:pPr>
+              <w:rPr>
+                <w:rFonts w:ascii="Times New Roman" w:eastAsia="Times New Roman" w:hAnsi="Times New Roman" w:cs="Times New Roman"/>
+              </w:rPr>
+            </w:pPr>
+            <w:r>
+              <w:rPr>
+                <w:rFonts w:ascii="Times New Roman" w:eastAsia="Times New Roman" w:hAnsi="Times New Roman" w:cs="Times New Roman"/>
+              </w:rPr>
+              <w:t xml:space="preserve">        </w:t>
+            </w:r>
+            <w:proofErr w:type="spellStart"/>
+            <w:r>
+              <w:rPr>
+                <w:rFonts w:ascii="Times New Roman" w:eastAsia="Times New Roman" w:hAnsi="Times New Roman" w:cs="Times New Roman"/>
+              </w:rPr>
+              <w:t>xlab</w:t>
+            </w:r>
+            <w:proofErr w:type="spellEnd"/>
+            <w:r>
+              <w:rPr>
+                <w:rFonts w:ascii="Times New Roman" w:eastAsia="Times New Roman" w:hAnsi="Times New Roman" w:cs="Times New Roman"/>
+              </w:rPr>
+              <w:t xml:space="preserve"> = "Life Expectancy Range (years)",</w:t>
+            </w:r>
+          </w:p>
+          <w:p>
+            <w:pPr>
+              <w:rPr>
+                <w:rFonts w:ascii="Times New Roman" w:eastAsia="Times New Roman" w:hAnsi="Times New Roman" w:cs="Times New Roman"/>
+              </w:rPr>
+            </w:pPr>
+            <w:r>
+              <w:rPr>
+                <w:rFonts w:ascii="Times New Roman" w:eastAsia="Times New Roman" w:hAnsi="Times New Roman" w:cs="Times New Roman"/>
+              </w:rPr>
+              <w:t xml:space="preserve">        </w:t>
+            </w:r>
+            <w:proofErr w:type="spellStart"/>
+            <w:r>
+              <w:rPr>
+                <w:rFonts w:ascii="Times New Roman" w:eastAsia="Times New Roman" w:hAnsi="Times New Roman" w:cs="Times New Roman"/>
+              </w:rPr>
+              <w:t>ylab</w:t>
+            </w:r>
+            <w:proofErr w:type="spellEnd"/>
+            <w:r>
+              <w:rPr>
+                <w:rFonts w:ascii="Times New Roman" w:eastAsia="Times New Roman" w:hAnsi="Times New Roman" w:cs="Times New Roman"/>
+              </w:rPr>
+              <w:t xml:space="preserve"> = "Count",</w:t>
+            </w:r>
+          </w:p>
+          <w:p>
+            <w:pPr>
+              <w:rPr>
+                <w:rFonts w:ascii="Times New Roman" w:eastAsia="Times New Roman" w:hAnsi="Times New Roman" w:cs="Times New Roman"/>
+              </w:rPr>
+            </w:pPr>
+            <w:r>
+              <w:rPr>
+                <w:rFonts w:ascii="Times New Roman" w:eastAsia="Times New Roman" w:hAnsi="Times New Roman" w:cs="Times New Roman"/>
+              </w:rPr>
+              <w:t xml:space="preserve">        col = "coral",</w:t>
+            </w:r>
+          </w:p>
+          <w:p>
+            <w:pPr>
+              <w:rPr>
+                <w:rFonts w:ascii="Times New Roman" w:eastAsia="Times New Roman" w:hAnsi="Times New Roman" w:cs="Times New Roman"/>
+              </w:rPr>
+            </w:pPr>
+            <w:r>
+              <w:rPr>
+                <w:rFonts w:ascii="Times New Roman" w:eastAsia="Times New Roman" w:hAnsi="Times New Roman" w:cs="Times New Roman"/>
+              </w:rPr>
+              <w:t xml:space="preserve">        las = 2)</w:t>
+            </w:r>
+          </w:p>
+          <w:p>
+            <w:pPr>
+              <w:rPr>
+                <w:rFonts w:ascii="Times New Roman" w:eastAsia="Times New Roman" w:hAnsi="Times New Roman" w:cs="Times New Roman"/>
+              </w:rPr>
+            </w:pPr>
+          </w:p>
+          <w:p>
+            <w:pPr>
+              <w:rPr>
+                <w:rFonts w:ascii="Times New Roman" w:eastAsia="Times New Roman" w:hAnsi="Times New Roman" w:cs="Times New Roman"/>
+              </w:rPr>
+            </w:pPr>
+            <w:proofErr w:type="gramStart"/>
+            <w:r>
+              <w:rPr>
+                <w:rFonts w:ascii="Times New Roman" w:eastAsia="Times New Roman" w:hAnsi="Times New Roman" w:cs="Times New Roman"/>
+              </w:rPr>
+              <w:t>cat(</w:t>
+            </w:r>
+            <w:proofErr w:type="gramEnd"/>
+            <w:r>
+              <w:rPr>
+                <w:rFonts w:ascii="Times New Roman" w:eastAsia="Times New Roman" w:hAnsi="Times New Roman" w:cs="Times New Roman"/>
+              </w:rPr>
+              <w:t xml:space="preserve">"Displayed: </w:t>
+            </w:r>
+            <w:proofErr w:type="spellStart"/>
+            <w:r>
+              <w:rPr>
+                <w:rFonts w:ascii="Times New Roman" w:eastAsia="Times New Roman" w:hAnsi="Times New Roman" w:cs="Times New Roman"/>
+              </w:rPr>
+              <w:t>Barplot</w:t>
+            </w:r>
+            <w:proofErr w:type="spellEnd"/>
+            <w:r>
+              <w:rPr>
+                <w:rFonts w:ascii="Times New Roman" w:eastAsia="Times New Roman" w:hAnsi="Times New Roman" w:cs="Times New Roman"/>
+              </w:rPr>
+              <w:t xml:space="preserve"> for Life Expectancy\n\n")</w:t>
+            </w:r>
+          </w:p>
+        </w:tc>
+      </w:tr>
+    </w:tbl>
+    <w:p>
+      <w:pPr>
         <w:rPr>
           <w:rFonts w:ascii="Times New Roman" w:eastAsia="Times New Roman" w:hAnsi="Times New Roman" w:cs="Times New Roman"/>
           <w:b/>
           <w:bCs/>
-          <w:i/>
-          <w:iCs/>
-        </w:rPr>
-        <w:t xml:space="preserve"> count)</w:t>
-      </w:r>
-    </w:p>
-    <w:p>
-      <w:pPr>
-        <w:pStyle w:val="ListParagraph"/>
-        <w:ind w:left="2250" w:hanging="810"/>
-        <w:rPr>
-          <w:rFonts w:ascii="Times New Roman" w:eastAsia="Times New Roman" w:hAnsi="Times New Roman" w:cs="Times New Roman"/>
-        </w:rPr>
-      </w:pPr>
-      <w:proofErr w:type="spellStart"/>
-      <w:r>
-        <w:rPr>
-          <w:rFonts w:ascii="Times New Roman" w:eastAsia="Times New Roman" w:hAnsi="Times New Roman" w:cs="Times New Roman"/>
-        </w:rPr>
-        <w:t>Analysis.R</w:t>
-      </w:r>
-      <w:proofErr w:type="spellEnd"/>
-      <w:r>
-        <w:rPr>
-          <w:rFonts w:ascii="Times New Roman" w:eastAsia="Times New Roman" w:hAnsi="Times New Roman" w:cs="Times New Roman"/>
-        </w:rPr>
-        <w:t xml:space="preserve"> code with the appropriate statistics to test the hypotheses. </w:t>
-      </w:r>
-    </w:p>
-    <w:p>
-      <w:pPr>
-        <w:pStyle w:val="ListParagraph"/>
-        <w:numPr>
-          <w:ilvl w:val="0"/>
-          <w:numId w:val="19"/>
-        </w:numPr>
-        <w:ind w:left="1440"/>
-        <w:rPr>
-          <w:rFonts w:ascii="Times New Roman" w:eastAsia="Times New Roman" w:hAnsi="Times New Roman" w:cs="Times New Roman"/>
-          <w:i/>
-          <w:iCs/>
-          <w:highlight w:val="yellow"/>
-        </w:rPr>
-      </w:pPr>
-      <w:r>
-        <w:rPr>
-          <w:rFonts w:ascii="Times New Roman" w:eastAsia="Times New Roman" w:hAnsi="Times New Roman" w:cs="Times New Roman"/>
-          <w:b/>
-          <w:bCs/>
-          <w:i/>
-          <w:iCs/>
-          <w:highlight w:val="yellow"/>
-        </w:rPr>
-        <w:t>No word count</w:t>
-      </w:r>
-      <w:r>
-        <w:rPr>
-          <w:rFonts w:ascii="Times New Roman" w:eastAsia="Times New Roman" w:hAnsi="Times New Roman" w:cs="Times New Roman"/>
-          <w:i/>
-          <w:iCs/>
-          <w:highlight w:val="yellow"/>
-        </w:rPr>
-        <w:t>, but ensure the code is without redundant lines, well-commented and produces the correct output.</w:t>
-      </w:r>
-      <w:r>
-        <w:rPr>
-          <w:rFonts w:ascii="Times New Roman" w:eastAsia="Times New Roman" w:hAnsi="Times New Roman" w:cs="Times New Roman"/>
-          <w:i/>
-          <w:iCs/>
-        </w:rPr>
-        <w:t xml:space="preserve"> </w:t>
-      </w:r>
-    </w:p>
-    <w:p>
-      <w:pPr>
-        <w:pStyle w:val="ListParagraph"/>
-        <w:numPr>
-          <w:ilvl w:val="0"/>
-          <w:numId w:val="19"/>
-        </w:numPr>
-        <w:ind w:left="1440"/>
-        <w:rPr>
-          <w:rFonts w:ascii="Times New Roman" w:eastAsia="Times New Roman" w:hAnsi="Times New Roman" w:cs="Times New Roman"/>
-          <w:i/>
-          <w:iCs/>
-          <w:highlight w:val="yellow"/>
-        </w:rPr>
-      </w:pPr>
-      <w:r>
-        <w:rPr>
-          <w:rFonts w:ascii="Times New Roman" w:eastAsia="Times New Roman" w:hAnsi="Times New Roman" w:cs="Times New Roman"/>
-          <w:i/>
-          <w:iCs/>
-          <w:highlight w:val="yellow"/>
-        </w:rPr>
-        <w:t>Make sure it runs (look in Rscript.log for output from a statistical test)</w:t>
-      </w:r>
-    </w:p>
-    <w:p>
-      <w:pPr>
-        <w:pStyle w:val="ListParagraph"/>
-        <w:numPr>
-          <w:ilvl w:val="0"/>
-          <w:numId w:val="19"/>
-        </w:numPr>
-        <w:ind w:left="1440"/>
-        <w:rPr>
-          <w:rFonts w:ascii="Times New Roman" w:eastAsia="Times New Roman" w:hAnsi="Times New Roman" w:cs="Times New Roman"/>
-          <w:highlight w:val="yellow"/>
-        </w:rPr>
-      </w:pPr>
-      <w:r>
-        <w:rPr>
-          <w:rFonts w:ascii="Times New Roman" w:eastAsia="Times New Roman" w:hAnsi="Times New Roman" w:cs="Times New Roman"/>
-          <w:i/>
-          <w:iCs/>
-          <w:highlight w:val="yellow"/>
-        </w:rPr>
-        <w:t>It should compute appropriate statistics to test the hypotheses</w:t>
-      </w:r>
+        </w:rPr>
+      </w:pPr>
     </w:p>
     <w:p>
       <w:pPr>
@@ -9003,6 +13436,7 @@
   <w:style w:type="character" w:default="1" w:styleId="DefaultParagraphFont">
     <w:name w:val="Default Paragraph Font"/>
     <w:uiPriority w:val="1"/>
+    <w:semiHidden/>
     <w:unhideWhenUsed/>
   </w:style>
   <w:style w:type="table" w:default="1" w:styleId="TableNormal">
@@ -9463,6 +13897,22 @@
       <w:shd w:val="clear" w:color="auto" w:fill="E1DFDD"/>
     </w:rPr>
   </w:style>
+  <w:style w:type="table" w:styleId="TableGrid">
+    <w:name w:val="Table Grid"/>
+    <w:basedOn w:val="TableNormal"/>
+    <w:uiPriority w:val="39"/>
+    <w:rsid w:val="0067706B"/>
+    <w:tblPr>
+      <w:tblBorders>
+        <w:top w:val="single" w:sz="4" w:space="0" w:color="auto"/>
+        <w:left w:val="single" w:sz="4" w:space="0" w:color="auto"/>
+        <w:bottom w:val="single" w:sz="4" w:space="0" w:color="auto"/>
+        <w:right w:val="single" w:sz="4" w:space="0" w:color="auto"/>
+        <w:insideH w:val="single" w:sz="4" w:space="0" w:color="auto"/>
+        <w:insideV w:val="single" w:sz="4" w:space="0" w:color="auto"/>
+      </w:tblBorders>
+    </w:tblPr>
+  </w:style>
 </w:styles>
 </file>
 

</xml_diff>

<commit_message>
Updated the R value in Analysis Documentation
</commit_message>
<xml_diff>
--- a/7COM1079_Final report_template.docx
+++ b/7COM1079_Final report_template.docx
@@ -473,12 +473,19 @@
     <w:p>
       <w:pPr>
         <w:jc w:val="center"/>
-      </w:pPr>
-      <w:r>
-        <w:rPr>
-          <w:rFonts w:ascii="Times New Roman" w:eastAsia="Times New Roman" w:hAnsi="Times New Roman" w:cs="Times New Roman"/>
-        </w:rPr>
-        <w:lastRenderedPageBreak/>
+        <w:rPr>
+          <w:rFonts w:ascii="Times New Roman" w:eastAsia="Times New Roman" w:hAnsi="Times New Roman" w:cs="Times New Roman"/>
+        </w:rPr>
+      </w:pPr>
+    </w:p>
+    <w:p>
+      <w:pPr>
+        <w:jc w:val="center"/>
+      </w:pPr>
+      <w:r>
+        <w:rPr>
+          <w:rFonts w:ascii="Times New Roman" w:eastAsia="Times New Roman" w:hAnsi="Times New Roman" w:cs="Times New Roman"/>
+        </w:rPr>
         <w:t>Table of Contents</w:t>
       </w:r>
       <w:r>
@@ -1399,6 +1406,20 @@
         </w:rPr>
         <w:t xml:space="preserve"> Introduction</w:t>
       </w:r>
+    </w:p>
+    <w:p>
+      <w:pPr>
+        <w:pStyle w:val="ListParagraph"/>
+        <w:spacing w:after="160" w:line="278" w:lineRule="auto"/>
+        <w:ind w:left="420"/>
+        <w:rPr>
+          <w:rFonts w:ascii="Times New Roman" w:hAnsi="Times New Roman" w:cs="Times New Roman"/>
+          <w:b/>
+          <w:bCs/>
+          <w:sz w:val="32"/>
+          <w:szCs w:val="32"/>
+        </w:rPr>
+      </w:pPr>
     </w:p>
     <w:p>
       <w:pPr>
@@ -1723,6 +1744,7 @@
         <w:rPr>
           <w:rFonts w:ascii="Times New Roman" w:eastAsia="Times New Roman" w:hAnsi="Times New Roman" w:cs="Times New Roman"/>
         </w:rPr>
+        <w:lastRenderedPageBreak/>
         <w:t xml:space="preserve"> </w:t>
       </w:r>
     </w:p>
@@ -2424,6 +2446,7 @@
           <w:i/>
           <w:highlight w:val="yellow"/>
         </w:rPr>
+        <w:lastRenderedPageBreak/>
         <w:t>Make sure the title or caption and axis labels</w:t>
       </w:r>
       <w:r>
@@ -3782,7 +3805,6 @@
           <w:sz w:val="28"/>
           <w:szCs w:val="28"/>
         </w:rPr>
-        <w:lastRenderedPageBreak/>
         <w:t>The null hypothesis is rejected based on the p-value</w:t>
       </w:r>
       <w:r>
@@ -3855,7 +3877,7 @@
           <w:rFonts w:ascii="Times New Roman" w:eastAsia="Times New Roman" w:hAnsi="Times New Roman" w:cs="Times New Roman"/>
           <w:lang w:val="en-IN"/>
         </w:rPr>
-        <w:t>The p-value of</w:t>
+        <w:t xml:space="preserve">The p-value of </w:t>
       </w:r>
       <w:r>
         <w:rPr>
@@ -3864,9 +3886,15 @@
           <w:bCs/>
           <w:lang w:val="en-IN"/>
         </w:rPr>
-        <w:t xml:space="preserve"> </w:t>
-      </w:r>
-      <w:proofErr w:type="gramStart"/>
+        <w:t>0.00034</w:t>
+      </w:r>
+      <w:r>
+        <w:rPr>
+          <w:rFonts w:ascii="Times New Roman" w:eastAsia="Times New Roman" w:hAnsi="Times New Roman" w:cs="Times New Roman"/>
+          <w:lang w:val="en-IN"/>
+        </w:rPr>
+        <w:t xml:space="preserve">, which is below the 0.05 significance level, leads to the rejection of the null hypothesis. There is a </w:t>
+      </w:r>
       <w:r>
         <w:rPr>
           <w:rFonts w:ascii="Times New Roman" w:eastAsia="Times New Roman" w:hAnsi="Times New Roman" w:cs="Times New Roman"/>
@@ -3874,29 +3902,14 @@
           <w:bCs/>
           <w:lang w:val="en-IN"/>
         </w:rPr>
-        <w:t>0.00034</w:t>
+        <w:t>weak positive</w:t>
       </w:r>
       <w:r>
         <w:rPr>
           <w:rFonts w:ascii="Times New Roman" w:eastAsia="Times New Roman" w:hAnsi="Times New Roman" w:cs="Times New Roman"/>
           <w:lang w:val="en-IN"/>
         </w:rPr>
-        <w:t xml:space="preserve"> </w:t>
-      </w:r>
-      <w:r>
-        <w:rPr>
-          <w:rFonts w:ascii="Times New Roman" w:eastAsia="Times New Roman" w:hAnsi="Times New Roman" w:cs="Times New Roman"/>
-          <w:lang w:val="en-IN"/>
-        </w:rPr>
-        <w:t>,</w:t>
-      </w:r>
-      <w:proofErr w:type="gramEnd"/>
-      <w:r>
-        <w:rPr>
-          <w:rFonts w:ascii="Times New Roman" w:eastAsia="Times New Roman" w:hAnsi="Times New Roman" w:cs="Times New Roman"/>
-          <w:lang w:val="en-IN"/>
-        </w:rPr>
-        <w:t xml:space="preserve"> which is below the 0.05 significance level, leads to the rejection of the null hypothesis. There is a </w:t>
+        <w:t xml:space="preserve"> link between life expectancy and alcohol intake, according to the Pearson correlation coefficient of </w:t>
       </w:r>
       <w:r>
         <w:rPr>
@@ -3905,30 +3918,14 @@
           <w:bCs/>
           <w:lang w:val="en-IN"/>
         </w:rPr>
-        <w:t>moderately positive</w:t>
+        <w:t>r = 0.15</w:t>
       </w:r>
       <w:r>
         <w:rPr>
           <w:rFonts w:ascii="Times New Roman" w:eastAsia="Times New Roman" w:hAnsi="Times New Roman" w:cs="Times New Roman"/>
           <w:lang w:val="en-IN"/>
         </w:rPr>
-        <w:t xml:space="preserve"> association between life expectancy and alcohol intake, according to the Pearson correlation value of </w:t>
-      </w:r>
-      <w:r>
-        <w:rPr>
-          <w:rFonts w:ascii="Times New Roman" w:eastAsia="Times New Roman" w:hAnsi="Times New Roman" w:cs="Times New Roman"/>
-          <w:b/>
-          <w:bCs/>
-          <w:lang w:val="en-IN"/>
-        </w:rPr>
-        <w:t>r = 0.48</w:t>
-      </w:r>
-      <w:r>
-        <w:rPr>
-          <w:rFonts w:ascii="Times New Roman" w:eastAsia="Times New Roman" w:hAnsi="Times New Roman" w:cs="Times New Roman"/>
-          <w:lang w:val="en-IN"/>
-        </w:rPr>
-        <w:t>. This demonstrates that across nations, higher national alcohol consumption is typically linked to longer life expectancies. The statistical evidence supports a significant linear association between the variables, even though the correlation does not imply causality. This suggests that patterns of alcohol intake at the population level are significantly related to life expectancy outcomes.</w:t>
+        <w:t>. This indicates that, although the correlation is small, nations with somewhat higher alcohol use typically have slightly longer life expectancies. The statistically significant p-value indicates a linear relationship between the variables despite its weakness, indicating a modest correlation between national alcohol consumption levels and population life expectancy outcomes.</w:t>
       </w:r>
     </w:p>
     <w:p>
@@ -5055,6 +5052,16 @@
         </w:rPr>
         <w:t xml:space="preserve"> </w:t>
       </w:r>
+    </w:p>
+    <w:p>
+      <w:pPr>
+        <w:rPr>
+          <w:rFonts w:ascii="Times New Roman" w:eastAsia="Times New Roman" w:hAnsi="Times New Roman" w:cs="Times New Roman"/>
+          <w:b/>
+          <w:bCs/>
+          <w:color w:val="333333"/>
+        </w:rPr>
+      </w:pPr>
     </w:p>
     <w:p>
       <w:pPr>
@@ -5458,7 +5465,6 @@
               <w:rPr>
                 <w:rFonts w:ascii="Times New Roman" w:eastAsia="Times New Roman" w:hAnsi="Times New Roman" w:cs="Times New Roman"/>
               </w:rPr>
-              <w:lastRenderedPageBreak/>
               <w:t>cat(</w:t>
             </w:r>
             <w:proofErr w:type="gramEnd"/>
@@ -6437,7 +6443,6 @@
               <w:rPr>
                 <w:rFonts w:ascii="Times New Roman" w:eastAsia="Times New Roman" w:hAnsi="Times New Roman" w:cs="Times New Roman"/>
               </w:rPr>
-              <w:lastRenderedPageBreak/>
               <w:t># ============================================================================</w:t>
             </w:r>
           </w:p>
@@ -7400,7 +7405,6 @@
               <w:rPr>
                 <w:rFonts w:ascii="Times New Roman" w:eastAsia="Times New Roman" w:hAnsi="Times New Roman" w:cs="Times New Roman"/>
               </w:rPr>
-              <w:lastRenderedPageBreak/>
               <w:t>cat(</w:t>
             </w:r>
             <w:proofErr w:type="gramEnd"/>
@@ -8386,6 +8390,7 @@
               <w:rPr>
                 <w:rFonts w:ascii="Times New Roman" w:eastAsia="Times New Roman" w:hAnsi="Times New Roman" w:cs="Times New Roman"/>
               </w:rPr>
+              <w:lastRenderedPageBreak/>
               <w:t>hist(</w:t>
             </w:r>
             <w:proofErr w:type="spellStart"/>
@@ -8454,8 +8459,1127 @@
               <w:rPr>
                 <w:rFonts w:ascii="Times New Roman" w:eastAsia="Times New Roman" w:hAnsi="Times New Roman" w:cs="Times New Roman"/>
               </w:rPr>
+              <w:t xml:space="preserve">     </w:t>
+            </w:r>
+            <w:proofErr w:type="spellStart"/>
+            <w:r>
+              <w:rPr>
+                <w:rFonts w:ascii="Times New Roman" w:eastAsia="Times New Roman" w:hAnsi="Times New Roman" w:cs="Times New Roman"/>
+              </w:rPr>
+              <w:t>ylab</w:t>
+            </w:r>
+            <w:proofErr w:type="spellEnd"/>
+            <w:r>
+              <w:rPr>
+                <w:rFonts w:ascii="Times New Roman" w:eastAsia="Times New Roman" w:hAnsi="Times New Roman" w:cs="Times New Roman"/>
+              </w:rPr>
+              <w:t xml:space="preserve"> = "Frequency",</w:t>
+            </w:r>
+          </w:p>
+          <w:p>
+            <w:pPr>
+              <w:rPr>
+                <w:rFonts w:ascii="Times New Roman" w:eastAsia="Times New Roman" w:hAnsi="Times New Roman" w:cs="Times New Roman"/>
+              </w:rPr>
+            </w:pPr>
+            <w:r>
+              <w:rPr>
+                <w:rFonts w:ascii="Times New Roman" w:eastAsia="Times New Roman" w:hAnsi="Times New Roman" w:cs="Times New Roman"/>
+              </w:rPr>
+              <w:t xml:space="preserve">     col = "coral",</w:t>
+            </w:r>
+          </w:p>
+          <w:p>
+            <w:pPr>
+              <w:rPr>
+                <w:rFonts w:ascii="Times New Roman" w:eastAsia="Times New Roman" w:hAnsi="Times New Roman" w:cs="Times New Roman"/>
+              </w:rPr>
+            </w:pPr>
+            <w:r>
+              <w:rPr>
+                <w:rFonts w:ascii="Times New Roman" w:eastAsia="Times New Roman" w:hAnsi="Times New Roman" w:cs="Times New Roman"/>
+              </w:rPr>
+              <w:t xml:space="preserve">     border = "white",</w:t>
+            </w:r>
+          </w:p>
+          <w:p>
+            <w:pPr>
+              <w:rPr>
+                <w:rFonts w:ascii="Times New Roman" w:eastAsia="Times New Roman" w:hAnsi="Times New Roman" w:cs="Times New Roman"/>
+              </w:rPr>
+            </w:pPr>
+            <w:r>
+              <w:rPr>
+                <w:rFonts w:ascii="Times New Roman" w:eastAsia="Times New Roman" w:hAnsi="Times New Roman" w:cs="Times New Roman"/>
+              </w:rPr>
+              <w:t xml:space="preserve">     breaks = 15)</w:t>
+            </w:r>
+          </w:p>
+          <w:p>
+            <w:pPr>
+              <w:rPr>
+                <w:rFonts w:ascii="Times New Roman" w:eastAsia="Times New Roman" w:hAnsi="Times New Roman" w:cs="Times New Roman"/>
+              </w:rPr>
+            </w:pPr>
+          </w:p>
+          <w:p>
+            <w:pPr>
+              <w:rPr>
+                <w:rFonts w:ascii="Times New Roman" w:eastAsia="Times New Roman" w:hAnsi="Times New Roman" w:cs="Times New Roman"/>
+              </w:rPr>
+            </w:pPr>
+            <w:proofErr w:type="gramStart"/>
+            <w:r>
+              <w:rPr>
+                <w:rFonts w:ascii="Times New Roman" w:eastAsia="Times New Roman" w:hAnsi="Times New Roman" w:cs="Times New Roman"/>
+              </w:rPr>
+              <w:t>cat(</w:t>
+            </w:r>
+            <w:proofErr w:type="gramEnd"/>
+            <w:r>
+              <w:rPr>
+                <w:rFonts w:ascii="Times New Roman" w:eastAsia="Times New Roman" w:hAnsi="Times New Roman" w:cs="Times New Roman"/>
+              </w:rPr>
+              <w:t>"Displayed: Histogram of Life Expectancy\n")</w:t>
+            </w:r>
+          </w:p>
+          <w:p>
+            <w:pPr>
+              <w:rPr>
+                <w:rFonts w:ascii="Times New Roman" w:eastAsia="Times New Roman" w:hAnsi="Times New Roman" w:cs="Times New Roman"/>
+              </w:rPr>
+            </w:pPr>
+          </w:p>
+          <w:p>
+            <w:pPr>
+              <w:rPr>
+                <w:rFonts w:ascii="Times New Roman" w:eastAsia="Times New Roman" w:hAnsi="Times New Roman" w:cs="Times New Roman"/>
+              </w:rPr>
+            </w:pPr>
+            <w:r>
+              <w:rPr>
+                <w:rFonts w:ascii="Times New Roman" w:eastAsia="Times New Roman" w:hAnsi="Times New Roman" w:cs="Times New Roman"/>
+              </w:rPr>
+              <w:t># --------------------------------------------------</w:t>
+            </w:r>
+          </w:p>
+          <w:p>
+            <w:pPr>
+              <w:rPr>
+                <w:rFonts w:ascii="Times New Roman" w:eastAsia="Times New Roman" w:hAnsi="Times New Roman" w:cs="Times New Roman"/>
+              </w:rPr>
+            </w:pPr>
+            <w:r>
+              <w:rPr>
+                <w:rFonts w:ascii="Times New Roman" w:eastAsia="Times New Roman" w:hAnsi="Times New Roman" w:cs="Times New Roman"/>
+              </w:rPr>
+              <w:t xml:space="preserve"># Visualization 3: Scatter Plot </w:t>
+            </w:r>
+          </w:p>
+          <w:p>
+            <w:pPr>
+              <w:rPr>
+                <w:rFonts w:ascii="Times New Roman" w:eastAsia="Times New Roman" w:hAnsi="Times New Roman" w:cs="Times New Roman"/>
+              </w:rPr>
+            </w:pPr>
+            <w:r>
+              <w:rPr>
+                <w:rFonts w:ascii="Times New Roman" w:eastAsia="Times New Roman" w:hAnsi="Times New Roman" w:cs="Times New Roman"/>
+              </w:rPr>
+              <w:t># --------------------------------------------------</w:t>
+            </w:r>
+          </w:p>
+          <w:p>
+            <w:pPr>
+              <w:rPr>
+                <w:rFonts w:ascii="Times New Roman" w:eastAsia="Times New Roman" w:hAnsi="Times New Roman" w:cs="Times New Roman"/>
+              </w:rPr>
+            </w:pPr>
+          </w:p>
+          <w:p>
+            <w:pPr>
+              <w:rPr>
+                <w:rFonts w:ascii="Times New Roman" w:eastAsia="Times New Roman" w:hAnsi="Times New Roman" w:cs="Times New Roman"/>
+              </w:rPr>
+            </w:pPr>
+            <w:proofErr w:type="gramStart"/>
+            <w:r>
+              <w:rPr>
+                <w:rFonts w:ascii="Times New Roman" w:eastAsia="Times New Roman" w:hAnsi="Times New Roman" w:cs="Times New Roman"/>
+              </w:rPr>
+              <w:t>plot(</w:t>
+            </w:r>
+            <w:proofErr w:type="spellStart"/>
+            <w:proofErr w:type="gramEnd"/>
+            <w:r>
+              <w:rPr>
+                <w:rFonts w:ascii="Times New Roman" w:eastAsia="Times New Roman" w:hAnsi="Times New Roman" w:cs="Times New Roman"/>
+              </w:rPr>
+              <w:t>data_clean$Alcohol_Consumption</w:t>
+            </w:r>
+            <w:proofErr w:type="spellEnd"/>
+            <w:r>
+              <w:rPr>
+                <w:rFonts w:ascii="Times New Roman" w:eastAsia="Times New Roman" w:hAnsi="Times New Roman" w:cs="Times New Roman"/>
+              </w:rPr>
+              <w:t xml:space="preserve">, </w:t>
+            </w:r>
+          </w:p>
+          <w:p>
+            <w:pPr>
+              <w:rPr>
+                <w:rFonts w:ascii="Times New Roman" w:eastAsia="Times New Roman" w:hAnsi="Times New Roman" w:cs="Times New Roman"/>
+              </w:rPr>
+            </w:pPr>
+            <w:r>
+              <w:rPr>
+                <w:rFonts w:ascii="Times New Roman" w:eastAsia="Times New Roman" w:hAnsi="Times New Roman" w:cs="Times New Roman"/>
+              </w:rPr>
+              <w:t xml:space="preserve">     </w:t>
+            </w:r>
+            <w:proofErr w:type="spellStart"/>
+            <w:r>
+              <w:rPr>
+                <w:rFonts w:ascii="Times New Roman" w:eastAsia="Times New Roman" w:hAnsi="Times New Roman" w:cs="Times New Roman"/>
+              </w:rPr>
+              <w:t>data_clean$Life_Expectancy</w:t>
+            </w:r>
+            <w:proofErr w:type="spellEnd"/>
+            <w:r>
+              <w:rPr>
+                <w:rFonts w:ascii="Times New Roman" w:eastAsia="Times New Roman" w:hAnsi="Times New Roman" w:cs="Times New Roman"/>
+              </w:rPr>
+              <w:t>,</w:t>
+            </w:r>
+          </w:p>
+          <w:p>
+            <w:pPr>
+              <w:rPr>
+                <w:rFonts w:ascii="Times New Roman" w:eastAsia="Times New Roman" w:hAnsi="Times New Roman" w:cs="Times New Roman"/>
+              </w:rPr>
+            </w:pPr>
+            <w:r>
+              <w:rPr>
+                <w:rFonts w:ascii="Times New Roman" w:eastAsia="Times New Roman" w:hAnsi="Times New Roman" w:cs="Times New Roman"/>
+              </w:rPr>
+              <w:t xml:space="preserve">     main = "Alcohol Consumption vs Life Expectancy",</w:t>
+            </w:r>
+          </w:p>
+          <w:p>
+            <w:pPr>
+              <w:rPr>
+                <w:rFonts w:ascii="Times New Roman" w:eastAsia="Times New Roman" w:hAnsi="Times New Roman" w:cs="Times New Roman"/>
+              </w:rPr>
+            </w:pPr>
+            <w:r>
+              <w:rPr>
+                <w:rFonts w:ascii="Times New Roman" w:eastAsia="Times New Roman" w:hAnsi="Times New Roman" w:cs="Times New Roman"/>
+              </w:rPr>
+              <w:t xml:space="preserve">     </w:t>
+            </w:r>
+            <w:proofErr w:type="spellStart"/>
+            <w:r>
+              <w:rPr>
+                <w:rFonts w:ascii="Times New Roman" w:eastAsia="Times New Roman" w:hAnsi="Times New Roman" w:cs="Times New Roman"/>
+              </w:rPr>
+              <w:t>xlab</w:t>
+            </w:r>
+            <w:proofErr w:type="spellEnd"/>
+            <w:r>
+              <w:rPr>
+                <w:rFonts w:ascii="Times New Roman" w:eastAsia="Times New Roman" w:hAnsi="Times New Roman" w:cs="Times New Roman"/>
+              </w:rPr>
+              <w:t xml:space="preserve"> = "Alcohol Consumption (litres per capita)",</w:t>
+            </w:r>
+          </w:p>
+          <w:p>
+            <w:pPr>
+              <w:rPr>
+                <w:rFonts w:ascii="Times New Roman" w:eastAsia="Times New Roman" w:hAnsi="Times New Roman" w:cs="Times New Roman"/>
+              </w:rPr>
+            </w:pPr>
+            <w:r>
+              <w:rPr>
+                <w:rFonts w:ascii="Times New Roman" w:eastAsia="Times New Roman" w:hAnsi="Times New Roman" w:cs="Times New Roman"/>
+              </w:rPr>
+              <w:t xml:space="preserve">     </w:t>
+            </w:r>
+            <w:proofErr w:type="spellStart"/>
+            <w:r>
+              <w:rPr>
+                <w:rFonts w:ascii="Times New Roman" w:eastAsia="Times New Roman" w:hAnsi="Times New Roman" w:cs="Times New Roman"/>
+              </w:rPr>
+              <w:t>ylab</w:t>
+            </w:r>
+            <w:proofErr w:type="spellEnd"/>
+            <w:r>
+              <w:rPr>
+                <w:rFonts w:ascii="Times New Roman" w:eastAsia="Times New Roman" w:hAnsi="Times New Roman" w:cs="Times New Roman"/>
+              </w:rPr>
+              <w:t xml:space="preserve"> = "Life Expectancy (years)",</w:t>
+            </w:r>
+          </w:p>
+          <w:p>
+            <w:pPr>
+              <w:rPr>
+                <w:rFonts w:ascii="Times New Roman" w:eastAsia="Times New Roman" w:hAnsi="Times New Roman" w:cs="Times New Roman"/>
+              </w:rPr>
+            </w:pPr>
+            <w:r>
+              <w:rPr>
+                <w:rFonts w:ascii="Times New Roman" w:eastAsia="Times New Roman" w:hAnsi="Times New Roman" w:cs="Times New Roman"/>
+              </w:rPr>
+              <w:t xml:space="preserve">     </w:t>
+            </w:r>
+            <w:proofErr w:type="spellStart"/>
+            <w:r>
+              <w:rPr>
+                <w:rFonts w:ascii="Times New Roman" w:eastAsia="Times New Roman" w:hAnsi="Times New Roman" w:cs="Times New Roman"/>
+              </w:rPr>
+              <w:t>pch</w:t>
+            </w:r>
+            <w:proofErr w:type="spellEnd"/>
+            <w:r>
+              <w:rPr>
+                <w:rFonts w:ascii="Times New Roman" w:eastAsia="Times New Roman" w:hAnsi="Times New Roman" w:cs="Times New Roman"/>
+              </w:rPr>
+              <w:t xml:space="preserve"> = 19,</w:t>
+            </w:r>
+          </w:p>
+          <w:p>
+            <w:pPr>
+              <w:rPr>
+                <w:rFonts w:ascii="Times New Roman" w:eastAsia="Times New Roman" w:hAnsi="Times New Roman" w:cs="Times New Roman"/>
+              </w:rPr>
+            </w:pPr>
+            <w:r>
+              <w:rPr>
+                <w:rFonts w:ascii="Times New Roman" w:eastAsia="Times New Roman" w:hAnsi="Times New Roman" w:cs="Times New Roman"/>
+              </w:rPr>
+              <w:t xml:space="preserve">     col = </w:t>
+            </w:r>
+            <w:proofErr w:type="spellStart"/>
+            <w:proofErr w:type="gramStart"/>
+            <w:r>
+              <w:rPr>
+                <w:rFonts w:ascii="Times New Roman" w:eastAsia="Times New Roman" w:hAnsi="Times New Roman" w:cs="Times New Roman"/>
+              </w:rPr>
+              <w:t>rgb</w:t>
+            </w:r>
+            <w:proofErr w:type="spellEnd"/>
+            <w:r>
+              <w:rPr>
+                <w:rFonts w:ascii="Times New Roman" w:eastAsia="Times New Roman" w:hAnsi="Times New Roman" w:cs="Times New Roman"/>
+              </w:rPr>
+              <w:t>(</w:t>
+            </w:r>
+            <w:proofErr w:type="gramEnd"/>
+            <w:r>
+              <w:rPr>
+                <w:rFonts w:ascii="Times New Roman" w:eastAsia="Times New Roman" w:hAnsi="Times New Roman" w:cs="Times New Roman"/>
+              </w:rPr>
+              <w:t>0, 0, 0.5, 0.6),</w:t>
+            </w:r>
+          </w:p>
+          <w:p>
+            <w:pPr>
+              <w:rPr>
+                <w:rFonts w:ascii="Times New Roman" w:eastAsia="Times New Roman" w:hAnsi="Times New Roman" w:cs="Times New Roman"/>
+              </w:rPr>
+            </w:pPr>
+            <w:r>
+              <w:rPr>
+                <w:rFonts w:ascii="Times New Roman" w:eastAsia="Times New Roman" w:hAnsi="Times New Roman" w:cs="Times New Roman"/>
+              </w:rPr>
+              <w:t xml:space="preserve">     </w:t>
+            </w:r>
+            <w:proofErr w:type="spellStart"/>
+            <w:r>
+              <w:rPr>
+                <w:rFonts w:ascii="Times New Roman" w:eastAsia="Times New Roman" w:hAnsi="Times New Roman" w:cs="Times New Roman"/>
+              </w:rPr>
+              <w:t>cex</w:t>
+            </w:r>
+            <w:proofErr w:type="spellEnd"/>
+            <w:r>
+              <w:rPr>
+                <w:rFonts w:ascii="Times New Roman" w:eastAsia="Times New Roman" w:hAnsi="Times New Roman" w:cs="Times New Roman"/>
+              </w:rPr>
+              <w:t xml:space="preserve"> = 1.1)</w:t>
+            </w:r>
+          </w:p>
+          <w:p>
+            <w:pPr>
+              <w:rPr>
+                <w:rFonts w:ascii="Times New Roman" w:eastAsia="Times New Roman" w:hAnsi="Times New Roman" w:cs="Times New Roman"/>
+              </w:rPr>
+            </w:pPr>
+          </w:p>
+          <w:p>
+            <w:pPr>
+              <w:rPr>
+                <w:rFonts w:ascii="Times New Roman" w:eastAsia="Times New Roman" w:hAnsi="Times New Roman" w:cs="Times New Roman"/>
+              </w:rPr>
+            </w:pPr>
+            <w:proofErr w:type="gramStart"/>
+            <w:r>
+              <w:rPr>
+                <w:rFonts w:ascii="Times New Roman" w:eastAsia="Times New Roman" w:hAnsi="Times New Roman" w:cs="Times New Roman"/>
+              </w:rPr>
+              <w:t>grid(</w:t>
+            </w:r>
+            <w:proofErr w:type="gramEnd"/>
+            <w:r>
+              <w:rPr>
+                <w:rFonts w:ascii="Times New Roman" w:eastAsia="Times New Roman" w:hAnsi="Times New Roman" w:cs="Times New Roman"/>
+              </w:rPr>
+              <w:t>col = "</w:t>
+            </w:r>
+            <w:proofErr w:type="spellStart"/>
+            <w:r>
+              <w:rPr>
+                <w:rFonts w:ascii="Times New Roman" w:eastAsia="Times New Roman" w:hAnsi="Times New Roman" w:cs="Times New Roman"/>
+              </w:rPr>
+              <w:t>gray</w:t>
+            </w:r>
+            <w:proofErr w:type="spellEnd"/>
+            <w:r>
+              <w:rPr>
+                <w:rFonts w:ascii="Times New Roman" w:eastAsia="Times New Roman" w:hAnsi="Times New Roman" w:cs="Times New Roman"/>
+              </w:rPr>
+              <w:t xml:space="preserve">", </w:t>
+            </w:r>
+            <w:proofErr w:type="spellStart"/>
+            <w:r>
+              <w:rPr>
+                <w:rFonts w:ascii="Times New Roman" w:eastAsia="Times New Roman" w:hAnsi="Times New Roman" w:cs="Times New Roman"/>
+              </w:rPr>
+              <w:t>lty</w:t>
+            </w:r>
+            <w:proofErr w:type="spellEnd"/>
+            <w:r>
+              <w:rPr>
+                <w:rFonts w:ascii="Times New Roman" w:eastAsia="Times New Roman" w:hAnsi="Times New Roman" w:cs="Times New Roman"/>
+              </w:rPr>
+              <w:t xml:space="preserve"> = "dotted")</w:t>
+            </w:r>
+          </w:p>
+          <w:p>
+            <w:pPr>
+              <w:rPr>
+                <w:rFonts w:ascii="Times New Roman" w:eastAsia="Times New Roman" w:hAnsi="Times New Roman" w:cs="Times New Roman"/>
+              </w:rPr>
+            </w:pPr>
+          </w:p>
+          <w:p>
+            <w:pPr>
+              <w:rPr>
+                <w:rFonts w:ascii="Times New Roman" w:eastAsia="Times New Roman" w:hAnsi="Times New Roman" w:cs="Times New Roman"/>
+              </w:rPr>
+            </w:pPr>
+            <w:proofErr w:type="spellStart"/>
+            <w:proofErr w:type="gramStart"/>
+            <w:r>
+              <w:rPr>
+                <w:rFonts w:ascii="Times New Roman" w:eastAsia="Times New Roman" w:hAnsi="Times New Roman" w:cs="Times New Roman"/>
+              </w:rPr>
+              <w:t>mtext</w:t>
+            </w:r>
+            <w:proofErr w:type="spellEnd"/>
+            <w:r>
+              <w:rPr>
+                <w:rFonts w:ascii="Times New Roman" w:eastAsia="Times New Roman" w:hAnsi="Times New Roman" w:cs="Times New Roman"/>
+              </w:rPr>
+              <w:t>(paste(</w:t>
+            </w:r>
+            <w:proofErr w:type="gramEnd"/>
+            <w:r>
+              <w:rPr>
+                <w:rFonts w:ascii="Times New Roman" w:eastAsia="Times New Roman" w:hAnsi="Times New Roman" w:cs="Times New Roman"/>
+              </w:rPr>
+              <w:t xml:space="preserve">"n =", </w:t>
+            </w:r>
+            <w:proofErr w:type="spellStart"/>
+            <w:r>
+              <w:rPr>
+                <w:rFonts w:ascii="Times New Roman" w:eastAsia="Times New Roman" w:hAnsi="Times New Roman" w:cs="Times New Roman"/>
+              </w:rPr>
+              <w:t>nrow</w:t>
+            </w:r>
+            <w:proofErr w:type="spellEnd"/>
+            <w:r>
+              <w:rPr>
+                <w:rFonts w:ascii="Times New Roman" w:eastAsia="Times New Roman" w:hAnsi="Times New Roman" w:cs="Times New Roman"/>
+              </w:rPr>
+              <w:t>(</w:t>
+            </w:r>
+            <w:proofErr w:type="spellStart"/>
+            <w:r>
+              <w:rPr>
+                <w:rFonts w:ascii="Times New Roman" w:eastAsia="Times New Roman" w:hAnsi="Times New Roman" w:cs="Times New Roman"/>
+              </w:rPr>
+              <w:t>data_clean</w:t>
+            </w:r>
+            <w:proofErr w:type="spellEnd"/>
+            <w:r>
+              <w:rPr>
+                <w:rFonts w:ascii="Times New Roman" w:eastAsia="Times New Roman" w:hAnsi="Times New Roman" w:cs="Times New Roman"/>
+              </w:rPr>
+              <w:t xml:space="preserve">), "countries"), </w:t>
+            </w:r>
+          </w:p>
+          <w:p>
+            <w:pPr>
+              <w:rPr>
+                <w:rFonts w:ascii="Times New Roman" w:eastAsia="Times New Roman" w:hAnsi="Times New Roman" w:cs="Times New Roman"/>
+              </w:rPr>
+            </w:pPr>
+            <w:r>
+              <w:rPr>
+                <w:rFonts w:ascii="Times New Roman" w:eastAsia="Times New Roman" w:hAnsi="Times New Roman" w:cs="Times New Roman"/>
+              </w:rPr>
+              <w:t xml:space="preserve">      side = 3, </w:t>
+            </w:r>
+          </w:p>
+          <w:p>
+            <w:pPr>
+              <w:rPr>
+                <w:rFonts w:ascii="Times New Roman" w:eastAsia="Times New Roman" w:hAnsi="Times New Roman" w:cs="Times New Roman"/>
+              </w:rPr>
+            </w:pPr>
+            <w:r>
+              <w:rPr>
+                <w:rFonts w:ascii="Times New Roman" w:eastAsia="Times New Roman" w:hAnsi="Times New Roman" w:cs="Times New Roman"/>
+              </w:rPr>
+              <w:t xml:space="preserve">      line = 0.3,</w:t>
+            </w:r>
+          </w:p>
+          <w:p>
+            <w:pPr>
+              <w:rPr>
+                <w:rFonts w:ascii="Times New Roman" w:eastAsia="Times New Roman" w:hAnsi="Times New Roman" w:cs="Times New Roman"/>
+              </w:rPr>
+            </w:pPr>
+            <w:r>
+              <w:rPr>
+                <w:rFonts w:ascii="Times New Roman" w:eastAsia="Times New Roman" w:hAnsi="Times New Roman" w:cs="Times New Roman"/>
+              </w:rPr>
+              <w:t xml:space="preserve">      </w:t>
+            </w:r>
+            <w:proofErr w:type="spellStart"/>
+            <w:r>
+              <w:rPr>
+                <w:rFonts w:ascii="Times New Roman" w:eastAsia="Times New Roman" w:hAnsi="Times New Roman" w:cs="Times New Roman"/>
+              </w:rPr>
+              <w:t>cex</w:t>
+            </w:r>
+            <w:proofErr w:type="spellEnd"/>
+            <w:r>
+              <w:rPr>
+                <w:rFonts w:ascii="Times New Roman" w:eastAsia="Times New Roman" w:hAnsi="Times New Roman" w:cs="Times New Roman"/>
+              </w:rPr>
+              <w:t xml:space="preserve"> = 0.9)</w:t>
+            </w:r>
+          </w:p>
+          <w:p>
+            <w:pPr>
+              <w:rPr>
+                <w:rFonts w:ascii="Times New Roman" w:eastAsia="Times New Roman" w:hAnsi="Times New Roman" w:cs="Times New Roman"/>
+              </w:rPr>
+            </w:pPr>
+          </w:p>
+          <w:p>
+            <w:pPr>
+              <w:rPr>
+                <w:rFonts w:ascii="Times New Roman" w:eastAsia="Times New Roman" w:hAnsi="Times New Roman" w:cs="Times New Roman"/>
+              </w:rPr>
+            </w:pPr>
+            <w:proofErr w:type="gramStart"/>
+            <w:r>
+              <w:rPr>
+                <w:rFonts w:ascii="Times New Roman" w:eastAsia="Times New Roman" w:hAnsi="Times New Roman" w:cs="Times New Roman"/>
+              </w:rPr>
+              <w:t>cat(</w:t>
+            </w:r>
+            <w:proofErr w:type="gramEnd"/>
+            <w:r>
+              <w:rPr>
+                <w:rFonts w:ascii="Times New Roman" w:eastAsia="Times New Roman" w:hAnsi="Times New Roman" w:cs="Times New Roman"/>
+              </w:rPr>
+              <w:t>"Displayed: Scatter Plot\n")</w:t>
+            </w:r>
+          </w:p>
+          <w:p>
+            <w:pPr>
+              <w:rPr>
+                <w:rFonts w:ascii="Times New Roman" w:eastAsia="Times New Roman" w:hAnsi="Times New Roman" w:cs="Times New Roman"/>
+              </w:rPr>
+            </w:pPr>
+          </w:p>
+          <w:p>
+            <w:pPr>
+              <w:rPr>
+                <w:rFonts w:ascii="Times New Roman" w:eastAsia="Times New Roman" w:hAnsi="Times New Roman" w:cs="Times New Roman"/>
+              </w:rPr>
+            </w:pPr>
+            <w:r>
+              <w:rPr>
+                <w:rFonts w:ascii="Times New Roman" w:eastAsia="Times New Roman" w:hAnsi="Times New Roman" w:cs="Times New Roman"/>
+              </w:rPr>
+              <w:t># --------------------------------------------------</w:t>
+            </w:r>
+          </w:p>
+          <w:p>
+            <w:pPr>
+              <w:rPr>
+                <w:rFonts w:ascii="Times New Roman" w:eastAsia="Times New Roman" w:hAnsi="Times New Roman" w:cs="Times New Roman"/>
+              </w:rPr>
+            </w:pPr>
+            <w:r>
+              <w:rPr>
+                <w:rFonts w:ascii="Times New Roman" w:eastAsia="Times New Roman" w:hAnsi="Times New Roman" w:cs="Times New Roman"/>
+              </w:rPr>
+              <w:t xml:space="preserve"># Visualization 4: </w:t>
+            </w:r>
+            <w:proofErr w:type="spellStart"/>
+            <w:r>
+              <w:rPr>
+                <w:rFonts w:ascii="Times New Roman" w:eastAsia="Times New Roman" w:hAnsi="Times New Roman" w:cs="Times New Roman"/>
+              </w:rPr>
+              <w:t>StripChart</w:t>
+            </w:r>
+            <w:proofErr w:type="spellEnd"/>
+            <w:r>
+              <w:rPr>
+                <w:rFonts w:ascii="Times New Roman" w:eastAsia="Times New Roman" w:hAnsi="Times New Roman" w:cs="Times New Roman"/>
+              </w:rPr>
+              <w:t xml:space="preserve"> (Alcohol)</w:t>
+            </w:r>
+          </w:p>
+          <w:p>
+            <w:pPr>
+              <w:rPr>
+                <w:rFonts w:ascii="Times New Roman" w:eastAsia="Times New Roman" w:hAnsi="Times New Roman" w:cs="Times New Roman"/>
+              </w:rPr>
+            </w:pPr>
+            <w:r>
+              <w:rPr>
+                <w:rFonts w:ascii="Times New Roman" w:eastAsia="Times New Roman" w:hAnsi="Times New Roman" w:cs="Times New Roman"/>
+              </w:rPr>
+              <w:t># --------------------------------------------------</w:t>
+            </w:r>
+          </w:p>
+          <w:p>
+            <w:pPr>
+              <w:rPr>
+                <w:rFonts w:ascii="Times New Roman" w:eastAsia="Times New Roman" w:hAnsi="Times New Roman" w:cs="Times New Roman"/>
+              </w:rPr>
+            </w:pPr>
+          </w:p>
+          <w:p>
+            <w:pPr>
+              <w:rPr>
+                <w:rFonts w:ascii="Times New Roman" w:eastAsia="Times New Roman" w:hAnsi="Times New Roman" w:cs="Times New Roman"/>
+              </w:rPr>
+            </w:pPr>
+            <w:proofErr w:type="spellStart"/>
+            <w:proofErr w:type="gramStart"/>
+            <w:r>
+              <w:rPr>
+                <w:rFonts w:ascii="Times New Roman" w:eastAsia="Times New Roman" w:hAnsi="Times New Roman" w:cs="Times New Roman"/>
+              </w:rPr>
+              <w:t>stripchart</w:t>
+            </w:r>
+            <w:proofErr w:type="spellEnd"/>
+            <w:r>
+              <w:rPr>
+                <w:rFonts w:ascii="Times New Roman" w:eastAsia="Times New Roman" w:hAnsi="Times New Roman" w:cs="Times New Roman"/>
+              </w:rPr>
+              <w:t>(</w:t>
+            </w:r>
+            <w:proofErr w:type="spellStart"/>
+            <w:proofErr w:type="gramEnd"/>
+            <w:r>
+              <w:rPr>
+                <w:rFonts w:ascii="Times New Roman" w:eastAsia="Times New Roman" w:hAnsi="Times New Roman" w:cs="Times New Roman"/>
+              </w:rPr>
+              <w:t>data_clean$Alcohol_Consumption</w:t>
+            </w:r>
+            <w:proofErr w:type="spellEnd"/>
+            <w:r>
+              <w:rPr>
+                <w:rFonts w:ascii="Times New Roman" w:eastAsia="Times New Roman" w:hAnsi="Times New Roman" w:cs="Times New Roman"/>
+              </w:rPr>
+              <w:t>,</w:t>
+            </w:r>
+          </w:p>
+          <w:p>
+            <w:pPr>
+              <w:rPr>
+                <w:rFonts w:ascii="Times New Roman" w:eastAsia="Times New Roman" w:hAnsi="Times New Roman" w:cs="Times New Roman"/>
+              </w:rPr>
+            </w:pPr>
+            <w:r>
+              <w:rPr>
+                <w:rFonts w:ascii="Times New Roman" w:eastAsia="Times New Roman" w:hAnsi="Times New Roman" w:cs="Times New Roman"/>
+              </w:rPr>
+              <w:t xml:space="preserve">           method = "jitter",</w:t>
+            </w:r>
+          </w:p>
+          <w:p>
+            <w:pPr>
+              <w:rPr>
+                <w:rFonts w:ascii="Times New Roman" w:eastAsia="Times New Roman" w:hAnsi="Times New Roman" w:cs="Times New Roman"/>
+              </w:rPr>
+            </w:pPr>
+            <w:r>
+              <w:rPr>
+                <w:rFonts w:ascii="Times New Roman" w:eastAsia="Times New Roman" w:hAnsi="Times New Roman" w:cs="Times New Roman"/>
+              </w:rPr>
+              <w:t xml:space="preserve">           main = "</w:t>
+            </w:r>
+            <w:proofErr w:type="spellStart"/>
+            <w:r>
+              <w:rPr>
+                <w:rFonts w:ascii="Times New Roman" w:eastAsia="Times New Roman" w:hAnsi="Times New Roman" w:cs="Times New Roman"/>
+              </w:rPr>
+              <w:t>Stripchart</w:t>
+            </w:r>
+            <w:proofErr w:type="spellEnd"/>
+            <w:r>
+              <w:rPr>
+                <w:rFonts w:ascii="Times New Roman" w:eastAsia="Times New Roman" w:hAnsi="Times New Roman" w:cs="Times New Roman"/>
+              </w:rPr>
+              <w:t>: Alcohol Consumption",</w:t>
+            </w:r>
+          </w:p>
+          <w:p>
+            <w:pPr>
+              <w:rPr>
+                <w:rFonts w:ascii="Times New Roman" w:eastAsia="Times New Roman" w:hAnsi="Times New Roman" w:cs="Times New Roman"/>
+              </w:rPr>
+            </w:pPr>
+            <w:r>
+              <w:rPr>
+                <w:rFonts w:ascii="Times New Roman" w:eastAsia="Times New Roman" w:hAnsi="Times New Roman" w:cs="Times New Roman"/>
+              </w:rPr>
+              <w:t xml:space="preserve">           </w:t>
+            </w:r>
+            <w:proofErr w:type="spellStart"/>
+            <w:r>
+              <w:rPr>
+                <w:rFonts w:ascii="Times New Roman" w:eastAsia="Times New Roman" w:hAnsi="Times New Roman" w:cs="Times New Roman"/>
+              </w:rPr>
+              <w:t>xlab</w:t>
+            </w:r>
+            <w:proofErr w:type="spellEnd"/>
+            <w:r>
+              <w:rPr>
+                <w:rFonts w:ascii="Times New Roman" w:eastAsia="Times New Roman" w:hAnsi="Times New Roman" w:cs="Times New Roman"/>
+              </w:rPr>
+              <w:t xml:space="preserve"> = "Alcohol Consumption (litres per capita)",</w:t>
+            </w:r>
+          </w:p>
+          <w:p>
+            <w:pPr>
+              <w:rPr>
+                <w:rFonts w:ascii="Times New Roman" w:eastAsia="Times New Roman" w:hAnsi="Times New Roman" w:cs="Times New Roman"/>
+              </w:rPr>
+            </w:pPr>
+            <w:r>
+              <w:rPr>
+                <w:rFonts w:ascii="Times New Roman" w:eastAsia="Times New Roman" w:hAnsi="Times New Roman" w:cs="Times New Roman"/>
+              </w:rPr>
+              <w:t xml:space="preserve">           </w:t>
+            </w:r>
+            <w:proofErr w:type="spellStart"/>
+            <w:r>
+              <w:rPr>
+                <w:rFonts w:ascii="Times New Roman" w:eastAsia="Times New Roman" w:hAnsi="Times New Roman" w:cs="Times New Roman"/>
+              </w:rPr>
+              <w:t>pch</w:t>
+            </w:r>
+            <w:proofErr w:type="spellEnd"/>
+            <w:r>
+              <w:rPr>
+                <w:rFonts w:ascii="Times New Roman" w:eastAsia="Times New Roman" w:hAnsi="Times New Roman" w:cs="Times New Roman"/>
+              </w:rPr>
+              <w:t xml:space="preserve"> = 19,</w:t>
+            </w:r>
+          </w:p>
+          <w:p>
+            <w:pPr>
+              <w:rPr>
+                <w:rFonts w:ascii="Times New Roman" w:eastAsia="Times New Roman" w:hAnsi="Times New Roman" w:cs="Times New Roman"/>
+              </w:rPr>
+            </w:pPr>
+            <w:r>
+              <w:rPr>
+                <w:rFonts w:ascii="Times New Roman" w:eastAsia="Times New Roman" w:hAnsi="Times New Roman" w:cs="Times New Roman"/>
+              </w:rPr>
+              <w:t xml:space="preserve">           col = "</w:t>
+            </w:r>
+            <w:proofErr w:type="spellStart"/>
+            <w:r>
+              <w:rPr>
+                <w:rFonts w:ascii="Times New Roman" w:eastAsia="Times New Roman" w:hAnsi="Times New Roman" w:cs="Times New Roman"/>
+              </w:rPr>
+              <w:t>steelblue</w:t>
+            </w:r>
+            <w:proofErr w:type="spellEnd"/>
+            <w:r>
+              <w:rPr>
+                <w:rFonts w:ascii="Times New Roman" w:eastAsia="Times New Roman" w:hAnsi="Times New Roman" w:cs="Times New Roman"/>
+              </w:rPr>
+              <w:t>")</w:t>
+            </w:r>
+          </w:p>
+          <w:p>
+            <w:pPr>
+              <w:rPr>
+                <w:rFonts w:ascii="Times New Roman" w:eastAsia="Times New Roman" w:hAnsi="Times New Roman" w:cs="Times New Roman"/>
+              </w:rPr>
+            </w:pPr>
+          </w:p>
+          <w:p>
+            <w:pPr>
+              <w:rPr>
+                <w:rFonts w:ascii="Times New Roman" w:eastAsia="Times New Roman" w:hAnsi="Times New Roman" w:cs="Times New Roman"/>
+              </w:rPr>
+            </w:pPr>
+            <w:proofErr w:type="gramStart"/>
+            <w:r>
+              <w:rPr>
+                <w:rFonts w:ascii="Times New Roman" w:eastAsia="Times New Roman" w:hAnsi="Times New Roman" w:cs="Times New Roman"/>
+              </w:rPr>
+              <w:t>cat(</w:t>
+            </w:r>
+            <w:proofErr w:type="gramEnd"/>
+            <w:r>
+              <w:rPr>
+                <w:rFonts w:ascii="Times New Roman" w:eastAsia="Times New Roman" w:hAnsi="Times New Roman" w:cs="Times New Roman"/>
+              </w:rPr>
+              <w:t xml:space="preserve">"Displayed: </w:t>
+            </w:r>
+            <w:proofErr w:type="spellStart"/>
+            <w:r>
+              <w:rPr>
+                <w:rFonts w:ascii="Times New Roman" w:eastAsia="Times New Roman" w:hAnsi="Times New Roman" w:cs="Times New Roman"/>
+              </w:rPr>
+              <w:t>Stripchart</w:t>
+            </w:r>
+            <w:proofErr w:type="spellEnd"/>
+            <w:r>
+              <w:rPr>
+                <w:rFonts w:ascii="Times New Roman" w:eastAsia="Times New Roman" w:hAnsi="Times New Roman" w:cs="Times New Roman"/>
+              </w:rPr>
+              <w:t xml:space="preserve"> for Alcohol Consumption\n")</w:t>
+            </w:r>
+          </w:p>
+          <w:p>
+            <w:pPr>
+              <w:rPr>
+                <w:rFonts w:ascii="Times New Roman" w:eastAsia="Times New Roman" w:hAnsi="Times New Roman" w:cs="Times New Roman"/>
+              </w:rPr>
+            </w:pPr>
+          </w:p>
+          <w:p>
+            <w:pPr>
+              <w:rPr>
+                <w:rFonts w:ascii="Times New Roman" w:eastAsia="Times New Roman" w:hAnsi="Times New Roman" w:cs="Times New Roman"/>
+              </w:rPr>
+            </w:pPr>
+            <w:r>
+              <w:rPr>
+                <w:rFonts w:ascii="Times New Roman" w:eastAsia="Times New Roman" w:hAnsi="Times New Roman" w:cs="Times New Roman"/>
+              </w:rPr>
+              <w:t># --------------------------------------------------</w:t>
+            </w:r>
+          </w:p>
+          <w:p>
+            <w:pPr>
+              <w:rPr>
+                <w:rFonts w:ascii="Times New Roman" w:eastAsia="Times New Roman" w:hAnsi="Times New Roman" w:cs="Times New Roman"/>
+              </w:rPr>
+            </w:pPr>
+            <w:r>
+              <w:rPr>
+                <w:rFonts w:ascii="Times New Roman" w:eastAsia="Times New Roman" w:hAnsi="Times New Roman" w:cs="Times New Roman"/>
+              </w:rPr>
+              <w:t xml:space="preserve"># Visualization 5: </w:t>
+            </w:r>
+            <w:proofErr w:type="spellStart"/>
+            <w:r>
+              <w:rPr>
+                <w:rFonts w:ascii="Times New Roman" w:eastAsia="Times New Roman" w:hAnsi="Times New Roman" w:cs="Times New Roman"/>
+              </w:rPr>
+              <w:t>Barplot</w:t>
+            </w:r>
+            <w:proofErr w:type="spellEnd"/>
+            <w:r>
+              <w:rPr>
+                <w:rFonts w:ascii="Times New Roman" w:eastAsia="Times New Roman" w:hAnsi="Times New Roman" w:cs="Times New Roman"/>
+              </w:rPr>
+              <w:t xml:space="preserve"> (Life Expectancy)</w:t>
+            </w:r>
+          </w:p>
+          <w:p>
+            <w:pPr>
+              <w:rPr>
+                <w:rFonts w:ascii="Times New Roman" w:eastAsia="Times New Roman" w:hAnsi="Times New Roman" w:cs="Times New Roman"/>
+              </w:rPr>
+            </w:pPr>
+            <w:r>
+              <w:rPr>
+                <w:rFonts w:ascii="Times New Roman" w:eastAsia="Times New Roman" w:hAnsi="Times New Roman" w:cs="Times New Roman"/>
+              </w:rPr>
+              <w:t># --------------------------------------------------</w:t>
+            </w:r>
+          </w:p>
+          <w:p>
+            <w:pPr>
+              <w:rPr>
+                <w:rFonts w:ascii="Times New Roman" w:eastAsia="Times New Roman" w:hAnsi="Times New Roman" w:cs="Times New Roman"/>
+              </w:rPr>
+            </w:pPr>
+          </w:p>
+          <w:p>
+            <w:pPr>
+              <w:rPr>
+                <w:rFonts w:ascii="Times New Roman" w:eastAsia="Times New Roman" w:hAnsi="Times New Roman" w:cs="Times New Roman"/>
+              </w:rPr>
+            </w:pPr>
+            <w:proofErr w:type="spellStart"/>
+            <w:r>
+              <w:rPr>
+                <w:rFonts w:ascii="Times New Roman" w:eastAsia="Times New Roman" w:hAnsi="Times New Roman" w:cs="Times New Roman"/>
+              </w:rPr>
+              <w:t>life_bins</w:t>
+            </w:r>
+            <w:proofErr w:type="spellEnd"/>
+            <w:r>
+              <w:rPr>
+                <w:rFonts w:ascii="Times New Roman" w:eastAsia="Times New Roman" w:hAnsi="Times New Roman" w:cs="Times New Roman"/>
+              </w:rPr>
+              <w:t xml:space="preserve"> &lt;- </w:t>
+            </w:r>
+            <w:proofErr w:type="gramStart"/>
+            <w:r>
+              <w:rPr>
+                <w:rFonts w:ascii="Times New Roman" w:eastAsia="Times New Roman" w:hAnsi="Times New Roman" w:cs="Times New Roman"/>
+              </w:rPr>
+              <w:t>cut(</w:t>
+            </w:r>
+            <w:proofErr w:type="spellStart"/>
+            <w:proofErr w:type="gramEnd"/>
+            <w:r>
+              <w:rPr>
+                <w:rFonts w:ascii="Times New Roman" w:eastAsia="Times New Roman" w:hAnsi="Times New Roman" w:cs="Times New Roman"/>
+              </w:rPr>
+              <w:t>data_clean$Life_Expectancy</w:t>
+            </w:r>
+            <w:proofErr w:type="spellEnd"/>
+            <w:r>
+              <w:rPr>
+                <w:rFonts w:ascii="Times New Roman" w:eastAsia="Times New Roman" w:hAnsi="Times New Roman" w:cs="Times New Roman"/>
+              </w:rPr>
+              <w:t>,</w:t>
+            </w:r>
+          </w:p>
+          <w:p>
+            <w:pPr>
+              <w:rPr>
+                <w:rFonts w:ascii="Times New Roman" w:eastAsia="Times New Roman" w:hAnsi="Times New Roman" w:cs="Times New Roman"/>
+              </w:rPr>
+            </w:pPr>
+            <w:r>
+              <w:rPr>
+                <w:rFonts w:ascii="Times New Roman" w:eastAsia="Times New Roman" w:hAnsi="Times New Roman" w:cs="Times New Roman"/>
+              </w:rPr>
               <w:lastRenderedPageBreak/>
-              <w:t xml:space="preserve">     </w:t>
+              <w:t xml:space="preserve">                 breaks = 10,</w:t>
+            </w:r>
+          </w:p>
+          <w:p>
+            <w:pPr>
+              <w:rPr>
+                <w:rFonts w:ascii="Times New Roman" w:eastAsia="Times New Roman" w:hAnsi="Times New Roman" w:cs="Times New Roman"/>
+              </w:rPr>
+            </w:pPr>
+            <w:r>
+              <w:rPr>
+                <w:rFonts w:ascii="Times New Roman" w:eastAsia="Times New Roman" w:hAnsi="Times New Roman" w:cs="Times New Roman"/>
+              </w:rPr>
+              <w:t xml:space="preserve">                 </w:t>
+            </w:r>
+            <w:proofErr w:type="spellStart"/>
+            <w:proofErr w:type="gramStart"/>
+            <w:r>
+              <w:rPr>
+                <w:rFonts w:ascii="Times New Roman" w:eastAsia="Times New Roman" w:hAnsi="Times New Roman" w:cs="Times New Roman"/>
+              </w:rPr>
+              <w:t>include.lowest</w:t>
+            </w:r>
+            <w:proofErr w:type="spellEnd"/>
+            <w:proofErr w:type="gramEnd"/>
+            <w:r>
+              <w:rPr>
+                <w:rFonts w:ascii="Times New Roman" w:eastAsia="Times New Roman" w:hAnsi="Times New Roman" w:cs="Times New Roman"/>
+              </w:rPr>
+              <w:t xml:space="preserve"> = TRUE)</w:t>
+            </w:r>
+          </w:p>
+          <w:p>
+            <w:pPr>
+              <w:rPr>
+                <w:rFonts w:ascii="Times New Roman" w:eastAsia="Times New Roman" w:hAnsi="Times New Roman" w:cs="Times New Roman"/>
+              </w:rPr>
+            </w:pPr>
+          </w:p>
+          <w:p>
+            <w:pPr>
+              <w:rPr>
+                <w:rFonts w:ascii="Times New Roman" w:eastAsia="Times New Roman" w:hAnsi="Times New Roman" w:cs="Times New Roman"/>
+              </w:rPr>
+            </w:pPr>
+            <w:proofErr w:type="spellStart"/>
+            <w:r>
+              <w:rPr>
+                <w:rFonts w:ascii="Times New Roman" w:eastAsia="Times New Roman" w:hAnsi="Times New Roman" w:cs="Times New Roman"/>
+              </w:rPr>
+              <w:t>life_counts</w:t>
+            </w:r>
+            <w:proofErr w:type="spellEnd"/>
+            <w:r>
+              <w:rPr>
+                <w:rFonts w:ascii="Times New Roman" w:eastAsia="Times New Roman" w:hAnsi="Times New Roman" w:cs="Times New Roman"/>
+              </w:rPr>
+              <w:t xml:space="preserve"> &lt;- table(</w:t>
+            </w:r>
+            <w:proofErr w:type="spellStart"/>
+            <w:r>
+              <w:rPr>
+                <w:rFonts w:ascii="Times New Roman" w:eastAsia="Times New Roman" w:hAnsi="Times New Roman" w:cs="Times New Roman"/>
+              </w:rPr>
+              <w:t>life_bins</w:t>
+            </w:r>
+            <w:proofErr w:type="spellEnd"/>
+            <w:r>
+              <w:rPr>
+                <w:rFonts w:ascii="Times New Roman" w:eastAsia="Times New Roman" w:hAnsi="Times New Roman" w:cs="Times New Roman"/>
+              </w:rPr>
+              <w:t>)</w:t>
+            </w:r>
+          </w:p>
+          <w:p>
+            <w:pPr>
+              <w:rPr>
+                <w:rFonts w:ascii="Times New Roman" w:eastAsia="Times New Roman" w:hAnsi="Times New Roman" w:cs="Times New Roman"/>
+              </w:rPr>
+            </w:pPr>
+          </w:p>
+          <w:p>
+            <w:pPr>
+              <w:rPr>
+                <w:rFonts w:ascii="Times New Roman" w:eastAsia="Times New Roman" w:hAnsi="Times New Roman" w:cs="Times New Roman"/>
+              </w:rPr>
+            </w:pPr>
+            <w:proofErr w:type="spellStart"/>
+            <w:proofErr w:type="gramStart"/>
+            <w:r>
+              <w:rPr>
+                <w:rFonts w:ascii="Times New Roman" w:eastAsia="Times New Roman" w:hAnsi="Times New Roman" w:cs="Times New Roman"/>
+              </w:rPr>
+              <w:t>barplot</w:t>
+            </w:r>
+            <w:proofErr w:type="spellEnd"/>
+            <w:r>
+              <w:rPr>
+                <w:rFonts w:ascii="Times New Roman" w:eastAsia="Times New Roman" w:hAnsi="Times New Roman" w:cs="Times New Roman"/>
+              </w:rPr>
+              <w:t>(</w:t>
+            </w:r>
+            <w:proofErr w:type="spellStart"/>
+            <w:proofErr w:type="gramEnd"/>
+            <w:r>
+              <w:rPr>
+                <w:rFonts w:ascii="Times New Roman" w:eastAsia="Times New Roman" w:hAnsi="Times New Roman" w:cs="Times New Roman"/>
+              </w:rPr>
+              <w:t>life_counts</w:t>
+            </w:r>
+            <w:proofErr w:type="spellEnd"/>
+            <w:r>
+              <w:rPr>
+                <w:rFonts w:ascii="Times New Roman" w:eastAsia="Times New Roman" w:hAnsi="Times New Roman" w:cs="Times New Roman"/>
+              </w:rPr>
+              <w:t>,</w:t>
+            </w:r>
+          </w:p>
+          <w:p>
+            <w:pPr>
+              <w:rPr>
+                <w:rFonts w:ascii="Times New Roman" w:eastAsia="Times New Roman" w:hAnsi="Times New Roman" w:cs="Times New Roman"/>
+              </w:rPr>
+            </w:pPr>
+            <w:r>
+              <w:rPr>
+                <w:rFonts w:ascii="Times New Roman" w:eastAsia="Times New Roman" w:hAnsi="Times New Roman" w:cs="Times New Roman"/>
+              </w:rPr>
+              <w:t xml:space="preserve">        main = "</w:t>
+            </w:r>
+            <w:proofErr w:type="spellStart"/>
+            <w:r>
+              <w:rPr>
+                <w:rFonts w:ascii="Times New Roman" w:eastAsia="Times New Roman" w:hAnsi="Times New Roman" w:cs="Times New Roman"/>
+              </w:rPr>
+              <w:t>Barplot</w:t>
+            </w:r>
+            <w:proofErr w:type="spellEnd"/>
+            <w:r>
+              <w:rPr>
+                <w:rFonts w:ascii="Times New Roman" w:eastAsia="Times New Roman" w:hAnsi="Times New Roman" w:cs="Times New Roman"/>
+              </w:rPr>
+              <w:t xml:space="preserve"> of Life Expectancy Bins",</w:t>
+            </w:r>
+          </w:p>
+          <w:p>
+            <w:pPr>
+              <w:rPr>
+                <w:rFonts w:ascii="Times New Roman" w:eastAsia="Times New Roman" w:hAnsi="Times New Roman" w:cs="Times New Roman"/>
+              </w:rPr>
+            </w:pPr>
+            <w:r>
+              <w:rPr>
+                <w:rFonts w:ascii="Times New Roman" w:eastAsia="Times New Roman" w:hAnsi="Times New Roman" w:cs="Times New Roman"/>
+              </w:rPr>
+              <w:t xml:space="preserve">        </w:t>
+            </w:r>
+            <w:proofErr w:type="spellStart"/>
+            <w:r>
+              <w:rPr>
+                <w:rFonts w:ascii="Times New Roman" w:eastAsia="Times New Roman" w:hAnsi="Times New Roman" w:cs="Times New Roman"/>
+              </w:rPr>
+              <w:t>xlab</w:t>
+            </w:r>
+            <w:proofErr w:type="spellEnd"/>
+            <w:r>
+              <w:rPr>
+                <w:rFonts w:ascii="Times New Roman" w:eastAsia="Times New Roman" w:hAnsi="Times New Roman" w:cs="Times New Roman"/>
+              </w:rPr>
+              <w:t xml:space="preserve"> = "Life Expectancy Range (years)",</w:t>
+            </w:r>
+          </w:p>
+          <w:p>
+            <w:pPr>
+              <w:rPr>
+                <w:rFonts w:ascii="Times New Roman" w:eastAsia="Times New Roman" w:hAnsi="Times New Roman" w:cs="Times New Roman"/>
+              </w:rPr>
+            </w:pPr>
+            <w:r>
+              <w:rPr>
+                <w:rFonts w:ascii="Times New Roman" w:eastAsia="Times New Roman" w:hAnsi="Times New Roman" w:cs="Times New Roman"/>
+              </w:rPr>
+              <w:t xml:space="preserve">        </w:t>
             </w:r>
             <w:proofErr w:type="spellStart"/>
             <w:r>
@@ -8469,46 +9593,33 @@
               <w:rPr>
                 <w:rFonts w:ascii="Times New Roman" w:eastAsia="Times New Roman" w:hAnsi="Times New Roman" w:cs="Times New Roman"/>
               </w:rPr>
-              <w:t xml:space="preserve"> = "Frequency",</w:t>
-            </w:r>
-          </w:p>
-          <w:p>
-            <w:pPr>
-              <w:rPr>
-                <w:rFonts w:ascii="Times New Roman" w:eastAsia="Times New Roman" w:hAnsi="Times New Roman" w:cs="Times New Roman"/>
-              </w:rPr>
-            </w:pPr>
-            <w:r>
-              <w:rPr>
-                <w:rFonts w:ascii="Times New Roman" w:eastAsia="Times New Roman" w:hAnsi="Times New Roman" w:cs="Times New Roman"/>
-              </w:rPr>
-              <w:t xml:space="preserve">     col = "coral",</w:t>
-            </w:r>
-          </w:p>
-          <w:p>
-            <w:pPr>
-              <w:rPr>
-                <w:rFonts w:ascii="Times New Roman" w:eastAsia="Times New Roman" w:hAnsi="Times New Roman" w:cs="Times New Roman"/>
-              </w:rPr>
-            </w:pPr>
-            <w:r>
-              <w:rPr>
-                <w:rFonts w:ascii="Times New Roman" w:eastAsia="Times New Roman" w:hAnsi="Times New Roman" w:cs="Times New Roman"/>
-              </w:rPr>
-              <w:t xml:space="preserve">     border = "white",</w:t>
-            </w:r>
-          </w:p>
-          <w:p>
-            <w:pPr>
-              <w:rPr>
-                <w:rFonts w:ascii="Times New Roman" w:eastAsia="Times New Roman" w:hAnsi="Times New Roman" w:cs="Times New Roman"/>
-              </w:rPr>
-            </w:pPr>
-            <w:r>
-              <w:rPr>
-                <w:rFonts w:ascii="Times New Roman" w:eastAsia="Times New Roman" w:hAnsi="Times New Roman" w:cs="Times New Roman"/>
-              </w:rPr>
-              <w:t xml:space="preserve">     breaks = 15)</w:t>
+              <w:t xml:space="preserve"> = "Count",</w:t>
+            </w:r>
+          </w:p>
+          <w:p>
+            <w:pPr>
+              <w:rPr>
+                <w:rFonts w:ascii="Times New Roman" w:eastAsia="Times New Roman" w:hAnsi="Times New Roman" w:cs="Times New Roman"/>
+              </w:rPr>
+            </w:pPr>
+            <w:r>
+              <w:rPr>
+                <w:rFonts w:ascii="Times New Roman" w:eastAsia="Times New Roman" w:hAnsi="Times New Roman" w:cs="Times New Roman"/>
+              </w:rPr>
+              <w:t xml:space="preserve">        col = "coral",</w:t>
+            </w:r>
+          </w:p>
+          <w:p>
+            <w:pPr>
+              <w:rPr>
+                <w:rFonts w:ascii="Times New Roman" w:eastAsia="Times New Roman" w:hAnsi="Times New Roman" w:cs="Times New Roman"/>
+              </w:rPr>
+            </w:pPr>
+            <w:r>
+              <w:rPr>
+                <w:rFonts w:ascii="Times New Roman" w:eastAsia="Times New Roman" w:hAnsi="Times New Roman" w:cs="Times New Roman"/>
+              </w:rPr>
+              <w:t xml:space="preserve">        las = 2)</w:t>
             </w:r>
           </w:p>
           <w:p>
@@ -8536,74 +9647,77 @@
               <w:rPr>
                 <w:rFonts w:ascii="Times New Roman" w:eastAsia="Times New Roman" w:hAnsi="Times New Roman" w:cs="Times New Roman"/>
               </w:rPr>
-              <w:t>"Displayed: Histogram of Life Expectancy\n")</w:t>
-            </w:r>
-          </w:p>
-          <w:p>
-            <w:pPr>
-              <w:rPr>
-                <w:rFonts w:ascii="Times New Roman" w:eastAsia="Times New Roman" w:hAnsi="Times New Roman" w:cs="Times New Roman"/>
-              </w:rPr>
-            </w:pPr>
-          </w:p>
-          <w:p>
-            <w:pPr>
-              <w:rPr>
-                <w:rFonts w:ascii="Times New Roman" w:eastAsia="Times New Roman" w:hAnsi="Times New Roman" w:cs="Times New Roman"/>
-              </w:rPr>
-            </w:pPr>
-            <w:r>
-              <w:rPr>
-                <w:rFonts w:ascii="Times New Roman" w:eastAsia="Times New Roman" w:hAnsi="Times New Roman" w:cs="Times New Roman"/>
-              </w:rPr>
-              <w:t># --------------------------------------------------</w:t>
-            </w:r>
-          </w:p>
-          <w:p>
-            <w:pPr>
-              <w:rPr>
-                <w:rFonts w:ascii="Times New Roman" w:eastAsia="Times New Roman" w:hAnsi="Times New Roman" w:cs="Times New Roman"/>
-              </w:rPr>
-            </w:pPr>
-            <w:r>
-              <w:rPr>
-                <w:rFonts w:ascii="Times New Roman" w:eastAsia="Times New Roman" w:hAnsi="Times New Roman" w:cs="Times New Roman"/>
-              </w:rPr>
-              <w:t xml:space="preserve"># Visualization 3: Scatter Plot </w:t>
-            </w:r>
-          </w:p>
-          <w:p>
-            <w:pPr>
-              <w:rPr>
-                <w:rFonts w:ascii="Times New Roman" w:eastAsia="Times New Roman" w:hAnsi="Times New Roman" w:cs="Times New Roman"/>
-              </w:rPr>
-            </w:pPr>
-            <w:r>
-              <w:rPr>
-                <w:rFonts w:ascii="Times New Roman" w:eastAsia="Times New Roman" w:hAnsi="Times New Roman" w:cs="Times New Roman"/>
-              </w:rPr>
-              <w:t># --------------------------------------------------</w:t>
-            </w:r>
-          </w:p>
-          <w:p>
-            <w:pPr>
-              <w:rPr>
-                <w:rFonts w:ascii="Times New Roman" w:eastAsia="Times New Roman" w:hAnsi="Times New Roman" w:cs="Times New Roman"/>
-              </w:rPr>
-            </w:pPr>
-          </w:p>
-          <w:p>
-            <w:pPr>
-              <w:rPr>
-                <w:rFonts w:ascii="Times New Roman" w:eastAsia="Times New Roman" w:hAnsi="Times New Roman" w:cs="Times New Roman"/>
-              </w:rPr>
-            </w:pPr>
+              <w:t xml:space="preserve">"Displayed: </w:t>
+            </w:r>
+            <w:proofErr w:type="spellStart"/>
+            <w:r>
+              <w:rPr>
+                <w:rFonts w:ascii="Times New Roman" w:eastAsia="Times New Roman" w:hAnsi="Times New Roman" w:cs="Times New Roman"/>
+              </w:rPr>
+              <w:t>Barplot</w:t>
+            </w:r>
+            <w:proofErr w:type="spellEnd"/>
+            <w:r>
+              <w:rPr>
+                <w:rFonts w:ascii="Times New Roman" w:eastAsia="Times New Roman" w:hAnsi="Times New Roman" w:cs="Times New Roman"/>
+              </w:rPr>
+              <w:t xml:space="preserve"> for Life Expectancy\n\n")</w:t>
+            </w:r>
+          </w:p>
+          <w:p>
+            <w:pPr>
+              <w:rPr>
+                <w:rFonts w:ascii="Times New Roman" w:eastAsia="Times New Roman" w:hAnsi="Times New Roman" w:cs="Times New Roman"/>
+              </w:rPr>
+            </w:pPr>
+          </w:p>
+          <w:p>
+            <w:pPr>
+              <w:rPr>
+                <w:rFonts w:ascii="Times New Roman" w:eastAsia="Times New Roman" w:hAnsi="Times New Roman" w:cs="Times New Roman"/>
+              </w:rPr>
+            </w:pPr>
+            <w:r>
+              <w:rPr>
+                <w:rFonts w:ascii="Times New Roman" w:eastAsia="Times New Roman" w:hAnsi="Times New Roman" w:cs="Times New Roman"/>
+              </w:rPr>
+              <w:t># Scatter plot with regression line</w:t>
+            </w:r>
+          </w:p>
+          <w:p>
+            <w:pPr>
+              <w:rPr>
+                <w:rFonts w:ascii="Times New Roman" w:eastAsia="Times New Roman" w:hAnsi="Times New Roman" w:cs="Times New Roman"/>
+              </w:rPr>
+            </w:pPr>
+            <w:proofErr w:type="spellStart"/>
+            <w:r>
+              <w:rPr>
+                <w:rFonts w:ascii="Times New Roman" w:eastAsia="Times New Roman" w:hAnsi="Times New Roman" w:cs="Times New Roman"/>
+              </w:rPr>
+              <w:t>scatter_plot</w:t>
+            </w:r>
+            <w:proofErr w:type="spellEnd"/>
+            <w:r>
+              <w:rPr>
+                <w:rFonts w:ascii="Times New Roman" w:eastAsia="Times New Roman" w:hAnsi="Times New Roman" w:cs="Times New Roman"/>
+              </w:rPr>
+              <w:t xml:space="preserve"> &lt;- </w:t>
+            </w:r>
+            <w:proofErr w:type="spellStart"/>
             <w:proofErr w:type="gramStart"/>
             <w:r>
               <w:rPr>
                 <w:rFonts w:ascii="Times New Roman" w:eastAsia="Times New Roman" w:hAnsi="Times New Roman" w:cs="Times New Roman"/>
               </w:rPr>
-              <w:t>plot(</w:t>
+              <w:t>ggplot</w:t>
+            </w:r>
+            <w:proofErr w:type="spellEnd"/>
+            <w:r>
+              <w:rPr>
+                <w:rFonts w:ascii="Times New Roman" w:eastAsia="Times New Roman" w:hAnsi="Times New Roman" w:cs="Times New Roman"/>
+              </w:rPr>
+              <w:t>(</w:t>
             </w:r>
             <w:proofErr w:type="spellStart"/>
             <w:proofErr w:type="gramEnd"/>
@@ -8611,6 +9725,504 @@
               <w:rPr>
                 <w:rFonts w:ascii="Times New Roman" w:eastAsia="Times New Roman" w:hAnsi="Times New Roman" w:cs="Times New Roman"/>
               </w:rPr>
+              <w:t>data_clean</w:t>
+            </w:r>
+            <w:proofErr w:type="spellEnd"/>
+            <w:r>
+              <w:rPr>
+                <w:rFonts w:ascii="Times New Roman" w:eastAsia="Times New Roman" w:hAnsi="Times New Roman" w:cs="Times New Roman"/>
+              </w:rPr>
+              <w:t xml:space="preserve">, </w:t>
+            </w:r>
+            <w:proofErr w:type="spellStart"/>
+            <w:proofErr w:type="gramStart"/>
+            <w:r>
+              <w:rPr>
+                <w:rFonts w:ascii="Times New Roman" w:eastAsia="Times New Roman" w:hAnsi="Times New Roman" w:cs="Times New Roman"/>
+              </w:rPr>
+              <w:t>aes</w:t>
+            </w:r>
+            <w:proofErr w:type="spellEnd"/>
+            <w:r>
+              <w:rPr>
+                <w:rFonts w:ascii="Times New Roman" w:eastAsia="Times New Roman" w:hAnsi="Times New Roman" w:cs="Times New Roman"/>
+              </w:rPr>
+              <w:t>(</w:t>
+            </w:r>
+            <w:proofErr w:type="gramEnd"/>
+            <w:r>
+              <w:rPr>
+                <w:rFonts w:ascii="Times New Roman" w:eastAsia="Times New Roman" w:hAnsi="Times New Roman" w:cs="Times New Roman"/>
+              </w:rPr>
+              <w:t xml:space="preserve">x = </w:t>
+            </w:r>
+            <w:proofErr w:type="spellStart"/>
+            <w:r>
+              <w:rPr>
+                <w:rFonts w:ascii="Times New Roman" w:eastAsia="Times New Roman" w:hAnsi="Times New Roman" w:cs="Times New Roman"/>
+              </w:rPr>
+              <w:t>Alcohol_Consumption</w:t>
+            </w:r>
+            <w:proofErr w:type="spellEnd"/>
+            <w:r>
+              <w:rPr>
+                <w:rFonts w:ascii="Times New Roman" w:eastAsia="Times New Roman" w:hAnsi="Times New Roman" w:cs="Times New Roman"/>
+              </w:rPr>
+              <w:t xml:space="preserve">, y = </w:t>
+            </w:r>
+            <w:proofErr w:type="spellStart"/>
+            <w:r>
+              <w:rPr>
+                <w:rFonts w:ascii="Times New Roman" w:eastAsia="Times New Roman" w:hAnsi="Times New Roman" w:cs="Times New Roman"/>
+              </w:rPr>
+              <w:t>Life_Expectancy</w:t>
+            </w:r>
+            <w:proofErr w:type="spellEnd"/>
+            <w:r>
+              <w:rPr>
+                <w:rFonts w:ascii="Times New Roman" w:eastAsia="Times New Roman" w:hAnsi="Times New Roman" w:cs="Times New Roman"/>
+              </w:rPr>
+              <w:t>)) +</w:t>
+            </w:r>
+          </w:p>
+          <w:p>
+            <w:pPr>
+              <w:rPr>
+                <w:rFonts w:ascii="Times New Roman" w:eastAsia="Times New Roman" w:hAnsi="Times New Roman" w:cs="Times New Roman"/>
+              </w:rPr>
+            </w:pPr>
+            <w:r>
+              <w:rPr>
+                <w:rFonts w:ascii="Times New Roman" w:eastAsia="Times New Roman" w:hAnsi="Times New Roman" w:cs="Times New Roman"/>
+              </w:rPr>
+              <w:t xml:space="preserve">  </w:t>
+            </w:r>
+            <w:proofErr w:type="spellStart"/>
+            <w:r>
+              <w:rPr>
+                <w:rFonts w:ascii="Times New Roman" w:eastAsia="Times New Roman" w:hAnsi="Times New Roman" w:cs="Times New Roman"/>
+              </w:rPr>
+              <w:t>geom_</w:t>
+            </w:r>
+            <w:proofErr w:type="gramStart"/>
+            <w:r>
+              <w:rPr>
+                <w:rFonts w:ascii="Times New Roman" w:eastAsia="Times New Roman" w:hAnsi="Times New Roman" w:cs="Times New Roman"/>
+              </w:rPr>
+              <w:t>point</w:t>
+            </w:r>
+            <w:proofErr w:type="spellEnd"/>
+            <w:r>
+              <w:rPr>
+                <w:rFonts w:ascii="Times New Roman" w:eastAsia="Times New Roman" w:hAnsi="Times New Roman" w:cs="Times New Roman"/>
+              </w:rPr>
+              <w:t>(</w:t>
+            </w:r>
+            <w:proofErr w:type="gramEnd"/>
+            <w:r>
+              <w:rPr>
+                <w:rFonts w:ascii="Times New Roman" w:eastAsia="Times New Roman" w:hAnsi="Times New Roman" w:cs="Times New Roman"/>
+              </w:rPr>
+              <w:t xml:space="preserve">alpha = 0.6, size = 3, </w:t>
+            </w:r>
+            <w:proofErr w:type="spellStart"/>
+            <w:r>
+              <w:rPr>
+                <w:rFonts w:ascii="Times New Roman" w:eastAsia="Times New Roman" w:hAnsi="Times New Roman" w:cs="Times New Roman"/>
+              </w:rPr>
+              <w:t>color</w:t>
+            </w:r>
+            <w:proofErr w:type="spellEnd"/>
+            <w:r>
+              <w:rPr>
+                <w:rFonts w:ascii="Times New Roman" w:eastAsia="Times New Roman" w:hAnsi="Times New Roman" w:cs="Times New Roman"/>
+              </w:rPr>
+              <w:t xml:space="preserve"> = "</w:t>
+            </w:r>
+            <w:proofErr w:type="spellStart"/>
+            <w:r>
+              <w:rPr>
+                <w:rFonts w:ascii="Times New Roman" w:eastAsia="Times New Roman" w:hAnsi="Times New Roman" w:cs="Times New Roman"/>
+              </w:rPr>
+              <w:t>darkblue</w:t>
+            </w:r>
+            <w:proofErr w:type="spellEnd"/>
+            <w:r>
+              <w:rPr>
+                <w:rFonts w:ascii="Times New Roman" w:eastAsia="Times New Roman" w:hAnsi="Times New Roman" w:cs="Times New Roman"/>
+              </w:rPr>
+              <w:t>") +</w:t>
+            </w:r>
+          </w:p>
+          <w:p>
+            <w:pPr>
+              <w:rPr>
+                <w:rFonts w:ascii="Times New Roman" w:eastAsia="Times New Roman" w:hAnsi="Times New Roman" w:cs="Times New Roman"/>
+              </w:rPr>
+            </w:pPr>
+            <w:r>
+              <w:rPr>
+                <w:rFonts w:ascii="Times New Roman" w:eastAsia="Times New Roman" w:hAnsi="Times New Roman" w:cs="Times New Roman"/>
+              </w:rPr>
+              <w:t xml:space="preserve">  </w:t>
+            </w:r>
+            <w:proofErr w:type="spellStart"/>
+            <w:r>
+              <w:rPr>
+                <w:rFonts w:ascii="Times New Roman" w:eastAsia="Times New Roman" w:hAnsi="Times New Roman" w:cs="Times New Roman"/>
+              </w:rPr>
+              <w:t>geom_</w:t>
+            </w:r>
+            <w:proofErr w:type="gramStart"/>
+            <w:r>
+              <w:rPr>
+                <w:rFonts w:ascii="Times New Roman" w:eastAsia="Times New Roman" w:hAnsi="Times New Roman" w:cs="Times New Roman"/>
+              </w:rPr>
+              <w:t>smooth</w:t>
+            </w:r>
+            <w:proofErr w:type="spellEnd"/>
+            <w:r>
+              <w:rPr>
+                <w:rFonts w:ascii="Times New Roman" w:eastAsia="Times New Roman" w:hAnsi="Times New Roman" w:cs="Times New Roman"/>
+              </w:rPr>
+              <w:t>(</w:t>
+            </w:r>
+            <w:proofErr w:type="gramEnd"/>
+            <w:r>
+              <w:rPr>
+                <w:rFonts w:ascii="Times New Roman" w:eastAsia="Times New Roman" w:hAnsi="Times New Roman" w:cs="Times New Roman"/>
+              </w:rPr>
+              <w:t>method = "</w:t>
+            </w:r>
+            <w:proofErr w:type="spellStart"/>
+            <w:r>
+              <w:rPr>
+                <w:rFonts w:ascii="Times New Roman" w:eastAsia="Times New Roman" w:hAnsi="Times New Roman" w:cs="Times New Roman"/>
+              </w:rPr>
+              <w:t>lm</w:t>
+            </w:r>
+            <w:proofErr w:type="spellEnd"/>
+            <w:r>
+              <w:rPr>
+                <w:rFonts w:ascii="Times New Roman" w:eastAsia="Times New Roman" w:hAnsi="Times New Roman" w:cs="Times New Roman"/>
+              </w:rPr>
+              <w:t xml:space="preserve">", se = TRUE, </w:t>
+            </w:r>
+            <w:proofErr w:type="spellStart"/>
+            <w:r>
+              <w:rPr>
+                <w:rFonts w:ascii="Times New Roman" w:eastAsia="Times New Roman" w:hAnsi="Times New Roman" w:cs="Times New Roman"/>
+              </w:rPr>
+              <w:t>color</w:t>
+            </w:r>
+            <w:proofErr w:type="spellEnd"/>
+            <w:r>
+              <w:rPr>
+                <w:rFonts w:ascii="Times New Roman" w:eastAsia="Times New Roman" w:hAnsi="Times New Roman" w:cs="Times New Roman"/>
+              </w:rPr>
+              <w:t xml:space="preserve"> = "red", linewidth = 1) +</w:t>
+            </w:r>
+          </w:p>
+          <w:p>
+            <w:pPr>
+              <w:rPr>
+                <w:rFonts w:ascii="Times New Roman" w:eastAsia="Times New Roman" w:hAnsi="Times New Roman" w:cs="Times New Roman"/>
+              </w:rPr>
+            </w:pPr>
+            <w:r>
+              <w:rPr>
+                <w:rFonts w:ascii="Times New Roman" w:eastAsia="Times New Roman" w:hAnsi="Times New Roman" w:cs="Times New Roman"/>
+              </w:rPr>
+              <w:t xml:space="preserve">  </w:t>
+            </w:r>
+            <w:proofErr w:type="gramStart"/>
+            <w:r>
+              <w:rPr>
+                <w:rFonts w:ascii="Times New Roman" w:eastAsia="Times New Roman" w:hAnsi="Times New Roman" w:cs="Times New Roman"/>
+              </w:rPr>
+              <w:t>labs(</w:t>
+            </w:r>
+            <w:proofErr w:type="gramEnd"/>
+            <w:r>
+              <w:rPr>
+                <w:rFonts w:ascii="Times New Roman" w:eastAsia="Times New Roman" w:hAnsi="Times New Roman" w:cs="Times New Roman"/>
+              </w:rPr>
+              <w:t>title = "Relationship between Alcohol Consumption and Life Expectancy",</w:t>
+            </w:r>
+          </w:p>
+          <w:p>
+            <w:pPr>
+              <w:rPr>
+                <w:rFonts w:ascii="Times New Roman" w:eastAsia="Times New Roman" w:hAnsi="Times New Roman" w:cs="Times New Roman"/>
+              </w:rPr>
+            </w:pPr>
+            <w:r>
+              <w:rPr>
+                <w:rFonts w:ascii="Times New Roman" w:eastAsia="Times New Roman" w:hAnsi="Times New Roman" w:cs="Times New Roman"/>
+              </w:rPr>
+              <w:t xml:space="preserve">       x = "Alcohol Consumption per Capita (litres)",</w:t>
+            </w:r>
+          </w:p>
+          <w:p>
+            <w:pPr>
+              <w:rPr>
+                <w:rFonts w:ascii="Times New Roman" w:eastAsia="Times New Roman" w:hAnsi="Times New Roman" w:cs="Times New Roman"/>
+              </w:rPr>
+            </w:pPr>
+            <w:r>
+              <w:rPr>
+                <w:rFonts w:ascii="Times New Roman" w:eastAsia="Times New Roman" w:hAnsi="Times New Roman" w:cs="Times New Roman"/>
+              </w:rPr>
+              <w:t xml:space="preserve">       y = "Life Expectancy at Birth (years)") +</w:t>
+            </w:r>
+          </w:p>
+          <w:p>
+            <w:pPr>
+              <w:rPr>
+                <w:rFonts w:ascii="Times New Roman" w:eastAsia="Times New Roman" w:hAnsi="Times New Roman" w:cs="Times New Roman"/>
+              </w:rPr>
+            </w:pPr>
+            <w:r>
+              <w:rPr>
+                <w:rFonts w:ascii="Times New Roman" w:eastAsia="Times New Roman" w:hAnsi="Times New Roman" w:cs="Times New Roman"/>
+              </w:rPr>
+              <w:t xml:space="preserve">  </w:t>
+            </w:r>
+            <w:proofErr w:type="spellStart"/>
+            <w:r>
+              <w:rPr>
+                <w:rFonts w:ascii="Times New Roman" w:eastAsia="Times New Roman" w:hAnsi="Times New Roman" w:cs="Times New Roman"/>
+              </w:rPr>
+              <w:t>theme_</w:t>
+            </w:r>
+            <w:proofErr w:type="gramStart"/>
+            <w:r>
+              <w:rPr>
+                <w:rFonts w:ascii="Times New Roman" w:eastAsia="Times New Roman" w:hAnsi="Times New Roman" w:cs="Times New Roman"/>
+              </w:rPr>
+              <w:t>minimal</w:t>
+            </w:r>
+            <w:proofErr w:type="spellEnd"/>
+            <w:r>
+              <w:rPr>
+                <w:rFonts w:ascii="Times New Roman" w:eastAsia="Times New Roman" w:hAnsi="Times New Roman" w:cs="Times New Roman"/>
+              </w:rPr>
+              <w:t>(</w:t>
+            </w:r>
+            <w:proofErr w:type="gramEnd"/>
+            <w:r>
+              <w:rPr>
+                <w:rFonts w:ascii="Times New Roman" w:eastAsia="Times New Roman" w:hAnsi="Times New Roman" w:cs="Times New Roman"/>
+              </w:rPr>
+              <w:t>) +</w:t>
+            </w:r>
+          </w:p>
+          <w:p>
+            <w:pPr>
+              <w:rPr>
+                <w:rFonts w:ascii="Times New Roman" w:eastAsia="Times New Roman" w:hAnsi="Times New Roman" w:cs="Times New Roman"/>
+              </w:rPr>
+            </w:pPr>
+            <w:r>
+              <w:rPr>
+                <w:rFonts w:ascii="Times New Roman" w:eastAsia="Times New Roman" w:hAnsi="Times New Roman" w:cs="Times New Roman"/>
+              </w:rPr>
+              <w:t xml:space="preserve">  </w:t>
+            </w:r>
+            <w:proofErr w:type="gramStart"/>
+            <w:r>
+              <w:rPr>
+                <w:rFonts w:ascii="Times New Roman" w:eastAsia="Times New Roman" w:hAnsi="Times New Roman" w:cs="Times New Roman"/>
+              </w:rPr>
+              <w:t>theme(</w:t>
+            </w:r>
+            <w:proofErr w:type="spellStart"/>
+            <w:r>
+              <w:rPr>
+                <w:rFonts w:ascii="Times New Roman" w:eastAsia="Times New Roman" w:hAnsi="Times New Roman" w:cs="Times New Roman"/>
+              </w:rPr>
+              <w:t>plot.title</w:t>
+            </w:r>
+            <w:proofErr w:type="spellEnd"/>
+            <w:proofErr w:type="gramEnd"/>
+            <w:r>
+              <w:rPr>
+                <w:rFonts w:ascii="Times New Roman" w:eastAsia="Times New Roman" w:hAnsi="Times New Roman" w:cs="Times New Roman"/>
+              </w:rPr>
+              <w:t xml:space="preserve"> = </w:t>
+            </w:r>
+            <w:proofErr w:type="spellStart"/>
+            <w:r>
+              <w:rPr>
+                <w:rFonts w:ascii="Times New Roman" w:eastAsia="Times New Roman" w:hAnsi="Times New Roman" w:cs="Times New Roman"/>
+              </w:rPr>
+              <w:t>element_</w:t>
+            </w:r>
+            <w:proofErr w:type="gramStart"/>
+            <w:r>
+              <w:rPr>
+                <w:rFonts w:ascii="Times New Roman" w:eastAsia="Times New Roman" w:hAnsi="Times New Roman" w:cs="Times New Roman"/>
+              </w:rPr>
+              <w:t>text</w:t>
+            </w:r>
+            <w:proofErr w:type="spellEnd"/>
+            <w:r>
+              <w:rPr>
+                <w:rFonts w:ascii="Times New Roman" w:eastAsia="Times New Roman" w:hAnsi="Times New Roman" w:cs="Times New Roman"/>
+              </w:rPr>
+              <w:t>(</w:t>
+            </w:r>
+            <w:proofErr w:type="spellStart"/>
+            <w:proofErr w:type="gramEnd"/>
+            <w:r>
+              <w:rPr>
+                <w:rFonts w:ascii="Times New Roman" w:eastAsia="Times New Roman" w:hAnsi="Times New Roman" w:cs="Times New Roman"/>
+              </w:rPr>
+              <w:t>hjust</w:t>
+            </w:r>
+            <w:proofErr w:type="spellEnd"/>
+            <w:r>
+              <w:rPr>
+                <w:rFonts w:ascii="Times New Roman" w:eastAsia="Times New Roman" w:hAnsi="Times New Roman" w:cs="Times New Roman"/>
+              </w:rPr>
+              <w:t xml:space="preserve"> = 0.5, face = "bold"))</w:t>
+            </w:r>
+          </w:p>
+          <w:p>
+            <w:pPr>
+              <w:rPr>
+                <w:rFonts w:ascii="Times New Roman" w:eastAsia="Times New Roman" w:hAnsi="Times New Roman" w:cs="Times New Roman"/>
+              </w:rPr>
+            </w:pPr>
+          </w:p>
+          <w:p>
+            <w:pPr>
+              <w:rPr>
+                <w:rFonts w:ascii="Times New Roman" w:eastAsia="Times New Roman" w:hAnsi="Times New Roman" w:cs="Times New Roman"/>
+              </w:rPr>
+            </w:pPr>
+            <w:r>
+              <w:rPr>
+                <w:rFonts w:ascii="Times New Roman" w:eastAsia="Times New Roman" w:hAnsi="Times New Roman" w:cs="Times New Roman"/>
+              </w:rPr>
+              <w:t># Display plot</w:t>
+            </w:r>
+          </w:p>
+          <w:p>
+            <w:pPr>
+              <w:rPr>
+                <w:rFonts w:ascii="Times New Roman" w:eastAsia="Times New Roman" w:hAnsi="Times New Roman" w:cs="Times New Roman"/>
+              </w:rPr>
+            </w:pPr>
+            <w:r>
+              <w:rPr>
+                <w:rFonts w:ascii="Times New Roman" w:eastAsia="Times New Roman" w:hAnsi="Times New Roman" w:cs="Times New Roman"/>
+              </w:rPr>
+              <w:t>print(</w:t>
+            </w:r>
+            <w:proofErr w:type="spellStart"/>
+            <w:r>
+              <w:rPr>
+                <w:rFonts w:ascii="Times New Roman" w:eastAsia="Times New Roman" w:hAnsi="Times New Roman" w:cs="Times New Roman"/>
+              </w:rPr>
+              <w:t>scatter_plot</w:t>
+            </w:r>
+            <w:proofErr w:type="spellEnd"/>
+            <w:r>
+              <w:rPr>
+                <w:rFonts w:ascii="Times New Roman" w:eastAsia="Times New Roman" w:hAnsi="Times New Roman" w:cs="Times New Roman"/>
+              </w:rPr>
+              <w:t>)</w:t>
+            </w:r>
+          </w:p>
+          <w:p>
+            <w:pPr>
+              <w:rPr>
+                <w:rFonts w:ascii="Times New Roman" w:eastAsia="Times New Roman" w:hAnsi="Times New Roman" w:cs="Times New Roman"/>
+              </w:rPr>
+            </w:pPr>
+          </w:p>
+          <w:p>
+            <w:pPr>
+              <w:rPr>
+                <w:rFonts w:ascii="Times New Roman" w:eastAsia="Times New Roman" w:hAnsi="Times New Roman" w:cs="Times New Roman"/>
+              </w:rPr>
+            </w:pPr>
+          </w:p>
+          <w:p>
+            <w:pPr>
+              <w:rPr>
+                <w:rFonts w:ascii="Times New Roman" w:eastAsia="Times New Roman" w:hAnsi="Times New Roman" w:cs="Times New Roman"/>
+              </w:rPr>
+            </w:pPr>
+          </w:p>
+          <w:p>
+            <w:pPr>
+              <w:rPr>
+                <w:rFonts w:ascii="Times New Roman" w:eastAsia="Times New Roman" w:hAnsi="Times New Roman" w:cs="Times New Roman"/>
+              </w:rPr>
+            </w:pPr>
+          </w:p>
+          <w:p>
+            <w:pPr>
+              <w:rPr>
+                <w:rFonts w:ascii="Times New Roman" w:eastAsia="Times New Roman" w:hAnsi="Times New Roman" w:cs="Times New Roman"/>
+              </w:rPr>
+            </w:pPr>
+            <w:r>
+              <w:rPr>
+                <w:rFonts w:ascii="Times New Roman" w:eastAsia="Times New Roman" w:hAnsi="Times New Roman" w:cs="Times New Roman"/>
+              </w:rPr>
+              <w:t># Pearson correlation test</w:t>
+            </w:r>
+          </w:p>
+          <w:p>
+            <w:pPr>
+              <w:rPr>
+                <w:rFonts w:ascii="Times New Roman" w:eastAsia="Times New Roman" w:hAnsi="Times New Roman" w:cs="Times New Roman"/>
+              </w:rPr>
+            </w:pPr>
+            <w:proofErr w:type="spellStart"/>
+            <w:r>
+              <w:rPr>
+                <w:rFonts w:ascii="Times New Roman" w:eastAsia="Times New Roman" w:hAnsi="Times New Roman" w:cs="Times New Roman"/>
+              </w:rPr>
+              <w:t>correlation_test</w:t>
+            </w:r>
+            <w:proofErr w:type="spellEnd"/>
+            <w:r>
+              <w:rPr>
+                <w:rFonts w:ascii="Times New Roman" w:eastAsia="Times New Roman" w:hAnsi="Times New Roman" w:cs="Times New Roman"/>
+              </w:rPr>
+              <w:t xml:space="preserve"> &lt;- </w:t>
+            </w:r>
+            <w:proofErr w:type="spellStart"/>
+            <w:r>
+              <w:rPr>
+                <w:rFonts w:ascii="Times New Roman" w:eastAsia="Times New Roman" w:hAnsi="Times New Roman" w:cs="Times New Roman"/>
+              </w:rPr>
+              <w:t>cor.</w:t>
+            </w:r>
+            <w:proofErr w:type="gramStart"/>
+            <w:r>
+              <w:rPr>
+                <w:rFonts w:ascii="Times New Roman" w:eastAsia="Times New Roman" w:hAnsi="Times New Roman" w:cs="Times New Roman"/>
+              </w:rPr>
+              <w:t>test</w:t>
+            </w:r>
+            <w:proofErr w:type="spellEnd"/>
+            <w:r>
+              <w:rPr>
+                <w:rFonts w:ascii="Times New Roman" w:eastAsia="Times New Roman" w:hAnsi="Times New Roman" w:cs="Times New Roman"/>
+              </w:rPr>
+              <w:t>(</w:t>
+            </w:r>
+            <w:proofErr w:type="spellStart"/>
+            <w:proofErr w:type="gramEnd"/>
+            <w:r>
+              <w:rPr>
+                <w:rFonts w:ascii="Times New Roman" w:eastAsia="Times New Roman" w:hAnsi="Times New Roman" w:cs="Times New Roman"/>
+              </w:rPr>
               <w:t>data_clean$Alcohol_Consumption</w:t>
             </w:r>
             <w:proofErr w:type="spellEnd"/>
@@ -8631,7 +10243,7 @@
               <w:rPr>
                 <w:rFonts w:ascii="Times New Roman" w:eastAsia="Times New Roman" w:hAnsi="Times New Roman" w:cs="Times New Roman"/>
               </w:rPr>
-              <w:t xml:space="preserve">     </w:t>
+              <w:t xml:space="preserve">                             </w:t>
             </w:r>
             <w:proofErr w:type="spellStart"/>
             <w:r>
@@ -8658,109 +10270,370 @@
               <w:rPr>
                 <w:rFonts w:ascii="Times New Roman" w:eastAsia="Times New Roman" w:hAnsi="Times New Roman" w:cs="Times New Roman"/>
               </w:rPr>
-              <w:t xml:space="preserve">     main = "Alcohol Consumption vs Life Expectancy",</w:t>
-            </w:r>
-          </w:p>
-          <w:p>
-            <w:pPr>
-              <w:rPr>
-                <w:rFonts w:ascii="Times New Roman" w:eastAsia="Times New Roman" w:hAnsi="Times New Roman" w:cs="Times New Roman"/>
-              </w:rPr>
-            </w:pPr>
-            <w:r>
-              <w:rPr>
-                <w:rFonts w:ascii="Times New Roman" w:eastAsia="Times New Roman" w:hAnsi="Times New Roman" w:cs="Times New Roman"/>
-              </w:rPr>
-              <w:t xml:space="preserve">     </w:t>
-            </w:r>
-            <w:proofErr w:type="spellStart"/>
-            <w:r>
-              <w:rPr>
-                <w:rFonts w:ascii="Times New Roman" w:eastAsia="Times New Roman" w:hAnsi="Times New Roman" w:cs="Times New Roman"/>
-              </w:rPr>
-              <w:t>xlab</w:t>
-            </w:r>
-            <w:proofErr w:type="spellEnd"/>
-            <w:r>
-              <w:rPr>
-                <w:rFonts w:ascii="Times New Roman" w:eastAsia="Times New Roman" w:hAnsi="Times New Roman" w:cs="Times New Roman"/>
-              </w:rPr>
-              <w:t xml:space="preserve"> = "Alcohol Consumption (litres per capita)",</w:t>
-            </w:r>
-          </w:p>
-          <w:p>
-            <w:pPr>
-              <w:rPr>
-                <w:rFonts w:ascii="Times New Roman" w:eastAsia="Times New Roman" w:hAnsi="Times New Roman" w:cs="Times New Roman"/>
-              </w:rPr>
-            </w:pPr>
-            <w:r>
-              <w:rPr>
-                <w:rFonts w:ascii="Times New Roman" w:eastAsia="Times New Roman" w:hAnsi="Times New Roman" w:cs="Times New Roman"/>
-              </w:rPr>
-              <w:t xml:space="preserve">     </w:t>
-            </w:r>
-            <w:proofErr w:type="spellStart"/>
-            <w:r>
-              <w:rPr>
-                <w:rFonts w:ascii="Times New Roman" w:eastAsia="Times New Roman" w:hAnsi="Times New Roman" w:cs="Times New Roman"/>
-              </w:rPr>
-              <w:t>ylab</w:t>
-            </w:r>
-            <w:proofErr w:type="spellEnd"/>
-            <w:r>
-              <w:rPr>
-                <w:rFonts w:ascii="Times New Roman" w:eastAsia="Times New Roman" w:hAnsi="Times New Roman" w:cs="Times New Roman"/>
-              </w:rPr>
-              <w:t xml:space="preserve"> = "Life Expectancy (years)",</w:t>
-            </w:r>
-          </w:p>
-          <w:p>
-            <w:pPr>
-              <w:rPr>
-                <w:rFonts w:ascii="Times New Roman" w:eastAsia="Times New Roman" w:hAnsi="Times New Roman" w:cs="Times New Roman"/>
-              </w:rPr>
-            </w:pPr>
-            <w:r>
-              <w:rPr>
-                <w:rFonts w:ascii="Times New Roman" w:eastAsia="Times New Roman" w:hAnsi="Times New Roman" w:cs="Times New Roman"/>
-              </w:rPr>
-              <w:t xml:space="preserve">     </w:t>
-            </w:r>
-            <w:proofErr w:type="spellStart"/>
-            <w:r>
-              <w:rPr>
-                <w:rFonts w:ascii="Times New Roman" w:eastAsia="Times New Roman" w:hAnsi="Times New Roman" w:cs="Times New Roman"/>
-              </w:rPr>
-              <w:t>pch</w:t>
-            </w:r>
-            <w:proofErr w:type="spellEnd"/>
-            <w:r>
-              <w:rPr>
-                <w:rFonts w:ascii="Times New Roman" w:eastAsia="Times New Roman" w:hAnsi="Times New Roman" w:cs="Times New Roman"/>
-              </w:rPr>
-              <w:t xml:space="preserve"> = 19,</w:t>
-            </w:r>
-          </w:p>
-          <w:p>
-            <w:pPr>
-              <w:rPr>
-                <w:rFonts w:ascii="Times New Roman" w:eastAsia="Times New Roman" w:hAnsi="Times New Roman" w:cs="Times New Roman"/>
-              </w:rPr>
-            </w:pPr>
-            <w:r>
-              <w:rPr>
-                <w:rFonts w:ascii="Times New Roman" w:eastAsia="Times New Roman" w:hAnsi="Times New Roman" w:cs="Times New Roman"/>
-              </w:rPr>
-              <w:t xml:space="preserve">     col = </w:t>
-            </w:r>
-            <w:proofErr w:type="spellStart"/>
+              <w:t xml:space="preserve">                             method = "</w:t>
+            </w:r>
+            <w:proofErr w:type="spellStart"/>
+            <w:r>
+              <w:rPr>
+                <w:rFonts w:ascii="Times New Roman" w:eastAsia="Times New Roman" w:hAnsi="Times New Roman" w:cs="Times New Roman"/>
+              </w:rPr>
+              <w:t>pearson</w:t>
+            </w:r>
+            <w:proofErr w:type="spellEnd"/>
+            <w:r>
+              <w:rPr>
+                <w:rFonts w:ascii="Times New Roman" w:eastAsia="Times New Roman" w:hAnsi="Times New Roman" w:cs="Times New Roman"/>
+              </w:rPr>
+              <w:t>")</w:t>
+            </w:r>
+          </w:p>
+          <w:p>
+            <w:pPr>
+              <w:rPr>
+                <w:rFonts w:ascii="Times New Roman" w:eastAsia="Times New Roman" w:hAnsi="Times New Roman" w:cs="Times New Roman"/>
+              </w:rPr>
+            </w:pPr>
+          </w:p>
+          <w:p>
+            <w:pPr>
+              <w:rPr>
+                <w:rFonts w:ascii="Times New Roman" w:eastAsia="Times New Roman" w:hAnsi="Times New Roman" w:cs="Times New Roman"/>
+              </w:rPr>
+            </w:pPr>
+            <w:r>
+              <w:rPr>
+                <w:rFonts w:ascii="Times New Roman" w:eastAsia="Times New Roman" w:hAnsi="Times New Roman" w:cs="Times New Roman"/>
+              </w:rPr>
+              <w:t># Display correlation results</w:t>
+            </w:r>
+          </w:p>
+          <w:p>
+            <w:pPr>
+              <w:rPr>
+                <w:rFonts w:ascii="Times New Roman" w:eastAsia="Times New Roman" w:hAnsi="Times New Roman" w:cs="Times New Roman"/>
+              </w:rPr>
+            </w:pPr>
+            <w:r>
+              <w:rPr>
+                <w:rFonts w:ascii="Times New Roman" w:eastAsia="Times New Roman" w:hAnsi="Times New Roman" w:cs="Times New Roman"/>
+              </w:rPr>
+              <w:t>print(</w:t>
+            </w:r>
+            <w:proofErr w:type="spellStart"/>
+            <w:r>
+              <w:rPr>
+                <w:rFonts w:ascii="Times New Roman" w:eastAsia="Times New Roman" w:hAnsi="Times New Roman" w:cs="Times New Roman"/>
+              </w:rPr>
+              <w:t>correlation_test</w:t>
+            </w:r>
+            <w:proofErr w:type="spellEnd"/>
+            <w:r>
+              <w:rPr>
+                <w:rFonts w:ascii="Times New Roman" w:eastAsia="Times New Roman" w:hAnsi="Times New Roman" w:cs="Times New Roman"/>
+              </w:rPr>
+              <w:t>)</w:t>
+            </w:r>
+          </w:p>
+          <w:p>
+            <w:pPr>
+              <w:rPr>
+                <w:rFonts w:ascii="Times New Roman" w:eastAsia="Times New Roman" w:hAnsi="Times New Roman" w:cs="Times New Roman"/>
+              </w:rPr>
+            </w:pPr>
+          </w:p>
+          <w:p>
+            <w:pPr>
+              <w:rPr>
+                <w:rFonts w:ascii="Times New Roman" w:eastAsia="Times New Roman" w:hAnsi="Times New Roman" w:cs="Times New Roman"/>
+              </w:rPr>
+            </w:pPr>
+            <w:r>
+              <w:rPr>
+                <w:rFonts w:ascii="Times New Roman" w:eastAsia="Times New Roman" w:hAnsi="Times New Roman" w:cs="Times New Roman"/>
+              </w:rPr>
+              <w:t># Extract key statistics</w:t>
+            </w:r>
+          </w:p>
+          <w:p>
+            <w:pPr>
+              <w:rPr>
+                <w:rFonts w:ascii="Times New Roman" w:eastAsia="Times New Roman" w:hAnsi="Times New Roman" w:cs="Times New Roman"/>
+              </w:rPr>
+            </w:pPr>
+            <w:proofErr w:type="spellStart"/>
+            <w:r>
+              <w:rPr>
+                <w:rFonts w:ascii="Times New Roman" w:eastAsia="Times New Roman" w:hAnsi="Times New Roman" w:cs="Times New Roman"/>
+              </w:rPr>
+              <w:t>correlation_coefficient</w:t>
+            </w:r>
+            <w:proofErr w:type="spellEnd"/>
+            <w:r>
+              <w:rPr>
+                <w:rFonts w:ascii="Times New Roman" w:eastAsia="Times New Roman" w:hAnsi="Times New Roman" w:cs="Times New Roman"/>
+              </w:rPr>
+              <w:t xml:space="preserve"> &lt;- </w:t>
+            </w:r>
+            <w:proofErr w:type="spellStart"/>
+            <w:r>
+              <w:rPr>
+                <w:rFonts w:ascii="Times New Roman" w:eastAsia="Times New Roman" w:hAnsi="Times New Roman" w:cs="Times New Roman"/>
+              </w:rPr>
+              <w:t>correlation_test$estimate</w:t>
+            </w:r>
+            <w:proofErr w:type="spellEnd"/>
+          </w:p>
+          <w:p>
+            <w:pPr>
+              <w:rPr>
+                <w:rFonts w:ascii="Times New Roman" w:eastAsia="Times New Roman" w:hAnsi="Times New Roman" w:cs="Times New Roman"/>
+              </w:rPr>
+            </w:pPr>
+            <w:proofErr w:type="spellStart"/>
+            <w:r>
+              <w:rPr>
+                <w:rFonts w:ascii="Times New Roman" w:eastAsia="Times New Roman" w:hAnsi="Times New Roman" w:cs="Times New Roman"/>
+              </w:rPr>
+              <w:t>p_value</w:t>
+            </w:r>
+            <w:proofErr w:type="spellEnd"/>
+            <w:r>
+              <w:rPr>
+                <w:rFonts w:ascii="Times New Roman" w:eastAsia="Times New Roman" w:hAnsi="Times New Roman" w:cs="Times New Roman"/>
+              </w:rPr>
+              <w:t xml:space="preserve"> &lt;- </w:t>
+            </w:r>
+            <w:proofErr w:type="spellStart"/>
+            <w:r>
+              <w:rPr>
+                <w:rFonts w:ascii="Times New Roman" w:eastAsia="Times New Roman" w:hAnsi="Times New Roman" w:cs="Times New Roman"/>
+              </w:rPr>
+              <w:t>correlation_test$p.value</w:t>
+            </w:r>
+            <w:proofErr w:type="spellEnd"/>
+          </w:p>
+          <w:p>
+            <w:pPr>
+              <w:rPr>
+                <w:rFonts w:ascii="Times New Roman" w:eastAsia="Times New Roman" w:hAnsi="Times New Roman" w:cs="Times New Roman"/>
+              </w:rPr>
+            </w:pPr>
+            <w:proofErr w:type="spellStart"/>
+            <w:r>
+              <w:rPr>
+                <w:rFonts w:ascii="Times New Roman" w:eastAsia="Times New Roman" w:hAnsi="Times New Roman" w:cs="Times New Roman"/>
+              </w:rPr>
+              <w:t>confidence_interval</w:t>
+            </w:r>
+            <w:proofErr w:type="spellEnd"/>
+            <w:r>
+              <w:rPr>
+                <w:rFonts w:ascii="Times New Roman" w:eastAsia="Times New Roman" w:hAnsi="Times New Roman" w:cs="Times New Roman"/>
+              </w:rPr>
+              <w:t xml:space="preserve"> &lt;- correlation_test$conf.int</w:t>
+            </w:r>
+          </w:p>
+          <w:p>
+            <w:pPr>
+              <w:rPr>
+                <w:rFonts w:ascii="Times New Roman" w:eastAsia="Times New Roman" w:hAnsi="Times New Roman" w:cs="Times New Roman"/>
+              </w:rPr>
+            </w:pPr>
+          </w:p>
+          <w:p>
+            <w:pPr>
+              <w:rPr>
+                <w:rFonts w:ascii="Times New Roman" w:eastAsia="Times New Roman" w:hAnsi="Times New Roman" w:cs="Times New Roman"/>
+              </w:rPr>
+            </w:pPr>
             <w:proofErr w:type="gramStart"/>
             <w:r>
               <w:rPr>
                 <w:rFonts w:ascii="Times New Roman" w:eastAsia="Times New Roman" w:hAnsi="Times New Roman" w:cs="Times New Roman"/>
               </w:rPr>
-              <w:t>rgb</w:t>
+              <w:t>cat(</w:t>
+            </w:r>
+            <w:proofErr w:type="gramEnd"/>
+            <w:r>
+              <w:rPr>
+                <w:rFonts w:ascii="Times New Roman" w:eastAsia="Times New Roman" w:hAnsi="Times New Roman" w:cs="Times New Roman"/>
+              </w:rPr>
+              <w:t>"\n=== CORRELATION ANALYSIS RESULTS ===\n")</w:t>
+            </w:r>
+          </w:p>
+          <w:p>
+            <w:pPr>
+              <w:rPr>
+                <w:rFonts w:ascii="Times New Roman" w:eastAsia="Times New Roman" w:hAnsi="Times New Roman" w:cs="Times New Roman"/>
+              </w:rPr>
+            </w:pPr>
+            <w:proofErr w:type="gramStart"/>
+            <w:r>
+              <w:rPr>
+                <w:rFonts w:ascii="Times New Roman" w:eastAsia="Times New Roman" w:hAnsi="Times New Roman" w:cs="Times New Roman"/>
+              </w:rPr>
+              <w:t>cat(</w:t>
+            </w:r>
+            <w:proofErr w:type="gramEnd"/>
+            <w:r>
+              <w:rPr>
+                <w:rFonts w:ascii="Times New Roman" w:eastAsia="Times New Roman" w:hAnsi="Times New Roman" w:cs="Times New Roman"/>
+              </w:rPr>
+              <w:t xml:space="preserve">"Pearson Correlation Coefficient (r):", </w:t>
+            </w:r>
+            <w:proofErr w:type="spellStart"/>
+            <w:r>
+              <w:rPr>
+                <w:rFonts w:ascii="Times New Roman" w:eastAsia="Times New Roman" w:hAnsi="Times New Roman" w:cs="Times New Roman"/>
+              </w:rPr>
+              <w:t>correlation_coefficient</w:t>
+            </w:r>
+            <w:proofErr w:type="spellEnd"/>
+            <w:r>
+              <w:rPr>
+                <w:rFonts w:ascii="Times New Roman" w:eastAsia="Times New Roman" w:hAnsi="Times New Roman" w:cs="Times New Roman"/>
+              </w:rPr>
+              <w:t>, "\n")</w:t>
+            </w:r>
+          </w:p>
+          <w:p>
+            <w:pPr>
+              <w:rPr>
+                <w:rFonts w:ascii="Times New Roman" w:eastAsia="Times New Roman" w:hAnsi="Times New Roman" w:cs="Times New Roman"/>
+              </w:rPr>
+            </w:pPr>
+            <w:proofErr w:type="gramStart"/>
+            <w:r>
+              <w:rPr>
+                <w:rFonts w:ascii="Times New Roman" w:eastAsia="Times New Roman" w:hAnsi="Times New Roman" w:cs="Times New Roman"/>
+              </w:rPr>
+              <w:t>cat(</w:t>
+            </w:r>
+            <w:proofErr w:type="gramEnd"/>
+            <w:r>
+              <w:rPr>
+                <w:rFonts w:ascii="Times New Roman" w:eastAsia="Times New Roman" w:hAnsi="Times New Roman" w:cs="Times New Roman"/>
+              </w:rPr>
+              <w:t xml:space="preserve">"P-value:", </w:t>
+            </w:r>
+            <w:proofErr w:type="spellStart"/>
+            <w:r>
+              <w:rPr>
+                <w:rFonts w:ascii="Times New Roman" w:eastAsia="Times New Roman" w:hAnsi="Times New Roman" w:cs="Times New Roman"/>
+              </w:rPr>
+              <w:t>p_value</w:t>
+            </w:r>
+            <w:proofErr w:type="spellEnd"/>
+            <w:r>
+              <w:rPr>
+                <w:rFonts w:ascii="Times New Roman" w:eastAsia="Times New Roman" w:hAnsi="Times New Roman" w:cs="Times New Roman"/>
+              </w:rPr>
+              <w:t>, "\n")</w:t>
+            </w:r>
+          </w:p>
+          <w:p>
+            <w:pPr>
+              <w:rPr>
+                <w:rFonts w:ascii="Times New Roman" w:eastAsia="Times New Roman" w:hAnsi="Times New Roman" w:cs="Times New Roman"/>
+              </w:rPr>
+            </w:pPr>
+            <w:proofErr w:type="gramStart"/>
+            <w:r>
+              <w:rPr>
+                <w:rFonts w:ascii="Times New Roman" w:eastAsia="Times New Roman" w:hAnsi="Times New Roman" w:cs="Times New Roman"/>
+              </w:rPr>
+              <w:t>cat(</w:t>
+            </w:r>
+            <w:proofErr w:type="gramEnd"/>
+            <w:r>
+              <w:rPr>
+                <w:rFonts w:ascii="Times New Roman" w:eastAsia="Times New Roman" w:hAnsi="Times New Roman" w:cs="Times New Roman"/>
+              </w:rPr>
+              <w:t xml:space="preserve">"95% Confidence Interval:", </w:t>
+            </w:r>
+            <w:proofErr w:type="spellStart"/>
+            <w:r>
+              <w:rPr>
+                <w:rFonts w:ascii="Times New Roman" w:eastAsia="Times New Roman" w:hAnsi="Times New Roman" w:cs="Times New Roman"/>
+              </w:rPr>
+              <w:t>confidence_</w:t>
+            </w:r>
+            <w:proofErr w:type="gramStart"/>
+            <w:r>
+              <w:rPr>
+                <w:rFonts w:ascii="Times New Roman" w:eastAsia="Times New Roman" w:hAnsi="Times New Roman" w:cs="Times New Roman"/>
+              </w:rPr>
+              <w:t>interval</w:t>
+            </w:r>
+            <w:proofErr w:type="spellEnd"/>
+            <w:r>
+              <w:rPr>
+                <w:rFonts w:ascii="Times New Roman" w:eastAsia="Times New Roman" w:hAnsi="Times New Roman" w:cs="Times New Roman"/>
+              </w:rPr>
+              <w:t>[</w:t>
+            </w:r>
+            <w:proofErr w:type="gramEnd"/>
+            <w:r>
+              <w:rPr>
+                <w:rFonts w:ascii="Times New Roman" w:eastAsia="Times New Roman" w:hAnsi="Times New Roman" w:cs="Times New Roman"/>
+              </w:rPr>
+              <w:t xml:space="preserve">1], "to", </w:t>
+            </w:r>
+            <w:proofErr w:type="spellStart"/>
+            <w:r>
+              <w:rPr>
+                <w:rFonts w:ascii="Times New Roman" w:eastAsia="Times New Roman" w:hAnsi="Times New Roman" w:cs="Times New Roman"/>
+              </w:rPr>
+              <w:t>confidence_</w:t>
+            </w:r>
+            <w:proofErr w:type="gramStart"/>
+            <w:r>
+              <w:rPr>
+                <w:rFonts w:ascii="Times New Roman" w:eastAsia="Times New Roman" w:hAnsi="Times New Roman" w:cs="Times New Roman"/>
+              </w:rPr>
+              <w:t>interval</w:t>
+            </w:r>
+            <w:proofErr w:type="spellEnd"/>
+            <w:r>
+              <w:rPr>
+                <w:rFonts w:ascii="Times New Roman" w:eastAsia="Times New Roman" w:hAnsi="Times New Roman" w:cs="Times New Roman"/>
+              </w:rPr>
+              <w:t>[</w:t>
+            </w:r>
+            <w:proofErr w:type="gramEnd"/>
+            <w:r>
+              <w:rPr>
+                <w:rFonts w:ascii="Times New Roman" w:eastAsia="Times New Roman" w:hAnsi="Times New Roman" w:cs="Times New Roman"/>
+              </w:rPr>
+              <w:t>2], "\n")</w:t>
+            </w:r>
+          </w:p>
+          <w:p>
+            <w:pPr>
+              <w:rPr>
+                <w:rFonts w:ascii="Times New Roman" w:eastAsia="Times New Roman" w:hAnsi="Times New Roman" w:cs="Times New Roman"/>
+              </w:rPr>
+            </w:pPr>
+            <w:proofErr w:type="gramStart"/>
+            <w:r>
+              <w:rPr>
+                <w:rFonts w:ascii="Times New Roman" w:eastAsia="Times New Roman" w:hAnsi="Times New Roman" w:cs="Times New Roman"/>
+              </w:rPr>
+              <w:t>cat(</w:t>
+            </w:r>
+            <w:proofErr w:type="gramEnd"/>
+            <w:r>
+              <w:rPr>
+                <w:rFonts w:ascii="Times New Roman" w:eastAsia="Times New Roman" w:hAnsi="Times New Roman" w:cs="Times New Roman"/>
+              </w:rPr>
+              <w:t xml:space="preserve">"Sample size (n):", </w:t>
+            </w:r>
+            <w:proofErr w:type="spellStart"/>
+            <w:r>
+              <w:rPr>
+                <w:rFonts w:ascii="Times New Roman" w:eastAsia="Times New Roman" w:hAnsi="Times New Roman" w:cs="Times New Roman"/>
+              </w:rPr>
+              <w:t>nrow</w:t>
             </w:r>
             <w:proofErr w:type="spellEnd"/>
             <w:r>
@@ -8769,1989 +10642,121 @@
               </w:rPr>
               <w:t>(</w:t>
             </w:r>
+            <w:proofErr w:type="spellStart"/>
+            <w:r>
+              <w:rPr>
+                <w:rFonts w:ascii="Times New Roman" w:eastAsia="Times New Roman" w:hAnsi="Times New Roman" w:cs="Times New Roman"/>
+              </w:rPr>
+              <w:t>data_clean</w:t>
+            </w:r>
+            <w:proofErr w:type="spellEnd"/>
+            <w:r>
+              <w:rPr>
+                <w:rFonts w:ascii="Times New Roman" w:eastAsia="Times New Roman" w:hAnsi="Times New Roman" w:cs="Times New Roman"/>
+              </w:rPr>
+              <w:t>), "\n")</w:t>
+            </w:r>
+          </w:p>
+          <w:p>
+            <w:pPr>
+              <w:rPr>
+                <w:rFonts w:ascii="Times New Roman" w:eastAsia="Times New Roman" w:hAnsi="Times New Roman" w:cs="Times New Roman"/>
+              </w:rPr>
+            </w:pPr>
+          </w:p>
+          <w:p>
+            <w:pPr>
+              <w:rPr>
+                <w:rFonts w:ascii="Times New Roman" w:eastAsia="Times New Roman" w:hAnsi="Times New Roman" w:cs="Times New Roman"/>
+              </w:rPr>
+            </w:pPr>
+            <w:r>
+              <w:rPr>
+                <w:rFonts w:ascii="Times New Roman" w:eastAsia="Times New Roman" w:hAnsi="Times New Roman" w:cs="Times New Roman"/>
+              </w:rPr>
+              <w:t># Interpretation</w:t>
+            </w:r>
+          </w:p>
+          <w:p>
+            <w:pPr>
+              <w:rPr>
+                <w:rFonts w:ascii="Times New Roman" w:eastAsia="Times New Roman" w:hAnsi="Times New Roman" w:cs="Times New Roman"/>
+              </w:rPr>
+            </w:pPr>
+            <w:r>
+              <w:rPr>
+                <w:rFonts w:ascii="Times New Roman" w:eastAsia="Times New Roman" w:hAnsi="Times New Roman" w:cs="Times New Roman"/>
+              </w:rPr>
+              <w:lastRenderedPageBreak/>
+              <w:t>if (</w:t>
+            </w:r>
+            <w:proofErr w:type="spellStart"/>
+            <w:r>
+              <w:rPr>
+                <w:rFonts w:ascii="Times New Roman" w:eastAsia="Times New Roman" w:hAnsi="Times New Roman" w:cs="Times New Roman"/>
+              </w:rPr>
+              <w:t>p_value</w:t>
+            </w:r>
+            <w:proofErr w:type="spellEnd"/>
+            <w:r>
+              <w:rPr>
+                <w:rFonts w:ascii="Times New Roman" w:eastAsia="Times New Roman" w:hAnsi="Times New Roman" w:cs="Times New Roman"/>
+              </w:rPr>
+              <w:t xml:space="preserve"> &lt; 0.05) {</w:t>
+            </w:r>
+          </w:p>
+          <w:p>
+            <w:pPr>
+              <w:rPr>
+                <w:rFonts w:ascii="Times New Roman" w:eastAsia="Times New Roman" w:hAnsi="Times New Roman" w:cs="Times New Roman"/>
+              </w:rPr>
+            </w:pPr>
+            <w:r>
+              <w:rPr>
+                <w:rFonts w:ascii="Times New Roman" w:eastAsia="Times New Roman" w:hAnsi="Times New Roman" w:cs="Times New Roman"/>
+              </w:rPr>
+              <w:t xml:space="preserve">  </w:t>
+            </w:r>
+            <w:proofErr w:type="gramStart"/>
+            <w:r>
+              <w:rPr>
+                <w:rFonts w:ascii="Times New Roman" w:eastAsia="Times New Roman" w:hAnsi="Times New Roman" w:cs="Times New Roman"/>
+              </w:rPr>
+              <w:t>cat(</w:t>
+            </w:r>
             <w:proofErr w:type="gramEnd"/>
             <w:r>
               <w:rPr>
                 <w:rFonts w:ascii="Times New Roman" w:eastAsia="Times New Roman" w:hAnsi="Times New Roman" w:cs="Times New Roman"/>
               </w:rPr>
-              <w:t>0, 0, 0.5, 0.6),</w:t>
-            </w:r>
-          </w:p>
-          <w:p>
-            <w:pPr>
-              <w:rPr>
-                <w:rFonts w:ascii="Times New Roman" w:eastAsia="Times New Roman" w:hAnsi="Times New Roman" w:cs="Times New Roman"/>
-              </w:rPr>
-            </w:pPr>
-            <w:r>
-              <w:rPr>
-                <w:rFonts w:ascii="Times New Roman" w:eastAsia="Times New Roman" w:hAnsi="Times New Roman" w:cs="Times New Roman"/>
-              </w:rPr>
-              <w:t xml:space="preserve">     </w:t>
-            </w:r>
-            <w:proofErr w:type="spellStart"/>
-            <w:r>
-              <w:rPr>
-                <w:rFonts w:ascii="Times New Roman" w:eastAsia="Times New Roman" w:hAnsi="Times New Roman" w:cs="Times New Roman"/>
-              </w:rPr>
-              <w:t>cex</w:t>
-            </w:r>
-            <w:proofErr w:type="spellEnd"/>
-            <w:r>
-              <w:rPr>
-                <w:rFonts w:ascii="Times New Roman" w:eastAsia="Times New Roman" w:hAnsi="Times New Roman" w:cs="Times New Roman"/>
-              </w:rPr>
-              <w:t xml:space="preserve"> = 1.1)</w:t>
-            </w:r>
-          </w:p>
-          <w:p>
-            <w:pPr>
-              <w:rPr>
-                <w:rFonts w:ascii="Times New Roman" w:eastAsia="Times New Roman" w:hAnsi="Times New Roman" w:cs="Times New Roman"/>
-              </w:rPr>
-            </w:pPr>
-          </w:p>
-          <w:p>
-            <w:pPr>
-              <w:rPr>
-                <w:rFonts w:ascii="Times New Roman" w:eastAsia="Times New Roman" w:hAnsi="Times New Roman" w:cs="Times New Roman"/>
-              </w:rPr>
-            </w:pPr>
+              <w:t>"\</w:t>
+            </w:r>
+            <w:proofErr w:type="spellStart"/>
+            <w:r>
+              <w:rPr>
+                <w:rFonts w:ascii="Times New Roman" w:eastAsia="Times New Roman" w:hAnsi="Times New Roman" w:cs="Times New Roman"/>
+              </w:rPr>
+              <w:t>nConclusion</w:t>
+            </w:r>
+            <w:proofErr w:type="spellEnd"/>
+            <w:r>
+              <w:rPr>
+                <w:rFonts w:ascii="Times New Roman" w:eastAsia="Times New Roman" w:hAnsi="Times New Roman" w:cs="Times New Roman"/>
+              </w:rPr>
+              <w:t xml:space="preserve">: The null hypothesis is REJECTED (p &lt; </w:t>
+            </w:r>
             <w:proofErr w:type="gramStart"/>
             <w:r>
               <w:rPr>
                 <w:rFonts w:ascii="Times New Roman" w:eastAsia="Times New Roman" w:hAnsi="Times New Roman" w:cs="Times New Roman"/>
               </w:rPr>
-              <w:t>grid(</w:t>
+              <w:t>0.05)\</w:t>
             </w:r>
             <w:proofErr w:type="gramEnd"/>
             <w:r>
               <w:rPr>
                 <w:rFonts w:ascii="Times New Roman" w:eastAsia="Times New Roman" w:hAnsi="Times New Roman" w:cs="Times New Roman"/>
               </w:rPr>
-              <w:t>col = "</w:t>
-            </w:r>
-            <w:proofErr w:type="spellStart"/>
-            <w:r>
-              <w:rPr>
-                <w:rFonts w:ascii="Times New Roman" w:eastAsia="Times New Roman" w:hAnsi="Times New Roman" w:cs="Times New Roman"/>
-              </w:rPr>
-              <w:t>gray</w:t>
-            </w:r>
-            <w:proofErr w:type="spellEnd"/>
-            <w:r>
-              <w:rPr>
-                <w:rFonts w:ascii="Times New Roman" w:eastAsia="Times New Roman" w:hAnsi="Times New Roman" w:cs="Times New Roman"/>
-              </w:rPr>
-              <w:t xml:space="preserve">", </w:t>
-            </w:r>
-            <w:proofErr w:type="spellStart"/>
-            <w:r>
-              <w:rPr>
-                <w:rFonts w:ascii="Times New Roman" w:eastAsia="Times New Roman" w:hAnsi="Times New Roman" w:cs="Times New Roman"/>
-              </w:rPr>
-              <w:t>lty</w:t>
-            </w:r>
-            <w:proofErr w:type="spellEnd"/>
-            <w:r>
-              <w:rPr>
-                <w:rFonts w:ascii="Times New Roman" w:eastAsia="Times New Roman" w:hAnsi="Times New Roman" w:cs="Times New Roman"/>
-              </w:rPr>
-              <w:t xml:space="preserve"> = "dotted")</w:t>
-            </w:r>
-          </w:p>
-          <w:p>
-            <w:pPr>
-              <w:rPr>
-                <w:rFonts w:ascii="Times New Roman" w:eastAsia="Times New Roman" w:hAnsi="Times New Roman" w:cs="Times New Roman"/>
-              </w:rPr>
-            </w:pPr>
-          </w:p>
-          <w:p>
-            <w:pPr>
-              <w:rPr>
-                <w:rFonts w:ascii="Times New Roman" w:eastAsia="Times New Roman" w:hAnsi="Times New Roman" w:cs="Times New Roman"/>
-              </w:rPr>
-            </w:pPr>
-            <w:proofErr w:type="spellStart"/>
-            <w:proofErr w:type="gramStart"/>
-            <w:r>
-              <w:rPr>
-                <w:rFonts w:ascii="Times New Roman" w:eastAsia="Times New Roman" w:hAnsi="Times New Roman" w:cs="Times New Roman"/>
-              </w:rPr>
-              <w:t>mtext</w:t>
-            </w:r>
-            <w:proofErr w:type="spellEnd"/>
-            <w:r>
-              <w:rPr>
-                <w:rFonts w:ascii="Times New Roman" w:eastAsia="Times New Roman" w:hAnsi="Times New Roman" w:cs="Times New Roman"/>
-              </w:rPr>
-              <w:t>(paste(</w:t>
-            </w:r>
-            <w:proofErr w:type="gramEnd"/>
-            <w:r>
-              <w:rPr>
-                <w:rFonts w:ascii="Times New Roman" w:eastAsia="Times New Roman" w:hAnsi="Times New Roman" w:cs="Times New Roman"/>
-              </w:rPr>
-              <w:t xml:space="preserve">"n =", </w:t>
-            </w:r>
-            <w:proofErr w:type="spellStart"/>
-            <w:r>
-              <w:rPr>
-                <w:rFonts w:ascii="Times New Roman" w:eastAsia="Times New Roman" w:hAnsi="Times New Roman" w:cs="Times New Roman"/>
-              </w:rPr>
-              <w:t>nrow</w:t>
-            </w:r>
-            <w:proofErr w:type="spellEnd"/>
-            <w:r>
-              <w:rPr>
-                <w:rFonts w:ascii="Times New Roman" w:eastAsia="Times New Roman" w:hAnsi="Times New Roman" w:cs="Times New Roman"/>
-              </w:rPr>
-              <w:t>(</w:t>
-            </w:r>
-            <w:proofErr w:type="spellStart"/>
-            <w:r>
-              <w:rPr>
-                <w:rFonts w:ascii="Times New Roman" w:eastAsia="Times New Roman" w:hAnsi="Times New Roman" w:cs="Times New Roman"/>
-              </w:rPr>
-              <w:t>data_clean</w:t>
-            </w:r>
-            <w:proofErr w:type="spellEnd"/>
-            <w:r>
-              <w:rPr>
-                <w:rFonts w:ascii="Times New Roman" w:eastAsia="Times New Roman" w:hAnsi="Times New Roman" w:cs="Times New Roman"/>
-              </w:rPr>
-              <w:t xml:space="preserve">), "countries"), </w:t>
-            </w:r>
-          </w:p>
-          <w:p>
-            <w:pPr>
-              <w:rPr>
-                <w:rFonts w:ascii="Times New Roman" w:eastAsia="Times New Roman" w:hAnsi="Times New Roman" w:cs="Times New Roman"/>
-              </w:rPr>
-            </w:pPr>
-            <w:r>
-              <w:rPr>
-                <w:rFonts w:ascii="Times New Roman" w:eastAsia="Times New Roman" w:hAnsi="Times New Roman" w:cs="Times New Roman"/>
-              </w:rPr>
-              <w:t xml:space="preserve">      side = 3, </w:t>
-            </w:r>
-          </w:p>
-          <w:p>
-            <w:pPr>
-              <w:rPr>
-                <w:rFonts w:ascii="Times New Roman" w:eastAsia="Times New Roman" w:hAnsi="Times New Roman" w:cs="Times New Roman"/>
-              </w:rPr>
-            </w:pPr>
-            <w:r>
-              <w:rPr>
-                <w:rFonts w:ascii="Times New Roman" w:eastAsia="Times New Roman" w:hAnsi="Times New Roman" w:cs="Times New Roman"/>
-              </w:rPr>
-              <w:t xml:space="preserve">      line = 0.3,</w:t>
-            </w:r>
-          </w:p>
-          <w:p>
-            <w:pPr>
-              <w:rPr>
-                <w:rFonts w:ascii="Times New Roman" w:eastAsia="Times New Roman" w:hAnsi="Times New Roman" w:cs="Times New Roman"/>
-              </w:rPr>
-            </w:pPr>
-            <w:r>
-              <w:rPr>
-                <w:rFonts w:ascii="Times New Roman" w:eastAsia="Times New Roman" w:hAnsi="Times New Roman" w:cs="Times New Roman"/>
-              </w:rPr>
-              <w:t xml:space="preserve">      </w:t>
-            </w:r>
-            <w:proofErr w:type="spellStart"/>
-            <w:r>
-              <w:rPr>
-                <w:rFonts w:ascii="Times New Roman" w:eastAsia="Times New Roman" w:hAnsi="Times New Roman" w:cs="Times New Roman"/>
-              </w:rPr>
-              <w:t>cex</w:t>
-            </w:r>
-            <w:proofErr w:type="spellEnd"/>
-            <w:r>
-              <w:rPr>
-                <w:rFonts w:ascii="Times New Roman" w:eastAsia="Times New Roman" w:hAnsi="Times New Roman" w:cs="Times New Roman"/>
-              </w:rPr>
-              <w:t xml:space="preserve"> = 0.9)</w:t>
-            </w:r>
-          </w:p>
-          <w:p>
-            <w:pPr>
-              <w:rPr>
-                <w:rFonts w:ascii="Times New Roman" w:eastAsia="Times New Roman" w:hAnsi="Times New Roman" w:cs="Times New Roman"/>
-              </w:rPr>
-            </w:pPr>
-          </w:p>
-          <w:p>
-            <w:pPr>
-              <w:rPr>
-                <w:rFonts w:ascii="Times New Roman" w:eastAsia="Times New Roman" w:hAnsi="Times New Roman" w:cs="Times New Roman"/>
-              </w:rPr>
-            </w:pPr>
-            <w:proofErr w:type="gramStart"/>
-            <w:r>
-              <w:rPr>
-                <w:rFonts w:ascii="Times New Roman" w:eastAsia="Times New Roman" w:hAnsi="Times New Roman" w:cs="Times New Roman"/>
-              </w:rPr>
-              <w:t>cat(</w:t>
-            </w:r>
-            <w:proofErr w:type="gramEnd"/>
-            <w:r>
-              <w:rPr>
-                <w:rFonts w:ascii="Times New Roman" w:eastAsia="Times New Roman" w:hAnsi="Times New Roman" w:cs="Times New Roman"/>
-              </w:rPr>
-              <w:t>"Displayed: Scatter Plot\n")</w:t>
-            </w:r>
-          </w:p>
-          <w:p>
-            <w:pPr>
-              <w:rPr>
-                <w:rFonts w:ascii="Times New Roman" w:eastAsia="Times New Roman" w:hAnsi="Times New Roman" w:cs="Times New Roman"/>
-              </w:rPr>
-            </w:pPr>
-          </w:p>
-          <w:p>
-            <w:pPr>
-              <w:rPr>
-                <w:rFonts w:ascii="Times New Roman" w:eastAsia="Times New Roman" w:hAnsi="Times New Roman" w:cs="Times New Roman"/>
-              </w:rPr>
-            </w:pPr>
-            <w:r>
-              <w:rPr>
-                <w:rFonts w:ascii="Times New Roman" w:eastAsia="Times New Roman" w:hAnsi="Times New Roman" w:cs="Times New Roman"/>
-              </w:rPr>
-              <w:t># --------------------------------------------------</w:t>
-            </w:r>
-          </w:p>
-          <w:p>
-            <w:pPr>
-              <w:rPr>
-                <w:rFonts w:ascii="Times New Roman" w:eastAsia="Times New Roman" w:hAnsi="Times New Roman" w:cs="Times New Roman"/>
-              </w:rPr>
-            </w:pPr>
-            <w:r>
-              <w:rPr>
-                <w:rFonts w:ascii="Times New Roman" w:eastAsia="Times New Roman" w:hAnsi="Times New Roman" w:cs="Times New Roman"/>
-              </w:rPr>
-              <w:t xml:space="preserve"># Visualization 4: </w:t>
-            </w:r>
-            <w:proofErr w:type="spellStart"/>
-            <w:r>
-              <w:rPr>
-                <w:rFonts w:ascii="Times New Roman" w:eastAsia="Times New Roman" w:hAnsi="Times New Roman" w:cs="Times New Roman"/>
-              </w:rPr>
-              <w:t>StripChart</w:t>
-            </w:r>
-            <w:proofErr w:type="spellEnd"/>
-            <w:r>
-              <w:rPr>
-                <w:rFonts w:ascii="Times New Roman" w:eastAsia="Times New Roman" w:hAnsi="Times New Roman" w:cs="Times New Roman"/>
-              </w:rPr>
-              <w:t xml:space="preserve"> (Alcohol)</w:t>
-            </w:r>
-          </w:p>
-          <w:p>
-            <w:pPr>
-              <w:rPr>
-                <w:rFonts w:ascii="Times New Roman" w:eastAsia="Times New Roman" w:hAnsi="Times New Roman" w:cs="Times New Roman"/>
-              </w:rPr>
-            </w:pPr>
-            <w:r>
-              <w:rPr>
-                <w:rFonts w:ascii="Times New Roman" w:eastAsia="Times New Roman" w:hAnsi="Times New Roman" w:cs="Times New Roman"/>
-              </w:rPr>
-              <w:t># --------------------------------------------------</w:t>
-            </w:r>
-          </w:p>
-          <w:p>
-            <w:pPr>
-              <w:rPr>
-                <w:rFonts w:ascii="Times New Roman" w:eastAsia="Times New Roman" w:hAnsi="Times New Roman" w:cs="Times New Roman"/>
-              </w:rPr>
-            </w:pPr>
-          </w:p>
-          <w:p>
-            <w:pPr>
-              <w:rPr>
-                <w:rFonts w:ascii="Times New Roman" w:eastAsia="Times New Roman" w:hAnsi="Times New Roman" w:cs="Times New Roman"/>
-              </w:rPr>
-            </w:pPr>
-            <w:proofErr w:type="spellStart"/>
-            <w:proofErr w:type="gramStart"/>
-            <w:r>
-              <w:rPr>
-                <w:rFonts w:ascii="Times New Roman" w:eastAsia="Times New Roman" w:hAnsi="Times New Roman" w:cs="Times New Roman"/>
-              </w:rPr>
-              <w:t>stripchart</w:t>
-            </w:r>
-            <w:proofErr w:type="spellEnd"/>
-            <w:r>
-              <w:rPr>
-                <w:rFonts w:ascii="Times New Roman" w:eastAsia="Times New Roman" w:hAnsi="Times New Roman" w:cs="Times New Roman"/>
-              </w:rPr>
-              <w:t>(</w:t>
-            </w:r>
-            <w:proofErr w:type="spellStart"/>
-            <w:proofErr w:type="gramEnd"/>
-            <w:r>
-              <w:rPr>
-                <w:rFonts w:ascii="Times New Roman" w:eastAsia="Times New Roman" w:hAnsi="Times New Roman" w:cs="Times New Roman"/>
-              </w:rPr>
-              <w:t>data_clean$Alcohol_Consumption</w:t>
-            </w:r>
-            <w:proofErr w:type="spellEnd"/>
-            <w:r>
-              <w:rPr>
-                <w:rFonts w:ascii="Times New Roman" w:eastAsia="Times New Roman" w:hAnsi="Times New Roman" w:cs="Times New Roman"/>
-              </w:rPr>
-              <w:t>,</w:t>
-            </w:r>
-          </w:p>
-          <w:p>
-            <w:pPr>
-              <w:rPr>
-                <w:rFonts w:ascii="Times New Roman" w:eastAsia="Times New Roman" w:hAnsi="Times New Roman" w:cs="Times New Roman"/>
-              </w:rPr>
-            </w:pPr>
-            <w:r>
-              <w:rPr>
-                <w:rFonts w:ascii="Times New Roman" w:eastAsia="Times New Roman" w:hAnsi="Times New Roman" w:cs="Times New Roman"/>
-              </w:rPr>
-              <w:t xml:space="preserve">           method = "jitter",</w:t>
-            </w:r>
-          </w:p>
-          <w:p>
-            <w:pPr>
-              <w:rPr>
-                <w:rFonts w:ascii="Times New Roman" w:eastAsia="Times New Roman" w:hAnsi="Times New Roman" w:cs="Times New Roman"/>
-              </w:rPr>
-            </w:pPr>
-            <w:r>
-              <w:rPr>
-                <w:rFonts w:ascii="Times New Roman" w:eastAsia="Times New Roman" w:hAnsi="Times New Roman" w:cs="Times New Roman"/>
-              </w:rPr>
-              <w:t xml:space="preserve">           main = "</w:t>
-            </w:r>
-            <w:proofErr w:type="spellStart"/>
-            <w:r>
-              <w:rPr>
-                <w:rFonts w:ascii="Times New Roman" w:eastAsia="Times New Roman" w:hAnsi="Times New Roman" w:cs="Times New Roman"/>
-              </w:rPr>
-              <w:t>Stripchart</w:t>
-            </w:r>
-            <w:proofErr w:type="spellEnd"/>
-            <w:r>
-              <w:rPr>
-                <w:rFonts w:ascii="Times New Roman" w:eastAsia="Times New Roman" w:hAnsi="Times New Roman" w:cs="Times New Roman"/>
-              </w:rPr>
-              <w:t>: Alcohol Consumption",</w:t>
-            </w:r>
-          </w:p>
-          <w:p>
-            <w:pPr>
-              <w:rPr>
-                <w:rFonts w:ascii="Times New Roman" w:eastAsia="Times New Roman" w:hAnsi="Times New Roman" w:cs="Times New Roman"/>
-              </w:rPr>
-            </w:pPr>
-            <w:r>
-              <w:rPr>
-                <w:rFonts w:ascii="Times New Roman" w:eastAsia="Times New Roman" w:hAnsi="Times New Roman" w:cs="Times New Roman"/>
-              </w:rPr>
-              <w:t xml:space="preserve">           </w:t>
-            </w:r>
-            <w:proofErr w:type="spellStart"/>
-            <w:r>
-              <w:rPr>
-                <w:rFonts w:ascii="Times New Roman" w:eastAsia="Times New Roman" w:hAnsi="Times New Roman" w:cs="Times New Roman"/>
-              </w:rPr>
-              <w:t>xlab</w:t>
-            </w:r>
-            <w:proofErr w:type="spellEnd"/>
-            <w:r>
-              <w:rPr>
-                <w:rFonts w:ascii="Times New Roman" w:eastAsia="Times New Roman" w:hAnsi="Times New Roman" w:cs="Times New Roman"/>
-              </w:rPr>
-              <w:t xml:space="preserve"> = "Alcohol Consumption (litres per capita)",</w:t>
-            </w:r>
-          </w:p>
-          <w:p>
-            <w:pPr>
-              <w:rPr>
-                <w:rFonts w:ascii="Times New Roman" w:eastAsia="Times New Roman" w:hAnsi="Times New Roman" w:cs="Times New Roman"/>
-              </w:rPr>
-            </w:pPr>
-            <w:r>
-              <w:rPr>
-                <w:rFonts w:ascii="Times New Roman" w:eastAsia="Times New Roman" w:hAnsi="Times New Roman" w:cs="Times New Roman"/>
-              </w:rPr>
-              <w:t xml:space="preserve">           </w:t>
-            </w:r>
-            <w:proofErr w:type="spellStart"/>
-            <w:r>
-              <w:rPr>
-                <w:rFonts w:ascii="Times New Roman" w:eastAsia="Times New Roman" w:hAnsi="Times New Roman" w:cs="Times New Roman"/>
-              </w:rPr>
-              <w:t>pch</w:t>
-            </w:r>
-            <w:proofErr w:type="spellEnd"/>
-            <w:r>
-              <w:rPr>
-                <w:rFonts w:ascii="Times New Roman" w:eastAsia="Times New Roman" w:hAnsi="Times New Roman" w:cs="Times New Roman"/>
-              </w:rPr>
-              <w:t xml:space="preserve"> = 19,</w:t>
-            </w:r>
-          </w:p>
-          <w:p>
-            <w:pPr>
-              <w:rPr>
-                <w:rFonts w:ascii="Times New Roman" w:eastAsia="Times New Roman" w:hAnsi="Times New Roman" w:cs="Times New Roman"/>
-              </w:rPr>
-            </w:pPr>
-            <w:r>
-              <w:rPr>
-                <w:rFonts w:ascii="Times New Roman" w:eastAsia="Times New Roman" w:hAnsi="Times New Roman" w:cs="Times New Roman"/>
-              </w:rPr>
-              <w:t xml:space="preserve">           col = "</w:t>
-            </w:r>
-            <w:proofErr w:type="spellStart"/>
-            <w:r>
-              <w:rPr>
-                <w:rFonts w:ascii="Times New Roman" w:eastAsia="Times New Roman" w:hAnsi="Times New Roman" w:cs="Times New Roman"/>
-              </w:rPr>
-              <w:t>steelblue</w:t>
-            </w:r>
-            <w:proofErr w:type="spellEnd"/>
-            <w:r>
-              <w:rPr>
-                <w:rFonts w:ascii="Times New Roman" w:eastAsia="Times New Roman" w:hAnsi="Times New Roman" w:cs="Times New Roman"/>
-              </w:rPr>
-              <w:t>")</w:t>
-            </w:r>
-          </w:p>
-          <w:p>
-            <w:pPr>
-              <w:rPr>
-                <w:rFonts w:ascii="Times New Roman" w:eastAsia="Times New Roman" w:hAnsi="Times New Roman" w:cs="Times New Roman"/>
-              </w:rPr>
-            </w:pPr>
-          </w:p>
-          <w:p>
-            <w:pPr>
-              <w:rPr>
-                <w:rFonts w:ascii="Times New Roman" w:eastAsia="Times New Roman" w:hAnsi="Times New Roman" w:cs="Times New Roman"/>
-              </w:rPr>
-            </w:pPr>
-            <w:proofErr w:type="gramStart"/>
-            <w:r>
-              <w:rPr>
-                <w:rFonts w:ascii="Times New Roman" w:eastAsia="Times New Roman" w:hAnsi="Times New Roman" w:cs="Times New Roman"/>
-              </w:rPr>
-              <w:t>cat(</w:t>
-            </w:r>
-            <w:proofErr w:type="gramEnd"/>
-            <w:r>
-              <w:rPr>
-                <w:rFonts w:ascii="Times New Roman" w:eastAsia="Times New Roman" w:hAnsi="Times New Roman" w:cs="Times New Roman"/>
-              </w:rPr>
-              <w:t xml:space="preserve">"Displayed: </w:t>
-            </w:r>
-            <w:proofErr w:type="spellStart"/>
-            <w:r>
-              <w:rPr>
-                <w:rFonts w:ascii="Times New Roman" w:eastAsia="Times New Roman" w:hAnsi="Times New Roman" w:cs="Times New Roman"/>
-              </w:rPr>
-              <w:t>Stripchart</w:t>
-            </w:r>
-            <w:proofErr w:type="spellEnd"/>
-            <w:r>
-              <w:rPr>
-                <w:rFonts w:ascii="Times New Roman" w:eastAsia="Times New Roman" w:hAnsi="Times New Roman" w:cs="Times New Roman"/>
-              </w:rPr>
-              <w:t xml:space="preserve"> for Alcohol Consumption\n")</w:t>
-            </w:r>
-          </w:p>
-          <w:p>
-            <w:pPr>
-              <w:rPr>
-                <w:rFonts w:ascii="Times New Roman" w:eastAsia="Times New Roman" w:hAnsi="Times New Roman" w:cs="Times New Roman"/>
-              </w:rPr>
-            </w:pPr>
-          </w:p>
-          <w:p>
-            <w:pPr>
-              <w:rPr>
-                <w:rFonts w:ascii="Times New Roman" w:eastAsia="Times New Roman" w:hAnsi="Times New Roman" w:cs="Times New Roman"/>
-              </w:rPr>
-            </w:pPr>
-            <w:r>
-              <w:rPr>
-                <w:rFonts w:ascii="Times New Roman" w:eastAsia="Times New Roman" w:hAnsi="Times New Roman" w:cs="Times New Roman"/>
-              </w:rPr>
-              <w:t># --------------------------------------------------</w:t>
-            </w:r>
-          </w:p>
-          <w:p>
-            <w:pPr>
-              <w:rPr>
-                <w:rFonts w:ascii="Times New Roman" w:eastAsia="Times New Roman" w:hAnsi="Times New Roman" w:cs="Times New Roman"/>
-              </w:rPr>
-            </w:pPr>
-            <w:r>
-              <w:rPr>
-                <w:rFonts w:ascii="Times New Roman" w:eastAsia="Times New Roman" w:hAnsi="Times New Roman" w:cs="Times New Roman"/>
-              </w:rPr>
-              <w:t xml:space="preserve"># Visualization 5: </w:t>
-            </w:r>
-            <w:proofErr w:type="spellStart"/>
-            <w:r>
-              <w:rPr>
-                <w:rFonts w:ascii="Times New Roman" w:eastAsia="Times New Roman" w:hAnsi="Times New Roman" w:cs="Times New Roman"/>
-              </w:rPr>
-              <w:t>Barplot</w:t>
-            </w:r>
-            <w:proofErr w:type="spellEnd"/>
-            <w:r>
-              <w:rPr>
-                <w:rFonts w:ascii="Times New Roman" w:eastAsia="Times New Roman" w:hAnsi="Times New Roman" w:cs="Times New Roman"/>
-              </w:rPr>
-              <w:t xml:space="preserve"> (Life Expectancy)</w:t>
-            </w:r>
-          </w:p>
-          <w:p>
-            <w:pPr>
-              <w:rPr>
-                <w:rFonts w:ascii="Times New Roman" w:eastAsia="Times New Roman" w:hAnsi="Times New Roman" w:cs="Times New Roman"/>
-              </w:rPr>
-            </w:pPr>
-            <w:r>
-              <w:rPr>
-                <w:rFonts w:ascii="Times New Roman" w:eastAsia="Times New Roman" w:hAnsi="Times New Roman" w:cs="Times New Roman"/>
-              </w:rPr>
-              <w:t># --------------------------------------------------</w:t>
-            </w:r>
-          </w:p>
-          <w:p>
-            <w:pPr>
-              <w:rPr>
-                <w:rFonts w:ascii="Times New Roman" w:eastAsia="Times New Roman" w:hAnsi="Times New Roman" w:cs="Times New Roman"/>
-              </w:rPr>
-            </w:pPr>
-          </w:p>
-          <w:p>
-            <w:pPr>
-              <w:rPr>
-                <w:rFonts w:ascii="Times New Roman" w:eastAsia="Times New Roman" w:hAnsi="Times New Roman" w:cs="Times New Roman"/>
-              </w:rPr>
-            </w:pPr>
-            <w:proofErr w:type="spellStart"/>
-            <w:r>
-              <w:rPr>
-                <w:rFonts w:ascii="Times New Roman" w:eastAsia="Times New Roman" w:hAnsi="Times New Roman" w:cs="Times New Roman"/>
-              </w:rPr>
-              <w:t>life_bins</w:t>
-            </w:r>
-            <w:proofErr w:type="spellEnd"/>
-            <w:r>
-              <w:rPr>
-                <w:rFonts w:ascii="Times New Roman" w:eastAsia="Times New Roman" w:hAnsi="Times New Roman" w:cs="Times New Roman"/>
-              </w:rPr>
-              <w:t xml:space="preserve"> &lt;- </w:t>
-            </w:r>
-            <w:proofErr w:type="gramStart"/>
-            <w:r>
-              <w:rPr>
-                <w:rFonts w:ascii="Times New Roman" w:eastAsia="Times New Roman" w:hAnsi="Times New Roman" w:cs="Times New Roman"/>
-              </w:rPr>
-              <w:t>cut(</w:t>
-            </w:r>
-            <w:proofErr w:type="spellStart"/>
-            <w:proofErr w:type="gramEnd"/>
-            <w:r>
-              <w:rPr>
-                <w:rFonts w:ascii="Times New Roman" w:eastAsia="Times New Roman" w:hAnsi="Times New Roman" w:cs="Times New Roman"/>
-              </w:rPr>
-              <w:t>data_clean$Life_Expectancy</w:t>
-            </w:r>
-            <w:proofErr w:type="spellEnd"/>
-            <w:r>
-              <w:rPr>
-                <w:rFonts w:ascii="Times New Roman" w:eastAsia="Times New Roman" w:hAnsi="Times New Roman" w:cs="Times New Roman"/>
-              </w:rPr>
-              <w:t>,</w:t>
-            </w:r>
-          </w:p>
-          <w:p>
-            <w:pPr>
-              <w:rPr>
-                <w:rFonts w:ascii="Times New Roman" w:eastAsia="Times New Roman" w:hAnsi="Times New Roman" w:cs="Times New Roman"/>
-              </w:rPr>
-            </w:pPr>
-            <w:r>
-              <w:rPr>
-                <w:rFonts w:ascii="Times New Roman" w:eastAsia="Times New Roman" w:hAnsi="Times New Roman" w:cs="Times New Roman"/>
-              </w:rPr>
-              <w:t xml:space="preserve">                 breaks = 10,</w:t>
-            </w:r>
-          </w:p>
-          <w:p>
-            <w:pPr>
-              <w:rPr>
-                <w:rFonts w:ascii="Times New Roman" w:eastAsia="Times New Roman" w:hAnsi="Times New Roman" w:cs="Times New Roman"/>
-              </w:rPr>
-            </w:pPr>
-            <w:r>
-              <w:rPr>
-                <w:rFonts w:ascii="Times New Roman" w:eastAsia="Times New Roman" w:hAnsi="Times New Roman" w:cs="Times New Roman"/>
-              </w:rPr>
-              <w:t xml:space="preserve">                 </w:t>
-            </w:r>
-            <w:proofErr w:type="spellStart"/>
-            <w:proofErr w:type="gramStart"/>
-            <w:r>
-              <w:rPr>
-                <w:rFonts w:ascii="Times New Roman" w:eastAsia="Times New Roman" w:hAnsi="Times New Roman" w:cs="Times New Roman"/>
-              </w:rPr>
-              <w:t>include.lowest</w:t>
-            </w:r>
-            <w:proofErr w:type="spellEnd"/>
-            <w:proofErr w:type="gramEnd"/>
-            <w:r>
-              <w:rPr>
-                <w:rFonts w:ascii="Times New Roman" w:eastAsia="Times New Roman" w:hAnsi="Times New Roman" w:cs="Times New Roman"/>
-              </w:rPr>
-              <w:t xml:space="preserve"> = TRUE)</w:t>
-            </w:r>
-          </w:p>
-          <w:p>
-            <w:pPr>
-              <w:rPr>
-                <w:rFonts w:ascii="Times New Roman" w:eastAsia="Times New Roman" w:hAnsi="Times New Roman" w:cs="Times New Roman"/>
-              </w:rPr>
-            </w:pPr>
-          </w:p>
-          <w:p>
-            <w:pPr>
-              <w:rPr>
-                <w:rFonts w:ascii="Times New Roman" w:eastAsia="Times New Roman" w:hAnsi="Times New Roman" w:cs="Times New Roman"/>
-              </w:rPr>
-            </w:pPr>
-            <w:proofErr w:type="spellStart"/>
-            <w:r>
-              <w:rPr>
-                <w:rFonts w:ascii="Times New Roman" w:eastAsia="Times New Roman" w:hAnsi="Times New Roman" w:cs="Times New Roman"/>
-              </w:rPr>
-              <w:lastRenderedPageBreak/>
-              <w:t>life_counts</w:t>
-            </w:r>
-            <w:proofErr w:type="spellEnd"/>
-            <w:r>
-              <w:rPr>
-                <w:rFonts w:ascii="Times New Roman" w:eastAsia="Times New Roman" w:hAnsi="Times New Roman" w:cs="Times New Roman"/>
-              </w:rPr>
-              <w:t xml:space="preserve"> &lt;- table(</w:t>
-            </w:r>
-            <w:proofErr w:type="spellStart"/>
-            <w:r>
-              <w:rPr>
-                <w:rFonts w:ascii="Times New Roman" w:eastAsia="Times New Roman" w:hAnsi="Times New Roman" w:cs="Times New Roman"/>
-              </w:rPr>
-              <w:t>life_bins</w:t>
-            </w:r>
-            <w:proofErr w:type="spellEnd"/>
-            <w:r>
-              <w:rPr>
-                <w:rFonts w:ascii="Times New Roman" w:eastAsia="Times New Roman" w:hAnsi="Times New Roman" w:cs="Times New Roman"/>
-              </w:rPr>
-              <w:t>)</w:t>
-            </w:r>
-          </w:p>
-          <w:p>
-            <w:pPr>
-              <w:rPr>
-                <w:rFonts w:ascii="Times New Roman" w:eastAsia="Times New Roman" w:hAnsi="Times New Roman" w:cs="Times New Roman"/>
-              </w:rPr>
-            </w:pPr>
-          </w:p>
-          <w:p>
-            <w:pPr>
-              <w:rPr>
-                <w:rFonts w:ascii="Times New Roman" w:eastAsia="Times New Roman" w:hAnsi="Times New Roman" w:cs="Times New Roman"/>
-              </w:rPr>
-            </w:pPr>
-            <w:proofErr w:type="spellStart"/>
-            <w:proofErr w:type="gramStart"/>
-            <w:r>
-              <w:rPr>
-                <w:rFonts w:ascii="Times New Roman" w:eastAsia="Times New Roman" w:hAnsi="Times New Roman" w:cs="Times New Roman"/>
-              </w:rPr>
-              <w:t>barplot</w:t>
-            </w:r>
-            <w:proofErr w:type="spellEnd"/>
-            <w:r>
-              <w:rPr>
-                <w:rFonts w:ascii="Times New Roman" w:eastAsia="Times New Roman" w:hAnsi="Times New Roman" w:cs="Times New Roman"/>
-              </w:rPr>
-              <w:t>(</w:t>
-            </w:r>
-            <w:proofErr w:type="spellStart"/>
-            <w:proofErr w:type="gramEnd"/>
-            <w:r>
-              <w:rPr>
-                <w:rFonts w:ascii="Times New Roman" w:eastAsia="Times New Roman" w:hAnsi="Times New Roman" w:cs="Times New Roman"/>
-              </w:rPr>
-              <w:t>life_counts</w:t>
-            </w:r>
-            <w:proofErr w:type="spellEnd"/>
-            <w:r>
-              <w:rPr>
-                <w:rFonts w:ascii="Times New Roman" w:eastAsia="Times New Roman" w:hAnsi="Times New Roman" w:cs="Times New Roman"/>
-              </w:rPr>
-              <w:t>,</w:t>
-            </w:r>
-          </w:p>
-          <w:p>
-            <w:pPr>
-              <w:rPr>
-                <w:rFonts w:ascii="Times New Roman" w:eastAsia="Times New Roman" w:hAnsi="Times New Roman" w:cs="Times New Roman"/>
-              </w:rPr>
-            </w:pPr>
-            <w:r>
-              <w:rPr>
-                <w:rFonts w:ascii="Times New Roman" w:eastAsia="Times New Roman" w:hAnsi="Times New Roman" w:cs="Times New Roman"/>
-              </w:rPr>
-              <w:t xml:space="preserve">        main = "</w:t>
-            </w:r>
-            <w:proofErr w:type="spellStart"/>
-            <w:r>
-              <w:rPr>
-                <w:rFonts w:ascii="Times New Roman" w:eastAsia="Times New Roman" w:hAnsi="Times New Roman" w:cs="Times New Roman"/>
-              </w:rPr>
-              <w:t>Barplot</w:t>
-            </w:r>
-            <w:proofErr w:type="spellEnd"/>
-            <w:r>
-              <w:rPr>
-                <w:rFonts w:ascii="Times New Roman" w:eastAsia="Times New Roman" w:hAnsi="Times New Roman" w:cs="Times New Roman"/>
-              </w:rPr>
-              <w:t xml:space="preserve"> of Life Expectancy Bins",</w:t>
-            </w:r>
-          </w:p>
-          <w:p>
-            <w:pPr>
-              <w:rPr>
-                <w:rFonts w:ascii="Times New Roman" w:eastAsia="Times New Roman" w:hAnsi="Times New Roman" w:cs="Times New Roman"/>
-              </w:rPr>
-            </w:pPr>
-            <w:r>
-              <w:rPr>
-                <w:rFonts w:ascii="Times New Roman" w:eastAsia="Times New Roman" w:hAnsi="Times New Roman" w:cs="Times New Roman"/>
-              </w:rPr>
-              <w:t xml:space="preserve">        </w:t>
-            </w:r>
-            <w:proofErr w:type="spellStart"/>
-            <w:r>
-              <w:rPr>
-                <w:rFonts w:ascii="Times New Roman" w:eastAsia="Times New Roman" w:hAnsi="Times New Roman" w:cs="Times New Roman"/>
-              </w:rPr>
-              <w:t>xlab</w:t>
-            </w:r>
-            <w:proofErr w:type="spellEnd"/>
-            <w:r>
-              <w:rPr>
-                <w:rFonts w:ascii="Times New Roman" w:eastAsia="Times New Roman" w:hAnsi="Times New Roman" w:cs="Times New Roman"/>
-              </w:rPr>
-              <w:t xml:space="preserve"> = "Life Expectancy Range (years)",</w:t>
-            </w:r>
-          </w:p>
-          <w:p>
-            <w:pPr>
-              <w:rPr>
-                <w:rFonts w:ascii="Times New Roman" w:eastAsia="Times New Roman" w:hAnsi="Times New Roman" w:cs="Times New Roman"/>
-              </w:rPr>
-            </w:pPr>
-            <w:r>
-              <w:rPr>
-                <w:rFonts w:ascii="Times New Roman" w:eastAsia="Times New Roman" w:hAnsi="Times New Roman" w:cs="Times New Roman"/>
-              </w:rPr>
-              <w:t xml:space="preserve">        </w:t>
-            </w:r>
-            <w:proofErr w:type="spellStart"/>
-            <w:r>
-              <w:rPr>
-                <w:rFonts w:ascii="Times New Roman" w:eastAsia="Times New Roman" w:hAnsi="Times New Roman" w:cs="Times New Roman"/>
-              </w:rPr>
-              <w:t>ylab</w:t>
-            </w:r>
-            <w:proofErr w:type="spellEnd"/>
-            <w:r>
-              <w:rPr>
-                <w:rFonts w:ascii="Times New Roman" w:eastAsia="Times New Roman" w:hAnsi="Times New Roman" w:cs="Times New Roman"/>
-              </w:rPr>
-              <w:t xml:space="preserve"> = "Count",</w:t>
-            </w:r>
-          </w:p>
-          <w:p>
-            <w:pPr>
-              <w:rPr>
-                <w:rFonts w:ascii="Times New Roman" w:eastAsia="Times New Roman" w:hAnsi="Times New Roman" w:cs="Times New Roman"/>
-              </w:rPr>
-            </w:pPr>
-            <w:r>
-              <w:rPr>
-                <w:rFonts w:ascii="Times New Roman" w:eastAsia="Times New Roman" w:hAnsi="Times New Roman" w:cs="Times New Roman"/>
-              </w:rPr>
-              <w:t xml:space="preserve">        col = "coral",</w:t>
-            </w:r>
-          </w:p>
-          <w:p>
-            <w:pPr>
-              <w:rPr>
-                <w:rFonts w:ascii="Times New Roman" w:eastAsia="Times New Roman" w:hAnsi="Times New Roman" w:cs="Times New Roman"/>
-              </w:rPr>
-            </w:pPr>
-            <w:r>
-              <w:rPr>
-                <w:rFonts w:ascii="Times New Roman" w:eastAsia="Times New Roman" w:hAnsi="Times New Roman" w:cs="Times New Roman"/>
-              </w:rPr>
-              <w:t xml:space="preserve">        las = 2)</w:t>
-            </w:r>
-          </w:p>
-          <w:p>
-            <w:pPr>
-              <w:rPr>
-                <w:rFonts w:ascii="Times New Roman" w:eastAsia="Times New Roman" w:hAnsi="Times New Roman" w:cs="Times New Roman"/>
-              </w:rPr>
-            </w:pPr>
-          </w:p>
-          <w:p>
-            <w:pPr>
-              <w:rPr>
-                <w:rFonts w:ascii="Times New Roman" w:eastAsia="Times New Roman" w:hAnsi="Times New Roman" w:cs="Times New Roman"/>
-              </w:rPr>
-            </w:pPr>
-            <w:proofErr w:type="gramStart"/>
-            <w:r>
-              <w:rPr>
-                <w:rFonts w:ascii="Times New Roman" w:eastAsia="Times New Roman" w:hAnsi="Times New Roman" w:cs="Times New Roman"/>
-              </w:rPr>
-              <w:t>cat(</w:t>
-            </w:r>
-            <w:proofErr w:type="gramEnd"/>
-            <w:r>
-              <w:rPr>
-                <w:rFonts w:ascii="Times New Roman" w:eastAsia="Times New Roman" w:hAnsi="Times New Roman" w:cs="Times New Roman"/>
-              </w:rPr>
-              <w:t xml:space="preserve">"Displayed: </w:t>
-            </w:r>
-            <w:proofErr w:type="spellStart"/>
-            <w:r>
-              <w:rPr>
-                <w:rFonts w:ascii="Times New Roman" w:eastAsia="Times New Roman" w:hAnsi="Times New Roman" w:cs="Times New Roman"/>
-              </w:rPr>
-              <w:t>Barplot</w:t>
-            </w:r>
-            <w:proofErr w:type="spellEnd"/>
-            <w:r>
-              <w:rPr>
-                <w:rFonts w:ascii="Times New Roman" w:eastAsia="Times New Roman" w:hAnsi="Times New Roman" w:cs="Times New Roman"/>
-              </w:rPr>
-              <w:t xml:space="preserve"> for Life Expectancy\n\n")</w:t>
-            </w:r>
-          </w:p>
-          <w:p>
-            <w:pPr>
-              <w:rPr>
-                <w:rFonts w:ascii="Times New Roman" w:eastAsia="Times New Roman" w:hAnsi="Times New Roman" w:cs="Times New Roman"/>
-              </w:rPr>
-            </w:pPr>
-          </w:p>
-          <w:p>
-            <w:pPr>
-              <w:rPr>
-                <w:rFonts w:ascii="Times New Roman" w:eastAsia="Times New Roman" w:hAnsi="Times New Roman" w:cs="Times New Roman"/>
-              </w:rPr>
-            </w:pPr>
-            <w:r>
-              <w:rPr>
-                <w:rFonts w:ascii="Times New Roman" w:eastAsia="Times New Roman" w:hAnsi="Times New Roman" w:cs="Times New Roman"/>
-              </w:rPr>
-              <w:t># Scatter plot with regression line</w:t>
-            </w:r>
-          </w:p>
-          <w:p>
-            <w:pPr>
-              <w:rPr>
-                <w:rFonts w:ascii="Times New Roman" w:eastAsia="Times New Roman" w:hAnsi="Times New Roman" w:cs="Times New Roman"/>
-              </w:rPr>
-            </w:pPr>
-            <w:proofErr w:type="spellStart"/>
-            <w:r>
-              <w:rPr>
-                <w:rFonts w:ascii="Times New Roman" w:eastAsia="Times New Roman" w:hAnsi="Times New Roman" w:cs="Times New Roman"/>
-              </w:rPr>
-              <w:t>scatter_plot</w:t>
-            </w:r>
-            <w:proofErr w:type="spellEnd"/>
-            <w:r>
-              <w:rPr>
-                <w:rFonts w:ascii="Times New Roman" w:eastAsia="Times New Roman" w:hAnsi="Times New Roman" w:cs="Times New Roman"/>
-              </w:rPr>
-              <w:t xml:space="preserve"> &lt;- </w:t>
-            </w:r>
-            <w:proofErr w:type="spellStart"/>
-            <w:proofErr w:type="gramStart"/>
-            <w:r>
-              <w:rPr>
-                <w:rFonts w:ascii="Times New Roman" w:eastAsia="Times New Roman" w:hAnsi="Times New Roman" w:cs="Times New Roman"/>
-              </w:rPr>
-              <w:t>ggplot</w:t>
-            </w:r>
-            <w:proofErr w:type="spellEnd"/>
-            <w:r>
-              <w:rPr>
-                <w:rFonts w:ascii="Times New Roman" w:eastAsia="Times New Roman" w:hAnsi="Times New Roman" w:cs="Times New Roman"/>
-              </w:rPr>
-              <w:t>(</w:t>
-            </w:r>
-            <w:proofErr w:type="spellStart"/>
-            <w:proofErr w:type="gramEnd"/>
-            <w:r>
-              <w:rPr>
-                <w:rFonts w:ascii="Times New Roman" w:eastAsia="Times New Roman" w:hAnsi="Times New Roman" w:cs="Times New Roman"/>
-              </w:rPr>
-              <w:t>data_clean</w:t>
-            </w:r>
-            <w:proofErr w:type="spellEnd"/>
-            <w:r>
-              <w:rPr>
-                <w:rFonts w:ascii="Times New Roman" w:eastAsia="Times New Roman" w:hAnsi="Times New Roman" w:cs="Times New Roman"/>
-              </w:rPr>
-              <w:t xml:space="preserve">, </w:t>
-            </w:r>
-            <w:proofErr w:type="spellStart"/>
-            <w:proofErr w:type="gramStart"/>
-            <w:r>
-              <w:rPr>
-                <w:rFonts w:ascii="Times New Roman" w:eastAsia="Times New Roman" w:hAnsi="Times New Roman" w:cs="Times New Roman"/>
-              </w:rPr>
-              <w:t>aes</w:t>
-            </w:r>
-            <w:proofErr w:type="spellEnd"/>
-            <w:r>
-              <w:rPr>
-                <w:rFonts w:ascii="Times New Roman" w:eastAsia="Times New Roman" w:hAnsi="Times New Roman" w:cs="Times New Roman"/>
-              </w:rPr>
-              <w:t>(</w:t>
-            </w:r>
-            <w:proofErr w:type="gramEnd"/>
-            <w:r>
-              <w:rPr>
-                <w:rFonts w:ascii="Times New Roman" w:eastAsia="Times New Roman" w:hAnsi="Times New Roman" w:cs="Times New Roman"/>
-              </w:rPr>
-              <w:t xml:space="preserve">x = </w:t>
-            </w:r>
-            <w:proofErr w:type="spellStart"/>
-            <w:r>
-              <w:rPr>
-                <w:rFonts w:ascii="Times New Roman" w:eastAsia="Times New Roman" w:hAnsi="Times New Roman" w:cs="Times New Roman"/>
-              </w:rPr>
-              <w:t>Alcohol_Consumption</w:t>
-            </w:r>
-            <w:proofErr w:type="spellEnd"/>
-            <w:r>
-              <w:rPr>
-                <w:rFonts w:ascii="Times New Roman" w:eastAsia="Times New Roman" w:hAnsi="Times New Roman" w:cs="Times New Roman"/>
-              </w:rPr>
-              <w:t xml:space="preserve">, y = </w:t>
-            </w:r>
-            <w:proofErr w:type="spellStart"/>
-            <w:r>
-              <w:rPr>
-                <w:rFonts w:ascii="Times New Roman" w:eastAsia="Times New Roman" w:hAnsi="Times New Roman" w:cs="Times New Roman"/>
-              </w:rPr>
-              <w:t>Life_Expectancy</w:t>
-            </w:r>
-            <w:proofErr w:type="spellEnd"/>
-            <w:r>
-              <w:rPr>
-                <w:rFonts w:ascii="Times New Roman" w:eastAsia="Times New Roman" w:hAnsi="Times New Roman" w:cs="Times New Roman"/>
-              </w:rPr>
-              <w:t>)) +</w:t>
-            </w:r>
-          </w:p>
-          <w:p>
-            <w:pPr>
-              <w:rPr>
-                <w:rFonts w:ascii="Times New Roman" w:eastAsia="Times New Roman" w:hAnsi="Times New Roman" w:cs="Times New Roman"/>
-              </w:rPr>
-            </w:pPr>
-            <w:r>
-              <w:rPr>
-                <w:rFonts w:ascii="Times New Roman" w:eastAsia="Times New Roman" w:hAnsi="Times New Roman" w:cs="Times New Roman"/>
-              </w:rPr>
-              <w:t xml:space="preserve">  </w:t>
-            </w:r>
-            <w:proofErr w:type="spellStart"/>
-            <w:r>
-              <w:rPr>
-                <w:rFonts w:ascii="Times New Roman" w:eastAsia="Times New Roman" w:hAnsi="Times New Roman" w:cs="Times New Roman"/>
-              </w:rPr>
-              <w:t>geom_</w:t>
-            </w:r>
-            <w:proofErr w:type="gramStart"/>
-            <w:r>
-              <w:rPr>
-                <w:rFonts w:ascii="Times New Roman" w:eastAsia="Times New Roman" w:hAnsi="Times New Roman" w:cs="Times New Roman"/>
-              </w:rPr>
-              <w:t>point</w:t>
-            </w:r>
-            <w:proofErr w:type="spellEnd"/>
-            <w:r>
-              <w:rPr>
-                <w:rFonts w:ascii="Times New Roman" w:eastAsia="Times New Roman" w:hAnsi="Times New Roman" w:cs="Times New Roman"/>
-              </w:rPr>
-              <w:t>(</w:t>
-            </w:r>
-            <w:proofErr w:type="gramEnd"/>
-            <w:r>
-              <w:rPr>
-                <w:rFonts w:ascii="Times New Roman" w:eastAsia="Times New Roman" w:hAnsi="Times New Roman" w:cs="Times New Roman"/>
-              </w:rPr>
-              <w:t xml:space="preserve">alpha = 0.6, size = 3, </w:t>
-            </w:r>
-            <w:proofErr w:type="spellStart"/>
-            <w:r>
-              <w:rPr>
-                <w:rFonts w:ascii="Times New Roman" w:eastAsia="Times New Roman" w:hAnsi="Times New Roman" w:cs="Times New Roman"/>
-              </w:rPr>
-              <w:t>color</w:t>
-            </w:r>
-            <w:proofErr w:type="spellEnd"/>
-            <w:r>
-              <w:rPr>
-                <w:rFonts w:ascii="Times New Roman" w:eastAsia="Times New Roman" w:hAnsi="Times New Roman" w:cs="Times New Roman"/>
-              </w:rPr>
-              <w:t xml:space="preserve"> = "</w:t>
-            </w:r>
-            <w:proofErr w:type="spellStart"/>
-            <w:r>
-              <w:rPr>
-                <w:rFonts w:ascii="Times New Roman" w:eastAsia="Times New Roman" w:hAnsi="Times New Roman" w:cs="Times New Roman"/>
-              </w:rPr>
-              <w:t>darkblue</w:t>
-            </w:r>
-            <w:proofErr w:type="spellEnd"/>
-            <w:r>
-              <w:rPr>
-                <w:rFonts w:ascii="Times New Roman" w:eastAsia="Times New Roman" w:hAnsi="Times New Roman" w:cs="Times New Roman"/>
-              </w:rPr>
-              <w:t>") +</w:t>
-            </w:r>
-          </w:p>
-          <w:p>
-            <w:pPr>
-              <w:rPr>
-                <w:rFonts w:ascii="Times New Roman" w:eastAsia="Times New Roman" w:hAnsi="Times New Roman" w:cs="Times New Roman"/>
-              </w:rPr>
-            </w:pPr>
-            <w:r>
-              <w:rPr>
-                <w:rFonts w:ascii="Times New Roman" w:eastAsia="Times New Roman" w:hAnsi="Times New Roman" w:cs="Times New Roman"/>
-              </w:rPr>
-              <w:t xml:space="preserve">  </w:t>
-            </w:r>
-            <w:proofErr w:type="spellStart"/>
-            <w:r>
-              <w:rPr>
-                <w:rFonts w:ascii="Times New Roman" w:eastAsia="Times New Roman" w:hAnsi="Times New Roman" w:cs="Times New Roman"/>
-              </w:rPr>
-              <w:t>geom_</w:t>
-            </w:r>
-            <w:proofErr w:type="gramStart"/>
-            <w:r>
-              <w:rPr>
-                <w:rFonts w:ascii="Times New Roman" w:eastAsia="Times New Roman" w:hAnsi="Times New Roman" w:cs="Times New Roman"/>
-              </w:rPr>
-              <w:t>smooth</w:t>
-            </w:r>
-            <w:proofErr w:type="spellEnd"/>
-            <w:r>
-              <w:rPr>
-                <w:rFonts w:ascii="Times New Roman" w:eastAsia="Times New Roman" w:hAnsi="Times New Roman" w:cs="Times New Roman"/>
-              </w:rPr>
-              <w:t>(</w:t>
-            </w:r>
-            <w:proofErr w:type="gramEnd"/>
-            <w:r>
-              <w:rPr>
-                <w:rFonts w:ascii="Times New Roman" w:eastAsia="Times New Roman" w:hAnsi="Times New Roman" w:cs="Times New Roman"/>
-              </w:rPr>
-              <w:t>method = "</w:t>
-            </w:r>
-            <w:proofErr w:type="spellStart"/>
-            <w:r>
-              <w:rPr>
-                <w:rFonts w:ascii="Times New Roman" w:eastAsia="Times New Roman" w:hAnsi="Times New Roman" w:cs="Times New Roman"/>
-              </w:rPr>
-              <w:t>lm</w:t>
-            </w:r>
-            <w:proofErr w:type="spellEnd"/>
-            <w:r>
-              <w:rPr>
-                <w:rFonts w:ascii="Times New Roman" w:eastAsia="Times New Roman" w:hAnsi="Times New Roman" w:cs="Times New Roman"/>
-              </w:rPr>
-              <w:t xml:space="preserve">", se = TRUE, </w:t>
-            </w:r>
-            <w:proofErr w:type="spellStart"/>
-            <w:r>
-              <w:rPr>
-                <w:rFonts w:ascii="Times New Roman" w:eastAsia="Times New Roman" w:hAnsi="Times New Roman" w:cs="Times New Roman"/>
-              </w:rPr>
-              <w:t>color</w:t>
-            </w:r>
-            <w:proofErr w:type="spellEnd"/>
-            <w:r>
-              <w:rPr>
-                <w:rFonts w:ascii="Times New Roman" w:eastAsia="Times New Roman" w:hAnsi="Times New Roman" w:cs="Times New Roman"/>
-              </w:rPr>
-              <w:t xml:space="preserve"> = "red", linewidth = 1) +</w:t>
-            </w:r>
-          </w:p>
-          <w:p>
-            <w:pPr>
-              <w:rPr>
-                <w:rFonts w:ascii="Times New Roman" w:eastAsia="Times New Roman" w:hAnsi="Times New Roman" w:cs="Times New Roman"/>
-              </w:rPr>
-            </w:pPr>
-            <w:r>
-              <w:rPr>
-                <w:rFonts w:ascii="Times New Roman" w:eastAsia="Times New Roman" w:hAnsi="Times New Roman" w:cs="Times New Roman"/>
-              </w:rPr>
-              <w:t xml:space="preserve">  </w:t>
-            </w:r>
-            <w:proofErr w:type="gramStart"/>
-            <w:r>
-              <w:rPr>
-                <w:rFonts w:ascii="Times New Roman" w:eastAsia="Times New Roman" w:hAnsi="Times New Roman" w:cs="Times New Roman"/>
-              </w:rPr>
-              <w:t>labs(</w:t>
-            </w:r>
-            <w:proofErr w:type="gramEnd"/>
-            <w:r>
-              <w:rPr>
-                <w:rFonts w:ascii="Times New Roman" w:eastAsia="Times New Roman" w:hAnsi="Times New Roman" w:cs="Times New Roman"/>
-              </w:rPr>
-              <w:t>title = "Relationship between Alcohol Consumption and Life Expectancy",</w:t>
-            </w:r>
-          </w:p>
-          <w:p>
-            <w:pPr>
-              <w:rPr>
-                <w:rFonts w:ascii="Times New Roman" w:eastAsia="Times New Roman" w:hAnsi="Times New Roman" w:cs="Times New Roman"/>
-              </w:rPr>
-            </w:pPr>
-            <w:r>
-              <w:rPr>
-                <w:rFonts w:ascii="Times New Roman" w:eastAsia="Times New Roman" w:hAnsi="Times New Roman" w:cs="Times New Roman"/>
-              </w:rPr>
-              <w:t xml:space="preserve">       x = "Alcohol Consumption per Capita (litres)",</w:t>
-            </w:r>
-          </w:p>
-          <w:p>
-            <w:pPr>
-              <w:rPr>
-                <w:rFonts w:ascii="Times New Roman" w:eastAsia="Times New Roman" w:hAnsi="Times New Roman" w:cs="Times New Roman"/>
-              </w:rPr>
-            </w:pPr>
-            <w:r>
-              <w:rPr>
-                <w:rFonts w:ascii="Times New Roman" w:eastAsia="Times New Roman" w:hAnsi="Times New Roman" w:cs="Times New Roman"/>
-              </w:rPr>
-              <w:t xml:space="preserve">       y = "Life Expectancy at Birth (years)") +</w:t>
-            </w:r>
-          </w:p>
-          <w:p>
-            <w:pPr>
-              <w:rPr>
-                <w:rFonts w:ascii="Times New Roman" w:eastAsia="Times New Roman" w:hAnsi="Times New Roman" w:cs="Times New Roman"/>
-              </w:rPr>
-            </w:pPr>
-            <w:r>
-              <w:rPr>
-                <w:rFonts w:ascii="Times New Roman" w:eastAsia="Times New Roman" w:hAnsi="Times New Roman" w:cs="Times New Roman"/>
-              </w:rPr>
-              <w:t xml:space="preserve">  </w:t>
-            </w:r>
-            <w:proofErr w:type="spellStart"/>
-            <w:r>
-              <w:rPr>
-                <w:rFonts w:ascii="Times New Roman" w:eastAsia="Times New Roman" w:hAnsi="Times New Roman" w:cs="Times New Roman"/>
-              </w:rPr>
-              <w:t>theme_</w:t>
-            </w:r>
-            <w:proofErr w:type="gramStart"/>
-            <w:r>
-              <w:rPr>
-                <w:rFonts w:ascii="Times New Roman" w:eastAsia="Times New Roman" w:hAnsi="Times New Roman" w:cs="Times New Roman"/>
-              </w:rPr>
-              <w:t>minimal</w:t>
-            </w:r>
-            <w:proofErr w:type="spellEnd"/>
-            <w:r>
-              <w:rPr>
-                <w:rFonts w:ascii="Times New Roman" w:eastAsia="Times New Roman" w:hAnsi="Times New Roman" w:cs="Times New Roman"/>
-              </w:rPr>
-              <w:t>(</w:t>
-            </w:r>
-            <w:proofErr w:type="gramEnd"/>
-            <w:r>
-              <w:rPr>
-                <w:rFonts w:ascii="Times New Roman" w:eastAsia="Times New Roman" w:hAnsi="Times New Roman" w:cs="Times New Roman"/>
-              </w:rPr>
-              <w:t>) +</w:t>
-            </w:r>
-          </w:p>
-          <w:p>
-            <w:pPr>
-              <w:rPr>
-                <w:rFonts w:ascii="Times New Roman" w:eastAsia="Times New Roman" w:hAnsi="Times New Roman" w:cs="Times New Roman"/>
-              </w:rPr>
-            </w:pPr>
-            <w:r>
-              <w:rPr>
-                <w:rFonts w:ascii="Times New Roman" w:eastAsia="Times New Roman" w:hAnsi="Times New Roman" w:cs="Times New Roman"/>
-              </w:rPr>
-              <w:t xml:space="preserve">  </w:t>
-            </w:r>
-            <w:proofErr w:type="gramStart"/>
-            <w:r>
-              <w:rPr>
-                <w:rFonts w:ascii="Times New Roman" w:eastAsia="Times New Roman" w:hAnsi="Times New Roman" w:cs="Times New Roman"/>
-              </w:rPr>
-              <w:t>theme(</w:t>
-            </w:r>
-            <w:proofErr w:type="spellStart"/>
-            <w:r>
-              <w:rPr>
-                <w:rFonts w:ascii="Times New Roman" w:eastAsia="Times New Roman" w:hAnsi="Times New Roman" w:cs="Times New Roman"/>
-              </w:rPr>
-              <w:t>plot.title</w:t>
-            </w:r>
-            <w:proofErr w:type="spellEnd"/>
-            <w:proofErr w:type="gramEnd"/>
-            <w:r>
-              <w:rPr>
-                <w:rFonts w:ascii="Times New Roman" w:eastAsia="Times New Roman" w:hAnsi="Times New Roman" w:cs="Times New Roman"/>
-              </w:rPr>
-              <w:t xml:space="preserve"> = </w:t>
-            </w:r>
-            <w:proofErr w:type="spellStart"/>
-            <w:r>
-              <w:rPr>
-                <w:rFonts w:ascii="Times New Roman" w:eastAsia="Times New Roman" w:hAnsi="Times New Roman" w:cs="Times New Roman"/>
-              </w:rPr>
-              <w:t>element_</w:t>
-            </w:r>
-            <w:proofErr w:type="gramStart"/>
-            <w:r>
-              <w:rPr>
-                <w:rFonts w:ascii="Times New Roman" w:eastAsia="Times New Roman" w:hAnsi="Times New Roman" w:cs="Times New Roman"/>
-              </w:rPr>
-              <w:t>text</w:t>
-            </w:r>
-            <w:proofErr w:type="spellEnd"/>
-            <w:r>
-              <w:rPr>
-                <w:rFonts w:ascii="Times New Roman" w:eastAsia="Times New Roman" w:hAnsi="Times New Roman" w:cs="Times New Roman"/>
-              </w:rPr>
-              <w:t>(</w:t>
-            </w:r>
-            <w:proofErr w:type="spellStart"/>
-            <w:proofErr w:type="gramEnd"/>
-            <w:r>
-              <w:rPr>
-                <w:rFonts w:ascii="Times New Roman" w:eastAsia="Times New Roman" w:hAnsi="Times New Roman" w:cs="Times New Roman"/>
-              </w:rPr>
-              <w:t>hjust</w:t>
-            </w:r>
-            <w:proofErr w:type="spellEnd"/>
-            <w:r>
-              <w:rPr>
-                <w:rFonts w:ascii="Times New Roman" w:eastAsia="Times New Roman" w:hAnsi="Times New Roman" w:cs="Times New Roman"/>
-              </w:rPr>
-              <w:t xml:space="preserve"> = 0.5, face = "bold"))</w:t>
-            </w:r>
-          </w:p>
-          <w:p>
-            <w:pPr>
-              <w:rPr>
-                <w:rFonts w:ascii="Times New Roman" w:eastAsia="Times New Roman" w:hAnsi="Times New Roman" w:cs="Times New Roman"/>
-              </w:rPr>
-            </w:pPr>
-          </w:p>
-          <w:p>
-            <w:pPr>
-              <w:rPr>
-                <w:rFonts w:ascii="Times New Roman" w:eastAsia="Times New Roman" w:hAnsi="Times New Roman" w:cs="Times New Roman"/>
-              </w:rPr>
-            </w:pPr>
-            <w:r>
-              <w:rPr>
-                <w:rFonts w:ascii="Times New Roman" w:eastAsia="Times New Roman" w:hAnsi="Times New Roman" w:cs="Times New Roman"/>
-              </w:rPr>
-              <w:t># Display plot</w:t>
-            </w:r>
-          </w:p>
-          <w:p>
-            <w:pPr>
-              <w:rPr>
-                <w:rFonts w:ascii="Times New Roman" w:eastAsia="Times New Roman" w:hAnsi="Times New Roman" w:cs="Times New Roman"/>
-              </w:rPr>
-            </w:pPr>
-            <w:r>
-              <w:rPr>
-                <w:rFonts w:ascii="Times New Roman" w:eastAsia="Times New Roman" w:hAnsi="Times New Roman" w:cs="Times New Roman"/>
-              </w:rPr>
-              <w:t>print(</w:t>
-            </w:r>
-            <w:proofErr w:type="spellStart"/>
-            <w:r>
-              <w:rPr>
-                <w:rFonts w:ascii="Times New Roman" w:eastAsia="Times New Roman" w:hAnsi="Times New Roman" w:cs="Times New Roman"/>
-              </w:rPr>
-              <w:t>scatter_plot</w:t>
-            </w:r>
-            <w:proofErr w:type="spellEnd"/>
-            <w:r>
-              <w:rPr>
-                <w:rFonts w:ascii="Times New Roman" w:eastAsia="Times New Roman" w:hAnsi="Times New Roman" w:cs="Times New Roman"/>
-              </w:rPr>
-              <w:t>)</w:t>
-            </w:r>
-          </w:p>
-          <w:p>
-            <w:pPr>
-              <w:rPr>
-                <w:rFonts w:ascii="Times New Roman" w:eastAsia="Times New Roman" w:hAnsi="Times New Roman" w:cs="Times New Roman"/>
-              </w:rPr>
-            </w:pPr>
-          </w:p>
-          <w:p>
-            <w:pPr>
-              <w:rPr>
-                <w:rFonts w:ascii="Times New Roman" w:eastAsia="Times New Roman" w:hAnsi="Times New Roman" w:cs="Times New Roman"/>
-              </w:rPr>
-            </w:pPr>
-          </w:p>
-          <w:p>
-            <w:pPr>
-              <w:rPr>
-                <w:rFonts w:ascii="Times New Roman" w:eastAsia="Times New Roman" w:hAnsi="Times New Roman" w:cs="Times New Roman"/>
-              </w:rPr>
-            </w:pPr>
-          </w:p>
-          <w:p>
-            <w:pPr>
-              <w:rPr>
-                <w:rFonts w:ascii="Times New Roman" w:eastAsia="Times New Roman" w:hAnsi="Times New Roman" w:cs="Times New Roman"/>
-              </w:rPr>
-            </w:pPr>
-          </w:p>
-          <w:p>
-            <w:pPr>
-              <w:rPr>
-                <w:rFonts w:ascii="Times New Roman" w:eastAsia="Times New Roman" w:hAnsi="Times New Roman" w:cs="Times New Roman"/>
-              </w:rPr>
-            </w:pPr>
-            <w:r>
-              <w:rPr>
-                <w:rFonts w:ascii="Times New Roman" w:eastAsia="Times New Roman" w:hAnsi="Times New Roman" w:cs="Times New Roman"/>
-              </w:rPr>
-              <w:t># Pearson correlation test</w:t>
-            </w:r>
-          </w:p>
-          <w:p>
-            <w:pPr>
-              <w:rPr>
-                <w:rFonts w:ascii="Times New Roman" w:eastAsia="Times New Roman" w:hAnsi="Times New Roman" w:cs="Times New Roman"/>
-              </w:rPr>
-            </w:pPr>
-            <w:proofErr w:type="spellStart"/>
-            <w:r>
-              <w:rPr>
-                <w:rFonts w:ascii="Times New Roman" w:eastAsia="Times New Roman" w:hAnsi="Times New Roman" w:cs="Times New Roman"/>
-              </w:rPr>
-              <w:t>correlation_test</w:t>
-            </w:r>
-            <w:proofErr w:type="spellEnd"/>
-            <w:r>
-              <w:rPr>
-                <w:rFonts w:ascii="Times New Roman" w:eastAsia="Times New Roman" w:hAnsi="Times New Roman" w:cs="Times New Roman"/>
-              </w:rPr>
-              <w:t xml:space="preserve"> &lt;- </w:t>
-            </w:r>
-            <w:proofErr w:type="spellStart"/>
-            <w:r>
-              <w:rPr>
-                <w:rFonts w:ascii="Times New Roman" w:eastAsia="Times New Roman" w:hAnsi="Times New Roman" w:cs="Times New Roman"/>
-              </w:rPr>
-              <w:t>cor.</w:t>
-            </w:r>
-            <w:proofErr w:type="gramStart"/>
-            <w:r>
-              <w:rPr>
-                <w:rFonts w:ascii="Times New Roman" w:eastAsia="Times New Roman" w:hAnsi="Times New Roman" w:cs="Times New Roman"/>
-              </w:rPr>
-              <w:t>test</w:t>
-            </w:r>
-            <w:proofErr w:type="spellEnd"/>
-            <w:r>
-              <w:rPr>
-                <w:rFonts w:ascii="Times New Roman" w:eastAsia="Times New Roman" w:hAnsi="Times New Roman" w:cs="Times New Roman"/>
-              </w:rPr>
-              <w:t>(</w:t>
-            </w:r>
-            <w:proofErr w:type="spellStart"/>
-            <w:proofErr w:type="gramEnd"/>
-            <w:r>
-              <w:rPr>
-                <w:rFonts w:ascii="Times New Roman" w:eastAsia="Times New Roman" w:hAnsi="Times New Roman" w:cs="Times New Roman"/>
-              </w:rPr>
-              <w:t>data_clean$Alcohol_Consumption</w:t>
-            </w:r>
-            <w:proofErr w:type="spellEnd"/>
-            <w:r>
-              <w:rPr>
-                <w:rFonts w:ascii="Times New Roman" w:eastAsia="Times New Roman" w:hAnsi="Times New Roman" w:cs="Times New Roman"/>
-              </w:rPr>
-              <w:t xml:space="preserve">, </w:t>
-            </w:r>
-          </w:p>
-          <w:p>
-            <w:pPr>
-              <w:rPr>
-                <w:rFonts w:ascii="Times New Roman" w:eastAsia="Times New Roman" w:hAnsi="Times New Roman" w:cs="Times New Roman"/>
-              </w:rPr>
-            </w:pPr>
-            <w:r>
-              <w:rPr>
-                <w:rFonts w:ascii="Times New Roman" w:eastAsia="Times New Roman" w:hAnsi="Times New Roman" w:cs="Times New Roman"/>
-              </w:rPr>
-              <w:t xml:space="preserve">                             </w:t>
-            </w:r>
-            <w:proofErr w:type="spellStart"/>
-            <w:r>
-              <w:rPr>
-                <w:rFonts w:ascii="Times New Roman" w:eastAsia="Times New Roman" w:hAnsi="Times New Roman" w:cs="Times New Roman"/>
-              </w:rPr>
-              <w:t>data_clean$Life_Expectancy</w:t>
-            </w:r>
-            <w:proofErr w:type="spellEnd"/>
-            <w:r>
-              <w:rPr>
-                <w:rFonts w:ascii="Times New Roman" w:eastAsia="Times New Roman" w:hAnsi="Times New Roman" w:cs="Times New Roman"/>
-              </w:rPr>
-              <w:t>,</w:t>
-            </w:r>
-          </w:p>
-          <w:p>
-            <w:pPr>
-              <w:rPr>
-                <w:rFonts w:ascii="Times New Roman" w:eastAsia="Times New Roman" w:hAnsi="Times New Roman" w:cs="Times New Roman"/>
-              </w:rPr>
-            </w:pPr>
-            <w:r>
-              <w:rPr>
-                <w:rFonts w:ascii="Times New Roman" w:eastAsia="Times New Roman" w:hAnsi="Times New Roman" w:cs="Times New Roman"/>
-              </w:rPr>
-              <w:t xml:space="preserve">                             method = "</w:t>
-            </w:r>
-            <w:proofErr w:type="spellStart"/>
-            <w:r>
-              <w:rPr>
-                <w:rFonts w:ascii="Times New Roman" w:eastAsia="Times New Roman" w:hAnsi="Times New Roman" w:cs="Times New Roman"/>
-              </w:rPr>
-              <w:t>pearson</w:t>
-            </w:r>
-            <w:proofErr w:type="spellEnd"/>
-            <w:r>
-              <w:rPr>
-                <w:rFonts w:ascii="Times New Roman" w:eastAsia="Times New Roman" w:hAnsi="Times New Roman" w:cs="Times New Roman"/>
-              </w:rPr>
-              <w:t>")</w:t>
-            </w:r>
-          </w:p>
-          <w:p>
-            <w:pPr>
-              <w:rPr>
-                <w:rFonts w:ascii="Times New Roman" w:eastAsia="Times New Roman" w:hAnsi="Times New Roman" w:cs="Times New Roman"/>
-              </w:rPr>
-            </w:pPr>
-          </w:p>
-          <w:p>
-            <w:pPr>
-              <w:rPr>
-                <w:rFonts w:ascii="Times New Roman" w:eastAsia="Times New Roman" w:hAnsi="Times New Roman" w:cs="Times New Roman"/>
-              </w:rPr>
-            </w:pPr>
-            <w:r>
-              <w:rPr>
-                <w:rFonts w:ascii="Times New Roman" w:eastAsia="Times New Roman" w:hAnsi="Times New Roman" w:cs="Times New Roman"/>
-              </w:rPr>
-              <w:t># Display correlation results</w:t>
-            </w:r>
-          </w:p>
-          <w:p>
-            <w:pPr>
-              <w:rPr>
-                <w:rFonts w:ascii="Times New Roman" w:eastAsia="Times New Roman" w:hAnsi="Times New Roman" w:cs="Times New Roman"/>
-              </w:rPr>
-            </w:pPr>
-            <w:r>
-              <w:rPr>
-                <w:rFonts w:ascii="Times New Roman" w:eastAsia="Times New Roman" w:hAnsi="Times New Roman" w:cs="Times New Roman"/>
-              </w:rPr>
-              <w:t>print(</w:t>
-            </w:r>
-            <w:proofErr w:type="spellStart"/>
-            <w:r>
-              <w:rPr>
-                <w:rFonts w:ascii="Times New Roman" w:eastAsia="Times New Roman" w:hAnsi="Times New Roman" w:cs="Times New Roman"/>
-              </w:rPr>
-              <w:t>correlation_test</w:t>
-            </w:r>
-            <w:proofErr w:type="spellEnd"/>
-            <w:r>
-              <w:rPr>
-                <w:rFonts w:ascii="Times New Roman" w:eastAsia="Times New Roman" w:hAnsi="Times New Roman" w:cs="Times New Roman"/>
-              </w:rPr>
-              <w:t>)</w:t>
-            </w:r>
-          </w:p>
-          <w:p>
-            <w:pPr>
-              <w:rPr>
-                <w:rFonts w:ascii="Times New Roman" w:eastAsia="Times New Roman" w:hAnsi="Times New Roman" w:cs="Times New Roman"/>
-              </w:rPr>
-            </w:pPr>
-          </w:p>
-          <w:p>
-            <w:pPr>
-              <w:rPr>
-                <w:rFonts w:ascii="Times New Roman" w:eastAsia="Times New Roman" w:hAnsi="Times New Roman" w:cs="Times New Roman"/>
-              </w:rPr>
-            </w:pPr>
-            <w:r>
-              <w:rPr>
-                <w:rFonts w:ascii="Times New Roman" w:eastAsia="Times New Roman" w:hAnsi="Times New Roman" w:cs="Times New Roman"/>
-              </w:rPr>
-              <w:t># Extract key statistics</w:t>
-            </w:r>
-          </w:p>
-          <w:p>
-            <w:pPr>
-              <w:rPr>
-                <w:rFonts w:ascii="Times New Roman" w:eastAsia="Times New Roman" w:hAnsi="Times New Roman" w:cs="Times New Roman"/>
-              </w:rPr>
-            </w:pPr>
-            <w:proofErr w:type="spellStart"/>
-            <w:r>
-              <w:rPr>
-                <w:rFonts w:ascii="Times New Roman" w:eastAsia="Times New Roman" w:hAnsi="Times New Roman" w:cs="Times New Roman"/>
-              </w:rPr>
-              <w:t>correlation_coefficient</w:t>
-            </w:r>
-            <w:proofErr w:type="spellEnd"/>
-            <w:r>
-              <w:rPr>
-                <w:rFonts w:ascii="Times New Roman" w:eastAsia="Times New Roman" w:hAnsi="Times New Roman" w:cs="Times New Roman"/>
-              </w:rPr>
-              <w:t xml:space="preserve"> &lt;- </w:t>
-            </w:r>
-            <w:proofErr w:type="spellStart"/>
-            <w:r>
-              <w:rPr>
-                <w:rFonts w:ascii="Times New Roman" w:eastAsia="Times New Roman" w:hAnsi="Times New Roman" w:cs="Times New Roman"/>
-              </w:rPr>
-              <w:t>correlation_test$estimate</w:t>
-            </w:r>
-            <w:proofErr w:type="spellEnd"/>
-          </w:p>
-          <w:p>
-            <w:pPr>
-              <w:rPr>
-                <w:rFonts w:ascii="Times New Roman" w:eastAsia="Times New Roman" w:hAnsi="Times New Roman" w:cs="Times New Roman"/>
-              </w:rPr>
-            </w:pPr>
-            <w:proofErr w:type="spellStart"/>
-            <w:r>
-              <w:rPr>
-                <w:rFonts w:ascii="Times New Roman" w:eastAsia="Times New Roman" w:hAnsi="Times New Roman" w:cs="Times New Roman"/>
-              </w:rPr>
-              <w:t>p_value</w:t>
-            </w:r>
-            <w:proofErr w:type="spellEnd"/>
-            <w:r>
-              <w:rPr>
-                <w:rFonts w:ascii="Times New Roman" w:eastAsia="Times New Roman" w:hAnsi="Times New Roman" w:cs="Times New Roman"/>
-              </w:rPr>
-              <w:t xml:space="preserve"> &lt;- </w:t>
-            </w:r>
-            <w:proofErr w:type="spellStart"/>
-            <w:r>
-              <w:rPr>
-                <w:rFonts w:ascii="Times New Roman" w:eastAsia="Times New Roman" w:hAnsi="Times New Roman" w:cs="Times New Roman"/>
-              </w:rPr>
-              <w:t>correlation_test$p.value</w:t>
-            </w:r>
-            <w:proofErr w:type="spellEnd"/>
-          </w:p>
-          <w:p>
-            <w:pPr>
-              <w:rPr>
-                <w:rFonts w:ascii="Times New Roman" w:eastAsia="Times New Roman" w:hAnsi="Times New Roman" w:cs="Times New Roman"/>
-              </w:rPr>
-            </w:pPr>
-            <w:proofErr w:type="spellStart"/>
-            <w:r>
-              <w:rPr>
-                <w:rFonts w:ascii="Times New Roman" w:eastAsia="Times New Roman" w:hAnsi="Times New Roman" w:cs="Times New Roman"/>
-              </w:rPr>
-              <w:t>confidence_interval</w:t>
-            </w:r>
-            <w:proofErr w:type="spellEnd"/>
-            <w:r>
-              <w:rPr>
-                <w:rFonts w:ascii="Times New Roman" w:eastAsia="Times New Roman" w:hAnsi="Times New Roman" w:cs="Times New Roman"/>
-              </w:rPr>
-              <w:t xml:space="preserve"> &lt;- correlation_test$conf.int</w:t>
-            </w:r>
-          </w:p>
-          <w:p>
-            <w:pPr>
-              <w:rPr>
-                <w:rFonts w:ascii="Times New Roman" w:eastAsia="Times New Roman" w:hAnsi="Times New Roman" w:cs="Times New Roman"/>
-              </w:rPr>
-            </w:pPr>
-          </w:p>
-          <w:p>
-            <w:pPr>
-              <w:rPr>
-                <w:rFonts w:ascii="Times New Roman" w:eastAsia="Times New Roman" w:hAnsi="Times New Roman" w:cs="Times New Roman"/>
-              </w:rPr>
-            </w:pPr>
-            <w:proofErr w:type="gramStart"/>
-            <w:r>
-              <w:rPr>
-                <w:rFonts w:ascii="Times New Roman" w:eastAsia="Times New Roman" w:hAnsi="Times New Roman" w:cs="Times New Roman"/>
-              </w:rPr>
-              <w:t>cat(</w:t>
-            </w:r>
-            <w:proofErr w:type="gramEnd"/>
-            <w:r>
-              <w:rPr>
-                <w:rFonts w:ascii="Times New Roman" w:eastAsia="Times New Roman" w:hAnsi="Times New Roman" w:cs="Times New Roman"/>
-              </w:rPr>
-              <w:t>"\n=== CORRELATION ANALYSIS RESULTS ===\n")</w:t>
-            </w:r>
-          </w:p>
-          <w:p>
-            <w:pPr>
-              <w:rPr>
-                <w:rFonts w:ascii="Times New Roman" w:eastAsia="Times New Roman" w:hAnsi="Times New Roman" w:cs="Times New Roman"/>
-              </w:rPr>
-            </w:pPr>
-            <w:proofErr w:type="gramStart"/>
-            <w:r>
-              <w:rPr>
-                <w:rFonts w:ascii="Times New Roman" w:eastAsia="Times New Roman" w:hAnsi="Times New Roman" w:cs="Times New Roman"/>
-              </w:rPr>
-              <w:t>cat(</w:t>
-            </w:r>
-            <w:proofErr w:type="gramEnd"/>
-            <w:r>
-              <w:rPr>
-                <w:rFonts w:ascii="Times New Roman" w:eastAsia="Times New Roman" w:hAnsi="Times New Roman" w:cs="Times New Roman"/>
-              </w:rPr>
-              <w:t xml:space="preserve">"Pearson Correlation Coefficient (r):", </w:t>
-            </w:r>
-            <w:proofErr w:type="spellStart"/>
-            <w:r>
-              <w:rPr>
-                <w:rFonts w:ascii="Times New Roman" w:eastAsia="Times New Roman" w:hAnsi="Times New Roman" w:cs="Times New Roman"/>
-              </w:rPr>
-              <w:t>correlation_coefficient</w:t>
-            </w:r>
-            <w:proofErr w:type="spellEnd"/>
-            <w:r>
-              <w:rPr>
-                <w:rFonts w:ascii="Times New Roman" w:eastAsia="Times New Roman" w:hAnsi="Times New Roman" w:cs="Times New Roman"/>
-              </w:rPr>
-              <w:t>, "\n")</w:t>
-            </w:r>
-          </w:p>
-          <w:p>
-            <w:pPr>
-              <w:rPr>
-                <w:rFonts w:ascii="Times New Roman" w:eastAsia="Times New Roman" w:hAnsi="Times New Roman" w:cs="Times New Roman"/>
-              </w:rPr>
-            </w:pPr>
-            <w:proofErr w:type="gramStart"/>
-            <w:r>
-              <w:rPr>
-                <w:rFonts w:ascii="Times New Roman" w:eastAsia="Times New Roman" w:hAnsi="Times New Roman" w:cs="Times New Roman"/>
-              </w:rPr>
-              <w:t>cat(</w:t>
-            </w:r>
-            <w:proofErr w:type="gramEnd"/>
-            <w:r>
-              <w:rPr>
-                <w:rFonts w:ascii="Times New Roman" w:eastAsia="Times New Roman" w:hAnsi="Times New Roman" w:cs="Times New Roman"/>
-              </w:rPr>
-              <w:t xml:space="preserve">"P-value:", </w:t>
-            </w:r>
-            <w:proofErr w:type="spellStart"/>
-            <w:r>
-              <w:rPr>
-                <w:rFonts w:ascii="Times New Roman" w:eastAsia="Times New Roman" w:hAnsi="Times New Roman" w:cs="Times New Roman"/>
-              </w:rPr>
-              <w:t>p_value</w:t>
-            </w:r>
-            <w:proofErr w:type="spellEnd"/>
-            <w:r>
-              <w:rPr>
-                <w:rFonts w:ascii="Times New Roman" w:eastAsia="Times New Roman" w:hAnsi="Times New Roman" w:cs="Times New Roman"/>
-              </w:rPr>
-              <w:t>, "\n")</w:t>
-            </w:r>
-          </w:p>
-          <w:p>
-            <w:pPr>
-              <w:rPr>
-                <w:rFonts w:ascii="Times New Roman" w:eastAsia="Times New Roman" w:hAnsi="Times New Roman" w:cs="Times New Roman"/>
-              </w:rPr>
-            </w:pPr>
-            <w:proofErr w:type="gramStart"/>
-            <w:r>
-              <w:rPr>
-                <w:rFonts w:ascii="Times New Roman" w:eastAsia="Times New Roman" w:hAnsi="Times New Roman" w:cs="Times New Roman"/>
-              </w:rPr>
-              <w:t>cat(</w:t>
-            </w:r>
-            <w:proofErr w:type="gramEnd"/>
-            <w:r>
-              <w:rPr>
-                <w:rFonts w:ascii="Times New Roman" w:eastAsia="Times New Roman" w:hAnsi="Times New Roman" w:cs="Times New Roman"/>
-              </w:rPr>
-              <w:t xml:space="preserve">"95% Confidence Interval:", </w:t>
-            </w:r>
-            <w:proofErr w:type="spellStart"/>
-            <w:r>
-              <w:rPr>
-                <w:rFonts w:ascii="Times New Roman" w:eastAsia="Times New Roman" w:hAnsi="Times New Roman" w:cs="Times New Roman"/>
-              </w:rPr>
-              <w:t>confidence_</w:t>
-            </w:r>
-            <w:proofErr w:type="gramStart"/>
-            <w:r>
-              <w:rPr>
-                <w:rFonts w:ascii="Times New Roman" w:eastAsia="Times New Roman" w:hAnsi="Times New Roman" w:cs="Times New Roman"/>
-              </w:rPr>
-              <w:t>interval</w:t>
-            </w:r>
-            <w:proofErr w:type="spellEnd"/>
-            <w:r>
-              <w:rPr>
-                <w:rFonts w:ascii="Times New Roman" w:eastAsia="Times New Roman" w:hAnsi="Times New Roman" w:cs="Times New Roman"/>
-              </w:rPr>
-              <w:t>[</w:t>
-            </w:r>
-            <w:proofErr w:type="gramEnd"/>
-            <w:r>
-              <w:rPr>
-                <w:rFonts w:ascii="Times New Roman" w:eastAsia="Times New Roman" w:hAnsi="Times New Roman" w:cs="Times New Roman"/>
-              </w:rPr>
-              <w:t xml:space="preserve">1], "to", </w:t>
-            </w:r>
-            <w:proofErr w:type="spellStart"/>
-            <w:r>
-              <w:rPr>
-                <w:rFonts w:ascii="Times New Roman" w:eastAsia="Times New Roman" w:hAnsi="Times New Roman" w:cs="Times New Roman"/>
-              </w:rPr>
-              <w:t>confidence_</w:t>
-            </w:r>
-            <w:proofErr w:type="gramStart"/>
-            <w:r>
-              <w:rPr>
-                <w:rFonts w:ascii="Times New Roman" w:eastAsia="Times New Roman" w:hAnsi="Times New Roman" w:cs="Times New Roman"/>
-              </w:rPr>
-              <w:t>interval</w:t>
-            </w:r>
-            <w:proofErr w:type="spellEnd"/>
-            <w:r>
-              <w:rPr>
-                <w:rFonts w:ascii="Times New Roman" w:eastAsia="Times New Roman" w:hAnsi="Times New Roman" w:cs="Times New Roman"/>
-              </w:rPr>
-              <w:t>[</w:t>
-            </w:r>
-            <w:proofErr w:type="gramEnd"/>
-            <w:r>
-              <w:rPr>
-                <w:rFonts w:ascii="Times New Roman" w:eastAsia="Times New Roman" w:hAnsi="Times New Roman" w:cs="Times New Roman"/>
-              </w:rPr>
-              <w:t>2], "\n")</w:t>
-            </w:r>
-          </w:p>
-          <w:p>
-            <w:pPr>
-              <w:rPr>
-                <w:rFonts w:ascii="Times New Roman" w:eastAsia="Times New Roman" w:hAnsi="Times New Roman" w:cs="Times New Roman"/>
-              </w:rPr>
-            </w:pPr>
-            <w:proofErr w:type="gramStart"/>
-            <w:r>
-              <w:rPr>
-                <w:rFonts w:ascii="Times New Roman" w:eastAsia="Times New Roman" w:hAnsi="Times New Roman" w:cs="Times New Roman"/>
-              </w:rPr>
-              <w:t>cat(</w:t>
-            </w:r>
-            <w:proofErr w:type="gramEnd"/>
-            <w:r>
-              <w:rPr>
-                <w:rFonts w:ascii="Times New Roman" w:eastAsia="Times New Roman" w:hAnsi="Times New Roman" w:cs="Times New Roman"/>
-              </w:rPr>
-              <w:t xml:space="preserve">"Sample size (n):", </w:t>
-            </w:r>
-            <w:proofErr w:type="spellStart"/>
-            <w:r>
-              <w:rPr>
-                <w:rFonts w:ascii="Times New Roman" w:eastAsia="Times New Roman" w:hAnsi="Times New Roman" w:cs="Times New Roman"/>
-              </w:rPr>
-              <w:t>nrow</w:t>
-            </w:r>
-            <w:proofErr w:type="spellEnd"/>
-            <w:r>
-              <w:rPr>
-                <w:rFonts w:ascii="Times New Roman" w:eastAsia="Times New Roman" w:hAnsi="Times New Roman" w:cs="Times New Roman"/>
-              </w:rPr>
-              <w:t>(</w:t>
-            </w:r>
-            <w:proofErr w:type="spellStart"/>
-            <w:r>
-              <w:rPr>
-                <w:rFonts w:ascii="Times New Roman" w:eastAsia="Times New Roman" w:hAnsi="Times New Roman" w:cs="Times New Roman"/>
-              </w:rPr>
-              <w:t>data_clean</w:t>
-            </w:r>
-            <w:proofErr w:type="spellEnd"/>
-            <w:r>
-              <w:rPr>
-                <w:rFonts w:ascii="Times New Roman" w:eastAsia="Times New Roman" w:hAnsi="Times New Roman" w:cs="Times New Roman"/>
-              </w:rPr>
-              <w:t>), "\n")</w:t>
-            </w:r>
-          </w:p>
-          <w:p>
-            <w:pPr>
-              <w:rPr>
-                <w:rFonts w:ascii="Times New Roman" w:eastAsia="Times New Roman" w:hAnsi="Times New Roman" w:cs="Times New Roman"/>
-              </w:rPr>
-            </w:pPr>
-          </w:p>
-          <w:p>
-            <w:pPr>
-              <w:rPr>
-                <w:rFonts w:ascii="Times New Roman" w:eastAsia="Times New Roman" w:hAnsi="Times New Roman" w:cs="Times New Roman"/>
-              </w:rPr>
-            </w:pPr>
-            <w:r>
-              <w:rPr>
-                <w:rFonts w:ascii="Times New Roman" w:eastAsia="Times New Roman" w:hAnsi="Times New Roman" w:cs="Times New Roman"/>
-              </w:rPr>
-              <w:t># Interpretation</w:t>
-            </w:r>
-          </w:p>
-          <w:p>
-            <w:pPr>
-              <w:rPr>
-                <w:rFonts w:ascii="Times New Roman" w:eastAsia="Times New Roman" w:hAnsi="Times New Roman" w:cs="Times New Roman"/>
-              </w:rPr>
-            </w:pPr>
-            <w:r>
-              <w:rPr>
-                <w:rFonts w:ascii="Times New Roman" w:eastAsia="Times New Roman" w:hAnsi="Times New Roman" w:cs="Times New Roman"/>
-              </w:rPr>
-              <w:t>if (</w:t>
-            </w:r>
-            <w:proofErr w:type="spellStart"/>
-            <w:r>
-              <w:rPr>
-                <w:rFonts w:ascii="Times New Roman" w:eastAsia="Times New Roman" w:hAnsi="Times New Roman" w:cs="Times New Roman"/>
-              </w:rPr>
-              <w:t>p_value</w:t>
-            </w:r>
-            <w:proofErr w:type="spellEnd"/>
-            <w:r>
-              <w:rPr>
-                <w:rFonts w:ascii="Times New Roman" w:eastAsia="Times New Roman" w:hAnsi="Times New Roman" w:cs="Times New Roman"/>
-              </w:rPr>
-              <w:t xml:space="preserve"> &lt; 0.05) {</w:t>
-            </w:r>
-          </w:p>
-          <w:p>
-            <w:pPr>
-              <w:rPr>
-                <w:rFonts w:ascii="Times New Roman" w:eastAsia="Times New Roman" w:hAnsi="Times New Roman" w:cs="Times New Roman"/>
-              </w:rPr>
-            </w:pPr>
-            <w:r>
-              <w:rPr>
-                <w:rFonts w:ascii="Times New Roman" w:eastAsia="Times New Roman" w:hAnsi="Times New Roman" w:cs="Times New Roman"/>
-              </w:rPr>
-              <w:t xml:space="preserve">  </w:t>
-            </w:r>
-            <w:proofErr w:type="gramStart"/>
-            <w:r>
-              <w:rPr>
-                <w:rFonts w:ascii="Times New Roman" w:eastAsia="Times New Roman" w:hAnsi="Times New Roman" w:cs="Times New Roman"/>
-              </w:rPr>
-              <w:t>cat(</w:t>
-            </w:r>
-            <w:proofErr w:type="gramEnd"/>
-            <w:r>
-              <w:rPr>
-                <w:rFonts w:ascii="Times New Roman" w:eastAsia="Times New Roman" w:hAnsi="Times New Roman" w:cs="Times New Roman"/>
-              </w:rPr>
-              <w:t>"\</w:t>
-            </w:r>
-            <w:proofErr w:type="spellStart"/>
-            <w:r>
-              <w:rPr>
-                <w:rFonts w:ascii="Times New Roman" w:eastAsia="Times New Roman" w:hAnsi="Times New Roman" w:cs="Times New Roman"/>
-              </w:rPr>
-              <w:t>nConclusion</w:t>
-            </w:r>
-            <w:proofErr w:type="spellEnd"/>
-            <w:r>
-              <w:rPr>
-                <w:rFonts w:ascii="Times New Roman" w:eastAsia="Times New Roman" w:hAnsi="Times New Roman" w:cs="Times New Roman"/>
-              </w:rPr>
-              <w:t xml:space="preserve">: The null hypothesis is REJECTED (p &lt; </w:t>
-            </w:r>
-            <w:proofErr w:type="gramStart"/>
-            <w:r>
-              <w:rPr>
-                <w:rFonts w:ascii="Times New Roman" w:eastAsia="Times New Roman" w:hAnsi="Times New Roman" w:cs="Times New Roman"/>
-              </w:rPr>
-              <w:t>0.05)\</w:t>
-            </w:r>
-            <w:proofErr w:type="gramEnd"/>
-            <w:r>
-              <w:rPr>
-                <w:rFonts w:ascii="Times New Roman" w:eastAsia="Times New Roman" w:hAnsi="Times New Roman" w:cs="Times New Roman"/>
-              </w:rPr>
               <w:t>n")</w:t>
             </w:r>
           </w:p>
@@ -10765,7 +10770,6 @@
               <w:rPr>
                 <w:rFonts w:ascii="Times New Roman" w:eastAsia="Times New Roman" w:hAnsi="Times New Roman" w:cs="Times New Roman"/>
               </w:rPr>
-              <w:lastRenderedPageBreak/>
               <w:t xml:space="preserve">  </w:t>
             </w:r>
             <w:proofErr w:type="gramStart"/>
@@ -10924,6 +10928,7 @@
           <w:ilvl w:val="0"/>
           <w:numId w:val="4"/>
         </w:numPr>
+        <w:ind w:left="0" w:firstLine="0"/>
         <w:rPr>
           <w:rFonts w:ascii="Times New Roman" w:eastAsia="Times New Roman" w:hAnsi="Times New Roman" w:cs="Times New Roman"/>
         </w:rPr>
@@ -11551,7 +11556,7 @@
   <w:abstractNum w:abstractNumId="4" w15:restartNumberingAfterBreak="0">
     <w:nsid w:val="064B1E91"/>
     <w:multiLevelType w:val="multilevel"/>
-    <w:tmpl w:val="340C31BA"/>
+    <w:tmpl w:val="9864E146"/>
     <w:lvl w:ilvl="0">
       <w:start w:val="1"/>
       <w:numFmt w:val="decimal"/>
@@ -11562,6 +11567,8 @@
       </w:pPr>
       <w:rPr>
         <w:rFonts w:ascii="Times New Roman" w:eastAsiaTheme="minorHAnsi" w:hAnsi="Times New Roman" w:cs="Times New Roman"/>
+        <w:sz w:val="32"/>
+        <w:szCs w:val="32"/>
       </w:rPr>
     </w:lvl>
     <w:lvl w:ilvl="1">

</xml_diff>

<commit_message>
Updated the Visualizations and Plots
</commit_message>
<xml_diff>
--- a/7COM1079_Final report_template.docx
+++ b/7COM1079_Final report_template.docx
@@ -1963,10 +1963,123 @@
           <w:rFonts w:ascii="Times New Roman" w:eastAsia="Times New Roman" w:hAnsi="Times New Roman" w:cs="Times New Roman"/>
         </w:rPr>
       </w:pPr>
-      <w:r>
-        <w:rPr>
-          <w:rFonts w:ascii="Times New Roman" w:eastAsia="Times New Roman" w:hAnsi="Times New Roman" w:cs="Times New Roman"/>
-        </w:rPr>
+    </w:p>
+    <w:p>
+      <w:pPr>
+        <w:ind w:left="1440"/>
+        <w:rPr>
+          <w:rFonts w:ascii="Times New Roman" w:eastAsia="Times New Roman" w:hAnsi="Times New Roman" w:cs="Times New Roman"/>
+        </w:rPr>
+      </w:pPr>
+    </w:p>
+    <w:p>
+      <w:pPr>
+        <w:ind w:left="1440"/>
+        <w:rPr>
+          <w:rFonts w:ascii="Times New Roman" w:eastAsia="Times New Roman" w:hAnsi="Times New Roman" w:cs="Times New Roman"/>
+        </w:rPr>
+      </w:pPr>
+    </w:p>
+    <w:p>
+      <w:pPr>
+        <w:ind w:left="1440"/>
+        <w:rPr>
+          <w:rFonts w:ascii="Times New Roman" w:eastAsia="Times New Roman" w:hAnsi="Times New Roman" w:cs="Times New Roman"/>
+        </w:rPr>
+      </w:pPr>
+    </w:p>
+    <w:p>
+      <w:pPr>
+        <w:ind w:left="1440"/>
+        <w:rPr>
+          <w:rFonts w:ascii="Times New Roman" w:eastAsia="Times New Roman" w:hAnsi="Times New Roman" w:cs="Times New Roman"/>
+        </w:rPr>
+      </w:pPr>
+    </w:p>
+    <w:p>
+      <w:pPr>
+        <w:ind w:left="1440"/>
+        <w:rPr>
+          <w:rFonts w:ascii="Times New Roman" w:eastAsia="Times New Roman" w:hAnsi="Times New Roman" w:cs="Times New Roman"/>
+        </w:rPr>
+      </w:pPr>
+    </w:p>
+    <w:p>
+      <w:pPr>
+        <w:ind w:left="1440"/>
+        <w:rPr>
+          <w:rFonts w:ascii="Times New Roman" w:eastAsia="Times New Roman" w:hAnsi="Times New Roman" w:cs="Times New Roman"/>
+        </w:rPr>
+      </w:pPr>
+    </w:p>
+    <w:p>
+      <w:pPr>
+        <w:ind w:left="1440"/>
+        <w:rPr>
+          <w:rFonts w:ascii="Times New Roman" w:eastAsia="Times New Roman" w:hAnsi="Times New Roman" w:cs="Times New Roman"/>
+        </w:rPr>
+      </w:pPr>
+    </w:p>
+    <w:p>
+      <w:pPr>
+        <w:ind w:left="1440"/>
+        <w:rPr>
+          <w:rFonts w:ascii="Times New Roman" w:eastAsia="Times New Roman" w:hAnsi="Times New Roman" w:cs="Times New Roman"/>
+        </w:rPr>
+      </w:pPr>
+    </w:p>
+    <w:p>
+      <w:pPr>
+        <w:ind w:left="1440"/>
+        <w:rPr>
+          <w:rFonts w:ascii="Times New Roman" w:eastAsia="Times New Roman" w:hAnsi="Times New Roman" w:cs="Times New Roman"/>
+        </w:rPr>
+      </w:pPr>
+    </w:p>
+    <w:p>
+      <w:pPr>
+        <w:ind w:left="1440"/>
+        <w:rPr>
+          <w:rFonts w:ascii="Times New Roman" w:eastAsia="Times New Roman" w:hAnsi="Times New Roman" w:cs="Times New Roman"/>
+        </w:rPr>
+      </w:pPr>
+    </w:p>
+    <w:p>
+      <w:pPr>
+        <w:ind w:left="1440"/>
+        <w:rPr>
+          <w:rFonts w:ascii="Times New Roman" w:eastAsia="Times New Roman" w:hAnsi="Times New Roman" w:cs="Times New Roman"/>
+        </w:rPr>
+      </w:pPr>
+    </w:p>
+    <w:p>
+      <w:pPr>
+        <w:ind w:left="1440"/>
+        <w:rPr>
+          <w:rFonts w:ascii="Times New Roman" w:eastAsia="Times New Roman" w:hAnsi="Times New Roman" w:cs="Times New Roman"/>
+        </w:rPr>
+      </w:pPr>
+    </w:p>
+    <w:p>
+      <w:pPr>
+        <w:ind w:left="1440"/>
+        <w:rPr>
+          <w:rFonts w:ascii="Times New Roman" w:eastAsia="Times New Roman" w:hAnsi="Times New Roman" w:cs="Times New Roman"/>
+        </w:rPr>
+      </w:pPr>
+    </w:p>
+    <w:p>
+      <w:pPr>
+        <w:ind w:left="1440"/>
+        <w:rPr>
+          <w:rFonts w:ascii="Times New Roman" w:eastAsia="Times New Roman" w:hAnsi="Times New Roman" w:cs="Times New Roman"/>
+        </w:rPr>
+      </w:pPr>
+      <w:r>
+        <w:rPr>
+          <w:rFonts w:ascii="Times New Roman" w:eastAsia="Times New Roman" w:hAnsi="Times New Roman" w:cs="Times New Roman"/>
+        </w:rPr>
+        <w:lastRenderedPageBreak/>
         <w:t xml:space="preserve"> </w:t>
       </w:r>
     </w:p>
@@ -1977,16 +2090,38 @@
           <w:ilvl w:val="0"/>
           <w:numId w:val="35"/>
         </w:numPr>
-        <w:rPr>
-          <w:rFonts w:ascii="Times New Roman" w:eastAsia="Times New Roman" w:hAnsi="Times New Roman" w:cs="Times New Roman"/>
-        </w:rPr>
-      </w:pPr>
-      <w:r>
-        <w:rPr>
-          <w:rFonts w:ascii="Times New Roman" w:eastAsia="Times New Roman" w:hAnsi="Times New Roman" w:cs="Times New Roman"/>
+        <w:ind w:left="142"/>
+        <w:rPr>
+          <w:rFonts w:ascii="Times New Roman" w:eastAsia="Times New Roman" w:hAnsi="Times New Roman" w:cs="Times New Roman"/>
+          <w:b/>
+          <w:bCs/>
+          <w:sz w:val="32"/>
+          <w:szCs w:val="32"/>
+        </w:rPr>
+      </w:pPr>
+      <w:r>
+        <w:rPr>
+          <w:rFonts w:ascii="Times New Roman" w:eastAsia="Times New Roman" w:hAnsi="Times New Roman" w:cs="Times New Roman"/>
+          <w:b/>
+          <w:bCs/>
+          <w:sz w:val="32"/>
+          <w:szCs w:val="32"/>
         </w:rPr>
         <w:t>Visualisation</w:t>
       </w:r>
+    </w:p>
+    <w:p>
+      <w:pPr>
+        <w:pStyle w:val="ListParagraph"/>
+        <w:ind w:left="142"/>
+        <w:rPr>
+          <w:rFonts w:ascii="Times New Roman" w:eastAsia="Times New Roman" w:hAnsi="Times New Roman" w:cs="Times New Roman"/>
+          <w:b/>
+          <w:bCs/>
+          <w:sz w:val="32"/>
+          <w:szCs w:val="32"/>
+        </w:rPr>
+      </w:pPr>
     </w:p>
     <w:p>
       <w:pPr>
@@ -1998,497 +2133,341 @@
         <w:ind w:hanging="720"/>
         <w:rPr>
           <w:rFonts w:ascii="Times New Roman" w:eastAsia="Times New Roman" w:hAnsi="Times New Roman" w:cs="Times New Roman"/>
-        </w:rPr>
-      </w:pPr>
-      <w:r>
-        <w:rPr>
-          <w:rFonts w:ascii="Times New Roman" w:eastAsia="Times New Roman" w:hAnsi="Times New Roman" w:cs="Times New Roman"/>
-        </w:rPr>
-        <w:t xml:space="preserve">Appropriate </w:t>
-      </w:r>
-      <w:r>
-        <w:rPr>
-          <w:rFonts w:ascii="Times New Roman" w:eastAsia="Times New Roman" w:hAnsi="Times New Roman" w:cs="Times New Roman"/>
-        </w:rPr>
-        <w:t>graphs</w:t>
-      </w:r>
-      <w:r>
-        <w:rPr>
-          <w:rFonts w:ascii="Times New Roman" w:eastAsia="Times New Roman" w:hAnsi="Times New Roman" w:cs="Times New Roman"/>
-        </w:rPr>
-        <w:t xml:space="preserve"> for the RQ </w:t>
-      </w:r>
-      <w:r>
-        <w:rPr>
-          <w:rFonts w:ascii="Times New Roman" w:eastAsia="Times New Roman" w:hAnsi="Times New Roman" w:cs="Times New Roman"/>
-          <w:i/>
-          <w:iCs/>
-          <w:highlight w:val="yellow"/>
-        </w:rPr>
-        <w:t>output of an R script (NOT a screenshot)</w:t>
-      </w:r>
-      <w:r>
-        <w:rPr>
-          <w:rFonts w:ascii="Times New Roman" w:eastAsia="Times New Roman" w:hAnsi="Times New Roman" w:cs="Times New Roman"/>
-          <w:i/>
-          <w:iCs/>
-        </w:rPr>
-        <w:t xml:space="preserve"> </w:t>
-      </w:r>
-      <w:r>
-        <w:rPr>
-          <w:rFonts w:ascii="Times New Roman" w:eastAsia="Times New Roman" w:hAnsi="Times New Roman" w:cs="Times New Roman"/>
-        </w:rPr>
-        <w:t>(</w:t>
-      </w:r>
-      <w:r>
-        <w:rPr>
-          <w:rFonts w:ascii="Times New Roman" w:eastAsia="Times New Roman" w:hAnsi="Times New Roman" w:cs="Times New Roman"/>
           <w:b/>
           <w:bCs/>
-        </w:rPr>
-        <w:t>50 words)</w:t>
-      </w:r>
-      <w:r>
-        <w:rPr>
-          <w:rFonts w:ascii="Times New Roman" w:eastAsia="Times New Roman" w:hAnsi="Times New Roman" w:cs="Times New Roman"/>
-        </w:rPr>
-        <w:t xml:space="preserve"> </w:t>
+          <w:sz w:val="28"/>
+          <w:szCs w:val="28"/>
+        </w:rPr>
+      </w:pPr>
+      <w:r>
+        <w:rPr>
+          <w:rFonts w:ascii="Times New Roman" w:eastAsia="Times New Roman" w:hAnsi="Times New Roman" w:cs="Times New Roman"/>
+          <w:b/>
+          <w:bCs/>
+          <w:sz w:val="28"/>
+          <w:szCs w:val="28"/>
+        </w:rPr>
+        <w:t xml:space="preserve">Appropriate </w:t>
+      </w:r>
+      <w:r>
+        <w:rPr>
+          <w:rFonts w:ascii="Times New Roman" w:eastAsia="Times New Roman" w:hAnsi="Times New Roman" w:cs="Times New Roman"/>
+          <w:b/>
+          <w:bCs/>
+          <w:sz w:val="28"/>
+          <w:szCs w:val="28"/>
+        </w:rPr>
+        <w:t>graphs</w:t>
+      </w:r>
+      <w:r>
+        <w:rPr>
+          <w:rFonts w:ascii="Times New Roman" w:eastAsia="Times New Roman" w:hAnsi="Times New Roman" w:cs="Times New Roman"/>
+          <w:b/>
+          <w:bCs/>
+          <w:sz w:val="28"/>
+          <w:szCs w:val="28"/>
+        </w:rPr>
+        <w:t xml:space="preserve"> for the RQ</w:t>
       </w:r>
     </w:p>
     <w:p>
       <w:pPr>
         <w:pStyle w:val="ListParagraph"/>
-        <w:numPr>
-          <w:ilvl w:val="0"/>
-          <w:numId w:val="23"/>
-        </w:numPr>
-        <w:ind w:left="1800"/>
-        <w:rPr>
-          <w:rFonts w:ascii="Times New Roman" w:eastAsia="Times New Roman" w:hAnsi="Times New Roman" w:cs="Times New Roman"/>
-          <w:i/>
-          <w:iCs/>
-          <w:highlight w:val="yellow"/>
-        </w:rPr>
-      </w:pPr>
-      <w:r>
-        <w:rPr>
-          <w:rFonts w:ascii="Times New Roman" w:eastAsia="Times New Roman" w:hAnsi="Times New Roman" w:cs="Times New Roman"/>
-          <w:i/>
-          <w:iCs/>
-          <w:highlight w:val="yellow"/>
-        </w:rPr>
-        <w:t>E</w:t>
-      </w:r>
-      <w:r>
-        <w:rPr>
-          <w:rFonts w:ascii="Times New Roman" w:eastAsia="Times New Roman" w:hAnsi="Times New Roman" w:cs="Times New Roman"/>
-          <w:i/>
-          <w:iCs/>
-          <w:highlight w:val="yellow"/>
-        </w:rPr>
-        <w:t>xplain the choice of</w:t>
-      </w:r>
-      <w:r>
-        <w:rPr>
-          <w:rFonts w:ascii="Times New Roman" w:eastAsia="Times New Roman" w:hAnsi="Times New Roman" w:cs="Times New Roman"/>
-          <w:i/>
-          <w:iCs/>
-          <w:highlight w:val="yellow"/>
-        </w:rPr>
-        <w:t xml:space="preserve"> the</w:t>
-      </w:r>
-      <w:r>
-        <w:rPr>
-          <w:rFonts w:ascii="Times New Roman" w:eastAsia="Times New Roman" w:hAnsi="Times New Roman" w:cs="Times New Roman"/>
-          <w:i/>
-          <w:iCs/>
-          <w:highlight w:val="yellow"/>
-        </w:rPr>
-        <w:t xml:space="preserve"> plot</w:t>
-      </w:r>
-      <w:r>
-        <w:rPr>
-          <w:rFonts w:ascii="Times New Roman" w:eastAsia="Times New Roman" w:hAnsi="Times New Roman" w:cs="Times New Roman"/>
-          <w:i/>
-          <w:iCs/>
-          <w:highlight w:val="yellow"/>
-        </w:rPr>
-        <w:t>.</w:t>
-      </w:r>
-    </w:p>
-    <w:p>
-      <w:pPr>
-        <w:pStyle w:val="ListParagraph"/>
-        <w:numPr>
-          <w:ilvl w:val="0"/>
-          <w:numId w:val="23"/>
-        </w:numPr>
-        <w:ind w:left="1800"/>
-        <w:rPr>
-          <w:rFonts w:ascii="Times New Roman" w:eastAsia="Times New Roman" w:hAnsi="Times New Roman" w:cs="Times New Roman"/>
-          <w:i/>
-          <w:iCs/>
-          <w:highlight w:val="yellow"/>
-        </w:rPr>
-      </w:pPr>
-      <w:r>
-        <w:rPr>
-          <w:rFonts w:ascii="Times New Roman" w:eastAsia="Times New Roman" w:hAnsi="Times New Roman" w:cs="Times New Roman"/>
-          <w:i/>
-          <w:iCs/>
-          <w:highlight w:val="yellow"/>
-        </w:rPr>
-        <w:t xml:space="preserve">Include your main plot relevant to the RQ type. </w:t>
-      </w:r>
-    </w:p>
-    <w:p>
-      <w:pPr>
-        <w:pStyle w:val="ListParagraph"/>
-        <w:numPr>
-          <w:ilvl w:val="0"/>
-          <w:numId w:val="23"/>
-        </w:numPr>
-        <w:ind w:left="1800"/>
-        <w:rPr>
-          <w:rFonts w:ascii="Times New Roman" w:eastAsia="Times New Roman" w:hAnsi="Times New Roman" w:cs="Times New Roman"/>
-          <w:i/>
-          <w:iCs/>
-          <w:highlight w:val="yellow"/>
+        <w:ind w:left="420"/>
+        <w:rPr>
+          <w:rFonts w:ascii="Times New Roman" w:eastAsia="Times New Roman" w:hAnsi="Times New Roman" w:cs="Times New Roman"/>
+          <w:b/>
+          <w:bCs/>
+          <w:sz w:val="28"/>
+          <w:szCs w:val="28"/>
+        </w:rPr>
+      </w:pPr>
+    </w:p>
+    <w:p>
+      <w:pPr>
+        <w:ind w:left="-300"/>
+        <w:rPr>
+          <w:rFonts w:ascii="Times New Roman" w:eastAsia="Times New Roman" w:hAnsi="Times New Roman" w:cs="Times New Roman"/>
         </w:rPr>
       </w:pPr>
       <w:r>
         <w:rPr>
           <w:rFonts w:ascii="Times New Roman" w:hAnsi="Times New Roman" w:cs="Times New Roman"/>
-          <w:i/>
-          <w:iCs/>
-          <w:color w:val="273540"/>
-          <w:highlight w:val="yellow"/>
-          <w:shd w:val="clear" w:color="auto" w:fill="FFFFFF"/>
-        </w:rPr>
-        <w:t xml:space="preserve">Include </w:t>
-      </w:r>
-      <w:r>
-        <w:rPr>
-          <w:rFonts w:ascii="Times New Roman" w:hAnsi="Times New Roman" w:cs="Times New Roman"/>
-          <w:i/>
-          <w:iCs/>
-          <w:color w:val="273540"/>
-          <w:highlight w:val="yellow"/>
-          <w:shd w:val="clear" w:color="auto" w:fill="FFFFFF"/>
-        </w:rPr>
-        <w:t>histogram</w:t>
-      </w:r>
-      <w:r>
-        <w:rPr>
-          <w:rFonts w:ascii="Times New Roman" w:hAnsi="Times New Roman" w:cs="Times New Roman"/>
-          <w:i/>
-          <w:iCs/>
-          <w:color w:val="273540"/>
-          <w:highlight w:val="yellow"/>
-          <w:shd w:val="clear" w:color="auto" w:fill="FFFFFF"/>
-        </w:rPr>
-        <w:t xml:space="preserve"> or </w:t>
-      </w:r>
-      <w:r>
-        <w:rPr>
-          <w:rFonts w:ascii="Times New Roman" w:hAnsi="Times New Roman" w:cs="Times New Roman"/>
-          <w:i/>
-          <w:iCs/>
-          <w:color w:val="273540"/>
-          <w:highlight w:val="yellow"/>
-          <w:shd w:val="clear" w:color="auto" w:fill="FFFFFF"/>
-        </w:rPr>
-        <w:t>contingency table</w:t>
-      </w:r>
-      <w:r>
-        <w:rPr>
-          <w:rFonts w:ascii="Times New Roman" w:hAnsi="Times New Roman" w:cs="Times New Roman"/>
-          <w:i/>
-          <w:iCs/>
-          <w:color w:val="273540"/>
-          <w:highlight w:val="yellow"/>
-          <w:shd w:val="clear" w:color="auto" w:fill="FFFFFF"/>
-        </w:rPr>
-        <w:t xml:space="preserve"> (think what is suitable)</w:t>
-      </w:r>
-      <w:r>
-        <w:rPr>
-          <w:rFonts w:ascii="Times New Roman" w:hAnsi="Times New Roman" w:cs="Times New Roman"/>
-          <w:i/>
-          <w:iCs/>
-          <w:color w:val="273540"/>
-          <w:highlight w:val="yellow"/>
-          <w:shd w:val="clear" w:color="auto" w:fill="FFFFFF"/>
-        </w:rPr>
-        <w:t xml:space="preserve"> </w:t>
-      </w:r>
-      <w:r>
-        <w:rPr>
-          <w:rFonts w:ascii="Times New Roman" w:hAnsi="Times New Roman" w:cs="Times New Roman"/>
-          <w:i/>
-          <w:iCs/>
-          <w:color w:val="273540"/>
-          <w:highlight w:val="yellow"/>
-          <w:shd w:val="clear" w:color="auto" w:fill="FFFFFF"/>
-        </w:rPr>
-        <w:t>in addition to the main plot</w:t>
-      </w:r>
-      <w:r>
-        <w:rPr>
-          <w:rFonts w:ascii="Times New Roman" w:hAnsi="Times New Roman" w:cs="Times New Roman"/>
-          <w:i/>
-          <w:iCs/>
-          <w:color w:val="273540"/>
-          <w:highlight w:val="yellow"/>
-        </w:rPr>
-        <w:t>.</w:t>
-      </w:r>
-    </w:p>
-    <w:p>
-      <w:pPr>
-        <w:pStyle w:val="ListParagraph"/>
-        <w:numPr>
-          <w:ilvl w:val="0"/>
-          <w:numId w:val="23"/>
-        </w:numPr>
-        <w:ind w:left="1800"/>
-        <w:rPr>
-          <w:rFonts w:ascii="Times New Roman" w:eastAsia="Times New Roman" w:hAnsi="Times New Roman" w:cs="Times New Roman"/>
-          <w:i/>
-          <w:highlight w:val="yellow"/>
-        </w:rPr>
-      </w:pPr>
-      <w:r>
-        <w:rPr>
-          <w:rFonts w:ascii="Times New Roman" w:eastAsia="Times New Roman" w:hAnsi="Times New Roman" w:cs="Times New Roman"/>
-          <w:i/>
-          <w:highlight w:val="yellow"/>
-        </w:rPr>
-        <w:t>A</w:t>
-      </w:r>
-      <w:r>
-        <w:rPr>
-          <w:rFonts w:ascii="Times New Roman" w:eastAsia="Times New Roman" w:hAnsi="Times New Roman" w:cs="Times New Roman"/>
-          <w:i/>
-          <w:highlight w:val="yellow"/>
-        </w:rPr>
-        <w:t>nything on the plot from R is not counted towards word count limit</w:t>
-      </w:r>
-      <w:r>
-        <w:rPr>
-          <w:rFonts w:ascii="Times New Roman" w:eastAsia="Times New Roman" w:hAnsi="Times New Roman" w:cs="Times New Roman"/>
-          <w:i/>
-          <w:highlight w:val="yellow"/>
-        </w:rPr>
-        <w:t xml:space="preserve"> (e.g. legend, axes titles, name). </w:t>
-      </w:r>
-    </w:p>
-    <w:p>
-      <w:pPr>
-        <w:pStyle w:val="ListParagraph"/>
-        <w:numPr>
-          <w:ilvl w:val="0"/>
-          <w:numId w:val="23"/>
-        </w:numPr>
-        <w:ind w:left="1800"/>
-        <w:rPr>
-          <w:rFonts w:ascii="Times New Roman" w:eastAsia="Times New Roman" w:hAnsi="Times New Roman" w:cs="Times New Roman"/>
-          <w:i/>
-          <w:highlight w:val="yellow"/>
-        </w:rPr>
-      </w:pPr>
-      <w:r>
-        <w:rPr>
-          <w:rFonts w:ascii="Times New Roman" w:eastAsia="Times New Roman" w:hAnsi="Times New Roman" w:cs="Times New Roman"/>
-          <w:i/>
-          <w:highlight w:val="yellow"/>
-        </w:rPr>
-        <w:t xml:space="preserve">Make sure that the plot </w:t>
-      </w:r>
-      <w:r>
-        <w:rPr>
-          <w:rFonts w:ascii="Times New Roman" w:eastAsia="Times New Roman" w:hAnsi="Times New Roman" w:cs="Times New Roman"/>
-          <w:i/>
-          <w:highlight w:val="yellow"/>
-        </w:rPr>
-        <w:t xml:space="preserve">is </w:t>
-      </w:r>
-      <w:r>
-        <w:rPr>
-          <w:rFonts w:ascii="Times New Roman" w:eastAsia="Times New Roman" w:hAnsi="Times New Roman" w:cs="Times New Roman"/>
-          <w:i/>
-          <w:highlight w:val="yellow"/>
-        </w:rPr>
-        <w:t>from output of an R script (NOT a screenshot</w:t>
-      </w:r>
-      <w:r>
-        <w:rPr>
-          <w:rFonts w:ascii="Times New Roman" w:eastAsia="Times New Roman" w:hAnsi="Times New Roman" w:cs="Times New Roman"/>
-          <w:i/>
-          <w:highlight w:val="yellow"/>
-        </w:rPr>
-        <w:t>)</w:t>
-      </w:r>
-      <w:r>
-        <w:rPr>
-          <w:rFonts w:ascii="Times New Roman" w:eastAsia="Times New Roman" w:hAnsi="Times New Roman" w:cs="Times New Roman"/>
-          <w:i/>
-          <w:highlight w:val="yellow"/>
-        </w:rPr>
-        <w:t>.</w:t>
-      </w:r>
-    </w:p>
-    <w:p>
-      <w:pPr>
-        <w:pStyle w:val="ListParagraph"/>
-        <w:numPr>
-          <w:ilvl w:val="0"/>
-          <w:numId w:val="23"/>
-        </w:numPr>
-        <w:ind w:left="1800"/>
-        <w:rPr>
-          <w:rFonts w:ascii="Times New Roman" w:eastAsia="Times New Roman" w:hAnsi="Times New Roman" w:cs="Times New Roman"/>
-          <w:i/>
-          <w:highlight w:val="yellow"/>
-        </w:rPr>
-      </w:pPr>
-      <w:r>
-        <w:rPr>
-          <w:rFonts w:ascii="Times New Roman" w:eastAsia="Times New Roman" w:hAnsi="Times New Roman" w:cs="Times New Roman"/>
-          <w:i/>
-          <w:highlight w:val="yellow"/>
-        </w:rPr>
-        <w:t xml:space="preserve">Make sure that the </w:t>
-      </w:r>
-      <w:r>
-        <w:rPr>
-          <w:rFonts w:ascii="Times New Roman" w:eastAsia="Times New Roman" w:hAnsi="Times New Roman" w:cs="Times New Roman"/>
-          <w:i/>
-          <w:highlight w:val="yellow"/>
-        </w:rPr>
-        <w:t>plot</w:t>
-      </w:r>
-      <w:r>
-        <w:rPr>
-          <w:rFonts w:ascii="Times New Roman" w:eastAsia="Times New Roman" w:hAnsi="Times New Roman" w:cs="Times New Roman"/>
-          <w:i/>
-          <w:highlight w:val="yellow"/>
-        </w:rPr>
-        <w:t xml:space="preserve"> </w:t>
-      </w:r>
-      <w:r>
-        <w:rPr>
-          <w:rFonts w:ascii="Times New Roman" w:eastAsia="Times New Roman" w:hAnsi="Times New Roman" w:cs="Times New Roman"/>
-          <w:i/>
-          <w:highlight w:val="yellow"/>
-        </w:rPr>
-        <w:t>has</w:t>
-      </w:r>
-      <w:r>
-        <w:rPr>
-          <w:rFonts w:ascii="Times New Roman" w:eastAsia="Times New Roman" w:hAnsi="Times New Roman" w:cs="Times New Roman"/>
-          <w:i/>
-          <w:highlight w:val="yellow"/>
-        </w:rPr>
-        <w:t xml:space="preserve"> a caption or title, X and Y-axis labels</w:t>
-      </w:r>
-      <w:r>
-        <w:rPr>
-          <w:rFonts w:ascii="Times New Roman" w:eastAsia="Times New Roman" w:hAnsi="Times New Roman" w:cs="Times New Roman"/>
-          <w:i/>
-          <w:highlight w:val="yellow"/>
-        </w:rPr>
-        <w:t xml:space="preserve"> with units where appropriate</w:t>
-      </w:r>
-      <w:r>
-        <w:rPr>
-          <w:rFonts w:ascii="Times New Roman" w:eastAsia="Times New Roman" w:hAnsi="Times New Roman" w:cs="Times New Roman"/>
-          <w:i/>
-          <w:highlight w:val="yellow"/>
-        </w:rPr>
-        <w:t>,</w:t>
-      </w:r>
-      <w:r>
-        <w:rPr>
-          <w:rFonts w:ascii="Times New Roman" w:eastAsia="Times New Roman" w:hAnsi="Times New Roman" w:cs="Times New Roman"/>
-          <w:i/>
-          <w:highlight w:val="yellow"/>
-        </w:rPr>
-        <w:t xml:space="preserve"> and legend</w:t>
-      </w:r>
-      <w:r>
-        <w:rPr>
-          <w:rFonts w:ascii="Times New Roman" w:eastAsia="Times New Roman" w:hAnsi="Times New Roman" w:cs="Times New Roman"/>
-          <w:i/>
-          <w:highlight w:val="yellow"/>
-        </w:rPr>
-        <w:t>.</w:t>
-      </w:r>
-    </w:p>
-    <w:p>
-      <w:pPr>
-        <w:pStyle w:val="ListParagraph"/>
-        <w:numPr>
-          <w:ilvl w:val="0"/>
-          <w:numId w:val="23"/>
-        </w:numPr>
-        <w:ind w:left="1800"/>
-        <w:rPr>
-          <w:rFonts w:ascii="Times New Roman" w:eastAsia="Times New Roman" w:hAnsi="Times New Roman" w:cs="Times New Roman"/>
-          <w:i/>
-          <w:highlight w:val="yellow"/>
-        </w:rPr>
-      </w:pPr>
-      <w:r>
-        <w:rPr>
-          <w:rFonts w:ascii="Times New Roman" w:eastAsia="Times New Roman" w:hAnsi="Times New Roman" w:cs="Times New Roman"/>
-          <w:i/>
-          <w:highlight w:val="yellow"/>
-        </w:rPr>
-        <w:lastRenderedPageBreak/>
-        <w:t>Make sure the title or caption and axis labels</w:t>
-      </w:r>
-      <w:r>
-        <w:rPr>
-          <w:rFonts w:ascii="Times New Roman" w:eastAsia="Times New Roman" w:hAnsi="Times New Roman" w:cs="Times New Roman"/>
-          <w:i/>
-          <w:highlight w:val="yellow"/>
-        </w:rPr>
-        <w:t xml:space="preserve"> are</w:t>
-      </w:r>
-      <w:r>
-        <w:rPr>
-          <w:rFonts w:ascii="Times New Roman" w:eastAsia="Times New Roman" w:hAnsi="Times New Roman" w:cs="Times New Roman"/>
-          <w:i/>
-          <w:highlight w:val="yellow"/>
-        </w:rPr>
-        <w:t xml:space="preserve"> informative</w:t>
-      </w:r>
-      <w:r>
-        <w:rPr>
-          <w:rFonts w:ascii="Times New Roman" w:eastAsia="Times New Roman" w:hAnsi="Times New Roman" w:cs="Times New Roman"/>
-          <w:i/>
-          <w:highlight w:val="yellow"/>
-        </w:rPr>
-        <w:t xml:space="preserve"> and written in English</w:t>
-      </w:r>
-      <w:r>
-        <w:rPr>
-          <w:rFonts w:ascii="Times New Roman" w:eastAsia="Times New Roman" w:hAnsi="Times New Roman" w:cs="Times New Roman"/>
-          <w:i/>
-          <w:highlight w:val="yellow"/>
-        </w:rPr>
-        <w:t>.</w:t>
-      </w:r>
-    </w:p>
-    <w:p>
-      <w:pPr>
-        <w:pStyle w:val="ListParagraph"/>
-        <w:rPr>
-          <w:rFonts w:ascii="Times New Roman" w:eastAsia="Times New Roman" w:hAnsi="Times New Roman" w:cs="Times New Roman"/>
-          <w:i/>
-          <w:iCs/>
+          <w:b/>
+          <w:bCs/>
+        </w:rPr>
+        <w:t>Figure 1: Scatter plot showing the relationship between alcohol consumption per capita (litres) and life expectancy (years) across countries, with fitted regression line</w:t>
+      </w:r>
+    </w:p>
+    <w:p>
+      <w:pPr>
+        <w:rPr>
+          <w:rFonts w:ascii="Times New Roman" w:eastAsia="Times New Roman" w:hAnsi="Times New Roman" w:cs="Times New Roman"/>
+        </w:rPr>
+      </w:pPr>
+    </w:p>
+    <w:p>
+      <w:pPr>
+        <w:rPr>
+          <w:rFonts w:ascii="Times New Roman" w:eastAsia="Times New Roman" w:hAnsi="Times New Roman" w:cs="Times New Roman"/>
+        </w:rPr>
+      </w:pPr>
+      <w:r>
+        <w:rPr>
+          <w:noProof/>
+        </w:rPr>
+        <w:drawing>
+          <wp:inline distT="0" distB="0" distL="0" distR="0" wp14:anchorId="212D7BA4" wp14:editId="5D078A36">
+            <wp:extent cx="5331542" cy="3294852"/>
+            <wp:effectExtent l="0" t="0" r="2540" b="1270"/>
+            <wp:docPr id="519426935" name="Picture 1"/>
+            <wp:cNvGraphicFramePr>
+              <a:graphicFrameLocks xmlns:a="http://schemas.openxmlformats.org/drawingml/2006/main" noChangeAspect="1"/>
+            </wp:cNvGraphicFramePr>
+            <a:graphic xmlns:a="http://schemas.openxmlformats.org/drawingml/2006/main">
+              <a:graphicData uri="http://schemas.openxmlformats.org/drawingml/2006/picture">
+                <pic:pic xmlns:pic="http://schemas.openxmlformats.org/drawingml/2006/picture">
+                  <pic:nvPicPr>
+                    <pic:cNvPr id="0" name="Picture 1"/>
+                    <pic:cNvPicPr>
+                      <a:picLocks noChangeAspect="1" noChangeArrowheads="1"/>
+                    </pic:cNvPicPr>
+                  </pic:nvPicPr>
+                  <pic:blipFill>
+                    <a:blip r:embed="rId10">
+                      <a:extLst>
+                        <a:ext uri="{28A0092B-C50C-407E-A947-70E740481C1C}">
+                          <a14:useLocalDpi xmlns:a14="http://schemas.microsoft.com/office/drawing/2010/main" val="0"/>
+                        </a:ext>
+                      </a:extLst>
+                    </a:blip>
+                    <a:srcRect/>
+                    <a:stretch>
+                      <a:fillRect/>
+                    </a:stretch>
+                  </pic:blipFill>
+                  <pic:spPr bwMode="auto">
+                    <a:xfrm>
+                      <a:off x="0" y="0"/>
+                      <a:ext cx="5341108" cy="3300764"/>
+                    </a:xfrm>
+                    <a:prstGeom prst="rect">
+                      <a:avLst/>
+                    </a:prstGeom>
+                    <a:noFill/>
+                    <a:ln>
+                      <a:noFill/>
+                    </a:ln>
+                  </pic:spPr>
+                </pic:pic>
+              </a:graphicData>
+            </a:graphic>
+          </wp:inline>
+        </w:drawing>
+      </w:r>
+    </w:p>
+    <w:p>
+      <w:pPr>
+        <w:rPr>
+          <w:rFonts w:ascii="Times New Roman" w:eastAsia="Times New Roman" w:hAnsi="Times New Roman" w:cs="Times New Roman"/>
+        </w:rPr>
+      </w:pPr>
+    </w:p>
+    <w:p>
+      <w:pPr>
+        <w:rPr>
+          <w:rFonts w:ascii="Times New Roman" w:eastAsia="Times New Roman" w:hAnsi="Times New Roman" w:cs="Times New Roman"/>
+          <w:b/>
+          <w:bCs/>
+        </w:rPr>
+      </w:pPr>
+      <w:r>
+        <w:rPr>
+          <w:rFonts w:ascii="Times New Roman" w:eastAsia="Times New Roman" w:hAnsi="Times New Roman" w:cs="Times New Roman"/>
+          <w:b/>
+          <w:bCs/>
+        </w:rPr>
+        <w:t xml:space="preserve">Figure 2: </w:t>
+      </w:r>
+      <w:r>
+        <w:rPr>
+          <w:rFonts w:ascii="Times New Roman" w:eastAsia="Times New Roman" w:hAnsi="Times New Roman" w:cs="Times New Roman"/>
+          <w:b/>
+          <w:bCs/>
+        </w:rPr>
+        <w:t>Histogram of Life Expectancy</w:t>
+      </w:r>
+    </w:p>
+    <w:p>
+      <w:pPr>
+        <w:rPr>
+          <w:rFonts w:ascii="Times New Roman" w:eastAsia="Times New Roman" w:hAnsi="Times New Roman" w:cs="Times New Roman"/>
+          <w:b/>
+          <w:bCs/>
+        </w:rPr>
+      </w:pPr>
+    </w:p>
+    <w:p>
+      <w:pPr>
+        <w:rPr>
+          <w:rFonts w:ascii="Times New Roman" w:eastAsia="Times New Roman" w:hAnsi="Times New Roman" w:cs="Times New Roman"/>
+          <w:b/>
+          <w:bCs/>
+        </w:rPr>
+      </w:pPr>
+      <w:r>
+        <w:rPr>
+          <w:noProof/>
+        </w:rPr>
+        <w:drawing>
+          <wp:inline distT="0" distB="0" distL="0" distR="0" wp14:anchorId="25DD1121" wp14:editId="3A4D7F17">
+            <wp:extent cx="5538019" cy="3422454"/>
+            <wp:effectExtent l="0" t="0" r="5715" b="6985"/>
+            <wp:docPr id="1750441869" name="Picture 2"/>
+            <wp:cNvGraphicFramePr>
+              <a:graphicFrameLocks xmlns:a="http://schemas.openxmlformats.org/drawingml/2006/main" noChangeAspect="1"/>
+            </wp:cNvGraphicFramePr>
+            <a:graphic xmlns:a="http://schemas.openxmlformats.org/drawingml/2006/main">
+              <a:graphicData uri="http://schemas.openxmlformats.org/drawingml/2006/picture">
+                <pic:pic xmlns:pic="http://schemas.openxmlformats.org/drawingml/2006/picture">
+                  <pic:nvPicPr>
+                    <pic:cNvPr id="0" name="Picture 3"/>
+                    <pic:cNvPicPr>
+                      <a:picLocks noChangeAspect="1" noChangeArrowheads="1"/>
+                    </pic:cNvPicPr>
+                  </pic:nvPicPr>
+                  <pic:blipFill>
+                    <a:blip r:embed="rId11">
+                      <a:extLst>
+                        <a:ext uri="{28A0092B-C50C-407E-A947-70E740481C1C}">
+                          <a14:useLocalDpi xmlns:a14="http://schemas.microsoft.com/office/drawing/2010/main" val="0"/>
+                        </a:ext>
+                      </a:extLst>
+                    </a:blip>
+                    <a:srcRect/>
+                    <a:stretch>
+                      <a:fillRect/>
+                    </a:stretch>
+                  </pic:blipFill>
+                  <pic:spPr bwMode="auto">
+                    <a:xfrm>
+                      <a:off x="0" y="0"/>
+                      <a:ext cx="5541228" cy="3424437"/>
+                    </a:xfrm>
+                    <a:prstGeom prst="rect">
+                      <a:avLst/>
+                    </a:prstGeom>
+                    <a:noFill/>
+                    <a:ln>
+                      <a:noFill/>
+                    </a:ln>
+                  </pic:spPr>
+                </pic:pic>
+              </a:graphicData>
+            </a:graphic>
+          </wp:inline>
+        </w:drawing>
+      </w:r>
+    </w:p>
+    <w:p>
+      <w:pPr>
+        <w:rPr>
+          <w:rFonts w:ascii="Times New Roman" w:eastAsia="Times New Roman" w:hAnsi="Times New Roman" w:cs="Times New Roman"/>
+        </w:rPr>
+      </w:pPr>
+    </w:p>
+    <w:p>
+      <w:pPr>
+        <w:rPr>
+          <w:rFonts w:ascii="Times New Roman" w:eastAsia="Times New Roman" w:hAnsi="Times New Roman" w:cs="Times New Roman"/>
+          <w:b/>
+          <w:bCs/>
+        </w:rPr>
+      </w:pPr>
+      <w:r>
+        <w:rPr>
+          <w:rFonts w:ascii="Times New Roman" w:eastAsia="Times New Roman" w:hAnsi="Times New Roman" w:cs="Times New Roman"/>
+          <w:b/>
+          <w:bCs/>
+        </w:rPr>
+        <w:t>Figure 3: Histogram for Alcohol Consumption</w:t>
+      </w:r>
+    </w:p>
+    <w:p>
+      <w:pPr>
+        <w:rPr>
+          <w:rFonts w:ascii="Times New Roman" w:eastAsia="Times New Roman" w:hAnsi="Times New Roman" w:cs="Times New Roman"/>
+          <w:b/>
+          <w:bCs/>
+        </w:rPr>
+      </w:pPr>
+    </w:p>
+    <w:p>
+      <w:pPr>
+        <w:rPr>
+          <w:rFonts w:ascii="Times New Roman" w:eastAsia="Times New Roman" w:hAnsi="Times New Roman" w:cs="Times New Roman"/>
+          <w:b/>
+          <w:bCs/>
+        </w:rPr>
+      </w:pPr>
+      <w:r>
+        <w:rPr>
+          <w:noProof/>
+        </w:rPr>
+        <w:drawing>
+          <wp:inline distT="0" distB="0" distL="0" distR="0" wp14:anchorId="55C33D89" wp14:editId="695E2EF8">
+            <wp:extent cx="5375787" cy="3322196"/>
+            <wp:effectExtent l="0" t="0" r="0" b="0"/>
+            <wp:docPr id="1411978071" name="Picture 3"/>
+            <wp:cNvGraphicFramePr>
+              <a:graphicFrameLocks xmlns:a="http://schemas.openxmlformats.org/drawingml/2006/main" noChangeAspect="1"/>
+            </wp:cNvGraphicFramePr>
+            <a:graphic xmlns:a="http://schemas.openxmlformats.org/drawingml/2006/main">
+              <a:graphicData uri="http://schemas.openxmlformats.org/drawingml/2006/picture">
+                <pic:pic xmlns:pic="http://schemas.openxmlformats.org/drawingml/2006/picture">
+                  <pic:nvPicPr>
+                    <pic:cNvPr id="0" name="Picture 5"/>
+                    <pic:cNvPicPr>
+                      <a:picLocks noChangeAspect="1" noChangeArrowheads="1"/>
+                    </pic:cNvPicPr>
+                  </pic:nvPicPr>
+                  <pic:blipFill>
+                    <a:blip r:embed="rId12">
+                      <a:extLst>
+                        <a:ext uri="{28A0092B-C50C-407E-A947-70E740481C1C}">
+                          <a14:useLocalDpi xmlns:a14="http://schemas.microsoft.com/office/drawing/2010/main" val="0"/>
+                        </a:ext>
+                      </a:extLst>
+                    </a:blip>
+                    <a:srcRect/>
+                    <a:stretch>
+                      <a:fillRect/>
+                    </a:stretch>
+                  </pic:blipFill>
+                  <pic:spPr bwMode="auto">
+                    <a:xfrm>
+                      <a:off x="0" y="0"/>
+                      <a:ext cx="5380454" cy="3325080"/>
+                    </a:xfrm>
+                    <a:prstGeom prst="rect">
+                      <a:avLst/>
+                    </a:prstGeom>
+                    <a:noFill/>
+                    <a:ln>
+                      <a:noFill/>
+                    </a:ln>
+                  </pic:spPr>
+                </pic:pic>
+              </a:graphicData>
+            </a:graphic>
+          </wp:inline>
+        </w:drawing>
+      </w:r>
+    </w:p>
+    <w:p>
+      <w:pPr>
+        <w:rPr>
+          <w:rFonts w:ascii="Times New Roman" w:eastAsia="Times New Roman" w:hAnsi="Times New Roman" w:cs="Times New Roman"/>
         </w:rPr>
       </w:pPr>
     </w:p>
@@ -3071,6 +3050,7 @@
                 <w:lang w:val="en-IN" w:eastAsia="ko-KR"/>
                 <w14:ligatures w14:val="none"/>
               </w:rPr>
+              <w:lastRenderedPageBreak/>
               <w:t xml:space="preserve">&gt; </w:t>
             </w:r>
           </w:p>
@@ -4395,6 +4375,7 @@
           <w:iCs/>
           <w:highlight w:val="yellow"/>
         </w:rPr>
+        <w:lastRenderedPageBreak/>
         <w:t>Commit Message:</w:t>
       </w:r>
       <w:r>
@@ -5207,6 +5188,7 @@
               <w:rPr>
                 <w:rFonts w:ascii="Times New Roman" w:eastAsia="Times New Roman" w:hAnsi="Times New Roman" w:cs="Times New Roman"/>
               </w:rPr>
+              <w:lastRenderedPageBreak/>
               <w:t># ============================================================================</w:t>
             </w:r>
           </w:p>
@@ -5895,10 +5877,67 @@
                 <w:rFonts w:ascii="Times New Roman" w:eastAsia="Times New Roman" w:hAnsi="Times New Roman" w:cs="Times New Roman"/>
               </w:rPr>
             </w:pPr>
-            <w:r>
-              <w:rPr>
-                <w:rFonts w:ascii="Times New Roman" w:eastAsia="Times New Roman" w:hAnsi="Times New Roman" w:cs="Times New Roman"/>
-              </w:rPr>
+          </w:p>
+          <w:p>
+            <w:pPr>
+              <w:rPr>
+                <w:rFonts w:ascii="Times New Roman" w:eastAsia="Times New Roman" w:hAnsi="Times New Roman" w:cs="Times New Roman"/>
+              </w:rPr>
+            </w:pPr>
+          </w:p>
+          <w:p>
+            <w:pPr>
+              <w:rPr>
+                <w:rFonts w:ascii="Times New Roman" w:eastAsia="Times New Roman" w:hAnsi="Times New Roman" w:cs="Times New Roman"/>
+              </w:rPr>
+            </w:pPr>
+          </w:p>
+          <w:p>
+            <w:pPr>
+              <w:rPr>
+                <w:rFonts w:ascii="Times New Roman" w:eastAsia="Times New Roman" w:hAnsi="Times New Roman" w:cs="Times New Roman"/>
+              </w:rPr>
+            </w:pPr>
+          </w:p>
+          <w:p>
+            <w:pPr>
+              <w:rPr>
+                <w:rFonts w:ascii="Times New Roman" w:eastAsia="Times New Roman" w:hAnsi="Times New Roman" w:cs="Times New Roman"/>
+              </w:rPr>
+            </w:pPr>
+          </w:p>
+          <w:p>
+            <w:pPr>
+              <w:rPr>
+                <w:rFonts w:ascii="Times New Roman" w:eastAsia="Times New Roman" w:hAnsi="Times New Roman" w:cs="Times New Roman"/>
+              </w:rPr>
+            </w:pPr>
+          </w:p>
+          <w:p>
+            <w:pPr>
+              <w:rPr>
+                <w:rFonts w:ascii="Times New Roman" w:eastAsia="Times New Roman" w:hAnsi="Times New Roman" w:cs="Times New Roman"/>
+              </w:rPr>
+            </w:pPr>
+          </w:p>
+          <w:p>
+            <w:pPr>
+              <w:rPr>
+                <w:rFonts w:ascii="Times New Roman" w:eastAsia="Times New Roman" w:hAnsi="Times New Roman" w:cs="Times New Roman"/>
+              </w:rPr>
+            </w:pPr>
+          </w:p>
+          <w:p>
+            <w:pPr>
+              <w:rPr>
+                <w:rFonts w:ascii="Times New Roman" w:eastAsia="Times New Roman" w:hAnsi="Times New Roman" w:cs="Times New Roman"/>
+              </w:rPr>
+            </w:pPr>
+            <w:r>
+              <w:rPr>
+                <w:rFonts w:ascii="Times New Roman" w:eastAsia="Times New Roman" w:hAnsi="Times New Roman" w:cs="Times New Roman"/>
+              </w:rPr>
+              <w:lastRenderedPageBreak/>
               <w:t># ============================================================================</w:t>
             </w:r>
           </w:p>
@@ -6390,55 +6429,6 @@
                 <w:rFonts w:ascii="Times New Roman" w:eastAsia="Times New Roman" w:hAnsi="Times New Roman" w:cs="Times New Roman"/>
               </w:rPr>
             </w:pPr>
-          </w:p>
-          <w:p>
-            <w:pPr>
-              <w:rPr>
-                <w:rFonts w:ascii="Times New Roman" w:eastAsia="Times New Roman" w:hAnsi="Times New Roman" w:cs="Times New Roman"/>
-              </w:rPr>
-            </w:pPr>
-          </w:p>
-          <w:p>
-            <w:pPr>
-              <w:rPr>
-                <w:rFonts w:ascii="Times New Roman" w:eastAsia="Times New Roman" w:hAnsi="Times New Roman" w:cs="Times New Roman"/>
-              </w:rPr>
-            </w:pPr>
-          </w:p>
-          <w:p>
-            <w:pPr>
-              <w:rPr>
-                <w:rFonts w:ascii="Times New Roman" w:eastAsia="Times New Roman" w:hAnsi="Times New Roman" w:cs="Times New Roman"/>
-              </w:rPr>
-            </w:pPr>
-          </w:p>
-          <w:p>
-            <w:pPr>
-              <w:rPr>
-                <w:rFonts w:ascii="Times New Roman" w:eastAsia="Times New Roman" w:hAnsi="Times New Roman" w:cs="Times New Roman"/>
-              </w:rPr>
-            </w:pPr>
-          </w:p>
-          <w:p>
-            <w:pPr>
-              <w:rPr>
-                <w:rFonts w:ascii="Times New Roman" w:eastAsia="Times New Roman" w:hAnsi="Times New Roman" w:cs="Times New Roman"/>
-              </w:rPr>
-            </w:pPr>
-          </w:p>
-          <w:p>
-            <w:pPr>
-              <w:rPr>
-                <w:rFonts w:ascii="Times New Roman" w:eastAsia="Times New Roman" w:hAnsi="Times New Roman" w:cs="Times New Roman"/>
-              </w:rPr>
-            </w:pPr>
-          </w:p>
-          <w:p>
-            <w:pPr>
-              <w:rPr>
-                <w:rFonts w:ascii="Times New Roman" w:eastAsia="Times New Roman" w:hAnsi="Times New Roman" w:cs="Times New Roman"/>
-              </w:rPr>
-            </w:pPr>
             <w:r>
               <w:rPr>
                 <w:rFonts w:ascii="Times New Roman" w:eastAsia="Times New Roman" w:hAnsi="Times New Roman" w:cs="Times New Roman"/>
@@ -6922,6 +6912,7 @@
               <w:rPr>
                 <w:rFonts w:ascii="Times New Roman" w:eastAsia="Times New Roman" w:hAnsi="Times New Roman" w:cs="Times New Roman"/>
               </w:rPr>
+              <w:lastRenderedPageBreak/>
               <w:t xml:space="preserve">         </w:t>
             </w:r>
             <w:proofErr w:type="spellStart"/>
@@ -8031,6 +8022,48 @@
                 <w:rFonts w:ascii="Times New Roman" w:eastAsia="Times New Roman" w:hAnsi="Times New Roman" w:cs="Times New Roman"/>
               </w:rPr>
             </w:pPr>
+          </w:p>
+          <w:p>
+            <w:pPr>
+              <w:rPr>
+                <w:rFonts w:ascii="Times New Roman" w:eastAsia="Times New Roman" w:hAnsi="Times New Roman" w:cs="Times New Roman"/>
+              </w:rPr>
+            </w:pPr>
+          </w:p>
+          <w:p>
+            <w:pPr>
+              <w:rPr>
+                <w:rFonts w:ascii="Times New Roman" w:eastAsia="Times New Roman" w:hAnsi="Times New Roman" w:cs="Times New Roman"/>
+              </w:rPr>
+            </w:pPr>
+          </w:p>
+          <w:p>
+            <w:pPr>
+              <w:rPr>
+                <w:rFonts w:ascii="Times New Roman" w:eastAsia="Times New Roman" w:hAnsi="Times New Roman" w:cs="Times New Roman"/>
+              </w:rPr>
+            </w:pPr>
+          </w:p>
+          <w:p>
+            <w:pPr>
+              <w:rPr>
+                <w:rFonts w:ascii="Times New Roman" w:eastAsia="Times New Roman" w:hAnsi="Times New Roman" w:cs="Times New Roman"/>
+              </w:rPr>
+            </w:pPr>
+          </w:p>
+          <w:p>
+            <w:pPr>
+              <w:rPr>
+                <w:rFonts w:ascii="Times New Roman" w:eastAsia="Times New Roman" w:hAnsi="Times New Roman" w:cs="Times New Roman"/>
+              </w:rPr>
+            </w:pPr>
+          </w:p>
+          <w:p>
+            <w:pPr>
+              <w:rPr>
+                <w:rFonts w:ascii="Times New Roman" w:eastAsia="Times New Roman" w:hAnsi="Times New Roman" w:cs="Times New Roman"/>
+              </w:rPr>
+            </w:pPr>
             <w:r>
               <w:rPr>
                 <w:rFonts w:ascii="Times New Roman" w:eastAsia="Times New Roman" w:hAnsi="Times New Roman" w:cs="Times New Roman"/>
@@ -8042,15 +8075,11 @@
             <w:pPr>
               <w:rPr>
                 <w:rFonts w:ascii="Times New Roman" w:eastAsia="Times New Roman" w:hAnsi="Times New Roman" w:cs="Times New Roman"/>
-                <w:b/>
-                <w:bCs/>
-              </w:rPr>
-            </w:pPr>
-            <w:r>
-              <w:rPr>
-                <w:rFonts w:ascii="Times New Roman" w:eastAsia="Times New Roman" w:hAnsi="Times New Roman" w:cs="Times New Roman"/>
-                <w:b/>
-                <w:bCs/>
+              </w:rPr>
+            </w:pPr>
+            <w:r>
+              <w:rPr>
+                <w:rFonts w:ascii="Times New Roman" w:eastAsia="Times New Roman" w:hAnsi="Times New Roman" w:cs="Times New Roman"/>
               </w:rPr>
               <w:t xml:space="preserve"># 5. VISUALIZATIONS </w:t>
             </w:r>
@@ -8109,6 +8138,13 @@
                 <w:rFonts w:ascii="Times New Roman" w:eastAsia="Times New Roman" w:hAnsi="Times New Roman" w:cs="Times New Roman"/>
               </w:rPr>
             </w:pPr>
+          </w:p>
+          <w:p>
+            <w:pPr>
+              <w:rPr>
+                <w:rFonts w:ascii="Times New Roman" w:eastAsia="Times New Roman" w:hAnsi="Times New Roman" w:cs="Times New Roman"/>
+              </w:rPr>
+            </w:pPr>
             <w:r>
               <w:rPr>
                 <w:rFonts w:ascii="Times New Roman" w:eastAsia="Times New Roman" w:hAnsi="Times New Roman" w:cs="Times New Roman"/>
@@ -8126,7 +8162,7 @@
               <w:rPr>
                 <w:rFonts w:ascii="Times New Roman" w:eastAsia="Times New Roman" w:hAnsi="Times New Roman" w:cs="Times New Roman"/>
               </w:rPr>
-              <w:t># Visualization 1: Histogram of Alcohol Consumption</w:t>
+              <w:t># Visualization 1: Scatter Plot with regression line</w:t>
             </w:r>
           </w:p>
           <w:p>
@@ -8155,12 +8191,54 @@
                 <w:rFonts w:ascii="Times New Roman" w:eastAsia="Times New Roman" w:hAnsi="Times New Roman" w:cs="Times New Roman"/>
               </w:rPr>
             </w:pPr>
+          </w:p>
+          <w:p>
+            <w:pPr>
+              <w:rPr>
+                <w:rFonts w:ascii="Times New Roman" w:eastAsia="Times New Roman" w:hAnsi="Times New Roman" w:cs="Times New Roman"/>
+              </w:rPr>
+            </w:pPr>
+            <w:r>
+              <w:rPr>
+                <w:rFonts w:ascii="Times New Roman" w:eastAsia="Times New Roman" w:hAnsi="Times New Roman" w:cs="Times New Roman"/>
+              </w:rPr>
+              <w:t># Scatter plot with regression line</w:t>
+            </w:r>
+          </w:p>
+          <w:p>
+            <w:pPr>
+              <w:rPr>
+                <w:rFonts w:ascii="Times New Roman" w:eastAsia="Times New Roman" w:hAnsi="Times New Roman" w:cs="Times New Roman"/>
+              </w:rPr>
+            </w:pPr>
+            <w:proofErr w:type="spellStart"/>
+            <w:r>
+              <w:rPr>
+                <w:rFonts w:ascii="Times New Roman" w:eastAsia="Times New Roman" w:hAnsi="Times New Roman" w:cs="Times New Roman"/>
+              </w:rPr>
+              <w:t>scatter_plot</w:t>
+            </w:r>
+            <w:proofErr w:type="spellEnd"/>
+            <w:r>
+              <w:rPr>
+                <w:rFonts w:ascii="Times New Roman" w:eastAsia="Times New Roman" w:hAnsi="Times New Roman" w:cs="Times New Roman"/>
+              </w:rPr>
+              <w:t xml:space="preserve"> &lt;- </w:t>
+            </w:r>
+            <w:proofErr w:type="spellStart"/>
             <w:proofErr w:type="gramStart"/>
             <w:r>
               <w:rPr>
                 <w:rFonts w:ascii="Times New Roman" w:eastAsia="Times New Roman" w:hAnsi="Times New Roman" w:cs="Times New Roman"/>
               </w:rPr>
-              <w:t>hist(</w:t>
+              <w:t>ggplot</w:t>
+            </w:r>
+            <w:proofErr w:type="spellEnd"/>
+            <w:r>
+              <w:rPr>
+                <w:rFonts w:ascii="Times New Roman" w:eastAsia="Times New Roman" w:hAnsi="Times New Roman" w:cs="Times New Roman"/>
+              </w:rPr>
+              <w:t>(</w:t>
             </w:r>
             <w:proofErr w:type="spellStart"/>
             <w:proofErr w:type="gramEnd"/>
@@ -8168,6 +8246,502 @@
               <w:rPr>
                 <w:rFonts w:ascii="Times New Roman" w:eastAsia="Times New Roman" w:hAnsi="Times New Roman" w:cs="Times New Roman"/>
               </w:rPr>
+              <w:t>data_clean</w:t>
+            </w:r>
+            <w:proofErr w:type="spellEnd"/>
+            <w:r>
+              <w:rPr>
+                <w:rFonts w:ascii="Times New Roman" w:eastAsia="Times New Roman" w:hAnsi="Times New Roman" w:cs="Times New Roman"/>
+              </w:rPr>
+              <w:t xml:space="preserve">, </w:t>
+            </w:r>
+            <w:proofErr w:type="spellStart"/>
+            <w:proofErr w:type="gramStart"/>
+            <w:r>
+              <w:rPr>
+                <w:rFonts w:ascii="Times New Roman" w:eastAsia="Times New Roman" w:hAnsi="Times New Roman" w:cs="Times New Roman"/>
+              </w:rPr>
+              <w:t>aes</w:t>
+            </w:r>
+            <w:proofErr w:type="spellEnd"/>
+            <w:r>
+              <w:rPr>
+                <w:rFonts w:ascii="Times New Roman" w:eastAsia="Times New Roman" w:hAnsi="Times New Roman" w:cs="Times New Roman"/>
+              </w:rPr>
+              <w:t>(</w:t>
+            </w:r>
+            <w:proofErr w:type="gramEnd"/>
+            <w:r>
+              <w:rPr>
+                <w:rFonts w:ascii="Times New Roman" w:eastAsia="Times New Roman" w:hAnsi="Times New Roman" w:cs="Times New Roman"/>
+              </w:rPr>
+              <w:t xml:space="preserve">x = </w:t>
+            </w:r>
+            <w:proofErr w:type="spellStart"/>
+            <w:r>
+              <w:rPr>
+                <w:rFonts w:ascii="Times New Roman" w:eastAsia="Times New Roman" w:hAnsi="Times New Roman" w:cs="Times New Roman"/>
+              </w:rPr>
+              <w:t>Alcohol_Consumption</w:t>
+            </w:r>
+            <w:proofErr w:type="spellEnd"/>
+            <w:r>
+              <w:rPr>
+                <w:rFonts w:ascii="Times New Roman" w:eastAsia="Times New Roman" w:hAnsi="Times New Roman" w:cs="Times New Roman"/>
+              </w:rPr>
+              <w:t xml:space="preserve">, y = </w:t>
+            </w:r>
+            <w:proofErr w:type="spellStart"/>
+            <w:r>
+              <w:rPr>
+                <w:rFonts w:ascii="Times New Roman" w:eastAsia="Times New Roman" w:hAnsi="Times New Roman" w:cs="Times New Roman"/>
+              </w:rPr>
+              <w:t>Life_Expectancy</w:t>
+            </w:r>
+            <w:proofErr w:type="spellEnd"/>
+            <w:r>
+              <w:rPr>
+                <w:rFonts w:ascii="Times New Roman" w:eastAsia="Times New Roman" w:hAnsi="Times New Roman" w:cs="Times New Roman"/>
+              </w:rPr>
+              <w:t>)) +</w:t>
+            </w:r>
+          </w:p>
+          <w:p>
+            <w:pPr>
+              <w:rPr>
+                <w:rFonts w:ascii="Times New Roman" w:eastAsia="Times New Roman" w:hAnsi="Times New Roman" w:cs="Times New Roman"/>
+              </w:rPr>
+            </w:pPr>
+            <w:r>
+              <w:rPr>
+                <w:rFonts w:ascii="Times New Roman" w:eastAsia="Times New Roman" w:hAnsi="Times New Roman" w:cs="Times New Roman"/>
+              </w:rPr>
+              <w:t xml:space="preserve">  </w:t>
+            </w:r>
+            <w:proofErr w:type="spellStart"/>
+            <w:r>
+              <w:rPr>
+                <w:rFonts w:ascii="Times New Roman" w:eastAsia="Times New Roman" w:hAnsi="Times New Roman" w:cs="Times New Roman"/>
+              </w:rPr>
+              <w:t>geom_</w:t>
+            </w:r>
+            <w:proofErr w:type="gramStart"/>
+            <w:r>
+              <w:rPr>
+                <w:rFonts w:ascii="Times New Roman" w:eastAsia="Times New Roman" w:hAnsi="Times New Roman" w:cs="Times New Roman"/>
+              </w:rPr>
+              <w:t>point</w:t>
+            </w:r>
+            <w:proofErr w:type="spellEnd"/>
+            <w:r>
+              <w:rPr>
+                <w:rFonts w:ascii="Times New Roman" w:eastAsia="Times New Roman" w:hAnsi="Times New Roman" w:cs="Times New Roman"/>
+              </w:rPr>
+              <w:t>(</w:t>
+            </w:r>
+            <w:proofErr w:type="gramEnd"/>
+            <w:r>
+              <w:rPr>
+                <w:rFonts w:ascii="Times New Roman" w:eastAsia="Times New Roman" w:hAnsi="Times New Roman" w:cs="Times New Roman"/>
+              </w:rPr>
+              <w:t xml:space="preserve">alpha = 0.6, size = 3, </w:t>
+            </w:r>
+            <w:proofErr w:type="spellStart"/>
+            <w:r>
+              <w:rPr>
+                <w:rFonts w:ascii="Times New Roman" w:eastAsia="Times New Roman" w:hAnsi="Times New Roman" w:cs="Times New Roman"/>
+              </w:rPr>
+              <w:t>color</w:t>
+            </w:r>
+            <w:proofErr w:type="spellEnd"/>
+            <w:r>
+              <w:rPr>
+                <w:rFonts w:ascii="Times New Roman" w:eastAsia="Times New Roman" w:hAnsi="Times New Roman" w:cs="Times New Roman"/>
+              </w:rPr>
+              <w:t xml:space="preserve"> = "</w:t>
+            </w:r>
+            <w:proofErr w:type="spellStart"/>
+            <w:r>
+              <w:rPr>
+                <w:rFonts w:ascii="Times New Roman" w:eastAsia="Times New Roman" w:hAnsi="Times New Roman" w:cs="Times New Roman"/>
+              </w:rPr>
+              <w:t>darkblue</w:t>
+            </w:r>
+            <w:proofErr w:type="spellEnd"/>
+            <w:r>
+              <w:rPr>
+                <w:rFonts w:ascii="Times New Roman" w:eastAsia="Times New Roman" w:hAnsi="Times New Roman" w:cs="Times New Roman"/>
+              </w:rPr>
+              <w:t>") +</w:t>
+            </w:r>
+          </w:p>
+          <w:p>
+            <w:pPr>
+              <w:rPr>
+                <w:rFonts w:ascii="Times New Roman" w:eastAsia="Times New Roman" w:hAnsi="Times New Roman" w:cs="Times New Roman"/>
+              </w:rPr>
+            </w:pPr>
+            <w:r>
+              <w:rPr>
+                <w:rFonts w:ascii="Times New Roman" w:eastAsia="Times New Roman" w:hAnsi="Times New Roman" w:cs="Times New Roman"/>
+              </w:rPr>
+              <w:t xml:space="preserve">  </w:t>
+            </w:r>
+            <w:proofErr w:type="spellStart"/>
+            <w:r>
+              <w:rPr>
+                <w:rFonts w:ascii="Times New Roman" w:eastAsia="Times New Roman" w:hAnsi="Times New Roman" w:cs="Times New Roman"/>
+              </w:rPr>
+              <w:t>geom_</w:t>
+            </w:r>
+            <w:proofErr w:type="gramStart"/>
+            <w:r>
+              <w:rPr>
+                <w:rFonts w:ascii="Times New Roman" w:eastAsia="Times New Roman" w:hAnsi="Times New Roman" w:cs="Times New Roman"/>
+              </w:rPr>
+              <w:t>smooth</w:t>
+            </w:r>
+            <w:proofErr w:type="spellEnd"/>
+            <w:r>
+              <w:rPr>
+                <w:rFonts w:ascii="Times New Roman" w:eastAsia="Times New Roman" w:hAnsi="Times New Roman" w:cs="Times New Roman"/>
+              </w:rPr>
+              <w:t>(</w:t>
+            </w:r>
+            <w:proofErr w:type="gramEnd"/>
+            <w:r>
+              <w:rPr>
+                <w:rFonts w:ascii="Times New Roman" w:eastAsia="Times New Roman" w:hAnsi="Times New Roman" w:cs="Times New Roman"/>
+              </w:rPr>
+              <w:t>method = "</w:t>
+            </w:r>
+            <w:proofErr w:type="spellStart"/>
+            <w:r>
+              <w:rPr>
+                <w:rFonts w:ascii="Times New Roman" w:eastAsia="Times New Roman" w:hAnsi="Times New Roman" w:cs="Times New Roman"/>
+              </w:rPr>
+              <w:t>lm</w:t>
+            </w:r>
+            <w:proofErr w:type="spellEnd"/>
+            <w:r>
+              <w:rPr>
+                <w:rFonts w:ascii="Times New Roman" w:eastAsia="Times New Roman" w:hAnsi="Times New Roman" w:cs="Times New Roman"/>
+              </w:rPr>
+              <w:t xml:space="preserve">", se = TRUE, </w:t>
+            </w:r>
+            <w:proofErr w:type="spellStart"/>
+            <w:r>
+              <w:rPr>
+                <w:rFonts w:ascii="Times New Roman" w:eastAsia="Times New Roman" w:hAnsi="Times New Roman" w:cs="Times New Roman"/>
+              </w:rPr>
+              <w:t>color</w:t>
+            </w:r>
+            <w:proofErr w:type="spellEnd"/>
+            <w:r>
+              <w:rPr>
+                <w:rFonts w:ascii="Times New Roman" w:eastAsia="Times New Roman" w:hAnsi="Times New Roman" w:cs="Times New Roman"/>
+              </w:rPr>
+              <w:t xml:space="preserve"> = "red", linewidth = 1) +</w:t>
+            </w:r>
+          </w:p>
+          <w:p>
+            <w:pPr>
+              <w:rPr>
+                <w:rFonts w:ascii="Times New Roman" w:eastAsia="Times New Roman" w:hAnsi="Times New Roman" w:cs="Times New Roman"/>
+              </w:rPr>
+            </w:pPr>
+            <w:r>
+              <w:rPr>
+                <w:rFonts w:ascii="Times New Roman" w:eastAsia="Times New Roman" w:hAnsi="Times New Roman" w:cs="Times New Roman"/>
+              </w:rPr>
+              <w:t xml:space="preserve">  </w:t>
+            </w:r>
+            <w:proofErr w:type="gramStart"/>
+            <w:r>
+              <w:rPr>
+                <w:rFonts w:ascii="Times New Roman" w:eastAsia="Times New Roman" w:hAnsi="Times New Roman" w:cs="Times New Roman"/>
+              </w:rPr>
+              <w:t>labs(</w:t>
+            </w:r>
+            <w:proofErr w:type="gramEnd"/>
+            <w:r>
+              <w:rPr>
+                <w:rFonts w:ascii="Times New Roman" w:eastAsia="Times New Roman" w:hAnsi="Times New Roman" w:cs="Times New Roman"/>
+              </w:rPr>
+              <w:t>title = "Relationship between Alcohol Consumption and Life Expectancy",</w:t>
+            </w:r>
+          </w:p>
+          <w:p>
+            <w:pPr>
+              <w:rPr>
+                <w:rFonts w:ascii="Times New Roman" w:eastAsia="Times New Roman" w:hAnsi="Times New Roman" w:cs="Times New Roman"/>
+              </w:rPr>
+            </w:pPr>
+            <w:r>
+              <w:rPr>
+                <w:rFonts w:ascii="Times New Roman" w:eastAsia="Times New Roman" w:hAnsi="Times New Roman" w:cs="Times New Roman"/>
+              </w:rPr>
+              <w:t xml:space="preserve">       x = "Alcohol Consumption per Capita (litres)",</w:t>
+            </w:r>
+          </w:p>
+          <w:p>
+            <w:pPr>
+              <w:rPr>
+                <w:rFonts w:ascii="Times New Roman" w:eastAsia="Times New Roman" w:hAnsi="Times New Roman" w:cs="Times New Roman"/>
+              </w:rPr>
+            </w:pPr>
+            <w:r>
+              <w:rPr>
+                <w:rFonts w:ascii="Times New Roman" w:eastAsia="Times New Roman" w:hAnsi="Times New Roman" w:cs="Times New Roman"/>
+              </w:rPr>
+              <w:t xml:space="preserve">       y = "Life Expectancy at Birth (years)") +</w:t>
+            </w:r>
+          </w:p>
+          <w:p>
+            <w:pPr>
+              <w:rPr>
+                <w:rFonts w:ascii="Times New Roman" w:eastAsia="Times New Roman" w:hAnsi="Times New Roman" w:cs="Times New Roman"/>
+              </w:rPr>
+            </w:pPr>
+            <w:r>
+              <w:rPr>
+                <w:rFonts w:ascii="Times New Roman" w:eastAsia="Times New Roman" w:hAnsi="Times New Roman" w:cs="Times New Roman"/>
+              </w:rPr>
+              <w:t xml:space="preserve">  </w:t>
+            </w:r>
+            <w:proofErr w:type="spellStart"/>
+            <w:r>
+              <w:rPr>
+                <w:rFonts w:ascii="Times New Roman" w:eastAsia="Times New Roman" w:hAnsi="Times New Roman" w:cs="Times New Roman"/>
+              </w:rPr>
+              <w:t>theme_</w:t>
+            </w:r>
+            <w:proofErr w:type="gramStart"/>
+            <w:r>
+              <w:rPr>
+                <w:rFonts w:ascii="Times New Roman" w:eastAsia="Times New Roman" w:hAnsi="Times New Roman" w:cs="Times New Roman"/>
+              </w:rPr>
+              <w:t>minimal</w:t>
+            </w:r>
+            <w:proofErr w:type="spellEnd"/>
+            <w:r>
+              <w:rPr>
+                <w:rFonts w:ascii="Times New Roman" w:eastAsia="Times New Roman" w:hAnsi="Times New Roman" w:cs="Times New Roman"/>
+              </w:rPr>
+              <w:t>(</w:t>
+            </w:r>
+            <w:proofErr w:type="gramEnd"/>
+            <w:r>
+              <w:rPr>
+                <w:rFonts w:ascii="Times New Roman" w:eastAsia="Times New Roman" w:hAnsi="Times New Roman" w:cs="Times New Roman"/>
+              </w:rPr>
+              <w:t>) +</w:t>
+            </w:r>
+          </w:p>
+          <w:p>
+            <w:pPr>
+              <w:rPr>
+                <w:rFonts w:ascii="Times New Roman" w:eastAsia="Times New Roman" w:hAnsi="Times New Roman" w:cs="Times New Roman"/>
+              </w:rPr>
+            </w:pPr>
+            <w:r>
+              <w:rPr>
+                <w:rFonts w:ascii="Times New Roman" w:eastAsia="Times New Roman" w:hAnsi="Times New Roman" w:cs="Times New Roman"/>
+              </w:rPr>
+              <w:t xml:space="preserve">  </w:t>
+            </w:r>
+            <w:proofErr w:type="gramStart"/>
+            <w:r>
+              <w:rPr>
+                <w:rFonts w:ascii="Times New Roman" w:eastAsia="Times New Roman" w:hAnsi="Times New Roman" w:cs="Times New Roman"/>
+              </w:rPr>
+              <w:t>theme(</w:t>
+            </w:r>
+            <w:proofErr w:type="spellStart"/>
+            <w:r>
+              <w:rPr>
+                <w:rFonts w:ascii="Times New Roman" w:eastAsia="Times New Roman" w:hAnsi="Times New Roman" w:cs="Times New Roman"/>
+              </w:rPr>
+              <w:t>plot.title</w:t>
+            </w:r>
+            <w:proofErr w:type="spellEnd"/>
+            <w:proofErr w:type="gramEnd"/>
+            <w:r>
+              <w:rPr>
+                <w:rFonts w:ascii="Times New Roman" w:eastAsia="Times New Roman" w:hAnsi="Times New Roman" w:cs="Times New Roman"/>
+              </w:rPr>
+              <w:t xml:space="preserve"> = </w:t>
+            </w:r>
+            <w:proofErr w:type="spellStart"/>
+            <w:r>
+              <w:rPr>
+                <w:rFonts w:ascii="Times New Roman" w:eastAsia="Times New Roman" w:hAnsi="Times New Roman" w:cs="Times New Roman"/>
+              </w:rPr>
+              <w:t>element_</w:t>
+            </w:r>
+            <w:proofErr w:type="gramStart"/>
+            <w:r>
+              <w:rPr>
+                <w:rFonts w:ascii="Times New Roman" w:eastAsia="Times New Roman" w:hAnsi="Times New Roman" w:cs="Times New Roman"/>
+              </w:rPr>
+              <w:t>text</w:t>
+            </w:r>
+            <w:proofErr w:type="spellEnd"/>
+            <w:r>
+              <w:rPr>
+                <w:rFonts w:ascii="Times New Roman" w:eastAsia="Times New Roman" w:hAnsi="Times New Roman" w:cs="Times New Roman"/>
+              </w:rPr>
+              <w:t>(</w:t>
+            </w:r>
+            <w:proofErr w:type="spellStart"/>
+            <w:proofErr w:type="gramEnd"/>
+            <w:r>
+              <w:rPr>
+                <w:rFonts w:ascii="Times New Roman" w:eastAsia="Times New Roman" w:hAnsi="Times New Roman" w:cs="Times New Roman"/>
+              </w:rPr>
+              <w:t>hjust</w:t>
+            </w:r>
+            <w:proofErr w:type="spellEnd"/>
+            <w:r>
+              <w:rPr>
+                <w:rFonts w:ascii="Times New Roman" w:eastAsia="Times New Roman" w:hAnsi="Times New Roman" w:cs="Times New Roman"/>
+              </w:rPr>
+              <w:t xml:space="preserve"> = 0.5, face = "bold"))</w:t>
+            </w:r>
+          </w:p>
+          <w:p>
+            <w:pPr>
+              <w:rPr>
+                <w:rFonts w:ascii="Times New Roman" w:eastAsia="Times New Roman" w:hAnsi="Times New Roman" w:cs="Times New Roman"/>
+              </w:rPr>
+            </w:pPr>
+          </w:p>
+          <w:p>
+            <w:pPr>
+              <w:rPr>
+                <w:rFonts w:ascii="Times New Roman" w:eastAsia="Times New Roman" w:hAnsi="Times New Roman" w:cs="Times New Roman"/>
+              </w:rPr>
+            </w:pPr>
+            <w:r>
+              <w:rPr>
+                <w:rFonts w:ascii="Times New Roman" w:eastAsia="Times New Roman" w:hAnsi="Times New Roman" w:cs="Times New Roman"/>
+              </w:rPr>
+              <w:t># Display plot</w:t>
+            </w:r>
+          </w:p>
+          <w:p>
+            <w:pPr>
+              <w:rPr>
+                <w:rFonts w:ascii="Times New Roman" w:eastAsia="Times New Roman" w:hAnsi="Times New Roman" w:cs="Times New Roman"/>
+              </w:rPr>
+            </w:pPr>
+            <w:r>
+              <w:rPr>
+                <w:rFonts w:ascii="Times New Roman" w:eastAsia="Times New Roman" w:hAnsi="Times New Roman" w:cs="Times New Roman"/>
+              </w:rPr>
+              <w:t>print(</w:t>
+            </w:r>
+            <w:proofErr w:type="spellStart"/>
+            <w:r>
+              <w:rPr>
+                <w:rFonts w:ascii="Times New Roman" w:eastAsia="Times New Roman" w:hAnsi="Times New Roman" w:cs="Times New Roman"/>
+              </w:rPr>
+              <w:t>scatter_plot</w:t>
+            </w:r>
+            <w:proofErr w:type="spellEnd"/>
+            <w:r>
+              <w:rPr>
+                <w:rFonts w:ascii="Times New Roman" w:eastAsia="Times New Roman" w:hAnsi="Times New Roman" w:cs="Times New Roman"/>
+              </w:rPr>
+              <w:t>)</w:t>
+            </w:r>
+          </w:p>
+          <w:p>
+            <w:pPr>
+              <w:rPr>
+                <w:rFonts w:ascii="Times New Roman" w:eastAsia="Times New Roman" w:hAnsi="Times New Roman" w:cs="Times New Roman"/>
+              </w:rPr>
+            </w:pPr>
+          </w:p>
+          <w:p>
+            <w:pPr>
+              <w:rPr>
+                <w:rFonts w:ascii="Times New Roman" w:eastAsia="Times New Roman" w:hAnsi="Times New Roman" w:cs="Times New Roman"/>
+              </w:rPr>
+            </w:pPr>
+          </w:p>
+          <w:p>
+            <w:pPr>
+              <w:rPr>
+                <w:rFonts w:ascii="Times New Roman" w:eastAsia="Times New Roman" w:hAnsi="Times New Roman" w:cs="Times New Roman"/>
+              </w:rPr>
+            </w:pPr>
+          </w:p>
+          <w:p>
+            <w:pPr>
+              <w:rPr>
+                <w:rFonts w:ascii="Times New Roman" w:eastAsia="Times New Roman" w:hAnsi="Times New Roman" w:cs="Times New Roman"/>
+              </w:rPr>
+            </w:pPr>
+            <w:r>
+              <w:rPr>
+                <w:rFonts w:ascii="Times New Roman" w:eastAsia="Times New Roman" w:hAnsi="Times New Roman" w:cs="Times New Roman"/>
+              </w:rPr>
+              <w:t># --------------------------------------------------</w:t>
+            </w:r>
+          </w:p>
+          <w:p>
+            <w:pPr>
+              <w:rPr>
+                <w:rFonts w:ascii="Times New Roman" w:eastAsia="Times New Roman" w:hAnsi="Times New Roman" w:cs="Times New Roman"/>
+              </w:rPr>
+            </w:pPr>
+            <w:r>
+              <w:rPr>
+                <w:rFonts w:ascii="Times New Roman" w:eastAsia="Times New Roman" w:hAnsi="Times New Roman" w:cs="Times New Roman"/>
+              </w:rPr>
+              <w:t># Visualization 2: Histogram of Alcohol Consumption</w:t>
+            </w:r>
+          </w:p>
+          <w:p>
+            <w:pPr>
+              <w:rPr>
+                <w:rFonts w:ascii="Times New Roman" w:eastAsia="Times New Roman" w:hAnsi="Times New Roman" w:cs="Times New Roman"/>
+              </w:rPr>
+            </w:pPr>
+            <w:r>
+              <w:rPr>
+                <w:rFonts w:ascii="Times New Roman" w:eastAsia="Times New Roman" w:hAnsi="Times New Roman" w:cs="Times New Roman"/>
+              </w:rPr>
+              <w:t># --------------------------------------------------</w:t>
+            </w:r>
+          </w:p>
+          <w:p>
+            <w:pPr>
+              <w:rPr>
+                <w:rFonts w:ascii="Times New Roman" w:eastAsia="Times New Roman" w:hAnsi="Times New Roman" w:cs="Times New Roman"/>
+              </w:rPr>
+            </w:pPr>
+          </w:p>
+          <w:p>
+            <w:pPr>
+              <w:rPr>
+                <w:rFonts w:ascii="Times New Roman" w:eastAsia="Times New Roman" w:hAnsi="Times New Roman" w:cs="Times New Roman"/>
+              </w:rPr>
+            </w:pPr>
+            <w:proofErr w:type="gramStart"/>
+            <w:r>
+              <w:rPr>
+                <w:rFonts w:ascii="Times New Roman" w:eastAsia="Times New Roman" w:hAnsi="Times New Roman" w:cs="Times New Roman"/>
+              </w:rPr>
+              <w:t>hist(</w:t>
+            </w:r>
+            <w:proofErr w:type="spellStart"/>
+            <w:proofErr w:type="gramEnd"/>
+            <w:r>
+              <w:rPr>
+                <w:rFonts w:ascii="Times New Roman" w:eastAsia="Times New Roman" w:hAnsi="Times New Roman" w:cs="Times New Roman"/>
+              </w:rPr>
               <w:t>data_clean$Alcohol_Consumption</w:t>
             </w:r>
             <w:proofErr w:type="spellEnd"/>
@@ -8356,7 +8930,7 @@
               <w:rPr>
                 <w:rFonts w:ascii="Times New Roman" w:eastAsia="Times New Roman" w:hAnsi="Times New Roman" w:cs="Times New Roman"/>
               </w:rPr>
-              <w:t># Visualization 2: Histogram of Life Expectancy</w:t>
+              <w:t># Visualization 3: Histogram of Life Expectancy</w:t>
             </w:r>
           </w:p>
           <w:p>
@@ -8560,54 +9134,49 @@
               <w:rPr>
                 <w:rFonts w:ascii="Times New Roman" w:eastAsia="Times New Roman" w:hAnsi="Times New Roman" w:cs="Times New Roman"/>
               </w:rPr>
-              <w:t># --------------------------------------------------</w:t>
-            </w:r>
-          </w:p>
-          <w:p>
-            <w:pPr>
-              <w:rPr>
-                <w:rFonts w:ascii="Times New Roman" w:eastAsia="Times New Roman" w:hAnsi="Times New Roman" w:cs="Times New Roman"/>
-              </w:rPr>
-            </w:pPr>
-            <w:r>
-              <w:rPr>
-                <w:rFonts w:ascii="Times New Roman" w:eastAsia="Times New Roman" w:hAnsi="Times New Roman" w:cs="Times New Roman"/>
-              </w:rPr>
-              <w:t xml:space="preserve"># Visualization 3: Scatter Plot </w:t>
-            </w:r>
-          </w:p>
-          <w:p>
-            <w:pPr>
-              <w:rPr>
-                <w:rFonts w:ascii="Times New Roman" w:eastAsia="Times New Roman" w:hAnsi="Times New Roman" w:cs="Times New Roman"/>
-              </w:rPr>
-            </w:pPr>
-            <w:r>
-              <w:rPr>
-                <w:rFonts w:ascii="Times New Roman" w:eastAsia="Times New Roman" w:hAnsi="Times New Roman" w:cs="Times New Roman"/>
-              </w:rPr>
-              <w:t># --------------------------------------------------</w:t>
-            </w:r>
-          </w:p>
-          <w:p>
-            <w:pPr>
-              <w:rPr>
-                <w:rFonts w:ascii="Times New Roman" w:eastAsia="Times New Roman" w:hAnsi="Times New Roman" w:cs="Times New Roman"/>
-              </w:rPr>
-            </w:pPr>
-          </w:p>
-          <w:p>
-            <w:pPr>
-              <w:rPr>
-                <w:rFonts w:ascii="Times New Roman" w:eastAsia="Times New Roman" w:hAnsi="Times New Roman" w:cs="Times New Roman"/>
-              </w:rPr>
-            </w:pPr>
+              <w:t># Pearson correlation test</w:t>
+            </w:r>
+          </w:p>
+          <w:p>
+            <w:pPr>
+              <w:rPr>
+                <w:rFonts w:ascii="Times New Roman" w:eastAsia="Times New Roman" w:hAnsi="Times New Roman" w:cs="Times New Roman"/>
+              </w:rPr>
+            </w:pPr>
+            <w:proofErr w:type="spellStart"/>
+            <w:r>
+              <w:rPr>
+                <w:rFonts w:ascii="Times New Roman" w:eastAsia="Times New Roman" w:hAnsi="Times New Roman" w:cs="Times New Roman"/>
+              </w:rPr>
+              <w:t>correlation_test</w:t>
+            </w:r>
+            <w:proofErr w:type="spellEnd"/>
+            <w:r>
+              <w:rPr>
+                <w:rFonts w:ascii="Times New Roman" w:eastAsia="Times New Roman" w:hAnsi="Times New Roman" w:cs="Times New Roman"/>
+              </w:rPr>
+              <w:t xml:space="preserve"> &lt;- </w:t>
+            </w:r>
+            <w:proofErr w:type="spellStart"/>
+            <w:r>
+              <w:rPr>
+                <w:rFonts w:ascii="Times New Roman" w:eastAsia="Times New Roman" w:hAnsi="Times New Roman" w:cs="Times New Roman"/>
+              </w:rPr>
+              <w:t>cor.</w:t>
+            </w:r>
             <w:proofErr w:type="gramStart"/>
             <w:r>
               <w:rPr>
                 <w:rFonts w:ascii="Times New Roman" w:eastAsia="Times New Roman" w:hAnsi="Times New Roman" w:cs="Times New Roman"/>
               </w:rPr>
-              <w:t>plot(</w:t>
+              <w:t>test</w:t>
+            </w:r>
+            <w:proofErr w:type="spellEnd"/>
+            <w:r>
+              <w:rPr>
+                <w:rFonts w:ascii="Times New Roman" w:eastAsia="Times New Roman" w:hAnsi="Times New Roman" w:cs="Times New Roman"/>
+              </w:rPr>
+              <w:t>(</w:t>
             </w:r>
             <w:proofErr w:type="spellStart"/>
             <w:proofErr w:type="gramEnd"/>
@@ -8635,7 +9204,7 @@
               <w:rPr>
                 <w:rFonts w:ascii="Times New Roman" w:eastAsia="Times New Roman" w:hAnsi="Times New Roman" w:cs="Times New Roman"/>
               </w:rPr>
-              <w:t xml:space="preserve">     </w:t>
+              <w:t xml:space="preserve">                             </w:t>
             </w:r>
             <w:proofErr w:type="spellStart"/>
             <w:r>
@@ -8662,1998 +9231,390 @@
               <w:rPr>
                 <w:rFonts w:ascii="Times New Roman" w:eastAsia="Times New Roman" w:hAnsi="Times New Roman" w:cs="Times New Roman"/>
               </w:rPr>
-              <w:t xml:space="preserve">     main = "Alcohol Consumption vs Life Expectancy",</w:t>
-            </w:r>
-          </w:p>
-          <w:p>
-            <w:pPr>
-              <w:rPr>
-                <w:rFonts w:ascii="Times New Roman" w:eastAsia="Times New Roman" w:hAnsi="Times New Roman" w:cs="Times New Roman"/>
-              </w:rPr>
-            </w:pPr>
-            <w:r>
-              <w:rPr>
-                <w:rFonts w:ascii="Times New Roman" w:eastAsia="Times New Roman" w:hAnsi="Times New Roman" w:cs="Times New Roman"/>
-              </w:rPr>
-              <w:t xml:space="preserve">     </w:t>
+              <w:t xml:space="preserve">                             method = "</w:t>
             </w:r>
             <w:proofErr w:type="spellStart"/>
             <w:r>
               <w:rPr>
                 <w:rFonts w:ascii="Times New Roman" w:eastAsia="Times New Roman" w:hAnsi="Times New Roman" w:cs="Times New Roman"/>
               </w:rPr>
-              <w:t>xlab</w:t>
+              <w:t>pearson</w:t>
             </w:r>
             <w:proofErr w:type="spellEnd"/>
             <w:r>
               <w:rPr>
                 <w:rFonts w:ascii="Times New Roman" w:eastAsia="Times New Roman" w:hAnsi="Times New Roman" w:cs="Times New Roman"/>
               </w:rPr>
-              <w:t xml:space="preserve"> = "Alcohol Consumption (litres per capita)",</w:t>
-            </w:r>
-          </w:p>
-          <w:p>
-            <w:pPr>
-              <w:rPr>
-                <w:rFonts w:ascii="Times New Roman" w:eastAsia="Times New Roman" w:hAnsi="Times New Roman" w:cs="Times New Roman"/>
-              </w:rPr>
-            </w:pPr>
-            <w:r>
-              <w:rPr>
-                <w:rFonts w:ascii="Times New Roman" w:eastAsia="Times New Roman" w:hAnsi="Times New Roman" w:cs="Times New Roman"/>
-              </w:rPr>
-              <w:t xml:space="preserve">     </w:t>
+              <w:t>")</w:t>
+            </w:r>
+          </w:p>
+          <w:p>
+            <w:pPr>
+              <w:rPr>
+                <w:rFonts w:ascii="Times New Roman" w:eastAsia="Times New Roman" w:hAnsi="Times New Roman" w:cs="Times New Roman"/>
+              </w:rPr>
+            </w:pPr>
+          </w:p>
+          <w:p>
+            <w:pPr>
+              <w:rPr>
+                <w:rFonts w:ascii="Times New Roman" w:eastAsia="Times New Roman" w:hAnsi="Times New Roman" w:cs="Times New Roman"/>
+              </w:rPr>
+            </w:pPr>
+            <w:r>
+              <w:rPr>
+                <w:rFonts w:ascii="Times New Roman" w:eastAsia="Times New Roman" w:hAnsi="Times New Roman" w:cs="Times New Roman"/>
+              </w:rPr>
+              <w:t># Display correlation results</w:t>
+            </w:r>
+          </w:p>
+          <w:p>
+            <w:pPr>
+              <w:rPr>
+                <w:rFonts w:ascii="Times New Roman" w:eastAsia="Times New Roman" w:hAnsi="Times New Roman" w:cs="Times New Roman"/>
+              </w:rPr>
+            </w:pPr>
+            <w:r>
+              <w:rPr>
+                <w:rFonts w:ascii="Times New Roman" w:eastAsia="Times New Roman" w:hAnsi="Times New Roman" w:cs="Times New Roman"/>
+              </w:rPr>
+              <w:t>print(</w:t>
             </w:r>
             <w:proofErr w:type="spellStart"/>
             <w:r>
               <w:rPr>
                 <w:rFonts w:ascii="Times New Roman" w:eastAsia="Times New Roman" w:hAnsi="Times New Roman" w:cs="Times New Roman"/>
               </w:rPr>
-              <w:t>ylab</w:t>
+              <w:t>correlation_test</w:t>
             </w:r>
             <w:proofErr w:type="spellEnd"/>
             <w:r>
               <w:rPr>
                 <w:rFonts w:ascii="Times New Roman" w:eastAsia="Times New Roman" w:hAnsi="Times New Roman" w:cs="Times New Roman"/>
               </w:rPr>
-              <w:t xml:space="preserve"> = "Life Expectancy (years)",</w:t>
-            </w:r>
-          </w:p>
-          <w:p>
-            <w:pPr>
-              <w:rPr>
-                <w:rFonts w:ascii="Times New Roman" w:eastAsia="Times New Roman" w:hAnsi="Times New Roman" w:cs="Times New Roman"/>
-              </w:rPr>
-            </w:pPr>
-            <w:r>
-              <w:rPr>
-                <w:rFonts w:ascii="Times New Roman" w:eastAsia="Times New Roman" w:hAnsi="Times New Roman" w:cs="Times New Roman"/>
-              </w:rPr>
-              <w:t xml:space="preserve">     </w:t>
-            </w:r>
+              <w:t>)</w:t>
+            </w:r>
+          </w:p>
+          <w:p>
+            <w:pPr>
+              <w:rPr>
+                <w:rFonts w:ascii="Times New Roman" w:eastAsia="Times New Roman" w:hAnsi="Times New Roman" w:cs="Times New Roman"/>
+              </w:rPr>
+            </w:pPr>
+          </w:p>
+          <w:p>
+            <w:pPr>
+              <w:rPr>
+                <w:rFonts w:ascii="Times New Roman" w:eastAsia="Times New Roman" w:hAnsi="Times New Roman" w:cs="Times New Roman"/>
+              </w:rPr>
+            </w:pPr>
+            <w:r>
+              <w:rPr>
+                <w:rFonts w:ascii="Times New Roman" w:eastAsia="Times New Roman" w:hAnsi="Times New Roman" w:cs="Times New Roman"/>
+              </w:rPr>
+              <w:t># Extract key statistics</w:t>
+            </w:r>
+          </w:p>
+          <w:p>
+            <w:pPr>
+              <w:rPr>
+                <w:rFonts w:ascii="Times New Roman" w:eastAsia="Times New Roman" w:hAnsi="Times New Roman" w:cs="Times New Roman"/>
+              </w:rPr>
+            </w:pPr>
             <w:proofErr w:type="spellStart"/>
             <w:r>
               <w:rPr>
                 <w:rFonts w:ascii="Times New Roman" w:eastAsia="Times New Roman" w:hAnsi="Times New Roman" w:cs="Times New Roman"/>
               </w:rPr>
-              <w:t>pch</w:t>
+              <w:t>correlation_coefficient</w:t>
             </w:r>
             <w:proofErr w:type="spellEnd"/>
             <w:r>
               <w:rPr>
                 <w:rFonts w:ascii="Times New Roman" w:eastAsia="Times New Roman" w:hAnsi="Times New Roman" w:cs="Times New Roman"/>
               </w:rPr>
-              <w:t xml:space="preserve"> = 19,</w:t>
-            </w:r>
-          </w:p>
-          <w:p>
-            <w:pPr>
-              <w:rPr>
-                <w:rFonts w:ascii="Times New Roman" w:eastAsia="Times New Roman" w:hAnsi="Times New Roman" w:cs="Times New Roman"/>
-              </w:rPr>
-            </w:pPr>
-            <w:r>
-              <w:rPr>
-                <w:rFonts w:ascii="Times New Roman" w:eastAsia="Times New Roman" w:hAnsi="Times New Roman" w:cs="Times New Roman"/>
-              </w:rPr>
-              <w:t xml:space="preserve">     col = </w:t>
+              <w:t xml:space="preserve"> &lt;- </w:t>
             </w:r>
             <w:proofErr w:type="spellStart"/>
+            <w:r>
+              <w:rPr>
+                <w:rFonts w:ascii="Times New Roman" w:eastAsia="Times New Roman" w:hAnsi="Times New Roman" w:cs="Times New Roman"/>
+              </w:rPr>
+              <w:t>correlation_test$estimate</w:t>
+            </w:r>
+            <w:proofErr w:type="spellEnd"/>
+          </w:p>
+          <w:p>
+            <w:pPr>
+              <w:rPr>
+                <w:rFonts w:ascii="Times New Roman" w:eastAsia="Times New Roman" w:hAnsi="Times New Roman" w:cs="Times New Roman"/>
+              </w:rPr>
+            </w:pPr>
+            <w:proofErr w:type="spellStart"/>
+            <w:r>
+              <w:rPr>
+                <w:rFonts w:ascii="Times New Roman" w:eastAsia="Times New Roman" w:hAnsi="Times New Roman" w:cs="Times New Roman"/>
+              </w:rPr>
+              <w:t>p_value</w:t>
+            </w:r>
+            <w:proofErr w:type="spellEnd"/>
+            <w:r>
+              <w:rPr>
+                <w:rFonts w:ascii="Times New Roman" w:eastAsia="Times New Roman" w:hAnsi="Times New Roman" w:cs="Times New Roman"/>
+              </w:rPr>
+              <w:t xml:space="preserve"> &lt;- </w:t>
+            </w:r>
+            <w:proofErr w:type="spellStart"/>
+            <w:r>
+              <w:rPr>
+                <w:rFonts w:ascii="Times New Roman" w:eastAsia="Times New Roman" w:hAnsi="Times New Roman" w:cs="Times New Roman"/>
+              </w:rPr>
+              <w:t>correlation_test$p.value</w:t>
+            </w:r>
+            <w:proofErr w:type="spellEnd"/>
+          </w:p>
+          <w:p>
+            <w:pPr>
+              <w:rPr>
+                <w:rFonts w:ascii="Times New Roman" w:eastAsia="Times New Roman" w:hAnsi="Times New Roman" w:cs="Times New Roman"/>
+              </w:rPr>
+            </w:pPr>
+            <w:proofErr w:type="spellStart"/>
+            <w:r>
+              <w:rPr>
+                <w:rFonts w:ascii="Times New Roman" w:eastAsia="Times New Roman" w:hAnsi="Times New Roman" w:cs="Times New Roman"/>
+              </w:rPr>
+              <w:t>confidence_interval</w:t>
+            </w:r>
+            <w:proofErr w:type="spellEnd"/>
+            <w:r>
+              <w:rPr>
+                <w:rFonts w:ascii="Times New Roman" w:eastAsia="Times New Roman" w:hAnsi="Times New Roman" w:cs="Times New Roman"/>
+              </w:rPr>
+              <w:t xml:space="preserve"> &lt;- correlation_test$conf.int</w:t>
+            </w:r>
+          </w:p>
+          <w:p>
+            <w:pPr>
+              <w:rPr>
+                <w:rFonts w:ascii="Times New Roman" w:eastAsia="Times New Roman" w:hAnsi="Times New Roman" w:cs="Times New Roman"/>
+              </w:rPr>
+            </w:pPr>
+          </w:p>
+          <w:p>
+            <w:pPr>
+              <w:rPr>
+                <w:rFonts w:ascii="Times New Roman" w:eastAsia="Times New Roman" w:hAnsi="Times New Roman" w:cs="Times New Roman"/>
+              </w:rPr>
+            </w:pPr>
             <w:proofErr w:type="gramStart"/>
             <w:r>
               <w:rPr>
                 <w:rFonts w:ascii="Times New Roman" w:eastAsia="Times New Roman" w:hAnsi="Times New Roman" w:cs="Times New Roman"/>
               </w:rPr>
-              <w:t>rgb</w:t>
+              <w:t>cat(</w:t>
+            </w:r>
+            <w:proofErr w:type="gramEnd"/>
+            <w:r>
+              <w:rPr>
+                <w:rFonts w:ascii="Times New Roman" w:eastAsia="Times New Roman" w:hAnsi="Times New Roman" w:cs="Times New Roman"/>
+              </w:rPr>
+              <w:t>"\n=== CORRELATION ANALYSIS RESULTS ===\n")</w:t>
+            </w:r>
+          </w:p>
+          <w:p>
+            <w:pPr>
+              <w:rPr>
+                <w:rFonts w:ascii="Times New Roman" w:eastAsia="Times New Roman" w:hAnsi="Times New Roman" w:cs="Times New Roman"/>
+              </w:rPr>
+            </w:pPr>
+            <w:proofErr w:type="gramStart"/>
+            <w:r>
+              <w:rPr>
+                <w:rFonts w:ascii="Times New Roman" w:eastAsia="Times New Roman" w:hAnsi="Times New Roman" w:cs="Times New Roman"/>
+              </w:rPr>
+              <w:t>cat(</w:t>
+            </w:r>
+            <w:proofErr w:type="gramEnd"/>
+            <w:r>
+              <w:rPr>
+                <w:rFonts w:ascii="Times New Roman" w:eastAsia="Times New Roman" w:hAnsi="Times New Roman" w:cs="Times New Roman"/>
+              </w:rPr>
+              <w:t xml:space="preserve">"Pearson Correlation Coefficient (r):", </w:t>
+            </w:r>
+            <w:proofErr w:type="spellStart"/>
+            <w:r>
+              <w:rPr>
+                <w:rFonts w:ascii="Times New Roman" w:eastAsia="Times New Roman" w:hAnsi="Times New Roman" w:cs="Times New Roman"/>
+              </w:rPr>
+              <w:t>correlation_coefficient</w:t>
             </w:r>
             <w:proofErr w:type="spellEnd"/>
             <w:r>
               <w:rPr>
                 <w:rFonts w:ascii="Times New Roman" w:eastAsia="Times New Roman" w:hAnsi="Times New Roman" w:cs="Times New Roman"/>
               </w:rPr>
+              <w:t>, "\n")</w:t>
+            </w:r>
+          </w:p>
+          <w:p>
+            <w:pPr>
+              <w:rPr>
+                <w:rFonts w:ascii="Times New Roman" w:eastAsia="Times New Roman" w:hAnsi="Times New Roman" w:cs="Times New Roman"/>
+              </w:rPr>
+            </w:pPr>
+            <w:proofErr w:type="gramStart"/>
+            <w:r>
+              <w:rPr>
+                <w:rFonts w:ascii="Times New Roman" w:eastAsia="Times New Roman" w:hAnsi="Times New Roman" w:cs="Times New Roman"/>
+              </w:rPr>
+              <w:t>cat(</w:t>
+            </w:r>
+            <w:proofErr w:type="gramEnd"/>
+            <w:r>
+              <w:rPr>
+                <w:rFonts w:ascii="Times New Roman" w:eastAsia="Times New Roman" w:hAnsi="Times New Roman" w:cs="Times New Roman"/>
+              </w:rPr>
+              <w:t xml:space="preserve">"P-value:", </w:t>
+            </w:r>
+            <w:proofErr w:type="spellStart"/>
+            <w:r>
+              <w:rPr>
+                <w:rFonts w:ascii="Times New Roman" w:eastAsia="Times New Roman" w:hAnsi="Times New Roman" w:cs="Times New Roman"/>
+              </w:rPr>
+              <w:t>p_value</w:t>
+            </w:r>
+            <w:proofErr w:type="spellEnd"/>
+            <w:r>
+              <w:rPr>
+                <w:rFonts w:ascii="Times New Roman" w:eastAsia="Times New Roman" w:hAnsi="Times New Roman" w:cs="Times New Roman"/>
+              </w:rPr>
+              <w:t>, "\n")</w:t>
+            </w:r>
+          </w:p>
+          <w:p>
+            <w:pPr>
+              <w:rPr>
+                <w:rFonts w:ascii="Times New Roman" w:eastAsia="Times New Roman" w:hAnsi="Times New Roman" w:cs="Times New Roman"/>
+              </w:rPr>
+            </w:pPr>
+            <w:proofErr w:type="gramStart"/>
+            <w:r>
+              <w:rPr>
+                <w:rFonts w:ascii="Times New Roman" w:eastAsia="Times New Roman" w:hAnsi="Times New Roman" w:cs="Times New Roman"/>
+              </w:rPr>
+              <w:t>cat(</w:t>
+            </w:r>
+            <w:proofErr w:type="gramEnd"/>
+            <w:r>
+              <w:rPr>
+                <w:rFonts w:ascii="Times New Roman" w:eastAsia="Times New Roman" w:hAnsi="Times New Roman" w:cs="Times New Roman"/>
+              </w:rPr>
+              <w:t xml:space="preserve">"95% Confidence Interval:", </w:t>
+            </w:r>
+            <w:proofErr w:type="spellStart"/>
+            <w:r>
+              <w:rPr>
+                <w:rFonts w:ascii="Times New Roman" w:eastAsia="Times New Roman" w:hAnsi="Times New Roman" w:cs="Times New Roman"/>
+              </w:rPr>
+              <w:t>confidence_</w:t>
+            </w:r>
+            <w:proofErr w:type="gramStart"/>
+            <w:r>
+              <w:rPr>
+                <w:rFonts w:ascii="Times New Roman" w:eastAsia="Times New Roman" w:hAnsi="Times New Roman" w:cs="Times New Roman"/>
+              </w:rPr>
+              <w:t>interval</w:t>
+            </w:r>
+            <w:proofErr w:type="spellEnd"/>
+            <w:r>
+              <w:rPr>
+                <w:rFonts w:ascii="Times New Roman" w:eastAsia="Times New Roman" w:hAnsi="Times New Roman" w:cs="Times New Roman"/>
+              </w:rPr>
+              <w:t>[</w:t>
+            </w:r>
+            <w:proofErr w:type="gramEnd"/>
+            <w:r>
+              <w:rPr>
+                <w:rFonts w:ascii="Times New Roman" w:eastAsia="Times New Roman" w:hAnsi="Times New Roman" w:cs="Times New Roman"/>
+              </w:rPr>
+              <w:t xml:space="preserve">1], "to", </w:t>
+            </w:r>
+            <w:proofErr w:type="spellStart"/>
+            <w:r>
+              <w:rPr>
+                <w:rFonts w:ascii="Times New Roman" w:eastAsia="Times New Roman" w:hAnsi="Times New Roman" w:cs="Times New Roman"/>
+              </w:rPr>
+              <w:t>confidence_</w:t>
+            </w:r>
+            <w:proofErr w:type="gramStart"/>
+            <w:r>
+              <w:rPr>
+                <w:rFonts w:ascii="Times New Roman" w:eastAsia="Times New Roman" w:hAnsi="Times New Roman" w:cs="Times New Roman"/>
+              </w:rPr>
+              <w:t>interval</w:t>
+            </w:r>
+            <w:proofErr w:type="spellEnd"/>
+            <w:r>
+              <w:rPr>
+                <w:rFonts w:ascii="Times New Roman" w:eastAsia="Times New Roman" w:hAnsi="Times New Roman" w:cs="Times New Roman"/>
+              </w:rPr>
+              <w:t>[</w:t>
+            </w:r>
+            <w:proofErr w:type="gramEnd"/>
+            <w:r>
+              <w:rPr>
+                <w:rFonts w:ascii="Times New Roman" w:eastAsia="Times New Roman" w:hAnsi="Times New Roman" w:cs="Times New Roman"/>
+              </w:rPr>
+              <w:t>2], "\n")</w:t>
+            </w:r>
+          </w:p>
+          <w:p>
+            <w:pPr>
+              <w:rPr>
+                <w:rFonts w:ascii="Times New Roman" w:eastAsia="Times New Roman" w:hAnsi="Times New Roman" w:cs="Times New Roman"/>
+              </w:rPr>
+            </w:pPr>
+            <w:proofErr w:type="gramStart"/>
+            <w:r>
+              <w:rPr>
+                <w:rFonts w:ascii="Times New Roman" w:eastAsia="Times New Roman" w:hAnsi="Times New Roman" w:cs="Times New Roman"/>
+              </w:rPr>
+              <w:t>cat(</w:t>
+            </w:r>
+            <w:proofErr w:type="gramEnd"/>
+            <w:r>
+              <w:rPr>
+                <w:rFonts w:ascii="Times New Roman" w:eastAsia="Times New Roman" w:hAnsi="Times New Roman" w:cs="Times New Roman"/>
+              </w:rPr>
+              <w:t xml:space="preserve">"Sample size (n):", </w:t>
+            </w:r>
+            <w:proofErr w:type="spellStart"/>
+            <w:r>
+              <w:rPr>
+                <w:rFonts w:ascii="Times New Roman" w:eastAsia="Times New Roman" w:hAnsi="Times New Roman" w:cs="Times New Roman"/>
+              </w:rPr>
+              <w:t>nrow</w:t>
+            </w:r>
+            <w:proofErr w:type="spellEnd"/>
+            <w:r>
+              <w:rPr>
+                <w:rFonts w:ascii="Times New Roman" w:eastAsia="Times New Roman" w:hAnsi="Times New Roman" w:cs="Times New Roman"/>
+              </w:rPr>
               <w:t>(</w:t>
             </w:r>
-            <w:proofErr w:type="gramEnd"/>
-            <w:r>
-              <w:rPr>
-                <w:rFonts w:ascii="Times New Roman" w:eastAsia="Times New Roman" w:hAnsi="Times New Roman" w:cs="Times New Roman"/>
-              </w:rPr>
-              <w:t>0, 0, 0.5, 0.6),</w:t>
-            </w:r>
-          </w:p>
-          <w:p>
-            <w:pPr>
-              <w:rPr>
-                <w:rFonts w:ascii="Times New Roman" w:eastAsia="Times New Roman" w:hAnsi="Times New Roman" w:cs="Times New Roman"/>
-              </w:rPr>
-            </w:pPr>
-            <w:r>
-              <w:rPr>
-                <w:rFonts w:ascii="Times New Roman" w:eastAsia="Times New Roman" w:hAnsi="Times New Roman" w:cs="Times New Roman"/>
-              </w:rPr>
-              <w:t xml:space="preserve">     </w:t>
-            </w:r>
             <w:proofErr w:type="spellStart"/>
             <w:r>
               <w:rPr>
                 <w:rFonts w:ascii="Times New Roman" w:eastAsia="Times New Roman" w:hAnsi="Times New Roman" w:cs="Times New Roman"/>
               </w:rPr>
-              <w:t>cex</w:t>
+              <w:t>data_clean</w:t>
             </w:r>
             <w:proofErr w:type="spellEnd"/>
             <w:r>
               <w:rPr>
                 <w:rFonts w:ascii="Times New Roman" w:eastAsia="Times New Roman" w:hAnsi="Times New Roman" w:cs="Times New Roman"/>
               </w:rPr>
-              <w:t xml:space="preserve"> = 1.1)</w:t>
-            </w:r>
-          </w:p>
-          <w:p>
-            <w:pPr>
-              <w:rPr>
-                <w:rFonts w:ascii="Times New Roman" w:eastAsia="Times New Roman" w:hAnsi="Times New Roman" w:cs="Times New Roman"/>
-              </w:rPr>
-            </w:pPr>
-          </w:p>
-          <w:p>
-            <w:pPr>
-              <w:rPr>
-                <w:rFonts w:ascii="Times New Roman" w:eastAsia="Times New Roman" w:hAnsi="Times New Roman" w:cs="Times New Roman"/>
-              </w:rPr>
-            </w:pPr>
-            <w:proofErr w:type="gramStart"/>
-            <w:r>
-              <w:rPr>
-                <w:rFonts w:ascii="Times New Roman" w:eastAsia="Times New Roman" w:hAnsi="Times New Roman" w:cs="Times New Roman"/>
-              </w:rPr>
-              <w:t>grid(</w:t>
-            </w:r>
-            <w:proofErr w:type="gramEnd"/>
-            <w:r>
-              <w:rPr>
-                <w:rFonts w:ascii="Times New Roman" w:eastAsia="Times New Roman" w:hAnsi="Times New Roman" w:cs="Times New Roman"/>
-              </w:rPr>
-              <w:t>col = "</w:t>
-            </w:r>
-            <w:proofErr w:type="spellStart"/>
-            <w:r>
-              <w:rPr>
-                <w:rFonts w:ascii="Times New Roman" w:eastAsia="Times New Roman" w:hAnsi="Times New Roman" w:cs="Times New Roman"/>
-              </w:rPr>
-              <w:t>gray</w:t>
-            </w:r>
-            <w:proofErr w:type="spellEnd"/>
-            <w:r>
-              <w:rPr>
-                <w:rFonts w:ascii="Times New Roman" w:eastAsia="Times New Roman" w:hAnsi="Times New Roman" w:cs="Times New Roman"/>
-              </w:rPr>
-              <w:t xml:space="preserve">", </w:t>
-            </w:r>
-            <w:proofErr w:type="spellStart"/>
-            <w:r>
-              <w:rPr>
-                <w:rFonts w:ascii="Times New Roman" w:eastAsia="Times New Roman" w:hAnsi="Times New Roman" w:cs="Times New Roman"/>
-              </w:rPr>
-              <w:t>lty</w:t>
-            </w:r>
-            <w:proofErr w:type="spellEnd"/>
-            <w:r>
-              <w:rPr>
-                <w:rFonts w:ascii="Times New Roman" w:eastAsia="Times New Roman" w:hAnsi="Times New Roman" w:cs="Times New Roman"/>
-              </w:rPr>
-              <w:t xml:space="preserve"> = "dotted")</w:t>
-            </w:r>
-          </w:p>
-          <w:p>
-            <w:pPr>
-              <w:rPr>
-                <w:rFonts w:ascii="Times New Roman" w:eastAsia="Times New Roman" w:hAnsi="Times New Roman" w:cs="Times New Roman"/>
-              </w:rPr>
-            </w:pPr>
-          </w:p>
-          <w:p>
-            <w:pPr>
-              <w:rPr>
-                <w:rFonts w:ascii="Times New Roman" w:eastAsia="Times New Roman" w:hAnsi="Times New Roman" w:cs="Times New Roman"/>
-              </w:rPr>
-            </w:pPr>
-            <w:proofErr w:type="spellStart"/>
-            <w:proofErr w:type="gramStart"/>
-            <w:r>
-              <w:rPr>
-                <w:rFonts w:ascii="Times New Roman" w:eastAsia="Times New Roman" w:hAnsi="Times New Roman" w:cs="Times New Roman"/>
-              </w:rPr>
-              <w:t>mtext</w:t>
-            </w:r>
-            <w:proofErr w:type="spellEnd"/>
-            <w:r>
-              <w:rPr>
-                <w:rFonts w:ascii="Times New Roman" w:eastAsia="Times New Roman" w:hAnsi="Times New Roman" w:cs="Times New Roman"/>
-              </w:rPr>
-              <w:t>(paste(</w:t>
-            </w:r>
-            <w:proofErr w:type="gramEnd"/>
-            <w:r>
-              <w:rPr>
-                <w:rFonts w:ascii="Times New Roman" w:eastAsia="Times New Roman" w:hAnsi="Times New Roman" w:cs="Times New Roman"/>
-              </w:rPr>
-              <w:t xml:space="preserve">"n =", </w:t>
-            </w:r>
-            <w:proofErr w:type="spellStart"/>
-            <w:r>
-              <w:rPr>
-                <w:rFonts w:ascii="Times New Roman" w:eastAsia="Times New Roman" w:hAnsi="Times New Roman" w:cs="Times New Roman"/>
-              </w:rPr>
-              <w:t>nrow</w:t>
-            </w:r>
-            <w:proofErr w:type="spellEnd"/>
-            <w:r>
-              <w:rPr>
-                <w:rFonts w:ascii="Times New Roman" w:eastAsia="Times New Roman" w:hAnsi="Times New Roman" w:cs="Times New Roman"/>
-              </w:rPr>
-              <w:t>(</w:t>
-            </w:r>
-            <w:proofErr w:type="spellStart"/>
-            <w:r>
-              <w:rPr>
-                <w:rFonts w:ascii="Times New Roman" w:eastAsia="Times New Roman" w:hAnsi="Times New Roman" w:cs="Times New Roman"/>
-              </w:rPr>
-              <w:t>data_clean</w:t>
-            </w:r>
-            <w:proofErr w:type="spellEnd"/>
-            <w:r>
-              <w:rPr>
-                <w:rFonts w:ascii="Times New Roman" w:eastAsia="Times New Roman" w:hAnsi="Times New Roman" w:cs="Times New Roman"/>
-              </w:rPr>
-              <w:t xml:space="preserve">), "countries"), </w:t>
-            </w:r>
-          </w:p>
-          <w:p>
-            <w:pPr>
-              <w:rPr>
-                <w:rFonts w:ascii="Times New Roman" w:eastAsia="Times New Roman" w:hAnsi="Times New Roman" w:cs="Times New Roman"/>
-              </w:rPr>
-            </w:pPr>
-            <w:r>
-              <w:rPr>
-                <w:rFonts w:ascii="Times New Roman" w:eastAsia="Times New Roman" w:hAnsi="Times New Roman" w:cs="Times New Roman"/>
-              </w:rPr>
-              <w:t xml:space="preserve">      side = 3, </w:t>
-            </w:r>
-          </w:p>
-          <w:p>
-            <w:pPr>
-              <w:rPr>
-                <w:rFonts w:ascii="Times New Roman" w:eastAsia="Times New Roman" w:hAnsi="Times New Roman" w:cs="Times New Roman"/>
-              </w:rPr>
-            </w:pPr>
-            <w:r>
-              <w:rPr>
-                <w:rFonts w:ascii="Times New Roman" w:eastAsia="Times New Roman" w:hAnsi="Times New Roman" w:cs="Times New Roman"/>
-              </w:rPr>
-              <w:t xml:space="preserve">      line = 0.3,</w:t>
-            </w:r>
-          </w:p>
-          <w:p>
-            <w:pPr>
-              <w:rPr>
-                <w:rFonts w:ascii="Times New Roman" w:eastAsia="Times New Roman" w:hAnsi="Times New Roman" w:cs="Times New Roman"/>
-              </w:rPr>
-            </w:pPr>
-            <w:r>
-              <w:rPr>
-                <w:rFonts w:ascii="Times New Roman" w:eastAsia="Times New Roman" w:hAnsi="Times New Roman" w:cs="Times New Roman"/>
-              </w:rPr>
-              <w:t xml:space="preserve">      </w:t>
-            </w:r>
-            <w:proofErr w:type="spellStart"/>
-            <w:r>
-              <w:rPr>
-                <w:rFonts w:ascii="Times New Roman" w:eastAsia="Times New Roman" w:hAnsi="Times New Roman" w:cs="Times New Roman"/>
-              </w:rPr>
-              <w:t>cex</w:t>
-            </w:r>
-            <w:proofErr w:type="spellEnd"/>
-            <w:r>
-              <w:rPr>
-                <w:rFonts w:ascii="Times New Roman" w:eastAsia="Times New Roman" w:hAnsi="Times New Roman" w:cs="Times New Roman"/>
-              </w:rPr>
-              <w:t xml:space="preserve"> = 0.9)</w:t>
-            </w:r>
-          </w:p>
-          <w:p>
-            <w:pPr>
-              <w:rPr>
-                <w:rFonts w:ascii="Times New Roman" w:eastAsia="Times New Roman" w:hAnsi="Times New Roman" w:cs="Times New Roman"/>
-              </w:rPr>
-            </w:pPr>
-          </w:p>
-          <w:p>
-            <w:pPr>
-              <w:rPr>
-                <w:rFonts w:ascii="Times New Roman" w:eastAsia="Times New Roman" w:hAnsi="Times New Roman" w:cs="Times New Roman"/>
-              </w:rPr>
-            </w:pPr>
-            <w:proofErr w:type="gramStart"/>
-            <w:r>
-              <w:rPr>
-                <w:rFonts w:ascii="Times New Roman" w:eastAsia="Times New Roman" w:hAnsi="Times New Roman" w:cs="Times New Roman"/>
-              </w:rPr>
-              <w:t>cat(</w:t>
-            </w:r>
-            <w:proofErr w:type="gramEnd"/>
-            <w:r>
-              <w:rPr>
-                <w:rFonts w:ascii="Times New Roman" w:eastAsia="Times New Roman" w:hAnsi="Times New Roman" w:cs="Times New Roman"/>
-              </w:rPr>
-              <w:t>"Displayed: Scatter Plot\n")</w:t>
-            </w:r>
-          </w:p>
-          <w:p>
-            <w:pPr>
-              <w:rPr>
-                <w:rFonts w:ascii="Times New Roman" w:eastAsia="Times New Roman" w:hAnsi="Times New Roman" w:cs="Times New Roman"/>
-              </w:rPr>
-            </w:pPr>
-          </w:p>
-          <w:p>
-            <w:pPr>
-              <w:rPr>
-                <w:rFonts w:ascii="Times New Roman" w:eastAsia="Times New Roman" w:hAnsi="Times New Roman" w:cs="Times New Roman"/>
-              </w:rPr>
-            </w:pPr>
-            <w:r>
-              <w:rPr>
-                <w:rFonts w:ascii="Times New Roman" w:eastAsia="Times New Roman" w:hAnsi="Times New Roman" w:cs="Times New Roman"/>
-              </w:rPr>
-              <w:t># --------------------------------------------------</w:t>
-            </w:r>
-          </w:p>
-          <w:p>
-            <w:pPr>
-              <w:rPr>
-                <w:rFonts w:ascii="Times New Roman" w:eastAsia="Times New Roman" w:hAnsi="Times New Roman" w:cs="Times New Roman"/>
-              </w:rPr>
-            </w:pPr>
-            <w:r>
-              <w:rPr>
-                <w:rFonts w:ascii="Times New Roman" w:eastAsia="Times New Roman" w:hAnsi="Times New Roman" w:cs="Times New Roman"/>
-              </w:rPr>
-              <w:t xml:space="preserve"># Visualization 4: </w:t>
-            </w:r>
-            <w:proofErr w:type="spellStart"/>
-            <w:r>
-              <w:rPr>
-                <w:rFonts w:ascii="Times New Roman" w:eastAsia="Times New Roman" w:hAnsi="Times New Roman" w:cs="Times New Roman"/>
-              </w:rPr>
-              <w:t>StripChart</w:t>
-            </w:r>
-            <w:proofErr w:type="spellEnd"/>
-            <w:r>
-              <w:rPr>
-                <w:rFonts w:ascii="Times New Roman" w:eastAsia="Times New Roman" w:hAnsi="Times New Roman" w:cs="Times New Roman"/>
-              </w:rPr>
-              <w:t xml:space="preserve"> (Alcohol)</w:t>
-            </w:r>
-          </w:p>
-          <w:p>
-            <w:pPr>
-              <w:rPr>
-                <w:rFonts w:ascii="Times New Roman" w:eastAsia="Times New Roman" w:hAnsi="Times New Roman" w:cs="Times New Roman"/>
-              </w:rPr>
-            </w:pPr>
-            <w:r>
-              <w:rPr>
-                <w:rFonts w:ascii="Times New Roman" w:eastAsia="Times New Roman" w:hAnsi="Times New Roman" w:cs="Times New Roman"/>
-              </w:rPr>
-              <w:t># --------------------------------------------------</w:t>
-            </w:r>
-          </w:p>
-          <w:p>
-            <w:pPr>
-              <w:rPr>
-                <w:rFonts w:ascii="Times New Roman" w:eastAsia="Times New Roman" w:hAnsi="Times New Roman" w:cs="Times New Roman"/>
-              </w:rPr>
-            </w:pPr>
-          </w:p>
-          <w:p>
-            <w:pPr>
-              <w:rPr>
-                <w:rFonts w:ascii="Times New Roman" w:eastAsia="Times New Roman" w:hAnsi="Times New Roman" w:cs="Times New Roman"/>
-              </w:rPr>
-            </w:pPr>
-            <w:proofErr w:type="spellStart"/>
-            <w:proofErr w:type="gramStart"/>
-            <w:r>
-              <w:rPr>
-                <w:rFonts w:ascii="Times New Roman" w:eastAsia="Times New Roman" w:hAnsi="Times New Roman" w:cs="Times New Roman"/>
-              </w:rPr>
-              <w:t>stripchart</w:t>
-            </w:r>
-            <w:proofErr w:type="spellEnd"/>
-            <w:r>
-              <w:rPr>
-                <w:rFonts w:ascii="Times New Roman" w:eastAsia="Times New Roman" w:hAnsi="Times New Roman" w:cs="Times New Roman"/>
-              </w:rPr>
-              <w:t>(</w:t>
-            </w:r>
-            <w:proofErr w:type="spellStart"/>
-            <w:proofErr w:type="gramEnd"/>
-            <w:r>
-              <w:rPr>
-                <w:rFonts w:ascii="Times New Roman" w:eastAsia="Times New Roman" w:hAnsi="Times New Roman" w:cs="Times New Roman"/>
-              </w:rPr>
-              <w:t>data_clean$Alcohol_Consumption</w:t>
-            </w:r>
-            <w:proofErr w:type="spellEnd"/>
-            <w:r>
-              <w:rPr>
-                <w:rFonts w:ascii="Times New Roman" w:eastAsia="Times New Roman" w:hAnsi="Times New Roman" w:cs="Times New Roman"/>
-              </w:rPr>
-              <w:t>,</w:t>
-            </w:r>
-          </w:p>
-          <w:p>
-            <w:pPr>
-              <w:rPr>
-                <w:rFonts w:ascii="Times New Roman" w:eastAsia="Times New Roman" w:hAnsi="Times New Roman" w:cs="Times New Roman"/>
-              </w:rPr>
-            </w:pPr>
-            <w:r>
-              <w:rPr>
-                <w:rFonts w:ascii="Times New Roman" w:eastAsia="Times New Roman" w:hAnsi="Times New Roman" w:cs="Times New Roman"/>
-              </w:rPr>
-              <w:t xml:space="preserve">           method = "jitter",</w:t>
-            </w:r>
-          </w:p>
-          <w:p>
-            <w:pPr>
-              <w:rPr>
-                <w:rFonts w:ascii="Times New Roman" w:eastAsia="Times New Roman" w:hAnsi="Times New Roman" w:cs="Times New Roman"/>
-              </w:rPr>
-            </w:pPr>
-            <w:r>
-              <w:rPr>
-                <w:rFonts w:ascii="Times New Roman" w:eastAsia="Times New Roman" w:hAnsi="Times New Roman" w:cs="Times New Roman"/>
-              </w:rPr>
-              <w:t xml:space="preserve">           main = "</w:t>
-            </w:r>
-            <w:proofErr w:type="spellStart"/>
-            <w:r>
-              <w:rPr>
-                <w:rFonts w:ascii="Times New Roman" w:eastAsia="Times New Roman" w:hAnsi="Times New Roman" w:cs="Times New Roman"/>
-              </w:rPr>
-              <w:t>Stripchart</w:t>
-            </w:r>
-            <w:proofErr w:type="spellEnd"/>
-            <w:r>
-              <w:rPr>
-                <w:rFonts w:ascii="Times New Roman" w:eastAsia="Times New Roman" w:hAnsi="Times New Roman" w:cs="Times New Roman"/>
-              </w:rPr>
-              <w:t>: Alcohol Consumption",</w:t>
-            </w:r>
-          </w:p>
-          <w:p>
-            <w:pPr>
-              <w:rPr>
-                <w:rFonts w:ascii="Times New Roman" w:eastAsia="Times New Roman" w:hAnsi="Times New Roman" w:cs="Times New Roman"/>
-              </w:rPr>
-            </w:pPr>
-            <w:r>
-              <w:rPr>
-                <w:rFonts w:ascii="Times New Roman" w:eastAsia="Times New Roman" w:hAnsi="Times New Roman" w:cs="Times New Roman"/>
-              </w:rPr>
-              <w:t xml:space="preserve">           </w:t>
-            </w:r>
-            <w:proofErr w:type="spellStart"/>
-            <w:r>
-              <w:rPr>
-                <w:rFonts w:ascii="Times New Roman" w:eastAsia="Times New Roman" w:hAnsi="Times New Roman" w:cs="Times New Roman"/>
-              </w:rPr>
-              <w:t>xlab</w:t>
-            </w:r>
-            <w:proofErr w:type="spellEnd"/>
-            <w:r>
-              <w:rPr>
-                <w:rFonts w:ascii="Times New Roman" w:eastAsia="Times New Roman" w:hAnsi="Times New Roman" w:cs="Times New Roman"/>
-              </w:rPr>
-              <w:t xml:space="preserve"> = "Alcohol Consumption (litres per capita)",</w:t>
-            </w:r>
-          </w:p>
-          <w:p>
-            <w:pPr>
-              <w:rPr>
-                <w:rFonts w:ascii="Times New Roman" w:eastAsia="Times New Roman" w:hAnsi="Times New Roman" w:cs="Times New Roman"/>
-              </w:rPr>
-            </w:pPr>
-            <w:r>
-              <w:rPr>
-                <w:rFonts w:ascii="Times New Roman" w:eastAsia="Times New Roman" w:hAnsi="Times New Roman" w:cs="Times New Roman"/>
-              </w:rPr>
-              <w:t xml:space="preserve">           </w:t>
-            </w:r>
-            <w:proofErr w:type="spellStart"/>
-            <w:r>
-              <w:rPr>
-                <w:rFonts w:ascii="Times New Roman" w:eastAsia="Times New Roman" w:hAnsi="Times New Roman" w:cs="Times New Roman"/>
-              </w:rPr>
-              <w:t>pch</w:t>
-            </w:r>
-            <w:proofErr w:type="spellEnd"/>
-            <w:r>
-              <w:rPr>
-                <w:rFonts w:ascii="Times New Roman" w:eastAsia="Times New Roman" w:hAnsi="Times New Roman" w:cs="Times New Roman"/>
-              </w:rPr>
-              <w:t xml:space="preserve"> = 19,</w:t>
-            </w:r>
-          </w:p>
-          <w:p>
-            <w:pPr>
-              <w:rPr>
-                <w:rFonts w:ascii="Times New Roman" w:eastAsia="Times New Roman" w:hAnsi="Times New Roman" w:cs="Times New Roman"/>
-              </w:rPr>
-            </w:pPr>
-            <w:r>
-              <w:rPr>
-                <w:rFonts w:ascii="Times New Roman" w:eastAsia="Times New Roman" w:hAnsi="Times New Roman" w:cs="Times New Roman"/>
-              </w:rPr>
-              <w:t xml:space="preserve">           col = "</w:t>
-            </w:r>
-            <w:proofErr w:type="spellStart"/>
-            <w:r>
-              <w:rPr>
-                <w:rFonts w:ascii="Times New Roman" w:eastAsia="Times New Roman" w:hAnsi="Times New Roman" w:cs="Times New Roman"/>
-              </w:rPr>
-              <w:t>steelblue</w:t>
-            </w:r>
-            <w:proofErr w:type="spellEnd"/>
-            <w:r>
-              <w:rPr>
-                <w:rFonts w:ascii="Times New Roman" w:eastAsia="Times New Roman" w:hAnsi="Times New Roman" w:cs="Times New Roman"/>
-              </w:rPr>
-              <w:t>")</w:t>
-            </w:r>
-          </w:p>
-          <w:p>
-            <w:pPr>
-              <w:rPr>
-                <w:rFonts w:ascii="Times New Roman" w:eastAsia="Times New Roman" w:hAnsi="Times New Roman" w:cs="Times New Roman"/>
-              </w:rPr>
-            </w:pPr>
-          </w:p>
-          <w:p>
-            <w:pPr>
-              <w:rPr>
-                <w:rFonts w:ascii="Times New Roman" w:eastAsia="Times New Roman" w:hAnsi="Times New Roman" w:cs="Times New Roman"/>
-              </w:rPr>
-            </w:pPr>
-            <w:proofErr w:type="gramStart"/>
-            <w:r>
-              <w:rPr>
-                <w:rFonts w:ascii="Times New Roman" w:eastAsia="Times New Roman" w:hAnsi="Times New Roman" w:cs="Times New Roman"/>
-              </w:rPr>
-              <w:t>cat(</w:t>
-            </w:r>
-            <w:proofErr w:type="gramEnd"/>
-            <w:r>
-              <w:rPr>
-                <w:rFonts w:ascii="Times New Roman" w:eastAsia="Times New Roman" w:hAnsi="Times New Roman" w:cs="Times New Roman"/>
-              </w:rPr>
-              <w:t xml:space="preserve">"Displayed: </w:t>
-            </w:r>
-            <w:proofErr w:type="spellStart"/>
-            <w:r>
-              <w:rPr>
-                <w:rFonts w:ascii="Times New Roman" w:eastAsia="Times New Roman" w:hAnsi="Times New Roman" w:cs="Times New Roman"/>
-              </w:rPr>
-              <w:t>Stripchart</w:t>
-            </w:r>
-            <w:proofErr w:type="spellEnd"/>
-            <w:r>
-              <w:rPr>
-                <w:rFonts w:ascii="Times New Roman" w:eastAsia="Times New Roman" w:hAnsi="Times New Roman" w:cs="Times New Roman"/>
-              </w:rPr>
-              <w:t xml:space="preserve"> for Alcohol Consumption\n")</w:t>
-            </w:r>
-          </w:p>
-          <w:p>
-            <w:pPr>
-              <w:rPr>
-                <w:rFonts w:ascii="Times New Roman" w:eastAsia="Times New Roman" w:hAnsi="Times New Roman" w:cs="Times New Roman"/>
-              </w:rPr>
-            </w:pPr>
-          </w:p>
-          <w:p>
-            <w:pPr>
-              <w:rPr>
-                <w:rFonts w:ascii="Times New Roman" w:eastAsia="Times New Roman" w:hAnsi="Times New Roman" w:cs="Times New Roman"/>
-              </w:rPr>
-            </w:pPr>
-            <w:r>
-              <w:rPr>
-                <w:rFonts w:ascii="Times New Roman" w:eastAsia="Times New Roman" w:hAnsi="Times New Roman" w:cs="Times New Roman"/>
-              </w:rPr>
-              <w:t># --------------------------------------------------</w:t>
-            </w:r>
-          </w:p>
-          <w:p>
-            <w:pPr>
-              <w:rPr>
-                <w:rFonts w:ascii="Times New Roman" w:eastAsia="Times New Roman" w:hAnsi="Times New Roman" w:cs="Times New Roman"/>
-              </w:rPr>
-            </w:pPr>
-            <w:r>
-              <w:rPr>
-                <w:rFonts w:ascii="Times New Roman" w:eastAsia="Times New Roman" w:hAnsi="Times New Roman" w:cs="Times New Roman"/>
-              </w:rPr>
-              <w:t xml:space="preserve"># Visualization 5: </w:t>
-            </w:r>
-            <w:proofErr w:type="spellStart"/>
-            <w:r>
-              <w:rPr>
-                <w:rFonts w:ascii="Times New Roman" w:eastAsia="Times New Roman" w:hAnsi="Times New Roman" w:cs="Times New Roman"/>
-              </w:rPr>
-              <w:t>Barplot</w:t>
-            </w:r>
-            <w:proofErr w:type="spellEnd"/>
-            <w:r>
-              <w:rPr>
-                <w:rFonts w:ascii="Times New Roman" w:eastAsia="Times New Roman" w:hAnsi="Times New Roman" w:cs="Times New Roman"/>
-              </w:rPr>
-              <w:t xml:space="preserve"> (Life Expectancy)</w:t>
-            </w:r>
-          </w:p>
-          <w:p>
-            <w:pPr>
-              <w:rPr>
-                <w:rFonts w:ascii="Times New Roman" w:eastAsia="Times New Roman" w:hAnsi="Times New Roman" w:cs="Times New Roman"/>
-              </w:rPr>
-            </w:pPr>
-            <w:r>
-              <w:rPr>
-                <w:rFonts w:ascii="Times New Roman" w:eastAsia="Times New Roman" w:hAnsi="Times New Roman" w:cs="Times New Roman"/>
-              </w:rPr>
-              <w:t># --------------------------------------------------</w:t>
-            </w:r>
-          </w:p>
-          <w:p>
-            <w:pPr>
-              <w:rPr>
-                <w:rFonts w:ascii="Times New Roman" w:eastAsia="Times New Roman" w:hAnsi="Times New Roman" w:cs="Times New Roman"/>
-              </w:rPr>
-            </w:pPr>
-          </w:p>
-          <w:p>
-            <w:pPr>
-              <w:rPr>
-                <w:rFonts w:ascii="Times New Roman" w:eastAsia="Times New Roman" w:hAnsi="Times New Roman" w:cs="Times New Roman"/>
-              </w:rPr>
-            </w:pPr>
-            <w:proofErr w:type="spellStart"/>
-            <w:r>
-              <w:rPr>
-                <w:rFonts w:ascii="Times New Roman" w:eastAsia="Times New Roman" w:hAnsi="Times New Roman" w:cs="Times New Roman"/>
-              </w:rPr>
-              <w:t>life_bins</w:t>
-            </w:r>
-            <w:proofErr w:type="spellEnd"/>
-            <w:r>
-              <w:rPr>
-                <w:rFonts w:ascii="Times New Roman" w:eastAsia="Times New Roman" w:hAnsi="Times New Roman" w:cs="Times New Roman"/>
-              </w:rPr>
-              <w:t xml:space="preserve"> &lt;- </w:t>
-            </w:r>
-            <w:proofErr w:type="gramStart"/>
-            <w:r>
-              <w:rPr>
-                <w:rFonts w:ascii="Times New Roman" w:eastAsia="Times New Roman" w:hAnsi="Times New Roman" w:cs="Times New Roman"/>
-              </w:rPr>
-              <w:t>cut(</w:t>
-            </w:r>
-            <w:proofErr w:type="spellStart"/>
-            <w:proofErr w:type="gramEnd"/>
-            <w:r>
-              <w:rPr>
-                <w:rFonts w:ascii="Times New Roman" w:eastAsia="Times New Roman" w:hAnsi="Times New Roman" w:cs="Times New Roman"/>
-              </w:rPr>
-              <w:t>data_clean$Life_Expectancy</w:t>
-            </w:r>
-            <w:proofErr w:type="spellEnd"/>
-            <w:r>
-              <w:rPr>
-                <w:rFonts w:ascii="Times New Roman" w:eastAsia="Times New Roman" w:hAnsi="Times New Roman" w:cs="Times New Roman"/>
-              </w:rPr>
-              <w:t>,</w:t>
-            </w:r>
-          </w:p>
-          <w:p>
-            <w:pPr>
-              <w:rPr>
-                <w:rFonts w:ascii="Times New Roman" w:eastAsia="Times New Roman" w:hAnsi="Times New Roman" w:cs="Times New Roman"/>
-              </w:rPr>
-            </w:pPr>
-            <w:r>
-              <w:rPr>
-                <w:rFonts w:ascii="Times New Roman" w:eastAsia="Times New Roman" w:hAnsi="Times New Roman" w:cs="Times New Roman"/>
-              </w:rPr>
-              <w:lastRenderedPageBreak/>
-              <w:t xml:space="preserve">                 breaks = 10,</w:t>
-            </w:r>
-          </w:p>
-          <w:p>
-            <w:pPr>
-              <w:rPr>
-                <w:rFonts w:ascii="Times New Roman" w:eastAsia="Times New Roman" w:hAnsi="Times New Roman" w:cs="Times New Roman"/>
-              </w:rPr>
-            </w:pPr>
-            <w:r>
-              <w:rPr>
-                <w:rFonts w:ascii="Times New Roman" w:eastAsia="Times New Roman" w:hAnsi="Times New Roman" w:cs="Times New Roman"/>
-              </w:rPr>
-              <w:t xml:space="preserve">                 </w:t>
-            </w:r>
-            <w:proofErr w:type="spellStart"/>
-            <w:proofErr w:type="gramStart"/>
-            <w:r>
-              <w:rPr>
-                <w:rFonts w:ascii="Times New Roman" w:eastAsia="Times New Roman" w:hAnsi="Times New Roman" w:cs="Times New Roman"/>
-              </w:rPr>
-              <w:t>include.lowest</w:t>
-            </w:r>
-            <w:proofErr w:type="spellEnd"/>
-            <w:proofErr w:type="gramEnd"/>
-            <w:r>
-              <w:rPr>
-                <w:rFonts w:ascii="Times New Roman" w:eastAsia="Times New Roman" w:hAnsi="Times New Roman" w:cs="Times New Roman"/>
-              </w:rPr>
-              <w:t xml:space="preserve"> = TRUE)</w:t>
-            </w:r>
-          </w:p>
-          <w:p>
-            <w:pPr>
-              <w:rPr>
-                <w:rFonts w:ascii="Times New Roman" w:eastAsia="Times New Roman" w:hAnsi="Times New Roman" w:cs="Times New Roman"/>
-              </w:rPr>
-            </w:pPr>
-          </w:p>
-          <w:p>
-            <w:pPr>
-              <w:rPr>
-                <w:rFonts w:ascii="Times New Roman" w:eastAsia="Times New Roman" w:hAnsi="Times New Roman" w:cs="Times New Roman"/>
-              </w:rPr>
-            </w:pPr>
-            <w:proofErr w:type="spellStart"/>
-            <w:r>
-              <w:rPr>
-                <w:rFonts w:ascii="Times New Roman" w:eastAsia="Times New Roman" w:hAnsi="Times New Roman" w:cs="Times New Roman"/>
-              </w:rPr>
-              <w:t>life_counts</w:t>
-            </w:r>
-            <w:proofErr w:type="spellEnd"/>
-            <w:r>
-              <w:rPr>
-                <w:rFonts w:ascii="Times New Roman" w:eastAsia="Times New Roman" w:hAnsi="Times New Roman" w:cs="Times New Roman"/>
-              </w:rPr>
-              <w:t xml:space="preserve"> &lt;- table(</w:t>
-            </w:r>
-            <w:proofErr w:type="spellStart"/>
-            <w:r>
-              <w:rPr>
-                <w:rFonts w:ascii="Times New Roman" w:eastAsia="Times New Roman" w:hAnsi="Times New Roman" w:cs="Times New Roman"/>
-              </w:rPr>
-              <w:t>life_bins</w:t>
-            </w:r>
-            <w:proofErr w:type="spellEnd"/>
-            <w:r>
-              <w:rPr>
-                <w:rFonts w:ascii="Times New Roman" w:eastAsia="Times New Roman" w:hAnsi="Times New Roman" w:cs="Times New Roman"/>
-              </w:rPr>
-              <w:t>)</w:t>
-            </w:r>
-          </w:p>
-          <w:p>
-            <w:pPr>
-              <w:rPr>
-                <w:rFonts w:ascii="Times New Roman" w:eastAsia="Times New Roman" w:hAnsi="Times New Roman" w:cs="Times New Roman"/>
-              </w:rPr>
-            </w:pPr>
-          </w:p>
-          <w:p>
-            <w:pPr>
-              <w:rPr>
-                <w:rFonts w:ascii="Times New Roman" w:eastAsia="Times New Roman" w:hAnsi="Times New Roman" w:cs="Times New Roman"/>
-              </w:rPr>
-            </w:pPr>
-            <w:proofErr w:type="spellStart"/>
-            <w:proofErr w:type="gramStart"/>
-            <w:r>
-              <w:rPr>
-                <w:rFonts w:ascii="Times New Roman" w:eastAsia="Times New Roman" w:hAnsi="Times New Roman" w:cs="Times New Roman"/>
-              </w:rPr>
-              <w:t>barplot</w:t>
-            </w:r>
-            <w:proofErr w:type="spellEnd"/>
-            <w:r>
-              <w:rPr>
-                <w:rFonts w:ascii="Times New Roman" w:eastAsia="Times New Roman" w:hAnsi="Times New Roman" w:cs="Times New Roman"/>
-              </w:rPr>
-              <w:t>(</w:t>
-            </w:r>
-            <w:proofErr w:type="spellStart"/>
-            <w:proofErr w:type="gramEnd"/>
-            <w:r>
-              <w:rPr>
-                <w:rFonts w:ascii="Times New Roman" w:eastAsia="Times New Roman" w:hAnsi="Times New Roman" w:cs="Times New Roman"/>
-              </w:rPr>
-              <w:t>life_counts</w:t>
-            </w:r>
-            <w:proofErr w:type="spellEnd"/>
-            <w:r>
-              <w:rPr>
-                <w:rFonts w:ascii="Times New Roman" w:eastAsia="Times New Roman" w:hAnsi="Times New Roman" w:cs="Times New Roman"/>
-              </w:rPr>
-              <w:t>,</w:t>
-            </w:r>
-          </w:p>
-          <w:p>
-            <w:pPr>
-              <w:rPr>
-                <w:rFonts w:ascii="Times New Roman" w:eastAsia="Times New Roman" w:hAnsi="Times New Roman" w:cs="Times New Roman"/>
-              </w:rPr>
-            </w:pPr>
-            <w:r>
-              <w:rPr>
-                <w:rFonts w:ascii="Times New Roman" w:eastAsia="Times New Roman" w:hAnsi="Times New Roman" w:cs="Times New Roman"/>
-              </w:rPr>
-              <w:t xml:space="preserve">        main = "</w:t>
-            </w:r>
-            <w:proofErr w:type="spellStart"/>
-            <w:r>
-              <w:rPr>
-                <w:rFonts w:ascii="Times New Roman" w:eastAsia="Times New Roman" w:hAnsi="Times New Roman" w:cs="Times New Roman"/>
-              </w:rPr>
-              <w:t>Barplot</w:t>
-            </w:r>
-            <w:proofErr w:type="spellEnd"/>
-            <w:r>
-              <w:rPr>
-                <w:rFonts w:ascii="Times New Roman" w:eastAsia="Times New Roman" w:hAnsi="Times New Roman" w:cs="Times New Roman"/>
-              </w:rPr>
-              <w:t xml:space="preserve"> of Life Expectancy Bins",</w:t>
-            </w:r>
-          </w:p>
-          <w:p>
-            <w:pPr>
-              <w:rPr>
-                <w:rFonts w:ascii="Times New Roman" w:eastAsia="Times New Roman" w:hAnsi="Times New Roman" w:cs="Times New Roman"/>
-              </w:rPr>
-            </w:pPr>
-            <w:r>
-              <w:rPr>
-                <w:rFonts w:ascii="Times New Roman" w:eastAsia="Times New Roman" w:hAnsi="Times New Roman" w:cs="Times New Roman"/>
-              </w:rPr>
-              <w:t xml:space="preserve">        </w:t>
-            </w:r>
-            <w:proofErr w:type="spellStart"/>
-            <w:r>
-              <w:rPr>
-                <w:rFonts w:ascii="Times New Roman" w:eastAsia="Times New Roman" w:hAnsi="Times New Roman" w:cs="Times New Roman"/>
-              </w:rPr>
-              <w:t>xlab</w:t>
-            </w:r>
-            <w:proofErr w:type="spellEnd"/>
-            <w:r>
-              <w:rPr>
-                <w:rFonts w:ascii="Times New Roman" w:eastAsia="Times New Roman" w:hAnsi="Times New Roman" w:cs="Times New Roman"/>
-              </w:rPr>
-              <w:t xml:space="preserve"> = "Life Expectancy Range (years)",</w:t>
-            </w:r>
-          </w:p>
-          <w:p>
-            <w:pPr>
-              <w:rPr>
-                <w:rFonts w:ascii="Times New Roman" w:eastAsia="Times New Roman" w:hAnsi="Times New Roman" w:cs="Times New Roman"/>
-              </w:rPr>
-            </w:pPr>
-            <w:r>
-              <w:rPr>
-                <w:rFonts w:ascii="Times New Roman" w:eastAsia="Times New Roman" w:hAnsi="Times New Roman" w:cs="Times New Roman"/>
-              </w:rPr>
-              <w:t xml:space="preserve">        </w:t>
-            </w:r>
-            <w:proofErr w:type="spellStart"/>
-            <w:r>
-              <w:rPr>
-                <w:rFonts w:ascii="Times New Roman" w:eastAsia="Times New Roman" w:hAnsi="Times New Roman" w:cs="Times New Roman"/>
-              </w:rPr>
-              <w:t>ylab</w:t>
-            </w:r>
-            <w:proofErr w:type="spellEnd"/>
-            <w:r>
-              <w:rPr>
-                <w:rFonts w:ascii="Times New Roman" w:eastAsia="Times New Roman" w:hAnsi="Times New Roman" w:cs="Times New Roman"/>
-              </w:rPr>
-              <w:t xml:space="preserve"> = "Count",</w:t>
-            </w:r>
-          </w:p>
-          <w:p>
-            <w:pPr>
-              <w:rPr>
-                <w:rFonts w:ascii="Times New Roman" w:eastAsia="Times New Roman" w:hAnsi="Times New Roman" w:cs="Times New Roman"/>
-              </w:rPr>
-            </w:pPr>
-            <w:r>
-              <w:rPr>
-                <w:rFonts w:ascii="Times New Roman" w:eastAsia="Times New Roman" w:hAnsi="Times New Roman" w:cs="Times New Roman"/>
-              </w:rPr>
-              <w:t xml:space="preserve">        col = "coral",</w:t>
-            </w:r>
-          </w:p>
-          <w:p>
-            <w:pPr>
-              <w:rPr>
-                <w:rFonts w:ascii="Times New Roman" w:eastAsia="Times New Roman" w:hAnsi="Times New Roman" w:cs="Times New Roman"/>
-              </w:rPr>
-            </w:pPr>
-            <w:r>
-              <w:rPr>
-                <w:rFonts w:ascii="Times New Roman" w:eastAsia="Times New Roman" w:hAnsi="Times New Roman" w:cs="Times New Roman"/>
-              </w:rPr>
-              <w:t xml:space="preserve">        las = 2)</w:t>
-            </w:r>
-          </w:p>
-          <w:p>
-            <w:pPr>
-              <w:rPr>
-                <w:rFonts w:ascii="Times New Roman" w:eastAsia="Times New Roman" w:hAnsi="Times New Roman" w:cs="Times New Roman"/>
-              </w:rPr>
-            </w:pPr>
-          </w:p>
-          <w:p>
-            <w:pPr>
-              <w:rPr>
-                <w:rFonts w:ascii="Times New Roman" w:eastAsia="Times New Roman" w:hAnsi="Times New Roman" w:cs="Times New Roman"/>
-              </w:rPr>
-            </w:pPr>
-            <w:proofErr w:type="gramStart"/>
-            <w:r>
-              <w:rPr>
-                <w:rFonts w:ascii="Times New Roman" w:eastAsia="Times New Roman" w:hAnsi="Times New Roman" w:cs="Times New Roman"/>
-              </w:rPr>
-              <w:t>cat(</w:t>
-            </w:r>
-            <w:proofErr w:type="gramEnd"/>
-            <w:r>
-              <w:rPr>
-                <w:rFonts w:ascii="Times New Roman" w:eastAsia="Times New Roman" w:hAnsi="Times New Roman" w:cs="Times New Roman"/>
-              </w:rPr>
-              <w:t xml:space="preserve">"Displayed: </w:t>
-            </w:r>
-            <w:proofErr w:type="spellStart"/>
-            <w:r>
-              <w:rPr>
-                <w:rFonts w:ascii="Times New Roman" w:eastAsia="Times New Roman" w:hAnsi="Times New Roman" w:cs="Times New Roman"/>
-              </w:rPr>
-              <w:t>Barplot</w:t>
-            </w:r>
-            <w:proofErr w:type="spellEnd"/>
-            <w:r>
-              <w:rPr>
-                <w:rFonts w:ascii="Times New Roman" w:eastAsia="Times New Roman" w:hAnsi="Times New Roman" w:cs="Times New Roman"/>
-              </w:rPr>
-              <w:t xml:space="preserve"> for Life Expectancy\n\n")</w:t>
-            </w:r>
-          </w:p>
-          <w:p>
-            <w:pPr>
-              <w:rPr>
-                <w:rFonts w:ascii="Times New Roman" w:eastAsia="Times New Roman" w:hAnsi="Times New Roman" w:cs="Times New Roman"/>
-              </w:rPr>
-            </w:pPr>
-          </w:p>
-          <w:p>
-            <w:pPr>
-              <w:rPr>
-                <w:rFonts w:ascii="Times New Roman" w:eastAsia="Times New Roman" w:hAnsi="Times New Roman" w:cs="Times New Roman"/>
-              </w:rPr>
-            </w:pPr>
-            <w:r>
-              <w:rPr>
-                <w:rFonts w:ascii="Times New Roman" w:eastAsia="Times New Roman" w:hAnsi="Times New Roman" w:cs="Times New Roman"/>
-              </w:rPr>
-              <w:t># Scatter plot with regression line</w:t>
-            </w:r>
-          </w:p>
-          <w:p>
-            <w:pPr>
-              <w:rPr>
-                <w:rFonts w:ascii="Times New Roman" w:eastAsia="Times New Roman" w:hAnsi="Times New Roman" w:cs="Times New Roman"/>
-              </w:rPr>
-            </w:pPr>
-            <w:proofErr w:type="spellStart"/>
-            <w:r>
-              <w:rPr>
-                <w:rFonts w:ascii="Times New Roman" w:eastAsia="Times New Roman" w:hAnsi="Times New Roman" w:cs="Times New Roman"/>
-              </w:rPr>
-              <w:t>scatter_plot</w:t>
-            </w:r>
-            <w:proofErr w:type="spellEnd"/>
-            <w:r>
-              <w:rPr>
-                <w:rFonts w:ascii="Times New Roman" w:eastAsia="Times New Roman" w:hAnsi="Times New Roman" w:cs="Times New Roman"/>
-              </w:rPr>
-              <w:t xml:space="preserve"> &lt;- </w:t>
-            </w:r>
-            <w:proofErr w:type="spellStart"/>
-            <w:proofErr w:type="gramStart"/>
-            <w:r>
-              <w:rPr>
-                <w:rFonts w:ascii="Times New Roman" w:eastAsia="Times New Roman" w:hAnsi="Times New Roman" w:cs="Times New Roman"/>
-              </w:rPr>
-              <w:t>ggplot</w:t>
-            </w:r>
-            <w:proofErr w:type="spellEnd"/>
-            <w:r>
-              <w:rPr>
-                <w:rFonts w:ascii="Times New Roman" w:eastAsia="Times New Roman" w:hAnsi="Times New Roman" w:cs="Times New Roman"/>
-              </w:rPr>
-              <w:t>(</w:t>
-            </w:r>
-            <w:proofErr w:type="spellStart"/>
-            <w:proofErr w:type="gramEnd"/>
-            <w:r>
-              <w:rPr>
-                <w:rFonts w:ascii="Times New Roman" w:eastAsia="Times New Roman" w:hAnsi="Times New Roman" w:cs="Times New Roman"/>
-              </w:rPr>
-              <w:t>data_clean</w:t>
-            </w:r>
-            <w:proofErr w:type="spellEnd"/>
-            <w:r>
-              <w:rPr>
-                <w:rFonts w:ascii="Times New Roman" w:eastAsia="Times New Roman" w:hAnsi="Times New Roman" w:cs="Times New Roman"/>
-              </w:rPr>
-              <w:t xml:space="preserve">, </w:t>
-            </w:r>
-            <w:proofErr w:type="spellStart"/>
-            <w:proofErr w:type="gramStart"/>
-            <w:r>
-              <w:rPr>
-                <w:rFonts w:ascii="Times New Roman" w:eastAsia="Times New Roman" w:hAnsi="Times New Roman" w:cs="Times New Roman"/>
-              </w:rPr>
-              <w:t>aes</w:t>
-            </w:r>
-            <w:proofErr w:type="spellEnd"/>
-            <w:r>
-              <w:rPr>
-                <w:rFonts w:ascii="Times New Roman" w:eastAsia="Times New Roman" w:hAnsi="Times New Roman" w:cs="Times New Roman"/>
-              </w:rPr>
-              <w:t>(</w:t>
-            </w:r>
-            <w:proofErr w:type="gramEnd"/>
-            <w:r>
-              <w:rPr>
-                <w:rFonts w:ascii="Times New Roman" w:eastAsia="Times New Roman" w:hAnsi="Times New Roman" w:cs="Times New Roman"/>
-              </w:rPr>
-              <w:t xml:space="preserve">x = </w:t>
-            </w:r>
-            <w:proofErr w:type="spellStart"/>
-            <w:r>
-              <w:rPr>
-                <w:rFonts w:ascii="Times New Roman" w:eastAsia="Times New Roman" w:hAnsi="Times New Roman" w:cs="Times New Roman"/>
-              </w:rPr>
-              <w:t>Alcohol_Consumption</w:t>
-            </w:r>
-            <w:proofErr w:type="spellEnd"/>
-            <w:r>
-              <w:rPr>
-                <w:rFonts w:ascii="Times New Roman" w:eastAsia="Times New Roman" w:hAnsi="Times New Roman" w:cs="Times New Roman"/>
-              </w:rPr>
-              <w:t xml:space="preserve">, y = </w:t>
-            </w:r>
-            <w:proofErr w:type="spellStart"/>
-            <w:r>
-              <w:rPr>
-                <w:rFonts w:ascii="Times New Roman" w:eastAsia="Times New Roman" w:hAnsi="Times New Roman" w:cs="Times New Roman"/>
-              </w:rPr>
-              <w:t>Life_Expectancy</w:t>
-            </w:r>
-            <w:proofErr w:type="spellEnd"/>
-            <w:r>
-              <w:rPr>
-                <w:rFonts w:ascii="Times New Roman" w:eastAsia="Times New Roman" w:hAnsi="Times New Roman" w:cs="Times New Roman"/>
-              </w:rPr>
-              <w:t>)) +</w:t>
-            </w:r>
-          </w:p>
-          <w:p>
-            <w:pPr>
-              <w:rPr>
-                <w:rFonts w:ascii="Times New Roman" w:eastAsia="Times New Roman" w:hAnsi="Times New Roman" w:cs="Times New Roman"/>
-              </w:rPr>
-            </w:pPr>
-            <w:r>
-              <w:rPr>
-                <w:rFonts w:ascii="Times New Roman" w:eastAsia="Times New Roman" w:hAnsi="Times New Roman" w:cs="Times New Roman"/>
-              </w:rPr>
-              <w:t xml:space="preserve">  </w:t>
-            </w:r>
-            <w:proofErr w:type="spellStart"/>
-            <w:r>
-              <w:rPr>
-                <w:rFonts w:ascii="Times New Roman" w:eastAsia="Times New Roman" w:hAnsi="Times New Roman" w:cs="Times New Roman"/>
-              </w:rPr>
-              <w:t>geom_</w:t>
-            </w:r>
-            <w:proofErr w:type="gramStart"/>
-            <w:r>
-              <w:rPr>
-                <w:rFonts w:ascii="Times New Roman" w:eastAsia="Times New Roman" w:hAnsi="Times New Roman" w:cs="Times New Roman"/>
-              </w:rPr>
-              <w:t>point</w:t>
-            </w:r>
-            <w:proofErr w:type="spellEnd"/>
-            <w:r>
-              <w:rPr>
-                <w:rFonts w:ascii="Times New Roman" w:eastAsia="Times New Roman" w:hAnsi="Times New Roman" w:cs="Times New Roman"/>
-              </w:rPr>
-              <w:t>(</w:t>
-            </w:r>
-            <w:proofErr w:type="gramEnd"/>
-            <w:r>
-              <w:rPr>
-                <w:rFonts w:ascii="Times New Roman" w:eastAsia="Times New Roman" w:hAnsi="Times New Roman" w:cs="Times New Roman"/>
-              </w:rPr>
-              <w:t xml:space="preserve">alpha = 0.6, size = 3, </w:t>
-            </w:r>
-            <w:proofErr w:type="spellStart"/>
-            <w:r>
-              <w:rPr>
-                <w:rFonts w:ascii="Times New Roman" w:eastAsia="Times New Roman" w:hAnsi="Times New Roman" w:cs="Times New Roman"/>
-              </w:rPr>
-              <w:t>color</w:t>
-            </w:r>
-            <w:proofErr w:type="spellEnd"/>
-            <w:r>
-              <w:rPr>
-                <w:rFonts w:ascii="Times New Roman" w:eastAsia="Times New Roman" w:hAnsi="Times New Roman" w:cs="Times New Roman"/>
-              </w:rPr>
-              <w:t xml:space="preserve"> = "</w:t>
-            </w:r>
-            <w:proofErr w:type="spellStart"/>
-            <w:r>
-              <w:rPr>
-                <w:rFonts w:ascii="Times New Roman" w:eastAsia="Times New Roman" w:hAnsi="Times New Roman" w:cs="Times New Roman"/>
-              </w:rPr>
-              <w:t>darkblue</w:t>
-            </w:r>
-            <w:proofErr w:type="spellEnd"/>
-            <w:r>
-              <w:rPr>
-                <w:rFonts w:ascii="Times New Roman" w:eastAsia="Times New Roman" w:hAnsi="Times New Roman" w:cs="Times New Roman"/>
-              </w:rPr>
-              <w:t>") +</w:t>
-            </w:r>
-          </w:p>
-          <w:p>
-            <w:pPr>
-              <w:rPr>
-                <w:rFonts w:ascii="Times New Roman" w:eastAsia="Times New Roman" w:hAnsi="Times New Roman" w:cs="Times New Roman"/>
-              </w:rPr>
-            </w:pPr>
-            <w:r>
-              <w:rPr>
-                <w:rFonts w:ascii="Times New Roman" w:eastAsia="Times New Roman" w:hAnsi="Times New Roman" w:cs="Times New Roman"/>
-              </w:rPr>
-              <w:t xml:space="preserve">  </w:t>
-            </w:r>
-            <w:proofErr w:type="spellStart"/>
-            <w:r>
-              <w:rPr>
-                <w:rFonts w:ascii="Times New Roman" w:eastAsia="Times New Roman" w:hAnsi="Times New Roman" w:cs="Times New Roman"/>
-              </w:rPr>
-              <w:t>geom_</w:t>
-            </w:r>
-            <w:proofErr w:type="gramStart"/>
-            <w:r>
-              <w:rPr>
-                <w:rFonts w:ascii="Times New Roman" w:eastAsia="Times New Roman" w:hAnsi="Times New Roman" w:cs="Times New Roman"/>
-              </w:rPr>
-              <w:t>smooth</w:t>
-            </w:r>
-            <w:proofErr w:type="spellEnd"/>
-            <w:r>
-              <w:rPr>
-                <w:rFonts w:ascii="Times New Roman" w:eastAsia="Times New Roman" w:hAnsi="Times New Roman" w:cs="Times New Roman"/>
-              </w:rPr>
-              <w:t>(</w:t>
-            </w:r>
-            <w:proofErr w:type="gramEnd"/>
-            <w:r>
-              <w:rPr>
-                <w:rFonts w:ascii="Times New Roman" w:eastAsia="Times New Roman" w:hAnsi="Times New Roman" w:cs="Times New Roman"/>
-              </w:rPr>
-              <w:t>method = "</w:t>
-            </w:r>
-            <w:proofErr w:type="spellStart"/>
-            <w:r>
-              <w:rPr>
-                <w:rFonts w:ascii="Times New Roman" w:eastAsia="Times New Roman" w:hAnsi="Times New Roman" w:cs="Times New Roman"/>
-              </w:rPr>
-              <w:t>lm</w:t>
-            </w:r>
-            <w:proofErr w:type="spellEnd"/>
-            <w:r>
-              <w:rPr>
-                <w:rFonts w:ascii="Times New Roman" w:eastAsia="Times New Roman" w:hAnsi="Times New Roman" w:cs="Times New Roman"/>
-              </w:rPr>
-              <w:t xml:space="preserve">", se = TRUE, </w:t>
-            </w:r>
-            <w:proofErr w:type="spellStart"/>
-            <w:r>
-              <w:rPr>
-                <w:rFonts w:ascii="Times New Roman" w:eastAsia="Times New Roman" w:hAnsi="Times New Roman" w:cs="Times New Roman"/>
-              </w:rPr>
-              <w:t>color</w:t>
-            </w:r>
-            <w:proofErr w:type="spellEnd"/>
-            <w:r>
-              <w:rPr>
-                <w:rFonts w:ascii="Times New Roman" w:eastAsia="Times New Roman" w:hAnsi="Times New Roman" w:cs="Times New Roman"/>
-              </w:rPr>
-              <w:t xml:space="preserve"> = "red", linewidth = 1) +</w:t>
-            </w:r>
-          </w:p>
-          <w:p>
-            <w:pPr>
-              <w:rPr>
-                <w:rFonts w:ascii="Times New Roman" w:eastAsia="Times New Roman" w:hAnsi="Times New Roman" w:cs="Times New Roman"/>
-              </w:rPr>
-            </w:pPr>
-            <w:r>
-              <w:rPr>
-                <w:rFonts w:ascii="Times New Roman" w:eastAsia="Times New Roman" w:hAnsi="Times New Roman" w:cs="Times New Roman"/>
-              </w:rPr>
-              <w:t xml:space="preserve">  </w:t>
-            </w:r>
-            <w:proofErr w:type="gramStart"/>
-            <w:r>
-              <w:rPr>
-                <w:rFonts w:ascii="Times New Roman" w:eastAsia="Times New Roman" w:hAnsi="Times New Roman" w:cs="Times New Roman"/>
-              </w:rPr>
-              <w:t>labs(</w:t>
-            </w:r>
-            <w:proofErr w:type="gramEnd"/>
-            <w:r>
-              <w:rPr>
-                <w:rFonts w:ascii="Times New Roman" w:eastAsia="Times New Roman" w:hAnsi="Times New Roman" w:cs="Times New Roman"/>
-              </w:rPr>
-              <w:t>title = "Relationship between Alcohol Consumption and Life Expectancy",</w:t>
-            </w:r>
-          </w:p>
-          <w:p>
-            <w:pPr>
-              <w:rPr>
-                <w:rFonts w:ascii="Times New Roman" w:eastAsia="Times New Roman" w:hAnsi="Times New Roman" w:cs="Times New Roman"/>
-              </w:rPr>
-            </w:pPr>
-            <w:r>
-              <w:rPr>
-                <w:rFonts w:ascii="Times New Roman" w:eastAsia="Times New Roman" w:hAnsi="Times New Roman" w:cs="Times New Roman"/>
-              </w:rPr>
-              <w:t xml:space="preserve">       x = "Alcohol Consumption per Capita (litres)",</w:t>
-            </w:r>
-          </w:p>
-          <w:p>
-            <w:pPr>
-              <w:rPr>
-                <w:rFonts w:ascii="Times New Roman" w:eastAsia="Times New Roman" w:hAnsi="Times New Roman" w:cs="Times New Roman"/>
-              </w:rPr>
-            </w:pPr>
-            <w:r>
-              <w:rPr>
-                <w:rFonts w:ascii="Times New Roman" w:eastAsia="Times New Roman" w:hAnsi="Times New Roman" w:cs="Times New Roman"/>
-              </w:rPr>
-              <w:t xml:space="preserve">       y = "Life Expectancy at Birth (years)") +</w:t>
-            </w:r>
-          </w:p>
-          <w:p>
-            <w:pPr>
-              <w:rPr>
-                <w:rFonts w:ascii="Times New Roman" w:eastAsia="Times New Roman" w:hAnsi="Times New Roman" w:cs="Times New Roman"/>
-              </w:rPr>
-            </w:pPr>
-            <w:r>
-              <w:rPr>
-                <w:rFonts w:ascii="Times New Roman" w:eastAsia="Times New Roman" w:hAnsi="Times New Roman" w:cs="Times New Roman"/>
-              </w:rPr>
-              <w:t xml:space="preserve">  </w:t>
-            </w:r>
-            <w:proofErr w:type="spellStart"/>
-            <w:r>
-              <w:rPr>
-                <w:rFonts w:ascii="Times New Roman" w:eastAsia="Times New Roman" w:hAnsi="Times New Roman" w:cs="Times New Roman"/>
-              </w:rPr>
-              <w:t>theme_</w:t>
-            </w:r>
-            <w:proofErr w:type="gramStart"/>
-            <w:r>
-              <w:rPr>
-                <w:rFonts w:ascii="Times New Roman" w:eastAsia="Times New Roman" w:hAnsi="Times New Roman" w:cs="Times New Roman"/>
-              </w:rPr>
-              <w:t>minimal</w:t>
-            </w:r>
-            <w:proofErr w:type="spellEnd"/>
-            <w:r>
-              <w:rPr>
-                <w:rFonts w:ascii="Times New Roman" w:eastAsia="Times New Roman" w:hAnsi="Times New Roman" w:cs="Times New Roman"/>
-              </w:rPr>
-              <w:t>(</w:t>
-            </w:r>
-            <w:proofErr w:type="gramEnd"/>
-            <w:r>
-              <w:rPr>
-                <w:rFonts w:ascii="Times New Roman" w:eastAsia="Times New Roman" w:hAnsi="Times New Roman" w:cs="Times New Roman"/>
-              </w:rPr>
-              <w:t>) +</w:t>
-            </w:r>
-          </w:p>
-          <w:p>
-            <w:pPr>
-              <w:rPr>
-                <w:rFonts w:ascii="Times New Roman" w:eastAsia="Times New Roman" w:hAnsi="Times New Roman" w:cs="Times New Roman"/>
-              </w:rPr>
-            </w:pPr>
-            <w:r>
-              <w:rPr>
-                <w:rFonts w:ascii="Times New Roman" w:eastAsia="Times New Roman" w:hAnsi="Times New Roman" w:cs="Times New Roman"/>
-              </w:rPr>
-              <w:t xml:space="preserve">  </w:t>
-            </w:r>
-            <w:proofErr w:type="gramStart"/>
-            <w:r>
-              <w:rPr>
-                <w:rFonts w:ascii="Times New Roman" w:eastAsia="Times New Roman" w:hAnsi="Times New Roman" w:cs="Times New Roman"/>
-              </w:rPr>
-              <w:t>theme(</w:t>
-            </w:r>
-            <w:proofErr w:type="spellStart"/>
-            <w:r>
-              <w:rPr>
-                <w:rFonts w:ascii="Times New Roman" w:eastAsia="Times New Roman" w:hAnsi="Times New Roman" w:cs="Times New Roman"/>
-              </w:rPr>
-              <w:t>plot.title</w:t>
-            </w:r>
-            <w:proofErr w:type="spellEnd"/>
-            <w:proofErr w:type="gramEnd"/>
-            <w:r>
-              <w:rPr>
-                <w:rFonts w:ascii="Times New Roman" w:eastAsia="Times New Roman" w:hAnsi="Times New Roman" w:cs="Times New Roman"/>
-              </w:rPr>
-              <w:t xml:space="preserve"> = </w:t>
-            </w:r>
-            <w:proofErr w:type="spellStart"/>
-            <w:r>
-              <w:rPr>
-                <w:rFonts w:ascii="Times New Roman" w:eastAsia="Times New Roman" w:hAnsi="Times New Roman" w:cs="Times New Roman"/>
-              </w:rPr>
-              <w:t>element_</w:t>
-            </w:r>
-            <w:proofErr w:type="gramStart"/>
-            <w:r>
-              <w:rPr>
-                <w:rFonts w:ascii="Times New Roman" w:eastAsia="Times New Roman" w:hAnsi="Times New Roman" w:cs="Times New Roman"/>
-              </w:rPr>
-              <w:t>text</w:t>
-            </w:r>
-            <w:proofErr w:type="spellEnd"/>
-            <w:r>
-              <w:rPr>
-                <w:rFonts w:ascii="Times New Roman" w:eastAsia="Times New Roman" w:hAnsi="Times New Roman" w:cs="Times New Roman"/>
-              </w:rPr>
-              <w:t>(</w:t>
-            </w:r>
-            <w:proofErr w:type="spellStart"/>
-            <w:proofErr w:type="gramEnd"/>
-            <w:r>
-              <w:rPr>
-                <w:rFonts w:ascii="Times New Roman" w:eastAsia="Times New Roman" w:hAnsi="Times New Roman" w:cs="Times New Roman"/>
-              </w:rPr>
-              <w:t>hjust</w:t>
-            </w:r>
-            <w:proofErr w:type="spellEnd"/>
-            <w:r>
-              <w:rPr>
-                <w:rFonts w:ascii="Times New Roman" w:eastAsia="Times New Roman" w:hAnsi="Times New Roman" w:cs="Times New Roman"/>
-              </w:rPr>
-              <w:t xml:space="preserve"> = 0.5, face = "bold"))</w:t>
-            </w:r>
-          </w:p>
-          <w:p>
-            <w:pPr>
-              <w:rPr>
-                <w:rFonts w:ascii="Times New Roman" w:eastAsia="Times New Roman" w:hAnsi="Times New Roman" w:cs="Times New Roman"/>
-              </w:rPr>
-            </w:pPr>
-          </w:p>
-          <w:p>
-            <w:pPr>
-              <w:rPr>
-                <w:rFonts w:ascii="Times New Roman" w:eastAsia="Times New Roman" w:hAnsi="Times New Roman" w:cs="Times New Roman"/>
-              </w:rPr>
-            </w:pPr>
-            <w:r>
-              <w:rPr>
-                <w:rFonts w:ascii="Times New Roman" w:eastAsia="Times New Roman" w:hAnsi="Times New Roman" w:cs="Times New Roman"/>
-              </w:rPr>
-              <w:t># Display plot</w:t>
-            </w:r>
-          </w:p>
-          <w:p>
-            <w:pPr>
-              <w:rPr>
-                <w:rFonts w:ascii="Times New Roman" w:eastAsia="Times New Roman" w:hAnsi="Times New Roman" w:cs="Times New Roman"/>
-              </w:rPr>
-            </w:pPr>
-            <w:r>
-              <w:rPr>
-                <w:rFonts w:ascii="Times New Roman" w:eastAsia="Times New Roman" w:hAnsi="Times New Roman" w:cs="Times New Roman"/>
-              </w:rPr>
-              <w:t>print(</w:t>
-            </w:r>
-            <w:proofErr w:type="spellStart"/>
-            <w:r>
-              <w:rPr>
-                <w:rFonts w:ascii="Times New Roman" w:eastAsia="Times New Roman" w:hAnsi="Times New Roman" w:cs="Times New Roman"/>
-              </w:rPr>
-              <w:t>scatter_plot</w:t>
-            </w:r>
-            <w:proofErr w:type="spellEnd"/>
-            <w:r>
-              <w:rPr>
-                <w:rFonts w:ascii="Times New Roman" w:eastAsia="Times New Roman" w:hAnsi="Times New Roman" w:cs="Times New Roman"/>
-              </w:rPr>
-              <w:t>)</w:t>
-            </w:r>
-          </w:p>
-          <w:p>
-            <w:pPr>
-              <w:rPr>
-                <w:rFonts w:ascii="Times New Roman" w:eastAsia="Times New Roman" w:hAnsi="Times New Roman" w:cs="Times New Roman"/>
-              </w:rPr>
-            </w:pPr>
-          </w:p>
-          <w:p>
-            <w:pPr>
-              <w:rPr>
-                <w:rFonts w:ascii="Times New Roman" w:eastAsia="Times New Roman" w:hAnsi="Times New Roman" w:cs="Times New Roman"/>
-              </w:rPr>
-            </w:pPr>
-          </w:p>
-          <w:p>
-            <w:pPr>
-              <w:rPr>
-                <w:rFonts w:ascii="Times New Roman" w:eastAsia="Times New Roman" w:hAnsi="Times New Roman" w:cs="Times New Roman"/>
-              </w:rPr>
-            </w:pPr>
-          </w:p>
-          <w:p>
-            <w:pPr>
-              <w:rPr>
-                <w:rFonts w:ascii="Times New Roman" w:eastAsia="Times New Roman" w:hAnsi="Times New Roman" w:cs="Times New Roman"/>
-              </w:rPr>
-            </w:pPr>
-          </w:p>
-          <w:p>
-            <w:pPr>
-              <w:rPr>
-                <w:rFonts w:ascii="Times New Roman" w:eastAsia="Times New Roman" w:hAnsi="Times New Roman" w:cs="Times New Roman"/>
-              </w:rPr>
-            </w:pPr>
-            <w:r>
-              <w:rPr>
-                <w:rFonts w:ascii="Times New Roman" w:eastAsia="Times New Roman" w:hAnsi="Times New Roman" w:cs="Times New Roman"/>
-              </w:rPr>
-              <w:t># Pearson correlation test</w:t>
-            </w:r>
-          </w:p>
-          <w:p>
-            <w:pPr>
-              <w:rPr>
-                <w:rFonts w:ascii="Times New Roman" w:eastAsia="Times New Roman" w:hAnsi="Times New Roman" w:cs="Times New Roman"/>
-              </w:rPr>
-            </w:pPr>
-            <w:proofErr w:type="spellStart"/>
-            <w:r>
-              <w:rPr>
-                <w:rFonts w:ascii="Times New Roman" w:eastAsia="Times New Roman" w:hAnsi="Times New Roman" w:cs="Times New Roman"/>
-              </w:rPr>
-              <w:t>correlation_test</w:t>
-            </w:r>
-            <w:proofErr w:type="spellEnd"/>
-            <w:r>
-              <w:rPr>
-                <w:rFonts w:ascii="Times New Roman" w:eastAsia="Times New Roman" w:hAnsi="Times New Roman" w:cs="Times New Roman"/>
-              </w:rPr>
-              <w:t xml:space="preserve"> &lt;- </w:t>
-            </w:r>
-            <w:proofErr w:type="spellStart"/>
-            <w:r>
-              <w:rPr>
-                <w:rFonts w:ascii="Times New Roman" w:eastAsia="Times New Roman" w:hAnsi="Times New Roman" w:cs="Times New Roman"/>
-              </w:rPr>
-              <w:t>cor.</w:t>
-            </w:r>
-            <w:proofErr w:type="gramStart"/>
-            <w:r>
-              <w:rPr>
-                <w:rFonts w:ascii="Times New Roman" w:eastAsia="Times New Roman" w:hAnsi="Times New Roman" w:cs="Times New Roman"/>
-              </w:rPr>
-              <w:t>test</w:t>
-            </w:r>
-            <w:proofErr w:type="spellEnd"/>
-            <w:r>
-              <w:rPr>
-                <w:rFonts w:ascii="Times New Roman" w:eastAsia="Times New Roman" w:hAnsi="Times New Roman" w:cs="Times New Roman"/>
-              </w:rPr>
-              <w:t>(</w:t>
-            </w:r>
-            <w:proofErr w:type="spellStart"/>
-            <w:proofErr w:type="gramEnd"/>
-            <w:r>
-              <w:rPr>
-                <w:rFonts w:ascii="Times New Roman" w:eastAsia="Times New Roman" w:hAnsi="Times New Roman" w:cs="Times New Roman"/>
-              </w:rPr>
-              <w:t>data_clean$Alcohol_Consumption</w:t>
-            </w:r>
-            <w:proofErr w:type="spellEnd"/>
-            <w:r>
-              <w:rPr>
-                <w:rFonts w:ascii="Times New Roman" w:eastAsia="Times New Roman" w:hAnsi="Times New Roman" w:cs="Times New Roman"/>
-              </w:rPr>
-              <w:t xml:space="preserve">, </w:t>
-            </w:r>
-          </w:p>
-          <w:p>
-            <w:pPr>
-              <w:rPr>
-                <w:rFonts w:ascii="Times New Roman" w:eastAsia="Times New Roman" w:hAnsi="Times New Roman" w:cs="Times New Roman"/>
-              </w:rPr>
-            </w:pPr>
-            <w:r>
-              <w:rPr>
-                <w:rFonts w:ascii="Times New Roman" w:eastAsia="Times New Roman" w:hAnsi="Times New Roman" w:cs="Times New Roman"/>
-              </w:rPr>
-              <w:t xml:space="preserve">                             </w:t>
-            </w:r>
-            <w:proofErr w:type="spellStart"/>
-            <w:r>
-              <w:rPr>
-                <w:rFonts w:ascii="Times New Roman" w:eastAsia="Times New Roman" w:hAnsi="Times New Roman" w:cs="Times New Roman"/>
-              </w:rPr>
-              <w:t>data_clean$Life_Expectancy</w:t>
-            </w:r>
-            <w:proofErr w:type="spellEnd"/>
-            <w:r>
-              <w:rPr>
-                <w:rFonts w:ascii="Times New Roman" w:eastAsia="Times New Roman" w:hAnsi="Times New Roman" w:cs="Times New Roman"/>
-              </w:rPr>
-              <w:t>,</w:t>
-            </w:r>
-          </w:p>
-          <w:p>
-            <w:pPr>
-              <w:rPr>
-                <w:rFonts w:ascii="Times New Roman" w:eastAsia="Times New Roman" w:hAnsi="Times New Roman" w:cs="Times New Roman"/>
-              </w:rPr>
-            </w:pPr>
-            <w:r>
-              <w:rPr>
-                <w:rFonts w:ascii="Times New Roman" w:eastAsia="Times New Roman" w:hAnsi="Times New Roman" w:cs="Times New Roman"/>
-              </w:rPr>
-              <w:t xml:space="preserve">                             method = "</w:t>
-            </w:r>
-            <w:proofErr w:type="spellStart"/>
-            <w:r>
-              <w:rPr>
-                <w:rFonts w:ascii="Times New Roman" w:eastAsia="Times New Roman" w:hAnsi="Times New Roman" w:cs="Times New Roman"/>
-              </w:rPr>
-              <w:t>pearson</w:t>
-            </w:r>
-            <w:proofErr w:type="spellEnd"/>
-            <w:r>
-              <w:rPr>
-                <w:rFonts w:ascii="Times New Roman" w:eastAsia="Times New Roman" w:hAnsi="Times New Roman" w:cs="Times New Roman"/>
-              </w:rPr>
-              <w:t>")</w:t>
-            </w:r>
-          </w:p>
-          <w:p>
-            <w:pPr>
-              <w:rPr>
-                <w:rFonts w:ascii="Times New Roman" w:eastAsia="Times New Roman" w:hAnsi="Times New Roman" w:cs="Times New Roman"/>
-              </w:rPr>
-            </w:pPr>
-          </w:p>
-          <w:p>
-            <w:pPr>
-              <w:rPr>
-                <w:rFonts w:ascii="Times New Roman" w:eastAsia="Times New Roman" w:hAnsi="Times New Roman" w:cs="Times New Roman"/>
-              </w:rPr>
-            </w:pPr>
-            <w:r>
-              <w:rPr>
-                <w:rFonts w:ascii="Times New Roman" w:eastAsia="Times New Roman" w:hAnsi="Times New Roman" w:cs="Times New Roman"/>
-              </w:rPr>
-              <w:t># Display correlation results</w:t>
-            </w:r>
-          </w:p>
-          <w:p>
-            <w:pPr>
-              <w:rPr>
-                <w:rFonts w:ascii="Times New Roman" w:eastAsia="Times New Roman" w:hAnsi="Times New Roman" w:cs="Times New Roman"/>
-              </w:rPr>
-            </w:pPr>
-            <w:r>
-              <w:rPr>
-                <w:rFonts w:ascii="Times New Roman" w:eastAsia="Times New Roman" w:hAnsi="Times New Roman" w:cs="Times New Roman"/>
-              </w:rPr>
-              <w:t>print(</w:t>
-            </w:r>
-            <w:proofErr w:type="spellStart"/>
-            <w:r>
-              <w:rPr>
-                <w:rFonts w:ascii="Times New Roman" w:eastAsia="Times New Roman" w:hAnsi="Times New Roman" w:cs="Times New Roman"/>
-              </w:rPr>
-              <w:t>correlation_test</w:t>
-            </w:r>
-            <w:proofErr w:type="spellEnd"/>
-            <w:r>
-              <w:rPr>
-                <w:rFonts w:ascii="Times New Roman" w:eastAsia="Times New Roman" w:hAnsi="Times New Roman" w:cs="Times New Roman"/>
-              </w:rPr>
-              <w:t>)</w:t>
-            </w:r>
-          </w:p>
-          <w:p>
-            <w:pPr>
-              <w:rPr>
-                <w:rFonts w:ascii="Times New Roman" w:eastAsia="Times New Roman" w:hAnsi="Times New Roman" w:cs="Times New Roman"/>
-              </w:rPr>
-            </w:pPr>
-          </w:p>
-          <w:p>
-            <w:pPr>
-              <w:rPr>
-                <w:rFonts w:ascii="Times New Roman" w:eastAsia="Times New Roman" w:hAnsi="Times New Roman" w:cs="Times New Roman"/>
-              </w:rPr>
-            </w:pPr>
-            <w:r>
-              <w:rPr>
-                <w:rFonts w:ascii="Times New Roman" w:eastAsia="Times New Roman" w:hAnsi="Times New Roman" w:cs="Times New Roman"/>
-              </w:rPr>
-              <w:t># Extract key statistics</w:t>
-            </w:r>
-          </w:p>
-          <w:p>
-            <w:pPr>
-              <w:rPr>
-                <w:rFonts w:ascii="Times New Roman" w:eastAsia="Times New Roman" w:hAnsi="Times New Roman" w:cs="Times New Roman"/>
-              </w:rPr>
-            </w:pPr>
-            <w:proofErr w:type="spellStart"/>
-            <w:r>
-              <w:rPr>
-                <w:rFonts w:ascii="Times New Roman" w:eastAsia="Times New Roman" w:hAnsi="Times New Roman" w:cs="Times New Roman"/>
-              </w:rPr>
-              <w:t>correlation_coefficient</w:t>
-            </w:r>
-            <w:proofErr w:type="spellEnd"/>
-            <w:r>
-              <w:rPr>
-                <w:rFonts w:ascii="Times New Roman" w:eastAsia="Times New Roman" w:hAnsi="Times New Roman" w:cs="Times New Roman"/>
-              </w:rPr>
-              <w:t xml:space="preserve"> &lt;- </w:t>
-            </w:r>
-            <w:proofErr w:type="spellStart"/>
-            <w:r>
-              <w:rPr>
-                <w:rFonts w:ascii="Times New Roman" w:eastAsia="Times New Roman" w:hAnsi="Times New Roman" w:cs="Times New Roman"/>
-              </w:rPr>
-              <w:t>correlation_test$estimate</w:t>
-            </w:r>
-            <w:proofErr w:type="spellEnd"/>
-          </w:p>
-          <w:p>
-            <w:pPr>
-              <w:rPr>
-                <w:rFonts w:ascii="Times New Roman" w:eastAsia="Times New Roman" w:hAnsi="Times New Roman" w:cs="Times New Roman"/>
-              </w:rPr>
-            </w:pPr>
-            <w:proofErr w:type="spellStart"/>
-            <w:r>
-              <w:rPr>
-                <w:rFonts w:ascii="Times New Roman" w:eastAsia="Times New Roman" w:hAnsi="Times New Roman" w:cs="Times New Roman"/>
-              </w:rPr>
-              <w:t>p_value</w:t>
-            </w:r>
-            <w:proofErr w:type="spellEnd"/>
-            <w:r>
-              <w:rPr>
-                <w:rFonts w:ascii="Times New Roman" w:eastAsia="Times New Roman" w:hAnsi="Times New Roman" w:cs="Times New Roman"/>
-              </w:rPr>
-              <w:t xml:space="preserve"> &lt;- </w:t>
-            </w:r>
-            <w:proofErr w:type="spellStart"/>
-            <w:r>
-              <w:rPr>
-                <w:rFonts w:ascii="Times New Roman" w:eastAsia="Times New Roman" w:hAnsi="Times New Roman" w:cs="Times New Roman"/>
-              </w:rPr>
-              <w:t>correlation_test$p.value</w:t>
-            </w:r>
-            <w:proofErr w:type="spellEnd"/>
-          </w:p>
-          <w:p>
-            <w:pPr>
-              <w:rPr>
-                <w:rFonts w:ascii="Times New Roman" w:eastAsia="Times New Roman" w:hAnsi="Times New Roman" w:cs="Times New Roman"/>
-              </w:rPr>
-            </w:pPr>
-            <w:proofErr w:type="spellStart"/>
-            <w:r>
-              <w:rPr>
-                <w:rFonts w:ascii="Times New Roman" w:eastAsia="Times New Roman" w:hAnsi="Times New Roman" w:cs="Times New Roman"/>
-              </w:rPr>
-              <w:t>confidence_interval</w:t>
-            </w:r>
-            <w:proofErr w:type="spellEnd"/>
-            <w:r>
-              <w:rPr>
-                <w:rFonts w:ascii="Times New Roman" w:eastAsia="Times New Roman" w:hAnsi="Times New Roman" w:cs="Times New Roman"/>
-              </w:rPr>
-              <w:t xml:space="preserve"> &lt;- correlation_test$conf.int</w:t>
-            </w:r>
-          </w:p>
-          <w:p>
-            <w:pPr>
-              <w:rPr>
-                <w:rFonts w:ascii="Times New Roman" w:eastAsia="Times New Roman" w:hAnsi="Times New Roman" w:cs="Times New Roman"/>
-              </w:rPr>
-            </w:pPr>
-          </w:p>
-          <w:p>
-            <w:pPr>
-              <w:rPr>
-                <w:rFonts w:ascii="Times New Roman" w:eastAsia="Times New Roman" w:hAnsi="Times New Roman" w:cs="Times New Roman"/>
-              </w:rPr>
-            </w:pPr>
-            <w:proofErr w:type="gramStart"/>
-            <w:r>
-              <w:rPr>
-                <w:rFonts w:ascii="Times New Roman" w:eastAsia="Times New Roman" w:hAnsi="Times New Roman" w:cs="Times New Roman"/>
-              </w:rPr>
-              <w:t>cat(</w:t>
-            </w:r>
-            <w:proofErr w:type="gramEnd"/>
-            <w:r>
-              <w:rPr>
-                <w:rFonts w:ascii="Times New Roman" w:eastAsia="Times New Roman" w:hAnsi="Times New Roman" w:cs="Times New Roman"/>
-              </w:rPr>
-              <w:t>"\n=== CORRELATION ANALYSIS RESULTS ===\n")</w:t>
-            </w:r>
-          </w:p>
-          <w:p>
-            <w:pPr>
-              <w:rPr>
-                <w:rFonts w:ascii="Times New Roman" w:eastAsia="Times New Roman" w:hAnsi="Times New Roman" w:cs="Times New Roman"/>
-              </w:rPr>
-            </w:pPr>
-            <w:proofErr w:type="gramStart"/>
-            <w:r>
-              <w:rPr>
-                <w:rFonts w:ascii="Times New Roman" w:eastAsia="Times New Roman" w:hAnsi="Times New Roman" w:cs="Times New Roman"/>
-              </w:rPr>
-              <w:t>cat(</w:t>
-            </w:r>
-            <w:proofErr w:type="gramEnd"/>
-            <w:r>
-              <w:rPr>
-                <w:rFonts w:ascii="Times New Roman" w:eastAsia="Times New Roman" w:hAnsi="Times New Roman" w:cs="Times New Roman"/>
-              </w:rPr>
-              <w:t xml:space="preserve">"Pearson Correlation Coefficient (r):", </w:t>
-            </w:r>
-            <w:proofErr w:type="spellStart"/>
-            <w:r>
-              <w:rPr>
-                <w:rFonts w:ascii="Times New Roman" w:eastAsia="Times New Roman" w:hAnsi="Times New Roman" w:cs="Times New Roman"/>
-              </w:rPr>
-              <w:t>correlation_coefficient</w:t>
-            </w:r>
-            <w:proofErr w:type="spellEnd"/>
-            <w:r>
-              <w:rPr>
-                <w:rFonts w:ascii="Times New Roman" w:eastAsia="Times New Roman" w:hAnsi="Times New Roman" w:cs="Times New Roman"/>
-              </w:rPr>
-              <w:t>, "\n")</w:t>
-            </w:r>
-          </w:p>
-          <w:p>
-            <w:pPr>
-              <w:rPr>
-                <w:rFonts w:ascii="Times New Roman" w:eastAsia="Times New Roman" w:hAnsi="Times New Roman" w:cs="Times New Roman"/>
-              </w:rPr>
-            </w:pPr>
-            <w:proofErr w:type="gramStart"/>
-            <w:r>
-              <w:rPr>
-                <w:rFonts w:ascii="Times New Roman" w:eastAsia="Times New Roman" w:hAnsi="Times New Roman" w:cs="Times New Roman"/>
-              </w:rPr>
-              <w:t>cat(</w:t>
-            </w:r>
-            <w:proofErr w:type="gramEnd"/>
-            <w:r>
-              <w:rPr>
-                <w:rFonts w:ascii="Times New Roman" w:eastAsia="Times New Roman" w:hAnsi="Times New Roman" w:cs="Times New Roman"/>
-              </w:rPr>
-              <w:t xml:space="preserve">"P-value:", </w:t>
-            </w:r>
-            <w:proofErr w:type="spellStart"/>
-            <w:r>
-              <w:rPr>
-                <w:rFonts w:ascii="Times New Roman" w:eastAsia="Times New Roman" w:hAnsi="Times New Roman" w:cs="Times New Roman"/>
-              </w:rPr>
-              <w:t>p_value</w:t>
-            </w:r>
-            <w:proofErr w:type="spellEnd"/>
-            <w:r>
-              <w:rPr>
-                <w:rFonts w:ascii="Times New Roman" w:eastAsia="Times New Roman" w:hAnsi="Times New Roman" w:cs="Times New Roman"/>
-              </w:rPr>
-              <w:t>, "\n")</w:t>
-            </w:r>
-          </w:p>
-          <w:p>
-            <w:pPr>
-              <w:rPr>
-                <w:rFonts w:ascii="Times New Roman" w:eastAsia="Times New Roman" w:hAnsi="Times New Roman" w:cs="Times New Roman"/>
-              </w:rPr>
-            </w:pPr>
-            <w:proofErr w:type="gramStart"/>
-            <w:r>
-              <w:rPr>
-                <w:rFonts w:ascii="Times New Roman" w:eastAsia="Times New Roman" w:hAnsi="Times New Roman" w:cs="Times New Roman"/>
-              </w:rPr>
-              <w:t>cat(</w:t>
-            </w:r>
-            <w:proofErr w:type="gramEnd"/>
-            <w:r>
-              <w:rPr>
-                <w:rFonts w:ascii="Times New Roman" w:eastAsia="Times New Roman" w:hAnsi="Times New Roman" w:cs="Times New Roman"/>
-              </w:rPr>
-              <w:t xml:space="preserve">"95% Confidence Interval:", </w:t>
-            </w:r>
-            <w:proofErr w:type="spellStart"/>
-            <w:r>
-              <w:rPr>
-                <w:rFonts w:ascii="Times New Roman" w:eastAsia="Times New Roman" w:hAnsi="Times New Roman" w:cs="Times New Roman"/>
-              </w:rPr>
-              <w:t>confidence_</w:t>
-            </w:r>
-            <w:proofErr w:type="gramStart"/>
-            <w:r>
-              <w:rPr>
-                <w:rFonts w:ascii="Times New Roman" w:eastAsia="Times New Roman" w:hAnsi="Times New Roman" w:cs="Times New Roman"/>
-              </w:rPr>
-              <w:t>interval</w:t>
-            </w:r>
-            <w:proofErr w:type="spellEnd"/>
-            <w:r>
-              <w:rPr>
-                <w:rFonts w:ascii="Times New Roman" w:eastAsia="Times New Roman" w:hAnsi="Times New Roman" w:cs="Times New Roman"/>
-              </w:rPr>
-              <w:t>[</w:t>
-            </w:r>
-            <w:proofErr w:type="gramEnd"/>
-            <w:r>
-              <w:rPr>
-                <w:rFonts w:ascii="Times New Roman" w:eastAsia="Times New Roman" w:hAnsi="Times New Roman" w:cs="Times New Roman"/>
-              </w:rPr>
-              <w:t xml:space="preserve">1], "to", </w:t>
-            </w:r>
-            <w:proofErr w:type="spellStart"/>
-            <w:r>
-              <w:rPr>
-                <w:rFonts w:ascii="Times New Roman" w:eastAsia="Times New Roman" w:hAnsi="Times New Roman" w:cs="Times New Roman"/>
-              </w:rPr>
-              <w:t>confidence_</w:t>
-            </w:r>
-            <w:proofErr w:type="gramStart"/>
-            <w:r>
-              <w:rPr>
-                <w:rFonts w:ascii="Times New Roman" w:eastAsia="Times New Roman" w:hAnsi="Times New Roman" w:cs="Times New Roman"/>
-              </w:rPr>
-              <w:t>interval</w:t>
-            </w:r>
-            <w:proofErr w:type="spellEnd"/>
-            <w:r>
-              <w:rPr>
-                <w:rFonts w:ascii="Times New Roman" w:eastAsia="Times New Roman" w:hAnsi="Times New Roman" w:cs="Times New Roman"/>
-              </w:rPr>
-              <w:t>[</w:t>
-            </w:r>
-            <w:proofErr w:type="gramEnd"/>
-            <w:r>
-              <w:rPr>
-                <w:rFonts w:ascii="Times New Roman" w:eastAsia="Times New Roman" w:hAnsi="Times New Roman" w:cs="Times New Roman"/>
-              </w:rPr>
-              <w:t>2], "\n")</w:t>
-            </w:r>
-          </w:p>
-          <w:p>
-            <w:pPr>
-              <w:rPr>
-                <w:rFonts w:ascii="Times New Roman" w:eastAsia="Times New Roman" w:hAnsi="Times New Roman" w:cs="Times New Roman"/>
-              </w:rPr>
-            </w:pPr>
-            <w:proofErr w:type="gramStart"/>
-            <w:r>
-              <w:rPr>
-                <w:rFonts w:ascii="Times New Roman" w:eastAsia="Times New Roman" w:hAnsi="Times New Roman" w:cs="Times New Roman"/>
-              </w:rPr>
-              <w:t>cat(</w:t>
-            </w:r>
-            <w:proofErr w:type="gramEnd"/>
-            <w:r>
-              <w:rPr>
-                <w:rFonts w:ascii="Times New Roman" w:eastAsia="Times New Roman" w:hAnsi="Times New Roman" w:cs="Times New Roman"/>
-              </w:rPr>
-              <w:t xml:space="preserve">"Sample size (n):", </w:t>
-            </w:r>
-            <w:proofErr w:type="spellStart"/>
-            <w:r>
-              <w:rPr>
-                <w:rFonts w:ascii="Times New Roman" w:eastAsia="Times New Roman" w:hAnsi="Times New Roman" w:cs="Times New Roman"/>
-              </w:rPr>
-              <w:t>nrow</w:t>
-            </w:r>
-            <w:proofErr w:type="spellEnd"/>
-            <w:r>
-              <w:rPr>
-                <w:rFonts w:ascii="Times New Roman" w:eastAsia="Times New Roman" w:hAnsi="Times New Roman" w:cs="Times New Roman"/>
-              </w:rPr>
-              <w:t>(</w:t>
-            </w:r>
-            <w:proofErr w:type="spellStart"/>
-            <w:r>
-              <w:rPr>
-                <w:rFonts w:ascii="Times New Roman" w:eastAsia="Times New Roman" w:hAnsi="Times New Roman" w:cs="Times New Roman"/>
-              </w:rPr>
-              <w:t>data_clean</w:t>
-            </w:r>
-            <w:proofErr w:type="spellEnd"/>
-            <w:r>
-              <w:rPr>
-                <w:rFonts w:ascii="Times New Roman" w:eastAsia="Times New Roman" w:hAnsi="Times New Roman" w:cs="Times New Roman"/>
-              </w:rPr>
               <w:t>), "\n")</w:t>
             </w:r>
           </w:p>
@@ -10687,7 +9648,6 @@
               <w:rPr>
                 <w:rFonts w:ascii="Times New Roman" w:eastAsia="Times New Roman" w:hAnsi="Times New Roman" w:cs="Times New Roman"/>
               </w:rPr>
-              <w:lastRenderedPageBreak/>
               <w:t>if (</w:t>
             </w:r>
             <w:proofErr w:type="spellStart"/>
@@ -10960,7 +9920,7 @@
       </w:pPr>
     </w:p>
     <w:sectPr>
-      <w:footerReference w:type="first" r:id="rId10"/>
+      <w:footerReference w:type="first" r:id="rId13"/>
       <w:pgSz w:w="11906" w:h="16838"/>
       <w:pgMar w:top="1440" w:right="1440" w:bottom="1440" w:left="1440" w:header="708" w:footer="708" w:gutter="0"/>
       <w:pgNumType w:start="1"/>

</xml_diff>